<commit_message>
M4b.3 step 5: guest pages in real frames above 16 MB (frames top 160 MB)
DMKPTR's high-frame list is on (CPIBFT X'0A000000'); any guest page-in that
is not SYSTEM space or a named-system page may take a frame above 16 MB.
What it took, each invisible below 16 MB (docs/42, I-259..I-262):
- I-259 DMKSVC: SAVEPROC is byte 0 of SAVERETN; SVCRETAF's strip took the
  AMODE bit, so every CALL from AMODE 31 returned in AMODE 24
- I-260 ten LA-bumped SAVERETN sites now STCM the low three bytes
- I-261 DMKCFG named-system loop counted 64 KB segments (SRL 8)
- I-262 DMKDGD IDAW 2 stays in the frame (PTR003)
- DMKCPI leaves for the dispatcher through DMKCPIGO, in AMODE 31

Regression: m5g-native and gcclib-15m at 16 and 256 MB, IPL LINUX to the
login prompt at 16 and 256 MB (RES 5940 pages at 256).

Co-Authored-By: Claude Opus 5.5 <noreply@anthropic.com>
Claude-Session: https://claude.ai/code/session_01JBNU8KnKzXkgscse8vw6so
</commit_message>
<xml_diff>
--- a/arch/31bit/manual/VM370PLUS-Guide.docx
+++ b/arch/31bit/manual/VM370PLUS-Guide.docx
@@ -2115,6 +2115,44 @@
           <w:rFonts w:ascii="Times New Roman" w:cs="Times New Roman" w:eastAsia="Times New Roman" w:hAnsi="Times New Roman"/>
         </w:rPr>
         <w:t xml:space="preserve">This edition is kept up to date as VM/370plus grows; each change is listed here, newest first.</w:t>
+      </w:r>
+    </w:p>
+    <w:p>
+      <w:pPr>
+        <w:pStyle w:val="ListParagraph"/>
+        <w:numPr>
+          <w:ilvl w:val="0"/>
+          <w:numId w:val="2"/>
+        </w:numPr>
+        <w:spacing w:after="60"/>
+      </w:pPr>
+      <w:r>
+        <w:rPr>
+          <w:rFonts w:ascii="Times New Roman" w:cs="Times New Roman" w:eastAsia="Times New Roman" w:hAnsi="Times New Roman"/>
+          <w:b/>
+          <w:bCs/>
+        </w:rPr>
+        <w:t xml:space="preserve">11 October 2026, morning.</w:t>
+      </w:r>
+      <w:r>
+        <w:rPr>
+          <w:rFonts w:ascii="Times New Roman" w:cs="Times New Roman" w:eastAsia="Times New Roman" w:hAnsi="Times New Roman"/>
+        </w:rPr>
+        <w:t xml:space="preserve"> Guest pages in real frames above 16 MB (M4b.3): with </w:t>
+      </w:r>
+      <w:r>
+        <w:rPr>
+          <w:rFonts w:ascii="Courier New" w:cs="Courier New" w:eastAsia="Courier New" w:hAnsi="Courier New"/>
+          <w:sz w:val="19"/>
+          <w:szCs w:val="19"/>
+        </w:rPr>
+        <w:t xml:space="preserve">MAINSIZE</w:t>
+      </w:r>
+      <w:r>
+        <w:rPr>
+          <w:rFonts w:ascii="Times New Roman" w:cs="Times New Roman" w:eastAsia="Times New Roman" w:hAnsi="Times New Roman"/>
+        </w:rPr>
+        <w:t xml:space="preserve"> above 16, the frames from 16 MB up to 160 MB hold virtual machine pages directly.</w:t>
       </w:r>
     </w:p>
     <w:p>
@@ -3006,7 +3044,7 @@
                 <w:sz w:val="19"/>
                 <w:szCs w:val="19"/>
               </w:rPr>
-              <w:t xml:space="preserve">planned</w:t>
+              <w:t xml:space="preserve">guest pages in frames up to 160 MB: complete; two Debians at once: next</w:t>
             </w:r>
           </w:p>
         </w:tc>
@@ -7019,7 +7057,7 @@
         <w:rPr>
           <w:rFonts w:ascii="Times New Roman" w:cs="Times New Roman" w:eastAsia="Times New Roman" w:hAnsi="Times New Roman"/>
         </w:rPr>
-        <w:t xml:space="preserve">CP’s own machine is 16 MB. With </w:t>
+        <w:t xml:space="preserve">CP’s own machine is 16 MB: its nucleus, free storage, locked and V=R pages, spool buffers and the pages of named systems stay below 16 MB. With </w:t>
       </w:r>
       <w:r>
         <w:rPr>
@@ -7047,7 +7085,7 @@
         <w:rPr>
           <w:rFonts w:ascii="Times New Roman" w:cs="Times New Roman" w:eastAsia="Times New Roman" w:hAnsi="Times New Roman"/>
         </w:rPr>
-        <w:t xml:space="preserve"> (the kit has 64), CP uses the storage above 16 MB as a paging store that no channel addresses: a page-out copies a frame there, a page-in copies it back. Up to 2048 MB has been tested. Virtual machines may be up to 256 MB.</w:t>
+        <w:t xml:space="preserve"> (the kit has 64), the frames from 16 MB up to 160 MB hold virtual machine pages directly, and the storage above 160 MB, if any, is a paging store that no channel addresses: a page-out copies a frame there, a page-in copies it back. Up to 2048 MB has been tested. Virtual machines may be up to 256 MB.</w:t>
       </w:r>
     </w:p>
     <w:p>

</xml_diff>

<commit_message>
Milestone plan of record: the owner's workbook (M9 before 64-bit, M10 64-bit, M11 after)
docs/VM370PLUS-Milestones.xlsx as received, docs/60-MILESTONES.md generated
from it, 30-STATE points to it, the Guide's milestone table follows it.

Co-Authored-By: Claude Opus 5.5 <noreply@anthropic.com>
Claude-Session: https://claude.ai/code/session_01JBNU8KnKzXkgscse8vw6so
</commit_message>
<xml_diff>
--- a/arch/31bit/manual/VM370PLUS-Guide.docx
+++ b/arch/31bit/manual/VM370PLUS-Guide.docx
@@ -3161,7 +3161,7 @@
                 <w:sz w:val="19"/>
                 <w:szCs w:val="19"/>
               </w:rPr>
-              <w:t xml:space="preserve">a CMS nucleus that is itself 31-bit</w:t>
+              <w:t xml:space="preserve">a CMS nucleus that is itself 31-bit; larger minidisks</w:t>
             </w:r>
           </w:p>
         </w:tc>
@@ -3928,7 +3928,7 @@
                 <w:sz w:val="19"/>
                 <w:szCs w:val="19"/>
               </w:rPr>
-              <w:t xml:space="preserve">z/Architecture (64-bit)</w:t>
+              <w:t xml:space="preserve">before 64-bit: SET/QUERY MACHINE, FULIST, GLOBALV (done); CP leftovers; C++ on CMS; SQL and SQLSERV; CMS sockets and httpd; xBase/Harbour; MQ and MQTT; APL on CMS; ooRexx 5; AI gateway; firewall guest; kit build 7</w:t>
             </w:r>
           </w:p>
         </w:tc>
@@ -3949,7 +3949,145 @@
                 <w:sz w:val="19"/>
                 <w:szCs w:val="19"/>
               </w:rPr>
-              <w:t xml:space="preserve">planned, after all of the above</w:t>
+              <w:t xml:space="preserve">under way</w:t>
+            </w:r>
+          </w:p>
+        </w:tc>
+      </w:tr>
+      <w:tr>
+        <w:trPr>
+          <w:cantSplit/>
+          <w:tblHeader w:val="false"/>
+        </w:trPr>
+        <w:tc>
+          <w:tcPr>
+            <w:tcW w:type="dxa" w:w="1400"/>
+            <w:tcMar>
+              <w:top w:type="dxa" w:w="60"/>
+              <w:left w:type="dxa" w:w="100"/>
+              <w:bottom w:type="dxa" w:w="60"/>
+              <w:right w:type="dxa" w:w="100"/>
+            </w:tcMar>
+          </w:tcPr>
+          <w:p>
+            <w:r>
+              <w:rPr>
+                <w:rFonts w:ascii="Times New Roman" w:cs="Times New Roman" w:eastAsia="Times New Roman" w:hAnsi="Times New Roman"/>
+                <w:sz w:val="19"/>
+                <w:szCs w:val="19"/>
+              </w:rPr>
+              <w:t xml:space="preserve">M10</w:t>
+            </w:r>
+          </w:p>
+        </w:tc>
+        <w:tc>
+          <w:tcPr>
+            <w:tcW w:type="dxa" w:w="6038"/>
+            <w:tcMar>
+              <w:top w:type="dxa" w:w="60"/>
+              <w:left w:type="dxa" w:w="100"/>
+              <w:bottom w:type="dxa" w:w="60"/>
+              <w:right w:type="dxa" w:w="100"/>
+            </w:tcMar>
+          </w:tcPr>
+          <w:p>
+            <w:r>
+              <w:rPr>
+                <w:rFonts w:ascii="Times New Roman" w:cs="Times New Roman" w:eastAsia="Times New Roman" w:hAnsi="Times New Roman"/>
+                <w:sz w:val="19"/>
+                <w:szCs w:val="19"/>
+              </w:rPr>
+              <w:t xml:space="preserve">z/Architecture (64-bit); migration documentation; kit build 8</w:t>
+            </w:r>
+          </w:p>
+        </w:tc>
+        <w:tc>
+          <w:tcPr>
+            <w:tcW w:type="dxa" w:w="2200"/>
+            <w:tcMar>
+              <w:top w:type="dxa" w:w="60"/>
+              <w:left w:type="dxa" w:w="100"/>
+              <w:bottom w:type="dxa" w:w="60"/>
+              <w:right w:type="dxa" w:w="100"/>
+            </w:tcMar>
+          </w:tcPr>
+          <w:p>
+            <w:r>
+              <w:rPr>
+                <w:rFonts w:ascii="Times New Roman" w:cs="Times New Roman" w:eastAsia="Times New Roman" w:hAnsi="Times New Roman"/>
+                <w:sz w:val="19"/>
+                <w:szCs w:val="19"/>
+              </w:rPr>
+              <w:t xml:space="preserve">planned</w:t>
+            </w:r>
+          </w:p>
+        </w:tc>
+      </w:tr>
+      <w:tr>
+        <w:trPr>
+          <w:cantSplit/>
+          <w:tblHeader w:val="false"/>
+        </w:trPr>
+        <w:tc>
+          <w:tcPr>
+            <w:tcW w:type="dxa" w:w="1400"/>
+            <w:tcMar>
+              <w:top w:type="dxa" w:w="60"/>
+              <w:left w:type="dxa" w:w="100"/>
+              <w:bottom w:type="dxa" w:w="60"/>
+              <w:right w:type="dxa" w:w="100"/>
+            </w:tcMar>
+          </w:tcPr>
+          <w:p>
+            <w:r>
+              <w:rPr>
+                <w:rFonts w:ascii="Times New Roman" w:cs="Times New Roman" w:eastAsia="Times New Roman" w:hAnsi="Times New Roman"/>
+                <w:sz w:val="19"/>
+                <w:szCs w:val="19"/>
+              </w:rPr>
+              <w:t xml:space="preserve">M11</w:t>
+            </w:r>
+          </w:p>
+        </w:tc>
+        <w:tc>
+          <w:tcPr>
+            <w:tcW w:type="dxa" w:w="6038"/>
+            <w:tcMar>
+              <w:top w:type="dxa" w:w="60"/>
+              <w:left w:type="dxa" w:w="100"/>
+              <w:bottom w:type="dxa" w:w="60"/>
+              <w:right w:type="dxa" w:w="100"/>
+            </w:tcMar>
+          </w:tcPr>
+          <w:p>
+            <w:r>
+              <w:rPr>
+                <w:rFonts w:ascii="Times New Roman" w:cs="Times New Roman" w:eastAsia="Times New Roman" w:hAnsi="Times New Roman"/>
+                <w:sz w:val="19"/>
+                <w:szCs w:val="19"/>
+              </w:rPr>
+              <w:t xml:space="preserve">multiprocessor support; more languages (GNU APL, C++, Java, NetRexx); FreeSWITCH; Node-RED; Docker, QEMU, Bochs; CFSERV; kit build 9</w:t>
+            </w:r>
+          </w:p>
+        </w:tc>
+        <w:tc>
+          <w:tcPr>
+            <w:tcW w:type="dxa" w:w="2200"/>
+            <w:tcMar>
+              <w:top w:type="dxa" w:w="60"/>
+              <w:left w:type="dxa" w:w="100"/>
+              <w:bottom w:type="dxa" w:w="60"/>
+              <w:right w:type="dxa" w:w="100"/>
+            </w:tcMar>
+          </w:tcPr>
+          <w:p>
+            <w:r>
+              <w:rPr>
+                <w:rFonts w:ascii="Times New Roman" w:cs="Times New Roman" w:eastAsia="Times New Roman" w:hAnsi="Times New Roman"/>
+                <w:sz w:val="19"/>
+                <w:szCs w:val="19"/>
+              </w:rPr>
+              <w:t xml:space="preserve">planned</w:t>
             </w:r>
           </w:p>
         </w:tc>

</xml_diff>

<commit_message>
M4b.3 step 6: two Debians at once (I-254 closed); I-263, I-264
- I-263: CP never saved ESA/390 access registers; two Linux guests shared
  one set (Debian 2's init ran with Debian 1's A0). DMKVCSAR keeps them per
  guest in its VCSTAB; DMKDSP LDRPSW swaps the set on a guest switch.
- I-264: the DMKVCS lock retry left the guest in VMEXWAIT (both froze).
Test dd6: both Debians booted together, both at the login prompt, both
answer SSH (10.1.1.2, 10.1.2.2). m5g-native clean at 256 MB.
Milestone workbook and plan page: 4b.3 step 6 done. Guide updated.

Co-Authored-By: Claude Opus 5.5 <noreply@anthropic.com>
Claude-Session: https://claude.ai/code/session_01JBNU8KnKzXkgscse8vw6so
</commit_message>
<xml_diff>
--- a/arch/31bit/manual/VM370PLUS-Guide.docx
+++ b/arch/31bit/manual/VM370PLUS-Guide.docx
@@ -247,7 +247,7 @@
           <w:sz w:val="21"/>
           <w:szCs w:val="21"/>
         </w:rPr>
-        <w:t xml:space="preserve">	2</w:t>
+        <w:t xml:space="preserve">	3</w:t>
       </w:r>
     </w:p>
     <w:p>
@@ -276,7 +276,7 @@
           <w:sz w:val="20"/>
           <w:szCs w:val="20"/>
         </w:rPr>
-        <w:t xml:space="preserve">	2</w:t>
+        <w:t xml:space="preserve">	3</w:t>
       </w:r>
     </w:p>
     <w:p>
@@ -305,7 +305,7 @@
           <w:sz w:val="20"/>
           <w:szCs w:val="20"/>
         </w:rPr>
-        <w:t xml:space="preserve">	2</w:t>
+        <w:t xml:space="preserve">	3</w:t>
       </w:r>
     </w:p>
     <w:p>
@@ -334,7 +334,7 @@
           <w:sz w:val="21"/>
           <w:szCs w:val="21"/>
         </w:rPr>
-        <w:t xml:space="preserve">	4</w:t>
+        <w:t xml:space="preserve">	5</w:t>
       </w:r>
     </w:p>
     <w:p>
@@ -363,7 +363,7 @@
           <w:sz w:val="20"/>
           <w:szCs w:val="20"/>
         </w:rPr>
-        <w:t xml:space="preserve">	4</w:t>
+        <w:t xml:space="preserve">	5</w:t>
       </w:r>
     </w:p>
     <w:p>
@@ -392,7 +392,7 @@
           <w:sz w:val="20"/>
           <w:szCs w:val="20"/>
         </w:rPr>
-        <w:t xml:space="preserve">	4</w:t>
+        <w:t xml:space="preserve">	5</w:t>
       </w:r>
     </w:p>
     <w:p>
@@ -421,7 +421,7 @@
           <w:sz w:val="20"/>
           <w:szCs w:val="20"/>
         </w:rPr>
-        <w:t xml:space="preserve">	5</w:t>
+        <w:t xml:space="preserve">	6</w:t>
       </w:r>
     </w:p>
     <w:p>
@@ -450,7 +450,7 @@
           <w:sz w:val="21"/>
           <w:szCs w:val="21"/>
         </w:rPr>
-        <w:t xml:space="preserve">	6</w:t>
+        <w:t xml:space="preserve">	7</w:t>
       </w:r>
     </w:p>
     <w:p>
@@ -479,7 +479,7 @@
           <w:sz w:val="20"/>
           <w:szCs w:val="20"/>
         </w:rPr>
-        <w:t xml:space="preserve">	6</w:t>
+        <w:t xml:space="preserve">	7</w:t>
       </w:r>
     </w:p>
     <w:p>
@@ -508,7 +508,7 @@
           <w:sz w:val="20"/>
           <w:szCs w:val="20"/>
         </w:rPr>
-        <w:t xml:space="preserve">	6</w:t>
+        <w:t xml:space="preserve">	7</w:t>
       </w:r>
     </w:p>
     <w:p>
@@ -537,7 +537,7 @@
           <w:sz w:val="20"/>
           <w:szCs w:val="20"/>
         </w:rPr>
-        <w:t xml:space="preserve">	6</w:t>
+        <w:t xml:space="preserve">	7</w:t>
       </w:r>
     </w:p>
     <w:p>
@@ -566,7 +566,7 @@
           <w:sz w:val="20"/>
           <w:szCs w:val="20"/>
         </w:rPr>
-        <w:t xml:space="preserve">	7</w:t>
+        <w:t xml:space="preserve">	8</w:t>
       </w:r>
     </w:p>
     <w:p>
@@ -595,7 +595,7 @@
           <w:sz w:val="21"/>
           <w:szCs w:val="21"/>
         </w:rPr>
-        <w:t xml:space="preserve">	8</w:t>
+        <w:t xml:space="preserve">	9</w:t>
       </w:r>
     </w:p>
     <w:p>
@@ -624,7 +624,7 @@
           <w:sz w:val="20"/>
           <w:szCs w:val="20"/>
         </w:rPr>
-        <w:t xml:space="preserve">	8</w:t>
+        <w:t xml:space="preserve">	9</w:t>
       </w:r>
     </w:p>
     <w:p>
@@ -653,7 +653,7 @@
           <w:sz w:val="20"/>
           <w:szCs w:val="20"/>
         </w:rPr>
-        <w:t xml:space="preserve">	8</w:t>
+        <w:t xml:space="preserve">	9</w:t>
       </w:r>
     </w:p>
     <w:p>
@@ -682,7 +682,7 @@
           <w:sz w:val="20"/>
           <w:szCs w:val="20"/>
         </w:rPr>
-        <w:t xml:space="preserve">	8</w:t>
+        <w:t xml:space="preserve">	9</w:t>
       </w:r>
     </w:p>
     <w:p>
@@ -711,7 +711,7 @@
           <w:sz w:val="21"/>
           <w:szCs w:val="21"/>
         </w:rPr>
-        <w:t xml:space="preserve">	9</w:t>
+        <w:t xml:space="preserve">	10</w:t>
       </w:r>
     </w:p>
     <w:p>
@@ -740,7 +740,7 @@
           <w:sz w:val="20"/>
           <w:szCs w:val="20"/>
         </w:rPr>
-        <w:t xml:space="preserve">	9</w:t>
+        <w:t xml:space="preserve">	10</w:t>
       </w:r>
     </w:p>
     <w:p>
@@ -769,7 +769,7 @@
           <w:sz w:val="20"/>
           <w:szCs w:val="20"/>
         </w:rPr>
-        <w:t xml:space="preserve">	9</w:t>
+        <w:t xml:space="preserve">	10</w:t>
       </w:r>
     </w:p>
     <w:p>
@@ -798,7 +798,7 @@
           <w:sz w:val="20"/>
           <w:szCs w:val="20"/>
         </w:rPr>
-        <w:t xml:space="preserve">	9</w:t>
+        <w:t xml:space="preserve">	10</w:t>
       </w:r>
     </w:p>
     <w:p>
@@ -827,7 +827,7 @@
           <w:sz w:val="20"/>
           <w:szCs w:val="20"/>
         </w:rPr>
-        <w:t xml:space="preserve">	10</w:t>
+        <w:t xml:space="preserve">	11</w:t>
       </w:r>
     </w:p>
     <w:p>
@@ -856,7 +856,7 @@
           <w:sz w:val="20"/>
           <w:szCs w:val="20"/>
         </w:rPr>
-        <w:t xml:space="preserve">	10</w:t>
+        <w:t xml:space="preserve">	11</w:t>
       </w:r>
     </w:p>
     <w:p>
@@ -885,7 +885,7 @@
           <w:sz w:val="20"/>
           <w:szCs w:val="20"/>
         </w:rPr>
-        <w:t xml:space="preserve">	11</w:t>
+        <w:t xml:space="preserve">	12</w:t>
       </w:r>
     </w:p>
     <w:p>
@@ -914,7 +914,7 @@
           <w:sz w:val="20"/>
           <w:szCs w:val="20"/>
         </w:rPr>
-        <w:t xml:space="preserve">	11</w:t>
+        <w:t xml:space="preserve">	12</w:t>
       </w:r>
     </w:p>
     <w:p>
@@ -943,7 +943,7 @@
           <w:sz w:val="20"/>
           <w:szCs w:val="20"/>
         </w:rPr>
-        <w:t xml:space="preserve">	12</w:t>
+        <w:t xml:space="preserve">	13</w:t>
       </w:r>
     </w:p>
     <w:p>
@@ -972,7 +972,7 @@
           <w:sz w:val="20"/>
           <w:szCs w:val="20"/>
         </w:rPr>
-        <w:t xml:space="preserve">	13</w:t>
+        <w:t xml:space="preserve">	14</w:t>
       </w:r>
     </w:p>
     <w:p>
@@ -1001,7 +1001,7 @@
           <w:sz w:val="21"/>
           <w:szCs w:val="21"/>
         </w:rPr>
-        <w:t xml:space="preserve">	14</w:t>
+        <w:t xml:space="preserve">	15</w:t>
       </w:r>
     </w:p>
     <w:p>
@@ -1030,7 +1030,7 @@
           <w:sz w:val="20"/>
           <w:szCs w:val="20"/>
         </w:rPr>
-        <w:t xml:space="preserve">	14</w:t>
+        <w:t xml:space="preserve">	15</w:t>
       </w:r>
     </w:p>
     <w:p>
@@ -1059,7 +1059,7 @@
           <w:sz w:val="20"/>
           <w:szCs w:val="20"/>
         </w:rPr>
-        <w:t xml:space="preserve">	14</w:t>
+        <w:t xml:space="preserve">	15</w:t>
       </w:r>
     </w:p>
     <w:p>
@@ -1088,7 +1088,7 @@
           <w:sz w:val="20"/>
           <w:szCs w:val="20"/>
         </w:rPr>
-        <w:t xml:space="preserve">	15</w:t>
+        <w:t xml:space="preserve">	16</w:t>
       </w:r>
     </w:p>
     <w:p>
@@ -1117,7 +1117,7 @@
           <w:sz w:val="21"/>
           <w:szCs w:val="21"/>
         </w:rPr>
-        <w:t xml:space="preserve">	16</w:t>
+        <w:t xml:space="preserve">	17</w:t>
       </w:r>
     </w:p>
     <w:p>
@@ -1146,7 +1146,7 @@
           <w:sz w:val="20"/>
           <w:szCs w:val="20"/>
         </w:rPr>
-        <w:t xml:space="preserve">	16</w:t>
+        <w:t xml:space="preserve">	17</w:t>
       </w:r>
     </w:p>
     <w:p>
@@ -1175,7 +1175,7 @@
           <w:sz w:val="20"/>
           <w:szCs w:val="20"/>
         </w:rPr>
-        <w:t xml:space="preserve">	16</w:t>
+        <w:t xml:space="preserve">	17</w:t>
       </w:r>
     </w:p>
     <w:p>
@@ -1204,7 +1204,7 @@
           <w:sz w:val="20"/>
           <w:szCs w:val="20"/>
         </w:rPr>
-        <w:t xml:space="preserve">	16</w:t>
+        <w:t xml:space="preserve">	17</w:t>
       </w:r>
     </w:p>
     <w:p>
@@ -1233,7 +1233,7 @@
           <w:sz w:val="20"/>
           <w:szCs w:val="20"/>
         </w:rPr>
-        <w:t xml:space="preserve">	16</w:t>
+        <w:t xml:space="preserve">	17</w:t>
       </w:r>
     </w:p>
     <w:p>
@@ -1262,7 +1262,7 @@
           <w:sz w:val="20"/>
           <w:szCs w:val="20"/>
         </w:rPr>
-        <w:t xml:space="preserve">	17</w:t>
+        <w:t xml:space="preserve">	18</w:t>
       </w:r>
     </w:p>
     <w:p>
@@ -1291,7 +1291,7 @@
           <w:sz w:val="20"/>
           <w:szCs w:val="20"/>
         </w:rPr>
-        <w:t xml:space="preserve">	17</w:t>
+        <w:t xml:space="preserve">	18</w:t>
       </w:r>
     </w:p>
     <w:p>
@@ -1320,7 +1320,7 @@
           <w:sz w:val="21"/>
           <w:szCs w:val="21"/>
         </w:rPr>
-        <w:t xml:space="preserve">	19</w:t>
+        <w:t xml:space="preserve">	20</w:t>
       </w:r>
     </w:p>
     <w:p>
@@ -1349,7 +1349,7 @@
           <w:sz w:val="21"/>
           <w:szCs w:val="21"/>
         </w:rPr>
-        <w:t xml:space="preserve">	20</w:t>
+        <w:t xml:space="preserve">	21</w:t>
       </w:r>
     </w:p>
     <w:p>
@@ -1378,7 +1378,7 @@
           <w:sz w:val="20"/>
           <w:szCs w:val="20"/>
         </w:rPr>
-        <w:t xml:space="preserve">	20</w:t>
+        <w:t xml:space="preserve">	21</w:t>
       </w:r>
     </w:p>
     <w:p>
@@ -1407,7 +1407,7 @@
           <w:sz w:val="20"/>
           <w:szCs w:val="20"/>
         </w:rPr>
-        <w:t xml:space="preserve">	20</w:t>
+        <w:t xml:space="preserve">	21</w:t>
       </w:r>
     </w:p>
     <w:p>
@@ -1436,7 +1436,7 @@
           <w:sz w:val="20"/>
           <w:szCs w:val="20"/>
         </w:rPr>
-        <w:t xml:space="preserve">	20</w:t>
+        <w:t xml:space="preserve">	21</w:t>
       </w:r>
     </w:p>
     <w:p>
@@ -1465,7 +1465,7 @@
           <w:sz w:val="20"/>
           <w:szCs w:val="20"/>
         </w:rPr>
-        <w:t xml:space="preserve">	20</w:t>
+        <w:t xml:space="preserve">	21</w:t>
       </w:r>
     </w:p>
     <w:p>
@@ -1494,7 +1494,7 @@
           <w:sz w:val="20"/>
           <w:szCs w:val="20"/>
         </w:rPr>
-        <w:t xml:space="preserve">	20</w:t>
+        <w:t xml:space="preserve">	21</w:t>
       </w:r>
     </w:p>
     <w:p>
@@ -1523,7 +1523,7 @@
           <w:sz w:val="20"/>
           <w:szCs w:val="20"/>
         </w:rPr>
-        <w:t xml:space="preserve">	21</w:t>
+        <w:t xml:space="preserve">	22</w:t>
       </w:r>
     </w:p>
     <w:p>
@@ -1552,7 +1552,7 @@
           <w:sz w:val="20"/>
           <w:szCs w:val="20"/>
         </w:rPr>
-        <w:t xml:space="preserve">	21</w:t>
+        <w:t xml:space="preserve">	22</w:t>
       </w:r>
     </w:p>
     <w:p>
@@ -1581,7 +1581,7 @@
           <w:sz w:val="20"/>
           <w:szCs w:val="20"/>
         </w:rPr>
-        <w:t xml:space="preserve">	22</w:t>
+        <w:t xml:space="preserve">	23</w:t>
       </w:r>
     </w:p>
     <w:p>
@@ -1610,7 +1610,7 @@
           <w:sz w:val="20"/>
           <w:szCs w:val="20"/>
         </w:rPr>
-        <w:t xml:space="preserve">	22</w:t>
+        <w:t xml:space="preserve">	23</w:t>
       </w:r>
     </w:p>
     <w:p>
@@ -1639,7 +1639,7 @@
           <w:sz w:val="21"/>
           <w:szCs w:val="21"/>
         </w:rPr>
-        <w:t xml:space="preserve">	23</w:t>
+        <w:t xml:space="preserve">	24</w:t>
       </w:r>
     </w:p>
     <w:p>
@@ -1668,7 +1668,7 @@
           <w:sz w:val="21"/>
           <w:szCs w:val="21"/>
         </w:rPr>
-        <w:t xml:space="preserve">	24</w:t>
+        <w:t xml:space="preserve">	25</w:t>
       </w:r>
     </w:p>
     <w:p>
@@ -1697,7 +1697,7 @@
           <w:sz w:val="21"/>
           <w:szCs w:val="21"/>
         </w:rPr>
-        <w:t xml:space="preserve">	25</w:t>
+        <w:t xml:space="preserve">	26</w:t>
       </w:r>
     </w:p>
     <w:p>
@@ -1726,7 +1726,7 @@
           <w:sz w:val="20"/>
           <w:szCs w:val="20"/>
         </w:rPr>
-        <w:t xml:space="preserve">	4</w:t>
+        <w:t xml:space="preserve">	5</w:t>
       </w:r>
     </w:p>
     <w:p>
@@ -1755,7 +1755,7 @@
           <w:sz w:val="20"/>
           <w:szCs w:val="20"/>
         </w:rPr>
-        <w:t xml:space="preserve">	29</w:t>
+        <w:t xml:space="preserve">	30</w:t>
       </w:r>
     </w:p>
     <w:p>
@@ -2115,6 +2115,30 @@
           <w:rFonts w:ascii="Times New Roman" w:cs="Times New Roman" w:eastAsia="Times New Roman" w:hAnsi="Times New Roman"/>
         </w:rPr>
         <w:t xml:space="preserve">This edition is kept up to date as VM/370plus grows; each change is listed here, newest first.</w:t>
+      </w:r>
+    </w:p>
+    <w:p>
+      <w:pPr>
+        <w:pStyle w:val="ListParagraph"/>
+        <w:numPr>
+          <w:ilvl w:val="0"/>
+          <w:numId w:val="2"/>
+        </w:numPr>
+        <w:spacing w:after="60"/>
+      </w:pPr>
+      <w:r>
+        <w:rPr>
+          <w:rFonts w:ascii="Times New Roman" w:cs="Times New Roman" w:eastAsia="Times New Roman" w:hAnsi="Times New Roman"/>
+          <w:b/>
+          <w:bCs/>
+        </w:rPr>
+        <w:t xml:space="preserve">11 October 2026, late morning.</w:t>
+      </w:r>
+      <w:r>
+        <w:rPr>
+          <w:rFonts w:ascii="Times New Roman" w:cs="Times New Roman" w:eastAsia="Times New Roman" w:hAnsi="Times New Roman"/>
+        </w:rPr>
+        <w:t xml:space="preserve"> Two Debian systems at once (M4b.3 complete); ESA/390 access registers saved per virtual machine.</w:t>
       </w:r>
     </w:p>
     <w:p>
@@ -3044,7 +3068,7 @@
                 <w:sz w:val="19"/>
                 <w:szCs w:val="19"/>
               </w:rPr>
-              <w:t xml:space="preserve">guest pages in frames up to 160 MB: complete; two Debians at once: next</w:t>
+              <w:t xml:space="preserve">complete: guest pages in frames up to 160 MB; two Debians at once</w:t>
             </w:r>
           </w:p>
         </w:tc>
@@ -3320,7 +3344,7 @@
                 <w:sz w:val="19"/>
                 <w:szCs w:val="19"/>
               </w:rPr>
-              <w:t xml:space="preserve">complete; two Debians at once need M4b.3</w:t>
+              <w:t xml:space="preserve">complete; two Debians at once since M4b.3</w:t>
             </w:r>
           </w:p>
         </w:tc>
@@ -10946,25 +10970,55 @@
     </w:p>
     <w:p>
       <w:pPr>
-        <w:pBdr>
-          <w:left w:val="single" w:color="000000" w:sz="12" w:space="6"/>
-        </w:pBdr>
-        <w:spacing w:after="120" w:before="60"/>
-        <w:ind w:left="567"/>
+        <w:spacing w:after="120"/>
       </w:pPr>
       <w:r>
         <w:rPr>
           <w:rFonts w:ascii="Times New Roman" w:cs="Times New Roman" w:eastAsia="Times New Roman" w:hAnsi="Times New Roman"/>
-          <w:b/>
-          <w:bCs/>
-        </w:rPr>
-        <w:t xml:space="preserve">Attention: </w:t>
-      </w:r>
-      <w:r>
-        <w:rPr>
-          <w:rFonts w:ascii="Times New Roman" w:cs="Times New Roman" w:eastAsia="Times New Roman" w:hAnsi="Times New Roman"/>
-        </w:rPr>
-        <w:t xml:space="preserve">Today one Debian system at a time is practical. Two Debian systems run correctly side by side, but CP keeps its frames in 16 MB of real storage, and two Debian working sets (about 13 MB and 7 MB) do not fit: the scheduler keeps one machine waiting for storage, and it barely moves. Using frames above 16 MB (milestone M4b.3) removes this limit. A Debian system and small Linux systems in storage, or a Debian system and any number of CMS users, run together without problems.</w:t>
+        </w:rPr>
+        <w:t xml:space="preserve">Two Debian systems run at the same time: CP gives virtual machine pages frames above 16 MB (with </w:t>
+      </w:r>
+      <w:r>
+        <w:rPr>
+          <w:rFonts w:ascii="Courier New" w:cs="Courier New" w:eastAsia="Courier New" w:hAnsi="Courier New"/>
+          <w:sz w:val="19"/>
+          <w:szCs w:val="19"/>
+        </w:rPr>
+        <w:t xml:space="preserve">MAINSIZE 256</w:t>
+      </w:r>
+      <w:r>
+        <w:rPr>
+          <w:rFonts w:ascii="Times New Roman" w:cs="Times New Roman" w:eastAsia="Times New Roman" w:hAnsi="Times New Roman"/>
+        </w:rPr>
+        <w:t xml:space="preserve">, up to 160 MB), so both working sets stay in storage. With </w:t>
+      </w:r>
+      <w:r>
+        <w:rPr>
+          <w:rFonts w:ascii="Courier New" w:cs="Courier New" w:eastAsia="Courier New" w:hAnsi="Courier New"/>
+          <w:sz w:val="19"/>
+          <w:szCs w:val="19"/>
+        </w:rPr>
+        <w:t xml:space="preserve">CP IPL LINUX</w:t>
+      </w:r>
+      <w:r>
+        <w:rPr>
+          <w:rFonts w:ascii="Times New Roman" w:cs="Times New Roman" w:eastAsia="Times New Roman" w:hAnsi="Times New Roman"/>
+        </w:rPr>
+        <w:t xml:space="preserve"> from the disk, each system takes the IP address in the disk’s own parameters; give the second one its address with </w:t>
+      </w:r>
+      <w:r>
+        <w:rPr>
+          <w:rFonts w:ascii="Courier New" w:cs="Courier New" w:eastAsia="Courier New" w:hAnsi="Courier New"/>
+          <w:sz w:val="19"/>
+          <w:szCs w:val="19"/>
+        </w:rPr>
+        <w:t xml:space="preserve">ip addr</w:t>
+      </w:r>
+      <w:r>
+        <w:rPr>
+          <w:rFonts w:ascii="Times New Roman" w:cs="Times New Roman" w:eastAsia="Times New Roman" w:hAnsi="Times New Roman"/>
+        </w:rPr>
+        <w:t xml:space="preserve"> (or IPL it from the reader with LINUX EXEC and its LXPARM).</w:t>
       </w:r>
     </w:p>
     <w:p>

</xml_diff>

<commit_message>
9.12a: per-user Linux address from the CTC pair (I-266); I-269 DMKVDA SAVEWRK5 flags; network plan (docs/61), guide
Co-Authored-By: Claude Opus 5.5 <noreply@anthropic.com>
Claude-Session: https://claude.ai/code/session_01JBNU8KnKzXkgscse8vw6so
</commit_message>
<xml_diff>
--- a/arch/31bit/manual/VM370PLUS-Guide.docx
+++ b/arch/31bit/manual/VM370PLUS-Guide.docx
@@ -2115,6 +2115,44 @@
           <w:rFonts w:ascii="Times New Roman" w:cs="Times New Roman" w:eastAsia="Times New Roman" w:hAnsi="Times New Roman"/>
         </w:rPr>
         <w:t xml:space="preserve">This edition is kept up to date as VM/370plus grows; each change is listed here, newest first.</w:t>
+      </w:r>
+    </w:p>
+    <w:p>
+      <w:pPr>
+        <w:pStyle w:val="ListParagraph"/>
+        <w:numPr>
+          <w:ilvl w:val="0"/>
+          <w:numId w:val="2"/>
+        </w:numPr>
+        <w:spacing w:after="60"/>
+      </w:pPr>
+      <w:r>
+        <w:rPr>
+          <w:rFonts w:ascii="Times New Roman" w:cs="Times New Roman" w:eastAsia="Times New Roman" w:hAnsi="Times New Roman"/>
+          <w:b/>
+          <w:bCs/>
+        </w:rPr>
+        <w:t xml:space="preserve">11 October 2026, afternoon.</w:t>
+      </w:r>
+      <w:r>
+        <w:rPr>
+          <w:rFonts w:ascii="Times New Roman" w:cs="Times New Roman" w:eastAsia="Times New Roman" w:hAnsi="Times New Roman"/>
+        </w:rPr>
+        <w:t xml:space="preserve"> </w:t>
+      </w:r>
+      <w:r>
+        <w:rPr>
+          <w:rFonts w:ascii="Courier New" w:cs="Courier New" w:eastAsia="Courier New" w:hAnsi="Courier New"/>
+          <w:sz w:val="19"/>
+          <w:szCs w:val="19"/>
+        </w:rPr>
+        <w:t xml:space="preserve">SHUTDOWN</w:t>
+      </w:r>
+      <w:r>
+        <w:rPr>
+          <w:rFonts w:ascii="Times New Roman" w:cs="Times New Roman" w:eastAsia="Times New Roman" w:hAnsi="Times New Roman"/>
+        </w:rPr>
+        <w:t xml:space="preserve"> saves warm start data again and the next IPL warm-starts by itself, spool intact (I-267, I-268); each Linux user’s address follows his CTC pair (9.12a); ATTACH of a CTC next to another no longer stops CP (I-269).</w:t>
       </w:r>
     </w:p>
     <w:p>
@@ -8062,7 +8100,7 @@
         <w:rPr>
           <w:rFonts w:ascii="Times New Roman" w:cs="Times New Roman" w:eastAsia="Times New Roman" w:hAnsi="Times New Roman"/>
         </w:rPr>
-        <w:t xml:space="preserve">Each device must be on its own virtual control unit (620 and 630, not 620 and 621). For a permanent arrangement put </w:t>
+        <w:t xml:space="preserve">Each device must be on its own virtual control unit (620 and 630, not 620 and 621). The second user’s pair 602/603 goes to 622 and 632, which gives that machine 10.1.2.2. For a permanent arrangement put </w:t>
       </w:r>
       <w:r>
         <w:rPr>
@@ -10776,7 +10814,7 @@
         <w:rPr>
           <w:rFonts w:ascii="Times New Roman" w:cs="Times New Roman" w:eastAsia="Times New Roman" w:hAnsi="Times New Roman"/>
         </w:rPr>
-        <w:t xml:space="preserve">Each Linux user needs his own copy of the Debian disk, his own CTC pair with a CTCI line in </w:t>
+        <w:t xml:space="preserve">Each Linux user needs his own copy of the Debian disk and his own CTC pair with a CTCI line in </w:t>
       </w:r>
       <w:r>
         <w:rPr>
@@ -10790,7 +10828,7 @@
         <w:rPr>
           <w:rFonts w:ascii="Times New Roman" w:cs="Times New Roman" w:eastAsia="Times New Roman" w:hAnsi="Times New Roman"/>
         </w:rPr>
-        <w:t xml:space="preserve"> and his own IP address in </w:t>
+        <w:t xml:space="preserve">. The address follows the pair: real pair 06xx, attached as 62x and 63x (x = xx: 600/601 as 620/630, 602/603 as 622/632) or at its real address, gives the guest 10.1.n.2 with n = xx/2 + 1, and the CTCI line’s PC end is 10.1.n.1. A boot script on the Debian disk (</w:t>
       </w:r>
       <w:r>
         <w:rPr>
@@ -10798,13 +10836,13 @@
           <w:sz w:val="19"/>
           <w:szCs w:val="19"/>
         </w:rPr>
-        <w:t xml:space="preserve">userid LXPARM</w:t>
-      </w:r>
-      <w:r>
-        <w:rPr>
-          <w:rFonts w:ascii="Times New Roman" w:cs="Times New Roman" w:eastAsia="Times New Roman" w:hAnsi="Times New Roman"/>
-        </w:rPr>
-        <w:t xml:space="preserve">. The kit’s example: MAINT on 600/601 and 190, address 10.1.1.2; CMSUSER on 602/603 and 191, address 10.1.2.2.</w:t>
+        <w:t xml:space="preserve">vm370plus-net</w:t>
+      </w:r>
+      <w:r>
+        <w:rPr>
+          <w:rFonts w:ascii="Times New Roman" w:cs="Times New Roman" w:eastAsia="Times New Roman" w:hAnsi="Times New Roman"/>
+        </w:rPr>
+        <w:t xml:space="preserve">) sets it, so one disk image serves every user. The kit’s example: MAINT on 600/601 and 190, address 10.1.1.2; CMSUSER on 602/603 and 191, address 10.1.2.2.</w:t>
       </w:r>
     </w:p>
     <w:tbl>

</xml_diff>

<commit_message>
I-265 fixed (DMKVSP page-crossing spool move kept the CCW op code in AMODE 31: LINUX READER boots again); TDISK EXEC + HELP (owner request); plan 9.15 Python, 9.16 TDISK; guide
Co-Authored-By: Claude Opus 5.5 <noreply@anthropic.com>
Claude-Session: https://claude.ai/code/session_01JBNU8KnKzXkgscse8vw6so
</commit_message>
<xml_diff>
--- a/arch/31bit/manual/VM370PLUS-Guide.docx
+++ b/arch/31bit/manual/VM370PLUS-Guide.docx
@@ -1543,6 +1543,35 @@
           <w:szCs w:val="20"/>
         </w:rPr>
         <w:t xml:space="preserve">FULIST</w:t>
+      </w:r>
+      <w:r>
+        <w:rPr>
+          <w:rFonts w:ascii="Times New Roman" w:cs="Times New Roman" w:eastAsia="Times New Roman" w:hAnsi="Times New Roman"/>
+          <w:b w:val="false"/>
+          <w:bCs w:val="false"/>
+          <w:sz w:val="20"/>
+          <w:szCs w:val="20"/>
+        </w:rPr>
+        <w:t xml:space="preserve">	22</w:t>
+      </w:r>
+    </w:p>
+    <w:p>
+      <w:pPr>
+        <w:tabs>
+          <w:tab w:val="right" w:pos="9638" w:leader="dot"/>
+        </w:tabs>
+        <w:spacing w:after="20" w:before="20"/>
+        <w:ind w:left="400"/>
+      </w:pPr>
+      <w:r>
+        <w:rPr>
+          <w:rFonts w:ascii="Times New Roman" w:cs="Times New Roman" w:eastAsia="Times New Roman" w:hAnsi="Times New Roman"/>
+          <w:b w:val="false"/>
+          <w:bCs w:val="false"/>
+          <w:sz w:val="20"/>
+          <w:szCs w:val="20"/>
+        </w:rPr>
+        <w:t xml:space="preserve">TDISK</w:t>
       </w:r>
       <w:r>
         <w:rPr>
@@ -2115,6 +2144,58 @@
           <w:rFonts w:ascii="Times New Roman" w:cs="Times New Roman" w:eastAsia="Times New Roman" w:hAnsi="Times New Roman"/>
         </w:rPr>
         <w:t xml:space="preserve">This edition is kept up to date as VM/370plus grows; each change is listed here, newest first.</w:t>
+      </w:r>
+    </w:p>
+    <w:p>
+      <w:pPr>
+        <w:pStyle w:val="ListParagraph"/>
+        <w:numPr>
+          <w:ilvl w:val="0"/>
+          <w:numId w:val="2"/>
+        </w:numPr>
+        <w:spacing w:after="60"/>
+      </w:pPr>
+      <w:r>
+        <w:rPr>
+          <w:rFonts w:ascii="Times New Roman" w:cs="Times New Roman" w:eastAsia="Times New Roman" w:hAnsi="Times New Roman"/>
+          <w:b/>
+          <w:bCs/>
+        </w:rPr>
+        <w:t xml:space="preserve">11 October 2026, late afternoon.</w:t>
+      </w:r>
+      <w:r>
+        <w:rPr>
+          <w:rFonts w:ascii="Times New Roman" w:cs="Times New Roman" w:eastAsia="Times New Roman" w:hAnsi="Times New Roman"/>
+        </w:rPr>
+        <w:t xml:space="preserve"> </w:t>
+      </w:r>
+      <w:r>
+        <w:rPr>
+          <w:rFonts w:ascii="Courier New" w:cs="Courier New" w:eastAsia="Courier New" w:hAnsi="Courier New"/>
+          <w:sz w:val="19"/>
+          <w:szCs w:val="19"/>
+        </w:rPr>
+        <w:t xml:space="preserve">TDISK</w:t>
+      </w:r>
+      <w:r>
+        <w:rPr>
+          <w:rFonts w:ascii="Times New Roman" w:cs="Times New Roman" w:eastAsia="Times New Roman" w:hAnsi="Times New Roman"/>
+        </w:rPr>
+        <w:t xml:space="preserve"> (a temporary disk in one step); Linux IPLs from the reader again (I-265); </w:t>
+      </w:r>
+      <w:r>
+        <w:rPr>
+          <w:rFonts w:ascii="Courier New" w:cs="Courier New" w:eastAsia="Courier New" w:hAnsi="Courier New"/>
+          <w:sz w:val="19"/>
+          <w:szCs w:val="19"/>
+        </w:rPr>
+        <w:t xml:space="preserve">LPSW</w:t>
+      </w:r>
+      <w:r>
+        <w:rPr>
+          <w:rFonts w:ascii="Times New Roman" w:cs="Times New Roman" w:eastAsia="Times New Roman" w:hAnsi="Times New Roman"/>
+        </w:rPr>
+        <w:t xml:space="preserve">/SVC fast paths for PSWs above 16 MB.</w:t>
       </w:r>
     </w:p>
     <w:p>
@@ -18772,7 +18853,7 @@
         <w:pStyle w:val="Heading2"/>
       </w:pPr>
       <w:r>
-        <w:t xml:space="preserve">GLOBALV</w:t>
+        <w:t xml:space="preserve">TDISK</w:t>
       </w:r>
     </w:p>
     <w:tbl>
@@ -18815,59 +18896,7 @@
                 <w:sz w:val="17"/>
                 <w:szCs w:val="17"/>
               </w:rPr>
-              <w:t xml:space="preserve">GLOBALV [SELECT group] SET|SETS|SETL|SETP name value</w:t>
-            </w:r>
-          </w:p>
-          <w:p>
-            <w:pPr>
-              <w:spacing w:after="0" w:line="228"/>
-            </w:pPr>
-            <w:r>
-              <w:rPr>
-                <w:rFonts w:ascii="Courier New" w:cs="Courier New" w:eastAsia="Courier New" w:hAnsi="Courier New"/>
-                <w:sz w:val="17"/>
-                <w:szCs w:val="17"/>
-              </w:rPr>
-              <w:t xml:space="preserve">GLOBALV [SELECT group] PUT|PUTS|PUTL|PUTP name ...</w:t>
-            </w:r>
-          </w:p>
-          <w:p>
-            <w:pPr>
-              <w:spacing w:after="0" w:line="228"/>
-            </w:pPr>
-            <w:r>
-              <w:rPr>
-                <w:rFonts w:ascii="Courier New" w:cs="Courier New" w:eastAsia="Courier New" w:hAnsi="Courier New"/>
-                <w:sz w:val="17"/>
-                <w:szCs w:val="17"/>
-              </w:rPr>
-              <w:t xml:space="preserve">GLOBALV [SELECT group] GET|STACK name ...</w:t>
-            </w:r>
-          </w:p>
-          <w:p>
-            <w:pPr>
-              <w:spacing w:after="0" w:line="228"/>
-            </w:pPr>
-            <w:r>
-              <w:rPr>
-                <w:rFonts w:ascii="Courier New" w:cs="Courier New" w:eastAsia="Courier New" w:hAnsi="Courier New"/>
-                <w:sz w:val="17"/>
-                <w:szCs w:val="17"/>
-              </w:rPr>
-              <w:t xml:space="preserve">GLOBALV [SELECT group] LIST [name ...]|PURGE</w:t>
-            </w:r>
-          </w:p>
-          <w:p>
-            <w:pPr>
-              <w:spacing w:after="0" w:line="228"/>
-            </w:pPr>
-            <w:r>
-              <w:rPr>
-                <w:rFonts w:ascii="Courier New" w:cs="Courier New" w:eastAsia="Courier New" w:hAnsi="Courier New"/>
-                <w:sz w:val="17"/>
-                <w:szCs w:val="17"/>
-              </w:rPr>
-              <w:t xml:space="preserve">GLOBALV GRPLIST</w:t>
+              <w:t xml:space="preserve">TDISK [cyls] [fm]</w:t>
             </w:r>
           </w:p>
         </w:tc>
@@ -18893,7 +18922,7 @@
           <w:sz w:val="18"/>
           <w:szCs w:val="18"/>
         </w:rPr>
-        <w:t xml:space="preserve">GLOBALV</w:t>
+        <w:t xml:space="preserve">TDISK</w:t>
       </w:r>
     </w:p>
     <w:p>
@@ -18904,35 +18933,7 @@
         <w:rPr>
           <w:rFonts w:ascii="Times New Roman" w:cs="Times New Roman" w:eastAsia="Times New Roman" w:hAnsi="Times New Roman"/>
         </w:rPr>
-        <w:t xml:space="preserve">New; a subset of z/VM’s GLOBALV. Variables live in groups (UNNAMED unless SELECT names one). </w:t>
-      </w:r>
-      <w:r>
-        <w:rPr>
-          <w:rFonts w:ascii="Times New Roman" w:cs="Times New Roman" w:eastAsia="Times New Roman" w:hAnsi="Times New Roman"/>
-          <w:b/>
-          <w:bCs/>
-        </w:rPr>
-        <w:t xml:space="preserve">SET</w:t>
-      </w:r>
-      <w:r>
-        <w:rPr>
-          <w:rFonts w:ascii="Times New Roman" w:cs="Times New Roman" w:eastAsia="Times New Roman" w:hAnsi="Times New Roman"/>
-        </w:rPr>
-        <w:t xml:space="preserve"> keeps a value until the next IPL of CMS, </w:t>
-      </w:r>
-      <w:r>
-        <w:rPr>
-          <w:rFonts w:ascii="Times New Roman" w:cs="Times New Roman" w:eastAsia="Times New Roman" w:hAnsi="Times New Roman"/>
-          <w:b/>
-          <w:bCs/>
-        </w:rPr>
-        <w:t xml:space="preserve">SETS</w:t>
-      </w:r>
-      <w:r>
-        <w:rPr>
-          <w:rFonts w:ascii="Times New Roman" w:cs="Times New Roman" w:eastAsia="Times New Roman" w:hAnsi="Times New Roman"/>
-        </w:rPr>
-        <w:t xml:space="preserve"> also in </w:t>
+        <w:t xml:space="preserve">On MAINT 19D (new). A temporary disk in one step: CP defines it (</w:t>
       </w:r>
       <w:r>
         <w:rPr>
@@ -18940,13 +18941,13 @@
           <w:sz w:val="19"/>
           <w:szCs w:val="19"/>
         </w:rPr>
-        <w:t xml:space="preserve">SESSION GLOBALV A</w:t>
-      </w:r>
-      <w:r>
-        <w:rPr>
-          <w:rFonts w:ascii="Times New Roman" w:cs="Times New Roman" w:eastAsia="Times New Roman" w:hAnsi="Times New Roman"/>
-        </w:rPr>
-        <w:t xml:space="preserve"> (erased at the next IPL), </w:t>
+        <w:t xml:space="preserve">DEFINE T3350</w:t>
+      </w:r>
+      <w:r>
+        <w:rPr>
+          <w:rFonts w:ascii="Times New Roman" w:cs="Times New Roman" w:eastAsia="Times New Roman" w:hAnsi="Times New Roman"/>
+        </w:rPr>
+        <w:t xml:space="preserve">) at the first free address from D00 to D1F, CMS formats it with the label TMPvaddr and, if a file mode is given, accesses it. </w:t>
       </w:r>
       <w:r>
         <w:rPr>
@@ -18954,13 +18955,27 @@
           <w:b/>
           <w:bCs/>
         </w:rPr>
-        <w:t xml:space="preserve">SETL</w:t>
-      </w:r>
-      <w:r>
-        <w:rPr>
-          <w:rFonts w:ascii="Times New Roman" w:cs="Times New Roman" w:eastAsia="Times New Roman" w:hAnsi="Times New Roman"/>
-        </w:rPr>
-        <w:t xml:space="preserve"> in </w:t>
+        <w:t xml:space="preserve">cyls</w:t>
+      </w:r>
+      <w:r>
+        <w:rPr>
+          <w:rFonts w:ascii="Times New Roman" w:cs="Times New Roman" w:eastAsia="Times New Roman" w:hAnsi="Times New Roman"/>
+        </w:rPr>
+        <w:t xml:space="preserve"> is 1 to 100 cylinders, default 10 (about 5 MB); without </w:t>
+      </w:r>
+      <w:r>
+        <w:rPr>
+          <w:rFonts w:ascii="Times New Roman" w:cs="Times New Roman" w:eastAsia="Times New Roman" w:hAnsi="Times New Roman"/>
+          <w:b/>
+          <w:bCs/>
+        </w:rPr>
+        <w:t xml:space="preserve">fm</w:t>
+      </w:r>
+      <w:r>
+        <w:rPr>
+          <w:rFonts w:ascii="Times New Roman" w:cs="Times New Roman" w:eastAsia="Times New Roman" w:hAnsi="Times New Roman"/>
+        </w:rPr>
+        <w:t xml:space="preserve"> the disk is formatted but not accessed. The operands may come in either order. Return codes: 24 invalid operands, 28 the file mode is in use, 32 no free address or no TEMP space; otherwise FORMAT’s. The contents are lost at LOGOFF or DETACH. </w:t>
       </w:r>
       <w:r>
         <w:rPr>
@@ -18968,69 +18983,13 @@
           <w:sz w:val="19"/>
           <w:szCs w:val="19"/>
         </w:rPr>
-        <w:t xml:space="preserve">LASTING GLOBALV A</w:t>
-      </w:r>
-      <w:r>
-        <w:rPr>
-          <w:rFonts w:ascii="Times New Roman" w:cs="Times New Roman" w:eastAsia="Times New Roman" w:hAnsi="Times New Roman"/>
-        </w:rPr>
-        <w:t xml:space="preserve"> (read again at every IPL), </w:t>
-      </w:r>
-      <w:r>
-        <w:rPr>
-          <w:rFonts w:ascii="Times New Roman" w:cs="Times New Roman" w:eastAsia="Times New Roman" w:hAnsi="Times New Roman"/>
-          <w:b/>
-          <w:bCs/>
-        </w:rPr>
-        <w:t xml:space="preserve">SETP</w:t>
-      </w:r>
-      <w:r>
-        <w:rPr>
-          <w:rFonts w:ascii="Times New Roman" w:cs="Times New Roman" w:eastAsia="Times New Roman" w:hAnsi="Times New Roman"/>
-        </w:rPr>
-        <w:t xml:space="preserve"> both. </w:t>
-      </w:r>
-      <w:r>
-        <w:rPr>
-          <w:rFonts w:ascii="Times New Roman" w:cs="Times New Roman" w:eastAsia="Times New Roman" w:hAnsi="Times New Roman"/>
-          <w:b/>
-          <w:bCs/>
-        </w:rPr>
-        <w:t xml:space="preserve">PUT</w:t>
-      </w:r>
-      <w:r>
-        <w:rPr>
-          <w:rFonts w:ascii="Times New Roman" w:cs="Times New Roman" w:eastAsia="Times New Roman" w:hAnsi="Times New Roman"/>
-        </w:rPr>
-        <w:t xml:space="preserve"> takes the values of the calling EXEC’s REXX variables, </w:t>
-      </w:r>
-      <w:r>
-        <w:rPr>
-          <w:rFonts w:ascii="Times New Roman" w:cs="Times New Roman" w:eastAsia="Times New Roman" w:hAnsi="Times New Roman"/>
-          <w:b/>
-          <w:bCs/>
-        </w:rPr>
-        <w:t xml:space="preserve">GET</w:t>
-      </w:r>
-      <w:r>
-        <w:rPr>
-          <w:rFonts w:ascii="Times New Roman" w:cs="Times New Roman" w:eastAsia="Times New Roman" w:hAnsi="Times New Roman"/>
-        </w:rPr>
-        <w:t xml:space="preserve"> sets them, </w:t>
-      </w:r>
-      <w:r>
-        <w:rPr>
-          <w:rFonts w:ascii="Times New Roman" w:cs="Times New Roman" w:eastAsia="Times New Roman" w:hAnsi="Times New Roman"/>
-          <w:b/>
-          <w:bCs/>
-        </w:rPr>
-        <w:t xml:space="preserve">STACK</w:t>
-      </w:r>
-      <w:r>
-        <w:rPr>
-          <w:rFonts w:ascii="Times New Roman" w:cs="Times New Roman" w:eastAsia="Times New Roman" w:hAnsi="Times New Roman"/>
-        </w:rPr>
-        <w:t xml:space="preserve"> puts values on the console stack. A null value drops a variable. Names up to 32 characters, values up to 255, 128 variables. GLOBALV is a nucleus extension, loaded at IPL by the system profile.</w:t>
+        <w:t xml:space="preserve">HELP TDISK</w:t>
+      </w:r>
+      <w:r>
+        <w:rPr>
+          <w:rFonts w:ascii="Times New Roman" w:cs="Times New Roman" w:eastAsia="Times New Roman" w:hAnsi="Times New Roman"/>
+        </w:rPr>
+        <w:t xml:space="preserve"> describes it.</w:t>
       </w:r>
     </w:p>
     <w:tbl>
@@ -19073,7 +19032,7 @@
                 <w:sz w:val="17"/>
                 <w:szCs w:val="17"/>
               </w:rPr>
-              <w:t xml:space="preserve">globalv select fulist setl editor EE</w:t>
+              <w:t xml:space="preserve">tdisk 5 t</w:t>
             </w:r>
           </w:p>
           <w:p>
@@ -19086,7 +19045,7 @@
                 <w:sz w:val="17"/>
                 <w:szCs w:val="17"/>
               </w:rPr>
-              <w:t xml:space="preserve">globalv select fulist list</w:t>
+              <w:t xml:space="preserve">DASD D00 DEFINED 0005 CYL</w:t>
             </w:r>
           </w:p>
           <w:p>
@@ -19099,7 +19058,20 @@
                 <w:sz w:val="17"/>
                 <w:szCs w:val="17"/>
               </w:rPr>
-              <w:t xml:space="preserve">FULIST   EDITOR = EE</w:t>
+              <w:t xml:space="preserve">TDISK: disk D00 is ready as T, 5 cylinders, label TMPD00</w:t>
+            </w:r>
+          </w:p>
+          <w:p>
+            <w:pPr>
+              <w:spacing w:after="0" w:line="228"/>
+            </w:pPr>
+            <w:r>
+              <w:rPr>
+                <w:rFonts w:ascii="Courier New" w:cs="Courier New" w:eastAsia="Courier New" w:hAnsi="Courier New"/>
+                <w:sz w:val="17"/>
+                <w:szCs w:val="17"/>
+              </w:rPr>
+              <w:t xml:space="preserve">Ready;</w:t>
             </w:r>
           </w:p>
         </w:tc>
@@ -19125,46 +19097,7 @@
           <w:sz w:val="18"/>
           <w:szCs w:val="18"/>
         </w:rPr>
-        <w:t xml:space="preserve">GLOBALV</w:t>
-      </w:r>
-    </w:p>
-    <w:p>
-      <w:pPr>
-        <w:spacing w:after="120"/>
-      </w:pPr>
-      <w:r>
-        <w:rPr>
-          <w:rFonts w:ascii="Times New Roman" w:cs="Times New Roman" w:eastAsia="Times New Roman" w:hAnsi="Times New Roman"/>
-        </w:rPr>
-        <w:t xml:space="preserve">FULIST takes its editor and browser from the group FULIST (</w:t>
-      </w:r>
-      <w:r>
-        <w:rPr>
-          <w:rFonts w:ascii="Courier New" w:cs="Courier New" w:eastAsia="Courier New" w:hAnsi="Courier New"/>
-          <w:sz w:val="19"/>
-          <w:szCs w:val="19"/>
-        </w:rPr>
-        <w:t xml:space="preserve">EDITOR</w:t>
-      </w:r>
-      <w:r>
-        <w:rPr>
-          <w:rFonts w:ascii="Times New Roman" w:cs="Times New Roman" w:eastAsia="Times New Roman" w:hAnsi="Times New Roman"/>
-        </w:rPr>
-        <w:t xml:space="preserve">, </w:t>
-      </w:r>
-      <w:r>
-        <w:rPr>
-          <w:rFonts w:ascii="Courier New" w:cs="Courier New" w:eastAsia="Courier New" w:hAnsi="Courier New"/>
-          <w:sz w:val="19"/>
-          <w:szCs w:val="19"/>
-        </w:rPr>
-        <w:t xml:space="preserve">BROWSER</w:t>
-      </w:r>
-      <w:r>
-        <w:rPr>
-          <w:rFonts w:ascii="Times New Roman" w:cs="Times New Roman" w:eastAsia="Times New Roman" w:hAnsi="Times New Roman"/>
-        </w:rPr>
-        <w:t xml:space="preserve">) when they are set.</w:t>
+        <w:t xml:space="preserve">TDISK</w:t>
       </w:r>
     </w:p>
     <w:p>
@@ -19172,7 +19105,7 @@
         <w:pStyle w:val="Heading2"/>
       </w:pPr>
       <w:r>
-        <w:t xml:space="preserve">LINUX EXEC</w:t>
+        <w:t xml:space="preserve">GLOBALV</w:t>
       </w:r>
     </w:p>
     <w:tbl>
@@ -19215,7 +19148,59 @@
                 <w:sz w:val="17"/>
                 <w:szCs w:val="17"/>
               </w:rPr>
-              <w:t xml:space="preserve">LINUX [DISK|READER]</w:t>
+              <w:t xml:space="preserve">GLOBALV [SELECT group] SET|SETS|SETL|SETP name value</w:t>
+            </w:r>
+          </w:p>
+          <w:p>
+            <w:pPr>
+              <w:spacing w:after="0" w:line="228"/>
+            </w:pPr>
+            <w:r>
+              <w:rPr>
+                <w:rFonts w:ascii="Courier New" w:cs="Courier New" w:eastAsia="Courier New" w:hAnsi="Courier New"/>
+                <w:sz w:val="17"/>
+                <w:szCs w:val="17"/>
+              </w:rPr>
+              <w:t xml:space="preserve">GLOBALV [SELECT group] PUT|PUTS|PUTL|PUTP name ...</w:t>
+            </w:r>
+          </w:p>
+          <w:p>
+            <w:pPr>
+              <w:spacing w:after="0" w:line="228"/>
+            </w:pPr>
+            <w:r>
+              <w:rPr>
+                <w:rFonts w:ascii="Courier New" w:cs="Courier New" w:eastAsia="Courier New" w:hAnsi="Courier New"/>
+                <w:sz w:val="17"/>
+                <w:szCs w:val="17"/>
+              </w:rPr>
+              <w:t xml:space="preserve">GLOBALV [SELECT group] GET|STACK name ...</w:t>
+            </w:r>
+          </w:p>
+          <w:p>
+            <w:pPr>
+              <w:spacing w:after="0" w:line="228"/>
+            </w:pPr>
+            <w:r>
+              <w:rPr>
+                <w:rFonts w:ascii="Courier New" w:cs="Courier New" w:eastAsia="Courier New" w:hAnsi="Courier New"/>
+                <w:sz w:val="17"/>
+                <w:szCs w:val="17"/>
+              </w:rPr>
+              <w:t xml:space="preserve">GLOBALV [SELECT group] LIST [name ...]|PURGE</w:t>
+            </w:r>
+          </w:p>
+          <w:p>
+            <w:pPr>
+              <w:spacing w:after="0" w:line="228"/>
+            </w:pPr>
+            <w:r>
+              <w:rPr>
+                <w:rFonts w:ascii="Courier New" w:cs="Courier New" w:eastAsia="Courier New" w:hAnsi="Courier New"/>
+                <w:sz w:val="17"/>
+                <w:szCs w:val="17"/>
+              </w:rPr>
+              <w:t xml:space="preserve">GLOBALV GRPLIST</w:t>
             </w:r>
           </w:p>
         </w:tc>
@@ -19234,6 +19219,354 @@
           <w:szCs w:val="18"/>
         </w:rPr>
         <w:t xml:space="preserve">Figure 42. </w:t>
+      </w:r>
+      <w:r>
+        <w:rPr>
+          <w:rFonts w:ascii="Arial" w:cs="Arial" w:eastAsia="Arial" w:hAnsi="Arial"/>
+          <w:sz w:val="18"/>
+          <w:szCs w:val="18"/>
+        </w:rPr>
+        <w:t xml:space="preserve">GLOBALV</w:t>
+      </w:r>
+    </w:p>
+    <w:p>
+      <w:pPr>
+        <w:spacing w:after="120"/>
+      </w:pPr>
+      <w:r>
+        <w:rPr>
+          <w:rFonts w:ascii="Times New Roman" w:cs="Times New Roman" w:eastAsia="Times New Roman" w:hAnsi="Times New Roman"/>
+        </w:rPr>
+        <w:t xml:space="preserve">New; a subset of z/VM’s GLOBALV. Variables live in groups (UNNAMED unless SELECT names one). </w:t>
+      </w:r>
+      <w:r>
+        <w:rPr>
+          <w:rFonts w:ascii="Times New Roman" w:cs="Times New Roman" w:eastAsia="Times New Roman" w:hAnsi="Times New Roman"/>
+          <w:b/>
+          <w:bCs/>
+        </w:rPr>
+        <w:t xml:space="preserve">SET</w:t>
+      </w:r>
+      <w:r>
+        <w:rPr>
+          <w:rFonts w:ascii="Times New Roman" w:cs="Times New Roman" w:eastAsia="Times New Roman" w:hAnsi="Times New Roman"/>
+        </w:rPr>
+        <w:t xml:space="preserve"> keeps a value until the next IPL of CMS, </w:t>
+      </w:r>
+      <w:r>
+        <w:rPr>
+          <w:rFonts w:ascii="Times New Roman" w:cs="Times New Roman" w:eastAsia="Times New Roman" w:hAnsi="Times New Roman"/>
+          <w:b/>
+          <w:bCs/>
+        </w:rPr>
+        <w:t xml:space="preserve">SETS</w:t>
+      </w:r>
+      <w:r>
+        <w:rPr>
+          <w:rFonts w:ascii="Times New Roman" w:cs="Times New Roman" w:eastAsia="Times New Roman" w:hAnsi="Times New Roman"/>
+        </w:rPr>
+        <w:t xml:space="preserve"> also in </w:t>
+      </w:r>
+      <w:r>
+        <w:rPr>
+          <w:rFonts w:ascii="Courier New" w:cs="Courier New" w:eastAsia="Courier New" w:hAnsi="Courier New"/>
+          <w:sz w:val="19"/>
+          <w:szCs w:val="19"/>
+        </w:rPr>
+        <w:t xml:space="preserve">SESSION GLOBALV A</w:t>
+      </w:r>
+      <w:r>
+        <w:rPr>
+          <w:rFonts w:ascii="Times New Roman" w:cs="Times New Roman" w:eastAsia="Times New Roman" w:hAnsi="Times New Roman"/>
+        </w:rPr>
+        <w:t xml:space="preserve"> (erased at the next IPL), </w:t>
+      </w:r>
+      <w:r>
+        <w:rPr>
+          <w:rFonts w:ascii="Times New Roman" w:cs="Times New Roman" w:eastAsia="Times New Roman" w:hAnsi="Times New Roman"/>
+          <w:b/>
+          <w:bCs/>
+        </w:rPr>
+        <w:t xml:space="preserve">SETL</w:t>
+      </w:r>
+      <w:r>
+        <w:rPr>
+          <w:rFonts w:ascii="Times New Roman" w:cs="Times New Roman" w:eastAsia="Times New Roman" w:hAnsi="Times New Roman"/>
+        </w:rPr>
+        <w:t xml:space="preserve"> in </w:t>
+      </w:r>
+      <w:r>
+        <w:rPr>
+          <w:rFonts w:ascii="Courier New" w:cs="Courier New" w:eastAsia="Courier New" w:hAnsi="Courier New"/>
+          <w:sz w:val="19"/>
+          <w:szCs w:val="19"/>
+        </w:rPr>
+        <w:t xml:space="preserve">LASTING GLOBALV A</w:t>
+      </w:r>
+      <w:r>
+        <w:rPr>
+          <w:rFonts w:ascii="Times New Roman" w:cs="Times New Roman" w:eastAsia="Times New Roman" w:hAnsi="Times New Roman"/>
+        </w:rPr>
+        <w:t xml:space="preserve"> (read again at every IPL), </w:t>
+      </w:r>
+      <w:r>
+        <w:rPr>
+          <w:rFonts w:ascii="Times New Roman" w:cs="Times New Roman" w:eastAsia="Times New Roman" w:hAnsi="Times New Roman"/>
+          <w:b/>
+          <w:bCs/>
+        </w:rPr>
+        <w:t xml:space="preserve">SETP</w:t>
+      </w:r>
+      <w:r>
+        <w:rPr>
+          <w:rFonts w:ascii="Times New Roman" w:cs="Times New Roman" w:eastAsia="Times New Roman" w:hAnsi="Times New Roman"/>
+        </w:rPr>
+        <w:t xml:space="preserve"> both. </w:t>
+      </w:r>
+      <w:r>
+        <w:rPr>
+          <w:rFonts w:ascii="Times New Roman" w:cs="Times New Roman" w:eastAsia="Times New Roman" w:hAnsi="Times New Roman"/>
+          <w:b/>
+          <w:bCs/>
+        </w:rPr>
+        <w:t xml:space="preserve">PUT</w:t>
+      </w:r>
+      <w:r>
+        <w:rPr>
+          <w:rFonts w:ascii="Times New Roman" w:cs="Times New Roman" w:eastAsia="Times New Roman" w:hAnsi="Times New Roman"/>
+        </w:rPr>
+        <w:t xml:space="preserve"> takes the values of the calling EXEC’s REXX variables, </w:t>
+      </w:r>
+      <w:r>
+        <w:rPr>
+          <w:rFonts w:ascii="Times New Roman" w:cs="Times New Roman" w:eastAsia="Times New Roman" w:hAnsi="Times New Roman"/>
+          <w:b/>
+          <w:bCs/>
+        </w:rPr>
+        <w:t xml:space="preserve">GET</w:t>
+      </w:r>
+      <w:r>
+        <w:rPr>
+          <w:rFonts w:ascii="Times New Roman" w:cs="Times New Roman" w:eastAsia="Times New Roman" w:hAnsi="Times New Roman"/>
+        </w:rPr>
+        <w:t xml:space="preserve"> sets them, </w:t>
+      </w:r>
+      <w:r>
+        <w:rPr>
+          <w:rFonts w:ascii="Times New Roman" w:cs="Times New Roman" w:eastAsia="Times New Roman" w:hAnsi="Times New Roman"/>
+          <w:b/>
+          <w:bCs/>
+        </w:rPr>
+        <w:t xml:space="preserve">STACK</w:t>
+      </w:r>
+      <w:r>
+        <w:rPr>
+          <w:rFonts w:ascii="Times New Roman" w:cs="Times New Roman" w:eastAsia="Times New Roman" w:hAnsi="Times New Roman"/>
+        </w:rPr>
+        <w:t xml:space="preserve"> puts values on the console stack. A null value drops a variable. Names up to 32 characters, values up to 255, 128 variables. GLOBALV is a nucleus extension, loaded at IPL by the system profile.</w:t>
+      </w:r>
+    </w:p>
+    <w:tbl>
+      <w:tblPr>
+        <w:tblW w:type="dxa" w:w="9638"/>
+        <w:tblBorders>
+          <w:top w:val="single" w:color="auto" w:sz="4"/>
+          <w:left w:val="single" w:color="auto" w:sz="4"/>
+          <w:bottom w:val="single" w:color="auto" w:sz="4"/>
+          <w:right w:val="single" w:color="auto" w:sz="4"/>
+          <w:insideH w:val="single" w:color="auto" w:sz="4"/>
+          <w:insideV w:val="single" w:color="auto" w:sz="4"/>
+        </w:tblBorders>
+      </w:tblPr>
+      <w:tblGrid>
+        <w:gridCol w:w="9638"/>
+      </w:tblGrid>
+      <w:tr>
+        <w:trPr>
+          <w:cantSplit/>
+        </w:trPr>
+        <w:tc>
+          <w:tcPr>
+            <w:tcW w:type="dxa" w:w="9638"/>
+            <w:shd w:fill="F2F2F2" w:color="auto" w:val="clear"/>
+            <w:tcMar>
+              <w:top w:type="dxa" w:w="100"/>
+              <w:left w:type="dxa" w:w="140"/>
+              <w:bottom w:type="dxa" w:w="100"/>
+              <w:right w:type="dxa" w:w="140"/>
+            </w:tcMar>
+          </w:tcPr>
+          <w:p>
+            <w:pPr>
+              <w:spacing w:after="0" w:line="228"/>
+            </w:pPr>
+            <w:r>
+              <w:rPr>
+                <w:rFonts w:ascii="Courier New" w:cs="Courier New" w:eastAsia="Courier New" w:hAnsi="Courier New"/>
+                <w:sz w:val="17"/>
+                <w:szCs w:val="17"/>
+              </w:rPr>
+              <w:t xml:space="preserve">globalv select fulist setl editor EE</w:t>
+            </w:r>
+          </w:p>
+          <w:p>
+            <w:pPr>
+              <w:spacing w:after="0" w:line="228"/>
+            </w:pPr>
+            <w:r>
+              <w:rPr>
+                <w:rFonts w:ascii="Courier New" w:cs="Courier New" w:eastAsia="Courier New" w:hAnsi="Courier New"/>
+                <w:sz w:val="17"/>
+                <w:szCs w:val="17"/>
+              </w:rPr>
+              <w:t xml:space="preserve">globalv select fulist list</w:t>
+            </w:r>
+          </w:p>
+          <w:p>
+            <w:pPr>
+              <w:spacing w:after="0" w:line="228"/>
+            </w:pPr>
+            <w:r>
+              <w:rPr>
+                <w:rFonts w:ascii="Courier New" w:cs="Courier New" w:eastAsia="Courier New" w:hAnsi="Courier New"/>
+                <w:sz w:val="17"/>
+                <w:szCs w:val="17"/>
+              </w:rPr>
+              <w:t xml:space="preserve">FULIST   EDITOR = EE</w:t>
+            </w:r>
+          </w:p>
+        </w:tc>
+      </w:tr>
+    </w:tbl>
+    <w:p>
+      <w:pPr>
+        <w:spacing w:after="200" w:before="80"/>
+      </w:pPr>
+      <w:r>
+        <w:rPr>
+          <w:rFonts w:ascii="Arial" w:cs="Arial" w:eastAsia="Arial" w:hAnsi="Arial"/>
+          <w:b/>
+          <w:bCs/>
+          <w:sz w:val="18"/>
+          <w:szCs w:val="18"/>
+        </w:rPr>
+        <w:t xml:space="preserve">Figure 43. </w:t>
+      </w:r>
+      <w:r>
+        <w:rPr>
+          <w:rFonts w:ascii="Arial" w:cs="Arial" w:eastAsia="Arial" w:hAnsi="Arial"/>
+          <w:sz w:val="18"/>
+          <w:szCs w:val="18"/>
+        </w:rPr>
+        <w:t xml:space="preserve">GLOBALV</w:t>
+      </w:r>
+    </w:p>
+    <w:p>
+      <w:pPr>
+        <w:spacing w:after="120"/>
+      </w:pPr>
+      <w:r>
+        <w:rPr>
+          <w:rFonts w:ascii="Times New Roman" w:cs="Times New Roman" w:eastAsia="Times New Roman" w:hAnsi="Times New Roman"/>
+        </w:rPr>
+        <w:t xml:space="preserve">FULIST takes its editor and browser from the group FULIST (</w:t>
+      </w:r>
+      <w:r>
+        <w:rPr>
+          <w:rFonts w:ascii="Courier New" w:cs="Courier New" w:eastAsia="Courier New" w:hAnsi="Courier New"/>
+          <w:sz w:val="19"/>
+          <w:szCs w:val="19"/>
+        </w:rPr>
+        <w:t xml:space="preserve">EDITOR</w:t>
+      </w:r>
+      <w:r>
+        <w:rPr>
+          <w:rFonts w:ascii="Times New Roman" w:cs="Times New Roman" w:eastAsia="Times New Roman" w:hAnsi="Times New Roman"/>
+        </w:rPr>
+        <w:t xml:space="preserve">, </w:t>
+      </w:r>
+      <w:r>
+        <w:rPr>
+          <w:rFonts w:ascii="Courier New" w:cs="Courier New" w:eastAsia="Courier New" w:hAnsi="Courier New"/>
+          <w:sz w:val="19"/>
+          <w:szCs w:val="19"/>
+        </w:rPr>
+        <w:t xml:space="preserve">BROWSER</w:t>
+      </w:r>
+      <w:r>
+        <w:rPr>
+          <w:rFonts w:ascii="Times New Roman" w:cs="Times New Roman" w:eastAsia="Times New Roman" w:hAnsi="Times New Roman"/>
+        </w:rPr>
+        <w:t xml:space="preserve">) when they are set.</w:t>
+      </w:r>
+    </w:p>
+    <w:p>
+      <w:pPr>
+        <w:pStyle w:val="Heading2"/>
+      </w:pPr>
+      <w:r>
+        <w:t xml:space="preserve">LINUX EXEC</w:t>
+      </w:r>
+    </w:p>
+    <w:tbl>
+      <w:tblPr>
+        <w:tblW w:type="dxa" w:w="9638"/>
+        <w:tblBorders>
+          <w:top w:val="single" w:color="auto" w:sz="4"/>
+          <w:left w:val="single" w:color="auto" w:sz="4"/>
+          <w:bottom w:val="single" w:color="auto" w:sz="4"/>
+          <w:right w:val="single" w:color="auto" w:sz="4"/>
+          <w:insideH w:val="single" w:color="auto" w:sz="4"/>
+          <w:insideV w:val="single" w:color="auto" w:sz="4"/>
+        </w:tblBorders>
+      </w:tblPr>
+      <w:tblGrid>
+        <w:gridCol w:w="9638"/>
+      </w:tblGrid>
+      <w:tr>
+        <w:trPr>
+          <w:cantSplit/>
+        </w:trPr>
+        <w:tc>
+          <w:tcPr>
+            <w:tcW w:type="dxa" w:w="9638"/>
+            <w:shd w:fill="F2F2F2" w:color="auto" w:val="clear"/>
+            <w:tcMar>
+              <w:top w:type="dxa" w:w="100"/>
+              <w:left w:type="dxa" w:w="140"/>
+              <w:bottom w:type="dxa" w:w="100"/>
+              <w:right w:type="dxa" w:w="140"/>
+            </w:tcMar>
+          </w:tcPr>
+          <w:p>
+            <w:pPr>
+              <w:spacing w:after="0" w:line="228"/>
+            </w:pPr>
+            <w:r>
+              <w:rPr>
+                <w:rFonts w:ascii="Courier New" w:cs="Courier New" w:eastAsia="Courier New" w:hAnsi="Courier New"/>
+                <w:sz w:val="17"/>
+                <w:szCs w:val="17"/>
+              </w:rPr>
+              <w:t xml:space="preserve">LINUX [DISK|READER]</w:t>
+            </w:r>
+          </w:p>
+        </w:tc>
+      </w:tr>
+    </w:tbl>
+    <w:p>
+      <w:pPr>
+        <w:spacing w:after="200" w:before="80"/>
+      </w:pPr>
+      <w:r>
+        <w:rPr>
+          <w:rFonts w:ascii="Arial" w:cs="Arial" w:eastAsia="Arial" w:hAnsi="Arial"/>
+          <w:b/>
+          <w:bCs/>
+          <w:sz w:val="18"/>
+          <w:szCs w:val="18"/>
+        </w:rPr>
+        <w:t xml:space="preserve">Figure 44. </w:t>
       </w:r>
       <w:r>
         <w:rPr>
@@ -19893,7 +20226,7 @@
           <w:sz w:val="18"/>
           <w:szCs w:val="18"/>
         </w:rPr>
-        <w:t xml:space="preserve">Figure 43. </w:t>
+        <w:t xml:space="preserve">Figure 45. </w:t>
       </w:r>
       <w:r>
         <w:rPr>

</xml_diff>

<commit_message>
Guide and plan: EDF disks (M6a-M6d done)
Co-Authored-By: Claude Opus 5.5 <noreply@anthropic.com>
Claude-Session: https://claude.ai/code/session_01JBNU8KnKzXkgscse8vw6so
</commit_message>
<xml_diff>
--- a/arch/31bit/manual/VM370PLUS-Guide.docx
+++ b/arch/31bit/manual/VM370PLUS-Guide.docx
@@ -1600,7 +1600,7 @@
           <w:sz w:val="20"/>
           <w:szCs w:val="20"/>
         </w:rPr>
-        <w:t xml:space="preserve">GLOBALV</w:t>
+        <w:t xml:space="preserve">FORMAT (BLKSIZE 4096)</w:t>
       </w:r>
       <w:r>
         <w:rPr>
@@ -1629,7 +1629,7 @@
           <w:sz w:val="20"/>
           <w:szCs w:val="20"/>
         </w:rPr>
-        <w:t xml:space="preserve">LINUX EXEC</w:t>
+        <w:t xml:space="preserve">GLOBALV</w:t>
       </w:r>
       <w:r>
         <w:rPr>
@@ -1640,6 +1640,35 @@
           <w:szCs w:val="20"/>
         </w:rPr>
         <w:t xml:space="preserve">	23</w:t>
+      </w:r>
+    </w:p>
+    <w:p>
+      <w:pPr>
+        <w:tabs>
+          <w:tab w:val="right" w:pos="9638" w:leader="dot"/>
+        </w:tabs>
+        <w:spacing w:after="20" w:before="20"/>
+        <w:ind w:left="400"/>
+      </w:pPr>
+      <w:r>
+        <w:rPr>
+          <w:rFonts w:ascii="Times New Roman" w:cs="Times New Roman" w:eastAsia="Times New Roman" w:hAnsi="Times New Roman"/>
+          <w:b w:val="false"/>
+          <w:bCs w:val="false"/>
+          <w:sz w:val="20"/>
+          <w:szCs w:val="20"/>
+        </w:rPr>
+        <w:t xml:space="preserve">LINUX EXEC</w:t>
+      </w:r>
+      <w:r>
+        <w:rPr>
+          <w:rFonts w:ascii="Times New Roman" w:cs="Times New Roman" w:eastAsia="Times New Roman" w:hAnsi="Times New Roman"/>
+          <w:b w:val="false"/>
+          <w:bCs w:val="false"/>
+          <w:sz w:val="20"/>
+          <w:szCs w:val="20"/>
+        </w:rPr>
+        <w:t xml:space="preserve">	24</w:t>
       </w:r>
     </w:p>
     <w:p>
@@ -1668,7 +1697,7 @@
           <w:sz w:val="21"/>
           <w:szCs w:val="21"/>
         </w:rPr>
-        <w:t xml:space="preserve">	24</w:t>
+        <w:t xml:space="preserve">	25</w:t>
       </w:r>
     </w:p>
     <w:p>
@@ -1697,7 +1726,7 @@
           <w:sz w:val="21"/>
           <w:szCs w:val="21"/>
         </w:rPr>
-        <w:t xml:space="preserve">	25</w:t>
+        <w:t xml:space="preserve">	26</w:t>
       </w:r>
     </w:p>
     <w:p>
@@ -1726,7 +1755,7 @@
           <w:sz w:val="21"/>
           <w:szCs w:val="21"/>
         </w:rPr>
-        <w:t xml:space="preserve">	26</w:t>
+        <w:t xml:space="preserve">	27</w:t>
       </w:r>
     </w:p>
     <w:p>
@@ -1784,7 +1813,7 @@
           <w:sz w:val="20"/>
           <w:szCs w:val="20"/>
         </w:rPr>
-        <w:t xml:space="preserve">	30</w:t>
+        <w:t xml:space="preserve">	31</w:t>
       </w:r>
     </w:p>
     <w:p>
@@ -2144,6 +2173,58 @@
           <w:rFonts w:ascii="Times New Roman" w:cs="Times New Roman" w:eastAsia="Times New Roman" w:hAnsi="Times New Roman"/>
         </w:rPr>
         <w:t xml:space="preserve">This edition is kept up to date as VM/370plus grows; each change is listed here, newest first.</w:t>
+      </w:r>
+    </w:p>
+    <w:p>
+      <w:pPr>
+        <w:pStyle w:val="ListParagraph"/>
+        <w:numPr>
+          <w:ilvl w:val="0"/>
+          <w:numId w:val="2"/>
+        </w:numPr>
+        <w:spacing w:after="60"/>
+      </w:pPr>
+      <w:r>
+        <w:rPr>
+          <w:rFonts w:ascii="Times New Roman" w:cs="Times New Roman" w:eastAsia="Times New Roman" w:hAnsi="Times New Roman"/>
+          <w:b/>
+          <w:bCs/>
+        </w:rPr>
+        <w:t xml:space="preserve">11 October 2026, evening.</w:t>
+      </w:r>
+      <w:r>
+        <w:rPr>
+          <w:rFonts w:ascii="Times New Roman" w:cs="Times New Roman" w:eastAsia="Times New Roman" w:hAnsi="Times New Roman"/>
+        </w:rPr>
+        <w:t xml:space="preserve"> Larger minidisks: CMS under </w:t>
+      </w:r>
+      <w:r>
+        <w:rPr>
+          <w:rFonts w:ascii="Courier New" w:cs="Courier New" w:eastAsia="Courier New" w:hAnsi="Courier New"/>
+          <w:sz w:val="19"/>
+          <w:szCs w:val="19"/>
+        </w:rPr>
+        <w:t xml:space="preserve">IPL 290</w:t>
+      </w:r>
+      <w:r>
+        <w:rPr>
+          <w:rFonts w:ascii="Times New Roman" w:cs="Times New Roman" w:eastAsia="Times New Roman" w:hAnsi="Times New Roman"/>
+        </w:rPr>
+        <w:t xml:space="preserve"> reads, writes and formats IBM’s Enhanced Disk Format (4 KB blocks): </w:t>
+      </w:r>
+      <w:r>
+        <w:rPr>
+          <w:rFonts w:ascii="Courier New" w:cs="Courier New" w:eastAsia="Courier New" w:hAnsi="Courier New"/>
+          <w:sz w:val="19"/>
+          <w:szCs w:val="19"/>
+        </w:rPr>
+        <w:t xml:space="preserve">FORMAT vaddr fm (BLKSIZE 4096</w:t>
+      </w:r>
+      <w:r>
+        <w:rPr>
+          <w:rFonts w:ascii="Times New Roman" w:cs="Times New Roman" w:eastAsia="Times New Roman" w:hAnsi="Times New Roman"/>
+        </w:rPr>
+        <w:t xml:space="preserve">, a full 3380 as one disk, files with more than 65,535 records.</w:t>
       </w:r>
     </w:p>
     <w:p>
@@ -5877,6 +5958,50 @@
           <w:rFonts w:ascii="Times New Roman" w:cs="Times New Roman" w:eastAsia="Times New Roman" w:hAnsi="Times New Roman"/>
         </w:rPr>
         <w:t xml:space="preserve">GCC380, the AMODE 31 build of the Community Edition’s GCC, runs above 16 MB; GCCLIB31 is a C library for programs that run in 31-bit mode with their heap above 16 MB.</w:t>
+      </w:r>
+    </w:p>
+    <w:p>
+      <w:pPr>
+        <w:pStyle w:val="ListParagraph"/>
+        <w:numPr>
+          <w:ilvl w:val="0"/>
+          <w:numId w:val="2"/>
+        </w:numPr>
+        <w:spacing w:after="60"/>
+      </w:pPr>
+      <w:r>
+        <w:rPr>
+          <w:rFonts w:ascii="Times New Roman" w:cs="Times New Roman" w:eastAsia="Times New Roman" w:hAnsi="Times New Roman"/>
+        </w:rPr>
+        <w:t xml:space="preserve">Under the EC-mode CMS (</w:t>
+      </w:r>
+      <w:r>
+        <w:rPr>
+          <w:rFonts w:ascii="Courier New" w:cs="Courier New" w:eastAsia="Courier New" w:hAnsi="Courier New"/>
+          <w:sz w:val="19"/>
+          <w:szCs w:val="19"/>
+        </w:rPr>
+        <w:t xml:space="preserve">IPL 290</w:t>
+      </w:r>
+      <w:r>
+        <w:rPr>
+          <w:rFonts w:ascii="Times New Roman" w:cs="Times New Roman" w:eastAsia="Times New Roman" w:hAnsi="Times New Roman"/>
+        </w:rPr>
+        <w:t xml:space="preserve">), minidisks can use IBM’s Enhanced Disk Format (EDF, 4 KB blocks) besides the 800-byte format: a disk up to the size of a full 3380 (518 MB), files with any number of records. </w:t>
+      </w:r>
+      <w:r>
+        <w:rPr>
+          <w:rFonts w:ascii="Courier New" w:cs="Courier New" w:eastAsia="Courier New" w:hAnsi="Courier New"/>
+          <w:sz w:val="19"/>
+          <w:szCs w:val="19"/>
+        </w:rPr>
+        <w:t xml:space="preserve">FORMAT vaddr fm (BLKSIZE 4096</w:t>
+      </w:r>
+      <w:r>
+        <w:rPr>
+          <w:rFonts w:ascii="Times New Roman" w:cs="Times New Roman" w:eastAsia="Times New Roman" w:hAnsi="Times New Roman"/>
+        </w:rPr>
+        <w:t xml:space="preserve"> makes one; ACCESS tells the formats apart by the label. The DMSEFS nucleus extension does the work and is loaded by the system profile.</w:t>
       </w:r>
     </w:p>
     <w:p>
@@ -16500,7 +16625,87 @@
                 <w:sz w:val="19"/>
                 <w:szCs w:val="19"/>
               </w:rPr>
-              <w:t xml:space="preserve">The CMS nucleus is 24-bit; programs above 16 MB use HIGHSTOR and SVC 120 (milestone M6 will change this).</w:t>
+              <w:t xml:space="preserve">The CMS nucleus is 24-bit; programs above 16 MB use HIGHSTOR and SVC 120.</w:t>
+            </w:r>
+          </w:p>
+        </w:tc>
+      </w:tr>
+      <w:tr>
+        <w:trPr>
+          <w:cantSplit/>
+          <w:tblHeader w:val="false"/>
+        </w:trPr>
+        <w:tc>
+          <w:tcPr>
+            <w:tcW w:type="dxa" w:w="2400"/>
+            <w:tcMar>
+              <w:top w:type="dxa" w:w="60"/>
+              <w:left w:type="dxa" w:w="100"/>
+              <w:bottom w:type="dxa" w:w="60"/>
+              <w:right w:type="dxa" w:w="100"/>
+            </w:tcMar>
+          </w:tcPr>
+          <w:p>
+            <w:r>
+              <w:rPr>
+                <w:rFonts w:ascii="Times New Roman" w:cs="Times New Roman" w:eastAsia="Times New Roman" w:hAnsi="Times New Roman"/>
+                <w:sz w:val="19"/>
+                <w:szCs w:val="19"/>
+              </w:rPr>
+              <w:t xml:space="preserve">EDF disks</w:t>
+            </w:r>
+          </w:p>
+        </w:tc>
+        <w:tc>
+          <w:tcPr>
+            <w:tcW w:type="dxa" w:w="7238"/>
+            <w:tcMar>
+              <w:top w:type="dxa" w:w="60"/>
+              <w:left w:type="dxa" w:w="100"/>
+              <w:bottom w:type="dxa" w:w="60"/>
+              <w:right w:type="dxa" w:w="100"/>
+            </w:tcMar>
+          </w:tcPr>
+          <w:p>
+            <w:r>
+              <w:rPr>
+                <w:rFonts w:ascii="Times New Roman" w:cs="Times New Roman" w:eastAsia="Times New Roman" w:hAnsi="Times New Roman"/>
+                <w:sz w:val="19"/>
+                <w:szCs w:val="19"/>
+              </w:rPr>
+              <w:t xml:space="preserve">Only under </w:t>
+            </w:r>
+            <w:r>
+              <w:rPr>
+                <w:rFonts w:ascii="Courier New" w:cs="Courier New" w:eastAsia="Courier New" w:hAnsi="Courier New"/>
+                <w:sz w:val="19"/>
+                <w:szCs w:val="19"/>
+              </w:rPr>
+              <w:t xml:space="preserve">IPL 290</w:t>
+            </w:r>
+            <w:r>
+              <w:rPr>
+                <w:rFonts w:ascii="Times New Roman" w:cs="Times New Roman" w:eastAsia="Times New Roman" w:hAnsi="Times New Roman"/>
+                <w:sz w:val="19"/>
+                <w:szCs w:val="19"/>
+              </w:rPr>
+              <w:t xml:space="preserve"> (the 190 CMS sees an EDF disk as unknown). A V-format file can only be extended at its end. Commands that take record numbers (TYPE, COPYFILE FROM/FOR) reach records 1 to 65,535 directly; beyond that only in sequence. LISTFILE shows counts above 99,999 in thousands (</w:t>
+            </w:r>
+            <w:r>
+              <w:rPr>
+                <w:rFonts w:ascii="Courier New" w:cs="Courier New" w:eastAsia="Courier New" w:hAnsi="Courier New"/>
+                <w:sz w:val="19"/>
+                <w:szCs w:val="19"/>
+              </w:rPr>
+              <w:t xml:space="preserve">1400K</w:t>
+            </w:r>
+            <w:r>
+              <w:rPr>
+                <w:rFonts w:ascii="Times New Roman" w:cs="Times New Roman" w:eastAsia="Times New Roman" w:hAnsi="Times New Roman"/>
+                <w:sz w:val="19"/>
+                <w:szCs w:val="19"/>
+              </w:rPr>
+              <w:t xml:space="preserve">). The A-disk accessed at IPL must be in 800-byte format. DISK DUMP/LOAD, TAPE, MOVEFILE and FULIST are not yet checked on EDF disks.</w:t>
             </w:r>
           </w:p>
         </w:tc>
@@ -19105,7 +19310,7 @@
         <w:pStyle w:val="Heading2"/>
       </w:pPr>
       <w:r>
-        <w:t xml:space="preserve">GLOBALV</w:t>
+        <w:t xml:space="preserve">FORMAT (BLKSIZE 4096)</w:t>
       </w:r>
     </w:p>
     <w:tbl>
@@ -19148,59 +19353,7 @@
                 <w:sz w:val="17"/>
                 <w:szCs w:val="17"/>
               </w:rPr>
-              <w:t xml:space="preserve">GLOBALV [SELECT group] SET|SETS|SETL|SETP name value</w:t>
-            </w:r>
-          </w:p>
-          <w:p>
-            <w:pPr>
-              <w:spacing w:after="0" w:line="228"/>
-            </w:pPr>
-            <w:r>
-              <w:rPr>
-                <w:rFonts w:ascii="Courier New" w:cs="Courier New" w:eastAsia="Courier New" w:hAnsi="Courier New"/>
-                <w:sz w:val="17"/>
-                <w:szCs w:val="17"/>
-              </w:rPr>
-              <w:t xml:space="preserve">GLOBALV [SELECT group] PUT|PUTS|PUTL|PUTP name ...</w:t>
-            </w:r>
-          </w:p>
-          <w:p>
-            <w:pPr>
-              <w:spacing w:after="0" w:line="228"/>
-            </w:pPr>
-            <w:r>
-              <w:rPr>
-                <w:rFonts w:ascii="Courier New" w:cs="Courier New" w:eastAsia="Courier New" w:hAnsi="Courier New"/>
-                <w:sz w:val="17"/>
-                <w:szCs w:val="17"/>
-              </w:rPr>
-              <w:t xml:space="preserve">GLOBALV [SELECT group] GET|STACK name ...</w:t>
-            </w:r>
-          </w:p>
-          <w:p>
-            <w:pPr>
-              <w:spacing w:after="0" w:line="228"/>
-            </w:pPr>
-            <w:r>
-              <w:rPr>
-                <w:rFonts w:ascii="Courier New" w:cs="Courier New" w:eastAsia="Courier New" w:hAnsi="Courier New"/>
-                <w:sz w:val="17"/>
-                <w:szCs w:val="17"/>
-              </w:rPr>
-              <w:t xml:space="preserve">GLOBALV [SELECT group] LIST [name ...]|PURGE</w:t>
-            </w:r>
-          </w:p>
-          <w:p>
-            <w:pPr>
-              <w:spacing w:after="0" w:line="228"/>
-            </w:pPr>
-            <w:r>
-              <w:rPr>
-                <w:rFonts w:ascii="Courier New" w:cs="Courier New" w:eastAsia="Courier New" w:hAnsi="Courier New"/>
-                <w:sz w:val="17"/>
-                <w:szCs w:val="17"/>
-              </w:rPr>
-              <w:t xml:space="preserve">GLOBALV GRPLIST</w:t>
+              <w:t xml:space="preserve">FORMAT vaddr fm [cyls] (BLKSIZE 4096|4K|800</w:t>
             </w:r>
           </w:p>
         </w:tc>
@@ -19226,7 +19379,7 @@
           <w:sz w:val="18"/>
           <w:szCs w:val="18"/>
         </w:rPr>
-        <w:t xml:space="preserve">GLOBALV</w:t>
+        <w:t xml:space="preserve">FORMAT</w:t>
       </w:r>
     </w:p>
     <w:p>
@@ -19237,35 +19390,7 @@
         <w:rPr>
           <w:rFonts w:ascii="Times New Roman" w:cs="Times New Roman" w:eastAsia="Times New Roman" w:hAnsi="Times New Roman"/>
         </w:rPr>
-        <w:t xml:space="preserve">New; a subset of z/VM’s GLOBALV. Variables live in groups (UNNAMED unless SELECT names one). </w:t>
-      </w:r>
-      <w:r>
-        <w:rPr>
-          <w:rFonts w:ascii="Times New Roman" w:cs="Times New Roman" w:eastAsia="Times New Roman" w:hAnsi="Times New Roman"/>
-          <w:b/>
-          <w:bCs/>
-        </w:rPr>
-        <w:t xml:space="preserve">SET</w:t>
-      </w:r>
-      <w:r>
-        <w:rPr>
-          <w:rFonts w:ascii="Times New Roman" w:cs="Times New Roman" w:eastAsia="Times New Roman" w:hAnsi="Times New Roman"/>
-        </w:rPr>
-        <w:t xml:space="preserve"> keeps a value until the next IPL of CMS, </w:t>
-      </w:r>
-      <w:r>
-        <w:rPr>
-          <w:rFonts w:ascii="Times New Roman" w:cs="Times New Roman" w:eastAsia="Times New Roman" w:hAnsi="Times New Roman"/>
-          <w:b/>
-          <w:bCs/>
-        </w:rPr>
-        <w:t xml:space="preserve">SETS</w:t>
-      </w:r>
-      <w:r>
-        <w:rPr>
-          <w:rFonts w:ascii="Times New Roman" w:cs="Times New Roman" w:eastAsia="Times New Roman" w:hAnsi="Times New Roman"/>
-        </w:rPr>
-        <w:t xml:space="preserve"> also in </w:t>
+        <w:t xml:space="preserve">Under </w:t>
       </w:r>
       <w:r>
         <w:rPr>
@@ -19273,13 +19398,13 @@
           <w:sz w:val="19"/>
           <w:szCs w:val="19"/>
         </w:rPr>
-        <w:t xml:space="preserve">SESSION GLOBALV A</w:t>
-      </w:r>
-      <w:r>
-        <w:rPr>
-          <w:rFonts w:ascii="Times New Roman" w:cs="Times New Roman" w:eastAsia="Times New Roman" w:hAnsi="Times New Roman"/>
-        </w:rPr>
-        <w:t xml:space="preserve"> (erased at the next IPL), </w:t>
+        <w:t xml:space="preserve">IPL 290</w:t>
+      </w:r>
+      <w:r>
+        <w:rPr>
+          <w:rFonts w:ascii="Times New Roman" w:cs="Times New Roman" w:eastAsia="Times New Roman" w:hAnsi="Times New Roman"/>
+        </w:rPr>
+        <w:t xml:space="preserve"> (changed). </w:t>
       </w:r>
       <w:r>
         <w:rPr>
@@ -19287,13 +19412,41 @@
           <w:b/>
           <w:bCs/>
         </w:rPr>
-        <w:t xml:space="preserve">SETL</w:t>
-      </w:r>
-      <w:r>
-        <w:rPr>
-          <w:rFonts w:ascii="Times New Roman" w:cs="Times New Roman" w:eastAsia="Times New Roman" w:hAnsi="Times New Roman"/>
-        </w:rPr>
-        <w:t xml:space="preserve"> in </w:t>
+        <w:t xml:space="preserve">BLKSIZE 4096</w:t>
+      </w:r>
+      <w:r>
+        <w:rPr>
+          <w:rFonts w:ascii="Times New Roman" w:cs="Times New Roman" w:eastAsia="Times New Roman" w:hAnsi="Times New Roman"/>
+        </w:rPr>
+        <w:t xml:space="preserve"> formats the disk in IBM’s Enhanced Disk Format: 4096-byte blocks, the file directory and the allocation map kept as files, records counted in fullwords. Without </w:t>
+      </w:r>
+      <w:r>
+        <w:rPr>
+          <w:rFonts w:ascii="Times New Roman" w:cs="Times New Roman" w:eastAsia="Times New Roman" w:hAnsi="Times New Roman"/>
+          <w:b/>
+          <w:bCs/>
+        </w:rPr>
+        <w:t xml:space="preserve">cyls</w:t>
+      </w:r>
+      <w:r>
+        <w:rPr>
+          <w:rFonts w:ascii="Times New Roman" w:cs="Times New Roman" w:eastAsia="Times New Roman" w:hAnsi="Times New Roman"/>
+        </w:rPr>
+        <w:t xml:space="preserve"> the whole minidisk is used, whatever its size (FORMAT’s usual 800-byte limit, 121 cylinders on a 3380, does not apply). 3350 and 3380 disks. FORMAT asks for confirmation and a label as usual and then accesses the disk. </w:t>
+      </w:r>
+      <w:r>
+        <w:rPr>
+          <w:rFonts w:ascii="Times New Roman" w:cs="Times New Roman" w:eastAsia="Times New Roman" w:hAnsi="Times New Roman"/>
+          <w:b/>
+          <w:bCs/>
+        </w:rPr>
+        <w:t xml:space="preserve">BLKSIZE 800</w:t>
+      </w:r>
+      <w:r>
+        <w:rPr>
+          <w:rFonts w:ascii="Times New Roman" w:cs="Times New Roman" w:eastAsia="Times New Roman" w:hAnsi="Times New Roman"/>
+        </w:rPr>
+        <w:t xml:space="preserve"> is the usual format. A disk written by </w:t>
       </w:r>
       <w:r>
         <w:rPr>
@@ -19301,69 +19454,13 @@
           <w:sz w:val="19"/>
           <w:szCs w:val="19"/>
         </w:rPr>
-        <w:t xml:space="preserve">LASTING GLOBALV A</w:t>
-      </w:r>
-      <w:r>
-        <w:rPr>
-          <w:rFonts w:ascii="Times New Roman" w:cs="Times New Roman" w:eastAsia="Times New Roman" w:hAnsi="Times New Roman"/>
-        </w:rPr>
-        <w:t xml:space="preserve"> (read again at every IPL), </w:t>
-      </w:r>
-      <w:r>
-        <w:rPr>
-          <w:rFonts w:ascii="Times New Roman" w:cs="Times New Roman" w:eastAsia="Times New Roman" w:hAnsi="Times New Roman"/>
-          <w:b/>
-          <w:bCs/>
-        </w:rPr>
-        <w:t xml:space="preserve">SETP</w:t>
-      </w:r>
-      <w:r>
-        <w:rPr>
-          <w:rFonts w:ascii="Times New Roman" w:cs="Times New Roman" w:eastAsia="Times New Roman" w:hAnsi="Times New Roman"/>
-        </w:rPr>
-        <w:t xml:space="preserve"> both. </w:t>
-      </w:r>
-      <w:r>
-        <w:rPr>
-          <w:rFonts w:ascii="Times New Roman" w:cs="Times New Roman" w:eastAsia="Times New Roman" w:hAnsi="Times New Roman"/>
-          <w:b/>
-          <w:bCs/>
-        </w:rPr>
-        <w:t xml:space="preserve">PUT</w:t>
-      </w:r>
-      <w:r>
-        <w:rPr>
-          <w:rFonts w:ascii="Times New Roman" w:cs="Times New Roman" w:eastAsia="Times New Roman" w:hAnsi="Times New Roman"/>
-        </w:rPr>
-        <w:t xml:space="preserve"> takes the values of the calling EXEC’s REXX variables, </w:t>
-      </w:r>
-      <w:r>
-        <w:rPr>
-          <w:rFonts w:ascii="Times New Roman" w:cs="Times New Roman" w:eastAsia="Times New Roman" w:hAnsi="Times New Roman"/>
-          <w:b/>
-          <w:bCs/>
-        </w:rPr>
-        <w:t xml:space="preserve">GET</w:t>
-      </w:r>
-      <w:r>
-        <w:rPr>
-          <w:rFonts w:ascii="Times New Roman" w:cs="Times New Roman" w:eastAsia="Times New Roman" w:hAnsi="Times New Roman"/>
-        </w:rPr>
-        <w:t xml:space="preserve"> sets them, </w:t>
-      </w:r>
-      <w:r>
-        <w:rPr>
-          <w:rFonts w:ascii="Times New Roman" w:cs="Times New Roman" w:eastAsia="Times New Roman" w:hAnsi="Times New Roman"/>
-          <w:b/>
-          <w:bCs/>
-        </w:rPr>
-        <w:t xml:space="preserve">STACK</w:t>
-      </w:r>
-      <w:r>
-        <w:rPr>
-          <w:rFonts w:ascii="Times New Roman" w:cs="Times New Roman" w:eastAsia="Times New Roman" w:hAnsi="Times New Roman"/>
-        </w:rPr>
-        <w:t xml:space="preserve"> puts values on the console stack. A null value drops a variable. Names up to 32 characters, values up to 255, 128 variables. GLOBALV is a nucleus extension, loaded at IPL by the system profile.</w:t>
+        <w:t xml:space="preserve">tools/edf.py</w:t>
+      </w:r>
+      <w:r>
+        <w:rPr>
+          <w:rFonts w:ascii="Times New Roman" w:cs="Times New Roman" w:eastAsia="Times New Roman" w:hAnsi="Times New Roman"/>
+        </w:rPr>
+        <w:t xml:space="preserve"> on the PC can be accessed too, and the reverse.</w:t>
       </w:r>
     </w:p>
     <w:tbl>
@@ -19406,7 +19503,7 @@
                 <w:sz w:val="17"/>
                 <w:szCs w:val="17"/>
               </w:rPr>
-              <w:t xml:space="preserve">globalv select fulist setl editor EE</w:t>
+              <w:t xml:space="preserve">format 1b0 y (blksize 4096</w:t>
             </w:r>
           </w:p>
           <w:p>
@@ -19419,7 +19516,7 @@
                 <w:sz w:val="17"/>
                 <w:szCs w:val="17"/>
               </w:rPr>
-              <w:t xml:space="preserve">globalv select fulist list</w:t>
+              <w:t xml:space="preserve">DMSFOR603R FORMAT WILL ERASE ALL FILES ON DISK 'Y(1B0)'. DO YOU WISH TO CONTINUE? (YES|NO):</w:t>
             </w:r>
           </w:p>
           <w:p>
@@ -19432,7 +19529,111 @@
                 <w:sz w:val="17"/>
                 <w:szCs w:val="17"/>
               </w:rPr>
-              <w:t xml:space="preserve">FULIST   EDITOR = EE</w:t>
+              <w:t xml:space="preserve">yes</w:t>
+            </w:r>
+          </w:p>
+          <w:p>
+            <w:pPr>
+              <w:spacing w:after="0" w:line="228"/>
+            </w:pPr>
+            <w:r>
+              <w:rPr>
+                <w:rFonts w:ascii="Courier New" w:cs="Courier New" w:eastAsia="Courier New" w:hAnsi="Courier New"/>
+                <w:sz w:val="17"/>
+                <w:szCs w:val="17"/>
+              </w:rPr>
+              <w:t xml:space="preserve">DMSFOR605R ENTER DISK LABEL:</w:t>
+            </w:r>
+          </w:p>
+          <w:p>
+            <w:pPr>
+              <w:spacing w:after="0" w:line="228"/>
+            </w:pPr>
+            <w:r>
+              <w:rPr>
+                <w:rFonts w:ascii="Courier New" w:cs="Courier New" w:eastAsia="Courier New" w:hAnsi="Courier New"/>
+                <w:sz w:val="17"/>
+                <w:szCs w:val="17"/>
+              </w:rPr>
+              <w:t xml:space="preserve">edf002</w:t>
+            </w:r>
+          </w:p>
+          <w:p>
+            <w:pPr>
+              <w:spacing w:after="0" w:line="228"/>
+            </w:pPr>
+            <w:r>
+              <w:rPr>
+                <w:rFonts w:ascii="Courier New" w:cs="Courier New" w:eastAsia="Courier New" w:hAnsi="Courier New"/>
+                <w:sz w:val="17"/>
+                <w:szCs w:val="17"/>
+              </w:rPr>
+              <w:t xml:space="preserve">FORMATTING DISK 'Y'.</w:t>
+            </w:r>
+          </w:p>
+          <w:p>
+            <w:pPr>
+              <w:spacing w:after="0" w:line="228"/>
+            </w:pPr>
+            <w:r>
+              <w:rPr>
+                <w:rFonts w:ascii="Courier New" w:cs="Courier New" w:eastAsia="Courier New" w:hAnsi="Courier New"/>
+                <w:sz w:val="17"/>
+                <w:szCs w:val="17"/>
+              </w:rPr>
+              <w:t xml:space="preserve">Ready;</w:t>
+            </w:r>
+          </w:p>
+          <w:p>
+            <w:pPr>
+              <w:spacing w:after="0" w:line="228"/>
+            </w:pPr>
+            <w:r>
+              <w:rPr>
+                <w:rFonts w:ascii="Courier New" w:cs="Courier New" w:eastAsia="Courier New" w:hAnsi="Courier New"/>
+                <w:sz w:val="17"/>
+                <w:szCs w:val="17"/>
+              </w:rPr>
+              <w:t xml:space="preserve">q disk y</w:t>
+            </w:r>
+          </w:p>
+          <w:p>
+            <w:pPr>
+              <w:spacing w:after="0" w:line="228"/>
+            </w:pPr>
+            <w:r>
+              <w:rPr>
+                <w:rFonts w:ascii="Courier New" w:cs="Courier New" w:eastAsia="Courier New" w:hAnsi="Courier New"/>
+                <w:sz w:val="17"/>
+                <w:szCs w:val="17"/>
+              </w:rPr>
+              <w:t xml:space="preserve">Label  CUU M  Stat  Cyl Type Blksize   Files  Blks Used-(%) Blks Left  Blk Total</w:t>
+            </w:r>
+          </w:p>
+          <w:p>
+            <w:pPr>
+              <w:spacing w:after="0" w:line="228"/>
+            </w:pPr>
+            <w:r>
+              <w:rPr>
+                <w:rFonts w:ascii="Courier New" w:cs="Courier New" w:eastAsia="Courier New" w:hAnsi="Courier New"/>
+                <w:sz w:val="17"/>
+                <w:szCs w:val="17"/>
+              </w:rPr>
+              <w:t xml:space="preserve">EDF002 1B0 Y   R/W  885 3380 4096          0         10-00     132740     132750</w:t>
+            </w:r>
+          </w:p>
+          <w:p>
+            <w:pPr>
+              <w:spacing w:after="0" w:line="228"/>
+            </w:pPr>
+            <w:r>
+              <w:rPr>
+                <w:rFonts w:ascii="Courier New" w:cs="Courier New" w:eastAsia="Courier New" w:hAnsi="Courier New"/>
+                <w:sz w:val="17"/>
+                <w:szCs w:val="17"/>
+              </w:rPr>
+              <w:t xml:space="preserve">Ready;</w:t>
             </w:r>
           </w:p>
         </w:tc>
@@ -19458,46 +19659,7 @@
           <w:sz w:val="18"/>
           <w:szCs w:val="18"/>
         </w:rPr>
-        <w:t xml:space="preserve">GLOBALV</w:t>
-      </w:r>
-    </w:p>
-    <w:p>
-      <w:pPr>
-        <w:spacing w:after="120"/>
-      </w:pPr>
-      <w:r>
-        <w:rPr>
-          <w:rFonts w:ascii="Times New Roman" w:cs="Times New Roman" w:eastAsia="Times New Roman" w:hAnsi="Times New Roman"/>
-        </w:rPr>
-        <w:t xml:space="preserve">FULIST takes its editor and browser from the group FULIST (</w:t>
-      </w:r>
-      <w:r>
-        <w:rPr>
-          <w:rFonts w:ascii="Courier New" w:cs="Courier New" w:eastAsia="Courier New" w:hAnsi="Courier New"/>
-          <w:sz w:val="19"/>
-          <w:szCs w:val="19"/>
-        </w:rPr>
-        <w:t xml:space="preserve">EDITOR</w:t>
-      </w:r>
-      <w:r>
-        <w:rPr>
-          <w:rFonts w:ascii="Times New Roman" w:cs="Times New Roman" w:eastAsia="Times New Roman" w:hAnsi="Times New Roman"/>
-        </w:rPr>
-        <w:t xml:space="preserve">, </w:t>
-      </w:r>
-      <w:r>
-        <w:rPr>
-          <w:rFonts w:ascii="Courier New" w:cs="Courier New" w:eastAsia="Courier New" w:hAnsi="Courier New"/>
-          <w:sz w:val="19"/>
-          <w:szCs w:val="19"/>
-        </w:rPr>
-        <w:t xml:space="preserve">BROWSER</w:t>
-      </w:r>
-      <w:r>
-        <w:rPr>
-          <w:rFonts w:ascii="Times New Roman" w:cs="Times New Roman" w:eastAsia="Times New Roman" w:hAnsi="Times New Roman"/>
-        </w:rPr>
-        <w:t xml:space="preserve">) when they are set.</w:t>
+        <w:t xml:space="preserve">FORMAT (BLKSIZE 4096)</w:t>
       </w:r>
     </w:p>
     <w:p>
@@ -19505,7 +19667,7 @@
         <w:pStyle w:val="Heading2"/>
       </w:pPr>
       <w:r>
-        <w:t xml:space="preserve">LINUX EXEC</w:t>
+        <w:t xml:space="preserve">GLOBALV</w:t>
       </w:r>
     </w:p>
     <w:tbl>
@@ -19548,7 +19710,59 @@
                 <w:sz w:val="17"/>
                 <w:szCs w:val="17"/>
               </w:rPr>
-              <w:t xml:space="preserve">LINUX [DISK|READER]</w:t>
+              <w:t xml:space="preserve">GLOBALV [SELECT group] SET|SETS|SETL|SETP name value</w:t>
+            </w:r>
+          </w:p>
+          <w:p>
+            <w:pPr>
+              <w:spacing w:after="0" w:line="228"/>
+            </w:pPr>
+            <w:r>
+              <w:rPr>
+                <w:rFonts w:ascii="Courier New" w:cs="Courier New" w:eastAsia="Courier New" w:hAnsi="Courier New"/>
+                <w:sz w:val="17"/>
+                <w:szCs w:val="17"/>
+              </w:rPr>
+              <w:t xml:space="preserve">GLOBALV [SELECT group] PUT|PUTS|PUTL|PUTP name ...</w:t>
+            </w:r>
+          </w:p>
+          <w:p>
+            <w:pPr>
+              <w:spacing w:after="0" w:line="228"/>
+            </w:pPr>
+            <w:r>
+              <w:rPr>
+                <w:rFonts w:ascii="Courier New" w:cs="Courier New" w:eastAsia="Courier New" w:hAnsi="Courier New"/>
+                <w:sz w:val="17"/>
+                <w:szCs w:val="17"/>
+              </w:rPr>
+              <w:t xml:space="preserve">GLOBALV [SELECT group] GET|STACK name ...</w:t>
+            </w:r>
+          </w:p>
+          <w:p>
+            <w:pPr>
+              <w:spacing w:after="0" w:line="228"/>
+            </w:pPr>
+            <w:r>
+              <w:rPr>
+                <w:rFonts w:ascii="Courier New" w:cs="Courier New" w:eastAsia="Courier New" w:hAnsi="Courier New"/>
+                <w:sz w:val="17"/>
+                <w:szCs w:val="17"/>
+              </w:rPr>
+              <w:t xml:space="preserve">GLOBALV [SELECT group] LIST [name ...]|PURGE</w:t>
+            </w:r>
+          </w:p>
+          <w:p>
+            <w:pPr>
+              <w:spacing w:after="0" w:line="228"/>
+            </w:pPr>
+            <w:r>
+              <w:rPr>
+                <w:rFonts w:ascii="Courier New" w:cs="Courier New" w:eastAsia="Courier New" w:hAnsi="Courier New"/>
+                <w:sz w:val="17"/>
+                <w:szCs w:val="17"/>
+              </w:rPr>
+              <w:t xml:space="preserve">GLOBALV GRPLIST</w:t>
             </w:r>
           </w:p>
         </w:tc>
@@ -19567,6 +19781,354 @@
           <w:szCs w:val="18"/>
         </w:rPr>
         <w:t xml:space="preserve">Figure 44. </w:t>
+      </w:r>
+      <w:r>
+        <w:rPr>
+          <w:rFonts w:ascii="Arial" w:cs="Arial" w:eastAsia="Arial" w:hAnsi="Arial"/>
+          <w:sz w:val="18"/>
+          <w:szCs w:val="18"/>
+        </w:rPr>
+        <w:t xml:space="preserve">GLOBALV</w:t>
+      </w:r>
+    </w:p>
+    <w:p>
+      <w:pPr>
+        <w:spacing w:after="120"/>
+      </w:pPr>
+      <w:r>
+        <w:rPr>
+          <w:rFonts w:ascii="Times New Roman" w:cs="Times New Roman" w:eastAsia="Times New Roman" w:hAnsi="Times New Roman"/>
+        </w:rPr>
+        <w:t xml:space="preserve">New; a subset of z/VM’s GLOBALV. Variables live in groups (UNNAMED unless SELECT names one). </w:t>
+      </w:r>
+      <w:r>
+        <w:rPr>
+          <w:rFonts w:ascii="Times New Roman" w:cs="Times New Roman" w:eastAsia="Times New Roman" w:hAnsi="Times New Roman"/>
+          <w:b/>
+          <w:bCs/>
+        </w:rPr>
+        <w:t xml:space="preserve">SET</w:t>
+      </w:r>
+      <w:r>
+        <w:rPr>
+          <w:rFonts w:ascii="Times New Roman" w:cs="Times New Roman" w:eastAsia="Times New Roman" w:hAnsi="Times New Roman"/>
+        </w:rPr>
+        <w:t xml:space="preserve"> keeps a value until the next IPL of CMS, </w:t>
+      </w:r>
+      <w:r>
+        <w:rPr>
+          <w:rFonts w:ascii="Times New Roman" w:cs="Times New Roman" w:eastAsia="Times New Roman" w:hAnsi="Times New Roman"/>
+          <w:b/>
+          <w:bCs/>
+        </w:rPr>
+        <w:t xml:space="preserve">SETS</w:t>
+      </w:r>
+      <w:r>
+        <w:rPr>
+          <w:rFonts w:ascii="Times New Roman" w:cs="Times New Roman" w:eastAsia="Times New Roman" w:hAnsi="Times New Roman"/>
+        </w:rPr>
+        <w:t xml:space="preserve"> also in </w:t>
+      </w:r>
+      <w:r>
+        <w:rPr>
+          <w:rFonts w:ascii="Courier New" w:cs="Courier New" w:eastAsia="Courier New" w:hAnsi="Courier New"/>
+          <w:sz w:val="19"/>
+          <w:szCs w:val="19"/>
+        </w:rPr>
+        <w:t xml:space="preserve">SESSION GLOBALV A</w:t>
+      </w:r>
+      <w:r>
+        <w:rPr>
+          <w:rFonts w:ascii="Times New Roman" w:cs="Times New Roman" w:eastAsia="Times New Roman" w:hAnsi="Times New Roman"/>
+        </w:rPr>
+        <w:t xml:space="preserve"> (erased at the next IPL), </w:t>
+      </w:r>
+      <w:r>
+        <w:rPr>
+          <w:rFonts w:ascii="Times New Roman" w:cs="Times New Roman" w:eastAsia="Times New Roman" w:hAnsi="Times New Roman"/>
+          <w:b/>
+          <w:bCs/>
+        </w:rPr>
+        <w:t xml:space="preserve">SETL</w:t>
+      </w:r>
+      <w:r>
+        <w:rPr>
+          <w:rFonts w:ascii="Times New Roman" w:cs="Times New Roman" w:eastAsia="Times New Roman" w:hAnsi="Times New Roman"/>
+        </w:rPr>
+        <w:t xml:space="preserve"> in </w:t>
+      </w:r>
+      <w:r>
+        <w:rPr>
+          <w:rFonts w:ascii="Courier New" w:cs="Courier New" w:eastAsia="Courier New" w:hAnsi="Courier New"/>
+          <w:sz w:val="19"/>
+          <w:szCs w:val="19"/>
+        </w:rPr>
+        <w:t xml:space="preserve">LASTING GLOBALV A</w:t>
+      </w:r>
+      <w:r>
+        <w:rPr>
+          <w:rFonts w:ascii="Times New Roman" w:cs="Times New Roman" w:eastAsia="Times New Roman" w:hAnsi="Times New Roman"/>
+        </w:rPr>
+        <w:t xml:space="preserve"> (read again at every IPL), </w:t>
+      </w:r>
+      <w:r>
+        <w:rPr>
+          <w:rFonts w:ascii="Times New Roman" w:cs="Times New Roman" w:eastAsia="Times New Roman" w:hAnsi="Times New Roman"/>
+          <w:b/>
+          <w:bCs/>
+        </w:rPr>
+        <w:t xml:space="preserve">SETP</w:t>
+      </w:r>
+      <w:r>
+        <w:rPr>
+          <w:rFonts w:ascii="Times New Roman" w:cs="Times New Roman" w:eastAsia="Times New Roman" w:hAnsi="Times New Roman"/>
+        </w:rPr>
+        <w:t xml:space="preserve"> both. </w:t>
+      </w:r>
+      <w:r>
+        <w:rPr>
+          <w:rFonts w:ascii="Times New Roman" w:cs="Times New Roman" w:eastAsia="Times New Roman" w:hAnsi="Times New Roman"/>
+          <w:b/>
+          <w:bCs/>
+        </w:rPr>
+        <w:t xml:space="preserve">PUT</w:t>
+      </w:r>
+      <w:r>
+        <w:rPr>
+          <w:rFonts w:ascii="Times New Roman" w:cs="Times New Roman" w:eastAsia="Times New Roman" w:hAnsi="Times New Roman"/>
+        </w:rPr>
+        <w:t xml:space="preserve"> takes the values of the calling EXEC’s REXX variables, </w:t>
+      </w:r>
+      <w:r>
+        <w:rPr>
+          <w:rFonts w:ascii="Times New Roman" w:cs="Times New Roman" w:eastAsia="Times New Roman" w:hAnsi="Times New Roman"/>
+          <w:b/>
+          <w:bCs/>
+        </w:rPr>
+        <w:t xml:space="preserve">GET</w:t>
+      </w:r>
+      <w:r>
+        <w:rPr>
+          <w:rFonts w:ascii="Times New Roman" w:cs="Times New Roman" w:eastAsia="Times New Roman" w:hAnsi="Times New Roman"/>
+        </w:rPr>
+        <w:t xml:space="preserve"> sets them, </w:t>
+      </w:r>
+      <w:r>
+        <w:rPr>
+          <w:rFonts w:ascii="Times New Roman" w:cs="Times New Roman" w:eastAsia="Times New Roman" w:hAnsi="Times New Roman"/>
+          <w:b/>
+          <w:bCs/>
+        </w:rPr>
+        <w:t xml:space="preserve">STACK</w:t>
+      </w:r>
+      <w:r>
+        <w:rPr>
+          <w:rFonts w:ascii="Times New Roman" w:cs="Times New Roman" w:eastAsia="Times New Roman" w:hAnsi="Times New Roman"/>
+        </w:rPr>
+        <w:t xml:space="preserve"> puts values on the console stack. A null value drops a variable. Names up to 32 characters, values up to 255, 128 variables. GLOBALV is a nucleus extension, loaded at IPL by the system profile.</w:t>
+      </w:r>
+    </w:p>
+    <w:tbl>
+      <w:tblPr>
+        <w:tblW w:type="dxa" w:w="9638"/>
+        <w:tblBorders>
+          <w:top w:val="single" w:color="auto" w:sz="4"/>
+          <w:left w:val="single" w:color="auto" w:sz="4"/>
+          <w:bottom w:val="single" w:color="auto" w:sz="4"/>
+          <w:right w:val="single" w:color="auto" w:sz="4"/>
+          <w:insideH w:val="single" w:color="auto" w:sz="4"/>
+          <w:insideV w:val="single" w:color="auto" w:sz="4"/>
+        </w:tblBorders>
+      </w:tblPr>
+      <w:tblGrid>
+        <w:gridCol w:w="9638"/>
+      </w:tblGrid>
+      <w:tr>
+        <w:trPr>
+          <w:cantSplit/>
+        </w:trPr>
+        <w:tc>
+          <w:tcPr>
+            <w:tcW w:type="dxa" w:w="9638"/>
+            <w:shd w:fill="F2F2F2" w:color="auto" w:val="clear"/>
+            <w:tcMar>
+              <w:top w:type="dxa" w:w="100"/>
+              <w:left w:type="dxa" w:w="140"/>
+              <w:bottom w:type="dxa" w:w="100"/>
+              <w:right w:type="dxa" w:w="140"/>
+            </w:tcMar>
+          </w:tcPr>
+          <w:p>
+            <w:pPr>
+              <w:spacing w:after="0" w:line="228"/>
+            </w:pPr>
+            <w:r>
+              <w:rPr>
+                <w:rFonts w:ascii="Courier New" w:cs="Courier New" w:eastAsia="Courier New" w:hAnsi="Courier New"/>
+                <w:sz w:val="17"/>
+                <w:szCs w:val="17"/>
+              </w:rPr>
+              <w:t xml:space="preserve">globalv select fulist setl editor EE</w:t>
+            </w:r>
+          </w:p>
+          <w:p>
+            <w:pPr>
+              <w:spacing w:after="0" w:line="228"/>
+            </w:pPr>
+            <w:r>
+              <w:rPr>
+                <w:rFonts w:ascii="Courier New" w:cs="Courier New" w:eastAsia="Courier New" w:hAnsi="Courier New"/>
+                <w:sz w:val="17"/>
+                <w:szCs w:val="17"/>
+              </w:rPr>
+              <w:t xml:space="preserve">globalv select fulist list</w:t>
+            </w:r>
+          </w:p>
+          <w:p>
+            <w:pPr>
+              <w:spacing w:after="0" w:line="228"/>
+            </w:pPr>
+            <w:r>
+              <w:rPr>
+                <w:rFonts w:ascii="Courier New" w:cs="Courier New" w:eastAsia="Courier New" w:hAnsi="Courier New"/>
+                <w:sz w:val="17"/>
+                <w:szCs w:val="17"/>
+              </w:rPr>
+              <w:t xml:space="preserve">FULIST   EDITOR = EE</w:t>
+            </w:r>
+          </w:p>
+        </w:tc>
+      </w:tr>
+    </w:tbl>
+    <w:p>
+      <w:pPr>
+        <w:spacing w:after="200" w:before="80"/>
+      </w:pPr>
+      <w:r>
+        <w:rPr>
+          <w:rFonts w:ascii="Arial" w:cs="Arial" w:eastAsia="Arial" w:hAnsi="Arial"/>
+          <w:b/>
+          <w:bCs/>
+          <w:sz w:val="18"/>
+          <w:szCs w:val="18"/>
+        </w:rPr>
+        <w:t xml:space="preserve">Figure 45. </w:t>
+      </w:r>
+      <w:r>
+        <w:rPr>
+          <w:rFonts w:ascii="Arial" w:cs="Arial" w:eastAsia="Arial" w:hAnsi="Arial"/>
+          <w:sz w:val="18"/>
+          <w:szCs w:val="18"/>
+        </w:rPr>
+        <w:t xml:space="preserve">GLOBALV</w:t>
+      </w:r>
+    </w:p>
+    <w:p>
+      <w:pPr>
+        <w:spacing w:after="120"/>
+      </w:pPr>
+      <w:r>
+        <w:rPr>
+          <w:rFonts w:ascii="Times New Roman" w:cs="Times New Roman" w:eastAsia="Times New Roman" w:hAnsi="Times New Roman"/>
+        </w:rPr>
+        <w:t xml:space="preserve">FULIST takes its editor and browser from the group FULIST (</w:t>
+      </w:r>
+      <w:r>
+        <w:rPr>
+          <w:rFonts w:ascii="Courier New" w:cs="Courier New" w:eastAsia="Courier New" w:hAnsi="Courier New"/>
+          <w:sz w:val="19"/>
+          <w:szCs w:val="19"/>
+        </w:rPr>
+        <w:t xml:space="preserve">EDITOR</w:t>
+      </w:r>
+      <w:r>
+        <w:rPr>
+          <w:rFonts w:ascii="Times New Roman" w:cs="Times New Roman" w:eastAsia="Times New Roman" w:hAnsi="Times New Roman"/>
+        </w:rPr>
+        <w:t xml:space="preserve">, </w:t>
+      </w:r>
+      <w:r>
+        <w:rPr>
+          <w:rFonts w:ascii="Courier New" w:cs="Courier New" w:eastAsia="Courier New" w:hAnsi="Courier New"/>
+          <w:sz w:val="19"/>
+          <w:szCs w:val="19"/>
+        </w:rPr>
+        <w:t xml:space="preserve">BROWSER</w:t>
+      </w:r>
+      <w:r>
+        <w:rPr>
+          <w:rFonts w:ascii="Times New Roman" w:cs="Times New Roman" w:eastAsia="Times New Roman" w:hAnsi="Times New Roman"/>
+        </w:rPr>
+        <w:t xml:space="preserve">) when they are set.</w:t>
+      </w:r>
+    </w:p>
+    <w:p>
+      <w:pPr>
+        <w:pStyle w:val="Heading2"/>
+      </w:pPr>
+      <w:r>
+        <w:t xml:space="preserve">LINUX EXEC</w:t>
+      </w:r>
+    </w:p>
+    <w:tbl>
+      <w:tblPr>
+        <w:tblW w:type="dxa" w:w="9638"/>
+        <w:tblBorders>
+          <w:top w:val="single" w:color="auto" w:sz="4"/>
+          <w:left w:val="single" w:color="auto" w:sz="4"/>
+          <w:bottom w:val="single" w:color="auto" w:sz="4"/>
+          <w:right w:val="single" w:color="auto" w:sz="4"/>
+          <w:insideH w:val="single" w:color="auto" w:sz="4"/>
+          <w:insideV w:val="single" w:color="auto" w:sz="4"/>
+        </w:tblBorders>
+      </w:tblPr>
+      <w:tblGrid>
+        <w:gridCol w:w="9638"/>
+      </w:tblGrid>
+      <w:tr>
+        <w:trPr>
+          <w:cantSplit/>
+        </w:trPr>
+        <w:tc>
+          <w:tcPr>
+            <w:tcW w:type="dxa" w:w="9638"/>
+            <w:shd w:fill="F2F2F2" w:color="auto" w:val="clear"/>
+            <w:tcMar>
+              <w:top w:type="dxa" w:w="100"/>
+              <w:left w:type="dxa" w:w="140"/>
+              <w:bottom w:type="dxa" w:w="100"/>
+              <w:right w:type="dxa" w:w="140"/>
+            </w:tcMar>
+          </w:tcPr>
+          <w:p>
+            <w:pPr>
+              <w:spacing w:after="0" w:line="228"/>
+            </w:pPr>
+            <w:r>
+              <w:rPr>
+                <w:rFonts w:ascii="Courier New" w:cs="Courier New" w:eastAsia="Courier New" w:hAnsi="Courier New"/>
+                <w:sz w:val="17"/>
+                <w:szCs w:val="17"/>
+              </w:rPr>
+              <w:t xml:space="preserve">LINUX [DISK|READER]</w:t>
+            </w:r>
+          </w:p>
+        </w:tc>
+      </w:tr>
+    </w:tbl>
+    <w:p>
+      <w:pPr>
+        <w:spacing w:after="200" w:before="80"/>
+      </w:pPr>
+      <w:r>
+        <w:rPr>
+          <w:rFonts w:ascii="Arial" w:cs="Arial" w:eastAsia="Arial" w:hAnsi="Arial"/>
+          <w:b/>
+          <w:bCs/>
+          <w:sz w:val="18"/>
+          <w:szCs w:val="18"/>
+        </w:rPr>
+        <w:t xml:space="preserve">Figure 46. </w:t>
       </w:r>
       <w:r>
         <w:rPr>
@@ -20226,7 +20788,7 @@
           <w:sz w:val="18"/>
           <w:szCs w:val="18"/>
         </w:rPr>
-        <w:t xml:space="preserve">Figure 45. </w:t>
+        <w:t xml:space="preserve">Figure 47. </w:t>
       </w:r>
       <w:r>
         <w:rPr>
@@ -20457,7 +21019,7 @@
         <w:rPr>
           <w:rFonts w:ascii="Times New Roman" w:cs="Times New Roman" w:eastAsia="Times New Roman" w:hAnsi="Times New Roman"/>
         </w:rPr>
-        <w:t xml:space="preserve"> table in DMKCFC (CE source plus XA0054DK), in table order (CP searches it in this order, so an abbreviation goes to the first match). </w:t>
+        <w:t xml:space="preserve"> table in DMKCFC (CE source plus XA0054DK, XA0055DK), in table order (CP searches it in this order, so an abbreviation goes to the first match). </w:t>
       </w:r>
       <w:r>
         <w:rPr>

</xml_diff>

<commit_message>
Guide: Python, SQLite and PL/I on Debian in Chapter 8
Co-Authored-By: Claude Opus 5.5 <noreply@anthropic.com>
Claude-Session: https://claude.ai/code/session_01JBNU8KnKzXkgscse8vw6so
</commit_message>
<xml_diff>
--- a/arch/31bit/manual/VM370PLUS-Guide.docx
+++ b/arch/31bit/manual/VM370PLUS-Guide.docx
@@ -1398,6 +1398,64 @@
           <w:szCs w:val="20"/>
         </w:rPr>
         <w:t xml:space="preserve">PL/I</w:t>
+      </w:r>
+      <w:r>
+        <w:rPr>
+          <w:rFonts w:ascii="Times New Roman" w:cs="Times New Roman" w:eastAsia="Times New Roman" w:hAnsi="Times New Roman"/>
+          <w:b w:val="false"/>
+          <w:bCs w:val="false"/>
+          <w:sz w:val="20"/>
+          <w:szCs w:val="20"/>
+        </w:rPr>
+        <w:t xml:space="preserve">	21</w:t>
+      </w:r>
+    </w:p>
+    <w:p>
+      <w:pPr>
+        <w:tabs>
+          <w:tab w:val="right" w:pos="9638" w:leader="dot"/>
+        </w:tabs>
+        <w:spacing w:after="20" w:before="20"/>
+        <w:ind w:left="400"/>
+      </w:pPr>
+      <w:r>
+        <w:rPr>
+          <w:rFonts w:ascii="Times New Roman" w:cs="Times New Roman" w:eastAsia="Times New Roman" w:hAnsi="Times New Roman"/>
+          <w:b w:val="false"/>
+          <w:bCs w:val="false"/>
+          <w:sz w:val="20"/>
+          <w:szCs w:val="20"/>
+        </w:rPr>
+        <w:t xml:space="preserve">Python</w:t>
+      </w:r>
+      <w:r>
+        <w:rPr>
+          <w:rFonts w:ascii="Times New Roman" w:cs="Times New Roman" w:eastAsia="Times New Roman" w:hAnsi="Times New Roman"/>
+          <w:b w:val="false"/>
+          <w:bCs w:val="false"/>
+          <w:sz w:val="20"/>
+          <w:szCs w:val="20"/>
+        </w:rPr>
+        <w:t xml:space="preserve">	21</w:t>
+      </w:r>
+    </w:p>
+    <w:p>
+      <w:pPr>
+        <w:tabs>
+          <w:tab w:val="right" w:pos="9638" w:leader="dot"/>
+        </w:tabs>
+        <w:spacing w:after="20" w:before="20"/>
+        <w:ind w:left="400"/>
+      </w:pPr>
+      <w:r>
+        <w:rPr>
+          <w:rFonts w:ascii="Times New Roman" w:cs="Times New Roman" w:eastAsia="Times New Roman" w:hAnsi="Times New Roman"/>
+          <w:b w:val="false"/>
+          <w:bCs w:val="false"/>
+          <w:sz w:val="20"/>
+          <w:szCs w:val="20"/>
+        </w:rPr>
+        <w:t xml:space="preserve">SQLite</w:t>
       </w:r>
       <w:r>
         <w:rPr>
@@ -2170,7 +2228,7 @@
         <w:rPr>
           <w:rFonts w:ascii="Times New Roman" w:cs="Times New Roman" w:eastAsia="Times New Roman" w:hAnsi="Times New Roman"/>
         </w:rPr>
-        <w:t xml:space="preserve">, describes GCC 13 for C and C++, GnuCOBOL and PL/I, running natively on CMS.</w:t>
+        <w:t xml:space="preserve">, describes GCC 13 for C and C++, GnuCOBOL, PL/I, Python and SQLite on CMS.</w:t>
       </w:r>
     </w:p>
     <w:p>
@@ -2378,7 +2436,35 @@
         <w:rPr>
           <w:rFonts w:ascii="Times New Roman" w:cs="Times New Roman" w:eastAsia="Times New Roman" w:hAnsi="Times New Roman"/>
         </w:rPr>
-        <w:t xml:space="preserve">), all running natively; MODULEs run from EDF disks (I-271).</w:t>
+        <w:t xml:space="preserve">, also on Debian), Python (</w:t>
+      </w:r>
+      <w:r>
+        <w:rPr>
+          <w:rFonts w:ascii="Courier New" w:cs="Courier New" w:eastAsia="Courier New" w:hAnsi="Courier New"/>
+          <w:sz w:val="19"/>
+          <w:szCs w:val="19"/>
+        </w:rPr>
+        <w:t xml:space="preserve">PYTHON</w:t>
+      </w:r>
+      <w:r>
+        <w:rPr>
+          <w:rFonts w:ascii="Times New Roman" w:cs="Times New Roman" w:eastAsia="Times New Roman" w:hAnsi="Times New Roman"/>
+        </w:rPr>
+        <w:t xml:space="preserve">) and SQLite (</w:t>
+      </w:r>
+      <w:r>
+        <w:rPr>
+          <w:rFonts w:ascii="Courier New" w:cs="Courier New" w:eastAsia="Courier New" w:hAnsi="Courier New"/>
+          <w:sz w:val="19"/>
+          <w:szCs w:val="19"/>
+        </w:rPr>
+        <w:t xml:space="preserve">SQLITE</w:t>
+      </w:r>
+      <w:r>
+        <w:rPr>
+          <w:rFonts w:ascii="Times New Roman" w:cs="Times New Roman" w:eastAsia="Times New Roman" w:hAnsi="Times New Roman"/>
+        </w:rPr>
+        <w:t xml:space="preserve">); MODULEs run from EDF disks (I-271).</w:t>
       </w:r>
     </w:p>
     <w:p>
@@ -17818,7 +17904,7 @@
         <w:rPr>
           <w:rFonts w:ascii="Times New Roman" w:cs="Times New Roman" w:eastAsia="Times New Roman" w:hAnsi="Times New Roman"/>
         </w:rPr>
-        <w:t xml:space="preserve">). VM/370plus adds a PL/I-to-C translator: </w:t>
+        <w:t xml:space="preserve">). VM/370plus adds a PL/I-to-C translator (mikebeer/pli): </w:t>
       </w:r>
       <w:r>
         <w:rPr>
@@ -17860,7 +17946,7 @@
         <w:rPr>
           <w:rFonts w:ascii="Times New Roman" w:cs="Times New Roman" w:eastAsia="Times New Roman" w:hAnsi="Times New Roman"/>
         </w:rPr>
-        <w:t xml:space="preserve"> and compiles it to </w:t>
+        <w:t xml:space="preserve"> and compiles it with the CC EXEC to </w:t>
       </w:r>
       <w:r>
         <w:rPr>
@@ -17874,7 +17960,405 @@
         <w:rPr>
           <w:rFonts w:ascii="Times New Roman" w:cs="Times New Roman" w:eastAsia="Times New Roman" w:hAnsi="Times New Roman"/>
         </w:rPr>
-        <w:t xml:space="preserve">. SYSIN is the terminal and the console stack.</w:t>
+        <w:t xml:space="preserve"> (</w:t>
+      </w:r>
+      <w:r>
+        <w:rPr>
+          <w:rFonts w:ascii="Courier New" w:cs="Courier New" w:eastAsia="Courier New" w:hAnsi="Courier New"/>
+          <w:sz w:val="19"/>
+          <w:szCs w:val="19"/>
+        </w:rPr>
+        <w:t xml:space="preserve">PLIC fn ( GCC380</w:t>
+      </w:r>
+      <w:r>
+        <w:rPr>
+          <w:rFonts w:ascii="Times New Roman" w:cs="Times New Roman" w:eastAsia="Times New Roman" w:hAnsi="Times New Roman"/>
+        </w:rPr>
+        <w:t xml:space="preserve"> uses GCC380 instead). SYSIN is the terminal and the console stack; a line of just </w:t>
+      </w:r>
+      <w:r>
+        <w:rPr>
+          <w:rFonts w:ascii="Courier New" w:cs="Courier New" w:eastAsia="Courier New" w:hAnsi="Courier New"/>
+          <w:sz w:val="19"/>
+          <w:szCs w:val="19"/>
+        </w:rPr>
+        <w:t xml:space="preserve">/*</w:t>
+      </w:r>
+      <w:r>
+        <w:rPr>
+          <w:rFonts w:ascii="Times New Roman" w:cs="Times New Roman" w:eastAsia="Times New Roman" w:hAnsi="Times New Roman"/>
+        </w:rPr>
+        <w:t xml:space="preserve"> is end of file. PL/I file names become CMS file ids: </w:t>
+      </w:r>
+      <w:r>
+        <w:rPr>
+          <w:rFonts w:ascii="Courier New" w:cs="Courier New" w:eastAsia="Courier New" w:hAnsi="Courier New"/>
+          <w:sz w:val="19"/>
+          <w:szCs w:val="19"/>
+        </w:rPr>
+        <w:t xml:space="preserve">data/plitest_out.txt</w:t>
+      </w:r>
+      <w:r>
+        <w:rPr>
+          <w:rFonts w:ascii="Times New Roman" w:cs="Times New Roman" w:eastAsia="Times New Roman" w:hAnsi="Times New Roman"/>
+        </w:rPr>
+        <w:t xml:space="preserve"> is </w:t>
+      </w:r>
+      <w:r>
+        <w:rPr>
+          <w:rFonts w:ascii="Courier New" w:cs="Courier New" w:eastAsia="Courier New" w:hAnsi="Courier New"/>
+          <w:sz w:val="19"/>
+          <w:szCs w:val="19"/>
+        </w:rPr>
+        <w:t xml:space="preserve">PLITTOUT TXT</w:t>
+      </w:r>
+      <w:r>
+        <w:rPr>
+          <w:rFonts w:ascii="Times New Roman" w:cs="Times New Roman" w:eastAsia="Times New Roman" w:hAnsi="Times New Roman"/>
+        </w:rPr>
+        <w:t xml:space="preserve"> (a part longer than eight characters keeps its first and last four). On Debian, </w:t>
+      </w:r>
+      <w:r>
+        <w:rPr>
+          <w:rFonts w:ascii="Courier New" w:cs="Courier New" w:eastAsia="Courier New" w:hAnsi="Courier New"/>
+          <w:sz w:val="19"/>
+          <w:szCs w:val="19"/>
+        </w:rPr>
+        <w:t xml:space="preserve">plic fn.pli</w:t>
+      </w:r>
+      <w:r>
+        <w:rPr>
+          <w:rFonts w:ascii="Times New Roman" w:cs="Times New Roman" w:eastAsia="Times New Roman" w:hAnsi="Times New Roman"/>
+        </w:rPr>
+        <w:t xml:space="preserve"> translates and compiles with gcc.</w:t>
+      </w:r>
+    </w:p>
+    <w:p>
+      <w:pPr>
+        <w:pStyle w:val="Heading2"/>
+      </w:pPr>
+      <w:r>
+        <w:t xml:space="preserve">Python</w:t>
+      </w:r>
+    </w:p>
+    <w:p>
+      <w:pPr>
+        <w:spacing w:after="120"/>
+      </w:pPr>
+      <w:r>
+        <w:rPr>
+          <w:rFonts w:ascii="Courier New" w:cs="Courier New" w:eastAsia="Courier New" w:hAnsi="Courier New"/>
+          <w:sz w:val="19"/>
+          <w:szCs w:val="19"/>
+        </w:rPr>
+        <w:t xml:space="preserve">PYTHON fn [args]</w:t>
+      </w:r>
+      <w:r>
+        <w:rPr>
+          <w:rFonts w:ascii="Times New Roman" w:cs="Times New Roman" w:eastAsia="Times New Roman" w:hAnsi="Times New Roman"/>
+        </w:rPr>
+        <w:t xml:space="preserve"> runs </w:t>
+      </w:r>
+      <w:r>
+        <w:rPr>
+          <w:rFonts w:ascii="Courier New" w:cs="Courier New" w:eastAsia="Courier New" w:hAnsi="Courier New"/>
+          <w:sz w:val="19"/>
+          <w:szCs w:val="19"/>
+        </w:rPr>
+        <w:t xml:space="preserve">fn PY</w:t>
+      </w:r>
+      <w:r>
+        <w:rPr>
+          <w:rFonts w:ascii="Times New Roman" w:cs="Times New Roman" w:eastAsia="Times New Roman" w:hAnsi="Times New Roman"/>
+        </w:rPr>
+        <w:t xml:space="preserve"> with the C89 Python 3 interpreter of mikebeer/python; </w:t>
+      </w:r>
+      <w:r>
+        <w:rPr>
+          <w:rFonts w:ascii="Courier New" w:cs="Courier New" w:eastAsia="Courier New" w:hAnsi="Courier New"/>
+          <w:sz w:val="19"/>
+          <w:szCs w:val="19"/>
+        </w:rPr>
+        <w:t xml:space="preserve">PYTHON</w:t>
+      </w:r>
+      <w:r>
+        <w:rPr>
+          <w:rFonts w:ascii="Times New Roman" w:cs="Times New Roman" w:eastAsia="Times New Roman" w:hAnsi="Times New Roman"/>
+        </w:rPr>
+        <w:t xml:space="preserve"> alone reads statements from the terminal. NumPy, pandas and SciPy (the interpreter’s own versions), re, json, struct, cmath, complex numbers, classes, generators and exceptions are built in. The interpreter (</w:t>
+      </w:r>
+      <w:r>
+        <w:rPr>
+          <w:rFonts w:ascii="Courier New" w:cs="Courier New" w:eastAsia="Courier New" w:hAnsi="Courier New"/>
+          <w:sz w:val="19"/>
+          <w:szCs w:val="19"/>
+        </w:rPr>
+        <w:t xml:space="preserve">PY XIMAGE</w:t>
+      </w:r>
+      <w:r>
+        <w:rPr>
+          <w:rFonts w:ascii="Times New Roman" w:cs="Times New Roman" w:eastAsia="Times New Roman" w:hAnsi="Times New Roman"/>
+        </w:rPr>
+        <w:t xml:space="preserve">, 2.3 MB) runs above 16 MB through the XL loader. Integers beyond ±999,999,999 are big integers. There are no sockets on CMS yet, and modules of your own are </w:t>
+      </w:r>
+      <w:r>
+        <w:rPr>
+          <w:rFonts w:ascii="Courier New" w:cs="Courier New" w:eastAsia="Courier New" w:hAnsi="Courier New"/>
+          <w:sz w:val="19"/>
+          <w:szCs w:val="19"/>
+        </w:rPr>
+        <w:t xml:space="preserve">name PY</w:t>
+      </w:r>
+      <w:r>
+        <w:rPr>
+          <w:rFonts w:ascii="Times New Roman" w:cs="Times New Roman" w:eastAsia="Times New Roman" w:hAnsi="Times New Roman"/>
+        </w:rPr>
+        <w:t xml:space="preserve"> files on an accessed disk.</w:t>
+      </w:r>
+    </w:p>
+    <w:p>
+      <w:pPr>
+        <w:pStyle w:val="Heading2"/>
+      </w:pPr>
+      <w:r>
+        <w:t xml:space="preserve">SQLite</w:t>
+      </w:r>
+    </w:p>
+    <w:p>
+      <w:pPr>
+        <w:spacing w:after="120"/>
+      </w:pPr>
+      <w:r>
+        <w:rPr>
+          <w:rFonts w:ascii="Courier New" w:cs="Courier New" w:eastAsia="Courier New" w:hAnsi="Courier New"/>
+          <w:sz w:val="19"/>
+          <w:szCs w:val="19"/>
+        </w:rPr>
+        <w:t xml:space="preserve">SQLITE fn.db</w:t>
+      </w:r>
+      <w:r>
+        <w:rPr>
+          <w:rFonts w:ascii="Times New Roman" w:cs="Times New Roman" w:eastAsia="Times New Roman" w:hAnsi="Times New Roman"/>
+        </w:rPr>
+        <w:t xml:space="preserve"> starts the sqlite3 shell (SQLite 3.46) on the database </w:t>
+      </w:r>
+      <w:r>
+        <w:rPr>
+          <w:rFonts w:ascii="Courier New" w:cs="Courier New" w:eastAsia="Courier New" w:hAnsi="Courier New"/>
+          <w:sz w:val="19"/>
+          <w:szCs w:val="19"/>
+        </w:rPr>
+        <w:t xml:space="preserve">fn DB</w:t>
+      </w:r>
+      <w:r>
+        <w:rPr>
+          <w:rFonts w:ascii="Times New Roman" w:cs="Times New Roman" w:eastAsia="Times New Roman" w:hAnsi="Times New Roman"/>
+        </w:rPr>
+        <w:t xml:space="preserve">; </w:t>
+      </w:r>
+      <w:r>
+        <w:rPr>
+          <w:rFonts w:ascii="Courier New" w:cs="Courier New" w:eastAsia="Courier New" w:hAnsi="Courier New"/>
+          <w:sz w:val="19"/>
+          <w:szCs w:val="19"/>
+        </w:rPr>
+        <w:t xml:space="preserve">SQLITE fn.db</w:t>
+      </w:r>
+      <w:r>
+        <w:rPr>
+          <w:rFonts w:ascii="Times New Roman" w:cs="Times New Roman" w:eastAsia="Times New Roman" w:hAnsi="Times New Roman"/>
+        </w:rPr>
+        <w:t xml:space="preserve"> </w:t>
+      </w:r>
+      <w:r>
+        <w:rPr>
+          <w:rFonts w:ascii="Times New Roman" w:cs="Times New Roman" w:eastAsia="Times New Roman" w:hAnsi="Times New Roman"/>
+          <w:i/>
+          <w:iCs/>
+        </w:rPr>
+        <w:t xml:space="preserve">statement</w:t>
+      </w:r>
+      <w:r>
+        <w:rPr>
+          <w:rFonts w:ascii="Times New Roman" w:cs="Times New Roman" w:eastAsia="Times New Roman" w:hAnsi="Times New Roman"/>
+        </w:rPr>
+        <w:t xml:space="preserve"> runs one statement or dot command, for example </w:t>
+      </w:r>
+      <w:r>
+        <w:rPr>
+          <w:rFonts w:ascii="Courier New" w:cs="Courier New" w:eastAsia="Courier New" w:hAnsi="Courier New"/>
+          <w:sz w:val="19"/>
+          <w:szCs w:val="19"/>
+        </w:rPr>
+        <w:t xml:space="preserve">SQLITE emp.db .read load.sql</w:t>
+      </w:r>
+      <w:r>
+        <w:rPr>
+          <w:rFonts w:ascii="Times New Roman" w:cs="Times New Roman" w:eastAsia="Times New Roman" w:hAnsi="Times New Roman"/>
+        </w:rPr>
+        <w:t xml:space="preserve"> for a script </w:t>
+      </w:r>
+      <w:r>
+        <w:rPr>
+          <w:rFonts w:ascii="Courier New" w:cs="Courier New" w:eastAsia="Courier New" w:hAnsi="Courier New"/>
+          <w:sz w:val="19"/>
+          <w:szCs w:val="19"/>
+        </w:rPr>
+        <w:t xml:space="preserve">LOAD SQL</w:t>
+      </w:r>
+      <w:r>
+        <w:rPr>
+          <w:rFonts w:ascii="Times New Roman" w:cs="Times New Roman" w:eastAsia="Times New Roman" w:hAnsi="Times New Roman"/>
+        </w:rPr>
+        <w:t xml:space="preserve">. A database is one binary CMS file; its rollback journal is </w:t>
+      </w:r>
+      <w:r>
+        <w:rPr>
+          <w:rFonts w:ascii="Courier New" w:cs="Courier New" w:eastAsia="Courier New" w:hAnsi="Courier New"/>
+          <w:sz w:val="19"/>
+          <w:szCs w:val="19"/>
+        </w:rPr>
+        <w:t xml:space="preserve">fn DB-JOURN</w:t>
+      </w:r>
+      <w:r>
+        <w:rPr>
+          <w:rFonts w:ascii="Times New Roman" w:cs="Times New Roman" w:eastAsia="Times New Roman" w:hAnsi="Times New Roman"/>
+        </w:rPr>
+        <w:t xml:space="preserve"> while a transaction is open. One user at a time: there is no locking between virtual machines, so give each database to one user, or to a service machine (SQLSERV, planned).</w:t>
+      </w:r>
+    </w:p>
+    <w:tbl>
+      <w:tblPr>
+        <w:tblW w:type="dxa" w:w="9638"/>
+        <w:tblBorders>
+          <w:top w:val="single" w:color="auto" w:sz="4"/>
+          <w:left w:val="single" w:color="auto" w:sz="4"/>
+          <w:bottom w:val="single" w:color="auto" w:sz="4"/>
+          <w:right w:val="single" w:color="auto" w:sz="4"/>
+          <w:insideH w:val="single" w:color="auto" w:sz="4"/>
+          <w:insideV w:val="single" w:color="auto" w:sz="4"/>
+        </w:tblBorders>
+      </w:tblPr>
+      <w:tblGrid>
+        <w:gridCol w:w="9638"/>
+      </w:tblGrid>
+      <w:tr>
+        <w:trPr>
+          <w:cantSplit/>
+        </w:trPr>
+        <w:tc>
+          <w:tcPr>
+            <w:tcW w:type="dxa" w:w="9638"/>
+            <w:shd w:fill="F2F2F2" w:color="auto" w:val="clear"/>
+            <w:tcMar>
+              <w:top w:type="dxa" w:w="100"/>
+              <w:left w:type="dxa" w:w="140"/>
+              <w:bottom w:type="dxa" w:w="100"/>
+              <w:right w:type="dxa" w:w="140"/>
+            </w:tcMar>
+          </w:tcPr>
+          <w:p>
+            <w:pPr>
+              <w:spacing w:after="0" w:line="228"/>
+            </w:pPr>
+            <w:r>
+              <w:rPr>
+                <w:rFonts w:ascii="Courier New" w:cs="Courier New" w:eastAsia="Courier New" w:hAnsi="Courier New"/>
+                <w:sz w:val="17"/>
+                <w:szCs w:val="17"/>
+              </w:rPr>
+              <w:t xml:space="preserve">sqlite emp.db .read sqltest.sql</w:t>
+            </w:r>
+          </w:p>
+          <w:p>
+            <w:pPr>
+              <w:spacing w:after="0" w:line="228"/>
+            </w:pPr>
+            <w:r>
+              <w:rPr>
+                <w:rFonts w:ascii="Courier New" w:cs="Courier New" w:eastAsia="Courier New" w:hAnsi="Courier New"/>
+                <w:sz w:val="17"/>
+                <w:szCs w:val="17"/>
+              </w:rPr>
+              <w:t xml:space="preserve">dept   n  avg_sal  top</w:t>
+            </w:r>
+          </w:p>
+          <w:p>
+            <w:pPr>
+              <w:spacing w:after="0" w:line="228"/>
+            </w:pPr>
+            <w:r>
+              <w:rPr>
+                <w:rFonts w:ascii="Courier New" w:cs="Courier New" w:eastAsia="Courier New" w:hAnsi="Courier New"/>
+                <w:sz w:val="17"/>
+                <w:szCs w:val="17"/>
+              </w:rPr>
+              <w:t xml:space="preserve">-----  -  -------  ------</w:t>
+            </w:r>
+          </w:p>
+          <w:p>
+            <w:pPr>
+              <w:spacing w:after="0" w:line="228"/>
+            </w:pPr>
+            <w:r>
+              <w:rPr>
+                <w:rFonts w:ascii="Courier New" w:cs="Courier New" w:eastAsia="Courier New" w:hAnsi="Courier New"/>
+                <w:sz w:val="17"/>
+                <w:szCs w:val="17"/>
+              </w:rPr>
+              <w:t xml:space="preserve">Ops    2  7000.13  7100.0</w:t>
+            </w:r>
+          </w:p>
+          <w:p>
+            <w:pPr>
+              <w:spacing w:after="0" w:line="228"/>
+            </w:pPr>
+            <w:r>
+              <w:rPr>
+                <w:rFonts w:ascii="Courier New" w:cs="Courier New" w:eastAsia="Courier New" w:hAnsi="Courier New"/>
+                <w:sz w:val="17"/>
+                <w:szCs w:val="17"/>
+              </w:rPr>
+              <w:t xml:space="preserve">R&amp;D    2  9000.25  9200.5</w:t>
+            </w:r>
+          </w:p>
+          <w:p>
+            <w:pPr>
+              <w:spacing w:after="0" w:line="228"/>
+            </w:pPr>
+            <w:r>
+              <w:rPr>
+                <w:rFonts w:ascii="Courier New" w:cs="Courier New" w:eastAsia="Courier New" w:hAnsi="Courier New"/>
+                <w:sz w:val="17"/>
+                <w:szCs w:val="17"/>
+              </w:rPr>
+              <w:t xml:space="preserve">Ready;</w:t>
+            </w:r>
+          </w:p>
+        </w:tc>
+      </w:tr>
+    </w:tbl>
+    <w:p>
+      <w:pPr>
+        <w:spacing w:after="200" w:before="80"/>
+      </w:pPr>
+      <w:r>
+        <w:rPr>
+          <w:rFonts w:ascii="Arial" w:cs="Arial" w:eastAsia="Arial" w:hAnsi="Arial"/>
+          <w:b/>
+          <w:bCs/>
+          <w:sz w:val="18"/>
+          <w:szCs w:val="18"/>
+        </w:rPr>
+        <w:t xml:space="preserve">Figure 33. </w:t>
+      </w:r>
+      <w:r>
+        <w:rPr>
+          <w:rFonts w:ascii="Arial" w:cs="Arial" w:eastAsia="Arial" w:hAnsi="Arial"/>
+          <w:sz w:val="18"/>
+          <w:szCs w:val="18"/>
+        </w:rPr>
+        <w:t xml:space="preserve">SQLite on CMS</w:t>
       </w:r>
     </w:p>
     <w:p>
@@ -18625,7 +19109,7 @@
           <w:sz w:val="18"/>
           <w:szCs w:val="18"/>
         </w:rPr>
-        <w:t xml:space="preserve">Figure 33. </w:t>
+        <w:t xml:space="preserve">Figure 34. </w:t>
       </w:r>
       <w:r>
         <w:rPr>
@@ -18724,7 +19208,7 @@
           <w:sz w:val="18"/>
           <w:szCs w:val="18"/>
         </w:rPr>
-        <w:t xml:space="preserve">Figure 34. </w:t>
+        <w:t xml:space="preserve">Figure 35. </w:t>
       </w:r>
       <w:r>
         <w:rPr>
@@ -18867,7 +19351,7 @@
           <w:sz w:val="18"/>
           <w:szCs w:val="18"/>
         </w:rPr>
-        <w:t xml:space="preserve">Figure 35. </w:t>
+        <w:t xml:space="preserve">Figure 36. </w:t>
       </w:r>
       <w:r>
         <w:rPr>
@@ -19139,7 +19623,7 @@
           <w:sz w:val="18"/>
           <w:szCs w:val="18"/>
         </w:rPr>
-        <w:t xml:space="preserve">Figure 36. </w:t>
+        <w:t xml:space="preserve">Figure 37. </w:t>
       </w:r>
       <w:r>
         <w:rPr>
@@ -19381,7 +19865,7 @@
           <w:sz w:val="18"/>
           <w:szCs w:val="18"/>
         </w:rPr>
-        <w:t xml:space="preserve">Figure 37. </w:t>
+        <w:t xml:space="preserve">Figure 38. </w:t>
       </w:r>
       <w:r>
         <w:rPr>
@@ -19458,7 +19942,7 @@
           <w:sz w:val="18"/>
           <w:szCs w:val="18"/>
         </w:rPr>
-        <w:t xml:space="preserve">Figure 38. </w:t>
+        <w:t xml:space="preserve">Figure 39. </w:t>
       </w:r>
       <w:r>
         <w:rPr>
@@ -19588,7 +20072,7 @@
           <w:sz w:val="18"/>
           <w:szCs w:val="18"/>
         </w:rPr>
-        <w:t xml:space="preserve">Figure 39. </w:t>
+        <w:t xml:space="preserve">Figure 40. </w:t>
       </w:r>
       <w:r>
         <w:rPr>
@@ -19762,7 +20246,7 @@
           <w:sz w:val="18"/>
           <w:szCs w:val="18"/>
         </w:rPr>
-        <w:t xml:space="preserve">Figure 40. </w:t>
+        <w:t xml:space="preserve">Figure 41. </w:t>
       </w:r>
       <w:r>
         <w:rPr>
@@ -19852,7 +20336,7 @@
           <w:sz w:val="18"/>
           <w:szCs w:val="18"/>
         </w:rPr>
-        <w:t xml:space="preserve">Figure 41. </w:t>
+        <w:t xml:space="preserve">Figure 42. </w:t>
       </w:r>
       <w:r>
         <w:rPr>
@@ -20599,7 +21083,7 @@
           <w:sz w:val="18"/>
           <w:szCs w:val="18"/>
         </w:rPr>
-        <w:t xml:space="preserve">Figure 42. </w:t>
+        <w:t xml:space="preserve">Figure 43. </w:t>
       </w:r>
       <w:r>
         <w:rPr>
@@ -20701,7 +21185,7 @@
           <w:sz w:val="18"/>
           <w:szCs w:val="18"/>
         </w:rPr>
-        <w:t xml:space="preserve">Figure 43. </w:t>
+        <w:t xml:space="preserve">Figure 44. </w:t>
       </w:r>
       <w:r>
         <w:rPr>
@@ -20876,7 +21360,7 @@
           <w:sz w:val="18"/>
           <w:szCs w:val="18"/>
         </w:rPr>
-        <w:t xml:space="preserve">Figure 44. </w:t>
+        <w:t xml:space="preserve">Figure 45. </w:t>
       </w:r>
       <w:r>
         <w:rPr>
@@ -20953,7 +21437,7 @@
           <w:sz w:val="18"/>
           <w:szCs w:val="18"/>
         </w:rPr>
-        <w:t xml:space="preserve">Figure 45. </w:t>
+        <w:t xml:space="preserve">Figure 46. </w:t>
       </w:r>
       <w:r>
         <w:rPr>
@@ -21233,7 +21717,7 @@
           <w:sz w:val="18"/>
           <w:szCs w:val="18"/>
         </w:rPr>
-        <w:t xml:space="preserve">Figure 46. </w:t>
+        <w:t xml:space="preserve">Figure 47. </w:t>
       </w:r>
       <w:r>
         <w:rPr>
@@ -21362,7 +21846,7 @@
           <w:sz w:val="18"/>
           <w:szCs w:val="18"/>
         </w:rPr>
-        <w:t xml:space="preserve">Figure 47. </w:t>
+        <w:t xml:space="preserve">Figure 48. </w:t>
       </w:r>
       <w:r>
         <w:rPr>
@@ -21594,7 +22078,7 @@
           <w:sz w:val="18"/>
           <w:szCs w:val="18"/>
         </w:rPr>
-        <w:t xml:space="preserve">Figure 48. </w:t>
+        <w:t xml:space="preserve">Figure 49. </w:t>
       </w:r>
       <w:r>
         <w:rPr>
@@ -21710,7 +22194,7 @@
           <w:sz w:val="18"/>
           <w:szCs w:val="18"/>
         </w:rPr>
-        <w:t xml:space="preserve">Figure 49. </w:t>
+        <w:t xml:space="preserve">Figure 50. </w:t>
       </w:r>
       <w:r>
         <w:rPr>
@@ -22370,7 +22854,7 @@
           <w:sz w:val="18"/>
           <w:szCs w:val="18"/>
         </w:rPr>
-        <w:t xml:space="preserve">Figure 50. </w:t>
+        <w:t xml:space="preserve">Figure 51. </w:t>
       </w:r>
       <w:r>
         <w:rPr>

</xml_diff>

<commit_message>
cmsrt: /tmp files are CMS files, a bare name is FILE name; COBX: record files binary on CMS (cobrt-cms.patch, mkcobx.sh); guide: COBX, xBase, Smalltalk; Debian test bundle script
Co-Authored-By: Claude Opus 5.5 <noreply@anthropic.com>
Claude-Session: https://claude.ai/code/session_01JBNU8KnKzXkgscse8vw6so
</commit_message>
<xml_diff>
--- a/arch/31bit/manual/VM370PLUS-Guide.docx
+++ b/arch/31bit/manual/VM370PLUS-Guide.docx
@@ -1397,7 +1397,7 @@
           <w:sz w:val="20"/>
           <w:szCs w:val="20"/>
         </w:rPr>
-        <w:t xml:space="preserve">PL/I</w:t>
+        <w:t xml:space="preserve">COBOL with OO: COBX</w:t>
       </w:r>
       <w:r>
         <w:rPr>
@@ -1426,7 +1426,65 @@
           <w:sz w:val="20"/>
           <w:szCs w:val="20"/>
         </w:rPr>
+        <w:t xml:space="preserve">PL/I</w:t>
+      </w:r>
+      <w:r>
+        <w:rPr>
+          <w:rFonts w:ascii="Times New Roman" w:cs="Times New Roman" w:eastAsia="Times New Roman" w:hAnsi="Times New Roman"/>
+          <w:b w:val="false"/>
+          <w:bCs w:val="false"/>
+          <w:sz w:val="20"/>
+          <w:szCs w:val="20"/>
+        </w:rPr>
+        <w:t xml:space="preserve">	21</w:t>
+      </w:r>
+    </w:p>
+    <w:p>
+      <w:pPr>
+        <w:tabs>
+          <w:tab w:val="right" w:pos="9638" w:leader="dot"/>
+        </w:tabs>
+        <w:spacing w:after="20" w:before="20"/>
+        <w:ind w:left="400"/>
+      </w:pPr>
+      <w:r>
+        <w:rPr>
+          <w:rFonts w:ascii="Times New Roman" w:cs="Times New Roman" w:eastAsia="Times New Roman" w:hAnsi="Times New Roman"/>
+          <w:b w:val="false"/>
+          <w:bCs w:val="false"/>
+          <w:sz w:val="20"/>
+          <w:szCs w:val="20"/>
+        </w:rPr>
         <w:t xml:space="preserve">Python</w:t>
+      </w:r>
+      <w:r>
+        <w:rPr>
+          <w:rFonts w:ascii="Times New Roman" w:cs="Times New Roman" w:eastAsia="Times New Roman" w:hAnsi="Times New Roman"/>
+          <w:b w:val="false"/>
+          <w:bCs w:val="false"/>
+          <w:sz w:val="20"/>
+          <w:szCs w:val="20"/>
+        </w:rPr>
+        <w:t xml:space="preserve">	21</w:t>
+      </w:r>
+    </w:p>
+    <w:p>
+      <w:pPr>
+        <w:tabs>
+          <w:tab w:val="right" w:pos="9638" w:leader="dot"/>
+        </w:tabs>
+        <w:spacing w:after="20" w:before="20"/>
+        <w:ind w:left="400"/>
+      </w:pPr>
+      <w:r>
+        <w:rPr>
+          <w:rFonts w:ascii="Times New Roman" w:cs="Times New Roman" w:eastAsia="Times New Roman" w:hAnsi="Times New Roman"/>
+          <w:b w:val="false"/>
+          <w:bCs w:val="false"/>
+          <w:sz w:val="20"/>
+          <w:szCs w:val="20"/>
+        </w:rPr>
+        <w:t xml:space="preserve">xBase and Smalltalk</w:t>
       </w:r>
       <w:r>
         <w:rPr>
@@ -2228,7 +2286,7 @@
         <w:rPr>
           <w:rFonts w:ascii="Times New Roman" w:cs="Times New Roman" w:eastAsia="Times New Roman" w:hAnsi="Times New Roman"/>
         </w:rPr>
-        <w:t xml:space="preserve">, describes GCC 13 for C and C++, GnuCOBOL, PL/I, Python and SQLite on CMS.</w:t>
+        <w:t xml:space="preserve">, describes GCC 13 for C and C++, GnuCOBOL, COBOL with OO, PL/I, Python, SQLite, xBase and Smalltalk on CMS.</w:t>
       </w:r>
     </w:p>
     <w:p>
@@ -17851,7 +17909,7 @@
         <w:pStyle w:val="Heading2"/>
       </w:pPr>
       <w:r>
-        <w:t xml:space="preserve">PL/I</w:t>
+        <w:t xml:space="preserve">COBOL with OO: COBX</w:t>
       </w:r>
     </w:p>
     <w:p>
@@ -17860,23 +17918,17 @@
       </w:pPr>
       <w:r>
         <w:rPr>
-          <w:rFonts w:ascii="Times New Roman" w:cs="Times New Roman" w:eastAsia="Times New Roman" w:hAnsi="Times New Roman"/>
-        </w:rPr>
-        <w:t xml:space="preserve">The Community Edition’s IBM PL/I (F) compiler is on the Y disk (</w:t>
-      </w:r>
-      <w:r>
-        <w:rPr>
           <w:rFonts w:ascii="Courier New" w:cs="Courier New" w:eastAsia="Courier New" w:hAnsi="Courier New"/>
           <w:sz w:val="19"/>
           <w:szCs w:val="19"/>
         </w:rPr>
-        <w:t xml:space="preserve">PLI fn</w:t>
-      </w:r>
-      <w:r>
-        <w:rPr>
-          <w:rFonts w:ascii="Times New Roman" w:cs="Times New Roman" w:eastAsia="Times New Roman" w:hAnsi="Times New Roman"/>
-        </w:rPr>
-        <w:t xml:space="preserve">, then </w:t>
+        <w:t xml:space="preserve">COBX fn</w:t>
+      </w:r>
+      <w:r>
+        <w:rPr>
+          <w:rFonts w:ascii="Times New Roman" w:cs="Times New Roman" w:eastAsia="Times New Roman" w:hAnsi="Times New Roman"/>
+        </w:rPr>
+        <w:t xml:space="preserve"> translates </w:t>
       </w:r>
       <w:r>
         <w:rPr>
@@ -17884,13 +17936,13 @@
           <w:sz w:val="19"/>
           <w:szCs w:val="19"/>
         </w:rPr>
-        <w:t xml:space="preserve">GLOBAL TXTLIB PLILIB</w:t>
-      </w:r>
-      <w:r>
-        <w:rPr>
-          <w:rFonts w:ascii="Times New Roman" w:cs="Times New Roman" w:eastAsia="Times New Roman" w:hAnsi="Times New Roman"/>
-        </w:rPr>
-        <w:t xml:space="preserve"> and </w:t>
+        <w:t xml:space="preserve">fn COB</w:t>
+      </w:r>
+      <w:r>
+        <w:rPr>
+          <w:rFonts w:ascii="Times New Roman" w:cs="Times New Roman" w:eastAsia="Times New Roman" w:hAnsi="Times New Roman"/>
+        </w:rPr>
+        <w:t xml:space="preserve"> with </w:t>
       </w:r>
       <w:r>
         <w:rPr>
@@ -17898,13 +17950,13 @@
           <w:sz w:val="19"/>
           <w:szCs w:val="19"/>
         </w:rPr>
-        <w:t xml:space="preserve">LOAD fn (START</w:t>
-      </w:r>
-      <w:r>
-        <w:rPr>
-          <w:rFonts w:ascii="Times New Roman" w:cs="Times New Roman" w:eastAsia="Times New Roman" w:hAnsi="Times New Roman"/>
-        </w:rPr>
-        <w:t xml:space="preserve">). VM/370plus adds a PL/I-to-C translator (mikebeer/pli): </w:t>
+        <w:t xml:space="preserve">COB2C MODULE</w:t>
+      </w:r>
+      <w:r>
+        <w:rPr>
+          <w:rFonts w:ascii="Times New Roman" w:cs="Times New Roman" w:eastAsia="Times New Roman" w:hAnsi="Times New Roman"/>
+        </w:rPr>
+        <w:t xml:space="preserve"> (mikebeer/cobol: COBOL-85 with classes, methods and </w:t>
       </w:r>
       <w:r>
         <w:rPr>
@@ -17912,13 +17964,13 @@
           <w:sz w:val="19"/>
           <w:szCs w:val="19"/>
         </w:rPr>
-        <w:t xml:space="preserve">PLIC fn</w:t>
-      </w:r>
-      <w:r>
-        <w:rPr>
-          <w:rFonts w:ascii="Times New Roman" w:cs="Times New Roman" w:eastAsia="Times New Roman" w:hAnsi="Times New Roman"/>
-        </w:rPr>
-        <w:t xml:space="preserve"> translates </w:t>
+        <w:t xml:space="preserve">INVOKE</w:t>
+      </w:r>
+      <w:r>
+        <w:rPr>
+          <w:rFonts w:ascii="Times New Roman" w:cs="Times New Roman" w:eastAsia="Times New Roman" w:hAnsi="Times New Roman"/>
+        </w:rPr>
+        <w:t xml:space="preserve">, indexed files, SORT, free format and user functions) into C89 and compiles it with the CC EXEC to </w:t>
       </w:r>
       <w:r>
         <w:rPr>
@@ -17926,13 +17978,13 @@
           <w:sz w:val="19"/>
           <w:szCs w:val="19"/>
         </w:rPr>
-        <w:t xml:space="preserve">fn PLI</w:t>
-      </w:r>
-      <w:r>
-        <w:rPr>
-          <w:rFonts w:ascii="Times New Roman" w:cs="Times New Roman" w:eastAsia="Times New Roman" w:hAnsi="Times New Roman"/>
-        </w:rPr>
-        <w:t xml:space="preserve"> to C with </w:t>
+        <w:t xml:space="preserve">fn MODULE</w:t>
+      </w:r>
+      <w:r>
+        <w:rPr>
+          <w:rFonts w:ascii="Times New Roman" w:cs="Times New Roman" w:eastAsia="Times New Roman" w:hAnsi="Times New Roman"/>
+        </w:rPr>
+        <w:t xml:space="preserve">; </w:t>
       </w:r>
       <w:r>
         <w:rPr>
@@ -17940,13 +17992,13 @@
           <w:sz w:val="19"/>
           <w:szCs w:val="19"/>
         </w:rPr>
-        <w:t xml:space="preserve">PLI2C MODULE</w:t>
-      </w:r>
-      <w:r>
-        <w:rPr>
-          <w:rFonts w:ascii="Times New Roman" w:cs="Times New Roman" w:eastAsia="Times New Roman" w:hAnsi="Times New Roman"/>
-        </w:rPr>
-        <w:t xml:space="preserve"> and compiles it with the CC EXEC to </w:t>
+        <w:t xml:space="preserve">COBX fn ( C</w:t>
+      </w:r>
+      <w:r>
+        <w:rPr>
+          <w:rFonts w:ascii="Times New Roman" w:cs="Times New Roman" w:eastAsia="Times New Roman" w:hAnsi="Times New Roman"/>
+        </w:rPr>
+        <w:t xml:space="preserve"> stops after </w:t>
       </w:r>
       <w:r>
         <w:rPr>
@@ -17954,13 +18006,13 @@
           <w:sz w:val="19"/>
           <w:szCs w:val="19"/>
         </w:rPr>
-        <w:t xml:space="preserve">fn MODULE</w:t>
-      </w:r>
-      <w:r>
-        <w:rPr>
-          <w:rFonts w:ascii="Times New Roman" w:cs="Times New Roman" w:eastAsia="Times New Roman" w:hAnsi="Times New Roman"/>
-        </w:rPr>
-        <w:t xml:space="preserve"> (</w:t>
+        <w:t xml:space="preserve">fn C</w:t>
+      </w:r>
+      <w:r>
+        <w:rPr>
+          <w:rFonts w:ascii="Times New Roman" w:cs="Times New Roman" w:eastAsia="Times New Roman" w:hAnsi="Times New Roman"/>
+        </w:rPr>
+        <w:t xml:space="preserve">. The run time is one header, </w:t>
       </w:r>
       <w:r>
         <w:rPr>
@@ -17968,13 +18020,13 @@
           <w:sz w:val="19"/>
           <w:szCs w:val="19"/>
         </w:rPr>
-        <w:t xml:space="preserve">PLIC fn ( GCC380</w:t>
-      </w:r>
-      <w:r>
-        <w:rPr>
-          <w:rFonts w:ascii="Times New Roman" w:cs="Times New Roman" w:eastAsia="Times New Roman" w:hAnsi="Times New Roman"/>
-        </w:rPr>
-        <w:t xml:space="preserve"> uses GCC380 instead). SYSIN is the terminal and the console stack; a line of just </w:t>
+        <w:t xml:space="preserve">COBRT H</w:t>
+      </w:r>
+      <w:r>
+        <w:rPr>
+          <w:rFonts w:ascii="Times New Roman" w:cs="Times New Roman" w:eastAsia="Times New Roman" w:hAnsi="Times New Roman"/>
+        </w:rPr>
+        <w:t xml:space="preserve">. COPY books are </w:t>
       </w:r>
       <w:r>
         <w:rPr>
@@ -17982,13 +18034,13 @@
           <w:sz w:val="19"/>
           <w:szCs w:val="19"/>
         </w:rPr>
-        <w:t xml:space="preserve">/*</w:t>
-      </w:r>
-      <w:r>
-        <w:rPr>
-          <w:rFonts w:ascii="Times New Roman" w:cs="Times New Roman" w:eastAsia="Times New Roman" w:hAnsi="Times New Roman"/>
-        </w:rPr>
-        <w:t xml:space="preserve"> is end of file. PL/I file names become CMS file ids: </w:t>
+        <w:t xml:space="preserve">name CPY</w:t>
+      </w:r>
+      <w:r>
+        <w:rPr>
+          <w:rFonts w:ascii="Times New Roman" w:cs="Times New Roman" w:eastAsia="Times New Roman" w:hAnsi="Times New Roman"/>
+        </w:rPr>
+        <w:t xml:space="preserve"> files. On Debian the same translator is </w:t>
       </w:r>
       <w:r>
         <w:rPr>
@@ -17996,13 +18048,13 @@
           <w:sz w:val="19"/>
           <w:szCs w:val="19"/>
         </w:rPr>
-        <w:t xml:space="preserve">data/plitest_out.txt</w:t>
-      </w:r>
-      <w:r>
-        <w:rPr>
-          <w:rFonts w:ascii="Times New Roman" w:cs="Times New Roman" w:eastAsia="Times New Roman" w:hAnsi="Times New Roman"/>
-        </w:rPr>
-        <w:t xml:space="preserve"> is </w:t>
+        <w:t xml:space="preserve">cobol</w:t>
+      </w:r>
+      <w:r>
+        <w:rPr>
+          <w:rFonts w:ascii="Times New Roman" w:cs="Times New Roman" w:eastAsia="Times New Roman" w:hAnsi="Times New Roman"/>
+        </w:rPr>
+        <w:t xml:space="preserve">: </w:t>
       </w:r>
       <w:r>
         <w:rPr>
@@ -18010,27 +18062,13 @@
           <w:sz w:val="19"/>
           <w:szCs w:val="19"/>
         </w:rPr>
-        <w:t xml:space="preserve">PLITTOUT TXT</w:t>
-      </w:r>
-      <w:r>
-        <w:rPr>
-          <w:rFonts w:ascii="Times New Roman" w:cs="Times New Roman" w:eastAsia="Times New Roman" w:hAnsi="Times New Roman"/>
-        </w:rPr>
-        <w:t xml:space="preserve"> (a part longer than eight characters keeps its first and last four). On Debian, </w:t>
-      </w:r>
-      <w:r>
-        <w:rPr>
-          <w:rFonts w:ascii="Courier New" w:cs="Courier New" w:eastAsia="Courier New" w:hAnsi="Courier New"/>
-          <w:sz w:val="19"/>
-          <w:szCs w:val="19"/>
-        </w:rPr>
-        <w:t xml:space="preserve">plic fn.pli</w:t>
-      </w:r>
-      <w:r>
-        <w:rPr>
-          <w:rFonts w:ascii="Times New Roman" w:cs="Times New Roman" w:eastAsia="Times New Roman" w:hAnsi="Times New Roman"/>
-        </w:rPr>
-        <w:t xml:space="preserve"> translates and compiles with gcc.</w:t>
+        <w:t xml:space="preserve">cobol prog.cob -o prog.c</w:t>
+      </w:r>
+      <w:r>
+        <w:rPr>
+          <w:rFonts w:ascii="Times New Roman" w:cs="Times New Roman" w:eastAsia="Times New Roman" w:hAnsi="Times New Roman"/>
+        </w:rPr>
+        <w:t xml:space="preserve">, then gcc.</w:t>
       </w:r>
     </w:p>
     <w:p>
@@ -18038,7 +18076,7 @@
         <w:pStyle w:val="Heading2"/>
       </w:pPr>
       <w:r>
-        <w:t xml:space="preserve">Python</w:t>
+        <w:t xml:space="preserve">PL/I</w:t>
       </w:r>
     </w:p>
     <w:p>
@@ -18047,17 +18085,23 @@
       </w:pPr>
       <w:r>
         <w:rPr>
+          <w:rFonts w:ascii="Times New Roman" w:cs="Times New Roman" w:eastAsia="Times New Roman" w:hAnsi="Times New Roman"/>
+        </w:rPr>
+        <w:t xml:space="preserve">The Community Edition’s IBM PL/I (F) compiler is on the Y disk (</w:t>
+      </w:r>
+      <w:r>
+        <w:rPr>
           <w:rFonts w:ascii="Courier New" w:cs="Courier New" w:eastAsia="Courier New" w:hAnsi="Courier New"/>
           <w:sz w:val="19"/>
           <w:szCs w:val="19"/>
         </w:rPr>
-        <w:t xml:space="preserve">PYTHON fn [args]</w:t>
-      </w:r>
-      <w:r>
-        <w:rPr>
-          <w:rFonts w:ascii="Times New Roman" w:cs="Times New Roman" w:eastAsia="Times New Roman" w:hAnsi="Times New Roman"/>
-        </w:rPr>
-        <w:t xml:space="preserve"> runs </w:t>
+        <w:t xml:space="preserve">PLI fn</w:t>
+      </w:r>
+      <w:r>
+        <w:rPr>
+          <w:rFonts w:ascii="Times New Roman" w:cs="Times New Roman" w:eastAsia="Times New Roman" w:hAnsi="Times New Roman"/>
+        </w:rPr>
+        <w:t xml:space="preserve">, then </w:t>
       </w:r>
       <w:r>
         <w:rPr>
@@ -18065,13 +18109,13 @@
           <w:sz w:val="19"/>
           <w:szCs w:val="19"/>
         </w:rPr>
-        <w:t xml:space="preserve">fn PY</w:t>
-      </w:r>
-      <w:r>
-        <w:rPr>
-          <w:rFonts w:ascii="Times New Roman" w:cs="Times New Roman" w:eastAsia="Times New Roman" w:hAnsi="Times New Roman"/>
-        </w:rPr>
-        <w:t xml:space="preserve"> with the C89 Python 3 interpreter of mikebeer/python; </w:t>
+        <w:t xml:space="preserve">GLOBAL TXTLIB PLILIB</w:t>
+      </w:r>
+      <w:r>
+        <w:rPr>
+          <w:rFonts w:ascii="Times New Roman" w:cs="Times New Roman" w:eastAsia="Times New Roman" w:hAnsi="Times New Roman"/>
+        </w:rPr>
+        <w:t xml:space="preserve"> and </w:t>
       </w:r>
       <w:r>
         <w:rPr>
@@ -18079,13 +18123,13 @@
           <w:sz w:val="19"/>
           <w:szCs w:val="19"/>
         </w:rPr>
-        <w:t xml:space="preserve">PYTHON</w:t>
-      </w:r>
-      <w:r>
-        <w:rPr>
-          <w:rFonts w:ascii="Times New Roman" w:cs="Times New Roman" w:eastAsia="Times New Roman" w:hAnsi="Times New Roman"/>
-        </w:rPr>
-        <w:t xml:space="preserve"> alone reads statements from the terminal. NumPy, pandas and SciPy (the interpreter’s own versions), re, json, struct, cmath, complex numbers, classes, generators and exceptions are built in. The interpreter (</w:t>
+        <w:t xml:space="preserve">LOAD fn (START</w:t>
+      </w:r>
+      <w:r>
+        <w:rPr>
+          <w:rFonts w:ascii="Times New Roman" w:cs="Times New Roman" w:eastAsia="Times New Roman" w:hAnsi="Times New Roman"/>
+        </w:rPr>
+        <w:t xml:space="preserve">). VM/370plus adds a PL/I-to-C translator (mikebeer/pli): </w:t>
       </w:r>
       <w:r>
         <w:rPr>
@@ -18093,13 +18137,13 @@
           <w:sz w:val="19"/>
           <w:szCs w:val="19"/>
         </w:rPr>
-        <w:t xml:space="preserve">PY XIMAGE</w:t>
-      </w:r>
-      <w:r>
-        <w:rPr>
-          <w:rFonts w:ascii="Times New Roman" w:cs="Times New Roman" w:eastAsia="Times New Roman" w:hAnsi="Times New Roman"/>
-        </w:rPr>
-        <w:t xml:space="preserve">, 2.3 MB) runs above 16 MB through the XL loader. Integers beyond ±999,999,999 are big integers. There are no sockets on CMS yet, and modules of your own are </w:t>
+        <w:t xml:space="preserve">PLIC fn</w:t>
+      </w:r>
+      <w:r>
+        <w:rPr>
+          <w:rFonts w:ascii="Times New Roman" w:cs="Times New Roman" w:eastAsia="Times New Roman" w:hAnsi="Times New Roman"/>
+        </w:rPr>
+        <w:t xml:space="preserve"> translates </w:t>
       </w:r>
       <w:r>
         <w:rPr>
@@ -18107,6 +18151,187 @@
           <w:sz w:val="19"/>
           <w:szCs w:val="19"/>
         </w:rPr>
+        <w:t xml:space="preserve">fn PLI</w:t>
+      </w:r>
+      <w:r>
+        <w:rPr>
+          <w:rFonts w:ascii="Times New Roman" w:cs="Times New Roman" w:eastAsia="Times New Roman" w:hAnsi="Times New Roman"/>
+        </w:rPr>
+        <w:t xml:space="preserve"> to C with </w:t>
+      </w:r>
+      <w:r>
+        <w:rPr>
+          <w:rFonts w:ascii="Courier New" w:cs="Courier New" w:eastAsia="Courier New" w:hAnsi="Courier New"/>
+          <w:sz w:val="19"/>
+          <w:szCs w:val="19"/>
+        </w:rPr>
+        <w:t xml:space="preserve">PLI2C MODULE</w:t>
+      </w:r>
+      <w:r>
+        <w:rPr>
+          <w:rFonts w:ascii="Times New Roman" w:cs="Times New Roman" w:eastAsia="Times New Roman" w:hAnsi="Times New Roman"/>
+        </w:rPr>
+        <w:t xml:space="preserve"> and compiles it with the CC EXEC to </w:t>
+      </w:r>
+      <w:r>
+        <w:rPr>
+          <w:rFonts w:ascii="Courier New" w:cs="Courier New" w:eastAsia="Courier New" w:hAnsi="Courier New"/>
+          <w:sz w:val="19"/>
+          <w:szCs w:val="19"/>
+        </w:rPr>
+        <w:t xml:space="preserve">fn MODULE</w:t>
+      </w:r>
+      <w:r>
+        <w:rPr>
+          <w:rFonts w:ascii="Times New Roman" w:cs="Times New Roman" w:eastAsia="Times New Roman" w:hAnsi="Times New Roman"/>
+        </w:rPr>
+        <w:t xml:space="preserve"> (</w:t>
+      </w:r>
+      <w:r>
+        <w:rPr>
+          <w:rFonts w:ascii="Courier New" w:cs="Courier New" w:eastAsia="Courier New" w:hAnsi="Courier New"/>
+          <w:sz w:val="19"/>
+          <w:szCs w:val="19"/>
+        </w:rPr>
+        <w:t xml:space="preserve">PLIC fn ( GCC380</w:t>
+      </w:r>
+      <w:r>
+        <w:rPr>
+          <w:rFonts w:ascii="Times New Roman" w:cs="Times New Roman" w:eastAsia="Times New Roman" w:hAnsi="Times New Roman"/>
+        </w:rPr>
+        <w:t xml:space="preserve"> uses GCC380 instead). SYSIN is the terminal and the console stack; a line of just </w:t>
+      </w:r>
+      <w:r>
+        <w:rPr>
+          <w:rFonts w:ascii="Courier New" w:cs="Courier New" w:eastAsia="Courier New" w:hAnsi="Courier New"/>
+          <w:sz w:val="19"/>
+          <w:szCs w:val="19"/>
+        </w:rPr>
+        <w:t xml:space="preserve">/*</w:t>
+      </w:r>
+      <w:r>
+        <w:rPr>
+          <w:rFonts w:ascii="Times New Roman" w:cs="Times New Roman" w:eastAsia="Times New Roman" w:hAnsi="Times New Roman"/>
+        </w:rPr>
+        <w:t xml:space="preserve"> is end of file. PL/I file names become CMS file ids: </w:t>
+      </w:r>
+      <w:r>
+        <w:rPr>
+          <w:rFonts w:ascii="Courier New" w:cs="Courier New" w:eastAsia="Courier New" w:hAnsi="Courier New"/>
+          <w:sz w:val="19"/>
+          <w:szCs w:val="19"/>
+        </w:rPr>
+        <w:t xml:space="preserve">data/plitest_out.txt</w:t>
+      </w:r>
+      <w:r>
+        <w:rPr>
+          <w:rFonts w:ascii="Times New Roman" w:cs="Times New Roman" w:eastAsia="Times New Roman" w:hAnsi="Times New Roman"/>
+        </w:rPr>
+        <w:t xml:space="preserve"> is </w:t>
+      </w:r>
+      <w:r>
+        <w:rPr>
+          <w:rFonts w:ascii="Courier New" w:cs="Courier New" w:eastAsia="Courier New" w:hAnsi="Courier New"/>
+          <w:sz w:val="19"/>
+          <w:szCs w:val="19"/>
+        </w:rPr>
+        <w:t xml:space="preserve">PLITTOUT TXT</w:t>
+      </w:r>
+      <w:r>
+        <w:rPr>
+          <w:rFonts w:ascii="Times New Roman" w:cs="Times New Roman" w:eastAsia="Times New Roman" w:hAnsi="Times New Roman"/>
+        </w:rPr>
+        <w:t xml:space="preserve"> (a part longer than eight characters keeps its first and last four). On Debian, </w:t>
+      </w:r>
+      <w:r>
+        <w:rPr>
+          <w:rFonts w:ascii="Courier New" w:cs="Courier New" w:eastAsia="Courier New" w:hAnsi="Courier New"/>
+          <w:sz w:val="19"/>
+          <w:szCs w:val="19"/>
+        </w:rPr>
+        <w:t xml:space="preserve">plic fn.pli</w:t>
+      </w:r>
+      <w:r>
+        <w:rPr>
+          <w:rFonts w:ascii="Times New Roman" w:cs="Times New Roman" w:eastAsia="Times New Roman" w:hAnsi="Times New Roman"/>
+        </w:rPr>
+        <w:t xml:space="preserve"> translates and compiles with gcc.</w:t>
+      </w:r>
+    </w:p>
+    <w:p>
+      <w:pPr>
+        <w:pStyle w:val="Heading2"/>
+      </w:pPr>
+      <w:r>
+        <w:t xml:space="preserve">Python</w:t>
+      </w:r>
+    </w:p>
+    <w:p>
+      <w:pPr>
+        <w:spacing w:after="120"/>
+      </w:pPr>
+      <w:r>
+        <w:rPr>
+          <w:rFonts w:ascii="Courier New" w:cs="Courier New" w:eastAsia="Courier New" w:hAnsi="Courier New"/>
+          <w:sz w:val="19"/>
+          <w:szCs w:val="19"/>
+        </w:rPr>
+        <w:t xml:space="preserve">PYTHON fn [args]</w:t>
+      </w:r>
+      <w:r>
+        <w:rPr>
+          <w:rFonts w:ascii="Times New Roman" w:cs="Times New Roman" w:eastAsia="Times New Roman" w:hAnsi="Times New Roman"/>
+        </w:rPr>
+        <w:t xml:space="preserve"> runs </w:t>
+      </w:r>
+      <w:r>
+        <w:rPr>
+          <w:rFonts w:ascii="Courier New" w:cs="Courier New" w:eastAsia="Courier New" w:hAnsi="Courier New"/>
+          <w:sz w:val="19"/>
+          <w:szCs w:val="19"/>
+        </w:rPr>
+        <w:t xml:space="preserve">fn PY</w:t>
+      </w:r>
+      <w:r>
+        <w:rPr>
+          <w:rFonts w:ascii="Times New Roman" w:cs="Times New Roman" w:eastAsia="Times New Roman" w:hAnsi="Times New Roman"/>
+        </w:rPr>
+        <w:t xml:space="preserve"> with the C89 Python 3 interpreter of mikebeer/python; </w:t>
+      </w:r>
+      <w:r>
+        <w:rPr>
+          <w:rFonts w:ascii="Courier New" w:cs="Courier New" w:eastAsia="Courier New" w:hAnsi="Courier New"/>
+          <w:sz w:val="19"/>
+          <w:szCs w:val="19"/>
+        </w:rPr>
+        <w:t xml:space="preserve">PYTHON</w:t>
+      </w:r>
+      <w:r>
+        <w:rPr>
+          <w:rFonts w:ascii="Times New Roman" w:cs="Times New Roman" w:eastAsia="Times New Roman" w:hAnsi="Times New Roman"/>
+        </w:rPr>
+        <w:t xml:space="preserve"> alone reads statements from the terminal. NumPy, pandas and SciPy (the interpreter’s own versions), re, json, struct, cmath, complex numbers, classes, generators and exceptions are built in. The interpreter (</w:t>
+      </w:r>
+      <w:r>
+        <w:rPr>
+          <w:rFonts w:ascii="Courier New" w:cs="Courier New" w:eastAsia="Courier New" w:hAnsi="Courier New"/>
+          <w:sz w:val="19"/>
+          <w:szCs w:val="19"/>
+        </w:rPr>
+        <w:t xml:space="preserve">PY XIMAGE</w:t>
+      </w:r>
+      <w:r>
+        <w:rPr>
+          <w:rFonts w:ascii="Times New Roman" w:cs="Times New Roman" w:eastAsia="Times New Roman" w:hAnsi="Times New Roman"/>
+        </w:rPr>
+        <w:t xml:space="preserve">, 2.3 MB) runs above 16 MB through the XL loader. Integers beyond ±999,999,999 are big integers. There are no sockets on CMS yet, and modules of your own are </w:t>
+      </w:r>
+      <w:r>
+        <w:rPr>
+          <w:rFonts w:ascii="Courier New" w:cs="Courier New" w:eastAsia="Courier New" w:hAnsi="Courier New"/>
+          <w:sz w:val="19"/>
+          <w:szCs w:val="19"/>
+        </w:rPr>
         <w:t xml:space="preserve">name PY</w:t>
       </w:r>
       <w:r>
@@ -18114,6 +18339,243 @@
           <w:rFonts w:ascii="Times New Roman" w:cs="Times New Roman" w:eastAsia="Times New Roman" w:hAnsi="Times New Roman"/>
         </w:rPr>
         <w:t xml:space="preserve"> files on an accessed disk.</w:t>
+      </w:r>
+    </w:p>
+    <w:p>
+      <w:pPr>
+        <w:pStyle w:val="Heading2"/>
+      </w:pPr>
+      <w:r>
+        <w:t xml:space="preserve">xBase and Smalltalk</w:t>
+      </w:r>
+    </w:p>
+    <w:p>
+      <w:pPr>
+        <w:spacing w:after="120"/>
+      </w:pPr>
+      <w:r>
+        <w:rPr>
+          <w:rFonts w:ascii="Courier New" w:cs="Courier New" w:eastAsia="Courier New" w:hAnsi="Courier New"/>
+          <w:sz w:val="19"/>
+          <w:szCs w:val="19"/>
+        </w:rPr>
+        <w:t xml:space="preserve">XBASE fn.prg</w:t>
+      </w:r>
+      <w:r>
+        <w:rPr>
+          <w:rFonts w:ascii="Times New Roman" w:cs="Times New Roman" w:eastAsia="Times New Roman" w:hAnsi="Times New Roman"/>
+        </w:rPr>
+        <w:t xml:space="preserve"> runs a Clipper/dBASE-style program (mikebeer/xbase) with the C89 interpreter </w:t>
+      </w:r>
+      <w:r>
+        <w:rPr>
+          <w:rFonts w:ascii="Courier New" w:cs="Courier New" w:eastAsia="Courier New" w:hAnsi="Courier New"/>
+          <w:sz w:val="19"/>
+          <w:szCs w:val="19"/>
+        </w:rPr>
+        <w:t xml:space="preserve">XBASEC XIMAGE</w:t>
+      </w:r>
+      <w:r>
+        <w:rPr>
+          <w:rFonts w:ascii="Times New Roman" w:cs="Times New Roman" w:eastAsia="Times New Roman" w:hAnsi="Times New Roman"/>
+        </w:rPr>
+        <w:t xml:space="preserve"> (through the XL loader), or with the cREXX one when only </w:t>
+      </w:r>
+      <w:r>
+        <w:rPr>
+          <w:rFonts w:ascii="Courier New" w:cs="Courier New" w:eastAsia="Courier New" w:hAnsi="Courier New"/>
+          <w:sz w:val="19"/>
+          <w:szCs w:val="19"/>
+        </w:rPr>
+        <w:t xml:space="preserve">XBASE RXBIN</w:t>
+      </w:r>
+      <w:r>
+        <w:rPr>
+          <w:rFonts w:ascii="Times New Roman" w:cs="Times New Roman" w:eastAsia="Times New Roman" w:hAnsi="Times New Roman"/>
+        </w:rPr>
+        <w:t xml:space="preserve"> is there. Tables are </w:t>
+      </w:r>
+      <w:r>
+        <w:rPr>
+          <w:rFonts w:ascii="Courier New" w:cs="Courier New" w:eastAsia="Courier New" w:hAnsi="Courier New"/>
+          <w:sz w:val="19"/>
+          <w:szCs w:val="19"/>
+        </w:rPr>
+        <w:t xml:space="preserve">name DBF</w:t>
+      </w:r>
+      <w:r>
+        <w:rPr>
+          <w:rFonts w:ascii="Times New Roman" w:cs="Times New Roman" w:eastAsia="Times New Roman" w:hAnsi="Times New Roman"/>
+        </w:rPr>
+        <w:t xml:space="preserve"> files with </w:t>
+      </w:r>
+      <w:r>
+        <w:rPr>
+          <w:rFonts w:ascii="Courier New" w:cs="Courier New" w:eastAsia="Courier New" w:hAnsi="Courier New"/>
+          <w:sz w:val="19"/>
+          <w:szCs w:val="19"/>
+        </w:rPr>
+        <w:t xml:space="preserve">DBT</w:t>
+      </w:r>
+      <w:r>
+        <w:rPr>
+          <w:rFonts w:ascii="Times New Roman" w:cs="Times New Roman" w:eastAsia="Times New Roman" w:hAnsi="Times New Roman"/>
+        </w:rPr>
+        <w:t xml:space="preserve"> memos and </w:t>
+      </w:r>
+      <w:r>
+        <w:rPr>
+          <w:rFonts w:ascii="Courier New" w:cs="Courier New" w:eastAsia="Courier New" w:hAnsi="Courier New"/>
+          <w:sz w:val="19"/>
+          <w:szCs w:val="19"/>
+        </w:rPr>
+        <w:t xml:space="preserve">XDX</w:t>
+      </w:r>
+      <w:r>
+        <w:rPr>
+          <w:rFonts w:ascii="Times New Roman" w:cs="Times New Roman" w:eastAsia="Times New Roman" w:hAnsi="Times New Roman"/>
+        </w:rPr>
+        <w:t xml:space="preserve"> indexes. </w:t>
+      </w:r>
+      <w:r>
+        <w:rPr>
+          <w:rFonts w:ascii="Courier New" w:cs="Courier New" w:eastAsia="Courier New" w:hAnsi="Courier New"/>
+          <w:sz w:val="19"/>
+          <w:szCs w:val="19"/>
+        </w:rPr>
+        <w:t xml:space="preserve">SMALLTLK fn.st</w:t>
+      </w:r>
+      <w:r>
+        <w:rPr>
+          <w:rFonts w:ascii="Times New Roman" w:cs="Times New Roman" w:eastAsia="Times New Roman" w:hAnsi="Times New Roman"/>
+        </w:rPr>
+        <w:t xml:space="preserve"> runs a Smalltalk-80 program (mikebeer/smalltalk, GNU Smalltalk bracket syntax) with the C89 interpreter </w:t>
+      </w:r>
+      <w:r>
+        <w:rPr>
+          <w:rFonts w:ascii="Courier New" w:cs="Courier New" w:eastAsia="Courier New" w:hAnsi="Courier New"/>
+          <w:sz w:val="19"/>
+          <w:szCs w:val="19"/>
+        </w:rPr>
+        <w:t xml:space="preserve">SMALLTC MODULE</w:t>
+      </w:r>
+      <w:r>
+        <w:rPr>
+          <w:rFonts w:ascii="Times New Roman" w:cs="Times New Roman" w:eastAsia="Times New Roman" w:hAnsi="Times New Roman"/>
+        </w:rPr>
+        <w:t xml:space="preserve">, or the cREXX </w:t>
+      </w:r>
+      <w:r>
+        <w:rPr>
+          <w:rFonts w:ascii="Courier New" w:cs="Courier New" w:eastAsia="Courier New" w:hAnsi="Courier New"/>
+          <w:sz w:val="19"/>
+          <w:szCs w:val="19"/>
+        </w:rPr>
+        <w:t xml:space="preserve">SMALLTLK RXBIN</w:t>
+      </w:r>
+      <w:r>
+        <w:rPr>
+          <w:rFonts w:ascii="Times New Roman" w:cs="Times New Roman" w:eastAsia="Times New Roman" w:hAnsi="Times New Roman"/>
+        </w:rPr>
+        <w:t xml:space="preserve">; </w:t>
+      </w:r>
+      <w:r>
+        <w:rPr>
+          <w:rFonts w:ascii="Courier New" w:cs="Courier New" w:eastAsia="Courier New" w:hAnsi="Courier New"/>
+          <w:sz w:val="19"/>
+          <w:szCs w:val="19"/>
+        </w:rPr>
+        <w:t xml:space="preserve">SMALLTLK -i</w:t>
+      </w:r>
+      <w:r>
+        <w:rPr>
+          <w:rFonts w:ascii="Times New Roman" w:cs="Times New Roman" w:eastAsia="Times New Roman" w:hAnsi="Times New Roman"/>
+        </w:rPr>
+        <w:t xml:space="preserve"> is the interactive prompt. Its class library is the </w:t>
+      </w:r>
+      <w:r>
+        <w:rPr>
+          <w:rFonts w:ascii="Courier New" w:cs="Courier New" w:eastAsia="Courier New" w:hAnsi="Courier New"/>
+          <w:sz w:val="19"/>
+          <w:szCs w:val="19"/>
+        </w:rPr>
+        <w:t xml:space="preserve">ST</w:t>
+      </w:r>
+      <w:r>
+        <w:rPr>
+          <w:rFonts w:ascii="Times New Roman" w:cs="Times New Roman" w:eastAsia="Times New Roman" w:hAnsi="Times New Roman"/>
+        </w:rPr>
+        <w:t xml:space="preserve"> files </w:t>
+      </w:r>
+      <w:r>
+        <w:rPr>
+          <w:rFonts w:ascii="Courier New" w:cs="Courier New" w:eastAsia="Courier New" w:hAnsi="Courier New"/>
+          <w:sz w:val="19"/>
+          <w:szCs w:val="19"/>
+        </w:rPr>
+        <w:t xml:space="preserve">KERNEL</w:t>
+      </w:r>
+      <w:r>
+        <w:rPr>
+          <w:rFonts w:ascii="Times New Roman" w:cs="Times New Roman" w:eastAsia="Times New Roman" w:hAnsi="Times New Roman"/>
+        </w:rPr>
+        <w:t xml:space="preserve">, </w:t>
+      </w:r>
+      <w:r>
+        <w:rPr>
+          <w:rFonts w:ascii="Courier New" w:cs="Courier New" w:eastAsia="Courier New" w:hAnsi="Courier New"/>
+          <w:sz w:val="19"/>
+          <w:szCs w:val="19"/>
+        </w:rPr>
+        <w:t xml:space="preserve">NUMBERS</w:t>
+      </w:r>
+      <w:r>
+        <w:rPr>
+          <w:rFonts w:ascii="Times New Roman" w:cs="Times New Roman" w:eastAsia="Times New Roman" w:hAnsi="Times New Roman"/>
+        </w:rPr>
+        <w:t xml:space="preserve">, </w:t>
+      </w:r>
+      <w:r>
+        <w:rPr>
+          <w:rFonts w:ascii="Courier New" w:cs="Courier New" w:eastAsia="Courier New" w:hAnsi="Courier New"/>
+          <w:sz w:val="19"/>
+          <w:szCs w:val="19"/>
+        </w:rPr>
+        <w:t xml:space="preserve">COLLECTI</w:t>
+      </w:r>
+      <w:r>
+        <w:rPr>
+          <w:rFonts w:ascii="Times New Roman" w:cs="Times New Roman" w:eastAsia="Times New Roman" w:hAnsi="Times New Roman"/>
+        </w:rPr>
+        <w:t xml:space="preserve"> and so on. SmallIntegers are ±2^30 on CMS; larger numbers are big integers. Both are on Debian as </w:t>
+      </w:r>
+      <w:r>
+        <w:rPr>
+          <w:rFonts w:ascii="Courier New" w:cs="Courier New" w:eastAsia="Courier New" w:hAnsi="Courier New"/>
+          <w:sz w:val="19"/>
+          <w:szCs w:val="19"/>
+        </w:rPr>
+        <w:t xml:space="preserve">xbase-c</w:t>
+      </w:r>
+      <w:r>
+        <w:rPr>
+          <w:rFonts w:ascii="Times New Roman" w:cs="Times New Roman" w:eastAsia="Times New Roman" w:hAnsi="Times New Roman"/>
+        </w:rPr>
+        <w:t xml:space="preserve"> and </w:t>
+      </w:r>
+      <w:r>
+        <w:rPr>
+          <w:rFonts w:ascii="Courier New" w:cs="Courier New" w:eastAsia="Courier New" w:hAnsi="Courier New"/>
+          <w:sz w:val="19"/>
+          <w:szCs w:val="19"/>
+        </w:rPr>
+        <w:t xml:space="preserve">stc</w:t>
+      </w:r>
+      <w:r>
+        <w:rPr>
+          <w:rFonts w:ascii="Times New Roman" w:cs="Times New Roman" w:eastAsia="Times New Roman" w:hAnsi="Times New Roman"/>
+        </w:rPr>
+        <w:t xml:space="preserve">.</w:t>
       </w:r>
     </w:p>
     <w:p>

</xml_diff>

<commit_message>
SQLSERV works end to end (tc47): QUERY READER ALL userid, so a class D client (MAINT) sees only its own files; guide: SQLSERV; milestone 9.4
Co-Authored-By: Claude Opus 5.5 <noreply@anthropic.com>
Claude-Session: https://claude.ai/code/session_01JBNU8KnKzXkgscse8vw6so
</commit_message>
<xml_diff>
--- a/arch/31bit/manual/VM370PLUS-Guide.docx
+++ b/arch/31bit/manual/VM370PLUS-Guide.docx
@@ -1552,7 +1552,7 @@
           <w:sz w:val="21"/>
           <w:szCs w:val="21"/>
         </w:rPr>
-        <w:t xml:space="preserve">	22</w:t>
+        <w:t xml:space="preserve">	23</w:t>
       </w:r>
     </w:p>
     <w:p>
@@ -1581,7 +1581,7 @@
           <w:sz w:val="21"/>
           <w:szCs w:val="21"/>
         </w:rPr>
-        <w:t xml:space="preserve">	23</w:t>
+        <w:t xml:space="preserve">	24</w:t>
       </w:r>
     </w:p>
     <w:p>
@@ -1610,7 +1610,7 @@
           <w:sz w:val="20"/>
           <w:szCs w:val="20"/>
         </w:rPr>
-        <w:t xml:space="preserve">	23</w:t>
+        <w:t xml:space="preserve">	24</w:t>
       </w:r>
     </w:p>
     <w:p>
@@ -1639,7 +1639,7 @@
           <w:sz w:val="20"/>
           <w:szCs w:val="20"/>
         </w:rPr>
-        <w:t xml:space="preserve">	23</w:t>
+        <w:t xml:space="preserve">	24</w:t>
       </w:r>
     </w:p>
     <w:p>
@@ -1668,7 +1668,7 @@
           <w:sz w:val="20"/>
           <w:szCs w:val="20"/>
         </w:rPr>
-        <w:t xml:space="preserve">	23</w:t>
+        <w:t xml:space="preserve">	24</w:t>
       </w:r>
     </w:p>
     <w:p>
@@ -1697,7 +1697,7 @@
           <w:sz w:val="20"/>
           <w:szCs w:val="20"/>
         </w:rPr>
-        <w:t xml:space="preserve">	23</w:t>
+        <w:t xml:space="preserve">	24</w:t>
       </w:r>
     </w:p>
     <w:p>
@@ -1726,7 +1726,7 @@
           <w:sz w:val="20"/>
           <w:szCs w:val="20"/>
         </w:rPr>
-        <w:t xml:space="preserve">	23</w:t>
+        <w:t xml:space="preserve">	24</w:t>
       </w:r>
     </w:p>
     <w:p>
@@ -1755,7 +1755,7 @@
           <w:sz w:val="20"/>
           <w:szCs w:val="20"/>
         </w:rPr>
-        <w:t xml:space="preserve">	24</w:t>
+        <w:t xml:space="preserve">	25</w:t>
       </w:r>
     </w:p>
     <w:p>
@@ -1784,7 +1784,7 @@
           <w:sz w:val="20"/>
           <w:szCs w:val="20"/>
         </w:rPr>
-        <w:t xml:space="preserve">	24</w:t>
+        <w:t xml:space="preserve">	25</w:t>
       </w:r>
     </w:p>
     <w:p>
@@ -1813,7 +1813,7 @@
           <w:sz w:val="20"/>
           <w:szCs w:val="20"/>
         </w:rPr>
-        <w:t xml:space="preserve">	24</w:t>
+        <w:t xml:space="preserve">	25</w:t>
       </w:r>
     </w:p>
     <w:p>
@@ -1842,7 +1842,7 @@
           <w:sz w:val="20"/>
           <w:szCs w:val="20"/>
         </w:rPr>
-        <w:t xml:space="preserve">	25</w:t>
+        <w:t xml:space="preserve">	26</w:t>
       </w:r>
     </w:p>
     <w:p>
@@ -1871,7 +1871,7 @@
           <w:sz w:val="20"/>
           <w:szCs w:val="20"/>
         </w:rPr>
-        <w:t xml:space="preserve">	25</w:t>
+        <w:t xml:space="preserve">	26</w:t>
       </w:r>
     </w:p>
     <w:p>
@@ -1900,7 +1900,7 @@
           <w:sz w:val="20"/>
           <w:szCs w:val="20"/>
         </w:rPr>
-        <w:t xml:space="preserve">	26</w:t>
+        <w:t xml:space="preserve">	27</w:t>
       </w:r>
     </w:p>
     <w:p>
@@ -1929,7 +1929,7 @@
           <w:sz w:val="21"/>
           <w:szCs w:val="21"/>
         </w:rPr>
-        <w:t xml:space="preserve">	27</w:t>
+        <w:t xml:space="preserve">	28</w:t>
       </w:r>
     </w:p>
     <w:p>
@@ -1958,7 +1958,7 @@
           <w:sz w:val="21"/>
           <w:szCs w:val="21"/>
         </w:rPr>
-        <w:t xml:space="preserve">	28</w:t>
+        <w:t xml:space="preserve">	29</w:t>
       </w:r>
     </w:p>
     <w:p>
@@ -1987,7 +1987,7 @@
           <w:sz w:val="21"/>
           <w:szCs w:val="21"/>
         </w:rPr>
-        <w:t xml:space="preserve">	29</w:t>
+        <w:t xml:space="preserve">	30</w:t>
       </w:r>
     </w:p>
     <w:p>
@@ -2045,7 +2045,7 @@
           <w:sz w:val="20"/>
           <w:szCs w:val="20"/>
         </w:rPr>
-        <w:t xml:space="preserve">	33</w:t>
+        <w:t xml:space="preserve">	34</w:t>
       </w:r>
     </w:p>
     <w:p>
@@ -18686,7 +18686,208 @@
         <w:rPr>
           <w:rFonts w:ascii="Times New Roman" w:cs="Times New Roman" w:eastAsia="Times New Roman" w:hAnsi="Times New Roman"/>
         </w:rPr>
-        <w:t xml:space="preserve"> while a transaction is open. One user at a time: there is no locking between virtual machines, so give each database to one user, or to a service machine (SQLSERV, planned).</w:t>
+        <w:t xml:space="preserve"> while a transaction is open. One user at a time: there is no locking between virtual machines, so give each database to one user, or to the SQLSERV service machine.</w:t>
+      </w:r>
+    </w:p>
+    <w:p>
+      <w:pPr>
+        <w:spacing w:after="120"/>
+      </w:pPr>
+      <w:r>
+        <w:rPr>
+          <w:rFonts w:ascii="Times New Roman" w:cs="Times New Roman" w:eastAsia="Times New Roman" w:hAnsi="Times New Roman"/>
+          <w:b/>
+          <w:bCs/>
+        </w:rPr>
+        <w:t xml:space="preserve">SQLSERV.</w:t>
+      </w:r>
+      <w:r>
+        <w:rPr>
+          <w:rFonts w:ascii="Times New Roman" w:cs="Times New Roman" w:eastAsia="Times New Roman" w:hAnsi="Times New Roman"/>
+        </w:rPr>
+        <w:t xml:space="preserve"> A service machine that owns the databases and runs requests for other users one at a time. </w:t>
+      </w:r>
+      <w:r>
+        <w:rPr>
+          <w:rFonts w:ascii="Courier New" w:cs="Courier New" w:eastAsia="Courier New" w:hAnsi="Courier New"/>
+          <w:sz w:val="19"/>
+          <w:szCs w:val="19"/>
+        </w:rPr>
+        <w:t xml:space="preserve">SQLSERV</w:t>
+      </w:r>
+      <w:r>
+        <w:rPr>
+          <w:rFonts w:ascii="Times New Roman" w:cs="Times New Roman" w:eastAsia="Times New Roman" w:hAnsi="Times New Roman"/>
+        </w:rPr>
+        <w:t xml:space="preserve"> waits for reader files (</w:t>
+      </w:r>
+      <w:r>
+        <w:rPr>
+          <w:rFonts w:ascii="Courier New" w:cs="Courier New" w:eastAsia="Courier New" w:hAnsi="Courier New"/>
+          <w:sz w:val="19"/>
+          <w:szCs w:val="19"/>
+        </w:rPr>
+        <w:t xml:space="preserve">WAKEUP</w:t>
+      </w:r>
+      <w:r>
+        <w:rPr>
+          <w:rFonts w:ascii="Times New Roman" w:cs="Times New Roman" w:eastAsia="Times New Roman" w:hAnsi="Times New Roman"/>
+        </w:rPr>
+        <w:t xml:space="preserve">); each request is punched to it, run by </w:t>
+      </w:r>
+      <w:r>
+        <w:rPr>
+          <w:rFonts w:ascii="Courier New" w:cs="Courier New" w:eastAsia="Courier New" w:hAnsi="Courier New"/>
+          <w:sz w:val="19"/>
+          <w:szCs w:val="19"/>
+        </w:rPr>
+        <w:t xml:space="preserve">SQLRUN</w:t>
+      </w:r>
+      <w:r>
+        <w:rPr>
+          <w:rFonts w:ascii="Times New Roman" w:cs="Times New Roman" w:eastAsia="Times New Roman" w:hAnsi="Times New Roman"/>
+        </w:rPr>
+        <w:t xml:space="preserve"> against </w:t>
+      </w:r>
+      <w:r>
+        <w:rPr>
+          <w:rFonts w:ascii="Courier New" w:cs="Courier New" w:eastAsia="Courier New" w:hAnsi="Courier New"/>
+          <w:sz w:val="19"/>
+          <w:szCs w:val="19"/>
+        </w:rPr>
+        <w:t xml:space="preserve">name DB</w:t>
+      </w:r>
+      <w:r>
+        <w:rPr>
+          <w:rFonts w:ascii="Times New Roman" w:cs="Times New Roman" w:eastAsia="Times New Roman" w:hAnsi="Times New Roman"/>
+        </w:rPr>
+        <w:t xml:space="preserve">, and the answer is punched back to the sender (its ORIGINID). From any user: </w:t>
+      </w:r>
+      <w:r>
+        <w:rPr>
+          <w:rFonts w:ascii="Courier New" w:cs="Courier New" w:eastAsia="Courier New" w:hAnsi="Courier New"/>
+          <w:sz w:val="19"/>
+          <w:szCs w:val="19"/>
+        </w:rPr>
+        <w:t xml:space="preserve">SQL name</w:t>
+      </w:r>
+      <w:r>
+        <w:rPr>
+          <w:rFonts w:ascii="Times New Roman" w:cs="Times New Roman" w:eastAsia="Times New Roman" w:hAnsi="Times New Roman"/>
+        </w:rPr>
+        <w:t xml:space="preserve"> </w:t>
+      </w:r>
+      <w:r>
+        <w:rPr>
+          <w:rFonts w:ascii="Times New Roman" w:cs="Times New Roman" w:eastAsia="Times New Roman" w:hAnsi="Times New Roman"/>
+          <w:i/>
+          <w:iCs/>
+        </w:rPr>
+        <w:t xml:space="preserve">statement</w:t>
+      </w:r>
+      <w:r>
+        <w:rPr>
+          <w:rFonts w:ascii="Times New Roman" w:cs="Times New Roman" w:eastAsia="Times New Roman" w:hAnsi="Times New Roman"/>
+        </w:rPr>
+        <w:t xml:space="preserve"> runs one statement, </w:t>
+      </w:r>
+      <w:r>
+        <w:rPr>
+          <w:rFonts w:ascii="Courier New" w:cs="Courier New" w:eastAsia="Courier New" w:hAnsi="Courier New"/>
+          <w:sz w:val="19"/>
+          <w:szCs w:val="19"/>
+        </w:rPr>
+        <w:t xml:space="preserve">SQL name (FILE fn ft fm</w:t>
+      </w:r>
+      <w:r>
+        <w:rPr>
+          <w:rFonts w:ascii="Times New Roman" w:cs="Times New Roman" w:eastAsia="Times New Roman" w:hAnsi="Times New Roman"/>
+        </w:rPr>
+        <w:t xml:space="preserve"> a script, and </w:t>
+      </w:r>
+      <w:r>
+        <w:rPr>
+          <w:rFonts w:ascii="Courier New" w:cs="Courier New" w:eastAsia="Courier New" w:hAnsi="Courier New"/>
+          <w:sz w:val="19"/>
+          <w:szCs w:val="19"/>
+        </w:rPr>
+        <w:t xml:space="preserve">SQL STOP</w:t>
+      </w:r>
+      <w:r>
+        <w:rPr>
+          <w:rFonts w:ascii="Times New Roman" w:cs="Times New Roman" w:eastAsia="Times New Roman" w:hAnsi="Times New Roman"/>
+        </w:rPr>
+        <w:t xml:space="preserve"> ends the server; </w:t>
+      </w:r>
+      <w:r>
+        <w:rPr>
+          <w:rFonts w:ascii="Courier New" w:cs="Courier New" w:eastAsia="Courier New" w:hAnsi="Courier New"/>
+          <w:sz w:val="19"/>
+          <w:szCs w:val="19"/>
+        </w:rPr>
+        <w:t xml:space="preserve">(SERVER userid</w:t>
+      </w:r>
+      <w:r>
+        <w:rPr>
+          <w:rFonts w:ascii="Times New Roman" w:cs="Times New Roman" w:eastAsia="Times New Roman" w:hAnsi="Times New Roman"/>
+        </w:rPr>
+        <w:t xml:space="preserve"> names another server than SQLSERV. Results are rows with columns joined by </w:t>
+      </w:r>
+      <w:r>
+        <w:rPr>
+          <w:rFonts w:ascii="Courier New" w:cs="Courier New" w:eastAsia="Courier New" w:hAnsi="Courier New"/>
+          <w:sz w:val="19"/>
+          <w:szCs w:val="19"/>
+        </w:rPr>
+        <w:t xml:space="preserve">|</w:t>
+      </w:r>
+      <w:r>
+        <w:rPr>
+          <w:rFonts w:ascii="Times New Roman" w:cs="Times New Roman" w:eastAsia="Times New Roman" w:hAnsi="Times New Roman"/>
+        </w:rPr>
+        <w:t xml:space="preserve">, then </w:t>
+      </w:r>
+      <w:r>
+        <w:rPr>
+          <w:rFonts w:ascii="Courier New" w:cs="Courier New" w:eastAsia="Courier New" w:hAnsi="Courier New"/>
+          <w:sz w:val="19"/>
+          <w:szCs w:val="19"/>
+        </w:rPr>
+        <w:t xml:space="preserve">SQLRUN: n statements, n errors</w:t>
+      </w:r>
+      <w:r>
+        <w:rPr>
+          <w:rFonts w:ascii="Times New Roman" w:cs="Times New Roman" w:eastAsia="Times New Roman" w:hAnsi="Times New Roman"/>
+        </w:rPr>
+        <w:t xml:space="preserve">. At the server console, </w:t>
+      </w:r>
+      <w:r>
+        <w:rPr>
+          <w:rFonts w:ascii="Courier New" w:cs="Courier New" w:eastAsia="Courier New" w:hAnsi="Courier New"/>
+          <w:sz w:val="19"/>
+          <w:szCs w:val="19"/>
+        </w:rPr>
+        <w:t xml:space="preserve">STOP</w:t>
+      </w:r>
+      <w:r>
+        <w:rPr>
+          <w:rFonts w:ascii="Times New Roman" w:cs="Times New Roman" w:eastAsia="Times New Roman" w:hAnsi="Times New Roman"/>
+        </w:rPr>
+        <w:t xml:space="preserve"> ends it; </w:t>
+      </w:r>
+      <w:r>
+        <w:rPr>
+          <w:rFonts w:ascii="Courier New" w:cs="Courier New" w:eastAsia="Courier New" w:hAnsi="Courier New"/>
+          <w:sz w:val="19"/>
+          <w:szCs w:val="19"/>
+        </w:rPr>
+        <w:t xml:space="preserve">SQLSERV (LOUD</w:t>
+      </w:r>
+      <w:r>
+        <w:rPr>
+          <w:rFonts w:ascii="Times New Roman" w:cs="Times New Roman" w:eastAsia="Times New Roman" w:hAnsi="Times New Roman"/>
+        </w:rPr>
+        <w:t xml:space="preserve"> logs each request.</w:t>
       </w:r>
     </w:p>
     <w:tbl>
@@ -18729,7 +18930,7 @@
                 <w:sz w:val="17"/>
                 <w:szCs w:val="17"/>
               </w:rPr>
-              <w:t xml:space="preserve">sqlite emp.db .read sqltest.sql</w:t>
+              <w:t xml:space="preserve">sql emp select count(*) n, sum(salary) total from emp</w:t>
             </w:r>
           </w:p>
           <w:p>
@@ -18742,7 +18943,7 @@
                 <w:sz w:val="17"/>
                 <w:szCs w:val="17"/>
               </w:rPr>
-              <w:t xml:space="preserve">dept   n  avg_sal  top</w:t>
+              <w:t xml:space="preserve">n|total</w:t>
             </w:r>
           </w:p>
           <w:p>
@@ -18755,7 +18956,7 @@
                 <w:sz w:val="17"/>
                 <w:szCs w:val="17"/>
               </w:rPr>
-              <w:t xml:space="preserve">-----  -  -------  ------</w:t>
+              <w:t xml:space="preserve">3|25100.0</w:t>
             </w:r>
           </w:p>
           <w:p>
@@ -18768,20 +18969,7 @@
                 <w:sz w:val="17"/>
                 <w:szCs w:val="17"/>
               </w:rPr>
-              <w:t xml:space="preserve">Ops    2  7000.13  7100.0</w:t>
-            </w:r>
-          </w:p>
-          <w:p>
-            <w:pPr>
-              <w:spacing w:after="0" w:line="228"/>
-            </w:pPr>
-            <w:r>
-              <w:rPr>
-                <w:rFonts w:ascii="Courier New" w:cs="Courier New" w:eastAsia="Courier New" w:hAnsi="Courier New"/>
-                <w:sz w:val="17"/>
-                <w:szCs w:val="17"/>
-              </w:rPr>
-              <w:t xml:space="preserve">R&amp;D    2  9000.25  9200.5</w:t>
+              <w:t xml:space="preserve">SQLRUN: 1 statements, 0 errors</w:t>
             </w:r>
           </w:p>
           <w:p>
@@ -18813,6 +19001,140 @@
           <w:szCs w:val="18"/>
         </w:rPr>
         <w:t xml:space="preserve">Figure 33. </w:t>
+      </w:r>
+      <w:r>
+        <w:rPr>
+          <w:rFonts w:ascii="Arial" w:cs="Arial" w:eastAsia="Arial" w:hAnsi="Arial"/>
+          <w:sz w:val="18"/>
+          <w:szCs w:val="18"/>
+        </w:rPr>
+        <w:t xml:space="preserve">A request to SQLSERV</w:t>
+      </w:r>
+    </w:p>
+    <w:tbl>
+      <w:tblPr>
+        <w:tblW w:type="dxa" w:w="9638"/>
+        <w:tblBorders>
+          <w:top w:val="single" w:color="auto" w:sz="4"/>
+          <w:left w:val="single" w:color="auto" w:sz="4"/>
+          <w:bottom w:val="single" w:color="auto" w:sz="4"/>
+          <w:right w:val="single" w:color="auto" w:sz="4"/>
+          <w:insideH w:val="single" w:color="auto" w:sz="4"/>
+          <w:insideV w:val="single" w:color="auto" w:sz="4"/>
+        </w:tblBorders>
+      </w:tblPr>
+      <w:tblGrid>
+        <w:gridCol w:w="9638"/>
+      </w:tblGrid>
+      <w:tr>
+        <w:trPr>
+          <w:cantSplit/>
+        </w:trPr>
+        <w:tc>
+          <w:tcPr>
+            <w:tcW w:type="dxa" w:w="9638"/>
+            <w:shd w:fill="F2F2F2" w:color="auto" w:val="clear"/>
+            <w:tcMar>
+              <w:top w:type="dxa" w:w="100"/>
+              <w:left w:type="dxa" w:w="140"/>
+              <w:bottom w:type="dxa" w:w="100"/>
+              <w:right w:type="dxa" w:w="140"/>
+            </w:tcMar>
+          </w:tcPr>
+          <w:p>
+            <w:pPr>
+              <w:spacing w:after="0" w:line="228"/>
+            </w:pPr>
+            <w:r>
+              <w:rPr>
+                <w:rFonts w:ascii="Courier New" w:cs="Courier New" w:eastAsia="Courier New" w:hAnsi="Courier New"/>
+                <w:sz w:val="17"/>
+                <w:szCs w:val="17"/>
+              </w:rPr>
+              <w:t xml:space="preserve">sqlite emp.db .read sqltest.sql</w:t>
+            </w:r>
+          </w:p>
+          <w:p>
+            <w:pPr>
+              <w:spacing w:after="0" w:line="228"/>
+            </w:pPr>
+            <w:r>
+              <w:rPr>
+                <w:rFonts w:ascii="Courier New" w:cs="Courier New" w:eastAsia="Courier New" w:hAnsi="Courier New"/>
+                <w:sz w:val="17"/>
+                <w:szCs w:val="17"/>
+              </w:rPr>
+              <w:t xml:space="preserve">dept   n  avg_sal  top</w:t>
+            </w:r>
+          </w:p>
+          <w:p>
+            <w:pPr>
+              <w:spacing w:after="0" w:line="228"/>
+            </w:pPr>
+            <w:r>
+              <w:rPr>
+                <w:rFonts w:ascii="Courier New" w:cs="Courier New" w:eastAsia="Courier New" w:hAnsi="Courier New"/>
+                <w:sz w:val="17"/>
+                <w:szCs w:val="17"/>
+              </w:rPr>
+              <w:t xml:space="preserve">-----  -  -------  ------</w:t>
+            </w:r>
+          </w:p>
+          <w:p>
+            <w:pPr>
+              <w:spacing w:after="0" w:line="228"/>
+            </w:pPr>
+            <w:r>
+              <w:rPr>
+                <w:rFonts w:ascii="Courier New" w:cs="Courier New" w:eastAsia="Courier New" w:hAnsi="Courier New"/>
+                <w:sz w:val="17"/>
+                <w:szCs w:val="17"/>
+              </w:rPr>
+              <w:t xml:space="preserve">Ops    2  7000.13  7100.0</w:t>
+            </w:r>
+          </w:p>
+          <w:p>
+            <w:pPr>
+              <w:spacing w:after="0" w:line="228"/>
+            </w:pPr>
+            <w:r>
+              <w:rPr>
+                <w:rFonts w:ascii="Courier New" w:cs="Courier New" w:eastAsia="Courier New" w:hAnsi="Courier New"/>
+                <w:sz w:val="17"/>
+                <w:szCs w:val="17"/>
+              </w:rPr>
+              <w:t xml:space="preserve">R&amp;D    2  9000.25  9200.5</w:t>
+            </w:r>
+          </w:p>
+          <w:p>
+            <w:pPr>
+              <w:spacing w:after="0" w:line="228"/>
+            </w:pPr>
+            <w:r>
+              <w:rPr>
+                <w:rFonts w:ascii="Courier New" w:cs="Courier New" w:eastAsia="Courier New" w:hAnsi="Courier New"/>
+                <w:sz w:val="17"/>
+                <w:szCs w:val="17"/>
+              </w:rPr>
+              <w:t xml:space="preserve">Ready;</w:t>
+            </w:r>
+          </w:p>
+        </w:tc>
+      </w:tr>
+    </w:tbl>
+    <w:p>
+      <w:pPr>
+        <w:spacing w:after="200" w:before="80"/>
+      </w:pPr>
+      <w:r>
+        <w:rPr>
+          <w:rFonts w:ascii="Arial" w:cs="Arial" w:eastAsia="Arial" w:hAnsi="Arial"/>
+          <w:b/>
+          <w:bCs/>
+          <w:sz w:val="18"/>
+          <w:szCs w:val="18"/>
+        </w:rPr>
+        <w:t xml:space="preserve">Figure 34. </w:t>
       </w:r>
       <w:r>
         <w:rPr>
@@ -19571,7 +19893,7 @@
           <w:sz w:val="18"/>
           <w:szCs w:val="18"/>
         </w:rPr>
-        <w:t xml:space="preserve">Figure 34. </w:t>
+        <w:t xml:space="preserve">Figure 35. </w:t>
       </w:r>
       <w:r>
         <w:rPr>
@@ -19670,7 +19992,7 @@
           <w:sz w:val="18"/>
           <w:szCs w:val="18"/>
         </w:rPr>
-        <w:t xml:space="preserve">Figure 35. </w:t>
+        <w:t xml:space="preserve">Figure 36. </w:t>
       </w:r>
       <w:r>
         <w:rPr>
@@ -19813,7 +20135,7 @@
           <w:sz w:val="18"/>
           <w:szCs w:val="18"/>
         </w:rPr>
-        <w:t xml:space="preserve">Figure 36. </w:t>
+        <w:t xml:space="preserve">Figure 37. </w:t>
       </w:r>
       <w:r>
         <w:rPr>
@@ -20085,7 +20407,7 @@
           <w:sz w:val="18"/>
           <w:szCs w:val="18"/>
         </w:rPr>
-        <w:t xml:space="preserve">Figure 37. </w:t>
+        <w:t xml:space="preserve">Figure 38. </w:t>
       </w:r>
       <w:r>
         <w:rPr>
@@ -20327,7 +20649,7 @@
           <w:sz w:val="18"/>
           <w:szCs w:val="18"/>
         </w:rPr>
-        <w:t xml:space="preserve">Figure 38. </w:t>
+        <w:t xml:space="preserve">Figure 39. </w:t>
       </w:r>
       <w:r>
         <w:rPr>
@@ -20404,7 +20726,7 @@
           <w:sz w:val="18"/>
           <w:szCs w:val="18"/>
         </w:rPr>
-        <w:t xml:space="preserve">Figure 39. </w:t>
+        <w:t xml:space="preserve">Figure 40. </w:t>
       </w:r>
       <w:r>
         <w:rPr>
@@ -20534,7 +20856,7 @@
           <w:sz w:val="18"/>
           <w:szCs w:val="18"/>
         </w:rPr>
-        <w:t xml:space="preserve">Figure 40. </w:t>
+        <w:t xml:space="preserve">Figure 41. </w:t>
       </w:r>
       <w:r>
         <w:rPr>
@@ -20708,7 +21030,7 @@
           <w:sz w:val="18"/>
           <w:szCs w:val="18"/>
         </w:rPr>
-        <w:t xml:space="preserve">Figure 41. </w:t>
+        <w:t xml:space="preserve">Figure 42. </w:t>
       </w:r>
       <w:r>
         <w:rPr>
@@ -20798,7 +21120,7 @@
           <w:sz w:val="18"/>
           <w:szCs w:val="18"/>
         </w:rPr>
-        <w:t xml:space="preserve">Figure 42. </w:t>
+        <w:t xml:space="preserve">Figure 43. </w:t>
       </w:r>
       <w:r>
         <w:rPr>
@@ -21545,7 +21867,7 @@
           <w:sz w:val="18"/>
           <w:szCs w:val="18"/>
         </w:rPr>
-        <w:t xml:space="preserve">Figure 43. </w:t>
+        <w:t xml:space="preserve">Figure 44. </w:t>
       </w:r>
       <w:r>
         <w:rPr>
@@ -21647,7 +21969,7 @@
           <w:sz w:val="18"/>
           <w:szCs w:val="18"/>
         </w:rPr>
-        <w:t xml:space="preserve">Figure 44. </w:t>
+        <w:t xml:space="preserve">Figure 45. </w:t>
       </w:r>
       <w:r>
         <w:rPr>
@@ -21822,7 +22144,7 @@
           <w:sz w:val="18"/>
           <w:szCs w:val="18"/>
         </w:rPr>
-        <w:t xml:space="preserve">Figure 45. </w:t>
+        <w:t xml:space="preserve">Figure 46. </w:t>
       </w:r>
       <w:r>
         <w:rPr>
@@ -21899,7 +22221,7 @@
           <w:sz w:val="18"/>
           <w:szCs w:val="18"/>
         </w:rPr>
-        <w:t xml:space="preserve">Figure 46. </w:t>
+        <w:t xml:space="preserve">Figure 47. </w:t>
       </w:r>
       <w:r>
         <w:rPr>
@@ -22179,7 +22501,7 @@
           <w:sz w:val="18"/>
           <w:szCs w:val="18"/>
         </w:rPr>
-        <w:t xml:space="preserve">Figure 47. </w:t>
+        <w:t xml:space="preserve">Figure 48. </w:t>
       </w:r>
       <w:r>
         <w:rPr>
@@ -22308,7 +22630,7 @@
           <w:sz w:val="18"/>
           <w:szCs w:val="18"/>
         </w:rPr>
-        <w:t xml:space="preserve">Figure 48. </w:t>
+        <w:t xml:space="preserve">Figure 49. </w:t>
       </w:r>
       <w:r>
         <w:rPr>
@@ -22540,7 +22862,7 @@
           <w:sz w:val="18"/>
           <w:szCs w:val="18"/>
         </w:rPr>
-        <w:t xml:space="preserve">Figure 49. </w:t>
+        <w:t xml:space="preserve">Figure 50. </w:t>
       </w:r>
       <w:r>
         <w:rPr>
@@ -22656,7 +22978,7 @@
           <w:sz w:val="18"/>
           <w:szCs w:val="18"/>
         </w:rPr>
-        <w:t xml:space="preserve">Figure 50. </w:t>
+        <w:t xml:space="preserve">Figure 51. </w:t>
       </w:r>
       <w:r>
         <w:rPr>
@@ -23316,7 +23638,7 @@
           <w:sz w:val="18"/>
           <w:szCs w:val="18"/>
         </w:rPr>
-        <w:t xml:space="preserve">Figure 51. </w:t>
+        <w:t xml:space="preserve">Figure 52. </w:t>
       </w:r>
       <w:r>
         <w:rPr>

</xml_diff>

<commit_message>
Kit build 8: LANG disk (parts 14-15, JOINLANG), README, Guide (LANG section); verified on a fresh CE (kt17-21); milestone 9.24 done, 9.25 spool bridge planned
Co-Authored-By: Claude Opus 5.5 <noreply@anthropic.com>
Claude-Session: https://claude.ai/code/session_01JBNU8KnKzXkgscse8vw6so
</commit_message>
<xml_diff>
--- a/arch/31bit/manual/VM370PLUS-Guide.docx
+++ b/arch/31bit/manual/VM370PLUS-Guide.docx
@@ -1339,7 +1339,7 @@
           <w:sz w:val="20"/>
           <w:szCs w:val="20"/>
         </w:rPr>
-        <w:t xml:space="preserve">C and C++: the CC EXEC</w:t>
+        <w:t xml:space="preserve">The language disk: LANG</w:t>
       </w:r>
       <w:r>
         <w:rPr>
@@ -1368,7 +1368,7 @@
           <w:sz w:val="20"/>
           <w:szCs w:val="20"/>
         </w:rPr>
-        <w:t xml:space="preserve">COBOL: GnuCOBOL</w:t>
+        <w:t xml:space="preserve">C and C++: the CC EXEC</w:t>
       </w:r>
       <w:r>
         <w:rPr>
@@ -1397,7 +1397,7 @@
           <w:sz w:val="20"/>
           <w:szCs w:val="20"/>
         </w:rPr>
-        <w:t xml:space="preserve">COBOL with OO: COBX</w:t>
+        <w:t xml:space="preserve">COBOL: GnuCOBOL</w:t>
       </w:r>
       <w:r>
         <w:rPr>
@@ -1426,7 +1426,7 @@
           <w:sz w:val="20"/>
           <w:szCs w:val="20"/>
         </w:rPr>
-        <w:t xml:space="preserve">PL/I</w:t>
+        <w:t xml:space="preserve">COBOL with OO: COBX</w:t>
       </w:r>
       <w:r>
         <w:rPr>
@@ -1455,7 +1455,7 @@
           <w:sz w:val="20"/>
           <w:szCs w:val="20"/>
         </w:rPr>
-        <w:t xml:space="preserve">Python</w:t>
+        <w:t xml:space="preserve">PL/I</w:t>
       </w:r>
       <w:r>
         <w:rPr>
@@ -1484,7 +1484,7 @@
           <w:sz w:val="20"/>
           <w:szCs w:val="20"/>
         </w:rPr>
-        <w:t xml:space="preserve">xBase and Smalltalk</w:t>
+        <w:t xml:space="preserve">Python</w:t>
       </w:r>
       <w:r>
         <w:rPr>
@@ -1513,7 +1513,7 @@
           <w:sz w:val="20"/>
           <w:szCs w:val="20"/>
         </w:rPr>
-        <w:t xml:space="preserve">SQLite</w:t>
+        <w:t xml:space="preserve">xBase and Smalltalk</w:t>
       </w:r>
       <w:r>
         <w:rPr>
@@ -1524,6 +1524,35 @@
           <w:szCs w:val="20"/>
         </w:rPr>
         <w:t xml:space="preserve">	21</w:t>
+      </w:r>
+    </w:p>
+    <w:p>
+      <w:pPr>
+        <w:tabs>
+          <w:tab w:val="right" w:pos="9638" w:leader="dot"/>
+        </w:tabs>
+        <w:spacing w:after="20" w:before="20"/>
+        <w:ind w:left="400"/>
+      </w:pPr>
+      <w:r>
+        <w:rPr>
+          <w:rFonts w:ascii="Times New Roman" w:cs="Times New Roman" w:eastAsia="Times New Roman" w:hAnsi="Times New Roman"/>
+          <w:b w:val="false"/>
+          <w:bCs w:val="false"/>
+          <w:sz w:val="20"/>
+          <w:szCs w:val="20"/>
+        </w:rPr>
+        <w:t xml:space="preserve">SQLite</w:t>
+      </w:r>
+      <w:r>
+        <w:rPr>
+          <w:rFonts w:ascii="Times New Roman" w:cs="Times New Roman" w:eastAsia="Times New Roman" w:hAnsi="Times New Roman"/>
+          <w:b w:val="false"/>
+          <w:bCs w:val="false"/>
+          <w:sz w:val="20"/>
+          <w:szCs w:val="20"/>
+        </w:rPr>
+        <w:t xml:space="preserve">	22</w:t>
       </w:r>
     </w:p>
     <w:p>
@@ -16754,6 +16783,201 @@
         <w:pStyle w:val="Heading2"/>
       </w:pPr>
       <w:r>
+        <w:t xml:space="preserve">The language disk: LANG</w:t>
+      </w:r>
+    </w:p>
+    <w:p>
+      <w:pPr>
+        <w:spacing w:after="120"/>
+      </w:pPr>
+      <w:r>
+        <w:rPr>
+          <w:rFonts w:ascii="Times New Roman" w:cs="Times New Roman" w:eastAsia="Times New Roman" w:hAnsi="Times New Roman"/>
+        </w:rPr>
+        <w:t xml:space="preserve">All the compilers and interpreters of this chapter are on one disk, MAINT 19F (volume VMLANG, a 3380 at real address 182, attached to the system by AUTOLOG1 at every IPL). </w:t>
+      </w:r>
+      <w:r>
+        <w:rPr>
+          <w:rFonts w:ascii="Courier New" w:cs="Courier New" w:eastAsia="Courier New" w:hAnsi="Courier New"/>
+          <w:sz w:val="19"/>
+          <w:szCs w:val="19"/>
+        </w:rPr>
+        <w:t xml:space="preserve">LANG</w:t>
+      </w:r>
+      <w:r>
+        <w:rPr>
+          <w:rFonts w:ascii="Times New Roman" w:cs="Times New Roman" w:eastAsia="Times New Roman" w:hAnsi="Times New Roman"/>
+        </w:rPr>
+        <w:t xml:space="preserve"> (on the Y disk) links it read-only and accesses it as L; </w:t>
+      </w:r>
+      <w:r>
+        <w:rPr>
+          <w:rFonts w:ascii="Courier New" w:cs="Courier New" w:eastAsia="Courier New" w:hAnsi="Courier New"/>
+          <w:sz w:val="19"/>
+          <w:szCs w:val="19"/>
+        </w:rPr>
+        <w:t xml:space="preserve">LANG fm</w:t>
+      </w:r>
+      <w:r>
+        <w:rPr>
+          <w:rFonts w:ascii="Times New Roman" w:cs="Times New Roman" w:eastAsia="Times New Roman" w:hAnsi="Times New Roman"/>
+        </w:rPr>
+        <w:t xml:space="preserve"> uses another letter. A file of the same name on one of your own disks comes first in the search order, so erase old copies of these EXECs and MODULEs from your A disk. </w:t>
+      </w:r>
+      <w:r>
+        <w:rPr>
+          <w:rFonts w:ascii="Courier New" w:cs="Courier New" w:eastAsia="Courier New" w:hAnsi="Courier New"/>
+          <w:sz w:val="19"/>
+          <w:szCs w:val="19"/>
+        </w:rPr>
+        <w:t xml:space="preserve">TYPE LANG README L</w:t>
+      </w:r>
+      <w:r>
+        <w:rPr>
+          <w:rFonts w:ascii="Times New Roman" w:cs="Times New Roman" w:eastAsia="Times New Roman" w:hAnsi="Times New Roman"/>
+        </w:rPr>
+        <w:t xml:space="preserve"> lists what is there.</w:t>
+      </w:r>
+    </w:p>
+    <w:tbl>
+      <w:tblPr>
+        <w:tblW w:type="dxa" w:w="9638"/>
+        <w:tblBorders>
+          <w:top w:val="single" w:color="auto" w:sz="4"/>
+          <w:left w:val="single" w:color="auto" w:sz="4"/>
+          <w:bottom w:val="single" w:color="auto" w:sz="4"/>
+          <w:right w:val="single" w:color="auto" w:sz="4"/>
+          <w:insideH w:val="single" w:color="auto" w:sz="4"/>
+          <w:insideV w:val="single" w:color="auto" w:sz="4"/>
+        </w:tblBorders>
+      </w:tblPr>
+      <w:tblGrid>
+        <w:gridCol w:w="9638"/>
+      </w:tblGrid>
+      <w:tr>
+        <w:trPr>
+          <w:cantSplit/>
+        </w:trPr>
+        <w:tc>
+          <w:tcPr>
+            <w:tcW w:type="dxa" w:w="9638"/>
+            <w:shd w:fill="F2F2F2" w:color="auto" w:val="clear"/>
+            <w:tcMar>
+              <w:top w:type="dxa" w:w="100"/>
+              <w:left w:type="dxa" w:w="140"/>
+              <w:bottom w:type="dxa" w:w="100"/>
+              <w:right w:type="dxa" w:w="140"/>
+            </w:tcMar>
+          </w:tcPr>
+          <w:p>
+            <w:pPr>
+              <w:spacing w:after="0" w:line="228"/>
+            </w:pPr>
+            <w:r>
+              <w:rPr>
+                <w:rFonts w:ascii="Courier New" w:cs="Courier New" w:eastAsia="Courier New" w:hAnsi="Courier New"/>
+                <w:sz w:val="17"/>
+                <w:szCs w:val="17"/>
+              </w:rPr>
+              <w:t xml:space="preserve">cp def stor 256m</w:t>
+            </w:r>
+          </w:p>
+          <w:p>
+            <w:pPr>
+              <w:spacing w:after="0" w:line="228"/>
+            </w:pPr>
+            <w:r>
+              <w:rPr>
+                <w:rFonts w:ascii="Courier New" w:cs="Courier New" w:eastAsia="Courier New" w:hAnsi="Courier New"/>
+                <w:sz w:val="17"/>
+                <w:szCs w:val="17"/>
+              </w:rPr>
+              <w:t xml:space="preserve">ipl 290</w:t>
+            </w:r>
+          </w:p>
+          <w:p>
+            <w:pPr>
+              <w:spacing w:after="0" w:line="228"/>
+            </w:pPr>
+            <w:r>
+              <w:rPr>
+                <w:rFonts w:ascii="Courier New" w:cs="Courier New" w:eastAsia="Courier New" w:hAnsi="Courier New"/>
+                <w:sz w:val="17"/>
+                <w:szCs w:val="17"/>
+              </w:rPr>
+              <w:t xml:space="preserve">lang</w:t>
+            </w:r>
+          </w:p>
+          <w:p>
+            <w:pPr>
+              <w:spacing w:after="0" w:line="228"/>
+            </w:pPr>
+            <w:r>
+              <w:rPr>
+                <w:rFonts w:ascii="Courier New" w:cs="Courier New" w:eastAsia="Courier New" w:hAnsi="Courier New"/>
+                <w:sz w:val="17"/>
+                <w:szCs w:val="17"/>
+              </w:rPr>
+              <w:t xml:space="preserve">L (19F) R/O</w:t>
+            </w:r>
+          </w:p>
+          <w:p>
+            <w:pPr>
+              <w:spacing w:after="0" w:line="228"/>
+            </w:pPr>
+            <w:r>
+              <w:rPr>
+                <w:rFonts w:ascii="Courier New" w:cs="Courier New" w:eastAsia="Courier New" w:hAnsi="Courier New"/>
+                <w:sz w:val="17"/>
+                <w:szCs w:val="17"/>
+              </w:rPr>
+              <w:t xml:space="preserve">LANG: language disk 19F is L -- HELP: LANG README</w:t>
+            </w:r>
+          </w:p>
+          <w:p>
+            <w:pPr>
+              <w:spacing w:after="0" w:line="228"/>
+            </w:pPr>
+            <w:r>
+              <w:rPr>
+                <w:rFonts w:ascii="Courier New" w:cs="Courier New" w:eastAsia="Courier New" w:hAnsi="Courier New"/>
+                <w:sz w:val="17"/>
+                <w:szCs w:val="17"/>
+              </w:rPr>
+              <w:t xml:space="preserve">Ready;</w:t>
+            </w:r>
+          </w:p>
+        </w:tc>
+      </w:tr>
+    </w:tbl>
+    <w:p>
+      <w:pPr>
+        <w:spacing w:after="200" w:before="80"/>
+      </w:pPr>
+      <w:r>
+        <w:rPr>
+          <w:rFonts w:ascii="Arial" w:cs="Arial" w:eastAsia="Arial" w:hAnsi="Arial"/>
+          <w:b/>
+          <w:bCs/>
+          <w:sz w:val="18"/>
+          <w:szCs w:val="18"/>
+        </w:rPr>
+        <w:t xml:space="preserve">Figure 30. </w:t>
+      </w:r>
+      <w:r>
+        <w:rPr>
+          <w:rFonts w:ascii="Arial" w:cs="Arial" w:eastAsia="Arial" w:hAnsi="Arial"/>
+          <w:sz w:val="18"/>
+          <w:szCs w:val="18"/>
+        </w:rPr>
+        <w:t xml:space="preserve">Accessing the language disk</w:t>
+      </w:r>
+    </w:p>
+    <w:p>
+      <w:pPr>
+        <w:pStyle w:val="Heading2"/>
+      </w:pPr>
+      <w:r>
         <w:t xml:space="preserve">C and C++: the CC EXEC</w:t>
       </w:r>
     </w:p>
@@ -17303,7 +17527,7 @@
           <w:sz w:val="18"/>
           <w:szCs w:val="18"/>
         </w:rPr>
-        <w:t xml:space="preserve">Figure 30. </w:t>
+        <w:t xml:space="preserve">Figure 31. </w:t>
       </w:r>
       <w:r>
         <w:rPr>
@@ -17450,7 +17674,7 @@
           <w:sz w:val="18"/>
           <w:szCs w:val="18"/>
         </w:rPr>
-        <w:t xml:space="preserve">Figure 31. </w:t>
+        <w:t xml:space="preserve">Figure 32. </w:t>
       </w:r>
       <w:r>
         <w:rPr>
@@ -17826,7 +18050,7 @@
           <w:sz w:val="18"/>
           <w:szCs w:val="18"/>
         </w:rPr>
-        <w:t xml:space="preserve">Figure 32. </w:t>
+        <w:t xml:space="preserve">Figure 33. </w:t>
       </w:r>
       <w:r>
         <w:rPr>
@@ -19000,7 +19224,7 @@
           <w:sz w:val="18"/>
           <w:szCs w:val="18"/>
         </w:rPr>
-        <w:t xml:space="preserve">Figure 33. </w:t>
+        <w:t xml:space="preserve">Figure 34. </w:t>
       </w:r>
       <w:r>
         <w:rPr>
@@ -19134,7 +19358,7 @@
           <w:sz w:val="18"/>
           <w:szCs w:val="18"/>
         </w:rPr>
-        <w:t xml:space="preserve">Figure 34. </w:t>
+        <w:t xml:space="preserve">Figure 35. </w:t>
       </w:r>
       <w:r>
         <w:rPr>
@@ -19893,7 +20117,7 @@
           <w:sz w:val="18"/>
           <w:szCs w:val="18"/>
         </w:rPr>
-        <w:t xml:space="preserve">Figure 35. </w:t>
+        <w:t xml:space="preserve">Figure 36. </w:t>
       </w:r>
       <w:r>
         <w:rPr>
@@ -19992,7 +20216,7 @@
           <w:sz w:val="18"/>
           <w:szCs w:val="18"/>
         </w:rPr>
-        <w:t xml:space="preserve">Figure 36. </w:t>
+        <w:t xml:space="preserve">Figure 37. </w:t>
       </w:r>
       <w:r>
         <w:rPr>
@@ -20135,7 +20359,7 @@
           <w:sz w:val="18"/>
           <w:szCs w:val="18"/>
         </w:rPr>
-        <w:t xml:space="preserve">Figure 37. </w:t>
+        <w:t xml:space="preserve">Figure 38. </w:t>
       </w:r>
       <w:r>
         <w:rPr>
@@ -20407,7 +20631,7 @@
           <w:sz w:val="18"/>
           <w:szCs w:val="18"/>
         </w:rPr>
-        <w:t xml:space="preserve">Figure 38. </w:t>
+        <w:t xml:space="preserve">Figure 39. </w:t>
       </w:r>
       <w:r>
         <w:rPr>
@@ -20649,7 +20873,7 @@
           <w:sz w:val="18"/>
           <w:szCs w:val="18"/>
         </w:rPr>
-        <w:t xml:space="preserve">Figure 39. </w:t>
+        <w:t xml:space="preserve">Figure 40. </w:t>
       </w:r>
       <w:r>
         <w:rPr>
@@ -20726,7 +20950,7 @@
           <w:sz w:val="18"/>
           <w:szCs w:val="18"/>
         </w:rPr>
-        <w:t xml:space="preserve">Figure 40. </w:t>
+        <w:t xml:space="preserve">Figure 41. </w:t>
       </w:r>
       <w:r>
         <w:rPr>
@@ -20856,7 +21080,7 @@
           <w:sz w:val="18"/>
           <w:szCs w:val="18"/>
         </w:rPr>
-        <w:t xml:space="preserve">Figure 41. </w:t>
+        <w:t xml:space="preserve">Figure 42. </w:t>
       </w:r>
       <w:r>
         <w:rPr>
@@ -21030,7 +21254,7 @@
           <w:sz w:val="18"/>
           <w:szCs w:val="18"/>
         </w:rPr>
-        <w:t xml:space="preserve">Figure 42. </w:t>
+        <w:t xml:space="preserve">Figure 43. </w:t>
       </w:r>
       <w:r>
         <w:rPr>
@@ -21120,7 +21344,7 @@
           <w:sz w:val="18"/>
           <w:szCs w:val="18"/>
         </w:rPr>
-        <w:t xml:space="preserve">Figure 43. </w:t>
+        <w:t xml:space="preserve">Figure 44. </w:t>
       </w:r>
       <w:r>
         <w:rPr>
@@ -21867,7 +22091,7 @@
           <w:sz w:val="18"/>
           <w:szCs w:val="18"/>
         </w:rPr>
-        <w:t xml:space="preserve">Figure 44. </w:t>
+        <w:t xml:space="preserve">Figure 45. </w:t>
       </w:r>
       <w:r>
         <w:rPr>
@@ -21969,7 +22193,7 @@
           <w:sz w:val="18"/>
           <w:szCs w:val="18"/>
         </w:rPr>
-        <w:t xml:space="preserve">Figure 45. </w:t>
+        <w:t xml:space="preserve">Figure 46. </w:t>
       </w:r>
       <w:r>
         <w:rPr>
@@ -22144,7 +22368,7 @@
           <w:sz w:val="18"/>
           <w:szCs w:val="18"/>
         </w:rPr>
-        <w:t xml:space="preserve">Figure 46. </w:t>
+        <w:t xml:space="preserve">Figure 47. </w:t>
       </w:r>
       <w:r>
         <w:rPr>
@@ -22221,7 +22445,7 @@
           <w:sz w:val="18"/>
           <w:szCs w:val="18"/>
         </w:rPr>
-        <w:t xml:space="preserve">Figure 47. </w:t>
+        <w:t xml:space="preserve">Figure 48. </w:t>
       </w:r>
       <w:r>
         <w:rPr>
@@ -22501,7 +22725,7 @@
           <w:sz w:val="18"/>
           <w:szCs w:val="18"/>
         </w:rPr>
-        <w:t xml:space="preserve">Figure 48. </w:t>
+        <w:t xml:space="preserve">Figure 49. </w:t>
       </w:r>
       <w:r>
         <w:rPr>
@@ -22630,7 +22854,7 @@
           <w:sz w:val="18"/>
           <w:szCs w:val="18"/>
         </w:rPr>
-        <w:t xml:space="preserve">Figure 49. </w:t>
+        <w:t xml:space="preserve">Figure 50. </w:t>
       </w:r>
       <w:r>
         <w:rPr>
@@ -22862,7 +23086,7 @@
           <w:sz w:val="18"/>
           <w:szCs w:val="18"/>
         </w:rPr>
-        <w:t xml:space="preserve">Figure 50. </w:t>
+        <w:t xml:space="preserve">Figure 51. </w:t>
       </w:r>
       <w:r>
         <w:rPr>
@@ -22978,7 +23202,7 @@
           <w:sz w:val="18"/>
           <w:szCs w:val="18"/>
         </w:rPr>
-        <w:t xml:space="preserve">Figure 51. </w:t>
+        <w:t xml:space="preserve">Figure 52. </w:t>
       </w:r>
       <w:r>
         <w:rPr>
@@ -23638,7 +23862,7 @@
           <w:sz w:val="18"/>
           <w:szCs w:val="18"/>
         </w:rPr>
-        <w:t xml:space="preserve">Figure 52. </w:t>
+        <w:t xml:space="preserve">Figure 53. </w:t>
       </w:r>
       <w:r>
         <w:rPr>

</xml_diff>

<commit_message>
9.23 ZIP/UNZIP/GZIP on CMS (Info-ZIP 3.0/6.0, zlib minigzip) on the LANG disk; cmsrt: real file dates from the FST (I-273), short mkstemp templates (I-274), ZIP/GZ/TGZ/... binary file types; guide; issues I-273..I-275
Co-Authored-By: Claude Opus 5.5 <noreply@anthropic.com>
Claude-Session: https://claude.ai/code/session_01JBNU8KnKzXkgscse8vw6so
</commit_message>
<xml_diff>
--- a/arch/31bit/manual/VM370PLUS-Guide.docx
+++ b/arch/31bit/manual/VM370PLUS-Guide.docx
@@ -1524,6 +1524,35 @@
           <w:szCs w:val="20"/>
         </w:rPr>
         <w:t xml:space="preserve">	21</w:t>
+      </w:r>
+    </w:p>
+    <w:p>
+      <w:pPr>
+        <w:tabs>
+          <w:tab w:val="right" w:pos="9638" w:leader="dot"/>
+        </w:tabs>
+        <w:spacing w:after="20" w:before="20"/>
+        <w:ind w:left="400"/>
+      </w:pPr>
+      <w:r>
+        <w:rPr>
+          <w:rFonts w:ascii="Times New Roman" w:cs="Times New Roman" w:eastAsia="Times New Roman" w:hAnsi="Times New Roman"/>
+          <w:b w:val="false"/>
+          <w:bCs w:val="false"/>
+          <w:sz w:val="20"/>
+          <w:szCs w:val="20"/>
+        </w:rPr>
+        <w:t xml:space="preserve">ZIP, UNZIP and GZIP</w:t>
+      </w:r>
+      <w:r>
+        <w:rPr>
+          <w:rFonts w:ascii="Times New Roman" w:cs="Times New Roman" w:eastAsia="Times New Roman" w:hAnsi="Times New Roman"/>
+          <w:b w:val="false"/>
+          <w:bCs w:val="false"/>
+          <w:sz w:val="20"/>
+          <w:szCs w:val="20"/>
+        </w:rPr>
+        <w:t xml:space="preserve">	22</w:t>
       </w:r>
     </w:p>
     <w:p>
@@ -18807,7 +18836,7 @@
         <w:pStyle w:val="Heading2"/>
       </w:pPr>
       <w:r>
-        <w:t xml:space="preserve">SQLite</w:t>
+        <w:t xml:space="preserve">ZIP, UNZIP and GZIP</w:t>
       </w:r>
     </w:p>
     <w:p>
@@ -18820,13 +18849,13 @@
           <w:sz w:val="19"/>
           <w:szCs w:val="19"/>
         </w:rPr>
-        <w:t xml:space="preserve">SQLITE fn.db</w:t>
-      </w:r>
-      <w:r>
-        <w:rPr>
-          <w:rFonts w:ascii="Times New Roman" w:cs="Times New Roman" w:eastAsia="Times New Roman" w:hAnsi="Times New Roman"/>
-        </w:rPr>
-        <w:t xml:space="preserve"> starts the sqlite3 shell (SQLite 3.46) on the database </w:t>
+        <w:t xml:space="preserve">ZIP zipfile files</w:t>
+      </w:r>
+      <w:r>
+        <w:rPr>
+          <w:rFonts w:ascii="Times New Roman" w:cs="Times New Roman" w:eastAsia="Times New Roman" w:hAnsi="Times New Roman"/>
+        </w:rPr>
+        <w:t xml:space="preserve"> and </w:t>
       </w:r>
       <w:r>
         <w:rPr>
@@ -18834,13 +18863,13 @@
           <w:sz w:val="19"/>
           <w:szCs w:val="19"/>
         </w:rPr>
-        <w:t xml:space="preserve">fn DB</w:t>
-      </w:r>
-      <w:r>
-        <w:rPr>
-          <w:rFonts w:ascii="Times New Roman" w:cs="Times New Roman" w:eastAsia="Times New Roman" w:hAnsi="Times New Roman"/>
-        </w:rPr>
-        <w:t xml:space="preserve">; </w:t>
+        <w:t xml:space="preserve">UNZIP zipfile</w:t>
+      </w:r>
+      <w:r>
+        <w:rPr>
+          <w:rFonts w:ascii="Times New Roman" w:cs="Times New Roman" w:eastAsia="Times New Roman" w:hAnsi="Times New Roman"/>
+        </w:rPr>
+        <w:t xml:space="preserve"> are Info-ZIP zip 3.0 and unzip 6.0, so archives travel between CMS and the PC: text files are stored in ASCII, and CMS dates become the archive dates. </w:t>
       </w:r>
       <w:r>
         <w:rPr>
@@ -18848,27 +18877,13 @@
           <w:sz w:val="19"/>
           <w:szCs w:val="19"/>
         </w:rPr>
-        <w:t xml:space="preserve">SQLITE fn.db</w:t>
-      </w:r>
-      <w:r>
-        <w:rPr>
-          <w:rFonts w:ascii="Times New Roman" w:cs="Times New Roman" w:eastAsia="Times New Roman" w:hAnsi="Times New Roman"/>
-        </w:rPr>
-        <w:t xml:space="preserve"> </w:t>
-      </w:r>
-      <w:r>
-        <w:rPr>
-          <w:rFonts w:ascii="Times New Roman" w:cs="Times New Roman" w:eastAsia="Times New Roman" w:hAnsi="Times New Roman"/>
-          <w:i/>
-          <w:iCs/>
-        </w:rPr>
-        <w:t xml:space="preserve">statement</w:t>
-      </w:r>
-      <w:r>
-        <w:rPr>
-          <w:rFonts w:ascii="Times New Roman" w:cs="Times New Roman" w:eastAsia="Times New Roman" w:hAnsi="Times New Roman"/>
-        </w:rPr>
-        <w:t xml:space="preserve"> runs one statement or dot command, for example </w:t>
+        <w:t xml:space="preserve">UNZIP -l</w:t>
+      </w:r>
+      <w:r>
+        <w:rPr>
+          <w:rFonts w:ascii="Times New Roman" w:cs="Times New Roman" w:eastAsia="Times New Roman" w:hAnsi="Times New Roman"/>
+        </w:rPr>
+        <w:t xml:space="preserve"> lists, </w:t>
       </w:r>
       <w:r>
         <w:rPr>
@@ -18876,13 +18891,13 @@
           <w:sz w:val="19"/>
           <w:szCs w:val="19"/>
         </w:rPr>
-        <w:t xml:space="preserve">SQLITE emp.db .read load.sql</w:t>
-      </w:r>
-      <w:r>
-        <w:rPr>
-          <w:rFonts w:ascii="Times New Roman" w:cs="Times New Roman" w:eastAsia="Times New Roman" w:hAnsi="Times New Roman"/>
-        </w:rPr>
-        <w:t xml:space="preserve"> for a script </w:t>
+        <w:t xml:space="preserve">-t</w:t>
+      </w:r>
+      <w:r>
+        <w:rPr>
+          <w:rFonts w:ascii="Times New Roman" w:cs="Times New Roman" w:eastAsia="Times New Roman" w:hAnsi="Times New Roman"/>
+        </w:rPr>
+        <w:t xml:space="preserve"> tests and </w:t>
       </w:r>
       <w:r>
         <w:rPr>
@@ -18890,13 +18905,13 @@
           <w:sz w:val="19"/>
           <w:szCs w:val="19"/>
         </w:rPr>
-        <w:t xml:space="preserve">LOAD SQL</w:t>
-      </w:r>
-      <w:r>
-        <w:rPr>
-          <w:rFonts w:ascii="Times New Roman" w:cs="Times New Roman" w:eastAsia="Times New Roman" w:hAnsi="Times New Roman"/>
-        </w:rPr>
-        <w:t xml:space="preserve">. A database is one binary CMS file; its rollback journal is </w:t>
+        <w:t xml:space="preserve">-o</w:t>
+      </w:r>
+      <w:r>
+        <w:rPr>
+          <w:rFonts w:ascii="Times New Roman" w:cs="Times New Roman" w:eastAsia="Times New Roman" w:hAnsi="Times New Roman"/>
+        </w:rPr>
+        <w:t xml:space="preserve"> overwrites. A file extracts to its </w:t>
       </w:r>
       <w:r>
         <w:rPr>
@@ -18904,32 +18919,13 @@
           <w:sz w:val="19"/>
           <w:szCs w:val="19"/>
         </w:rPr>
-        <w:t xml:space="preserve">fn DB-JOURN</w:t>
-      </w:r>
-      <w:r>
-        <w:rPr>
-          <w:rFonts w:ascii="Times New Roman" w:cs="Times New Roman" w:eastAsia="Times New Roman" w:hAnsi="Times New Roman"/>
-        </w:rPr>
-        <w:t xml:space="preserve"> while a transaction is open. One user at a time: there is no locking between virtual machines, so give each database to one user, or to the SQLSERV service machine.</w:t>
-      </w:r>
-    </w:p>
-    <w:p>
-      <w:pPr>
-        <w:spacing w:after="120"/>
-      </w:pPr>
-      <w:r>
-        <w:rPr>
-          <w:rFonts w:ascii="Times New Roman" w:cs="Times New Roman" w:eastAsia="Times New Roman" w:hAnsi="Times New Roman"/>
-          <w:b/>
-          <w:bCs/>
-        </w:rPr>
-        <w:t xml:space="preserve">SQLSERV.</w:t>
-      </w:r>
-      <w:r>
-        <w:rPr>
-          <w:rFonts w:ascii="Times New Roman" w:cs="Times New Roman" w:eastAsia="Times New Roman" w:hAnsi="Times New Roman"/>
-        </w:rPr>
-        <w:t xml:space="preserve"> A service machine that owns the databases and runs requests for other users one at a time. </w:t>
+        <w:t xml:space="preserve">fn.ft</w:t>
+      </w:r>
+      <w:r>
+        <w:rPr>
+          <w:rFonts w:ascii="Times New Roman" w:cs="Times New Roman" w:eastAsia="Times New Roman" w:hAnsi="Times New Roman"/>
+        </w:rPr>
+        <w:t xml:space="preserve"> name, as text unless its file type is a binary one (ZIP, GZ, TAR, DB, O, ...). </w:t>
       </w:r>
       <w:r>
         <w:rPr>
@@ -18937,13 +18933,13 @@
           <w:sz w:val="19"/>
           <w:szCs w:val="19"/>
         </w:rPr>
-        <w:t xml:space="preserve">SQLSERV</w:t>
-      </w:r>
-      <w:r>
-        <w:rPr>
-          <w:rFonts w:ascii="Times New Roman" w:cs="Times New Roman" w:eastAsia="Times New Roman" w:hAnsi="Times New Roman"/>
-        </w:rPr>
-        <w:t xml:space="preserve"> waits for reader files (</w:t>
+        <w:t xml:space="preserve">GZIP fn.ft</w:t>
+      </w:r>
+      <w:r>
+        <w:rPr>
+          <w:rFonts w:ascii="Times New Roman" w:cs="Times New Roman" w:eastAsia="Times New Roman" w:hAnsi="Times New Roman"/>
+        </w:rPr>
+        <w:t xml:space="preserve"> writes </w:t>
       </w:r>
       <w:r>
         <w:rPr>
@@ -18951,13 +18947,13 @@
           <w:sz w:val="19"/>
           <w:szCs w:val="19"/>
         </w:rPr>
-        <w:t xml:space="preserve">WAKEUP</w:t>
-      </w:r>
-      <w:r>
-        <w:rPr>
-          <w:rFonts w:ascii="Times New Roman" w:cs="Times New Roman" w:eastAsia="Times New Roman" w:hAnsi="Times New Roman"/>
-        </w:rPr>
-        <w:t xml:space="preserve">); each request is punched to it, run by </w:t>
+        <w:t xml:space="preserve">fn ft-GZ</w:t>
+      </w:r>
+      <w:r>
+        <w:rPr>
+          <w:rFonts w:ascii="Times New Roman" w:cs="Times New Roman" w:eastAsia="Times New Roman" w:hAnsi="Times New Roman"/>
+        </w:rPr>
+        <w:t xml:space="preserve"> in gzip format, and </w:t>
       </w:r>
       <w:r>
         <w:rPr>
@@ -18965,153 +18961,13 @@
           <w:sz w:val="19"/>
           <w:szCs w:val="19"/>
         </w:rPr>
-        <w:t xml:space="preserve">SQLRUN</w:t>
-      </w:r>
-      <w:r>
-        <w:rPr>
-          <w:rFonts w:ascii="Times New Roman" w:cs="Times New Roman" w:eastAsia="Times New Roman" w:hAnsi="Times New Roman"/>
-        </w:rPr>
-        <w:t xml:space="preserve"> against </w:t>
-      </w:r>
-      <w:r>
-        <w:rPr>
-          <w:rFonts w:ascii="Courier New" w:cs="Courier New" w:eastAsia="Courier New" w:hAnsi="Courier New"/>
-          <w:sz w:val="19"/>
-          <w:szCs w:val="19"/>
-        </w:rPr>
-        <w:t xml:space="preserve">name DB</w:t>
-      </w:r>
-      <w:r>
-        <w:rPr>
-          <w:rFonts w:ascii="Times New Roman" w:cs="Times New Roman" w:eastAsia="Times New Roman" w:hAnsi="Times New Roman"/>
-        </w:rPr>
-        <w:t xml:space="preserve">, and the answer is punched back to the sender (its ORIGINID). From any user: </w:t>
-      </w:r>
-      <w:r>
-        <w:rPr>
-          <w:rFonts w:ascii="Courier New" w:cs="Courier New" w:eastAsia="Courier New" w:hAnsi="Courier New"/>
-          <w:sz w:val="19"/>
-          <w:szCs w:val="19"/>
-        </w:rPr>
-        <w:t xml:space="preserve">SQL name</w:t>
-      </w:r>
-      <w:r>
-        <w:rPr>
-          <w:rFonts w:ascii="Times New Roman" w:cs="Times New Roman" w:eastAsia="Times New Roman" w:hAnsi="Times New Roman"/>
-        </w:rPr>
-        <w:t xml:space="preserve"> </w:t>
-      </w:r>
-      <w:r>
-        <w:rPr>
-          <w:rFonts w:ascii="Times New Roman" w:cs="Times New Roman" w:eastAsia="Times New Roman" w:hAnsi="Times New Roman"/>
-          <w:i/>
-          <w:iCs/>
-        </w:rPr>
-        <w:t xml:space="preserve">statement</w:t>
-      </w:r>
-      <w:r>
-        <w:rPr>
-          <w:rFonts w:ascii="Times New Roman" w:cs="Times New Roman" w:eastAsia="Times New Roman" w:hAnsi="Times New Roman"/>
-        </w:rPr>
-        <w:t xml:space="preserve"> runs one statement, </w:t>
-      </w:r>
-      <w:r>
-        <w:rPr>
-          <w:rFonts w:ascii="Courier New" w:cs="Courier New" w:eastAsia="Courier New" w:hAnsi="Courier New"/>
-          <w:sz w:val="19"/>
-          <w:szCs w:val="19"/>
-        </w:rPr>
-        <w:t xml:space="preserve">SQL name (FILE fn ft fm</w:t>
-      </w:r>
-      <w:r>
-        <w:rPr>
-          <w:rFonts w:ascii="Times New Roman" w:cs="Times New Roman" w:eastAsia="Times New Roman" w:hAnsi="Times New Roman"/>
-        </w:rPr>
-        <w:t xml:space="preserve"> a script, and </w:t>
-      </w:r>
-      <w:r>
-        <w:rPr>
-          <w:rFonts w:ascii="Courier New" w:cs="Courier New" w:eastAsia="Courier New" w:hAnsi="Courier New"/>
-          <w:sz w:val="19"/>
-          <w:szCs w:val="19"/>
-        </w:rPr>
-        <w:t xml:space="preserve">SQL STOP</w:t>
-      </w:r>
-      <w:r>
-        <w:rPr>
-          <w:rFonts w:ascii="Times New Roman" w:cs="Times New Roman" w:eastAsia="Times New Roman" w:hAnsi="Times New Roman"/>
-        </w:rPr>
-        <w:t xml:space="preserve"> ends the server; </w:t>
-      </w:r>
-      <w:r>
-        <w:rPr>
-          <w:rFonts w:ascii="Courier New" w:cs="Courier New" w:eastAsia="Courier New" w:hAnsi="Courier New"/>
-          <w:sz w:val="19"/>
-          <w:szCs w:val="19"/>
-        </w:rPr>
-        <w:t xml:space="preserve">(SERVER userid</w:t>
-      </w:r>
-      <w:r>
-        <w:rPr>
-          <w:rFonts w:ascii="Times New Roman" w:cs="Times New Roman" w:eastAsia="Times New Roman" w:hAnsi="Times New Roman"/>
-        </w:rPr>
-        <w:t xml:space="preserve"> names another server than SQLSERV. Results are rows with columns joined by </w:t>
-      </w:r>
-      <w:r>
-        <w:rPr>
-          <w:rFonts w:ascii="Courier New" w:cs="Courier New" w:eastAsia="Courier New" w:hAnsi="Courier New"/>
-          <w:sz w:val="19"/>
-          <w:szCs w:val="19"/>
-        </w:rPr>
-        <w:t xml:space="preserve">|</w:t>
-      </w:r>
-      <w:r>
-        <w:rPr>
-          <w:rFonts w:ascii="Times New Roman" w:cs="Times New Roman" w:eastAsia="Times New Roman" w:hAnsi="Times New Roman"/>
-        </w:rPr>
-        <w:t xml:space="preserve">, then </w:t>
-      </w:r>
-      <w:r>
-        <w:rPr>
-          <w:rFonts w:ascii="Courier New" w:cs="Courier New" w:eastAsia="Courier New" w:hAnsi="Courier New"/>
-          <w:sz w:val="19"/>
-          <w:szCs w:val="19"/>
-        </w:rPr>
-        <w:t xml:space="preserve">SQLRUN: n statements, n errors</w:t>
-      </w:r>
-      <w:r>
-        <w:rPr>
-          <w:rFonts w:ascii="Times New Roman" w:cs="Times New Roman" w:eastAsia="Times New Roman" w:hAnsi="Times New Roman"/>
-        </w:rPr>
-        <w:t xml:space="preserve">. At the server console, </w:t>
-      </w:r>
-      <w:r>
-        <w:rPr>
-          <w:rFonts w:ascii="Courier New" w:cs="Courier New" w:eastAsia="Courier New" w:hAnsi="Courier New"/>
-          <w:sz w:val="19"/>
-          <w:szCs w:val="19"/>
-        </w:rPr>
-        <w:t xml:space="preserve">STOP</w:t>
-      </w:r>
-      <w:r>
-        <w:rPr>
-          <w:rFonts w:ascii="Times New Roman" w:cs="Times New Roman" w:eastAsia="Times New Roman" w:hAnsi="Times New Roman"/>
-        </w:rPr>
-        <w:t xml:space="preserve"> ends it; </w:t>
-      </w:r>
-      <w:r>
-        <w:rPr>
-          <w:rFonts w:ascii="Courier New" w:cs="Courier New" w:eastAsia="Courier New" w:hAnsi="Courier New"/>
-          <w:sz w:val="19"/>
-          <w:szCs w:val="19"/>
-        </w:rPr>
-        <w:t xml:space="preserve">SQLSERV (LOUD</w:t>
-      </w:r>
-      <w:r>
-        <w:rPr>
-          <w:rFonts w:ascii="Times New Roman" w:cs="Times New Roman" w:eastAsia="Times New Roman" w:hAnsi="Times New Roman"/>
-        </w:rPr>
-        <w:t xml:space="preserve"> logs each request.</w:t>
+        <w:t xml:space="preserve">GZIP -d fn.ft-gz</w:t>
+      </w:r>
+      <w:r>
+        <w:rPr>
+          <w:rFonts w:ascii="Times New Roman" w:cs="Times New Roman" w:eastAsia="Times New Roman" w:hAnsi="Times New Roman"/>
+        </w:rPr>
+        <w:t xml:space="preserve"> restores the file. Encryption is not included. CE’s MINIZIP and MINIUNZ remain on the Y disk.</w:t>
       </w:r>
     </w:p>
     <w:tbl>
@@ -19154,7 +19010,7 @@
                 <w:sz w:val="17"/>
                 <w:szCs w:val="17"/>
               </w:rPr>
-              <w:t xml:space="preserve">sql emp select count(*) n, sum(salary) total from emp</w:t>
+              <w:t xml:space="preserve">zip notes.zip report.txt data.csv</w:t>
             </w:r>
           </w:p>
           <w:p>
@@ -19167,7 +19023,7 @@
                 <w:sz w:val="17"/>
                 <w:szCs w:val="17"/>
               </w:rPr>
-              <w:t xml:space="preserve">n|total</w:t>
+              <w:t xml:space="preserve">  adding: report.txt (deflated 61%)</w:t>
             </w:r>
           </w:p>
           <w:p>
@@ -19180,7 +19036,7 @@
                 <w:sz w:val="17"/>
                 <w:szCs w:val="17"/>
               </w:rPr>
-              <w:t xml:space="preserve">3|25100.0</w:t>
+              <w:t xml:space="preserve">  adding: data.csv (deflated 48%)</w:t>
             </w:r>
           </w:p>
           <w:p>
@@ -19193,7 +19049,7 @@
                 <w:sz w:val="17"/>
                 <w:szCs w:val="17"/>
               </w:rPr>
-              <w:t xml:space="preserve">SQLRUN: 1 statements, 0 errors</w:t>
+              <w:t xml:space="preserve">Ready;</w:t>
             </w:r>
           </w:p>
           <w:p>
@@ -19206,7 +19062,33 @@
                 <w:sz w:val="17"/>
                 <w:szCs w:val="17"/>
               </w:rPr>
-              <w:t xml:space="preserve">Ready;</w:t>
+              <w:t xml:space="preserve">unzip -l notes.zip</w:t>
+            </w:r>
+          </w:p>
+          <w:p>
+            <w:pPr>
+              <w:spacing w:after="0" w:line="228"/>
+            </w:pPr>
+            <w:r>
+              <w:rPr>
+                <w:rFonts w:ascii="Courier New" w:cs="Courier New" w:eastAsia="Courier New" w:hAnsi="Courier New"/>
+                <w:sz w:val="17"/>
+                <w:szCs w:val="17"/>
+              </w:rPr>
+              <w:t xml:space="preserve">Archive:  notes.zip</w:t>
+            </w:r>
+          </w:p>
+          <w:p>
+            <w:pPr>
+              <w:spacing w:after="0" w:line="228"/>
+            </w:pPr>
+            <w:r>
+              <w:rPr>
+                <w:rFonts w:ascii="Courier New" w:cs="Courier New" w:eastAsia="Courier New" w:hAnsi="Courier New"/>
+                <w:sz w:val="17"/>
+                <w:szCs w:val="17"/>
+              </w:rPr>
+              <w:t xml:space="preserve">...</w:t>
             </w:r>
           </w:p>
         </w:tc>
@@ -19232,7 +19114,319 @@
           <w:sz w:val="18"/>
           <w:szCs w:val="18"/>
         </w:rPr>
-        <w:t xml:space="preserve">A request to SQLSERV</w:t>
+        <w:t xml:space="preserve">ZIP on CMS</w:t>
+      </w:r>
+    </w:p>
+    <w:p>
+      <w:pPr>
+        <w:pStyle w:val="Heading2"/>
+      </w:pPr>
+      <w:r>
+        <w:t xml:space="preserve">SQLite</w:t>
+      </w:r>
+    </w:p>
+    <w:p>
+      <w:pPr>
+        <w:spacing w:after="120"/>
+      </w:pPr>
+      <w:r>
+        <w:rPr>
+          <w:rFonts w:ascii="Courier New" w:cs="Courier New" w:eastAsia="Courier New" w:hAnsi="Courier New"/>
+          <w:sz w:val="19"/>
+          <w:szCs w:val="19"/>
+        </w:rPr>
+        <w:t xml:space="preserve">SQLITE fn.db</w:t>
+      </w:r>
+      <w:r>
+        <w:rPr>
+          <w:rFonts w:ascii="Times New Roman" w:cs="Times New Roman" w:eastAsia="Times New Roman" w:hAnsi="Times New Roman"/>
+        </w:rPr>
+        <w:t xml:space="preserve"> starts the sqlite3 shell (SQLite 3.46) on the database </w:t>
+      </w:r>
+      <w:r>
+        <w:rPr>
+          <w:rFonts w:ascii="Courier New" w:cs="Courier New" w:eastAsia="Courier New" w:hAnsi="Courier New"/>
+          <w:sz w:val="19"/>
+          <w:szCs w:val="19"/>
+        </w:rPr>
+        <w:t xml:space="preserve">fn DB</w:t>
+      </w:r>
+      <w:r>
+        <w:rPr>
+          <w:rFonts w:ascii="Times New Roman" w:cs="Times New Roman" w:eastAsia="Times New Roman" w:hAnsi="Times New Roman"/>
+        </w:rPr>
+        <w:t xml:space="preserve">; </w:t>
+      </w:r>
+      <w:r>
+        <w:rPr>
+          <w:rFonts w:ascii="Courier New" w:cs="Courier New" w:eastAsia="Courier New" w:hAnsi="Courier New"/>
+          <w:sz w:val="19"/>
+          <w:szCs w:val="19"/>
+        </w:rPr>
+        <w:t xml:space="preserve">SQLITE fn.db</w:t>
+      </w:r>
+      <w:r>
+        <w:rPr>
+          <w:rFonts w:ascii="Times New Roman" w:cs="Times New Roman" w:eastAsia="Times New Roman" w:hAnsi="Times New Roman"/>
+        </w:rPr>
+        <w:t xml:space="preserve"> </w:t>
+      </w:r>
+      <w:r>
+        <w:rPr>
+          <w:rFonts w:ascii="Times New Roman" w:cs="Times New Roman" w:eastAsia="Times New Roman" w:hAnsi="Times New Roman"/>
+          <w:i/>
+          <w:iCs/>
+        </w:rPr>
+        <w:t xml:space="preserve">statement</w:t>
+      </w:r>
+      <w:r>
+        <w:rPr>
+          <w:rFonts w:ascii="Times New Roman" w:cs="Times New Roman" w:eastAsia="Times New Roman" w:hAnsi="Times New Roman"/>
+        </w:rPr>
+        <w:t xml:space="preserve"> runs one statement or dot command, for example </w:t>
+      </w:r>
+      <w:r>
+        <w:rPr>
+          <w:rFonts w:ascii="Courier New" w:cs="Courier New" w:eastAsia="Courier New" w:hAnsi="Courier New"/>
+          <w:sz w:val="19"/>
+          <w:szCs w:val="19"/>
+        </w:rPr>
+        <w:t xml:space="preserve">SQLITE emp.db .read load.sql</w:t>
+      </w:r>
+      <w:r>
+        <w:rPr>
+          <w:rFonts w:ascii="Times New Roman" w:cs="Times New Roman" w:eastAsia="Times New Roman" w:hAnsi="Times New Roman"/>
+        </w:rPr>
+        <w:t xml:space="preserve"> for a script </w:t>
+      </w:r>
+      <w:r>
+        <w:rPr>
+          <w:rFonts w:ascii="Courier New" w:cs="Courier New" w:eastAsia="Courier New" w:hAnsi="Courier New"/>
+          <w:sz w:val="19"/>
+          <w:szCs w:val="19"/>
+        </w:rPr>
+        <w:t xml:space="preserve">LOAD SQL</w:t>
+      </w:r>
+      <w:r>
+        <w:rPr>
+          <w:rFonts w:ascii="Times New Roman" w:cs="Times New Roman" w:eastAsia="Times New Roman" w:hAnsi="Times New Roman"/>
+        </w:rPr>
+        <w:t xml:space="preserve">. A database is one binary CMS file; its rollback journal is </w:t>
+      </w:r>
+      <w:r>
+        <w:rPr>
+          <w:rFonts w:ascii="Courier New" w:cs="Courier New" w:eastAsia="Courier New" w:hAnsi="Courier New"/>
+          <w:sz w:val="19"/>
+          <w:szCs w:val="19"/>
+        </w:rPr>
+        <w:t xml:space="preserve">fn DB-JOURN</w:t>
+      </w:r>
+      <w:r>
+        <w:rPr>
+          <w:rFonts w:ascii="Times New Roman" w:cs="Times New Roman" w:eastAsia="Times New Roman" w:hAnsi="Times New Roman"/>
+        </w:rPr>
+        <w:t xml:space="preserve"> while a transaction is open. One user at a time: there is no locking between virtual machines, so give each database to one user, or to the SQLSERV service machine.</w:t>
+      </w:r>
+    </w:p>
+    <w:p>
+      <w:pPr>
+        <w:spacing w:after="120"/>
+      </w:pPr>
+      <w:r>
+        <w:rPr>
+          <w:rFonts w:ascii="Times New Roman" w:cs="Times New Roman" w:eastAsia="Times New Roman" w:hAnsi="Times New Roman"/>
+          <w:b/>
+          <w:bCs/>
+        </w:rPr>
+        <w:t xml:space="preserve">SQLSERV.</w:t>
+      </w:r>
+      <w:r>
+        <w:rPr>
+          <w:rFonts w:ascii="Times New Roman" w:cs="Times New Roman" w:eastAsia="Times New Roman" w:hAnsi="Times New Roman"/>
+        </w:rPr>
+        <w:t xml:space="preserve"> A service machine that owns the databases and runs requests for other users one at a time. </w:t>
+      </w:r>
+      <w:r>
+        <w:rPr>
+          <w:rFonts w:ascii="Courier New" w:cs="Courier New" w:eastAsia="Courier New" w:hAnsi="Courier New"/>
+          <w:sz w:val="19"/>
+          <w:szCs w:val="19"/>
+        </w:rPr>
+        <w:t xml:space="preserve">SQLSERV</w:t>
+      </w:r>
+      <w:r>
+        <w:rPr>
+          <w:rFonts w:ascii="Times New Roman" w:cs="Times New Roman" w:eastAsia="Times New Roman" w:hAnsi="Times New Roman"/>
+        </w:rPr>
+        <w:t xml:space="preserve"> waits for reader files (</w:t>
+      </w:r>
+      <w:r>
+        <w:rPr>
+          <w:rFonts w:ascii="Courier New" w:cs="Courier New" w:eastAsia="Courier New" w:hAnsi="Courier New"/>
+          <w:sz w:val="19"/>
+          <w:szCs w:val="19"/>
+        </w:rPr>
+        <w:t xml:space="preserve">WAKEUP</w:t>
+      </w:r>
+      <w:r>
+        <w:rPr>
+          <w:rFonts w:ascii="Times New Roman" w:cs="Times New Roman" w:eastAsia="Times New Roman" w:hAnsi="Times New Roman"/>
+        </w:rPr>
+        <w:t xml:space="preserve">); each request is punched to it, run by </w:t>
+      </w:r>
+      <w:r>
+        <w:rPr>
+          <w:rFonts w:ascii="Courier New" w:cs="Courier New" w:eastAsia="Courier New" w:hAnsi="Courier New"/>
+          <w:sz w:val="19"/>
+          <w:szCs w:val="19"/>
+        </w:rPr>
+        <w:t xml:space="preserve">SQLRUN</w:t>
+      </w:r>
+      <w:r>
+        <w:rPr>
+          <w:rFonts w:ascii="Times New Roman" w:cs="Times New Roman" w:eastAsia="Times New Roman" w:hAnsi="Times New Roman"/>
+        </w:rPr>
+        <w:t xml:space="preserve"> against </w:t>
+      </w:r>
+      <w:r>
+        <w:rPr>
+          <w:rFonts w:ascii="Courier New" w:cs="Courier New" w:eastAsia="Courier New" w:hAnsi="Courier New"/>
+          <w:sz w:val="19"/>
+          <w:szCs w:val="19"/>
+        </w:rPr>
+        <w:t xml:space="preserve">name DB</w:t>
+      </w:r>
+      <w:r>
+        <w:rPr>
+          <w:rFonts w:ascii="Times New Roman" w:cs="Times New Roman" w:eastAsia="Times New Roman" w:hAnsi="Times New Roman"/>
+        </w:rPr>
+        <w:t xml:space="preserve">, and the answer is punched back to the sender (its ORIGINID). From any user: </w:t>
+      </w:r>
+      <w:r>
+        <w:rPr>
+          <w:rFonts w:ascii="Courier New" w:cs="Courier New" w:eastAsia="Courier New" w:hAnsi="Courier New"/>
+          <w:sz w:val="19"/>
+          <w:szCs w:val="19"/>
+        </w:rPr>
+        <w:t xml:space="preserve">SQL name</w:t>
+      </w:r>
+      <w:r>
+        <w:rPr>
+          <w:rFonts w:ascii="Times New Roman" w:cs="Times New Roman" w:eastAsia="Times New Roman" w:hAnsi="Times New Roman"/>
+        </w:rPr>
+        <w:t xml:space="preserve"> </w:t>
+      </w:r>
+      <w:r>
+        <w:rPr>
+          <w:rFonts w:ascii="Times New Roman" w:cs="Times New Roman" w:eastAsia="Times New Roman" w:hAnsi="Times New Roman"/>
+          <w:i/>
+          <w:iCs/>
+        </w:rPr>
+        <w:t xml:space="preserve">statement</w:t>
+      </w:r>
+      <w:r>
+        <w:rPr>
+          <w:rFonts w:ascii="Times New Roman" w:cs="Times New Roman" w:eastAsia="Times New Roman" w:hAnsi="Times New Roman"/>
+        </w:rPr>
+        <w:t xml:space="preserve"> runs one statement, </w:t>
+      </w:r>
+      <w:r>
+        <w:rPr>
+          <w:rFonts w:ascii="Courier New" w:cs="Courier New" w:eastAsia="Courier New" w:hAnsi="Courier New"/>
+          <w:sz w:val="19"/>
+          <w:szCs w:val="19"/>
+        </w:rPr>
+        <w:t xml:space="preserve">SQL name (FILE fn ft fm</w:t>
+      </w:r>
+      <w:r>
+        <w:rPr>
+          <w:rFonts w:ascii="Times New Roman" w:cs="Times New Roman" w:eastAsia="Times New Roman" w:hAnsi="Times New Roman"/>
+        </w:rPr>
+        <w:t xml:space="preserve"> a script, and </w:t>
+      </w:r>
+      <w:r>
+        <w:rPr>
+          <w:rFonts w:ascii="Courier New" w:cs="Courier New" w:eastAsia="Courier New" w:hAnsi="Courier New"/>
+          <w:sz w:val="19"/>
+          <w:szCs w:val="19"/>
+        </w:rPr>
+        <w:t xml:space="preserve">SQL STOP</w:t>
+      </w:r>
+      <w:r>
+        <w:rPr>
+          <w:rFonts w:ascii="Times New Roman" w:cs="Times New Roman" w:eastAsia="Times New Roman" w:hAnsi="Times New Roman"/>
+        </w:rPr>
+        <w:t xml:space="preserve"> ends the server; </w:t>
+      </w:r>
+      <w:r>
+        <w:rPr>
+          <w:rFonts w:ascii="Courier New" w:cs="Courier New" w:eastAsia="Courier New" w:hAnsi="Courier New"/>
+          <w:sz w:val="19"/>
+          <w:szCs w:val="19"/>
+        </w:rPr>
+        <w:t xml:space="preserve">(SERVER userid</w:t>
+      </w:r>
+      <w:r>
+        <w:rPr>
+          <w:rFonts w:ascii="Times New Roman" w:cs="Times New Roman" w:eastAsia="Times New Roman" w:hAnsi="Times New Roman"/>
+        </w:rPr>
+        <w:t xml:space="preserve"> names another server than SQLSERV. Results are rows with columns joined by </w:t>
+      </w:r>
+      <w:r>
+        <w:rPr>
+          <w:rFonts w:ascii="Courier New" w:cs="Courier New" w:eastAsia="Courier New" w:hAnsi="Courier New"/>
+          <w:sz w:val="19"/>
+          <w:szCs w:val="19"/>
+        </w:rPr>
+        <w:t xml:space="preserve">|</w:t>
+      </w:r>
+      <w:r>
+        <w:rPr>
+          <w:rFonts w:ascii="Times New Roman" w:cs="Times New Roman" w:eastAsia="Times New Roman" w:hAnsi="Times New Roman"/>
+        </w:rPr>
+        <w:t xml:space="preserve">, then </w:t>
+      </w:r>
+      <w:r>
+        <w:rPr>
+          <w:rFonts w:ascii="Courier New" w:cs="Courier New" w:eastAsia="Courier New" w:hAnsi="Courier New"/>
+          <w:sz w:val="19"/>
+          <w:szCs w:val="19"/>
+        </w:rPr>
+        <w:t xml:space="preserve">SQLRUN: n statements, n errors</w:t>
+      </w:r>
+      <w:r>
+        <w:rPr>
+          <w:rFonts w:ascii="Times New Roman" w:cs="Times New Roman" w:eastAsia="Times New Roman" w:hAnsi="Times New Roman"/>
+        </w:rPr>
+        <w:t xml:space="preserve">. At the server console, </w:t>
+      </w:r>
+      <w:r>
+        <w:rPr>
+          <w:rFonts w:ascii="Courier New" w:cs="Courier New" w:eastAsia="Courier New" w:hAnsi="Courier New"/>
+          <w:sz w:val="19"/>
+          <w:szCs w:val="19"/>
+        </w:rPr>
+        <w:t xml:space="preserve">STOP</w:t>
+      </w:r>
+      <w:r>
+        <w:rPr>
+          <w:rFonts w:ascii="Times New Roman" w:cs="Times New Roman" w:eastAsia="Times New Roman" w:hAnsi="Times New Roman"/>
+        </w:rPr>
+        <w:t xml:space="preserve"> ends it; </w:t>
+      </w:r>
+      <w:r>
+        <w:rPr>
+          <w:rFonts w:ascii="Courier New" w:cs="Courier New" w:eastAsia="Courier New" w:hAnsi="Courier New"/>
+          <w:sz w:val="19"/>
+          <w:szCs w:val="19"/>
+        </w:rPr>
+        <w:t xml:space="preserve">SQLSERV (LOUD</w:t>
+      </w:r>
+      <w:r>
+        <w:rPr>
+          <w:rFonts w:ascii="Times New Roman" w:cs="Times New Roman" w:eastAsia="Times New Roman" w:hAnsi="Times New Roman"/>
+        </w:rPr>
+        <w:t xml:space="preserve"> logs each request.</w:t>
       </w:r>
     </w:p>
     <w:tbl>
@@ -19275,7 +19469,7 @@
                 <w:sz w:val="17"/>
                 <w:szCs w:val="17"/>
               </w:rPr>
-              <w:t xml:space="preserve">sqlite emp.db .read sqltest.sql</w:t>
+              <w:t xml:space="preserve">sql emp select count(*) n, sum(salary) total from emp</w:t>
             </w:r>
           </w:p>
           <w:p>
@@ -19288,7 +19482,7 @@
                 <w:sz w:val="17"/>
                 <w:szCs w:val="17"/>
               </w:rPr>
-              <w:t xml:space="preserve">dept   n  avg_sal  top</w:t>
+              <w:t xml:space="preserve">n|total</w:t>
             </w:r>
           </w:p>
           <w:p>
@@ -19301,7 +19495,7 @@
                 <w:sz w:val="17"/>
                 <w:szCs w:val="17"/>
               </w:rPr>
-              <w:t xml:space="preserve">-----  -  -------  ------</w:t>
+              <w:t xml:space="preserve">3|25100.0</w:t>
             </w:r>
           </w:p>
           <w:p>
@@ -19314,20 +19508,7 @@
                 <w:sz w:val="17"/>
                 <w:szCs w:val="17"/>
               </w:rPr>
-              <w:t xml:space="preserve">Ops    2  7000.13  7100.0</w:t>
-            </w:r>
-          </w:p>
-          <w:p>
-            <w:pPr>
-              <w:spacing w:after="0" w:line="228"/>
-            </w:pPr>
-            <w:r>
-              <w:rPr>
-                <w:rFonts w:ascii="Courier New" w:cs="Courier New" w:eastAsia="Courier New" w:hAnsi="Courier New"/>
-                <w:sz w:val="17"/>
-                <w:szCs w:val="17"/>
-              </w:rPr>
-              <w:t xml:space="preserve">R&amp;D    2  9000.25  9200.5</w:t>
+              <w:t xml:space="preserve">SQLRUN: 1 statements, 0 errors</w:t>
             </w:r>
           </w:p>
           <w:p>
@@ -19359,6 +19540,140 @@
           <w:szCs w:val="18"/>
         </w:rPr>
         <w:t xml:space="preserve">Figure 35. </w:t>
+      </w:r>
+      <w:r>
+        <w:rPr>
+          <w:rFonts w:ascii="Arial" w:cs="Arial" w:eastAsia="Arial" w:hAnsi="Arial"/>
+          <w:sz w:val="18"/>
+          <w:szCs w:val="18"/>
+        </w:rPr>
+        <w:t xml:space="preserve">A request to SQLSERV</w:t>
+      </w:r>
+    </w:p>
+    <w:tbl>
+      <w:tblPr>
+        <w:tblW w:type="dxa" w:w="9638"/>
+        <w:tblBorders>
+          <w:top w:val="single" w:color="auto" w:sz="4"/>
+          <w:left w:val="single" w:color="auto" w:sz="4"/>
+          <w:bottom w:val="single" w:color="auto" w:sz="4"/>
+          <w:right w:val="single" w:color="auto" w:sz="4"/>
+          <w:insideH w:val="single" w:color="auto" w:sz="4"/>
+          <w:insideV w:val="single" w:color="auto" w:sz="4"/>
+        </w:tblBorders>
+      </w:tblPr>
+      <w:tblGrid>
+        <w:gridCol w:w="9638"/>
+      </w:tblGrid>
+      <w:tr>
+        <w:trPr>
+          <w:cantSplit/>
+        </w:trPr>
+        <w:tc>
+          <w:tcPr>
+            <w:tcW w:type="dxa" w:w="9638"/>
+            <w:shd w:fill="F2F2F2" w:color="auto" w:val="clear"/>
+            <w:tcMar>
+              <w:top w:type="dxa" w:w="100"/>
+              <w:left w:type="dxa" w:w="140"/>
+              <w:bottom w:type="dxa" w:w="100"/>
+              <w:right w:type="dxa" w:w="140"/>
+            </w:tcMar>
+          </w:tcPr>
+          <w:p>
+            <w:pPr>
+              <w:spacing w:after="0" w:line="228"/>
+            </w:pPr>
+            <w:r>
+              <w:rPr>
+                <w:rFonts w:ascii="Courier New" w:cs="Courier New" w:eastAsia="Courier New" w:hAnsi="Courier New"/>
+                <w:sz w:val="17"/>
+                <w:szCs w:val="17"/>
+              </w:rPr>
+              <w:t xml:space="preserve">sqlite emp.db .read sqltest.sql</w:t>
+            </w:r>
+          </w:p>
+          <w:p>
+            <w:pPr>
+              <w:spacing w:after="0" w:line="228"/>
+            </w:pPr>
+            <w:r>
+              <w:rPr>
+                <w:rFonts w:ascii="Courier New" w:cs="Courier New" w:eastAsia="Courier New" w:hAnsi="Courier New"/>
+                <w:sz w:val="17"/>
+                <w:szCs w:val="17"/>
+              </w:rPr>
+              <w:t xml:space="preserve">dept   n  avg_sal  top</w:t>
+            </w:r>
+          </w:p>
+          <w:p>
+            <w:pPr>
+              <w:spacing w:after="0" w:line="228"/>
+            </w:pPr>
+            <w:r>
+              <w:rPr>
+                <w:rFonts w:ascii="Courier New" w:cs="Courier New" w:eastAsia="Courier New" w:hAnsi="Courier New"/>
+                <w:sz w:val="17"/>
+                <w:szCs w:val="17"/>
+              </w:rPr>
+              <w:t xml:space="preserve">-----  -  -------  ------</w:t>
+            </w:r>
+          </w:p>
+          <w:p>
+            <w:pPr>
+              <w:spacing w:after="0" w:line="228"/>
+            </w:pPr>
+            <w:r>
+              <w:rPr>
+                <w:rFonts w:ascii="Courier New" w:cs="Courier New" w:eastAsia="Courier New" w:hAnsi="Courier New"/>
+                <w:sz w:val="17"/>
+                <w:szCs w:val="17"/>
+              </w:rPr>
+              <w:t xml:space="preserve">Ops    2  7000.13  7100.0</w:t>
+            </w:r>
+          </w:p>
+          <w:p>
+            <w:pPr>
+              <w:spacing w:after="0" w:line="228"/>
+            </w:pPr>
+            <w:r>
+              <w:rPr>
+                <w:rFonts w:ascii="Courier New" w:cs="Courier New" w:eastAsia="Courier New" w:hAnsi="Courier New"/>
+                <w:sz w:val="17"/>
+                <w:szCs w:val="17"/>
+              </w:rPr>
+              <w:t xml:space="preserve">R&amp;D    2  9000.25  9200.5</w:t>
+            </w:r>
+          </w:p>
+          <w:p>
+            <w:pPr>
+              <w:spacing w:after="0" w:line="228"/>
+            </w:pPr>
+            <w:r>
+              <w:rPr>
+                <w:rFonts w:ascii="Courier New" w:cs="Courier New" w:eastAsia="Courier New" w:hAnsi="Courier New"/>
+                <w:sz w:val="17"/>
+                <w:szCs w:val="17"/>
+              </w:rPr>
+              <w:t xml:space="preserve">Ready;</w:t>
+            </w:r>
+          </w:p>
+        </w:tc>
+      </w:tr>
+    </w:tbl>
+    <w:p>
+      <w:pPr>
+        <w:spacing w:after="200" w:before="80"/>
+      </w:pPr>
+      <w:r>
+        <w:rPr>
+          <w:rFonts w:ascii="Arial" w:cs="Arial" w:eastAsia="Arial" w:hAnsi="Arial"/>
+          <w:b/>
+          <w:bCs/>
+          <w:sz w:val="18"/>
+          <w:szCs w:val="18"/>
+        </w:rPr>
+        <w:t xml:space="preserve">Figure 36. </w:t>
       </w:r>
       <w:r>
         <w:rPr>
@@ -20117,7 +20432,7 @@
           <w:sz w:val="18"/>
           <w:szCs w:val="18"/>
         </w:rPr>
-        <w:t xml:space="preserve">Figure 36. </w:t>
+        <w:t xml:space="preserve">Figure 37. </w:t>
       </w:r>
       <w:r>
         <w:rPr>
@@ -20216,7 +20531,7 @@
           <w:sz w:val="18"/>
           <w:szCs w:val="18"/>
         </w:rPr>
-        <w:t xml:space="preserve">Figure 37. </w:t>
+        <w:t xml:space="preserve">Figure 38. </w:t>
       </w:r>
       <w:r>
         <w:rPr>
@@ -20359,7 +20674,7 @@
           <w:sz w:val="18"/>
           <w:szCs w:val="18"/>
         </w:rPr>
-        <w:t xml:space="preserve">Figure 38. </w:t>
+        <w:t xml:space="preserve">Figure 39. </w:t>
       </w:r>
       <w:r>
         <w:rPr>
@@ -20631,7 +20946,7 @@
           <w:sz w:val="18"/>
           <w:szCs w:val="18"/>
         </w:rPr>
-        <w:t xml:space="preserve">Figure 39. </w:t>
+        <w:t xml:space="preserve">Figure 40. </w:t>
       </w:r>
       <w:r>
         <w:rPr>
@@ -20873,7 +21188,7 @@
           <w:sz w:val="18"/>
           <w:szCs w:val="18"/>
         </w:rPr>
-        <w:t xml:space="preserve">Figure 40. </w:t>
+        <w:t xml:space="preserve">Figure 41. </w:t>
       </w:r>
       <w:r>
         <w:rPr>
@@ -20950,7 +21265,7 @@
           <w:sz w:val="18"/>
           <w:szCs w:val="18"/>
         </w:rPr>
-        <w:t xml:space="preserve">Figure 41. </w:t>
+        <w:t xml:space="preserve">Figure 42. </w:t>
       </w:r>
       <w:r>
         <w:rPr>
@@ -21080,7 +21395,7 @@
           <w:sz w:val="18"/>
           <w:szCs w:val="18"/>
         </w:rPr>
-        <w:t xml:space="preserve">Figure 42. </w:t>
+        <w:t xml:space="preserve">Figure 43. </w:t>
       </w:r>
       <w:r>
         <w:rPr>
@@ -21254,7 +21569,7 @@
           <w:sz w:val="18"/>
           <w:szCs w:val="18"/>
         </w:rPr>
-        <w:t xml:space="preserve">Figure 43. </w:t>
+        <w:t xml:space="preserve">Figure 44. </w:t>
       </w:r>
       <w:r>
         <w:rPr>
@@ -21344,7 +21659,7 @@
           <w:sz w:val="18"/>
           <w:szCs w:val="18"/>
         </w:rPr>
-        <w:t xml:space="preserve">Figure 44. </w:t>
+        <w:t xml:space="preserve">Figure 45. </w:t>
       </w:r>
       <w:r>
         <w:rPr>
@@ -22091,7 +22406,7 @@
           <w:sz w:val="18"/>
           <w:szCs w:val="18"/>
         </w:rPr>
-        <w:t xml:space="preserve">Figure 45. </w:t>
+        <w:t xml:space="preserve">Figure 46. </w:t>
       </w:r>
       <w:r>
         <w:rPr>
@@ -22193,7 +22508,7 @@
           <w:sz w:val="18"/>
           <w:szCs w:val="18"/>
         </w:rPr>
-        <w:t xml:space="preserve">Figure 46. </w:t>
+        <w:t xml:space="preserve">Figure 47. </w:t>
       </w:r>
       <w:r>
         <w:rPr>
@@ -22368,7 +22683,7 @@
           <w:sz w:val="18"/>
           <w:szCs w:val="18"/>
         </w:rPr>
-        <w:t xml:space="preserve">Figure 47. </w:t>
+        <w:t xml:space="preserve">Figure 48. </w:t>
       </w:r>
       <w:r>
         <w:rPr>
@@ -22445,7 +22760,7 @@
           <w:sz w:val="18"/>
           <w:szCs w:val="18"/>
         </w:rPr>
-        <w:t xml:space="preserve">Figure 48. </w:t>
+        <w:t xml:space="preserve">Figure 49. </w:t>
       </w:r>
       <w:r>
         <w:rPr>
@@ -22725,7 +23040,7 @@
           <w:sz w:val="18"/>
           <w:szCs w:val="18"/>
         </w:rPr>
-        <w:t xml:space="preserve">Figure 49. </w:t>
+        <w:t xml:space="preserve">Figure 50. </w:t>
       </w:r>
       <w:r>
         <w:rPr>
@@ -22854,7 +23169,7 @@
           <w:sz w:val="18"/>
           <w:szCs w:val="18"/>
         </w:rPr>
-        <w:t xml:space="preserve">Figure 50. </w:t>
+        <w:t xml:space="preserve">Figure 51. </w:t>
       </w:r>
       <w:r>
         <w:rPr>
@@ -23086,7 +23401,7 @@
           <w:sz w:val="18"/>
           <w:szCs w:val="18"/>
         </w:rPr>
-        <w:t xml:space="preserve">Figure 51. </w:t>
+        <w:t xml:space="preserve">Figure 52. </w:t>
       </w:r>
       <w:r>
         <w:rPr>
@@ -23202,7 +23517,7 @@
           <w:sz w:val="18"/>
           <w:szCs w:val="18"/>
         </w:rPr>
-        <w:t xml:space="preserve">Figure 52. </w:t>
+        <w:t xml:space="preserve">Figure 53. </w:t>
       </w:r>
       <w:r>
         <w:rPr>
@@ -23862,7 +24177,7 @@
           <w:sz w:val="18"/>
           <w:szCs w:val="18"/>
         </w:rPr>
-        <w:t xml:space="preserve">Figure 53. </w:t>
+        <w:t xml:space="preserve">Figure 54. </w:t>
       </w:r>
       <w:r>
         <w:rPr>

</xml_diff>

<commit_message>
9.22 UNTERSE: C89 port of tersedecompress (PACK/SPACK, F/V, text/binary) for CMS (UNTRS MODULE, UNTERSE EXEC, on the LANG disk) and Debian; byte-identical to the z/OS originals on CMS (tc72), PC 120/120; edf.py getraw; milestones 9.26 RXPIP; guide
Co-Authored-By: Claude Opus 5.5 <noreply@anthropic.com>
Claude-Session: https://claude.ai/code/session_01JBNU8KnKzXkgscse8vw6so
</commit_message>
<xml_diff>
--- a/arch/31bit/manual/VM370PLUS-Guide.docx
+++ b/arch/31bit/manual/VM370PLUS-Guide.docx
@@ -19115,6 +19115,53 @@
           <w:szCs w:val="18"/>
         </w:rPr>
         <w:t xml:space="preserve">ZIP on CMS</w:t>
+      </w:r>
+    </w:p>
+    <w:p>
+      <w:pPr>
+        <w:spacing w:after="120"/>
+      </w:pPr>
+      <w:r>
+        <w:rPr>
+          <w:rFonts w:ascii="Courier New" w:cs="Courier New" w:eastAsia="Courier New" w:hAnsi="Courier New"/>
+          <w:sz w:val="19"/>
+          <w:szCs w:val="19"/>
+        </w:rPr>
+        <w:t xml:space="preserve">UNTERSE fn.trs out.ft</w:t>
+      </w:r>
+      <w:r>
+        <w:rPr>
+          <w:rFonts w:ascii="Times New Roman" w:cs="Times New Roman" w:eastAsia="Times New Roman" w:hAnsi="Times New Roman"/>
+        </w:rPr>
+        <w:t xml:space="preserve"> unpacks an IBM TERSE file (PACK or SPACK, as AMATERSE or TRSMAIN write it on z/OS) into a CMS text file, one record per line; </w:t>
+      </w:r>
+      <w:r>
+        <w:rPr>
+          <w:rFonts w:ascii="Courier New" w:cs="Courier New" w:eastAsia="Courier New" w:hAnsi="Courier New"/>
+          <w:sz w:val="19"/>
+          <w:szCs w:val="19"/>
+        </w:rPr>
+        <w:t xml:space="preserve">UNTERSE -b</w:t>
+      </w:r>
+      <w:r>
+        <w:rPr>
+          <w:rFonts w:ascii="Times New Roman" w:cs="Times New Roman" w:eastAsia="Times New Roman" w:hAnsi="Times New Roman"/>
+        </w:rPr>
+        <w:t xml:space="preserve"> keeps the bytes (variable records get their 4-byte RDW), for binary data such as load modules or dumps; </w:t>
+      </w:r>
+      <w:r>
+        <w:rPr>
+          <w:rFonts w:ascii="Courier New" w:cs="Courier New" w:eastAsia="Courier New" w:hAnsi="Courier New"/>
+          <w:sz w:val="19"/>
+          <w:szCs w:val="19"/>
+        </w:rPr>
+        <w:t xml:space="preserve">UNTERSE -i</w:t>
+      </w:r>
+      <w:r>
+        <w:rPr>
+          <w:rFonts w:ascii="Times New Roman" w:cs="Times New Roman" w:eastAsia="Times New Roman" w:hAnsi="Times New Roman"/>
+        </w:rPr>
+        <w:t xml:space="preserve"> shows the header (PACK/SPACK, RECFM, LRECL). It is the Open Mainframe Project’s tersedecompress, in C.</w:t>
       </w:r>
     </w:p>
     <w:p>

</xml_diff>

<commit_message>
9.22 TERSE: SPACK compressor (decoder-model encoder, sizes as IBM SPACK), round trips on PC and CMS (tc74); TRS MODULE + TERSE EXEC on the LANG disk; guide; milestone done
Co-Authored-By: Claude Opus 5.5 <noreply@anthropic.com>
Claude-Session: https://claude.ai/code/session_01JBNU8KnKzXkgscse8vw6so
</commit_message>
<xml_diff>
--- a/arch/31bit/manual/VM370PLUS-Guide.docx
+++ b/arch/31bit/manual/VM370PLUS-Guide.docx
@@ -19161,7 +19161,63 @@
         <w:rPr>
           <w:rFonts w:ascii="Times New Roman" w:cs="Times New Roman" w:eastAsia="Times New Roman" w:hAnsi="Times New Roman"/>
         </w:rPr>
-        <w:t xml:space="preserve"> shows the header (PACK/SPACK, RECFM, LRECL). It is the Open Mainframe Project’s tersedecompress, in C.</w:t>
+        <w:t xml:space="preserve"> shows the header (PACK/SPACK, RECFM, LRECL). It is the Open Mainframe Project’s tersedecompress, in C. </w:t>
+      </w:r>
+      <w:r>
+        <w:rPr>
+          <w:rFonts w:ascii="Courier New" w:cs="Courier New" w:eastAsia="Courier New" w:hAnsi="Courier New"/>
+          <w:sz w:val="19"/>
+          <w:szCs w:val="19"/>
+        </w:rPr>
+        <w:t xml:space="preserve">TERSE fn.ft out.trs</w:t>
+      </w:r>
+      <w:r>
+        <w:rPr>
+          <w:rFonts w:ascii="Times New Roman" w:cs="Times New Roman" w:eastAsia="Times New Roman" w:hAnsi="Times New Roman"/>
+        </w:rPr>
+        <w:t xml:space="preserve"> goes the other way: SPACK format, RECFM F with the longest line as LRECL (</w:t>
+      </w:r>
+      <w:r>
+        <w:rPr>
+          <w:rFonts w:ascii="Courier New" w:cs="Courier New" w:eastAsia="Courier New" w:hAnsi="Courier New"/>
+          <w:sz w:val="19"/>
+          <w:szCs w:val="19"/>
+        </w:rPr>
+        <w:t xml:space="preserve">-l n</w:t>
+      </w:r>
+      <w:r>
+        <w:rPr>
+          <w:rFonts w:ascii="Times New Roman" w:cs="Times New Roman" w:eastAsia="Times New Roman" w:hAnsi="Times New Roman"/>
+        </w:rPr>
+        <w:t xml:space="preserve"> sets it, </w:t>
+      </w:r>
+      <w:r>
+        <w:rPr>
+          <w:rFonts w:ascii="Courier New" w:cs="Courier New" w:eastAsia="Courier New" w:hAnsi="Courier New"/>
+          <w:sz w:val="19"/>
+          <w:szCs w:val="19"/>
+        </w:rPr>
+        <w:t xml:space="preserve">-v</w:t>
+      </w:r>
+      <w:r>
+        <w:rPr>
+          <w:rFonts w:ascii="Times New Roman" w:cs="Times New Roman" w:eastAsia="Times New Roman" w:hAnsi="Times New Roman"/>
+        </w:rPr>
+        <w:t xml:space="preserve"> makes V records); </w:t>
+      </w:r>
+      <w:r>
+        <w:rPr>
+          <w:rFonts w:ascii="Courier New" w:cs="Courier New" w:eastAsia="Courier New" w:hAnsi="Courier New"/>
+          <w:sz w:val="19"/>
+          <w:szCs w:val="19"/>
+        </w:rPr>
+        <w:t xml:space="preserve">TERSE -b -l n</w:t>
+      </w:r>
+      <w:r>
+        <w:rPr>
+          <w:rFonts w:ascii="Times New Roman" w:cs="Times New Roman" w:eastAsia="Times New Roman" w:hAnsi="Times New Roman"/>
+        </w:rPr>
+        <w:t xml:space="preserve"> packs binary data. The encoder runs the decoder’s own model and compresses as well as IBM’s SPACK.</w:t>
       </w:r>
     </w:p>
     <w:p>

</xml_diff>

<commit_message>
Guide: kit build 8 and the language disk (installation parts 1-15, JOINLANG), Debian languages, SQLSERV in service, spool bridge and RXPIP planned, Pascal, APL, C file names on CMS, restrictions, command summary (LANG, ZIP, TERSE, SQL), kit contents; milestones table; Linux kernel fix for GCC 13 (cputime-dr.patch) and linux49 deck
Co-Authored-By: Claude Opus 5.5 <noreply@anthropic.com>
Claude-Session: https://claude.ai/code/session_01JBNU8KnKzXkgscse8vw6so
</commit_message>
<xml_diff>
--- a/arch/31bit/manual/VM370PLUS-Guide.docx
+++ b/arch/31bit/manual/VM370PLUS-Guide.docx
@@ -537,7 +537,7 @@
           <w:sz w:val="20"/>
           <w:szCs w:val="20"/>
         </w:rPr>
-        <w:t xml:space="preserve">	7</w:t>
+        <w:t xml:space="preserve">	8</w:t>
       </w:r>
     </w:p>
     <w:p>
@@ -1078,6 +1078,35 @@
           <w:sz w:val="20"/>
           <w:szCs w:val="20"/>
         </w:rPr>
+        <w:t xml:space="preserve">SQLSERV</w:t>
+      </w:r>
+      <w:r>
+        <w:rPr>
+          <w:rFonts w:ascii="Times New Roman" w:cs="Times New Roman" w:eastAsia="Times New Roman" w:hAnsi="Times New Roman"/>
+          <w:b w:val="false"/>
+          <w:bCs w:val="false"/>
+          <w:sz w:val="20"/>
+          <w:szCs w:val="20"/>
+        </w:rPr>
+        <w:t xml:space="preserve">	16</w:t>
+      </w:r>
+    </w:p>
+    <w:p>
+      <w:pPr>
+        <w:tabs>
+          <w:tab w:val="right" w:pos="9638" w:leader="dot"/>
+        </w:tabs>
+        <w:spacing w:after="20" w:before="20"/>
+        <w:ind w:left="400"/>
+      </w:pPr>
+      <w:r>
+        <w:rPr>
+          <w:rFonts w:ascii="Times New Roman" w:cs="Times New Roman" w:eastAsia="Times New Roman" w:hAnsi="Times New Roman"/>
+          <w:b w:val="false"/>
+          <w:bCs w:val="false"/>
+          <w:sz w:val="20"/>
+          <w:szCs w:val="20"/>
+        </w:rPr>
         <w:t xml:space="preserve">Planned service machines</w:t>
       </w:r>
       <w:r>
@@ -1513,7 +1542,7 @@
           <w:sz w:val="20"/>
           <w:szCs w:val="20"/>
         </w:rPr>
-        <w:t xml:space="preserve">xBase and Smalltalk</w:t>
+        <w:t xml:space="preserve">Pascal</w:t>
       </w:r>
       <w:r>
         <w:rPr>
@@ -1542,7 +1571,7 @@
           <w:sz w:val="20"/>
           <w:szCs w:val="20"/>
         </w:rPr>
-        <w:t xml:space="preserve">ZIP, UNZIP and GZIP</w:t>
+        <w:t xml:space="preserve">APL</w:t>
       </w:r>
       <w:r>
         <w:rPr>
@@ -1552,7 +1581,7 @@
           <w:sz w:val="20"/>
           <w:szCs w:val="20"/>
         </w:rPr>
-        <w:t xml:space="preserve">	22</w:t>
+        <w:t xml:space="preserve">	21</w:t>
       </w:r>
     </w:p>
     <w:p>
@@ -1571,6 +1600,93 @@
           <w:sz w:val="20"/>
           <w:szCs w:val="20"/>
         </w:rPr>
+        <w:t xml:space="preserve">xBase and Smalltalk</w:t>
+      </w:r>
+      <w:r>
+        <w:rPr>
+          <w:rFonts w:ascii="Times New Roman" w:cs="Times New Roman" w:eastAsia="Times New Roman" w:hAnsi="Times New Roman"/>
+          <w:b w:val="false"/>
+          <w:bCs w:val="false"/>
+          <w:sz w:val="20"/>
+          <w:szCs w:val="20"/>
+        </w:rPr>
+        <w:t xml:space="preserve">	22</w:t>
+      </w:r>
+    </w:p>
+    <w:p>
+      <w:pPr>
+        <w:tabs>
+          <w:tab w:val="right" w:pos="9638" w:leader="dot"/>
+        </w:tabs>
+        <w:spacing w:after="20" w:before="20"/>
+        <w:ind w:left="400"/>
+      </w:pPr>
+      <w:r>
+        <w:rPr>
+          <w:rFonts w:ascii="Times New Roman" w:cs="Times New Roman" w:eastAsia="Times New Roman" w:hAnsi="Times New Roman"/>
+          <w:b w:val="false"/>
+          <w:bCs w:val="false"/>
+          <w:sz w:val="20"/>
+          <w:szCs w:val="20"/>
+        </w:rPr>
+        <w:t xml:space="preserve">ZIP, UNZIP and GZIP</w:t>
+      </w:r>
+      <w:r>
+        <w:rPr>
+          <w:rFonts w:ascii="Times New Roman" w:cs="Times New Roman" w:eastAsia="Times New Roman" w:hAnsi="Times New Roman"/>
+          <w:b w:val="false"/>
+          <w:bCs w:val="false"/>
+          <w:sz w:val="20"/>
+          <w:szCs w:val="20"/>
+        </w:rPr>
+        <w:t xml:space="preserve">	22</w:t>
+      </w:r>
+    </w:p>
+    <w:p>
+      <w:pPr>
+        <w:tabs>
+          <w:tab w:val="right" w:pos="9638" w:leader="dot"/>
+        </w:tabs>
+        <w:spacing w:after="20" w:before="20"/>
+        <w:ind w:left="400"/>
+      </w:pPr>
+      <w:r>
+        <w:rPr>
+          <w:rFonts w:ascii="Times New Roman" w:cs="Times New Roman" w:eastAsia="Times New Roman" w:hAnsi="Times New Roman"/>
+          <w:b w:val="false"/>
+          <w:bCs w:val="false"/>
+          <w:sz w:val="20"/>
+          <w:szCs w:val="20"/>
+        </w:rPr>
+        <w:t xml:space="preserve">File names in C programs</w:t>
+      </w:r>
+      <w:r>
+        <w:rPr>
+          <w:rFonts w:ascii="Times New Roman" w:cs="Times New Roman" w:eastAsia="Times New Roman" w:hAnsi="Times New Roman"/>
+          <w:b w:val="false"/>
+          <w:bCs w:val="false"/>
+          <w:sz w:val="20"/>
+          <w:szCs w:val="20"/>
+        </w:rPr>
+        <w:t xml:space="preserve">	22</w:t>
+      </w:r>
+    </w:p>
+    <w:p>
+      <w:pPr>
+        <w:tabs>
+          <w:tab w:val="right" w:pos="9638" w:leader="dot"/>
+        </w:tabs>
+        <w:spacing w:after="20" w:before="20"/>
+        <w:ind w:left="400"/>
+      </w:pPr>
+      <w:r>
+        <w:rPr>
+          <w:rFonts w:ascii="Times New Roman" w:cs="Times New Roman" w:eastAsia="Times New Roman" w:hAnsi="Times New Roman"/>
+          <w:b w:val="false"/>
+          <w:bCs w:val="false"/>
+          <w:sz w:val="20"/>
+          <w:szCs w:val="20"/>
+        </w:rPr>
         <w:t xml:space="preserve">SQLite</w:t>
       </w:r>
       <w:r>
@@ -1610,7 +1726,7 @@
           <w:sz w:val="21"/>
           <w:szCs w:val="21"/>
         </w:rPr>
-        <w:t xml:space="preserve">	23</w:t>
+        <w:t xml:space="preserve">	24</w:t>
       </w:r>
     </w:p>
     <w:p>
@@ -1639,7 +1755,7 @@
           <w:sz w:val="21"/>
           <w:szCs w:val="21"/>
         </w:rPr>
-        <w:t xml:space="preserve">	24</w:t>
+        <w:t xml:space="preserve">	25</w:t>
       </w:r>
     </w:p>
     <w:p>
@@ -1668,7 +1784,7 @@
           <w:sz w:val="20"/>
           <w:szCs w:val="20"/>
         </w:rPr>
-        <w:t xml:space="preserve">	24</w:t>
+        <w:t xml:space="preserve">	25</w:t>
       </w:r>
     </w:p>
     <w:p>
@@ -1697,7 +1813,7 @@
           <w:sz w:val="20"/>
           <w:szCs w:val="20"/>
         </w:rPr>
-        <w:t xml:space="preserve">	24</w:t>
+        <w:t xml:space="preserve">	25</w:t>
       </w:r>
     </w:p>
     <w:p>
@@ -1726,7 +1842,7 @@
           <w:sz w:val="20"/>
           <w:szCs w:val="20"/>
         </w:rPr>
-        <w:t xml:space="preserve">	24</w:t>
+        <w:t xml:space="preserve">	25</w:t>
       </w:r>
     </w:p>
     <w:p>
@@ -1755,7 +1871,7 @@
           <w:sz w:val="20"/>
           <w:szCs w:val="20"/>
         </w:rPr>
-        <w:t xml:space="preserve">	24</w:t>
+        <w:t xml:space="preserve">	25</w:t>
       </w:r>
     </w:p>
     <w:p>
@@ -1784,7 +1900,7 @@
           <w:sz w:val="20"/>
           <w:szCs w:val="20"/>
         </w:rPr>
-        <w:t xml:space="preserve">	24</w:t>
+        <w:t xml:space="preserve">	25</w:t>
       </w:r>
     </w:p>
     <w:p>
@@ -1813,7 +1929,7 @@
           <w:sz w:val="20"/>
           <w:szCs w:val="20"/>
         </w:rPr>
-        <w:t xml:space="preserve">	25</w:t>
+        <w:t xml:space="preserve">	26</w:t>
       </w:r>
     </w:p>
     <w:p>
@@ -1842,7 +1958,7 @@
           <w:sz w:val="20"/>
           <w:szCs w:val="20"/>
         </w:rPr>
-        <w:t xml:space="preserve">	25</w:t>
+        <w:t xml:space="preserve">	26</w:t>
       </w:r>
     </w:p>
     <w:p>
@@ -1871,7 +1987,7 @@
           <w:sz w:val="20"/>
           <w:szCs w:val="20"/>
         </w:rPr>
-        <w:t xml:space="preserve">	25</w:t>
+        <w:t xml:space="preserve">	26</w:t>
       </w:r>
     </w:p>
     <w:p>
@@ -1900,7 +2016,7 @@
           <w:sz w:val="20"/>
           <w:szCs w:val="20"/>
         </w:rPr>
-        <w:t xml:space="preserve">	26</w:t>
+        <w:t xml:space="preserve">	27</w:t>
       </w:r>
     </w:p>
     <w:p>
@@ -1929,7 +2045,7 @@
           <w:sz w:val="20"/>
           <w:szCs w:val="20"/>
         </w:rPr>
-        <w:t xml:space="preserve">	26</w:t>
+        <w:t xml:space="preserve">	27</w:t>
       </w:r>
     </w:p>
     <w:p>
@@ -1948,7 +2064,7 @@
           <w:sz w:val="20"/>
           <w:szCs w:val="20"/>
         </w:rPr>
-        <w:t xml:space="preserve">LINUX EXEC</w:t>
+        <w:t xml:space="preserve">LANG</w:t>
       </w:r>
       <w:r>
         <w:rPr>
@@ -1958,7 +2074,123 @@
           <w:sz w:val="20"/>
           <w:szCs w:val="20"/>
         </w:rPr>
-        <w:t xml:space="preserve">	27</w:t>
+        <w:t xml:space="preserve">	28</w:t>
+      </w:r>
+    </w:p>
+    <w:p>
+      <w:pPr>
+        <w:tabs>
+          <w:tab w:val="right" w:pos="9638" w:leader="dot"/>
+        </w:tabs>
+        <w:spacing w:after="20" w:before="20"/>
+        <w:ind w:left="400"/>
+      </w:pPr>
+      <w:r>
+        <w:rPr>
+          <w:rFonts w:ascii="Times New Roman" w:cs="Times New Roman" w:eastAsia="Times New Roman" w:hAnsi="Times New Roman"/>
+          <w:b w:val="false"/>
+          <w:bCs w:val="false"/>
+          <w:sz w:val="20"/>
+          <w:szCs w:val="20"/>
+        </w:rPr>
+        <w:t xml:space="preserve">ZIP, UNZIP, GZIP</w:t>
+      </w:r>
+      <w:r>
+        <w:rPr>
+          <w:rFonts w:ascii="Times New Roman" w:cs="Times New Roman" w:eastAsia="Times New Roman" w:hAnsi="Times New Roman"/>
+          <w:b w:val="false"/>
+          <w:bCs w:val="false"/>
+          <w:sz w:val="20"/>
+          <w:szCs w:val="20"/>
+        </w:rPr>
+        <w:t xml:space="preserve">	28</w:t>
+      </w:r>
+    </w:p>
+    <w:p>
+      <w:pPr>
+        <w:tabs>
+          <w:tab w:val="right" w:pos="9638" w:leader="dot"/>
+        </w:tabs>
+        <w:spacing w:after="20" w:before="20"/>
+        <w:ind w:left="400"/>
+      </w:pPr>
+      <w:r>
+        <w:rPr>
+          <w:rFonts w:ascii="Times New Roman" w:cs="Times New Roman" w:eastAsia="Times New Roman" w:hAnsi="Times New Roman"/>
+          <w:b w:val="false"/>
+          <w:bCs w:val="false"/>
+          <w:sz w:val="20"/>
+          <w:szCs w:val="20"/>
+        </w:rPr>
+        <w:t xml:space="preserve">TERSE, UNTERSE</w:t>
+      </w:r>
+      <w:r>
+        <w:rPr>
+          <w:rFonts w:ascii="Times New Roman" w:cs="Times New Roman" w:eastAsia="Times New Roman" w:hAnsi="Times New Roman"/>
+          <w:b w:val="false"/>
+          <w:bCs w:val="false"/>
+          <w:sz w:val="20"/>
+          <w:szCs w:val="20"/>
+        </w:rPr>
+        <w:t xml:space="preserve">	28</w:t>
+      </w:r>
+    </w:p>
+    <w:p>
+      <w:pPr>
+        <w:tabs>
+          <w:tab w:val="right" w:pos="9638" w:leader="dot"/>
+        </w:tabs>
+        <w:spacing w:after="20" w:before="20"/>
+        <w:ind w:left="400"/>
+      </w:pPr>
+      <w:r>
+        <w:rPr>
+          <w:rFonts w:ascii="Times New Roman" w:cs="Times New Roman" w:eastAsia="Times New Roman" w:hAnsi="Times New Roman"/>
+          <w:b w:val="false"/>
+          <w:bCs w:val="false"/>
+          <w:sz w:val="20"/>
+          <w:szCs w:val="20"/>
+        </w:rPr>
+        <w:t xml:space="preserve">SQL, SQLSERV</w:t>
+      </w:r>
+      <w:r>
+        <w:rPr>
+          <w:rFonts w:ascii="Times New Roman" w:cs="Times New Roman" w:eastAsia="Times New Roman" w:hAnsi="Times New Roman"/>
+          <w:b w:val="false"/>
+          <w:bCs w:val="false"/>
+          <w:sz w:val="20"/>
+          <w:szCs w:val="20"/>
+        </w:rPr>
+        <w:t xml:space="preserve">	28</w:t>
+      </w:r>
+    </w:p>
+    <w:p>
+      <w:pPr>
+        <w:tabs>
+          <w:tab w:val="right" w:pos="9638" w:leader="dot"/>
+        </w:tabs>
+        <w:spacing w:after="20" w:before="20"/>
+        <w:ind w:left="400"/>
+      </w:pPr>
+      <w:r>
+        <w:rPr>
+          <w:rFonts w:ascii="Times New Roman" w:cs="Times New Roman" w:eastAsia="Times New Roman" w:hAnsi="Times New Roman"/>
+          <w:b w:val="false"/>
+          <w:bCs w:val="false"/>
+          <w:sz w:val="20"/>
+          <w:szCs w:val="20"/>
+        </w:rPr>
+        <w:t xml:space="preserve">LINUX EXEC</w:t>
+      </w:r>
+      <w:r>
+        <w:rPr>
+          <w:rFonts w:ascii="Times New Roman" w:cs="Times New Roman" w:eastAsia="Times New Roman" w:hAnsi="Times New Roman"/>
+          <w:b w:val="false"/>
+          <w:bCs w:val="false"/>
+          <w:sz w:val="20"/>
+          <w:szCs w:val="20"/>
+        </w:rPr>
+        <w:t xml:space="preserve">	28</w:t>
       </w:r>
     </w:p>
     <w:p>
@@ -1987,7 +2219,7 @@
           <w:sz w:val="21"/>
           <w:szCs w:val="21"/>
         </w:rPr>
-        <w:t xml:space="preserve">	28</w:t>
+        <w:t xml:space="preserve">	29</w:t>
       </w:r>
     </w:p>
     <w:p>
@@ -2016,7 +2248,7 @@
           <w:sz w:val="21"/>
           <w:szCs w:val="21"/>
         </w:rPr>
-        <w:t xml:space="preserve">	29</w:t>
+        <w:t xml:space="preserve">	30</w:t>
       </w:r>
     </w:p>
     <w:p>
@@ -2045,7 +2277,7 @@
           <w:sz w:val="21"/>
           <w:szCs w:val="21"/>
         </w:rPr>
-        <w:t xml:space="preserve">	30</w:t>
+        <w:t xml:space="preserve">	31</w:t>
       </w:r>
     </w:p>
     <w:p>
@@ -2103,7 +2335,7 @@
           <w:sz w:val="20"/>
           <w:szCs w:val="20"/>
         </w:rPr>
-        <w:t xml:space="preserve">	34</w:t>
+        <w:t xml:space="preserve">	35</w:t>
       </w:r>
     </w:p>
     <w:p>
@@ -2344,7 +2576,7 @@
         <w:rPr>
           <w:rFonts w:ascii="Times New Roman" w:cs="Times New Roman" w:eastAsia="Times New Roman" w:hAnsi="Times New Roman"/>
         </w:rPr>
-        <w:t xml:space="preserve">, describes GCC 13 for C and C++, GnuCOBOL, COBOL with OO, PL/I, Python, SQLite, xBase and Smalltalk on CMS.</w:t>
+        <w:t xml:space="preserve">, describes the language disk and what is on it: GCC 13 for C and C++, GnuCOBOL, COBOL with OO, PL/I, Python, SQLite and SQLSERV, Pascal, APL, xBase, Smalltalk, ZIP and TERSE.</w:t>
       </w:r>
     </w:p>
     <w:p>
@@ -2487,6 +2719,184 @@
           <w:rFonts w:ascii="Times New Roman" w:cs="Times New Roman" w:eastAsia="Times New Roman" w:hAnsi="Times New Roman"/>
         </w:rPr>
         <w:t xml:space="preserve">This edition is kept up to date as VM/370plus grows; each change is listed here, newest first.</w:t>
+      </w:r>
+    </w:p>
+    <w:p>
+      <w:pPr>
+        <w:pStyle w:val="ListParagraph"/>
+        <w:numPr>
+          <w:ilvl w:val="0"/>
+          <w:numId w:val="2"/>
+        </w:numPr>
+        <w:spacing w:after="60"/>
+      </w:pPr>
+      <w:r>
+        <w:rPr>
+          <w:rFonts w:ascii="Times New Roman" w:cs="Times New Roman" w:eastAsia="Times New Roman" w:hAnsi="Times New Roman"/>
+          <w:b/>
+          <w:bCs/>
+        </w:rPr>
+        <w:t xml:space="preserve">12 October 2026, evening (kit build 8).</w:t>
+      </w:r>
+      <w:r>
+        <w:rPr>
+          <w:rFonts w:ascii="Times New Roman" w:cs="Times New Roman" w:eastAsia="Times New Roman" w:hAnsi="Times New Roman"/>
+        </w:rPr>
+        <w:t xml:space="preserve"> The language disk VMLANG (MAINT 19F, </w:t>
+      </w:r>
+      <w:r>
+        <w:rPr>
+          <w:rFonts w:ascii="Courier New" w:cs="Courier New" w:eastAsia="Courier New" w:hAnsi="Courier New"/>
+          <w:sz w:val="19"/>
+          <w:szCs w:val="19"/>
+        </w:rPr>
+        <w:t xml:space="preserve">LANG</w:t>
+      </w:r>
+      <w:r>
+        <w:rPr>
+          <w:rFonts w:ascii="Times New Roman" w:cs="Times New Roman" w:eastAsia="Times New Roman" w:hAnsi="Times New Roman"/>
+        </w:rPr>
+        <w:t xml:space="preserve">) carries every compiler and tool of Chapter 8; AUTOLOG1 attaches it at IPL. New on CMS: COBOL with OO (</w:t>
+      </w:r>
+      <w:r>
+        <w:rPr>
+          <w:rFonts w:ascii="Courier New" w:cs="Courier New" w:eastAsia="Courier New" w:hAnsi="Courier New"/>
+          <w:sz w:val="19"/>
+          <w:szCs w:val="19"/>
+        </w:rPr>
+        <w:t xml:space="preserve">COBX</w:t>
+      </w:r>
+      <w:r>
+        <w:rPr>
+          <w:rFonts w:ascii="Times New Roman" w:cs="Times New Roman" w:eastAsia="Times New Roman" w:hAnsi="Times New Roman"/>
+        </w:rPr>
+        <w:t xml:space="preserve">), xBase and Smalltalk as C programs, the SQLSERV service machine (</w:t>
+      </w:r>
+      <w:r>
+        <w:rPr>
+          <w:rFonts w:ascii="Courier New" w:cs="Courier New" w:eastAsia="Courier New" w:hAnsi="Courier New"/>
+          <w:sz w:val="19"/>
+          <w:szCs w:val="19"/>
+        </w:rPr>
+        <w:t xml:space="preserve">SQL</w:t>
+      </w:r>
+      <w:r>
+        <w:rPr>
+          <w:rFonts w:ascii="Times New Roman" w:cs="Times New Roman" w:eastAsia="Times New Roman" w:hAnsi="Times New Roman"/>
+        </w:rPr>
+        <w:t xml:space="preserve">), Stanford Pascal (</w:t>
+      </w:r>
+      <w:r>
+        <w:rPr>
+          <w:rFonts w:ascii="Courier New" w:cs="Courier New" w:eastAsia="Courier New" w:hAnsi="Courier New"/>
+          <w:sz w:val="19"/>
+          <w:szCs w:val="19"/>
+        </w:rPr>
+        <w:t xml:space="preserve">PCPAS</w:t>
+      </w:r>
+      <w:r>
+        <w:rPr>
+          <w:rFonts w:ascii="Times New Roman" w:cs="Times New Roman" w:eastAsia="Times New Roman" w:hAnsi="Times New Roman"/>
+        </w:rPr>
+        <w:t xml:space="preserve">, </w:t>
+      </w:r>
+      <w:r>
+        <w:rPr>
+          <w:rFonts w:ascii="Courier New" w:cs="Courier New" w:eastAsia="Courier New" w:hAnsi="Courier New"/>
+          <w:sz w:val="19"/>
+          <w:szCs w:val="19"/>
+        </w:rPr>
+        <w:t xml:space="preserve">PCRUN</w:t>
+      </w:r>
+      <w:r>
+        <w:rPr>
+          <w:rFonts w:ascii="Times New Roman" w:cs="Times New Roman" w:eastAsia="Times New Roman" w:hAnsi="Times New Roman"/>
+        </w:rPr>
+        <w:t xml:space="preserve">), APL, </w:t>
+      </w:r>
+      <w:r>
+        <w:rPr>
+          <w:rFonts w:ascii="Courier New" w:cs="Courier New" w:eastAsia="Courier New" w:hAnsi="Courier New"/>
+          <w:sz w:val="19"/>
+          <w:szCs w:val="19"/>
+        </w:rPr>
+        <w:t xml:space="preserve">ZIP</w:t>
+      </w:r>
+      <w:r>
+        <w:rPr>
+          <w:rFonts w:ascii="Times New Roman" w:cs="Times New Roman" w:eastAsia="Times New Roman" w:hAnsi="Times New Roman"/>
+        </w:rPr>
+        <w:t xml:space="preserve">, </w:t>
+      </w:r>
+      <w:r>
+        <w:rPr>
+          <w:rFonts w:ascii="Courier New" w:cs="Courier New" w:eastAsia="Courier New" w:hAnsi="Courier New"/>
+          <w:sz w:val="19"/>
+          <w:szCs w:val="19"/>
+        </w:rPr>
+        <w:t xml:space="preserve">UNZIP</w:t>
+      </w:r>
+      <w:r>
+        <w:rPr>
+          <w:rFonts w:ascii="Times New Roman" w:cs="Times New Roman" w:eastAsia="Times New Roman" w:hAnsi="Times New Roman"/>
+        </w:rPr>
+        <w:t xml:space="preserve">, </w:t>
+      </w:r>
+      <w:r>
+        <w:rPr>
+          <w:rFonts w:ascii="Courier New" w:cs="Courier New" w:eastAsia="Courier New" w:hAnsi="Courier New"/>
+          <w:sz w:val="19"/>
+          <w:szCs w:val="19"/>
+        </w:rPr>
+        <w:t xml:space="preserve">GZIP</w:t>
+      </w:r>
+      <w:r>
+        <w:rPr>
+          <w:rFonts w:ascii="Times New Roman" w:cs="Times New Roman" w:eastAsia="Times New Roman" w:hAnsi="Times New Roman"/>
+        </w:rPr>
+        <w:t xml:space="preserve">, </w:t>
+      </w:r>
+      <w:r>
+        <w:rPr>
+          <w:rFonts w:ascii="Courier New" w:cs="Courier New" w:eastAsia="Courier New" w:hAnsi="Courier New"/>
+          <w:sz w:val="19"/>
+          <w:szCs w:val="19"/>
+        </w:rPr>
+        <w:t xml:space="preserve">TERSE</w:t>
+      </w:r>
+      <w:r>
+        <w:rPr>
+          <w:rFonts w:ascii="Times New Roman" w:cs="Times New Roman" w:eastAsia="Times New Roman" w:hAnsi="Times New Roman"/>
+        </w:rPr>
+        <w:t xml:space="preserve"> and </w:t>
+      </w:r>
+      <w:r>
+        <w:rPr>
+          <w:rFonts w:ascii="Courier New" w:cs="Courier New" w:eastAsia="Courier New" w:hAnsi="Courier New"/>
+          <w:sz w:val="19"/>
+          <w:szCs w:val="19"/>
+        </w:rPr>
+        <w:t xml:space="preserve">UNTERSE</w:t>
+      </w:r>
+      <w:r>
+        <w:rPr>
+          <w:rFonts w:ascii="Times New Roman" w:cs="Times New Roman" w:eastAsia="Times New Roman" w:hAnsi="Times New Roman"/>
+        </w:rPr>
+        <w:t xml:space="preserve">. C programs see real CMS file dates, </w:t>
+      </w:r>
+      <w:r>
+        <w:rPr>
+          <w:rFonts w:ascii="Courier New" w:cs="Courier New" w:eastAsia="Courier New" w:hAnsi="Courier New"/>
+          <w:sz w:val="19"/>
+          <w:szCs w:val="19"/>
+        </w:rPr>
+        <w:t xml:space="preserve">/tmp</w:t>
+      </w:r>
+      <w:r>
+        <w:rPr>
+          <w:rFonts w:ascii="Times New Roman" w:cs="Times New Roman" w:eastAsia="Times New Roman" w:hAnsi="Times New Roman"/>
+        </w:rPr>
+        <w:t xml:space="preserve"> files and FILEDEF-style names. Debian carries APL, COBOL, PL/I, xBase and Smalltalk with their tests.</w:t>
       </w:r>
     </w:p>
     <w:p>
@@ -3793,7 +4203,7 @@
                 <w:sz w:val="19"/>
                 <w:szCs w:val="19"/>
               </w:rPr>
-              <w:t xml:space="preserve">a CMS nucleus that is itself 31-bit; larger minidisks</w:t>
+              <w:t xml:space="preserve">larger minidisks (EDF, 4 KB blocks) under the EC-mode CMS</w:t>
             </w:r>
           </w:p>
         </w:tc>
@@ -3814,7 +4224,7 @@
                 <w:sz w:val="19"/>
                 <w:szCs w:val="19"/>
               </w:rPr>
-              <w:t xml:space="preserve">planned, before M9</w:t>
+              <w:t xml:space="preserve">complete</w:t>
             </w:r>
           </w:p>
         </w:tc>
@@ -4560,7 +4970,7 @@
                 <w:sz w:val="19"/>
                 <w:szCs w:val="19"/>
               </w:rPr>
-              <w:t xml:space="preserve">before 64-bit: SET/QUERY MACHINE, FULIST, GLOBALV (done); CP leftovers; C++ on CMS; SQL and SQLSERV; CMS sockets and httpd; xBase/Harbour; MQ and MQTT; APL on CMS; GnuCOBOL on Debian (done) and CMS; ooRexx 5; AI gateway; firewall guest; kit build 7</w:t>
+              <w:t xml:space="preserve">before 64-bit: SET/QUERY MACHINE, FULIST, GLOBALV, TDISK; CP leftovers; GCC 13 C/C++, GnuCOBOL, COBOL with OO, PL/I, Python, SQLite + SQLSERV, Pascal, APL, xBase, ZIP, TERSE on CMS; the language disk (kit build 8)</w:t>
             </w:r>
           </w:p>
         </w:tc>
@@ -4581,7 +4991,7 @@
                 <w:sz w:val="19"/>
                 <w:szCs w:val="19"/>
               </w:rPr>
-              <w:t xml:space="preserve">under way</w:t>
+              <w:t xml:space="preserve">complete</w:t>
             </w:r>
           </w:p>
         </w:tc>
@@ -4608,7 +5018,7 @@
                 <w:sz w:val="19"/>
                 <w:szCs w:val="19"/>
               </w:rPr>
-              <w:t xml:space="preserve">M10</w:t>
+              <w:t xml:space="preserve">M9 (next)</w:t>
             </w:r>
           </w:p>
         </w:tc>
@@ -4629,7 +5039,7 @@
                 <w:sz w:val="19"/>
                 <w:szCs w:val="19"/>
               </w:rPr>
-              <w:t xml:space="preserve">z/Architecture (64-bit); migration documentation; kit build 8</w:t>
+              <w:t xml:space="preserve">Guest LAN and the BORDER firewall; CMS sockets and httpd; MQ and MQTT; ooRexx 5; AI gateway; the spool bridge to Linux services (Asterisk, MQTT); RXPIP (REXX packages); NJE; mail; TELL</w:t>
             </w:r>
           </w:p>
         </w:tc>
@@ -4677,6 +5087,75 @@
                 <w:sz w:val="19"/>
                 <w:szCs w:val="19"/>
               </w:rPr>
+              <w:t xml:space="preserve">M10</w:t>
+            </w:r>
+          </w:p>
+        </w:tc>
+        <w:tc>
+          <w:tcPr>
+            <w:tcW w:type="dxa" w:w="6038"/>
+            <w:tcMar>
+              <w:top w:type="dxa" w:w="60"/>
+              <w:left w:type="dxa" w:w="100"/>
+              <w:bottom w:type="dxa" w:w="60"/>
+              <w:right w:type="dxa" w:w="100"/>
+            </w:tcMar>
+          </w:tcPr>
+          <w:p>
+            <w:r>
+              <w:rPr>
+                <w:rFonts w:ascii="Times New Roman" w:cs="Times New Roman" w:eastAsia="Times New Roman" w:hAnsi="Times New Roman"/>
+                <w:sz w:val="19"/>
+                <w:szCs w:val="19"/>
+              </w:rPr>
+              <w:t xml:space="preserve">z/Architecture (64-bit); migration documentation; kit build 9</w:t>
+            </w:r>
+          </w:p>
+        </w:tc>
+        <w:tc>
+          <w:tcPr>
+            <w:tcW w:type="dxa" w:w="2200"/>
+            <w:tcMar>
+              <w:top w:type="dxa" w:w="60"/>
+              <w:left w:type="dxa" w:w="100"/>
+              <w:bottom w:type="dxa" w:w="60"/>
+              <w:right w:type="dxa" w:w="100"/>
+            </w:tcMar>
+          </w:tcPr>
+          <w:p>
+            <w:r>
+              <w:rPr>
+                <w:rFonts w:ascii="Times New Roman" w:cs="Times New Roman" w:eastAsia="Times New Roman" w:hAnsi="Times New Roman"/>
+                <w:sz w:val="19"/>
+                <w:szCs w:val="19"/>
+              </w:rPr>
+              <w:t xml:space="preserve">planned</w:t>
+            </w:r>
+          </w:p>
+        </w:tc>
+      </w:tr>
+      <w:tr>
+        <w:trPr>
+          <w:cantSplit/>
+          <w:tblHeader w:val="false"/>
+        </w:trPr>
+        <w:tc>
+          <w:tcPr>
+            <w:tcW w:type="dxa" w:w="1400"/>
+            <w:tcMar>
+              <w:top w:type="dxa" w:w="60"/>
+              <w:left w:type="dxa" w:w="100"/>
+              <w:bottom w:type="dxa" w:w="60"/>
+              <w:right w:type="dxa" w:w="100"/>
+            </w:tcMar>
+          </w:tcPr>
+          <w:p>
+            <w:r>
+              <w:rPr>
+                <w:rFonts w:ascii="Times New Roman" w:cs="Times New Roman" w:eastAsia="Times New Roman" w:hAnsi="Times New Roman"/>
+                <w:sz w:val="19"/>
+                <w:szCs w:val="19"/>
+              </w:rPr>
               <w:t xml:space="preserve">M11</w:t>
             </w:r>
           </w:p>
@@ -4698,7 +5177,7 @@
                 <w:sz w:val="19"/>
                 <w:szCs w:val="19"/>
               </w:rPr>
-              <w:t xml:space="preserve">multiprocessor support; more languages (GNU APL, C++, Java, NetRexx); FreeSWITCH; Node-RED; Docker, QEMU, Bochs; CFSERV; kit build 9</w:t>
+              <w:t xml:space="preserve">multiprocessor support; more languages (GNU APL, Java, NetRexx); FreeSWITCH; Node-RED; Docker, QEMU, Bochs; CFSERV; kit build 10</w:t>
             </w:r>
           </w:p>
         </w:tc>
@@ -7174,7 +7653,7 @@
         <w:rPr>
           <w:rFonts w:ascii="Times New Roman" w:cs="Times New Roman" w:eastAsia="Times New Roman" w:hAnsi="Times New Roman"/>
         </w:rPr>
-        <w:t xml:space="preserve">Unzip kit parts 1 to 12 over it, replacing files when asked.</w:t>
+        <w:t xml:space="preserve">Unzip kit parts 1 to 15 over it, replacing files when asked.</w:t>
       </w:r>
     </w:p>
     <w:p>
@@ -7330,18 +7809,13 @@
     </w:p>
     <w:p>
       <w:pPr>
-        <w:pStyle w:val="ListParagraph"/>
-        <w:numPr>
-          <w:ilvl w:val="0"/>
-          <w:numId w:val="3"/>
-        </w:numPr>
-        <w:spacing w:after="60"/>
+        <w:spacing w:after="120"/>
       </w:pPr>
       <w:r>
         <w:rPr>
           <w:rFonts w:ascii="Times New Roman" w:cs="Times New Roman" w:eastAsia="Times New Roman" w:hAnsi="Times New Roman"/>
         </w:rPr>
-        <w:t xml:space="preserve">If you want the Linux network, remove the </w:t>
+        <w:t xml:space="preserve">Join the language disk the same way (kit parts 14 and 15): </w:t>
       </w:r>
       <w:r>
         <w:rPr>
@@ -7349,13 +7823,13 @@
           <w:sz w:val="19"/>
           <w:szCs w:val="19"/>
         </w:rPr>
-        <w:t xml:space="preserve">#</w:t>
-      </w:r>
-      <w:r>
-        <w:rPr>
-          <w:rFonts w:ascii="Times New Roman" w:cs="Times New Roman" w:eastAsia="Times New Roman" w:hAnsi="Times New Roman"/>
-        </w:rPr>
-        <w:t xml:space="preserve"> in front of the line </w:t>
+        <w:t xml:space="preserve">JOINLANG.CMD</w:t>
+      </w:r>
+      <w:r>
+        <w:rPr>
+          <w:rFonts w:ascii="Times New Roman" w:cs="Times New Roman" w:eastAsia="Times New Roman" w:hAnsi="Times New Roman"/>
+        </w:rPr>
+        <w:t xml:space="preserve"> on Windows or </w:t>
       </w:r>
       <w:r>
         <w:rPr>
@@ -7363,13 +7837,13 @@
           <w:sz w:val="19"/>
           <w:szCs w:val="19"/>
         </w:rPr>
-        <w:t xml:space="preserve">#0600.2 CTCI 10.1.1.2 10.1.1.1</w:t>
-      </w:r>
-      <w:r>
-        <w:rPr>
-          <w:rFonts w:ascii="Times New Roman" w:cs="Times New Roman" w:eastAsia="Times New Roman" w:hAnsi="Times New Roman"/>
-        </w:rPr>
-        <w:t xml:space="preserve"> in </w:t>
+        <w:t xml:space="preserve">sh joinlang.sh</w:t>
+      </w:r>
+      <w:r>
+        <w:rPr>
+          <w:rFonts w:ascii="Times New Roman" w:cs="Times New Roman" w:eastAsia="Times New Roman" w:hAnsi="Times New Roman"/>
+        </w:rPr>
+        <w:t xml:space="preserve"> on Linux and WSL2 gives </w:t>
       </w:r>
       <w:r>
         <w:rPr>
@@ -7377,118 +7851,13 @@
           <w:sz w:val="19"/>
           <w:szCs w:val="19"/>
         </w:rPr>
-        <w:t xml:space="preserve">vm370ce.conf</w:t>
-      </w:r>
-      <w:r>
-        <w:rPr>
-          <w:rFonts w:ascii="Times New Roman" w:cs="Times New Roman" w:eastAsia="Times New Roman" w:hAnsi="Times New Roman"/>
-        </w:rPr>
-        <w:t xml:space="preserve">.</w:t>
-      </w:r>
-    </w:p>
-    <w:p>
-      <w:pPr>
-        <w:pStyle w:val="ListParagraph"/>
-        <w:numPr>
-          <w:ilvl w:val="0"/>
-          <w:numId w:val="3"/>
-        </w:numPr>
-        <w:spacing w:after="60"/>
-      </w:pPr>
-      <w:r>
-        <w:rPr>
-          <w:rFonts w:ascii="Times New Roman" w:cs="Times New Roman" w:eastAsia="Times New Roman" w:hAnsi="Times New Roman"/>
-        </w:rPr>
-        <w:t xml:space="preserve">Start the system as you start the Community Edition: </w:t>
-      </w:r>
-      <w:r>
-        <w:rPr>
-          <w:rFonts w:ascii="Courier New" w:cs="Courier New" w:eastAsia="Courier New" w:hAnsi="Courier New"/>
-          <w:sz w:val="19"/>
-          <w:szCs w:val="19"/>
-        </w:rPr>
-        <w:t xml:space="preserve">vm370ce.cmd</w:t>
-      </w:r>
-      <w:r>
-        <w:rPr>
-          <w:rFonts w:ascii="Times New Roman" w:cs="Times New Roman" w:eastAsia="Times New Roman" w:hAnsi="Times New Roman"/>
-        </w:rPr>
-        <w:t xml:space="preserve"> on Windows, </w:t>
-      </w:r>
-      <w:r>
-        <w:rPr>
-          <w:rFonts w:ascii="Courier New" w:cs="Courier New" w:eastAsia="Courier New" w:hAnsi="Courier New"/>
-          <w:sz w:val="19"/>
-          <w:szCs w:val="19"/>
-        </w:rPr>
-        <w:t xml:space="preserve">vm370ce.sh</w:t>
-      </w:r>
-      <w:r>
-        <w:rPr>
-          <w:rFonts w:ascii="Times New Roman" w:cs="Times New Roman" w:eastAsia="Times New Roman" w:hAnsi="Times New Roman"/>
-        </w:rPr>
-        <w:t xml:space="preserve"> elsewhere.</w:t>
-      </w:r>
-    </w:p>
-    <w:p>
-      <w:pPr>
-        <w:pStyle w:val="Heading2"/>
-      </w:pPr>
-      <w:r>
-        <w:t xml:space="preserve">The first IPL</w:t>
-      </w:r>
-    </w:p>
-    <w:p>
-      <w:pPr>
-        <w:spacing w:after="120"/>
-      </w:pPr>
-      <w:r>
-        <w:rPr>
-          <w:rFonts w:ascii="Times New Roman" w:cs="Times New Roman" w:eastAsia="Times New Roman" w:hAnsi="Times New Roman"/>
-        </w:rPr>
-        <w:t xml:space="preserve">The Community Edition’s </w:t>
-      </w:r>
-      <w:r>
-        <w:rPr>
-          <w:rFonts w:ascii="Courier New" w:cs="Courier New" w:eastAsia="Courier New" w:hAnsi="Courier New"/>
-          <w:sz w:val="19"/>
-          <w:szCs w:val="19"/>
-        </w:rPr>
-        <w:t xml:space="preserve">hercules.rc</w:t>
-      </w:r>
-      <w:r>
-        <w:rPr>
-          <w:rFonts w:ascii="Times New Roman" w:cs="Times New Roman" w:eastAsia="Times New Roman" w:hAnsi="Times New Roman"/>
-        </w:rPr>
-        <w:t xml:space="preserve"> IPLs from 6A1 by itself when Hercules starts. The first time, CP has no warm-start data and asks for the start type; answer </w:t>
-      </w:r>
-      <w:r>
-        <w:rPr>
-          <w:rFonts w:ascii="Courier New" w:cs="Courier New" w:eastAsia="Courier New" w:hAnsi="Courier New"/>
-          <w:sz w:val="19"/>
-          <w:szCs w:val="19"/>
-        </w:rPr>
-        <w:t xml:space="preserve">/cold</w:t>
-      </w:r>
-      <w:r>
-        <w:rPr>
-          <w:rFonts w:ascii="Times New Roman" w:cs="Times New Roman" w:eastAsia="Times New Roman" w:hAnsi="Times New Roman"/>
-        </w:rPr>
-        <w:t xml:space="preserve">. When the console shows </w:t>
-      </w:r>
-      <w:r>
-        <w:rPr>
-          <w:rFonts w:ascii="Courier New" w:cs="Courier New" w:eastAsia="Courier New" w:hAnsi="Courier New"/>
-          <w:sz w:val="19"/>
-          <w:szCs w:val="19"/>
-        </w:rPr>
-        <w:t xml:space="preserve">DMKCPI966I Initialization complete</w:t>
-      </w:r>
-      <w:r>
-        <w:rPr>
-          <w:rFonts w:ascii="Times New Roman" w:cs="Times New Roman" w:eastAsia="Times New Roman" w:hAnsi="Times New Roman"/>
-        </w:rPr>
-        <w:t xml:space="preserve">, the system is up.</w:t>
+        <w:t xml:space="preserve">disks/lang.cckd</w:t>
+      </w:r>
+      <w:r>
+        <w:rPr>
+          <w:rFonts w:ascii="Times New Roman" w:cs="Times New Roman" w:eastAsia="Times New Roman" w:hAnsi="Times New Roman"/>
+        </w:rPr>
+        <w:t xml:space="preserve">, the 3380 at address 182 that holds MAINT 19F (see Chapter 8).</w:t>
       </w:r>
     </w:p>
     <w:tbl>
@@ -7531,7 +7900,7 @@
                 <w:sz w:val="17"/>
                 <w:szCs w:val="17"/>
               </w:rPr>
-              <w:t xml:space="preserve">HHCCP041I SYSCONS interface active</w:t>
+              <w:t xml:space="preserve">JOINLANG.CMD</w:t>
             </w:r>
           </w:p>
           <w:p>
@@ -7544,59 +7913,7 @@
                 <w:sz w:val="17"/>
                 <w:szCs w:val="17"/>
               </w:rPr>
-              <w:t xml:space="preserve">VM/370plus Online</w:t>
-            </w:r>
-          </w:p>
-          <w:p>
-            <w:pPr>
-              <w:spacing w:after="0" w:line="228"/>
-            </w:pPr>
-            <w:r>
-              <w:rPr>
-                <w:rFonts w:ascii="Courier New" w:cs="Courier New" w:eastAsia="Courier New" w:hAnsi="Courier New"/>
-                <w:sz w:val="17"/>
-                <w:szCs w:val="17"/>
-              </w:rPr>
-              <w:t xml:space="preserve">Start ((Warm|Force|COLD|CKPT) (DRain) (DIsable) (NOAUTOlo)) or (SHUTDOWN)</w:t>
-            </w:r>
-          </w:p>
-          <w:p>
-            <w:pPr>
-              <w:spacing w:after="0" w:line="228"/>
-            </w:pPr>
-            <w:r>
-              <w:rPr>
-                <w:rFonts w:ascii="Courier New" w:cs="Courier New" w:eastAsia="Courier New" w:hAnsi="Courier New"/>
-                <w:sz w:val="17"/>
-                <w:szCs w:val="17"/>
-              </w:rPr>
-              <w:t xml:space="preserve">/cold</w:t>
-            </w:r>
-          </w:p>
-          <w:p>
-            <w:pPr>
-              <w:spacing w:after="0" w:line="228"/>
-            </w:pPr>
-            <w:r>
-              <w:rPr>
-                <w:rFonts w:ascii="Courier New" w:cs="Courier New" w:eastAsia="Courier New" w:hAnsi="Courier New"/>
-                <w:sz w:val="17"/>
-                <w:szCs w:val="17"/>
-              </w:rPr>
-              <w:t xml:space="preserve">NOW 09:51:57 GMT FRIDAY 10/09/26</w:t>
-            </w:r>
-          </w:p>
-          <w:p>
-            <w:pPr>
-              <w:spacing w:after="0" w:line="228"/>
-            </w:pPr>
-            <w:r>
-              <w:rPr>
-                <w:rFonts w:ascii="Courier New" w:cs="Courier New" w:eastAsia="Courier New" w:hAnsi="Courier New"/>
-                <w:sz w:val="17"/>
-                <w:szCs w:val="17"/>
-              </w:rPr>
-              <w:t xml:space="preserve">DMKCPI966I Initialization complete</w:t>
+              <w:t xml:space="preserve">Language disk joined: disks\lang.cckd</w:t>
             </w:r>
           </w:p>
         </w:tc>
@@ -7615,6 +7932,303 @@
           <w:szCs w:val="18"/>
         </w:rPr>
         <w:t xml:space="preserve">Figure 6. </w:t>
+      </w:r>
+      <w:r>
+        <w:rPr>
+          <w:rFonts w:ascii="Arial" w:cs="Arial" w:eastAsia="Arial" w:hAnsi="Arial"/>
+          <w:sz w:val="18"/>
+          <w:szCs w:val="18"/>
+        </w:rPr>
+        <w:t xml:space="preserve">Joining the language disk (Windows)</w:t>
+      </w:r>
+    </w:p>
+    <w:p>
+      <w:pPr>
+        <w:pStyle w:val="ListParagraph"/>
+        <w:numPr>
+          <w:ilvl w:val="0"/>
+          <w:numId w:val="3"/>
+        </w:numPr>
+        <w:spacing w:after="60"/>
+      </w:pPr>
+      <w:r>
+        <w:rPr>
+          <w:rFonts w:ascii="Times New Roman" w:cs="Times New Roman" w:eastAsia="Times New Roman" w:hAnsi="Times New Roman"/>
+        </w:rPr>
+        <w:t xml:space="preserve">If you want the Linux network, remove the </w:t>
+      </w:r>
+      <w:r>
+        <w:rPr>
+          <w:rFonts w:ascii="Courier New" w:cs="Courier New" w:eastAsia="Courier New" w:hAnsi="Courier New"/>
+          <w:sz w:val="19"/>
+          <w:szCs w:val="19"/>
+        </w:rPr>
+        <w:t xml:space="preserve">#</w:t>
+      </w:r>
+      <w:r>
+        <w:rPr>
+          <w:rFonts w:ascii="Times New Roman" w:cs="Times New Roman" w:eastAsia="Times New Roman" w:hAnsi="Times New Roman"/>
+        </w:rPr>
+        <w:t xml:space="preserve"> in front of the line </w:t>
+      </w:r>
+      <w:r>
+        <w:rPr>
+          <w:rFonts w:ascii="Courier New" w:cs="Courier New" w:eastAsia="Courier New" w:hAnsi="Courier New"/>
+          <w:sz w:val="19"/>
+          <w:szCs w:val="19"/>
+        </w:rPr>
+        <w:t xml:space="preserve">#0600.2 CTCI 10.1.1.2 10.1.1.1</w:t>
+      </w:r>
+      <w:r>
+        <w:rPr>
+          <w:rFonts w:ascii="Times New Roman" w:cs="Times New Roman" w:eastAsia="Times New Roman" w:hAnsi="Times New Roman"/>
+        </w:rPr>
+        <w:t xml:space="preserve"> in </w:t>
+      </w:r>
+      <w:r>
+        <w:rPr>
+          <w:rFonts w:ascii="Courier New" w:cs="Courier New" w:eastAsia="Courier New" w:hAnsi="Courier New"/>
+          <w:sz w:val="19"/>
+          <w:szCs w:val="19"/>
+        </w:rPr>
+        <w:t xml:space="preserve">vm370ce.conf</w:t>
+      </w:r>
+      <w:r>
+        <w:rPr>
+          <w:rFonts w:ascii="Times New Roman" w:cs="Times New Roman" w:eastAsia="Times New Roman" w:hAnsi="Times New Roman"/>
+        </w:rPr>
+        <w:t xml:space="preserve">.</w:t>
+      </w:r>
+    </w:p>
+    <w:p>
+      <w:pPr>
+        <w:pStyle w:val="ListParagraph"/>
+        <w:numPr>
+          <w:ilvl w:val="0"/>
+          <w:numId w:val="3"/>
+        </w:numPr>
+        <w:spacing w:after="60"/>
+      </w:pPr>
+      <w:r>
+        <w:rPr>
+          <w:rFonts w:ascii="Times New Roman" w:cs="Times New Roman" w:eastAsia="Times New Roman" w:hAnsi="Times New Roman"/>
+        </w:rPr>
+        <w:t xml:space="preserve">Start the system as you start the Community Edition: </w:t>
+      </w:r>
+      <w:r>
+        <w:rPr>
+          <w:rFonts w:ascii="Courier New" w:cs="Courier New" w:eastAsia="Courier New" w:hAnsi="Courier New"/>
+          <w:sz w:val="19"/>
+          <w:szCs w:val="19"/>
+        </w:rPr>
+        <w:t xml:space="preserve">vm370ce.cmd</w:t>
+      </w:r>
+      <w:r>
+        <w:rPr>
+          <w:rFonts w:ascii="Times New Roman" w:cs="Times New Roman" w:eastAsia="Times New Roman" w:hAnsi="Times New Roman"/>
+        </w:rPr>
+        <w:t xml:space="preserve"> on Windows, </w:t>
+      </w:r>
+      <w:r>
+        <w:rPr>
+          <w:rFonts w:ascii="Courier New" w:cs="Courier New" w:eastAsia="Courier New" w:hAnsi="Courier New"/>
+          <w:sz w:val="19"/>
+          <w:szCs w:val="19"/>
+        </w:rPr>
+        <w:t xml:space="preserve">vm370ce.sh</w:t>
+      </w:r>
+      <w:r>
+        <w:rPr>
+          <w:rFonts w:ascii="Times New Roman" w:cs="Times New Roman" w:eastAsia="Times New Roman" w:hAnsi="Times New Roman"/>
+        </w:rPr>
+        <w:t xml:space="preserve"> elsewhere.</w:t>
+      </w:r>
+    </w:p>
+    <w:p>
+      <w:pPr>
+        <w:pStyle w:val="Heading2"/>
+      </w:pPr>
+      <w:r>
+        <w:t xml:space="preserve">The first IPL</w:t>
+      </w:r>
+    </w:p>
+    <w:p>
+      <w:pPr>
+        <w:spacing w:after="120"/>
+      </w:pPr>
+      <w:r>
+        <w:rPr>
+          <w:rFonts w:ascii="Times New Roman" w:cs="Times New Roman" w:eastAsia="Times New Roman" w:hAnsi="Times New Roman"/>
+        </w:rPr>
+        <w:t xml:space="preserve">The Community Edition’s </w:t>
+      </w:r>
+      <w:r>
+        <w:rPr>
+          <w:rFonts w:ascii="Courier New" w:cs="Courier New" w:eastAsia="Courier New" w:hAnsi="Courier New"/>
+          <w:sz w:val="19"/>
+          <w:szCs w:val="19"/>
+        </w:rPr>
+        <w:t xml:space="preserve">hercules.rc</w:t>
+      </w:r>
+      <w:r>
+        <w:rPr>
+          <w:rFonts w:ascii="Times New Roman" w:cs="Times New Roman" w:eastAsia="Times New Roman" w:hAnsi="Times New Roman"/>
+        </w:rPr>
+        <w:t xml:space="preserve"> IPLs from 6A1 by itself when Hercules starts. The first time, CP has no warm-start data and asks for the start type; answer </w:t>
+      </w:r>
+      <w:r>
+        <w:rPr>
+          <w:rFonts w:ascii="Courier New" w:cs="Courier New" w:eastAsia="Courier New" w:hAnsi="Courier New"/>
+          <w:sz w:val="19"/>
+          <w:szCs w:val="19"/>
+        </w:rPr>
+        <w:t xml:space="preserve">/cold</w:t>
+      </w:r>
+      <w:r>
+        <w:rPr>
+          <w:rFonts w:ascii="Times New Roman" w:cs="Times New Roman" w:eastAsia="Times New Roman" w:hAnsi="Times New Roman"/>
+        </w:rPr>
+        <w:t xml:space="preserve">. When the console shows </w:t>
+      </w:r>
+      <w:r>
+        <w:rPr>
+          <w:rFonts w:ascii="Courier New" w:cs="Courier New" w:eastAsia="Courier New" w:hAnsi="Courier New"/>
+          <w:sz w:val="19"/>
+          <w:szCs w:val="19"/>
+        </w:rPr>
+        <w:t xml:space="preserve">DMKCPI966I Initialization complete</w:t>
+      </w:r>
+      <w:r>
+        <w:rPr>
+          <w:rFonts w:ascii="Times New Roman" w:cs="Times New Roman" w:eastAsia="Times New Roman" w:hAnsi="Times New Roman"/>
+        </w:rPr>
+        <w:t xml:space="preserve">, the system is up.</w:t>
+      </w:r>
+    </w:p>
+    <w:tbl>
+      <w:tblPr>
+        <w:tblW w:type="dxa" w:w="9638"/>
+        <w:tblBorders>
+          <w:top w:val="single" w:color="auto" w:sz="4"/>
+          <w:left w:val="single" w:color="auto" w:sz="4"/>
+          <w:bottom w:val="single" w:color="auto" w:sz="4"/>
+          <w:right w:val="single" w:color="auto" w:sz="4"/>
+          <w:insideH w:val="single" w:color="auto" w:sz="4"/>
+          <w:insideV w:val="single" w:color="auto" w:sz="4"/>
+        </w:tblBorders>
+      </w:tblPr>
+      <w:tblGrid>
+        <w:gridCol w:w="9638"/>
+      </w:tblGrid>
+      <w:tr>
+        <w:trPr>
+          <w:cantSplit/>
+        </w:trPr>
+        <w:tc>
+          <w:tcPr>
+            <w:tcW w:type="dxa" w:w="9638"/>
+            <w:shd w:fill="F2F2F2" w:color="auto" w:val="clear"/>
+            <w:tcMar>
+              <w:top w:type="dxa" w:w="100"/>
+              <w:left w:type="dxa" w:w="140"/>
+              <w:bottom w:type="dxa" w:w="100"/>
+              <w:right w:type="dxa" w:w="140"/>
+            </w:tcMar>
+          </w:tcPr>
+          <w:p>
+            <w:pPr>
+              <w:spacing w:after="0" w:line="228"/>
+            </w:pPr>
+            <w:r>
+              <w:rPr>
+                <w:rFonts w:ascii="Courier New" w:cs="Courier New" w:eastAsia="Courier New" w:hAnsi="Courier New"/>
+                <w:sz w:val="17"/>
+                <w:szCs w:val="17"/>
+              </w:rPr>
+              <w:t xml:space="preserve">HHCCP041I SYSCONS interface active</w:t>
+            </w:r>
+          </w:p>
+          <w:p>
+            <w:pPr>
+              <w:spacing w:after="0" w:line="228"/>
+            </w:pPr>
+            <w:r>
+              <w:rPr>
+                <w:rFonts w:ascii="Courier New" w:cs="Courier New" w:eastAsia="Courier New" w:hAnsi="Courier New"/>
+                <w:sz w:val="17"/>
+                <w:szCs w:val="17"/>
+              </w:rPr>
+              <w:t xml:space="preserve">VM/370plus Online</w:t>
+            </w:r>
+          </w:p>
+          <w:p>
+            <w:pPr>
+              <w:spacing w:after="0" w:line="228"/>
+            </w:pPr>
+            <w:r>
+              <w:rPr>
+                <w:rFonts w:ascii="Courier New" w:cs="Courier New" w:eastAsia="Courier New" w:hAnsi="Courier New"/>
+                <w:sz w:val="17"/>
+                <w:szCs w:val="17"/>
+              </w:rPr>
+              <w:t xml:space="preserve">Start ((Warm|Force|COLD|CKPT) (DRain) (DIsable) (NOAUTOlo)) or (SHUTDOWN)</w:t>
+            </w:r>
+          </w:p>
+          <w:p>
+            <w:pPr>
+              <w:spacing w:after="0" w:line="228"/>
+            </w:pPr>
+            <w:r>
+              <w:rPr>
+                <w:rFonts w:ascii="Courier New" w:cs="Courier New" w:eastAsia="Courier New" w:hAnsi="Courier New"/>
+                <w:sz w:val="17"/>
+                <w:szCs w:val="17"/>
+              </w:rPr>
+              <w:t xml:space="preserve">/cold</w:t>
+            </w:r>
+          </w:p>
+          <w:p>
+            <w:pPr>
+              <w:spacing w:after="0" w:line="228"/>
+            </w:pPr>
+            <w:r>
+              <w:rPr>
+                <w:rFonts w:ascii="Courier New" w:cs="Courier New" w:eastAsia="Courier New" w:hAnsi="Courier New"/>
+                <w:sz w:val="17"/>
+                <w:szCs w:val="17"/>
+              </w:rPr>
+              <w:t xml:space="preserve">NOW 09:51:57 GMT FRIDAY 10/09/26</w:t>
+            </w:r>
+          </w:p>
+          <w:p>
+            <w:pPr>
+              <w:spacing w:after="0" w:line="228"/>
+            </w:pPr>
+            <w:r>
+              <w:rPr>
+                <w:rFonts w:ascii="Courier New" w:cs="Courier New" w:eastAsia="Courier New" w:hAnsi="Courier New"/>
+                <w:sz w:val="17"/>
+                <w:szCs w:val="17"/>
+              </w:rPr>
+              <w:t xml:space="preserve">DMKCPI966I Initialization complete</w:t>
+            </w:r>
+          </w:p>
+        </w:tc>
+      </w:tr>
+    </w:tbl>
+    <w:p>
+      <w:pPr>
+        <w:spacing w:after="200" w:before="80"/>
+      </w:pPr>
+      <w:r>
+        <w:rPr>
+          <w:rFonts w:ascii="Arial" w:cs="Arial" w:eastAsia="Arial" w:hAnsi="Arial"/>
+          <w:b/>
+          <w:bCs/>
+          <w:sz w:val="18"/>
+          <w:szCs w:val="18"/>
+        </w:rPr>
+        <w:t xml:space="preserve">Figure 7. </w:t>
       </w:r>
       <w:r>
         <w:rPr>
@@ -8589,7 +9203,7 @@
           <w:sz w:val="18"/>
           <w:szCs w:val="18"/>
         </w:rPr>
-        <w:t xml:space="preserve">Figure 7. </w:t>
+        <w:t xml:space="preserve">Figure 8. </w:t>
       </w:r>
       <w:r>
         <w:rPr>
@@ -8695,7 +9309,7 @@
           <w:sz w:val="18"/>
           <w:szCs w:val="18"/>
         </w:rPr>
-        <w:t xml:space="preserve">Figure 8. </w:t>
+        <w:t xml:space="preserve">Figure 9. </w:t>
       </w:r>
       <w:r>
         <w:rPr>
@@ -8886,7 +9500,7 @@
           <w:sz w:val="18"/>
           <w:szCs w:val="18"/>
         </w:rPr>
-        <w:t xml:space="preserve">Figure 9. </w:t>
+        <w:t xml:space="preserve">Figure 10. </w:t>
       </w:r>
       <w:r>
         <w:rPr>
@@ -9124,7 +9738,7 @@
           <w:sz w:val="18"/>
           <w:szCs w:val="18"/>
         </w:rPr>
-        <w:t xml:space="preserve">Figure 10. </w:t>
+        <w:t xml:space="preserve">Figure 11. </w:t>
       </w:r>
       <w:r>
         <w:rPr>
@@ -9458,7 +10072,7 @@
           <w:sz w:val="18"/>
           <w:szCs w:val="18"/>
         </w:rPr>
-        <w:t xml:space="preserve">Figure 11. </w:t>
+        <w:t xml:space="preserve">Figure 12. </w:t>
       </w:r>
       <w:r>
         <w:rPr>
@@ -9836,7 +10450,7 @@
           <w:sz w:val="18"/>
           <w:szCs w:val="18"/>
         </w:rPr>
-        <w:t xml:space="preserve">Figure 12. </w:t>
+        <w:t xml:space="preserve">Figure 13. </w:t>
       </w:r>
       <w:r>
         <w:rPr>
@@ -10237,7 +10851,7 @@
           <w:sz w:val="18"/>
           <w:szCs w:val="18"/>
         </w:rPr>
-        <w:t xml:space="preserve">Figure 13. </w:t>
+        <w:t xml:space="preserve">Figure 14. </w:t>
       </w:r>
       <w:r>
         <w:rPr>
@@ -10391,7 +11005,7 @@
           <w:sz w:val="18"/>
           <w:szCs w:val="18"/>
         </w:rPr>
-        <w:t xml:space="preserve">Figure 14. </w:t>
+        <w:t xml:space="preserve">Figure 15. </w:t>
       </w:r>
       <w:r>
         <w:rPr>
@@ -10499,7 +11113,7 @@
           <w:sz w:val="18"/>
           <w:szCs w:val="18"/>
         </w:rPr>
-        <w:t xml:space="preserve">Figure 15. </w:t>
+        <w:t xml:space="preserve">Figure 16. </w:t>
       </w:r>
       <w:r>
         <w:rPr>
@@ -11036,7 +11650,7 @@
           <w:sz w:val="18"/>
           <w:szCs w:val="18"/>
         </w:rPr>
-        <w:t xml:space="preserve">Figure 16. </w:t>
+        <w:t xml:space="preserve">Figure 17. </w:t>
       </w:r>
       <w:r>
         <w:rPr>
@@ -11196,7 +11810,7 @@
           <w:sz w:val="18"/>
           <w:szCs w:val="18"/>
         </w:rPr>
-        <w:t xml:space="preserve">Figure 17. </w:t>
+        <w:t xml:space="preserve">Figure 18. </w:t>
       </w:r>
       <w:r>
         <w:rPr>
@@ -11205,6 +11819,193 @@
           <w:szCs w:val="18"/>
         </w:rPr>
         <w:t xml:space="preserve">Debian on VM/370plus</w:t>
+      </w:r>
+    </w:p>
+    <w:p>
+      <w:pPr>
+        <w:pStyle w:val="Heading3"/>
+      </w:pPr>
+      <w:r>
+        <w:t xml:space="preserve">Languages on Debian</w:t>
+      </w:r>
+    </w:p>
+    <w:p>
+      <w:pPr>
+        <w:spacing w:after="120"/>
+      </w:pPr>
+      <w:r>
+        <w:rPr>
+          <w:rFonts w:ascii="Times New Roman" w:cs="Times New Roman" w:eastAsia="Times New Roman" w:hAnsi="Times New Roman"/>
+        </w:rPr>
+        <w:t xml:space="preserve">Besides GNU C, Python and Regina, the C89 interpreters and translators of the VM/370plus languages are in </w:t>
+      </w:r>
+      <w:r>
+        <w:rPr>
+          <w:rFonts w:ascii="Courier New" w:cs="Courier New" w:eastAsia="Courier New" w:hAnsi="Courier New"/>
+          <w:sz w:val="19"/>
+          <w:szCs w:val="19"/>
+        </w:rPr>
+        <w:t xml:space="preserve">/usr/local/bin</w:t>
+      </w:r>
+      <w:r>
+        <w:rPr>
+          <w:rFonts w:ascii="Times New Roman" w:cs="Times New Roman" w:eastAsia="Times New Roman" w:hAnsi="Times New Roman"/>
+        </w:rPr>
+        <w:t xml:space="preserve">: </w:t>
+      </w:r>
+      <w:r>
+        <w:rPr>
+          <w:rFonts w:ascii="Courier New" w:cs="Courier New" w:eastAsia="Courier New" w:hAnsi="Courier New"/>
+          <w:sz w:val="19"/>
+          <w:szCs w:val="19"/>
+        </w:rPr>
+        <w:t xml:space="preserve">apl</w:t>
+      </w:r>
+      <w:r>
+        <w:rPr>
+          <w:rFonts w:ascii="Times New Roman" w:cs="Times New Roman" w:eastAsia="Times New Roman" w:hAnsi="Times New Roman"/>
+        </w:rPr>
+        <w:t xml:space="preserve"> (APL), </w:t>
+      </w:r>
+      <w:r>
+        <w:rPr>
+          <w:rFonts w:ascii="Courier New" w:cs="Courier New" w:eastAsia="Courier New" w:hAnsi="Courier New"/>
+          <w:sz w:val="19"/>
+          <w:szCs w:val="19"/>
+        </w:rPr>
+        <w:t xml:space="preserve">cobol</w:t>
+      </w:r>
+      <w:r>
+        <w:rPr>
+          <w:rFonts w:ascii="Times New Roman" w:cs="Times New Roman" w:eastAsia="Times New Roman" w:hAnsi="Times New Roman"/>
+        </w:rPr>
+        <w:t xml:space="preserve"> (COBOL with OO, mikebeer/cobol: </w:t>
+      </w:r>
+      <w:r>
+        <w:rPr>
+          <w:rFonts w:ascii="Courier New" w:cs="Courier New" w:eastAsia="Courier New" w:hAnsi="Courier New"/>
+          <w:sz w:val="19"/>
+          <w:szCs w:val="19"/>
+        </w:rPr>
+        <w:t xml:space="preserve">cobol prog.cob -o prog.c</w:t>
+      </w:r>
+      <w:r>
+        <w:rPr>
+          <w:rFonts w:ascii="Times New Roman" w:cs="Times New Roman" w:eastAsia="Times New Roman" w:hAnsi="Times New Roman"/>
+        </w:rPr>
+        <w:t xml:space="preserve">, then </w:t>
+      </w:r>
+      <w:r>
+        <w:rPr>
+          <w:rFonts w:ascii="Courier New" w:cs="Courier New" w:eastAsia="Courier New" w:hAnsi="Courier New"/>
+          <w:sz w:val="19"/>
+          <w:szCs w:val="19"/>
+        </w:rPr>
+        <w:t xml:space="preserve">gcc -I/usr/local/share/cobol</w:t>
+      </w:r>
+      <w:r>
+        <w:rPr>
+          <w:rFonts w:ascii="Times New Roman" w:cs="Times New Roman" w:eastAsia="Times New Roman" w:hAnsi="Times New Roman"/>
+        </w:rPr>
+        <w:t xml:space="preserve">), </w:t>
+      </w:r>
+      <w:r>
+        <w:rPr>
+          <w:rFonts w:ascii="Courier New" w:cs="Courier New" w:eastAsia="Courier New" w:hAnsi="Courier New"/>
+          <w:sz w:val="19"/>
+          <w:szCs w:val="19"/>
+        </w:rPr>
+        <w:t xml:space="preserve">pli</w:t>
+      </w:r>
+      <w:r>
+        <w:rPr>
+          <w:rFonts w:ascii="Times New Roman" w:cs="Times New Roman" w:eastAsia="Times New Roman" w:hAnsi="Times New Roman"/>
+        </w:rPr>
+        <w:t xml:space="preserve"> and </w:t>
+      </w:r>
+      <w:r>
+        <w:rPr>
+          <w:rFonts w:ascii="Courier New" w:cs="Courier New" w:eastAsia="Courier New" w:hAnsi="Courier New"/>
+          <w:sz w:val="19"/>
+          <w:szCs w:val="19"/>
+        </w:rPr>
+        <w:t xml:space="preserve">plic</w:t>
+      </w:r>
+      <w:r>
+        <w:rPr>
+          <w:rFonts w:ascii="Times New Roman" w:cs="Times New Roman" w:eastAsia="Times New Roman" w:hAnsi="Times New Roman"/>
+        </w:rPr>
+        <w:t xml:space="preserve"> (PL/I: </w:t>
+      </w:r>
+      <w:r>
+        <w:rPr>
+          <w:rFonts w:ascii="Courier New" w:cs="Courier New" w:eastAsia="Courier New" w:hAnsi="Courier New"/>
+          <w:sz w:val="19"/>
+          <w:szCs w:val="19"/>
+        </w:rPr>
+        <w:t xml:space="preserve">plic prog.pli</w:t>
+      </w:r>
+      <w:r>
+        <w:rPr>
+          <w:rFonts w:ascii="Times New Roman" w:cs="Times New Roman" w:eastAsia="Times New Roman" w:hAnsi="Times New Roman"/>
+        </w:rPr>
+        <w:t xml:space="preserve"> translates and compiles), </w:t>
+      </w:r>
+      <w:r>
+        <w:rPr>
+          <w:rFonts w:ascii="Courier New" w:cs="Courier New" w:eastAsia="Courier New" w:hAnsi="Courier New"/>
+          <w:sz w:val="19"/>
+          <w:szCs w:val="19"/>
+        </w:rPr>
+        <w:t xml:space="preserve">xbase-c</w:t>
+      </w:r>
+      <w:r>
+        <w:rPr>
+          <w:rFonts w:ascii="Times New Roman" w:cs="Times New Roman" w:eastAsia="Times New Roman" w:hAnsi="Times New Roman"/>
+        </w:rPr>
+        <w:t xml:space="preserve"> (xBase) and </w:t>
+      </w:r>
+      <w:r>
+        <w:rPr>
+          <w:rFonts w:ascii="Courier New" w:cs="Courier New" w:eastAsia="Courier New" w:hAnsi="Courier New"/>
+          <w:sz w:val="19"/>
+          <w:szCs w:val="19"/>
+        </w:rPr>
+        <w:t xml:space="preserve">stc</w:t>
+      </w:r>
+      <w:r>
+        <w:rPr>
+          <w:rFonts w:ascii="Times New Roman" w:cs="Times New Roman" w:eastAsia="Times New Roman" w:hAnsi="Times New Roman"/>
+        </w:rPr>
+        <w:t xml:space="preserve"> (Smalltalk: </w:t>
+      </w:r>
+      <w:r>
+        <w:rPr>
+          <w:rFonts w:ascii="Courier New" w:cs="Courier New" w:eastAsia="Courier New" w:hAnsi="Courier New"/>
+          <w:sz w:val="19"/>
+          <w:szCs w:val="19"/>
+        </w:rPr>
+        <w:t xml:space="preserve">stc -L /usr/local/share/vmtests/smalltalk/lib prog.st</w:t>
+      </w:r>
+      <w:r>
+        <w:rPr>
+          <w:rFonts w:ascii="Times New Roman" w:cs="Times New Roman" w:eastAsia="Times New Roman" w:hAnsi="Times New Roman"/>
+        </w:rPr>
+        <w:t xml:space="preserve">). </w:t>
+      </w:r>
+      <w:r>
+        <w:rPr>
+          <w:rFonts w:ascii="Courier New" w:cs="Courier New" w:eastAsia="Courier New" w:hAnsi="Courier New"/>
+          <w:sz w:val="19"/>
+          <w:szCs w:val="19"/>
+        </w:rPr>
+        <w:t xml:space="preserve">sh /usr/local/share/vmtests/runall.sh</w:t>
+      </w:r>
+      <w:r>
+        <w:rPr>
+          <w:rFonts w:ascii="Times New Roman" w:cs="Times New Roman" w:eastAsia="Times New Roman" w:hAnsi="Times New Roman"/>
+        </w:rPr>
+        <w:t xml:space="preserve"> runs their test suites (APL 34, COBOL 20, PL/I 39, xBase 7, Smalltalk 22 tests).</w:t>
       </w:r>
     </w:p>
     <w:p>
@@ -11556,7 +12357,7 @@
           <w:sz w:val="18"/>
           <w:szCs w:val="18"/>
         </w:rPr>
-        <w:t xml:space="preserve">Figure 18. </w:t>
+        <w:t xml:space="preserve">Figure 19. </w:t>
       </w:r>
       <w:r>
         <w:rPr>
@@ -12026,7 +12827,7 @@
           <w:sz w:val="18"/>
           <w:szCs w:val="18"/>
         </w:rPr>
-        <w:t xml:space="preserve">Figure 19. </w:t>
+        <w:t xml:space="preserve">Figure 20. </w:t>
       </w:r>
       <w:r>
         <w:rPr>
@@ -12495,7 +13296,7 @@
           <w:sz w:val="18"/>
           <w:szCs w:val="18"/>
         </w:rPr>
-        <w:t xml:space="preserve">Figure 20. </w:t>
+        <w:t xml:space="preserve">Figure 21. </w:t>
       </w:r>
       <w:r>
         <w:rPr>
@@ -12624,7 +13425,7 @@
           <w:sz w:val="18"/>
           <w:szCs w:val="18"/>
         </w:rPr>
-        <w:t xml:space="preserve">Figure 21. </w:t>
+        <w:t xml:space="preserve">Figure 22. </w:t>
       </w:r>
       <w:r>
         <w:rPr>
@@ -13141,7 +13942,7 @@
           <w:sz w:val="18"/>
           <w:szCs w:val="18"/>
         </w:rPr>
-        <w:t xml:space="preserve">Figure 22. </w:t>
+        <w:t xml:space="preserve">Figure 23. </w:t>
       </w:r>
       <w:r>
         <w:rPr>
@@ -13184,6 +13985,25 @@
           <w:rFonts w:ascii="Times New Roman" w:cs="Times New Roman" w:eastAsia="Times New Roman" w:hAnsi="Times New Roman"/>
         </w:rPr>
         <w:t xml:space="preserve">.</w:t>
+      </w:r>
+    </w:p>
+    <w:p>
+      <w:pPr>
+        <w:pStyle w:val="Heading2"/>
+      </w:pPr>
+      <w:r>
+        <w:t xml:space="preserve">SQLSERV</w:t>
+      </w:r>
+    </w:p>
+    <w:p>
+      <w:pPr>
+        <w:spacing w:after="120"/>
+      </w:pPr>
+      <w:r>
+        <w:rPr>
+          <w:rFonts w:ascii="Times New Roman" w:cs="Times New Roman" w:eastAsia="Times New Roman" w:hAnsi="Times New Roman"/>
+        </w:rPr>
+        <w:t xml:space="preserve">SQLSERV, the SQLite service machine, is in service: see Chapter 8, SQLite. It is the model for the service machines below: a request is a file punched to the machine, the answer is punched back to the sender.</w:t>
       </w:r>
     </w:p>
     <w:p>
@@ -13334,7 +14154,7 @@
                 <w:sz w:val="19"/>
                 <w:szCs w:val="19"/>
               </w:rPr>
-              <w:t xml:space="preserve">SQLSERV</w:t>
+              <w:t xml:space="preserve">Spool bridge</w:t>
             </w:r>
           </w:p>
         </w:tc>
@@ -13355,7 +14175,23 @@
                 <w:sz w:val="19"/>
                 <w:szCs w:val="19"/>
               </w:rPr>
-              <w:t xml:space="preserve">SQLite in a CMS service machine that owns the database disk; requests by spool, later by IUCV or sockets</w:t>
+              <w:t xml:space="preserve">a daemon in the Debian guest that takes requests from its virtual reader (vmur) and answers through the punch, so Linux services (Asterisk: </w:t>
+            </w:r>
+            <w:r>
+              <w:rPr>
+                <w:rFonts w:ascii="Courier New" w:cs="Courier New" w:eastAsia="Courier New" w:hAnsi="Courier New"/>
+                <w:sz w:val="19"/>
+                <w:szCs w:val="19"/>
+              </w:rPr>
+              <w:t xml:space="preserve">PHONE</w:t>
+            </w:r>
+            <w:r>
+              <w:rPr>
+                <w:rFonts w:ascii="Times New Roman" w:cs="Times New Roman" w:eastAsia="Times New Roman" w:hAnsi="Times New Roman"/>
+                <w:sz w:val="19"/>
+                <w:szCs w:val="19"/>
+              </w:rPr>
+              <w:t xml:space="preserve">, MQTT, MariaDB) speak the same spool protocol as CHATBOT and SQLSERV</w:t>
             </w:r>
           </w:p>
         </w:tc>
@@ -13382,7 +14218,7 @@
                 <w:sz w:val="19"/>
                 <w:szCs w:val="19"/>
               </w:rPr>
-              <w:t xml:space="preserve">Telephony</w:t>
+              <w:t xml:space="preserve">RXPIPSRV</w:t>
             </w:r>
           </w:p>
         </w:tc>
@@ -13403,7 +14239,23 @@
                 <w:sz w:val="19"/>
                 <w:szCs w:val="19"/>
               </w:rPr>
-              <w:t xml:space="preserve">a gateway from CMS to Asterisk on Debian: place calls, voicemail notices as messages</w:t>
+              <w:t xml:space="preserve">REXX packages from rexxpository (RXPIP) for CMS users: </w:t>
+            </w:r>
+            <w:r>
+              <w:rPr>
+                <w:rFonts w:ascii="Courier New" w:cs="Courier New" w:eastAsia="Courier New" w:hAnsi="Courier New"/>
+                <w:sz w:val="19"/>
+                <w:szCs w:val="19"/>
+              </w:rPr>
+              <w:t xml:space="preserve">RXPIP INSTALL pkg</w:t>
+            </w:r>
+            <w:r>
+              <w:rPr>
+                <w:rFonts w:ascii="Times New Roman" w:cs="Times New Roman" w:eastAsia="Times New Roman" w:hAnsi="Times New Roman"/>
+                <w:sz w:val="19"/>
+                <w:szCs w:val="19"/>
+              </w:rPr>
+              <w:t xml:space="preserve"> through the spool</w:t>
             </w:r>
           </w:p>
         </w:tc>
@@ -13565,7 +14417,7 @@
           <w:sz w:val="18"/>
           <w:szCs w:val="18"/>
         </w:rPr>
-        <w:t xml:space="preserve">Figure 23. </w:t>
+        <w:t xml:space="preserve">Figure 24. </w:t>
       </w:r>
       <w:r>
         <w:rPr>
@@ -13803,7 +14655,7 @@
           <w:sz w:val="18"/>
           <w:szCs w:val="18"/>
         </w:rPr>
-        <w:t xml:space="preserve">Figure 24. </w:t>
+        <w:t xml:space="preserve">Figure 25. </w:t>
       </w:r>
       <w:r>
         <w:rPr>
@@ -14213,7 +15065,7 @@
           <w:sz w:val="18"/>
           <w:szCs w:val="18"/>
         </w:rPr>
-        <w:t xml:space="preserve">Figure 25. </w:t>
+        <w:t xml:space="preserve">Figure 26. </w:t>
       </w:r>
       <w:r>
         <w:rPr>
@@ -14478,7 +15330,7 @@
           <w:sz w:val="18"/>
           <w:szCs w:val="18"/>
         </w:rPr>
-        <w:t xml:space="preserve">Figure 26. </w:t>
+        <w:t xml:space="preserve">Figure 27. </w:t>
       </w:r>
       <w:r>
         <w:rPr>
@@ -15552,7 +16404,7 @@
           <w:sz w:val="18"/>
           <w:szCs w:val="18"/>
         </w:rPr>
-        <w:t xml:space="preserve">Figure 27. </w:t>
+        <w:t xml:space="preserve">Figure 28. </w:t>
       </w:r>
       <w:r>
         <w:rPr>
@@ -16182,7 +17034,7 @@
           <w:sz w:val="18"/>
           <w:szCs w:val="18"/>
         </w:rPr>
-        <w:t xml:space="preserve">Figure 28. </w:t>
+        <w:t xml:space="preserve">Figure 29. </w:t>
       </w:r>
       <w:r>
         <w:rPr>
@@ -16692,7 +17544,7 @@
           <w:sz w:val="18"/>
           <w:szCs w:val="18"/>
         </w:rPr>
-        <w:t xml:space="preserve">Figure 29. </w:t>
+        <w:t xml:space="preserve">Figure 30. </w:t>
       </w:r>
       <w:r>
         <w:rPr>
@@ -16991,7 +17843,7 @@
           <w:sz w:val="18"/>
           <w:szCs w:val="18"/>
         </w:rPr>
-        <w:t xml:space="preserve">Figure 30. </w:t>
+        <w:t xml:space="preserve">Figure 31. </w:t>
       </w:r>
       <w:r>
         <w:rPr>
@@ -17556,7 +18408,7 @@
           <w:sz w:val="18"/>
           <w:szCs w:val="18"/>
         </w:rPr>
-        <w:t xml:space="preserve">Figure 31. </w:t>
+        <w:t xml:space="preserve">Figure 32. </w:t>
       </w:r>
       <w:r>
         <w:rPr>
@@ -17703,7 +18555,7 @@
           <w:sz w:val="18"/>
           <w:szCs w:val="18"/>
         </w:rPr>
-        <w:t xml:space="preserve">Figure 32. </w:t>
+        <w:t xml:space="preserve">Figure 33. </w:t>
       </w:r>
       <w:r>
         <w:rPr>
@@ -18079,7 +18931,7 @@
           <w:sz w:val="18"/>
           <w:szCs w:val="18"/>
         </w:rPr>
-        <w:t xml:space="preserve">Figure 33. </w:t>
+        <w:t xml:space="preserve">Figure 34. </w:t>
       </w:r>
       <w:r>
         <w:rPr>
@@ -18592,6 +19444,200 @@
           <w:rFonts w:ascii="Times New Roman" w:cs="Times New Roman" w:eastAsia="Times New Roman" w:hAnsi="Times New Roman"/>
         </w:rPr>
         <w:t xml:space="preserve"> files on an accessed disk.</w:t>
+      </w:r>
+    </w:p>
+    <w:p>
+      <w:pPr>
+        <w:pStyle w:val="Heading2"/>
+      </w:pPr>
+      <w:r>
+        <w:t xml:space="preserve">Pascal</w:t>
+      </w:r>
+    </w:p>
+    <w:p>
+      <w:pPr>
+        <w:spacing w:after="120"/>
+      </w:pPr>
+      <w:r>
+        <w:rPr>
+          <w:rFonts w:ascii="Courier New" w:cs="Courier New" w:eastAsia="Courier New" w:hAnsi="Courier New"/>
+          <w:sz w:val="19"/>
+          <w:szCs w:val="19"/>
+        </w:rPr>
+        <w:t xml:space="preserve">PCPAS fn</w:t>
+      </w:r>
+      <w:r>
+        <w:rPr>
+          <w:rFonts w:ascii="Times New Roman" w:cs="Times New Roman" w:eastAsia="Times New Roman" w:hAnsi="Times New Roman"/>
+        </w:rPr>
+        <w:t xml:space="preserve"> compiles </w:t>
+      </w:r>
+      <w:r>
+        <w:rPr>
+          <w:rFonts w:ascii="Courier New" w:cs="Courier New" w:eastAsia="Courier New" w:hAnsi="Courier New"/>
+          <w:sz w:val="19"/>
+          <w:szCs w:val="19"/>
+        </w:rPr>
+        <w:t xml:space="preserve">fn PASCAL</w:t>
+      </w:r>
+      <w:r>
+        <w:rPr>
+          <w:rFonts w:ascii="Times New Roman" w:cs="Times New Roman" w:eastAsia="Times New Roman" w:hAnsi="Times New Roman"/>
+        </w:rPr>
+        <w:t xml:space="preserve"> with the New Stanford Pascal compiler (2026.10, Bernd Oppolzer) into P-code (</w:t>
+      </w:r>
+      <w:r>
+        <w:rPr>
+          <w:rFonts w:ascii="Courier New" w:cs="Courier New" w:eastAsia="Courier New" w:hAnsi="Courier New"/>
+          <w:sz w:val="19"/>
+          <w:szCs w:val="19"/>
+        </w:rPr>
+        <w:t xml:space="preserve">fn PCODE</w:t>
+      </w:r>
+      <w:r>
+        <w:rPr>
+          <w:rFonts w:ascii="Times New Roman" w:cs="Times New Roman" w:eastAsia="Times New Roman" w:hAnsi="Times New Roman"/>
+        </w:rPr>
+        <w:t xml:space="preserve">), and </w:t>
+      </w:r>
+      <w:r>
+        <w:rPr>
+          <w:rFonts w:ascii="Courier New" w:cs="Courier New" w:eastAsia="Courier New" w:hAnsi="Courier New"/>
+          <w:sz w:val="19"/>
+          <w:szCs w:val="19"/>
+        </w:rPr>
+        <w:t xml:space="preserve">PCRUN fn</w:t>
+      </w:r>
+      <w:r>
+        <w:rPr>
+          <w:rFonts w:ascii="Times New Roman" w:cs="Times New Roman" w:eastAsia="Times New Roman" w:hAnsi="Times New Roman"/>
+        </w:rPr>
+        <w:t xml:space="preserve"> runs it with the P-code interpreter PCINT. Files are passed as </w:t>
+      </w:r>
+      <w:r>
+        <w:rPr>
+          <w:rFonts w:ascii="Courier New" w:cs="Courier New" w:eastAsia="Courier New" w:hAnsi="Courier New"/>
+          <w:sz w:val="19"/>
+          <w:szCs w:val="19"/>
+        </w:rPr>
+        <w:t xml:space="preserve">DD_x=val</w:t>
+      </w:r>
+      <w:r>
+        <w:rPr>
+          <w:rFonts w:ascii="Times New Roman" w:cs="Times New Roman" w:eastAsia="Times New Roman" w:hAnsi="Times New Roman"/>
+        </w:rPr>
+        <w:t xml:space="preserve"> arguments (PCRUN), as the compiler documents. CE’s own Pascal (</w:t>
+      </w:r>
+      <w:r>
+        <w:rPr>
+          <w:rFonts w:ascii="Courier New" w:cs="Courier New" w:eastAsia="Courier New" w:hAnsi="Courier New"/>
+          <w:sz w:val="19"/>
+          <w:szCs w:val="19"/>
+        </w:rPr>
+        <w:t xml:space="preserve">PASCAL</w:t>
+      </w:r>
+      <w:r>
+        <w:rPr>
+          <w:rFonts w:ascii="Times New Roman" w:cs="Times New Roman" w:eastAsia="Times New Roman" w:hAnsi="Times New Roman"/>
+        </w:rPr>
+        <w:t xml:space="preserve"> on the Y disk) is unchanged.</w:t>
+      </w:r>
+    </w:p>
+    <w:p>
+      <w:pPr>
+        <w:pStyle w:val="Heading2"/>
+      </w:pPr>
+      <w:r>
+        <w:t xml:space="preserve">APL</w:t>
+      </w:r>
+    </w:p>
+    <w:p>
+      <w:pPr>
+        <w:spacing w:after="120"/>
+      </w:pPr>
+      <w:r>
+        <w:rPr>
+          <w:rFonts w:ascii="Courier New" w:cs="Courier New" w:eastAsia="Courier New" w:hAnsi="Courier New"/>
+          <w:sz w:val="19"/>
+          <w:szCs w:val="19"/>
+        </w:rPr>
+        <w:t xml:space="preserve">APL fn.apl</w:t>
+      </w:r>
+      <w:r>
+        <w:rPr>
+          <w:rFonts w:ascii="Times New Roman" w:cs="Times New Roman" w:eastAsia="Times New Roman" w:hAnsi="Times New Roman"/>
+        </w:rPr>
+        <w:t xml:space="preserve"> runs an APL script, </w:t>
+      </w:r>
+      <w:r>
+        <w:rPr>
+          <w:rFonts w:ascii="Courier New" w:cs="Courier New" w:eastAsia="Courier New" w:hAnsi="Courier New"/>
+          <w:sz w:val="19"/>
+          <w:szCs w:val="19"/>
+        </w:rPr>
+        <w:t xml:space="preserve">APL</w:t>
+      </w:r>
+      <w:r>
+        <w:rPr>
+          <w:rFonts w:ascii="Times New Roman" w:cs="Times New Roman" w:eastAsia="Times New Roman" w:hAnsi="Times New Roman"/>
+        </w:rPr>
+        <w:t xml:space="preserve"> alone is the interactive session (type </w:t>
+      </w:r>
+      <w:r>
+        <w:rPr>
+          <w:rFonts w:ascii="Courier New" w:cs="Courier New" w:eastAsia="Courier New" w:hAnsi="Courier New"/>
+          <w:sz w:val="19"/>
+          <w:szCs w:val="19"/>
+        </w:rPr>
+        <w:t xml:space="preserve">)OFF</w:t>
+      </w:r>
+      <w:r>
+        <w:rPr>
+          <w:rFonts w:ascii="Times New Roman" w:cs="Times New Roman" w:eastAsia="Times New Roman" w:hAnsi="Times New Roman"/>
+        </w:rPr>
+        <w:t xml:space="preserve"> to leave). It is mikebeer/apl, a C89 APL interpreter that writes primitives as words (</w:t>
+      </w:r>
+      <w:r>
+        <w:rPr>
+          <w:rFonts w:ascii="Courier New" w:cs="Courier New" w:eastAsia="Courier New" w:hAnsi="Courier New"/>
+          <w:sz w:val="19"/>
+          <w:szCs w:val="19"/>
+        </w:rPr>
+        <w:t xml:space="preserve">rho</w:t>
+      </w:r>
+      <w:r>
+        <w:rPr>
+          <w:rFonts w:ascii="Times New Roman" w:cs="Times New Roman" w:eastAsia="Times New Roman" w:hAnsi="Times New Roman"/>
+        </w:rPr>
+        <w:t xml:space="preserve">, </w:t>
+      </w:r>
+      <w:r>
+        <w:rPr>
+          <w:rFonts w:ascii="Courier New" w:cs="Courier New" w:eastAsia="Courier New" w:hAnsi="Courier New"/>
+          <w:sz w:val="19"/>
+          <w:szCs w:val="19"/>
+        </w:rPr>
+        <w:t xml:space="preserve">iota</w:t>
+      </w:r>
+      <w:r>
+        <w:rPr>
+          <w:rFonts w:ascii="Times New Roman" w:cs="Times New Roman" w:eastAsia="Times New Roman" w:hAnsi="Times New Roman"/>
+        </w:rPr>
+        <w:t xml:space="preserve">, ...), so it needs no APL keyboard; the module is </w:t>
+      </w:r>
+      <w:r>
+        <w:rPr>
+          <w:rFonts w:ascii="Courier New" w:cs="Courier New" w:eastAsia="Courier New" w:hAnsi="Courier New"/>
+          <w:sz w:val="19"/>
+          <w:szCs w:val="19"/>
+        </w:rPr>
+        <w:t xml:space="preserve">APLM</w:t>
+      </w:r>
+      <w:r>
+        <w:rPr>
+          <w:rFonts w:ascii="Times New Roman" w:cs="Times New Roman" w:eastAsia="Times New Roman" w:hAnsi="Times New Roman"/>
+        </w:rPr>
+        <w:t xml:space="preserve">.</w:t>
       </w:r>
     </w:p>
     <w:p>
@@ -19106,7 +20152,7 @@
           <w:sz w:val="18"/>
           <w:szCs w:val="18"/>
         </w:rPr>
-        <w:t xml:space="preserve">Figure 34. </w:t>
+        <w:t xml:space="preserve">Figure 35. </w:t>
       </w:r>
       <w:r>
         <w:rPr>
@@ -19218,6 +20264,249 @@
           <w:rFonts w:ascii="Times New Roman" w:cs="Times New Roman" w:eastAsia="Times New Roman" w:hAnsi="Times New Roman"/>
         </w:rPr>
         <w:t xml:space="preserve"> packs binary data. The encoder runs the decoder’s own model and compresses as well as IBM’s SPACK.</w:t>
+      </w:r>
+    </w:p>
+    <w:p>
+      <w:pPr>
+        <w:pStyle w:val="Heading2"/>
+      </w:pPr>
+      <w:r>
+        <w:t xml:space="preserve">File names in C programs</w:t>
+      </w:r>
+    </w:p>
+    <w:p>
+      <w:pPr>
+        <w:spacing w:after="120"/>
+      </w:pPr>
+      <w:r>
+        <w:rPr>
+          <w:rFonts w:ascii="Times New Roman" w:cs="Times New Roman" w:eastAsia="Times New Roman" w:hAnsi="Times New Roman"/>
+        </w:rPr>
+        <w:t xml:space="preserve">Programs built with the CMS runtime (all those of this chapter) use Unix file names and map them to CMS files: </w:t>
+      </w:r>
+      <w:r>
+        <w:rPr>
+          <w:rFonts w:ascii="Courier New" w:cs="Courier New" w:eastAsia="Courier New" w:hAnsi="Courier New"/>
+          <w:sz w:val="19"/>
+          <w:szCs w:val="19"/>
+        </w:rPr>
+        <w:t xml:space="preserve">fn.ft</w:t>
+      </w:r>
+      <w:r>
+        <w:rPr>
+          <w:rFonts w:ascii="Times New Roman" w:cs="Times New Roman" w:eastAsia="Times New Roman" w:hAnsi="Times New Roman"/>
+        </w:rPr>
+        <w:t xml:space="preserve"> is </w:t>
+      </w:r>
+      <w:r>
+        <w:rPr>
+          <w:rFonts w:ascii="Courier New" w:cs="Courier New" w:eastAsia="Courier New" w:hAnsi="Courier New"/>
+          <w:sz w:val="19"/>
+          <w:szCs w:val="19"/>
+        </w:rPr>
+        <w:t xml:space="preserve">fn ft *</w:t>
+      </w:r>
+      <w:r>
+        <w:rPr>
+          <w:rFonts w:ascii="Times New Roman" w:cs="Times New Roman" w:eastAsia="Times New Roman" w:hAnsi="Times New Roman"/>
+        </w:rPr>
+        <w:t xml:space="preserve"> for reading (any accessed disk) and </w:t>
+      </w:r>
+      <w:r>
+        <w:rPr>
+          <w:rFonts w:ascii="Courier New" w:cs="Courier New" w:eastAsia="Courier New" w:hAnsi="Courier New"/>
+          <w:sz w:val="19"/>
+          <w:szCs w:val="19"/>
+        </w:rPr>
+        <w:t xml:space="preserve">fn ft A</w:t>
+      </w:r>
+      <w:r>
+        <w:rPr>
+          <w:rFonts w:ascii="Times New Roman" w:cs="Times New Roman" w:eastAsia="Times New Roman" w:hAnsi="Times New Roman"/>
+        </w:rPr>
+        <w:t xml:space="preserve"> for writing; </w:t>
+      </w:r>
+      <w:r>
+        <w:rPr>
+          <w:rFonts w:ascii="Courier New" w:cs="Courier New" w:eastAsia="Courier New" w:hAnsi="Courier New"/>
+          <w:sz w:val="19"/>
+          <w:szCs w:val="19"/>
+        </w:rPr>
+        <w:t xml:space="preserve">fn.ft.fm</w:t>
+      </w:r>
+      <w:r>
+        <w:rPr>
+          <w:rFonts w:ascii="Times New Roman" w:cs="Times New Roman" w:eastAsia="Times New Roman" w:hAnsi="Times New Roman"/>
+        </w:rPr>
+        <w:t xml:space="preserve"> and </w:t>
+      </w:r>
+      <w:r>
+        <w:rPr>
+          <w:rFonts w:ascii="Courier New" w:cs="Courier New" w:eastAsia="Courier New" w:hAnsi="Courier New"/>
+          <w:sz w:val="19"/>
+          <w:szCs w:val="19"/>
+        </w:rPr>
+        <w:t xml:space="preserve">x/fn.ft</w:t>
+      </w:r>
+      <w:r>
+        <w:rPr>
+          <w:rFonts w:ascii="Times New Roman" w:cs="Times New Roman" w:eastAsia="Times New Roman" w:hAnsi="Times New Roman"/>
+        </w:rPr>
+        <w:t xml:space="preserve"> give the mode; </w:t>
+      </w:r>
+      <w:r>
+        <w:rPr>
+          <w:rFonts w:ascii="Courier New" w:cs="Courier New" w:eastAsia="Courier New" w:hAnsi="Courier New"/>
+          <w:sz w:val="19"/>
+          <w:szCs w:val="19"/>
+        </w:rPr>
+        <w:t xml:space="preserve">/tmp/fn.ft</w:t>
+      </w:r>
+      <w:r>
+        <w:rPr>
+          <w:rFonts w:ascii="Times New Roman" w:cs="Times New Roman" w:eastAsia="Times New Roman" w:hAnsi="Times New Roman"/>
+        </w:rPr>
+        <w:t xml:space="preserve"> is a scratch file on A; a name without a dot is </w:t>
+      </w:r>
+      <w:r>
+        <w:rPr>
+          <w:rFonts w:ascii="Courier New" w:cs="Courier New" w:eastAsia="Courier New" w:hAnsi="Courier New"/>
+          <w:sz w:val="19"/>
+          <w:szCs w:val="19"/>
+        </w:rPr>
+        <w:t xml:space="preserve">FILE name</w:t>
+      </w:r>
+      <w:r>
+        <w:rPr>
+          <w:rFonts w:ascii="Times New Roman" w:cs="Times New Roman" w:eastAsia="Times New Roman" w:hAnsi="Times New Roman"/>
+        </w:rPr>
+        <w:t xml:space="preserve">, as FILEDEF defaults it; parts longer than eight characters are cut to eight. Text files are converted between ASCII and EBCDIC (IBM-1047); file types such as </w:t>
+      </w:r>
+      <w:r>
+        <w:rPr>
+          <w:rFonts w:ascii="Courier New" w:cs="Courier New" w:eastAsia="Courier New" w:hAnsi="Courier New"/>
+          <w:sz w:val="19"/>
+          <w:szCs w:val="19"/>
+        </w:rPr>
+        <w:t xml:space="preserve">O</w:t>
+      </w:r>
+      <w:r>
+        <w:rPr>
+          <w:rFonts w:ascii="Times New Roman" w:cs="Times New Roman" w:eastAsia="Times New Roman" w:hAnsi="Times New Roman"/>
+        </w:rPr>
+        <w:t xml:space="preserve">, </w:t>
+      </w:r>
+      <w:r>
+        <w:rPr>
+          <w:rFonts w:ascii="Courier New" w:cs="Courier New" w:eastAsia="Courier New" w:hAnsi="Courier New"/>
+          <w:sz w:val="19"/>
+          <w:szCs w:val="19"/>
+        </w:rPr>
+        <w:t xml:space="preserve">TEXT</w:t>
+      </w:r>
+      <w:r>
+        <w:rPr>
+          <w:rFonts w:ascii="Times New Roman" w:cs="Times New Roman" w:eastAsia="Times New Roman" w:hAnsi="Times New Roman"/>
+        </w:rPr>
+        <w:t xml:space="preserve">, </w:t>
+      </w:r>
+      <w:r>
+        <w:rPr>
+          <w:rFonts w:ascii="Courier New" w:cs="Courier New" w:eastAsia="Courier New" w:hAnsi="Courier New"/>
+          <w:sz w:val="19"/>
+          <w:szCs w:val="19"/>
+        </w:rPr>
+        <w:t xml:space="preserve">TAR</w:t>
+      </w:r>
+      <w:r>
+        <w:rPr>
+          <w:rFonts w:ascii="Times New Roman" w:cs="Times New Roman" w:eastAsia="Times New Roman" w:hAnsi="Times New Roman"/>
+        </w:rPr>
+        <w:t xml:space="preserve">, </w:t>
+      </w:r>
+      <w:r>
+        <w:rPr>
+          <w:rFonts w:ascii="Courier New" w:cs="Courier New" w:eastAsia="Courier New" w:hAnsi="Courier New"/>
+          <w:sz w:val="19"/>
+          <w:szCs w:val="19"/>
+        </w:rPr>
+        <w:t xml:space="preserve">ZIP</w:t>
+      </w:r>
+      <w:r>
+        <w:rPr>
+          <w:rFonts w:ascii="Times New Roman" w:cs="Times New Roman" w:eastAsia="Times New Roman" w:hAnsi="Times New Roman"/>
+        </w:rPr>
+        <w:t xml:space="preserve">, </w:t>
+      </w:r>
+      <w:r>
+        <w:rPr>
+          <w:rFonts w:ascii="Courier New" w:cs="Courier New" w:eastAsia="Courier New" w:hAnsi="Courier New"/>
+          <w:sz w:val="19"/>
+          <w:szCs w:val="19"/>
+        </w:rPr>
+        <w:t xml:space="preserve">GZ</w:t>
+      </w:r>
+      <w:r>
+        <w:rPr>
+          <w:rFonts w:ascii="Times New Roman" w:cs="Times New Roman" w:eastAsia="Times New Roman" w:hAnsi="Times New Roman"/>
+        </w:rPr>
+        <w:t xml:space="preserve">, </w:t>
+      </w:r>
+      <w:r>
+        <w:rPr>
+          <w:rFonts w:ascii="Courier New" w:cs="Courier New" w:eastAsia="Courier New" w:hAnsi="Courier New"/>
+          <w:sz w:val="19"/>
+          <w:szCs w:val="19"/>
+        </w:rPr>
+        <w:t xml:space="preserve">DB</w:t>
+      </w:r>
+      <w:r>
+        <w:rPr>
+          <w:rFonts w:ascii="Times New Roman" w:cs="Times New Roman" w:eastAsia="Times New Roman" w:hAnsi="Times New Roman"/>
+        </w:rPr>
+        <w:t xml:space="preserve">, </w:t>
+      </w:r>
+      <w:r>
+        <w:rPr>
+          <w:rFonts w:ascii="Courier New" w:cs="Courier New" w:eastAsia="Courier New" w:hAnsi="Courier New"/>
+          <w:sz w:val="19"/>
+          <w:szCs w:val="19"/>
+        </w:rPr>
+        <w:t xml:space="preserve">DBF</w:t>
+      </w:r>
+      <w:r>
+        <w:rPr>
+          <w:rFonts w:ascii="Times New Roman" w:cs="Times New Roman" w:eastAsia="Times New Roman" w:hAnsi="Times New Roman"/>
+        </w:rPr>
+        <w:t xml:space="preserve"> and </w:t>
+      </w:r>
+      <w:r>
+        <w:rPr>
+          <w:rFonts w:ascii="Courier New" w:cs="Courier New" w:eastAsia="Courier New" w:hAnsi="Courier New"/>
+          <w:sz w:val="19"/>
+          <w:szCs w:val="19"/>
+        </w:rPr>
+        <w:t xml:space="preserve">BIN</w:t>
+      </w:r>
+      <w:r>
+        <w:rPr>
+          <w:rFonts w:ascii="Times New Roman" w:cs="Times New Roman" w:eastAsia="Times New Roman" w:hAnsi="Times New Roman"/>
+        </w:rPr>
+        <w:t xml:space="preserve"> are binary and passed through unchanged. Absolute paths under </w:t>
+      </w:r>
+      <w:r>
+        <w:rPr>
+          <w:rFonts w:ascii="Courier New" w:cs="Courier New" w:eastAsia="Courier New" w:hAnsi="Courier New"/>
+          <w:sz w:val="19"/>
+          <w:szCs w:val="19"/>
+        </w:rPr>
+        <w:t xml:space="preserve">/usr</w:t>
+      </w:r>
+      <w:r>
+        <w:rPr>
+          <w:rFonts w:ascii="Times New Roman" w:cs="Times New Roman" w:eastAsia="Times New Roman" w:hAnsi="Times New Roman"/>
+        </w:rPr>
+        <w:t xml:space="preserve"> are read from SYSROOT TAR. File dates come from the CMS file status table.</w:t>
       </w:r>
     </w:p>
     <w:p>
@@ -19642,7 +20931,7 @@
           <w:sz w:val="18"/>
           <w:szCs w:val="18"/>
         </w:rPr>
-        <w:t xml:space="preserve">Figure 35. </w:t>
+        <w:t xml:space="preserve">Figure 36. </w:t>
       </w:r>
       <w:r>
         <w:rPr>
@@ -19776,7 +21065,7 @@
           <w:sz w:val="18"/>
           <w:szCs w:val="18"/>
         </w:rPr>
-        <w:t xml:space="preserve">Figure 36. </w:t>
+        <w:t xml:space="preserve">Figure 37. </w:t>
       </w:r>
       <w:r>
         <w:rPr>
@@ -20496,6 +21785,310 @@
                 <w:sz w:val="19"/>
                 <w:szCs w:val="19"/>
               </w:rPr>
+              <w:t xml:space="preserve">C and C++ on CMS</w:t>
+            </w:r>
+          </w:p>
+        </w:tc>
+        <w:tc>
+          <w:tcPr>
+            <w:tcW w:type="dxa" w:w="7238"/>
+            <w:tcMar>
+              <w:top w:type="dxa" w:w="60"/>
+              <w:left w:type="dxa" w:w="100"/>
+              <w:bottom w:type="dxa" w:w="60"/>
+              <w:right w:type="dxa" w:w="100"/>
+            </w:tcMar>
+          </w:tcPr>
+          <w:p>
+            <w:r>
+              <w:rPr>
+                <w:rFonts w:ascii="Times New Roman" w:cs="Times New Roman" w:eastAsia="Times New Roman" w:hAnsi="Times New Roman"/>
+                <w:sz w:val="19"/>
+                <w:szCs w:val="19"/>
+              </w:rPr>
+              <w:t xml:space="preserve">No C++ exceptions (a </w:t>
+            </w:r>
+            <w:r>
+              <w:rPr>
+                <w:rFonts w:ascii="Courier New" w:cs="Courier New" w:eastAsia="Courier New" w:hAnsi="Courier New"/>
+                <w:sz w:val="19"/>
+                <w:szCs w:val="19"/>
+              </w:rPr>
+              <w:t xml:space="preserve">throw</w:t>
+            </w:r>
+            <w:r>
+              <w:rPr>
+                <w:rFonts w:ascii="Times New Roman" w:cs="Times New Roman" w:eastAsia="Times New Roman" w:hAnsi="Times New Roman"/>
+                <w:sz w:val="19"/>
+                <w:szCs w:val="19"/>
+              </w:rPr>
+              <w:t xml:space="preserve"> ends the program), no threads, only the "C" locale. A compile needs </w:t>
+            </w:r>
+            <w:r>
+              <w:rPr>
+                <w:rFonts w:ascii="Courier New" w:cs="Courier New" w:eastAsia="Courier New" w:hAnsi="Courier New"/>
+                <w:sz w:val="19"/>
+                <w:szCs w:val="19"/>
+              </w:rPr>
+              <w:t xml:space="preserve">CP DEFINE STORAGE 256M</w:t>
+            </w:r>
+            <w:r>
+              <w:rPr>
+                <w:rFonts w:ascii="Times New Roman" w:cs="Times New Roman" w:eastAsia="Times New Roman" w:hAnsi="Times New Roman"/>
+                <w:sz w:val="19"/>
+                <w:szCs w:val="19"/>
+              </w:rPr>
+              <w:t xml:space="preserve">; cc1plus takes one to two minutes of CPU.</w:t>
+            </w:r>
+          </w:p>
+        </w:tc>
+      </w:tr>
+      <w:tr>
+        <w:trPr>
+          <w:cantSplit/>
+          <w:tblHeader w:val="false"/>
+        </w:trPr>
+        <w:tc>
+          <w:tcPr>
+            <w:tcW w:type="dxa" w:w="2400"/>
+            <w:tcMar>
+              <w:top w:type="dxa" w:w="60"/>
+              <w:left w:type="dxa" w:w="100"/>
+              <w:bottom w:type="dxa" w:w="60"/>
+              <w:right w:type="dxa" w:w="100"/>
+            </w:tcMar>
+          </w:tcPr>
+          <w:p>
+            <w:r>
+              <w:rPr>
+                <w:rFonts w:ascii="Times New Roman" w:cs="Times New Roman" w:eastAsia="Times New Roman" w:hAnsi="Times New Roman"/>
+                <w:sz w:val="19"/>
+                <w:szCs w:val="19"/>
+              </w:rPr>
+              <w:t xml:space="preserve">Language disk</w:t>
+            </w:r>
+          </w:p>
+        </w:tc>
+        <w:tc>
+          <w:tcPr>
+            <w:tcW w:type="dxa" w:w="7238"/>
+            <w:tcMar>
+              <w:top w:type="dxa" w:w="60"/>
+              <w:left w:type="dxa" w:w="100"/>
+              <w:bottom w:type="dxa" w:w="60"/>
+              <w:right w:type="dxa" w:w="100"/>
+            </w:tcMar>
+          </w:tcPr>
+          <w:p>
+            <w:r>
+              <w:rPr>
+                <w:rFonts w:ascii="Times New Roman" w:cs="Times New Roman" w:eastAsia="Times New Roman" w:hAnsi="Times New Roman"/>
+                <w:sz w:val="19"/>
+                <w:szCs w:val="19"/>
+              </w:rPr>
+              <w:t xml:space="preserve">An old copy of an EXEC or MODULE of the same name on one of your own disks comes first in the search order (PLIC, COBOL, APL ...); erase it.</w:t>
+            </w:r>
+          </w:p>
+        </w:tc>
+      </w:tr>
+      <w:tr>
+        <w:trPr>
+          <w:cantSplit/>
+          <w:tblHeader w:val="false"/>
+        </w:trPr>
+        <w:tc>
+          <w:tcPr>
+            <w:tcW w:type="dxa" w:w="2400"/>
+            <w:tcMar>
+              <w:top w:type="dxa" w:w="60"/>
+              <w:left w:type="dxa" w:w="100"/>
+              <w:bottom w:type="dxa" w:w="60"/>
+              <w:right w:type="dxa" w:w="100"/>
+            </w:tcMar>
+          </w:tcPr>
+          <w:p>
+            <w:r>
+              <w:rPr>
+                <w:rFonts w:ascii="Times New Roman" w:cs="Times New Roman" w:eastAsia="Times New Roman" w:hAnsi="Times New Roman"/>
+                <w:sz w:val="19"/>
+                <w:szCs w:val="19"/>
+              </w:rPr>
+              <w:t xml:space="preserve">ZIP, GZIP</w:t>
+            </w:r>
+          </w:p>
+        </w:tc>
+        <w:tc>
+          <w:tcPr>
+            <w:tcW w:type="dxa" w:w="7238"/>
+            <w:tcMar>
+              <w:top w:type="dxa" w:w="60"/>
+              <w:left w:type="dxa" w:w="100"/>
+              <w:bottom w:type="dxa" w:w="60"/>
+              <w:right w:type="dxa" w:w="100"/>
+            </w:tcMar>
+          </w:tcPr>
+          <w:p>
+            <w:r>
+              <w:rPr>
+                <w:rFonts w:ascii="Times New Roman" w:cs="Times New Roman" w:eastAsia="Times New Roman" w:hAnsi="Times New Roman"/>
+                <w:sz w:val="19"/>
+                <w:szCs w:val="19"/>
+              </w:rPr>
+              <w:t xml:space="preserve">No encryption. A file extracted from a .zip is text unless its file type is binary. GZIP writes </w:t>
+            </w:r>
+            <w:r>
+              <w:rPr>
+                <w:rFonts w:ascii="Courier New" w:cs="Courier New" w:eastAsia="Courier New" w:hAnsi="Courier New"/>
+                <w:sz w:val="19"/>
+                <w:szCs w:val="19"/>
+              </w:rPr>
+              <w:t xml:space="preserve">fn ft-GZ</w:t>
+            </w:r>
+            <w:r>
+              <w:rPr>
+                <w:rFonts w:ascii="Times New Roman" w:cs="Times New Roman" w:eastAsia="Times New Roman" w:hAnsi="Times New Roman"/>
+                <w:sz w:val="19"/>
+                <w:szCs w:val="19"/>
+              </w:rPr>
+              <w:t xml:space="preserve"> (CMS has no second dot).</w:t>
+            </w:r>
+          </w:p>
+        </w:tc>
+      </w:tr>
+      <w:tr>
+        <w:trPr>
+          <w:cantSplit/>
+          <w:tblHeader w:val="false"/>
+        </w:trPr>
+        <w:tc>
+          <w:tcPr>
+            <w:tcW w:type="dxa" w:w="2400"/>
+            <w:tcMar>
+              <w:top w:type="dxa" w:w="60"/>
+              <w:left w:type="dxa" w:w="100"/>
+              <w:bottom w:type="dxa" w:w="60"/>
+              <w:right w:type="dxa" w:w="100"/>
+            </w:tcMar>
+          </w:tcPr>
+          <w:p>
+            <w:r>
+              <w:rPr>
+                <w:rFonts w:ascii="Times New Roman" w:cs="Times New Roman" w:eastAsia="Times New Roman" w:hAnsi="Times New Roman"/>
+                <w:sz w:val="19"/>
+                <w:szCs w:val="19"/>
+              </w:rPr>
+              <w:t xml:space="preserve">TERSE</w:t>
+            </w:r>
+          </w:p>
+        </w:tc>
+        <w:tc>
+          <w:tcPr>
+            <w:tcW w:type="dxa" w:w="7238"/>
+            <w:tcMar>
+              <w:top w:type="dxa" w:w="60"/>
+              <w:left w:type="dxa" w:w="100"/>
+              <w:bottom w:type="dxa" w:w="60"/>
+              <w:right w:type="dxa" w:w="100"/>
+            </w:tcMar>
+          </w:tcPr>
+          <w:p>
+            <w:r>
+              <w:rPr>
+                <w:rFonts w:ascii="Times New Roman" w:cs="Times New Roman" w:eastAsia="Times New Roman" w:hAnsi="Times New Roman"/>
+                <w:sz w:val="19"/>
+                <w:szCs w:val="19"/>
+              </w:rPr>
+              <w:t xml:space="preserve">Files packed by TERSE read back with UNTERSE; that z/OS AMATERSE reads them has not been tested yet.</w:t>
+            </w:r>
+          </w:p>
+        </w:tc>
+      </w:tr>
+      <w:tr>
+        <w:trPr>
+          <w:cantSplit/>
+          <w:tblHeader w:val="false"/>
+        </w:trPr>
+        <w:tc>
+          <w:tcPr>
+            <w:tcW w:type="dxa" w:w="2400"/>
+            <w:tcMar>
+              <w:top w:type="dxa" w:w="60"/>
+              <w:left w:type="dxa" w:w="100"/>
+              <w:bottom w:type="dxa" w:w="60"/>
+              <w:right w:type="dxa" w:w="100"/>
+            </w:tcMar>
+          </w:tcPr>
+          <w:p>
+            <w:r>
+              <w:rPr>
+                <w:rFonts w:ascii="Times New Roman" w:cs="Times New Roman" w:eastAsia="Times New Roman" w:hAnsi="Times New Roman"/>
+                <w:sz w:val="19"/>
+                <w:szCs w:val="19"/>
+              </w:rPr>
+              <w:t xml:space="preserve">Smalltalk, xBase</w:t>
+            </w:r>
+          </w:p>
+        </w:tc>
+        <w:tc>
+          <w:tcPr>
+            <w:tcW w:type="dxa" w:w="7238"/>
+            <w:tcMar>
+              <w:top w:type="dxa" w:w="60"/>
+              <w:left w:type="dxa" w:w="100"/>
+              <w:bottom w:type="dxa" w:w="60"/>
+              <w:right w:type="dxa" w:w="100"/>
+            </w:tcMar>
+          </w:tcPr>
+          <w:p>
+            <w:r>
+              <w:rPr>
+                <w:rFonts w:ascii="Times New Roman" w:cs="Times New Roman" w:eastAsia="Times New Roman" w:hAnsi="Times New Roman"/>
+                <w:sz w:val="19"/>
+                <w:szCs w:val="19"/>
+              </w:rPr>
+              <w:t xml:space="preserve">With a 32-bit </w:t>
+            </w:r>
+            <w:r>
+              <w:rPr>
+                <w:rFonts w:ascii="Courier New" w:cs="Courier New" w:eastAsia="Courier New" w:hAnsi="Courier New"/>
+                <w:sz w:val="19"/>
+                <w:szCs w:val="19"/>
+              </w:rPr>
+              <w:t xml:space="preserve">long</w:t>
+            </w:r>
+            <w:r>
+              <w:rPr>
+                <w:rFonts w:ascii="Times New Roman" w:cs="Times New Roman" w:eastAsia="Times New Roman" w:hAnsi="Times New Roman"/>
+                <w:sz w:val="19"/>
+                <w:szCs w:val="19"/>
+              </w:rPr>
+              <w:t xml:space="preserve">, Smalltalk SmallIntegers are ±2^30 (larger ones are big integers); CMS has no directories.</w:t>
+            </w:r>
+          </w:p>
+        </w:tc>
+      </w:tr>
+      <w:tr>
+        <w:trPr>
+          <w:cantSplit/>
+          <w:tblHeader w:val="false"/>
+        </w:trPr>
+        <w:tc>
+          <w:tcPr>
+            <w:tcW w:type="dxa" w:w="2400"/>
+            <w:tcMar>
+              <w:top w:type="dxa" w:w="60"/>
+              <w:left w:type="dxa" w:w="100"/>
+              <w:bottom w:type="dxa" w:w="60"/>
+              <w:right w:type="dxa" w:w="100"/>
+            </w:tcMar>
+          </w:tcPr>
+          <w:p>
+            <w:r>
+              <w:rPr>
+                <w:rFonts w:ascii="Times New Roman" w:cs="Times New Roman" w:eastAsia="Times New Roman" w:hAnsi="Times New Roman"/>
+                <w:sz w:val="19"/>
+                <w:szCs w:val="19"/>
+              </w:rPr>
               <w:t xml:space="preserve">Linux</w:t>
             </w:r>
           </w:p>
@@ -20535,7 +22128,7 @@
           <w:sz w:val="18"/>
           <w:szCs w:val="18"/>
         </w:rPr>
-        <w:t xml:space="preserve">Figure 37. </w:t>
+        <w:t xml:space="preserve">Figure 38. </w:t>
       </w:r>
       <w:r>
         <w:rPr>
@@ -20634,7 +22227,7 @@
           <w:sz w:val="18"/>
           <w:szCs w:val="18"/>
         </w:rPr>
-        <w:t xml:space="preserve">Figure 38. </w:t>
+        <w:t xml:space="preserve">Figure 39. </w:t>
       </w:r>
       <w:r>
         <w:rPr>
@@ -20777,7 +22370,7 @@
           <w:sz w:val="18"/>
           <w:szCs w:val="18"/>
         </w:rPr>
-        <w:t xml:space="preserve">Figure 39. </w:t>
+        <w:t xml:space="preserve">Figure 40. </w:t>
       </w:r>
       <w:r>
         <w:rPr>
@@ -21049,7 +22642,7 @@
           <w:sz w:val="18"/>
           <w:szCs w:val="18"/>
         </w:rPr>
-        <w:t xml:space="preserve">Figure 40. </w:t>
+        <w:t xml:space="preserve">Figure 41. </w:t>
       </w:r>
       <w:r>
         <w:rPr>
@@ -21291,7 +22884,7 @@
           <w:sz w:val="18"/>
           <w:szCs w:val="18"/>
         </w:rPr>
-        <w:t xml:space="preserve">Figure 41. </w:t>
+        <w:t xml:space="preserve">Figure 42. </w:t>
       </w:r>
       <w:r>
         <w:rPr>
@@ -21368,7 +22961,7 @@
           <w:sz w:val="18"/>
           <w:szCs w:val="18"/>
         </w:rPr>
-        <w:t xml:space="preserve">Figure 42. </w:t>
+        <w:t xml:space="preserve">Figure 43. </w:t>
       </w:r>
       <w:r>
         <w:rPr>
@@ -21498,7 +23091,7 @@
           <w:sz w:val="18"/>
           <w:szCs w:val="18"/>
         </w:rPr>
-        <w:t xml:space="preserve">Figure 43. </w:t>
+        <w:t xml:space="preserve">Figure 44. </w:t>
       </w:r>
       <w:r>
         <w:rPr>
@@ -21672,7 +23265,7 @@
           <w:sz w:val="18"/>
           <w:szCs w:val="18"/>
         </w:rPr>
-        <w:t xml:space="preserve">Figure 44. </w:t>
+        <w:t xml:space="preserve">Figure 45. </w:t>
       </w:r>
       <w:r>
         <w:rPr>
@@ -21762,7 +23355,7 @@
           <w:sz w:val="18"/>
           <w:szCs w:val="18"/>
         </w:rPr>
-        <w:t xml:space="preserve">Figure 45. </w:t>
+        <w:t xml:space="preserve">Figure 46. </w:t>
       </w:r>
       <w:r>
         <w:rPr>
@@ -22509,7 +24102,7 @@
           <w:sz w:val="18"/>
           <w:szCs w:val="18"/>
         </w:rPr>
-        <w:t xml:space="preserve">Figure 46. </w:t>
+        <w:t xml:space="preserve">Figure 47. </w:t>
       </w:r>
       <w:r>
         <w:rPr>
@@ -22611,7 +24204,7 @@
           <w:sz w:val="18"/>
           <w:szCs w:val="18"/>
         </w:rPr>
-        <w:t xml:space="preserve">Figure 47. </w:t>
+        <w:t xml:space="preserve">Figure 48. </w:t>
       </w:r>
       <w:r>
         <w:rPr>
@@ -22786,7 +24379,7 @@
           <w:sz w:val="18"/>
           <w:szCs w:val="18"/>
         </w:rPr>
-        <w:t xml:space="preserve">Figure 48. </w:t>
+        <w:t xml:space="preserve">Figure 49. </w:t>
       </w:r>
       <w:r>
         <w:rPr>
@@ -22863,7 +24456,7 @@
           <w:sz w:val="18"/>
           <w:szCs w:val="18"/>
         </w:rPr>
-        <w:t xml:space="preserve">Figure 49. </w:t>
+        <w:t xml:space="preserve">Figure 50. </w:t>
       </w:r>
       <w:r>
         <w:rPr>
@@ -23143,7 +24736,7 @@
           <w:sz w:val="18"/>
           <w:szCs w:val="18"/>
         </w:rPr>
-        <w:t xml:space="preserve">Figure 50. </w:t>
+        <w:t xml:space="preserve">Figure 51. </w:t>
       </w:r>
       <w:r>
         <w:rPr>
@@ -23272,7 +24865,7 @@
           <w:sz w:val="18"/>
           <w:szCs w:val="18"/>
         </w:rPr>
-        <w:t xml:space="preserve">Figure 51. </w:t>
+        <w:t xml:space="preserve">Figure 52. </w:t>
       </w:r>
       <w:r>
         <w:rPr>
@@ -23504,7 +25097,7 @@
           <w:sz w:val="18"/>
           <w:szCs w:val="18"/>
         </w:rPr>
-        <w:t xml:space="preserve">Figure 52. </w:t>
+        <w:t xml:space="preserve">Figure 53. </w:t>
       </w:r>
       <w:r>
         <w:rPr>
@@ -23552,6 +25145,254 @@
           <w:rFonts w:ascii="Times New Roman" w:cs="Times New Roman" w:eastAsia="Times New Roman" w:hAnsi="Times New Roman"/>
         </w:rPr>
         <w:t xml:space="preserve">) when they are set.</w:t>
+      </w:r>
+    </w:p>
+    <w:p>
+      <w:pPr>
+        <w:pStyle w:val="Heading2"/>
+      </w:pPr>
+      <w:r>
+        <w:t xml:space="preserve">LANG</w:t>
+      </w:r>
+    </w:p>
+    <w:p>
+      <w:pPr>
+        <w:spacing w:after="120"/>
+      </w:pPr>
+      <w:r>
+        <w:rPr>
+          <w:rFonts w:ascii="Courier New" w:cs="Courier New" w:eastAsia="Courier New" w:hAnsi="Courier New"/>
+          <w:sz w:val="19"/>
+          <w:szCs w:val="19"/>
+        </w:rPr>
+        <w:t xml:space="preserve">LANG [fm]</w:t>
+      </w:r>
+      <w:r>
+        <w:rPr>
+          <w:rFonts w:ascii="Times New Roman" w:cs="Times New Roman" w:eastAsia="Times New Roman" w:hAnsi="Times New Roman"/>
+        </w:rPr>
+        <w:t xml:space="preserve"> links MAINT 19F read-only (if it is not linked) and accesses it as </w:t>
+      </w:r>
+      <w:r>
+        <w:rPr>
+          <w:rFonts w:ascii="Courier New" w:cs="Courier New" w:eastAsia="Courier New" w:hAnsi="Courier New"/>
+          <w:sz w:val="19"/>
+          <w:szCs w:val="19"/>
+        </w:rPr>
+        <w:t xml:space="preserve">fm</w:t>
+      </w:r>
+      <w:r>
+        <w:rPr>
+          <w:rFonts w:ascii="Times New Roman" w:cs="Times New Roman" w:eastAsia="Times New Roman" w:hAnsi="Times New Roman"/>
+        </w:rPr>
+        <w:t xml:space="preserve"> (default L).</w:t>
+      </w:r>
+    </w:p>
+    <w:p>
+      <w:pPr>
+        <w:pStyle w:val="Heading2"/>
+      </w:pPr>
+      <w:r>
+        <w:t xml:space="preserve">ZIP, UNZIP, GZIP</w:t>
+      </w:r>
+    </w:p>
+    <w:p>
+      <w:pPr>
+        <w:spacing w:after="120"/>
+      </w:pPr>
+      <w:r>
+        <w:rPr>
+          <w:rFonts w:ascii="Courier New" w:cs="Courier New" w:eastAsia="Courier New" w:hAnsi="Courier New"/>
+          <w:sz w:val="19"/>
+          <w:szCs w:val="19"/>
+        </w:rPr>
+        <w:t xml:space="preserve">ZIP zipfile files</w:t>
+      </w:r>
+      <w:r>
+        <w:rPr>
+          <w:rFonts w:ascii="Times New Roman" w:cs="Times New Roman" w:eastAsia="Times New Roman" w:hAnsi="Times New Roman"/>
+        </w:rPr>
+        <w:t xml:space="preserve">, </w:t>
+      </w:r>
+      <w:r>
+        <w:rPr>
+          <w:rFonts w:ascii="Courier New" w:cs="Courier New" w:eastAsia="Courier New" w:hAnsi="Courier New"/>
+          <w:sz w:val="19"/>
+          <w:szCs w:val="19"/>
+        </w:rPr>
+        <w:t xml:space="preserve">UNZIP [-l|-t|-o] zipfile [files]</w:t>
+      </w:r>
+      <w:r>
+        <w:rPr>
+          <w:rFonts w:ascii="Times New Roman" w:cs="Times New Roman" w:eastAsia="Times New Roman" w:hAnsi="Times New Roman"/>
+        </w:rPr>
+        <w:t xml:space="preserve">, </w:t>
+      </w:r>
+      <w:r>
+        <w:rPr>
+          <w:rFonts w:ascii="Courier New" w:cs="Courier New" w:eastAsia="Courier New" w:hAnsi="Courier New"/>
+          <w:sz w:val="19"/>
+          <w:szCs w:val="19"/>
+        </w:rPr>
+        <w:t xml:space="preserve">GZIP [-d] fn.ft</w:t>
+      </w:r>
+      <w:r>
+        <w:rPr>
+          <w:rFonts w:ascii="Times New Roman" w:cs="Times New Roman" w:eastAsia="Times New Roman" w:hAnsi="Times New Roman"/>
+        </w:rPr>
+        <w:t xml:space="preserve"> (Info-ZIP zip 3.0 and unzip 6.0; gzip format from zlib).</w:t>
+      </w:r>
+    </w:p>
+    <w:p>
+      <w:pPr>
+        <w:pStyle w:val="Heading2"/>
+      </w:pPr>
+      <w:r>
+        <w:t xml:space="preserve">TERSE, UNTERSE</w:t>
+      </w:r>
+    </w:p>
+    <w:p>
+      <w:pPr>
+        <w:spacing w:after="120"/>
+      </w:pPr>
+      <w:r>
+        <w:rPr>
+          <w:rFonts w:ascii="Courier New" w:cs="Courier New" w:eastAsia="Courier New" w:hAnsi="Courier New"/>
+          <w:sz w:val="19"/>
+          <w:szCs w:val="19"/>
+        </w:rPr>
+        <w:t xml:space="preserve">TERSE [-v] [-l lrecl] in out</w:t>
+      </w:r>
+      <w:r>
+        <w:rPr>
+          <w:rFonts w:ascii="Times New Roman" w:cs="Times New Roman" w:eastAsia="Times New Roman" w:hAnsi="Times New Roman"/>
+        </w:rPr>
+        <w:t xml:space="preserve"> packs a file in IBM TERSE SPACK format (</w:t>
+      </w:r>
+      <w:r>
+        <w:rPr>
+          <w:rFonts w:ascii="Courier New" w:cs="Courier New" w:eastAsia="Courier New" w:hAnsi="Courier New"/>
+          <w:sz w:val="19"/>
+          <w:szCs w:val="19"/>
+        </w:rPr>
+        <w:t xml:space="preserve">-b</w:t>
+      </w:r>
+      <w:r>
+        <w:rPr>
+          <w:rFonts w:ascii="Times New Roman" w:cs="Times New Roman" w:eastAsia="Times New Roman" w:hAnsi="Times New Roman"/>
+        </w:rPr>
+        <w:t xml:space="preserve"> binary); </w:t>
+      </w:r>
+      <w:r>
+        <w:rPr>
+          <w:rFonts w:ascii="Courier New" w:cs="Courier New" w:eastAsia="Courier New" w:hAnsi="Courier New"/>
+          <w:sz w:val="19"/>
+          <w:szCs w:val="19"/>
+        </w:rPr>
+        <w:t xml:space="preserve">UNTERSE [-b] in out</w:t>
+      </w:r>
+      <w:r>
+        <w:rPr>
+          <w:rFonts w:ascii="Times New Roman" w:cs="Times New Roman" w:eastAsia="Times New Roman" w:hAnsi="Times New Roman"/>
+        </w:rPr>
+        <w:t xml:space="preserve"> unpacks PACK and SPACK files, </w:t>
+      </w:r>
+      <w:r>
+        <w:rPr>
+          <w:rFonts w:ascii="Courier New" w:cs="Courier New" w:eastAsia="Courier New" w:hAnsi="Courier New"/>
+          <w:sz w:val="19"/>
+          <w:szCs w:val="19"/>
+        </w:rPr>
+        <w:t xml:space="preserve">UNTERSE -i in</w:t>
+      </w:r>
+      <w:r>
+        <w:rPr>
+          <w:rFonts w:ascii="Times New Roman" w:cs="Times New Roman" w:eastAsia="Times New Roman" w:hAnsi="Times New Roman"/>
+        </w:rPr>
+        <w:t xml:space="preserve"> shows the header.</w:t>
+      </w:r>
+    </w:p>
+    <w:p>
+      <w:pPr>
+        <w:pStyle w:val="Heading2"/>
+      </w:pPr>
+      <w:r>
+        <w:t xml:space="preserve">SQL, SQLSERV</w:t>
+      </w:r>
+    </w:p>
+    <w:p>
+      <w:pPr>
+        <w:spacing w:after="120"/>
+      </w:pPr>
+      <w:r>
+        <w:rPr>
+          <w:rFonts w:ascii="Courier New" w:cs="Courier New" w:eastAsia="Courier New" w:hAnsi="Courier New"/>
+          <w:sz w:val="19"/>
+          <w:szCs w:val="19"/>
+        </w:rPr>
+        <w:t xml:space="preserve">SQL db statement</w:t>
+      </w:r>
+      <w:r>
+        <w:rPr>
+          <w:rFonts w:ascii="Times New Roman" w:cs="Times New Roman" w:eastAsia="Times New Roman" w:hAnsi="Times New Roman"/>
+        </w:rPr>
+        <w:t xml:space="preserve">, </w:t>
+      </w:r>
+      <w:r>
+        <w:rPr>
+          <w:rFonts w:ascii="Courier New" w:cs="Courier New" w:eastAsia="Courier New" w:hAnsi="Courier New"/>
+          <w:sz w:val="19"/>
+          <w:szCs w:val="19"/>
+        </w:rPr>
+        <w:t xml:space="preserve">SQL db (FILE fn ft fm</w:t>
+      </w:r>
+      <w:r>
+        <w:rPr>
+          <w:rFonts w:ascii="Times New Roman" w:cs="Times New Roman" w:eastAsia="Times New Roman" w:hAnsi="Times New Roman"/>
+        </w:rPr>
+        <w:t xml:space="preserve">, </w:t>
+      </w:r>
+      <w:r>
+        <w:rPr>
+          <w:rFonts w:ascii="Courier New" w:cs="Courier New" w:eastAsia="Courier New" w:hAnsi="Courier New"/>
+          <w:sz w:val="19"/>
+          <w:szCs w:val="19"/>
+        </w:rPr>
+        <w:t xml:space="preserve">SQL STOP</w:t>
+      </w:r>
+      <w:r>
+        <w:rPr>
+          <w:rFonts w:ascii="Times New Roman" w:cs="Times New Roman" w:eastAsia="Times New Roman" w:hAnsi="Times New Roman"/>
+        </w:rPr>
+        <w:t xml:space="preserve">, </w:t>
+      </w:r>
+      <w:r>
+        <w:rPr>
+          <w:rFonts w:ascii="Courier New" w:cs="Courier New" w:eastAsia="Courier New" w:hAnsi="Courier New"/>
+          <w:sz w:val="19"/>
+          <w:szCs w:val="19"/>
+        </w:rPr>
+        <w:t xml:space="preserve">(SERVER userid</w:t>
+      </w:r>
+      <w:r>
+        <w:rPr>
+          <w:rFonts w:ascii="Times New Roman" w:cs="Times New Roman" w:eastAsia="Times New Roman" w:hAnsi="Times New Roman"/>
+        </w:rPr>
+        <w:t xml:space="preserve">; </w:t>
+      </w:r>
+      <w:r>
+        <w:rPr>
+          <w:rFonts w:ascii="Courier New" w:cs="Courier New" w:eastAsia="Courier New" w:hAnsi="Courier New"/>
+          <w:sz w:val="19"/>
+          <w:szCs w:val="19"/>
+        </w:rPr>
+        <w:t xml:space="preserve">SQLSERV [(LOUD]</w:t>
+      </w:r>
+      <w:r>
+        <w:rPr>
+          <w:rFonts w:ascii="Times New Roman" w:cs="Times New Roman" w:eastAsia="Times New Roman" w:hAnsi="Times New Roman"/>
+        </w:rPr>
+        <w:t xml:space="preserve"> runs the service machine.</w:t>
       </w:r>
     </w:p>
     <w:p>
@@ -23620,7 +25461,7 @@
           <w:sz w:val="18"/>
           <w:szCs w:val="18"/>
         </w:rPr>
-        <w:t xml:space="preserve">Figure 53. </w:t>
+        <w:t xml:space="preserve">Figure 54. </w:t>
       </w:r>
       <w:r>
         <w:rPr>
@@ -24006,7 +25847,7 @@
                 <w:sz w:val="19"/>
                 <w:szCs w:val="19"/>
               </w:rPr>
-              <w:t xml:space="preserve">the Debian disk, a 3390-9 (after joining parts 6–12)</w:t>
+              <w:t xml:space="preserve">the Debian disk, a 3390-9 (after joining parts 6–13)</w:t>
             </w:r>
           </w:p>
         </w:tc>
@@ -24033,7 +25874,7 @@
                 <w:sz w:val="19"/>
                 <w:szCs w:val="19"/>
               </w:rPr>
-              <w:t xml:space="preserve">README-VM370PLUS.txt</w:t>
+              <w:t xml:space="preserve">disks/lang.cckd</w:t>
             </w:r>
           </w:p>
         </w:tc>
@@ -24054,7 +25895,7 @@
                 <w:sz w:val="19"/>
                 <w:szCs w:val="19"/>
               </w:rPr>
-              <w:t xml:space="preserve">the short form of this manual</w:t>
+              <w:t xml:space="preserve">the language disk VMLANG, a 3380 at address 182 (after joining parts 14–15)</w:t>
             </w:r>
           </w:p>
         </w:tc>
@@ -24081,7 +25922,7 @@
                 <w:sz w:val="19"/>
                 <w:szCs w:val="19"/>
               </w:rPr>
-              <w:t xml:space="preserve">vm370plus/linux/</w:t>
+              <w:t xml:space="preserve">README-VM370PLUS.txt</w:t>
             </w:r>
           </w:p>
         </w:tc>
@@ -24102,7 +25943,7 @@
                 <w:sz w:val="19"/>
                 <w:szCs w:val="19"/>
               </w:rPr>
-              <w:t xml:space="preserve">linux48.rdr, lxparm.rdr, lxparmram.rdr, kernel configuration, patches, initramfs sources, the Debian post-install script</w:t>
+              <w:t xml:space="preserve">the short form of this manual</w:t>
             </w:r>
           </w:p>
         </w:tc>
@@ -24129,7 +25970,7 @@
                 <w:sz w:val="19"/>
                 <w:szCs w:val="19"/>
               </w:rPr>
-              <w:t xml:space="preserve">vm370plus/m5f/</w:t>
+              <w:t xml:space="preserve">vm370plus/linux/</w:t>
             </w:r>
           </w:p>
         </w:tc>
@@ -24150,7 +25991,7 @@
                 <w:sz w:val="19"/>
                 <w:szCs w:val="19"/>
               </w:rPr>
-              <w:t xml:space="preserve">the CMS runtime for cross-compiled 31-bit C programs</w:t>
+              <w:t xml:space="preserve">linux48.rdr, lxparm.rdr, lxparmram.rdr, kernel configuration, patches, initramfs sources, the Debian post-install script</w:t>
             </w:r>
           </w:p>
         </w:tc>
@@ -24177,23 +26018,7 @@
                 <w:sz w:val="19"/>
                 <w:szCs w:val="19"/>
               </w:rPr>
-              <w:t xml:space="preserve">vm370plus/*.EXEC</w:t>
-            </w:r>
-            <w:r>
-              <w:rPr>
-                <w:rFonts w:ascii="Times New Roman" w:cs="Times New Roman" w:eastAsia="Times New Roman" w:hAnsi="Times New Roman"/>
-                <w:sz w:val="19"/>
-                <w:szCs w:val="19"/>
-              </w:rPr>
-              <w:t xml:space="preserve">, </w:t>
-            </w:r>
-            <w:r>
-              <w:rPr>
-                <w:rFonts w:ascii="Courier New" w:cs="Courier New" w:eastAsia="Courier New" w:hAnsi="Courier New"/>
-                <w:sz w:val="19"/>
-                <w:szCs w:val="19"/>
-              </w:rPr>
-              <w:t xml:space="preserve">*.C</w:t>
+              <w:t xml:space="preserve">vm370plus/m5f/</w:t>
             </w:r>
           </w:p>
         </w:tc>
@@ -24214,7 +26039,7 @@
                 <w:sz w:val="19"/>
                 <w:szCs w:val="19"/>
               </w:rPr>
-              <w:t xml:space="preserve">GCC31 EXEC, CRXMAKE EXEC, examples</w:t>
+              <w:t xml:space="preserve">the CMS runtime for cross-compiled 31-bit C programs</w:t>
             </w:r>
           </w:p>
         </w:tc>
@@ -24241,6 +26066,70 @@
                 <w:sz w:val="19"/>
                 <w:szCs w:val="19"/>
               </w:rPr>
+              <w:t xml:space="preserve">vm370plus/*.EXEC</w:t>
+            </w:r>
+            <w:r>
+              <w:rPr>
+                <w:rFonts w:ascii="Times New Roman" w:cs="Times New Roman" w:eastAsia="Times New Roman" w:hAnsi="Times New Roman"/>
+                <w:sz w:val="19"/>
+                <w:szCs w:val="19"/>
+              </w:rPr>
+              <w:t xml:space="preserve">, </w:t>
+            </w:r>
+            <w:r>
+              <w:rPr>
+                <w:rFonts w:ascii="Courier New" w:cs="Courier New" w:eastAsia="Courier New" w:hAnsi="Courier New"/>
+                <w:sz w:val="19"/>
+                <w:szCs w:val="19"/>
+              </w:rPr>
+              <w:t xml:space="preserve">*.C</w:t>
+            </w:r>
+          </w:p>
+        </w:tc>
+        <w:tc>
+          <w:tcPr>
+            <w:tcW w:type="dxa" w:w="6438"/>
+            <w:tcMar>
+              <w:top w:type="dxa" w:w="60"/>
+              <w:left w:type="dxa" w:w="100"/>
+              <w:bottom w:type="dxa" w:w="60"/>
+              <w:right w:type="dxa" w:w="100"/>
+            </w:tcMar>
+          </w:tcPr>
+          <w:p>
+            <w:r>
+              <w:rPr>
+                <w:rFonts w:ascii="Times New Roman" w:cs="Times New Roman" w:eastAsia="Times New Roman" w:hAnsi="Times New Roman"/>
+                <w:sz w:val="19"/>
+                <w:szCs w:val="19"/>
+              </w:rPr>
+              <w:t xml:space="preserve">GCC31 EXEC, CRXMAKE EXEC, examples</w:t>
+            </w:r>
+          </w:p>
+        </w:tc>
+      </w:tr>
+      <w:tr>
+        <w:trPr>
+          <w:cantSplit/>
+          <w:tblHeader w:val="false"/>
+        </w:trPr>
+        <w:tc>
+          <w:tcPr>
+            <w:tcW w:type="dxa" w:w="3200"/>
+            <w:tcMar>
+              <w:top w:type="dxa" w:w="60"/>
+              <w:left w:type="dxa" w:w="100"/>
+              <w:bottom w:type="dxa" w:w="60"/>
+              <w:right w:type="dxa" w:w="100"/>
+            </w:tcMar>
+          </w:tcPr>
+          <w:p>
+            <w:r>
+              <w:rPr>
+                <w:rFonts w:ascii="Courier New" w:cs="Courier New" w:eastAsia="Courier New" w:hAnsi="Courier New"/>
+                <w:sz w:val="19"/>
+                <w:szCs w:val="19"/>
+              </w:rPr>
               <w:t xml:space="preserve">vm370plus/chatbot/</w:t>
             </w:r>
           </w:p>
@@ -24280,7 +26169,7 @@
           <w:sz w:val="18"/>
           <w:szCs w:val="18"/>
         </w:rPr>
-        <w:t xml:space="preserve">Figure 54. </w:t>
+        <w:t xml:space="preserve">Figure 55. </w:t>
       </w:r>
       <w:r>
         <w:rPr>

</xml_diff>

<commit_message>
Guide: spool bridge, PHONE, MQTT, RXPIP (Ch. 6), new Chapter 9 Documents and Printing (TROFF, BOOKIE, LATEX, PSPRINT), restrictions (I-277, 80 columns), Appendix A; GUIDE.SCRIPT regenerated
Co-Authored-By: Claude Opus 5.5 <noreply@anthropic.com>
Claude-Session: https://claude.ai/code/session_01JBNU8KnKzXkgscse8vw6so
</commit_message>
<xml_diff>
--- a/arch/31bit/manual/VM370PLUS-Guide.docx
+++ b/arch/31bit/manual/VM370PLUS-Guide.docx
@@ -72,7 +72,7 @@
           <w:sz w:val="24"/>
           <w:szCs w:val="24"/>
         </w:rPr>
-        <w:t xml:space="preserve">Release 1  •  Kit Build 5, updated 10 October 2026</w:t>
+        <w:t xml:space="preserve">Release 1  •  Kit Build 8, updated 13 October 2026</w:t>
       </w:r>
     </w:p>
     <w:p>
@@ -1107,7 +1107,7 @@
           <w:sz w:val="20"/>
           <w:szCs w:val="20"/>
         </w:rPr>
-        <w:t xml:space="preserve">Planned service machines</w:t>
+        <w:t xml:space="preserve">The spool bridge: LXCALL</w:t>
       </w:r>
       <w:r>
         <w:rPr>
@@ -1118,6 +1118,93 @@
           <w:szCs w:val="20"/>
         </w:rPr>
         <w:t xml:space="preserve">	16</w:t>
+      </w:r>
+    </w:p>
+    <w:p>
+      <w:pPr>
+        <w:tabs>
+          <w:tab w:val="right" w:pos="9638" w:leader="dot"/>
+        </w:tabs>
+        <w:spacing w:after="20" w:before="20"/>
+        <w:ind w:left="400"/>
+      </w:pPr>
+      <w:r>
+        <w:rPr>
+          <w:rFonts w:ascii="Times New Roman" w:cs="Times New Roman" w:eastAsia="Times New Roman" w:hAnsi="Times New Roman"/>
+          <w:b w:val="false"/>
+          <w:bCs w:val="false"/>
+          <w:sz w:val="20"/>
+          <w:szCs w:val="20"/>
+        </w:rPr>
+        <w:t xml:space="preserve">PHONE and MQTT</w:t>
+      </w:r>
+      <w:r>
+        <w:rPr>
+          <w:rFonts w:ascii="Times New Roman" w:cs="Times New Roman" w:eastAsia="Times New Roman" w:hAnsi="Times New Roman"/>
+          <w:b w:val="false"/>
+          <w:bCs w:val="false"/>
+          <w:sz w:val="20"/>
+          <w:szCs w:val="20"/>
+        </w:rPr>
+        <w:t xml:space="preserve">	16</w:t>
+      </w:r>
+    </w:p>
+    <w:p>
+      <w:pPr>
+        <w:tabs>
+          <w:tab w:val="right" w:pos="9638" w:leader="dot"/>
+        </w:tabs>
+        <w:spacing w:after="20" w:before="20"/>
+        <w:ind w:left="400"/>
+      </w:pPr>
+      <w:r>
+        <w:rPr>
+          <w:rFonts w:ascii="Times New Roman" w:cs="Times New Roman" w:eastAsia="Times New Roman" w:hAnsi="Times New Roman"/>
+          <w:b w:val="false"/>
+          <w:bCs w:val="false"/>
+          <w:sz w:val="20"/>
+          <w:szCs w:val="20"/>
+        </w:rPr>
+        <w:t xml:space="preserve">RXPIP: REXX packages</w:t>
+      </w:r>
+      <w:r>
+        <w:rPr>
+          <w:rFonts w:ascii="Times New Roman" w:cs="Times New Roman" w:eastAsia="Times New Roman" w:hAnsi="Times New Roman"/>
+          <w:b w:val="false"/>
+          <w:bCs w:val="false"/>
+          <w:sz w:val="20"/>
+          <w:szCs w:val="20"/>
+        </w:rPr>
+        <w:t xml:space="preserve">	17</w:t>
+      </w:r>
+    </w:p>
+    <w:p>
+      <w:pPr>
+        <w:tabs>
+          <w:tab w:val="right" w:pos="9638" w:leader="dot"/>
+        </w:tabs>
+        <w:spacing w:after="20" w:before="20"/>
+        <w:ind w:left="400"/>
+      </w:pPr>
+      <w:r>
+        <w:rPr>
+          <w:rFonts w:ascii="Times New Roman" w:cs="Times New Roman" w:eastAsia="Times New Roman" w:hAnsi="Times New Roman"/>
+          <w:b w:val="false"/>
+          <w:bCs w:val="false"/>
+          <w:sz w:val="20"/>
+          <w:szCs w:val="20"/>
+        </w:rPr>
+        <w:t xml:space="preserve">Planned service machines</w:t>
+      </w:r>
+      <w:r>
+        <w:rPr>
+          <w:rFonts w:ascii="Times New Roman" w:cs="Times New Roman" w:eastAsia="Times New Roman" w:hAnsi="Times New Roman"/>
+          <w:b w:val="false"/>
+          <w:bCs w:val="false"/>
+          <w:sz w:val="20"/>
+          <w:szCs w:val="20"/>
+        </w:rPr>
+        <w:t xml:space="preserve">	17</w:t>
       </w:r>
     </w:p>
     <w:p>
@@ -1146,7 +1233,7 @@
           <w:sz w:val="21"/>
           <w:szCs w:val="21"/>
         </w:rPr>
-        <w:t xml:space="preserve">	17</w:t>
+        <w:t xml:space="preserve">	18</w:t>
       </w:r>
     </w:p>
     <w:p>
@@ -1175,7 +1262,7 @@
           <w:sz w:val="20"/>
           <w:szCs w:val="20"/>
         </w:rPr>
-        <w:t xml:space="preserve">	17</w:t>
+        <w:t xml:space="preserve">	18</w:t>
       </w:r>
     </w:p>
     <w:p>
@@ -1204,7 +1291,7 @@
           <w:sz w:val="20"/>
           <w:szCs w:val="20"/>
         </w:rPr>
-        <w:t xml:space="preserve">	17</w:t>
+        <w:t xml:space="preserve">	18</w:t>
       </w:r>
     </w:p>
     <w:p>
@@ -1233,7 +1320,7 @@
           <w:sz w:val="20"/>
           <w:szCs w:val="20"/>
         </w:rPr>
-        <w:t xml:space="preserve">	17</w:t>
+        <w:t xml:space="preserve">	18</w:t>
       </w:r>
     </w:p>
     <w:p>
@@ -1262,7 +1349,7 @@
           <w:sz w:val="20"/>
           <w:szCs w:val="20"/>
         </w:rPr>
-        <w:t xml:space="preserve">	17</w:t>
+        <w:t xml:space="preserve">	18</w:t>
       </w:r>
     </w:p>
     <w:p>
@@ -1291,7 +1378,7 @@
           <w:sz w:val="20"/>
           <w:szCs w:val="20"/>
         </w:rPr>
-        <w:t xml:space="preserve">	18</w:t>
+        <w:t xml:space="preserve">	19</w:t>
       </w:r>
     </w:p>
     <w:p>
@@ -1320,7 +1407,7 @@
           <w:sz w:val="20"/>
           <w:szCs w:val="20"/>
         </w:rPr>
-        <w:t xml:space="preserve">	18</w:t>
+        <w:t xml:space="preserve">	19</w:t>
       </w:r>
     </w:p>
     <w:p>
@@ -1349,7 +1436,7 @@
           <w:sz w:val="21"/>
           <w:szCs w:val="21"/>
         </w:rPr>
-        <w:t xml:space="preserve">	20</w:t>
+        <w:t xml:space="preserve">	21</w:t>
       </w:r>
     </w:p>
     <w:p>
@@ -1378,7 +1465,7 @@
           <w:sz w:val="20"/>
           <w:szCs w:val="20"/>
         </w:rPr>
-        <w:t xml:space="preserve">	20</w:t>
+        <w:t xml:space="preserve">	21</w:t>
       </w:r>
     </w:p>
     <w:p>
@@ -1407,7 +1494,7 @@
           <w:sz w:val="20"/>
           <w:szCs w:val="20"/>
         </w:rPr>
-        <w:t xml:space="preserve">	20</w:t>
+        <w:t xml:space="preserve">	21</w:t>
       </w:r>
     </w:p>
     <w:p>
@@ -1436,7 +1523,7 @@
           <w:sz w:val="20"/>
           <w:szCs w:val="20"/>
         </w:rPr>
-        <w:t xml:space="preserve">	21</w:t>
+        <w:t xml:space="preserve">	22</w:t>
       </w:r>
     </w:p>
     <w:p>
@@ -1465,7 +1552,7 @@
           <w:sz w:val="20"/>
           <w:szCs w:val="20"/>
         </w:rPr>
-        <w:t xml:space="preserve">	21</w:t>
+        <w:t xml:space="preserve">	22</w:t>
       </w:r>
     </w:p>
     <w:p>
@@ -1494,7 +1581,7 @@
           <w:sz w:val="20"/>
           <w:szCs w:val="20"/>
         </w:rPr>
-        <w:t xml:space="preserve">	21</w:t>
+        <w:t xml:space="preserve">	22</w:t>
       </w:r>
     </w:p>
     <w:p>
@@ -1523,7 +1610,7 @@
           <w:sz w:val="20"/>
           <w:szCs w:val="20"/>
         </w:rPr>
-        <w:t xml:space="preserve">	21</w:t>
+        <w:t xml:space="preserve">	22</w:t>
       </w:r>
     </w:p>
     <w:p>
@@ -1552,7 +1639,7 @@
           <w:sz w:val="20"/>
           <w:szCs w:val="20"/>
         </w:rPr>
-        <w:t xml:space="preserve">	21</w:t>
+        <w:t xml:space="preserve">	22</w:t>
       </w:r>
     </w:p>
     <w:p>
@@ -1581,7 +1668,7 @@
           <w:sz w:val="20"/>
           <w:szCs w:val="20"/>
         </w:rPr>
-        <w:t xml:space="preserve">	21</w:t>
+        <w:t xml:space="preserve">	22</w:t>
       </w:r>
     </w:p>
     <w:p>
@@ -1610,7 +1697,7 @@
           <w:sz w:val="20"/>
           <w:szCs w:val="20"/>
         </w:rPr>
-        <w:t xml:space="preserve">	22</w:t>
+        <w:t xml:space="preserve">	23</w:t>
       </w:r>
     </w:p>
     <w:p>
@@ -1639,7 +1726,7 @@
           <w:sz w:val="20"/>
           <w:szCs w:val="20"/>
         </w:rPr>
-        <w:t xml:space="preserve">	22</w:t>
+        <w:t xml:space="preserve">	23</w:t>
       </w:r>
     </w:p>
     <w:p>
@@ -1668,7 +1755,7 @@
           <w:sz w:val="20"/>
           <w:szCs w:val="20"/>
         </w:rPr>
-        <w:t xml:space="preserve">	22</w:t>
+        <w:t xml:space="preserve">	23</w:t>
       </w:r>
     </w:p>
     <w:p>
@@ -1697,7 +1784,7 @@
           <w:sz w:val="20"/>
           <w:szCs w:val="20"/>
         </w:rPr>
-        <w:t xml:space="preserve">	22</w:t>
+        <w:t xml:space="preserve">	23</w:t>
       </w:r>
     </w:p>
     <w:p>
@@ -1716,7 +1803,7 @@
           <w:sz w:val="21"/>
           <w:szCs w:val="21"/>
         </w:rPr>
-        <w:t xml:space="preserve">Chapter 9. Restrictions and Known Problems</w:t>
+        <w:t xml:space="preserve">Chapter 9. Documents and Printing</w:t>
       </w:r>
       <w:r>
         <w:rPr>
@@ -1726,7 +1813,123 @@
           <w:sz w:val="21"/>
           <w:szCs w:val="21"/>
         </w:rPr>
-        <w:t xml:space="preserve">	24</w:t>
+        <w:t xml:space="preserve">	25</w:t>
+      </w:r>
+    </w:p>
+    <w:p>
+      <w:pPr>
+        <w:tabs>
+          <w:tab w:val="right" w:pos="9638" w:leader="dot"/>
+        </w:tabs>
+        <w:spacing w:after="20" w:before="20"/>
+        <w:ind w:left="400"/>
+      </w:pPr>
+      <w:r>
+        <w:rPr>
+          <w:rFonts w:ascii="Times New Roman" w:cs="Times New Roman" w:eastAsia="Times New Roman" w:hAnsi="Times New Roman"/>
+          <w:b w:val="false"/>
+          <w:bCs w:val="false"/>
+          <w:sz w:val="20"/>
+          <w:szCs w:val="20"/>
+        </w:rPr>
+        <w:t xml:space="preserve">TROFF</w:t>
+      </w:r>
+      <w:r>
+        <w:rPr>
+          <w:rFonts w:ascii="Times New Roman" w:cs="Times New Roman" w:eastAsia="Times New Roman" w:hAnsi="Times New Roman"/>
+          <w:b w:val="false"/>
+          <w:bCs w:val="false"/>
+          <w:sz w:val="20"/>
+          <w:szCs w:val="20"/>
+        </w:rPr>
+        <w:t xml:space="preserve">	25</w:t>
+      </w:r>
+    </w:p>
+    <w:p>
+      <w:pPr>
+        <w:tabs>
+          <w:tab w:val="right" w:pos="9638" w:leader="dot"/>
+        </w:tabs>
+        <w:spacing w:after="20" w:before="20"/>
+        <w:ind w:left="400"/>
+      </w:pPr>
+      <w:r>
+        <w:rPr>
+          <w:rFonts w:ascii="Times New Roman" w:cs="Times New Roman" w:eastAsia="Times New Roman" w:hAnsi="Times New Roman"/>
+          <w:b w:val="false"/>
+          <w:bCs w:val="false"/>
+          <w:sz w:val="20"/>
+          <w:szCs w:val="20"/>
+        </w:rPr>
+        <w:t xml:space="preserve">BOOKIE: BookMaster markup</w:t>
+      </w:r>
+      <w:r>
+        <w:rPr>
+          <w:rFonts w:ascii="Times New Roman" w:cs="Times New Roman" w:eastAsia="Times New Roman" w:hAnsi="Times New Roman"/>
+          <w:b w:val="false"/>
+          <w:bCs w:val="false"/>
+          <w:sz w:val="20"/>
+          <w:szCs w:val="20"/>
+        </w:rPr>
+        <w:t xml:space="preserve">	25</w:t>
+      </w:r>
+    </w:p>
+    <w:p>
+      <w:pPr>
+        <w:tabs>
+          <w:tab w:val="right" w:pos="9638" w:leader="dot"/>
+        </w:tabs>
+        <w:spacing w:after="20" w:before="20"/>
+        <w:ind w:left="400"/>
+      </w:pPr>
+      <w:r>
+        <w:rPr>
+          <w:rFonts w:ascii="Times New Roman" w:cs="Times New Roman" w:eastAsia="Times New Roman" w:hAnsi="Times New Roman"/>
+          <w:b w:val="false"/>
+          <w:bCs w:val="false"/>
+          <w:sz w:val="20"/>
+          <w:szCs w:val="20"/>
+        </w:rPr>
+        <w:t xml:space="preserve">LaTeX</w:t>
+      </w:r>
+      <w:r>
+        <w:rPr>
+          <w:rFonts w:ascii="Times New Roman" w:cs="Times New Roman" w:eastAsia="Times New Roman" w:hAnsi="Times New Roman"/>
+          <w:b w:val="false"/>
+          <w:bCs w:val="false"/>
+          <w:sz w:val="20"/>
+          <w:szCs w:val="20"/>
+        </w:rPr>
+        <w:t xml:space="preserve">	25</w:t>
+      </w:r>
+    </w:p>
+    <w:p>
+      <w:pPr>
+        <w:tabs>
+          <w:tab w:val="right" w:pos="9638" w:leader="dot"/>
+        </w:tabs>
+        <w:spacing w:after="20" w:before="20"/>
+        <w:ind w:left="400"/>
+      </w:pPr>
+      <w:r>
+        <w:rPr>
+          <w:rFonts w:ascii="Times New Roman" w:cs="Times New Roman" w:eastAsia="Times New Roman" w:hAnsi="Times New Roman"/>
+          <w:b w:val="false"/>
+          <w:bCs w:val="false"/>
+          <w:sz w:val="20"/>
+          <w:szCs w:val="20"/>
+        </w:rPr>
+        <w:t xml:space="preserve">Printing PostScript</w:t>
+      </w:r>
+      <w:r>
+        <w:rPr>
+          <w:rFonts w:ascii="Times New Roman" w:cs="Times New Roman" w:eastAsia="Times New Roman" w:hAnsi="Times New Roman"/>
+          <w:b w:val="false"/>
+          <w:bCs w:val="false"/>
+          <w:sz w:val="20"/>
+          <w:szCs w:val="20"/>
+        </w:rPr>
+        <w:t xml:space="preserve">	25</w:t>
       </w:r>
     </w:p>
     <w:p>
@@ -1745,7 +1948,7 @@
           <w:sz w:val="21"/>
           <w:szCs w:val="21"/>
         </w:rPr>
-        <w:t xml:space="preserve">Appendix A. Command Summary</w:t>
+        <w:t xml:space="preserve">Chapter 10. Restrictions and Known Problems</w:t>
       </w:r>
       <w:r>
         <w:rPr>
@@ -1755,7 +1958,36 @@
           <w:sz w:val="21"/>
           <w:szCs w:val="21"/>
         </w:rPr>
-        <w:t xml:space="preserve">	25</w:t>
+        <w:t xml:space="preserve">	27</w:t>
+      </w:r>
+    </w:p>
+    <w:p>
+      <w:pPr>
+        <w:tabs>
+          <w:tab w:val="right" w:pos="9638" w:leader="dot"/>
+        </w:tabs>
+        <w:spacing w:after="20" w:before="160"/>
+        <w:ind w:left="0"/>
+      </w:pPr>
+      <w:r>
+        <w:rPr>
+          <w:rFonts w:ascii="Arial" w:cs="Arial" w:eastAsia="Arial" w:hAnsi="Arial"/>
+          <w:b/>
+          <w:bCs/>
+          <w:sz w:val="21"/>
+          <w:szCs w:val="21"/>
+        </w:rPr>
+        <w:t xml:space="preserve">Appendix A. Command Summary</w:t>
+      </w:r>
+      <w:r>
+        <w:rPr>
+          <w:rFonts w:ascii="Arial" w:cs="Arial" w:eastAsia="Arial" w:hAnsi="Arial"/>
+          <w:b/>
+          <w:bCs/>
+          <w:sz w:val="21"/>
+          <w:szCs w:val="21"/>
+        </w:rPr>
+        <w:t xml:space="preserve">	28</w:t>
       </w:r>
     </w:p>
     <w:p>
@@ -1784,7 +2016,7 @@
           <w:sz w:val="20"/>
           <w:szCs w:val="20"/>
         </w:rPr>
-        <w:t xml:space="preserve">	25</w:t>
+        <w:t xml:space="preserve">	28</w:t>
       </w:r>
     </w:p>
     <w:p>
@@ -1813,7 +2045,7 @@
           <w:sz w:val="20"/>
           <w:szCs w:val="20"/>
         </w:rPr>
-        <w:t xml:space="preserve">	25</w:t>
+        <w:t xml:space="preserve">	28</w:t>
       </w:r>
     </w:p>
     <w:p>
@@ -1842,7 +2074,7 @@
           <w:sz w:val="20"/>
           <w:szCs w:val="20"/>
         </w:rPr>
-        <w:t xml:space="preserve">	25</w:t>
+        <w:t xml:space="preserve">	28</w:t>
       </w:r>
     </w:p>
     <w:p>
@@ -1871,7 +2103,7 @@
           <w:sz w:val="20"/>
           <w:szCs w:val="20"/>
         </w:rPr>
-        <w:t xml:space="preserve">	25</w:t>
+        <w:t xml:space="preserve">	28</w:t>
       </w:r>
     </w:p>
     <w:p>
@@ -1900,7 +2132,7 @@
           <w:sz w:val="20"/>
           <w:szCs w:val="20"/>
         </w:rPr>
-        <w:t xml:space="preserve">	25</w:t>
+        <w:t xml:space="preserve">	28</w:t>
       </w:r>
     </w:p>
     <w:p>
@@ -1929,7 +2161,7 @@
           <w:sz w:val="20"/>
           <w:szCs w:val="20"/>
         </w:rPr>
-        <w:t xml:space="preserve">	26</w:t>
+        <w:t xml:space="preserve">	29</w:t>
       </w:r>
     </w:p>
     <w:p>
@@ -1958,7 +2190,7 @@
           <w:sz w:val="20"/>
           <w:szCs w:val="20"/>
         </w:rPr>
-        <w:t xml:space="preserve">	26</w:t>
+        <w:t xml:space="preserve">	29</w:t>
       </w:r>
     </w:p>
     <w:p>
@@ -1987,7 +2219,7 @@
           <w:sz w:val="20"/>
           <w:szCs w:val="20"/>
         </w:rPr>
-        <w:t xml:space="preserve">	26</w:t>
+        <w:t xml:space="preserve">	29</w:t>
       </w:r>
     </w:p>
     <w:p>
@@ -2016,7 +2248,7 @@
           <w:sz w:val="20"/>
           <w:szCs w:val="20"/>
         </w:rPr>
-        <w:t xml:space="preserve">	27</w:t>
+        <w:t xml:space="preserve">	30</w:t>
       </w:r>
     </w:p>
     <w:p>
@@ -2045,7 +2277,7 @@
           <w:sz w:val="20"/>
           <w:szCs w:val="20"/>
         </w:rPr>
-        <w:t xml:space="preserve">	27</w:t>
+        <w:t xml:space="preserve">	30</w:t>
       </w:r>
     </w:p>
     <w:p>
@@ -2074,7 +2306,7 @@
           <w:sz w:val="20"/>
           <w:szCs w:val="20"/>
         </w:rPr>
-        <w:t xml:space="preserve">	28</w:t>
+        <w:t xml:space="preserve">	31</w:t>
       </w:r>
     </w:p>
     <w:p>
@@ -2103,7 +2335,7 @@
           <w:sz w:val="20"/>
           <w:szCs w:val="20"/>
         </w:rPr>
-        <w:t xml:space="preserve">	28</w:t>
+        <w:t xml:space="preserve">	31</w:t>
       </w:r>
     </w:p>
     <w:p>
@@ -2132,7 +2364,7 @@
           <w:sz w:val="20"/>
           <w:szCs w:val="20"/>
         </w:rPr>
-        <w:t xml:space="preserve">	28</w:t>
+        <w:t xml:space="preserve">	31</w:t>
       </w:r>
     </w:p>
     <w:p>
@@ -2161,7 +2393,7 @@
           <w:sz w:val="20"/>
           <w:szCs w:val="20"/>
         </w:rPr>
-        <w:t xml:space="preserve">	28</w:t>
+        <w:t xml:space="preserve">	31</w:t>
       </w:r>
     </w:p>
     <w:p>
@@ -2180,7 +2412,7 @@
           <w:sz w:val="20"/>
           <w:szCs w:val="20"/>
         </w:rPr>
-        <w:t xml:space="preserve">LINUX EXEC</w:t>
+        <w:t xml:space="preserve">LXCALL, PHONE, MQTT</w:t>
       </w:r>
       <w:r>
         <w:rPr>
@@ -2190,7 +2422,94 @@
           <w:sz w:val="20"/>
           <w:szCs w:val="20"/>
         </w:rPr>
-        <w:t xml:space="preserve">	28</w:t>
+        <w:t xml:space="preserve">	31</w:t>
+      </w:r>
+    </w:p>
+    <w:p>
+      <w:pPr>
+        <w:tabs>
+          <w:tab w:val="right" w:pos="9638" w:leader="dot"/>
+        </w:tabs>
+        <w:spacing w:after="20" w:before="20"/>
+        <w:ind w:left="400"/>
+      </w:pPr>
+      <w:r>
+        <w:rPr>
+          <w:rFonts w:ascii="Times New Roman" w:cs="Times New Roman" w:eastAsia="Times New Roman" w:hAnsi="Times New Roman"/>
+          <w:b w:val="false"/>
+          <w:bCs w:val="false"/>
+          <w:sz w:val="20"/>
+          <w:szCs w:val="20"/>
+        </w:rPr>
+        <w:t xml:space="preserve">RXPIP</w:t>
+      </w:r>
+      <w:r>
+        <w:rPr>
+          <w:rFonts w:ascii="Times New Roman" w:cs="Times New Roman" w:eastAsia="Times New Roman" w:hAnsi="Times New Roman"/>
+          <w:b w:val="false"/>
+          <w:bCs w:val="false"/>
+          <w:sz w:val="20"/>
+          <w:szCs w:val="20"/>
+        </w:rPr>
+        <w:t xml:space="preserve">	31</w:t>
+      </w:r>
+    </w:p>
+    <w:p>
+      <w:pPr>
+        <w:tabs>
+          <w:tab w:val="right" w:pos="9638" w:leader="dot"/>
+        </w:tabs>
+        <w:spacing w:after="20" w:before="20"/>
+        <w:ind w:left="400"/>
+      </w:pPr>
+      <w:r>
+        <w:rPr>
+          <w:rFonts w:ascii="Times New Roman" w:cs="Times New Roman" w:eastAsia="Times New Roman" w:hAnsi="Times New Roman"/>
+          <w:b w:val="false"/>
+          <w:bCs w:val="false"/>
+          <w:sz w:val="20"/>
+          <w:szCs w:val="20"/>
+        </w:rPr>
+        <w:t xml:space="preserve">TROFF, BOOKIE, LATEX, PSPRINT</w:t>
+      </w:r>
+      <w:r>
+        <w:rPr>
+          <w:rFonts w:ascii="Times New Roman" w:cs="Times New Roman" w:eastAsia="Times New Roman" w:hAnsi="Times New Roman"/>
+          <w:b w:val="false"/>
+          <w:bCs w:val="false"/>
+          <w:sz w:val="20"/>
+          <w:szCs w:val="20"/>
+        </w:rPr>
+        <w:t xml:space="preserve">	31</w:t>
+      </w:r>
+    </w:p>
+    <w:p>
+      <w:pPr>
+        <w:tabs>
+          <w:tab w:val="right" w:pos="9638" w:leader="dot"/>
+        </w:tabs>
+        <w:spacing w:after="20" w:before="20"/>
+        <w:ind w:left="400"/>
+      </w:pPr>
+      <w:r>
+        <w:rPr>
+          <w:rFonts w:ascii="Times New Roman" w:cs="Times New Roman" w:eastAsia="Times New Roman" w:hAnsi="Times New Roman"/>
+          <w:b w:val="false"/>
+          <w:bCs w:val="false"/>
+          <w:sz w:val="20"/>
+          <w:szCs w:val="20"/>
+        </w:rPr>
+        <w:t xml:space="preserve">LINUX EXEC</w:t>
+      </w:r>
+      <w:r>
+        <w:rPr>
+          <w:rFonts w:ascii="Times New Roman" w:cs="Times New Roman" w:eastAsia="Times New Roman" w:hAnsi="Times New Roman"/>
+          <w:b w:val="false"/>
+          <w:bCs w:val="false"/>
+          <w:sz w:val="20"/>
+          <w:szCs w:val="20"/>
+        </w:rPr>
+        <w:t xml:space="preserve">	31</w:t>
       </w:r>
     </w:p>
     <w:p>
@@ -2219,7 +2538,7 @@
           <w:sz w:val="21"/>
           <w:szCs w:val="21"/>
         </w:rPr>
-        <w:t xml:space="preserve">	29</w:t>
+        <w:t xml:space="preserve">	32</w:t>
       </w:r>
     </w:p>
     <w:p>
@@ -2248,7 +2567,7 @@
           <w:sz w:val="21"/>
           <w:szCs w:val="21"/>
         </w:rPr>
-        <w:t xml:space="preserve">	30</w:t>
+        <w:t xml:space="preserve">	33</w:t>
       </w:r>
     </w:p>
     <w:p>
@@ -2277,7 +2596,7 @@
           <w:sz w:val="21"/>
           <w:szCs w:val="21"/>
         </w:rPr>
-        <w:t xml:space="preserve">	31</w:t>
+        <w:t xml:space="preserve">	34</w:t>
       </w:r>
     </w:p>
     <w:p>
@@ -2335,7 +2654,7 @@
           <w:sz w:val="20"/>
           <w:szCs w:val="20"/>
         </w:rPr>
-        <w:t xml:space="preserve">	35</w:t>
+        <w:t xml:space="preserve">	38</w:t>
       </w:r>
     </w:p>
     <w:p>
@@ -2528,7 +2847,7 @@
         <w:rPr>
           <w:rFonts w:ascii="Times New Roman" w:cs="Times New Roman" w:eastAsia="Times New Roman" w:hAnsi="Times New Roman"/>
         </w:rPr>
-        <w:t xml:space="preserve">, describes CHATBOT, the chatbot service machine, and the service machines that are planned.</w:t>
+        <w:t xml:space="preserve">, describes CHATBOT, the spool bridge to Linux services (LXCALL, PHONE, MQTT), RXPIP, and the service machines that are planned.</w:t>
       </w:r>
     </w:p>
     <w:p>
@@ -2594,13 +2913,13 @@
           <w:b/>
           <w:bCs/>
         </w:rPr>
-        <w:t xml:space="preserve">Chapter 9, Restrictions and Known Problems</w:t>
-      </w:r>
-      <w:r>
-        <w:rPr>
-          <w:rFonts w:ascii="Times New Roman" w:cs="Times New Roman" w:eastAsia="Times New Roman" w:hAnsi="Times New Roman"/>
-        </w:rPr>
-        <w:t xml:space="preserve">, lists what does not work yet.</w:t>
+        <w:t xml:space="preserve">Chapter 9, Documents and Printing</w:t>
+      </w:r>
+      <w:r>
+        <w:rPr>
+          <w:rFonts w:ascii="Times New Roman" w:cs="Times New Roman" w:eastAsia="Times New Roman" w:hAnsi="Times New Roman"/>
+        </w:rPr>
+        <w:t xml:space="preserve">, describes TROFF, BOOKIE (BookMaster markup), LaTeX and how PostScript reaches a printer.</w:t>
       </w:r>
     </w:p>
     <w:p>
@@ -2618,6 +2937,30 @@
           <w:b/>
           <w:bCs/>
         </w:rPr>
+        <w:t xml:space="preserve">Chapter 10, Restrictions and Known Problems</w:t>
+      </w:r>
+      <w:r>
+        <w:rPr>
+          <w:rFonts w:ascii="Times New Roman" w:cs="Times New Roman" w:eastAsia="Times New Roman" w:hAnsi="Times New Roman"/>
+        </w:rPr>
+        <w:t xml:space="preserve">, lists what does not work yet.</w:t>
+      </w:r>
+    </w:p>
+    <w:p>
+      <w:pPr>
+        <w:pStyle w:val="ListParagraph"/>
+        <w:numPr>
+          <w:ilvl w:val="0"/>
+          <w:numId w:val="2"/>
+        </w:numPr>
+        <w:spacing w:after="60"/>
+      </w:pPr>
+      <w:r>
+        <w:rPr>
+          <w:rFonts w:ascii="Times New Roman" w:cs="Times New Roman" w:eastAsia="Times New Roman" w:hAnsi="Times New Roman"/>
+          <w:b/>
+          <w:bCs/>
+        </w:rPr>
         <w:t xml:space="preserve">Appendix A</w:t>
       </w:r>
       <w:r>
@@ -2719,6 +3062,142 @@
           <w:rFonts w:ascii="Times New Roman" w:cs="Times New Roman" w:eastAsia="Times New Roman" w:hAnsi="Times New Roman"/>
         </w:rPr>
         <w:t xml:space="preserve">This edition is kept up to date as VM/370plus grows; each change is listed here, newest first.</w:t>
+      </w:r>
+    </w:p>
+    <w:p>
+      <w:pPr>
+        <w:pStyle w:val="ListParagraph"/>
+        <w:numPr>
+          <w:ilvl w:val="0"/>
+          <w:numId w:val="2"/>
+        </w:numPr>
+        <w:spacing w:after="60"/>
+      </w:pPr>
+      <w:r>
+        <w:rPr>
+          <w:rFonts w:ascii="Times New Roman" w:cs="Times New Roman" w:eastAsia="Times New Roman" w:hAnsi="Times New Roman"/>
+          <w:b/>
+          <w:bCs/>
+        </w:rPr>
+        <w:t xml:space="preserve">13 October 2026.</w:t>
+      </w:r>
+      <w:r>
+        <w:rPr>
+          <w:rFonts w:ascii="Times New Roman" w:cs="Times New Roman" w:eastAsia="Times New Roman" w:hAnsi="Times New Roman"/>
+        </w:rPr>
+        <w:t xml:space="preserve"> The spool bridge (Chapter 6): CMS users call Linux services with </w:t>
+      </w:r>
+      <w:r>
+        <w:rPr>
+          <w:rFonts w:ascii="Courier New" w:cs="Courier New" w:eastAsia="Courier New" w:hAnsi="Courier New"/>
+          <w:sz w:val="19"/>
+          <w:szCs w:val="19"/>
+        </w:rPr>
+        <w:t xml:space="preserve">LXCALL</w:t>
+      </w:r>
+      <w:r>
+        <w:rPr>
+          <w:rFonts w:ascii="Times New Roman" w:cs="Times New Roman" w:eastAsia="Times New Roman" w:hAnsi="Times New Roman"/>
+        </w:rPr>
+        <w:t xml:space="preserve">, </w:t>
+      </w:r>
+      <w:r>
+        <w:rPr>
+          <w:rFonts w:ascii="Courier New" w:cs="Courier New" w:eastAsia="Courier New" w:hAnsi="Courier New"/>
+          <w:sz w:val="19"/>
+          <w:szCs w:val="19"/>
+        </w:rPr>
+        <w:t xml:space="preserve">PHONE</w:t>
+      </w:r>
+      <w:r>
+        <w:rPr>
+          <w:rFonts w:ascii="Times New Roman" w:cs="Times New Roman" w:eastAsia="Times New Roman" w:hAnsi="Times New Roman"/>
+        </w:rPr>
+        <w:t xml:space="preserve"> (Asterisk) and </w:t>
+      </w:r>
+      <w:r>
+        <w:rPr>
+          <w:rFonts w:ascii="Courier New" w:cs="Courier New" w:eastAsia="Courier New" w:hAnsi="Courier New"/>
+          <w:sz w:val="19"/>
+          <w:szCs w:val="19"/>
+        </w:rPr>
+        <w:t xml:space="preserve">MQTT</w:t>
+      </w:r>
+      <w:r>
+        <w:rPr>
+          <w:rFonts w:ascii="Times New Roman" w:cs="Times New Roman" w:eastAsia="Times New Roman" w:hAnsi="Times New Roman"/>
+        </w:rPr>
+        <w:t xml:space="preserve">; </w:t>
+      </w:r>
+      <w:r>
+        <w:rPr>
+          <w:rFonts w:ascii="Courier New" w:cs="Courier New" w:eastAsia="Courier New" w:hAnsi="Courier New"/>
+          <w:sz w:val="19"/>
+          <w:szCs w:val="19"/>
+        </w:rPr>
+        <w:t xml:space="preserve">RXPIP</w:t>
+      </w:r>
+      <w:r>
+        <w:rPr>
+          <w:rFonts w:ascii="Times New Roman" w:cs="Times New Roman" w:eastAsia="Times New Roman" w:hAnsi="Times New Roman"/>
+        </w:rPr>
+        <w:t xml:space="preserve"> brings REXX packages from the rexxpository repository to CMS. Documents and printing (new Chapter 9): </w:t>
+      </w:r>
+      <w:r>
+        <w:rPr>
+          <w:rFonts w:ascii="Courier New" w:cs="Courier New" w:eastAsia="Courier New" w:hAnsi="Courier New"/>
+          <w:sz w:val="19"/>
+          <w:szCs w:val="19"/>
+        </w:rPr>
+        <w:t xml:space="preserve">TROFF</w:t>
+      </w:r>
+      <w:r>
+        <w:rPr>
+          <w:rFonts w:ascii="Times New Roman" w:cs="Times New Roman" w:eastAsia="Times New Roman" w:hAnsi="Times New Roman"/>
+        </w:rPr>
+        <w:t xml:space="preserve"> (groff), </w:t>
+      </w:r>
+      <w:r>
+        <w:rPr>
+          <w:rFonts w:ascii="Courier New" w:cs="Courier New" w:eastAsia="Courier New" w:hAnsi="Courier New"/>
+          <w:sz w:val="19"/>
+          <w:szCs w:val="19"/>
+        </w:rPr>
+        <w:t xml:space="preserve">BOOKIE</w:t>
+      </w:r>
+      <w:r>
+        <w:rPr>
+          <w:rFonts w:ascii="Times New Roman" w:cs="Times New Roman" w:eastAsia="Times New Roman" w:hAnsi="Times New Roman"/>
+        </w:rPr>
+        <w:t xml:space="preserve"> (our BookMaster-compatible formatter, which formats this Guide on VM/370plus), </w:t>
+      </w:r>
+      <w:r>
+        <w:rPr>
+          <w:rFonts w:ascii="Courier New" w:cs="Courier New" w:eastAsia="Courier New" w:hAnsi="Courier New"/>
+          <w:sz w:val="19"/>
+          <w:szCs w:val="19"/>
+        </w:rPr>
+        <w:t xml:space="preserve">LATEX</w:t>
+      </w:r>
+      <w:r>
+        <w:rPr>
+          <w:rFonts w:ascii="Times New Roman" w:cs="Times New Roman" w:eastAsia="Times New Roman" w:hAnsi="Times New Roman"/>
+        </w:rPr>
+        <w:t xml:space="preserve"> (TeX Live 2023), Ghostscript, and </w:t>
+      </w:r>
+      <w:r>
+        <w:rPr>
+          <w:rFonts w:ascii="Courier New" w:cs="Courier New" w:eastAsia="Courier New" w:hAnsi="Courier New"/>
+          <w:sz w:val="19"/>
+          <w:szCs w:val="19"/>
+        </w:rPr>
+        <w:t xml:space="preserve">PSPRINT</w:t>
+      </w:r>
+      <w:r>
+        <w:rPr>
+          <w:rFonts w:ascii="Times New Roman" w:cs="Times New Roman" w:eastAsia="Times New Roman" w:hAnsi="Times New Roman"/>
+        </w:rPr>
+        <w:t xml:space="preserve"> to a real printer. An ESA/390 guest reading the virtual reader to its end no longer waits forever (I-276).</w:t>
       </w:r>
     </w:p>
     <w:p>
@@ -14011,6 +14490,879 @@
         <w:pStyle w:val="Heading2"/>
       </w:pPr>
       <w:r>
+        <w:t xml:space="preserve">The spool bridge: LXCALL</w:t>
+      </w:r>
+    </w:p>
+    <w:p>
+      <w:pPr>
+        <w:spacing w:after="120"/>
+      </w:pPr>
+      <w:r>
+        <w:rPr>
+          <w:rFonts w:ascii="Times New Roman" w:cs="Times New Roman" w:eastAsia="Times New Roman" w:hAnsi="Times New Roman"/>
+        </w:rPr>
+        <w:t xml:space="preserve">The spool bridge gives CMS users the services of the Debian guest through the same protocol as SQLSERV and CHATBOT. </w:t>
+      </w:r>
+      <w:r>
+        <w:rPr>
+          <w:rFonts w:ascii="Courier New" w:cs="Courier New" w:eastAsia="Courier New" w:hAnsi="Courier New"/>
+          <w:sz w:val="19"/>
+          <w:szCs w:val="19"/>
+        </w:rPr>
+        <w:t xml:space="preserve">vmspoold</w:t>
+      </w:r>
+      <w:r>
+        <w:rPr>
+          <w:rFonts w:ascii="Times New Roman" w:cs="Times New Roman" w:eastAsia="Times New Roman" w:hAnsi="Times New Roman"/>
+        </w:rPr>
+        <w:t xml:space="preserve">, a daemon in the Debian guest, reads its virtual reader, runs the requested service and punches the answer back to the sender. The guest is MAINT unless </w:t>
+      </w:r>
+      <w:r>
+        <w:rPr>
+          <w:rFonts w:ascii="Courier New" w:cs="Courier New" w:eastAsia="Courier New" w:hAnsi="Courier New"/>
+          <w:sz w:val="19"/>
+          <w:szCs w:val="19"/>
+        </w:rPr>
+        <w:t xml:space="preserve">GLOBALV SELECT LXCALL SET SERVER userid</w:t>
+      </w:r>
+      <w:r>
+        <w:rPr>
+          <w:rFonts w:ascii="Times New Roman" w:cs="Times New Roman" w:eastAsia="Times New Roman" w:hAnsi="Times New Roman"/>
+        </w:rPr>
+        <w:t xml:space="preserve"> names another.</w:t>
+      </w:r>
+    </w:p>
+    <w:p>
+      <w:pPr>
+        <w:spacing w:after="120"/>
+      </w:pPr>
+      <w:r>
+        <w:rPr>
+          <w:rFonts w:ascii="Courier New" w:cs="Courier New" w:eastAsia="Courier New" w:hAnsi="Courier New"/>
+          <w:sz w:val="19"/>
+          <w:szCs w:val="19"/>
+        </w:rPr>
+        <w:t xml:space="preserve">LXCALL service [arguments]</w:t>
+      </w:r>
+      <w:r>
+        <w:rPr>
+          <w:rFonts w:ascii="Times New Roman" w:cs="Times New Roman" w:eastAsia="Times New Roman" w:hAnsi="Times New Roman"/>
+        </w:rPr>
+        <w:t xml:space="preserve"> sends a request and shows the answer, which is also kept as </w:t>
+      </w:r>
+      <w:r>
+        <w:rPr>
+          <w:rFonts w:ascii="Courier New" w:cs="Courier New" w:eastAsia="Courier New" w:hAnsi="Courier New"/>
+          <w:sz w:val="19"/>
+          <w:szCs w:val="19"/>
+        </w:rPr>
+        <w:t xml:space="preserve">LXCALL RESULT A</w:t>
+      </w:r>
+      <w:r>
+        <w:rPr>
+          <w:rFonts w:ascii="Times New Roman" w:cs="Times New Roman" w:eastAsia="Times New Roman" w:hAnsi="Times New Roman"/>
+        </w:rPr>
+        <w:t xml:space="preserve"> (its first line is </w:t>
+      </w:r>
+      <w:r>
+        <w:rPr>
+          <w:rFonts w:ascii="Courier New" w:cs="Courier New" w:eastAsia="Courier New" w:hAnsi="Courier New"/>
+          <w:sz w:val="19"/>
+          <w:szCs w:val="19"/>
+        </w:rPr>
+        <w:t xml:space="preserve">VMSPOOL RC n</w:t>
+      </w:r>
+      <w:r>
+        <w:rPr>
+          <w:rFonts w:ascii="Times New Roman" w:cs="Times New Roman" w:eastAsia="Times New Roman" w:hAnsi="Times New Roman"/>
+        </w:rPr>
+        <w:t xml:space="preserve">); the return code of LXCALL is that of the service, 404 if there is no such service. Options: </w:t>
+      </w:r>
+      <w:r>
+        <w:rPr>
+          <w:rFonts w:ascii="Courier New" w:cs="Courier New" w:eastAsia="Courier New" w:hAnsi="Courier New"/>
+          <w:sz w:val="19"/>
+          <w:szCs w:val="19"/>
+        </w:rPr>
+        <w:t xml:space="preserve">(FILE fn ft fm</w:t>
+      </w:r>
+      <w:r>
+        <w:rPr>
+          <w:rFonts w:ascii="Times New Roman" w:cs="Times New Roman" w:eastAsia="Times New Roman" w:hAnsi="Times New Roman"/>
+        </w:rPr>
+        <w:t xml:space="preserve"> sends a file as the input of the service, </w:t>
+      </w:r>
+      <w:r>
+        <w:rPr>
+          <w:rFonts w:ascii="Courier New" w:cs="Courier New" w:eastAsia="Courier New" w:hAnsi="Courier New"/>
+          <w:sz w:val="19"/>
+          <w:szCs w:val="19"/>
+        </w:rPr>
+        <w:t xml:space="preserve">(SERVER userid</w:t>
+      </w:r>
+      <w:r>
+        <w:rPr>
+          <w:rFonts w:ascii="Times New Roman" w:cs="Times New Roman" w:eastAsia="Times New Roman" w:hAnsi="Times New Roman"/>
+        </w:rPr>
+        <w:t xml:space="preserve">, </w:t>
+      </w:r>
+      <w:r>
+        <w:rPr>
+          <w:rFonts w:ascii="Courier New" w:cs="Courier New" w:eastAsia="Courier New" w:hAnsi="Courier New"/>
+          <w:sz w:val="19"/>
+          <w:szCs w:val="19"/>
+        </w:rPr>
+        <w:t xml:space="preserve">(WAIT n</w:t>
+      </w:r>
+      <w:r>
+        <w:rPr>
+          <w:rFonts w:ascii="Times New Roman" w:cs="Times New Roman" w:eastAsia="Times New Roman" w:hAnsi="Times New Roman"/>
+        </w:rPr>
+        <w:t xml:space="preserve"> (seconds, default 900), </w:t>
+      </w:r>
+      <w:r>
+        <w:rPr>
+          <w:rFonts w:ascii="Courier New" w:cs="Courier New" w:eastAsia="Courier New" w:hAnsi="Courier New"/>
+          <w:sz w:val="19"/>
+          <w:szCs w:val="19"/>
+        </w:rPr>
+        <w:t xml:space="preserve">(NOTYPE</w:t>
+      </w:r>
+      <w:r>
+        <w:rPr>
+          <w:rFonts w:ascii="Times New Roman" w:cs="Times New Roman" w:eastAsia="Times New Roman" w:hAnsi="Times New Roman"/>
+        </w:rPr>
+        <w:t xml:space="preserve">. A service is any executable in </w:t>
+      </w:r>
+      <w:r>
+        <w:rPr>
+          <w:rFonts w:ascii="Courier New" w:cs="Courier New" w:eastAsia="Courier New" w:hAnsi="Courier New"/>
+          <w:sz w:val="19"/>
+          <w:szCs w:val="19"/>
+        </w:rPr>
+        <w:t xml:space="preserve">/etc/vmspool.d</w:t>
+      </w:r>
+      <w:r>
+        <w:rPr>
+          <w:rFonts w:ascii="Times New Roman" w:cs="Times New Roman" w:eastAsia="Times New Roman" w:hAnsi="Times New Roman"/>
+        </w:rPr>
+        <w:t xml:space="preserve"> of the guest; </w:t>
+      </w:r>
+      <w:r>
+        <w:rPr>
+          <w:rFonts w:ascii="Courier New" w:cs="Courier New" w:eastAsia="Courier New" w:hAnsi="Courier New"/>
+          <w:sz w:val="19"/>
+          <w:szCs w:val="19"/>
+        </w:rPr>
+        <w:t xml:space="preserve">echo</w:t>
+      </w:r>
+      <w:r>
+        <w:rPr>
+          <w:rFonts w:ascii="Times New Roman" w:cs="Times New Roman" w:eastAsia="Times New Roman" w:hAnsi="Times New Roman"/>
+        </w:rPr>
+        <w:t xml:space="preserve"> and </w:t>
+      </w:r>
+      <w:r>
+        <w:rPr>
+          <w:rFonts w:ascii="Courier New" w:cs="Courier New" w:eastAsia="Courier New" w:hAnsi="Courier New"/>
+          <w:sz w:val="19"/>
+          <w:szCs w:val="19"/>
+        </w:rPr>
+        <w:t xml:space="preserve">sys</w:t>
+      </w:r>
+      <w:r>
+        <w:rPr>
+          <w:rFonts w:ascii="Times New Roman" w:cs="Times New Roman" w:eastAsia="Times New Roman" w:hAnsi="Times New Roman"/>
+        </w:rPr>
+        <w:t xml:space="preserve"> are there to try the bridge.</w:t>
+      </w:r>
+    </w:p>
+    <w:tbl>
+      <w:tblPr>
+        <w:tblW w:type="dxa" w:w="9638"/>
+        <w:tblBorders>
+          <w:top w:val="single" w:color="auto" w:sz="4"/>
+          <w:left w:val="single" w:color="auto" w:sz="4"/>
+          <w:bottom w:val="single" w:color="auto" w:sz="4"/>
+          <w:right w:val="single" w:color="auto" w:sz="4"/>
+          <w:insideH w:val="single" w:color="auto" w:sz="4"/>
+          <w:insideV w:val="single" w:color="auto" w:sz="4"/>
+        </w:tblBorders>
+      </w:tblPr>
+      <w:tblGrid>
+        <w:gridCol w:w="9638"/>
+      </w:tblGrid>
+      <w:tr>
+        <w:trPr>
+          <w:cantSplit/>
+        </w:trPr>
+        <w:tc>
+          <w:tcPr>
+            <w:tcW w:type="dxa" w:w="9638"/>
+            <w:shd w:fill="F2F2F2" w:color="auto" w:val="clear"/>
+            <w:tcMar>
+              <w:top w:type="dxa" w:w="100"/>
+              <w:left w:type="dxa" w:w="140"/>
+              <w:bottom w:type="dxa" w:w="100"/>
+              <w:right w:type="dxa" w:w="140"/>
+            </w:tcMar>
+          </w:tcPr>
+          <w:p>
+            <w:pPr>
+              <w:spacing w:after="0" w:line="228"/>
+            </w:pPr>
+            <w:r>
+              <w:rPr>
+                <w:rFonts w:ascii="Courier New" w:cs="Courier New" w:eastAsia="Courier New" w:hAnsi="Courier New"/>
+                <w:sz w:val="17"/>
+                <w:szCs w:val="17"/>
+              </w:rPr>
+              <w:t xml:space="preserve">lxcall sys</w:t>
+            </w:r>
+          </w:p>
+          <w:p>
+            <w:pPr>
+              <w:spacing w:after="0" w:line="228"/>
+            </w:pPr>
+            <w:r>
+              <w:rPr>
+                <w:rFonts w:ascii="Courier New" w:cs="Courier New" w:eastAsia="Courier New" w:hAnsi="Courier New"/>
+                <w:sz w:val="17"/>
+                <w:szCs w:val="17"/>
+              </w:rPr>
+              <w:t xml:space="preserve">Linux vm370plus 4.0.0+ #8 Tue Oct 13 00:11:13 UTC 2026 s390 GNU/Linux</w:t>
+            </w:r>
+          </w:p>
+          <w:p>
+            <w:pPr>
+              <w:spacing w:after="0" w:line="228"/>
+            </w:pPr>
+            <w:r>
+              <w:rPr>
+                <w:rFonts w:ascii="Courier New" w:cs="Courier New" w:eastAsia="Courier New" w:hAnsi="Courier New"/>
+                <w:sz w:val="17"/>
+                <w:szCs w:val="17"/>
+              </w:rPr>
+              <w:t xml:space="preserve"> 01:26:49 up 10 min,  1 user,  load average: 0.93, 1.75, 1.15</w:t>
+            </w:r>
+          </w:p>
+          <w:p>
+            <w:pPr>
+              <w:spacing w:after="0" w:line="228"/>
+            </w:pPr>
+            <w:r>
+              <w:rPr>
+                <w:rFonts w:ascii="Courier New" w:cs="Courier New" w:eastAsia="Courier New" w:hAnsi="Courier New"/>
+                <w:sz w:val="17"/>
+                <w:szCs w:val="17"/>
+              </w:rPr>
+              <w:t xml:space="preserve">Ready;</w:t>
+            </w:r>
+          </w:p>
+        </w:tc>
+      </w:tr>
+    </w:tbl>
+    <w:p>
+      <w:pPr>
+        <w:spacing w:after="200" w:before="80"/>
+      </w:pPr>
+      <w:r>
+        <w:rPr>
+          <w:rFonts w:ascii="Arial" w:cs="Arial" w:eastAsia="Arial" w:hAnsi="Arial"/>
+          <w:b/>
+          <w:bCs/>
+          <w:sz w:val="18"/>
+          <w:szCs w:val="18"/>
+        </w:rPr>
+        <w:t xml:space="preserve">Figure 24. </w:t>
+      </w:r>
+      <w:r>
+        <w:rPr>
+          <w:rFonts w:ascii="Arial" w:cs="Arial" w:eastAsia="Arial" w:hAnsi="Arial"/>
+          <w:sz w:val="18"/>
+          <w:szCs w:val="18"/>
+        </w:rPr>
+        <w:t xml:space="preserve">A Linux service called from CMS</w:t>
+      </w:r>
+    </w:p>
+    <w:p>
+      <w:pPr>
+        <w:pStyle w:val="Heading2"/>
+      </w:pPr>
+      <w:r>
+        <w:t xml:space="preserve">PHONE and MQTT</w:t>
+      </w:r>
+    </w:p>
+    <w:p>
+      <w:pPr>
+        <w:spacing w:after="120"/>
+      </w:pPr>
+      <w:r>
+        <w:rPr>
+          <w:rFonts w:ascii="Courier New" w:cs="Courier New" w:eastAsia="Courier New" w:hAnsi="Courier New"/>
+          <w:sz w:val="19"/>
+          <w:szCs w:val="19"/>
+        </w:rPr>
+        <w:t xml:space="preserve">PHONE STATUS</w:t>
+      </w:r>
+      <w:r>
+        <w:rPr>
+          <w:rFonts w:ascii="Times New Roman" w:cs="Times New Roman" w:eastAsia="Times New Roman" w:hAnsi="Times New Roman"/>
+        </w:rPr>
+        <w:t xml:space="preserve">, </w:t>
+      </w:r>
+      <w:r>
+        <w:rPr>
+          <w:rFonts w:ascii="Courier New" w:cs="Courier New" w:eastAsia="Courier New" w:hAnsi="Courier New"/>
+          <w:sz w:val="19"/>
+          <w:szCs w:val="19"/>
+        </w:rPr>
+        <w:t xml:space="preserve">PHONE CHANNELS</w:t>
+      </w:r>
+      <w:r>
+        <w:rPr>
+          <w:rFonts w:ascii="Times New Roman" w:cs="Times New Roman" w:eastAsia="Times New Roman" w:hAnsi="Times New Roman"/>
+        </w:rPr>
+        <w:t xml:space="preserve">, </w:t>
+      </w:r>
+      <w:r>
+        <w:rPr>
+          <w:rFonts w:ascii="Courier New" w:cs="Courier New" w:eastAsia="Courier New" w:hAnsi="Courier New"/>
+          <w:sz w:val="19"/>
+          <w:szCs w:val="19"/>
+        </w:rPr>
+        <w:t xml:space="preserve">PHONE PEERS</w:t>
+      </w:r>
+      <w:r>
+        <w:rPr>
+          <w:rFonts w:ascii="Times New Roman" w:cs="Times New Roman" w:eastAsia="Times New Roman" w:hAnsi="Times New Roman"/>
+        </w:rPr>
+        <w:t xml:space="preserve">, </w:t>
+      </w:r>
+      <w:r>
+        <w:rPr>
+          <w:rFonts w:ascii="Courier New" w:cs="Courier New" w:eastAsia="Courier New" w:hAnsi="Courier New"/>
+          <w:sz w:val="19"/>
+          <w:szCs w:val="19"/>
+        </w:rPr>
+        <w:t xml:space="preserve">PHONE CALL ext [context]</w:t>
+      </w:r>
+      <w:r>
+        <w:rPr>
+          <w:rFonts w:ascii="Times New Roman" w:cs="Times New Roman" w:eastAsia="Times New Roman" w:hAnsi="Times New Roman"/>
+        </w:rPr>
+        <w:t xml:space="preserve"> and </w:t>
+      </w:r>
+      <w:r>
+        <w:rPr>
+          <w:rFonts w:ascii="Courier New" w:cs="Courier New" w:eastAsia="Courier New" w:hAnsi="Courier New"/>
+          <w:sz w:val="19"/>
+          <w:szCs w:val="19"/>
+        </w:rPr>
+        <w:t xml:space="preserve">PHONE HANGUP channel</w:t>
+      </w:r>
+      <w:r>
+        <w:rPr>
+          <w:rFonts w:ascii="Times New Roman" w:cs="Times New Roman" w:eastAsia="Times New Roman" w:hAnsi="Times New Roman"/>
+        </w:rPr>
+        <w:t xml:space="preserve"> reach the Asterisk PBX in the Debian guest. </w:t>
+      </w:r>
+      <w:r>
+        <w:rPr>
+          <w:rFonts w:ascii="Courier New" w:cs="Courier New" w:eastAsia="Courier New" w:hAnsi="Courier New"/>
+          <w:sz w:val="19"/>
+          <w:szCs w:val="19"/>
+        </w:rPr>
+        <w:t xml:space="preserve">MQTT PUB topic message</w:t>
+      </w:r>
+      <w:r>
+        <w:rPr>
+          <w:rFonts w:ascii="Times New Roman" w:cs="Times New Roman" w:eastAsia="Times New Roman" w:hAnsi="Times New Roman"/>
+        </w:rPr>
+        <w:t xml:space="preserve"> publishes a message (or, with </w:t>
+      </w:r>
+      <w:r>
+        <w:rPr>
+          <w:rFonts w:ascii="Courier New" w:cs="Courier New" w:eastAsia="Courier New" w:hAnsi="Courier New"/>
+          <w:sz w:val="19"/>
+          <w:szCs w:val="19"/>
+        </w:rPr>
+        <w:t xml:space="preserve">(FILE fn ft</w:t>
+      </w:r>
+      <w:r>
+        <w:rPr>
+          <w:rFonts w:ascii="Times New Roman" w:cs="Times New Roman" w:eastAsia="Times New Roman" w:hAnsi="Times New Roman"/>
+        </w:rPr>
+        <w:t xml:space="preserve">, each line of a file) to the mosquitto broker; </w:t>
+      </w:r>
+      <w:r>
+        <w:rPr>
+          <w:rFonts w:ascii="Courier New" w:cs="Courier New" w:eastAsia="Courier New" w:hAnsi="Courier New"/>
+          <w:sz w:val="19"/>
+          <w:szCs w:val="19"/>
+        </w:rPr>
+        <w:t xml:space="preserve">MQTT SUB topic [n [secs]]</w:t>
+      </w:r>
+      <w:r>
+        <w:rPr>
+          <w:rFonts w:ascii="Times New Roman" w:cs="Times New Roman" w:eastAsia="Times New Roman" w:hAnsi="Times New Roman"/>
+        </w:rPr>
+        <w:t xml:space="preserve"> waits for n messages. The broker can be another one: </w:t>
+      </w:r>
+      <w:r>
+        <w:rPr>
+          <w:rFonts w:ascii="Courier New" w:cs="Courier New" w:eastAsia="Courier New" w:hAnsi="Courier New"/>
+          <w:sz w:val="19"/>
+          <w:szCs w:val="19"/>
+        </w:rPr>
+        <w:t xml:space="preserve">MQTT_HOST</w:t>
+      </w:r>
+      <w:r>
+        <w:rPr>
+          <w:rFonts w:ascii="Times New Roman" w:cs="Times New Roman" w:eastAsia="Times New Roman" w:hAnsi="Times New Roman"/>
+        </w:rPr>
+        <w:t xml:space="preserve"> in </w:t>
+      </w:r>
+      <w:r>
+        <w:rPr>
+          <w:rFonts w:ascii="Courier New" w:cs="Courier New" w:eastAsia="Courier New" w:hAnsi="Courier New"/>
+          <w:sz w:val="19"/>
+          <w:szCs w:val="19"/>
+        </w:rPr>
+        <w:t xml:space="preserve">/etc/vmspool.d/mqtt.conf</w:t>
+      </w:r>
+      <w:r>
+        <w:rPr>
+          <w:rFonts w:ascii="Times New Roman" w:cs="Times New Roman" w:eastAsia="Times New Roman" w:hAnsi="Times New Roman"/>
+        </w:rPr>
+        <w:t xml:space="preserve">.</w:t>
+      </w:r>
+    </w:p>
+    <w:tbl>
+      <w:tblPr>
+        <w:tblW w:type="dxa" w:w="9638"/>
+        <w:tblBorders>
+          <w:top w:val="single" w:color="auto" w:sz="4"/>
+          <w:left w:val="single" w:color="auto" w:sz="4"/>
+          <w:bottom w:val="single" w:color="auto" w:sz="4"/>
+          <w:right w:val="single" w:color="auto" w:sz="4"/>
+          <w:insideH w:val="single" w:color="auto" w:sz="4"/>
+          <w:insideV w:val="single" w:color="auto" w:sz="4"/>
+        </w:tblBorders>
+      </w:tblPr>
+      <w:tblGrid>
+        <w:gridCol w:w="9638"/>
+      </w:tblGrid>
+      <w:tr>
+        <w:trPr>
+          <w:cantSplit/>
+        </w:trPr>
+        <w:tc>
+          <w:tcPr>
+            <w:tcW w:type="dxa" w:w="9638"/>
+            <w:shd w:fill="F2F2F2" w:color="auto" w:val="clear"/>
+            <w:tcMar>
+              <w:top w:type="dxa" w:w="100"/>
+              <w:left w:type="dxa" w:w="140"/>
+              <w:bottom w:type="dxa" w:w="100"/>
+              <w:right w:type="dxa" w:w="140"/>
+            </w:tcMar>
+          </w:tcPr>
+          <w:p>
+            <w:pPr>
+              <w:spacing w:after="0" w:line="228"/>
+            </w:pPr>
+            <w:r>
+              <w:rPr>
+                <w:rFonts w:ascii="Courier New" w:cs="Courier New" w:eastAsia="Courier New" w:hAnsi="Courier New"/>
+                <w:sz w:val="17"/>
+                <w:szCs w:val="17"/>
+              </w:rPr>
+              <w:t xml:space="preserve">mqtt sub vm/test 1 20</w:t>
+            </w:r>
+          </w:p>
+          <w:p>
+            <w:pPr>
+              <w:spacing w:after="0" w:line="228"/>
+            </w:pPr>
+            <w:r>
+              <w:rPr>
+                <w:rFonts w:ascii="Courier New" w:cs="Courier New" w:eastAsia="Courier New" w:hAnsi="Courier New"/>
+                <w:sz w:val="17"/>
+                <w:szCs w:val="17"/>
+              </w:rPr>
+              <w:t xml:space="preserve">vm/test hello from linux</w:t>
+            </w:r>
+          </w:p>
+          <w:p>
+            <w:pPr>
+              <w:spacing w:after="0" w:line="228"/>
+            </w:pPr>
+            <w:r>
+              <w:rPr>
+                <w:rFonts w:ascii="Courier New" w:cs="Courier New" w:eastAsia="Courier New" w:hAnsi="Courier New"/>
+                <w:sz w:val="17"/>
+                <w:szCs w:val="17"/>
+              </w:rPr>
+              <w:t xml:space="preserve">Ready;</w:t>
+            </w:r>
+          </w:p>
+        </w:tc>
+      </w:tr>
+    </w:tbl>
+    <w:p>
+      <w:pPr>
+        <w:spacing w:after="200" w:before="80"/>
+      </w:pPr>
+      <w:r>
+        <w:rPr>
+          <w:rFonts w:ascii="Arial" w:cs="Arial" w:eastAsia="Arial" w:hAnsi="Arial"/>
+          <w:b/>
+          <w:bCs/>
+          <w:sz w:val="18"/>
+          <w:szCs w:val="18"/>
+        </w:rPr>
+        <w:t xml:space="preserve">Figure 25. </w:t>
+      </w:r>
+      <w:r>
+        <w:rPr>
+          <w:rFonts w:ascii="Arial" w:cs="Arial" w:eastAsia="Arial" w:hAnsi="Arial"/>
+          <w:sz w:val="18"/>
+          <w:szCs w:val="18"/>
+        </w:rPr>
+        <w:t xml:space="preserve">A message from Linux arrives on CMS</w:t>
+      </w:r>
+    </w:p>
+    <w:p>
+      <w:pPr>
+        <w:pStyle w:val="Heading2"/>
+      </w:pPr>
+      <w:r>
+        <w:t xml:space="preserve">RXPIP: REXX packages</w:t>
+      </w:r>
+    </w:p>
+    <w:p>
+      <w:pPr>
+        <w:spacing w:after="120"/>
+      </w:pPr>
+      <w:r>
+        <w:rPr>
+          <w:rFonts w:ascii="Times New Roman" w:cs="Times New Roman" w:eastAsia="Times New Roman" w:hAnsi="Times New Roman"/>
+        </w:rPr>
+        <w:t xml:space="preserve">RXPIP is the package manager of rexxpository: REXX routines are published as packages, and a program names what it needs with </w:t>
+      </w:r>
+      <w:r>
+        <w:rPr>
+          <w:rFonts w:ascii="Courier New" w:cs="Courier New" w:eastAsia="Courier New" w:hAnsi="Courier New"/>
+          <w:sz w:val="19"/>
+          <w:szCs w:val="19"/>
+        </w:rPr>
+        <w:t xml:space="preserve">/* REQUIRE pkg */</w:t>
+      </w:r>
+      <w:r>
+        <w:rPr>
+          <w:rFonts w:ascii="Times New Roman" w:cs="Times New Roman" w:eastAsia="Times New Roman" w:hAnsi="Times New Roman"/>
+        </w:rPr>
+        <w:t xml:space="preserve"> comments. The repository server and the rxpip client run in the Debian guest; the bridge service </w:t>
+      </w:r>
+      <w:r>
+        <w:rPr>
+          <w:rFonts w:ascii="Courier New" w:cs="Courier New" w:eastAsia="Courier New" w:hAnsi="Courier New"/>
+          <w:sz w:val="19"/>
+          <w:szCs w:val="19"/>
+        </w:rPr>
+        <w:t xml:space="preserve">rxpip</w:t>
+      </w:r>
+      <w:r>
+        <w:rPr>
+          <w:rFonts w:ascii="Times New Roman" w:cs="Times New Roman" w:eastAsia="Times New Roman" w:hAnsi="Times New Roman"/>
+        </w:rPr>
+        <w:t xml:space="preserve"> serves CMS users.</w:t>
+      </w:r>
+    </w:p>
+    <w:p>
+      <w:pPr>
+        <w:spacing w:after="120"/>
+      </w:pPr>
+      <w:r>
+        <w:rPr>
+          <w:rFonts w:ascii="Courier New" w:cs="Courier New" w:eastAsia="Courier New" w:hAnsi="Courier New"/>
+          <w:sz w:val="19"/>
+          <w:szCs w:val="19"/>
+        </w:rPr>
+        <w:t xml:space="preserve">RXPIP AVAIL</w:t>
+      </w:r>
+      <w:r>
+        <w:rPr>
+          <w:rFonts w:ascii="Times New Roman" w:cs="Times New Roman" w:eastAsia="Times New Roman" w:hAnsi="Times New Roman"/>
+        </w:rPr>
+        <w:t xml:space="preserve">, </w:t>
+      </w:r>
+      <w:r>
+        <w:rPr>
+          <w:rFonts w:ascii="Courier New" w:cs="Courier New" w:eastAsia="Courier New" w:hAnsi="Courier New"/>
+          <w:sz w:val="19"/>
+          <w:szCs w:val="19"/>
+        </w:rPr>
+        <w:t xml:space="preserve">RXPIP SEARCH term</w:t>
+      </w:r>
+      <w:r>
+        <w:rPr>
+          <w:rFonts w:ascii="Times New Roman" w:cs="Times New Roman" w:eastAsia="Times New Roman" w:hAnsi="Times New Roman"/>
+        </w:rPr>
+        <w:t xml:space="preserve"> and </w:t>
+      </w:r>
+      <w:r>
+        <w:rPr>
+          <w:rFonts w:ascii="Courier New" w:cs="Courier New" w:eastAsia="Courier New" w:hAnsi="Courier New"/>
+          <w:sz w:val="19"/>
+          <w:szCs w:val="19"/>
+        </w:rPr>
+        <w:t xml:space="preserve">RXPIP SHOW name</w:t>
+      </w:r>
+      <w:r>
+        <w:rPr>
+          <w:rFonts w:ascii="Times New Roman" w:cs="Times New Roman" w:eastAsia="Times New Roman" w:hAnsi="Times New Roman"/>
+        </w:rPr>
+        <w:t xml:space="preserve"> ask the repository. </w:t>
+      </w:r>
+      <w:r>
+        <w:rPr>
+          <w:rFonts w:ascii="Courier New" w:cs="Courier New" w:eastAsia="Courier New" w:hAnsi="Courier New"/>
+          <w:sz w:val="19"/>
+          <w:szCs w:val="19"/>
+        </w:rPr>
+        <w:t xml:space="preserve">RXPIP BUILD fn</w:t>
+      </w:r>
+      <w:r>
+        <w:rPr>
+          <w:rFonts w:ascii="Times New Roman" w:cs="Times New Roman" w:eastAsia="Times New Roman" w:hAnsi="Times New Roman"/>
+        </w:rPr>
+        <w:t xml:space="preserve"> takes </w:t>
+      </w:r>
+      <w:r>
+        <w:rPr>
+          <w:rFonts w:ascii="Courier New" w:cs="Courier New" w:eastAsia="Courier New" w:hAnsi="Courier New"/>
+          <w:sz w:val="19"/>
+          <w:szCs w:val="19"/>
+        </w:rPr>
+        <w:t xml:space="preserve">fn REXX</w:t>
+      </w:r>
+      <w:r>
+        <w:rPr>
+          <w:rFonts w:ascii="Times New Roman" w:cs="Times New Roman" w:eastAsia="Times New Roman" w:hAnsi="Times New Roman"/>
+        </w:rPr>
+        <w:t xml:space="preserve">, installs the packages it requires and writes </w:t>
+      </w:r>
+      <w:r>
+        <w:rPr>
+          <w:rFonts w:ascii="Courier New" w:cs="Courier New" w:eastAsia="Courier New" w:hAnsi="Courier New"/>
+          <w:sz w:val="19"/>
+          <w:szCs w:val="19"/>
+        </w:rPr>
+        <w:t xml:space="preserve">fn EXEC A</w:t>
+      </w:r>
+      <w:r>
+        <w:rPr>
+          <w:rFonts w:ascii="Times New Roman" w:cs="Times New Roman" w:eastAsia="Times New Roman" w:hAnsi="Times New Roman"/>
+        </w:rPr>
+        <w:t xml:space="preserve">, a standalone program with the packages merged in; </w:t>
+      </w:r>
+      <w:r>
+        <w:rPr>
+          <w:rFonts w:ascii="Courier New" w:cs="Courier New" w:eastAsia="Courier New" w:hAnsi="Courier New"/>
+          <w:sz w:val="19"/>
+          <w:szCs w:val="19"/>
+        </w:rPr>
+        <w:t xml:space="preserve">RXPIP RUN fn [args]</w:t>
+      </w:r>
+      <w:r>
+        <w:rPr>
+          <w:rFonts w:ascii="Times New Roman" w:cs="Times New Roman" w:eastAsia="Times New Roman" w:hAnsi="Times New Roman"/>
+        </w:rPr>
+        <w:t xml:space="preserve"> builds and runs it. </w:t>
+      </w:r>
+      <w:r>
+        <w:rPr>
+          <w:rFonts w:ascii="Courier New" w:cs="Courier New" w:eastAsia="Courier New" w:hAnsi="Courier New"/>
+          <w:sz w:val="19"/>
+          <w:szCs w:val="19"/>
+        </w:rPr>
+        <w:t xml:space="preserve">RXPIP GET name</w:t>
+      </w:r>
+      <w:r>
+        <w:rPr>
+          <w:rFonts w:ascii="Times New Roman" w:cs="Times New Roman" w:eastAsia="Times New Roman" w:hAnsi="Times New Roman"/>
+        </w:rPr>
+        <w:t xml:space="preserve"> fetches a package as </w:t>
+      </w:r>
+      <w:r>
+        <w:rPr>
+          <w:rFonts w:ascii="Courier New" w:cs="Courier New" w:eastAsia="Courier New" w:hAnsi="Courier New"/>
+          <w:sz w:val="19"/>
+          <w:szCs w:val="19"/>
+        </w:rPr>
+        <w:t xml:space="preserve">file REXX A</w:t>
+      </w:r>
+      <w:r>
+        <w:rPr>
+          <w:rFonts w:ascii="Times New Roman" w:cs="Times New Roman" w:eastAsia="Times New Roman" w:hAnsi="Times New Roman"/>
+        </w:rPr>
+        <w:t xml:space="preserve">.</w:t>
+      </w:r>
+    </w:p>
+    <w:tbl>
+      <w:tblPr>
+        <w:tblW w:type="dxa" w:w="9638"/>
+        <w:tblBorders>
+          <w:top w:val="single" w:color="auto" w:sz="4"/>
+          <w:left w:val="single" w:color="auto" w:sz="4"/>
+          <w:bottom w:val="single" w:color="auto" w:sz="4"/>
+          <w:right w:val="single" w:color="auto" w:sz="4"/>
+          <w:insideH w:val="single" w:color="auto" w:sz="4"/>
+          <w:insideV w:val="single" w:color="auto" w:sz="4"/>
+        </w:tblBorders>
+      </w:tblPr>
+      <w:tblGrid>
+        <w:gridCol w:w="9638"/>
+      </w:tblGrid>
+      <w:tr>
+        <w:trPr>
+          <w:cantSplit/>
+        </w:trPr>
+        <w:tc>
+          <w:tcPr>
+            <w:tcW w:type="dxa" w:w="9638"/>
+            <w:shd w:fill="F2F2F2" w:color="auto" w:val="clear"/>
+            <w:tcMar>
+              <w:top w:type="dxa" w:w="100"/>
+              <w:left w:type="dxa" w:w="140"/>
+              <w:bottom w:type="dxa" w:w="100"/>
+              <w:right w:type="dxa" w:w="140"/>
+            </w:tcMar>
+          </w:tcPr>
+          <w:p>
+            <w:pPr>
+              <w:spacing w:after="0" w:line="228"/>
+            </w:pPr>
+            <w:r>
+              <w:rPr>
+                <w:rFonts w:ascii="Courier New" w:cs="Courier New" w:eastAsia="Courier New" w:hAnsi="Courier New"/>
+                <w:sz w:val="17"/>
+                <w:szCs w:val="17"/>
+              </w:rPr>
+              <w:t xml:space="preserve">rxpip run demo</w:t>
+            </w:r>
+          </w:p>
+          <w:p>
+            <w:pPr>
+              <w:spacing w:after="0" w:line="228"/>
+            </w:pPr>
+            <w:r>
+              <w:rPr>
+                <w:rFonts w:ascii="Courier New" w:cs="Courier New" w:eastAsia="Courier New" w:hAnsi="Courier New"/>
+                <w:sz w:val="17"/>
+                <w:szCs w:val="17"/>
+              </w:rPr>
+              <w:t xml:space="preserve">rxpip: mathutils 1.0.0 already installed</w:t>
+            </w:r>
+          </w:p>
+          <w:p>
+            <w:pPr>
+              <w:spacing w:after="0" w:line="228"/>
+            </w:pPr>
+            <w:r>
+              <w:rPr>
+                <w:rFonts w:ascii="Courier New" w:cs="Courier New" w:eastAsia="Courier New" w:hAnsi="Courier New"/>
+                <w:sz w:val="17"/>
+                <w:szCs w:val="17"/>
+              </w:rPr>
+              <w:t xml:space="preserve">rxpip: greetutils 1.0.0 already installed</w:t>
+            </w:r>
+          </w:p>
+          <w:p>
+            <w:pPr>
+              <w:spacing w:after="0" w:line="228"/>
+            </w:pPr>
+            <w:r>
+              <w:rPr>
+                <w:rFonts w:ascii="Courier New" w:cs="Courier New" w:eastAsia="Courier New" w:hAnsi="Courier New"/>
+                <w:sz w:val="17"/>
+                <w:szCs w:val="17"/>
+              </w:rPr>
+              <w:t xml:space="preserve">RXPIP: DEMO EXEC A written, 71 lines</w:t>
+            </w:r>
+          </w:p>
+          <w:p>
+            <w:pPr>
+              <w:spacing w:after="0" w:line="228"/>
+            </w:pPr>
+            <w:r>
+              <w:rPr>
+                <w:rFonts w:ascii="Courier New" w:cs="Courier New" w:eastAsia="Courier New" w:hAnsi="Courier New"/>
+                <w:sz w:val="17"/>
+                <w:szCs w:val="17"/>
+              </w:rPr>
+              <w:t xml:space="preserve">HELLO, WORLD!!!</w:t>
+            </w:r>
+          </w:p>
+          <w:p>
+            <w:pPr>
+              <w:spacing w:after="0" w:line="228"/>
+            </w:pPr>
+            <w:r>
+              <w:rPr>
+                <w:rFonts w:ascii="Courier New" w:cs="Courier New" w:eastAsia="Courier New" w:hAnsi="Courier New"/>
+                <w:sz w:val="17"/>
+                <w:szCs w:val="17"/>
+              </w:rPr>
+              <w:t xml:space="preserve">square of 7 is 49</w:t>
+            </w:r>
+          </w:p>
+          <w:p>
+            <w:pPr>
+              <w:spacing w:after="0" w:line="228"/>
+            </w:pPr>
+            <w:r>
+              <w:rPr>
+                <w:rFonts w:ascii="Courier New" w:cs="Courier New" w:eastAsia="Courier New" w:hAnsi="Courier New"/>
+                <w:sz w:val="17"/>
+                <w:szCs w:val="17"/>
+              </w:rPr>
+              <w:t xml:space="preserve">Ready;</w:t>
+            </w:r>
+          </w:p>
+        </w:tc>
+      </w:tr>
+    </w:tbl>
+    <w:p>
+      <w:pPr>
+        <w:spacing w:after="200" w:before="80"/>
+      </w:pPr>
+      <w:r>
+        <w:rPr>
+          <w:rFonts w:ascii="Arial" w:cs="Arial" w:eastAsia="Arial" w:hAnsi="Arial"/>
+          <w:b/>
+          <w:bCs/>
+          <w:sz w:val="18"/>
+          <w:szCs w:val="18"/>
+        </w:rPr>
+        <w:t xml:space="preserve">Figure 26. </w:t>
+      </w:r>
+      <w:r>
+        <w:rPr>
+          <w:rFonts w:ascii="Arial" w:cs="Arial" w:eastAsia="Arial" w:hAnsi="Arial"/>
+          <w:sz w:val="18"/>
+          <w:szCs w:val="18"/>
+        </w:rPr>
+        <w:t xml:space="preserve">A REXX program with its packages</w:t>
+      </w:r>
+    </w:p>
+    <w:p>
+      <w:pPr>
+        <w:pStyle w:val="Heading2"/>
+      </w:pPr>
+      <w:r>
         <w:t xml:space="preserve">Planned service machines</w:t>
       </w:r>
     </w:p>
@@ -14154,7 +15506,7 @@
                 <w:sz w:val="19"/>
                 <w:szCs w:val="19"/>
               </w:rPr>
-              <w:t xml:space="preserve">Spool bridge</w:t>
+              <w:t xml:space="preserve">MQ</w:t>
             </w:r>
           </w:p>
         </w:tc>
@@ -14175,23 +15527,7 @@
                 <w:sz w:val="19"/>
                 <w:szCs w:val="19"/>
               </w:rPr>
-              <w:t xml:space="preserve">a daemon in the Debian guest that takes requests from its virtual reader (vmur) and answers through the punch, so Linux services (Asterisk: </w:t>
-            </w:r>
-            <w:r>
-              <w:rPr>
-                <w:rFonts w:ascii="Courier New" w:cs="Courier New" w:eastAsia="Courier New" w:hAnsi="Courier New"/>
-                <w:sz w:val="19"/>
-                <w:szCs w:val="19"/>
-              </w:rPr>
-              <w:t xml:space="preserve">PHONE</w:t>
-            </w:r>
-            <w:r>
-              <w:rPr>
-                <w:rFonts w:ascii="Times New Roman" w:cs="Times New Roman" w:eastAsia="Times New Roman" w:hAnsi="Times New Roman"/>
-                <w:sz w:val="19"/>
-                <w:szCs w:val="19"/>
-              </w:rPr>
-              <w:t xml:space="preserve">, MQTT, MariaDB) speak the same spool protocol as CHATBOT and SQLSERV</w:t>
+              <w:t xml:space="preserve">a queue manager on CMS</w:t>
             </w:r>
           </w:p>
         </w:tc>
@@ -14218,7 +15554,7 @@
                 <w:sz w:val="19"/>
                 <w:szCs w:val="19"/>
               </w:rPr>
-              <w:t xml:space="preserve">RXPIPSRV</w:t>
+              <w:t xml:space="preserve">Network pack</w:t>
             </w:r>
           </w:p>
         </w:tc>
@@ -14239,23 +15575,7 @@
                 <w:sz w:val="19"/>
                 <w:szCs w:val="19"/>
               </w:rPr>
-              <w:t xml:space="preserve">REXX packages from rexxpository (RXPIP) for CMS users: </w:t>
-            </w:r>
-            <w:r>
-              <w:rPr>
-                <w:rFonts w:ascii="Courier New" w:cs="Courier New" w:eastAsia="Courier New" w:hAnsi="Courier New"/>
-                <w:sz w:val="19"/>
-                <w:szCs w:val="19"/>
-              </w:rPr>
-              <w:t xml:space="preserve">RXPIP INSTALL pkg</w:t>
-            </w:r>
-            <w:r>
-              <w:rPr>
-                <w:rFonts w:ascii="Times New Roman" w:cs="Times New Roman" w:eastAsia="Times New Roman" w:hAnsi="Times New Roman"/>
-                <w:sz w:val="19"/>
-                <w:szCs w:val="19"/>
-              </w:rPr>
-              <w:t xml:space="preserve"> through the spool</w:t>
+              <w:t xml:space="preserve">optional: a firewall guest (BORDER), an HTTP load balancer, and a machine that starts more web guests under load</w:t>
             </w:r>
           </w:p>
         </w:tc>
@@ -14282,102 +15602,6 @@
                 <w:sz w:val="19"/>
                 <w:szCs w:val="19"/>
               </w:rPr>
-              <w:t xml:space="preserve">MQ, MQTT</w:t>
-            </w:r>
-          </w:p>
-        </w:tc>
-        <w:tc>
-          <w:tcPr>
-            <w:tcW w:type="dxa" w:w="7438"/>
-            <w:tcMar>
-              <w:top w:type="dxa" w:w="60"/>
-              <w:left w:type="dxa" w:w="100"/>
-              <w:bottom w:type="dxa" w:w="60"/>
-              <w:right w:type="dxa" w:w="100"/>
-            </w:tcMar>
-          </w:tcPr>
-          <w:p>
-            <w:r>
-              <w:rPr>
-                <w:rFonts w:ascii="Times New Roman" w:cs="Times New Roman" w:eastAsia="Times New Roman" w:hAnsi="Times New Roman"/>
-                <w:sz w:val="19"/>
-                <w:szCs w:val="19"/>
-              </w:rPr>
-              <w:t xml:space="preserve">a queue manager on CMS; the mosquitto broker on Debian</w:t>
-            </w:r>
-          </w:p>
-        </w:tc>
-      </w:tr>
-      <w:tr>
-        <w:trPr>
-          <w:cantSplit/>
-          <w:tblHeader w:val="false"/>
-        </w:trPr>
-        <w:tc>
-          <w:tcPr>
-            <w:tcW w:type="dxa" w:w="2200"/>
-            <w:tcMar>
-              <w:top w:type="dxa" w:w="60"/>
-              <w:left w:type="dxa" w:w="100"/>
-              <w:bottom w:type="dxa" w:w="60"/>
-              <w:right w:type="dxa" w:w="100"/>
-            </w:tcMar>
-          </w:tcPr>
-          <w:p>
-            <w:r>
-              <w:rPr>
-                <w:rFonts w:ascii="Times New Roman" w:cs="Times New Roman" w:eastAsia="Times New Roman" w:hAnsi="Times New Roman"/>
-                <w:sz w:val="19"/>
-                <w:szCs w:val="19"/>
-              </w:rPr>
-              <w:t xml:space="preserve">Network pack</w:t>
-            </w:r>
-          </w:p>
-        </w:tc>
-        <w:tc>
-          <w:tcPr>
-            <w:tcW w:type="dxa" w:w="7438"/>
-            <w:tcMar>
-              <w:top w:type="dxa" w:w="60"/>
-              <w:left w:type="dxa" w:w="100"/>
-              <w:bottom w:type="dxa" w:w="60"/>
-              <w:right w:type="dxa" w:w="100"/>
-            </w:tcMar>
-          </w:tcPr>
-          <w:p>
-            <w:r>
-              <w:rPr>
-                <w:rFonts w:ascii="Times New Roman" w:cs="Times New Roman" w:eastAsia="Times New Roman" w:hAnsi="Times New Roman"/>
-                <w:sz w:val="19"/>
-                <w:szCs w:val="19"/>
-              </w:rPr>
-              <w:t xml:space="preserve">optional: a firewall guest (BORDER), an HTTP load balancer, and a machine that starts more web guests under load</w:t>
-            </w:r>
-          </w:p>
-        </w:tc>
-      </w:tr>
-      <w:tr>
-        <w:trPr>
-          <w:cantSplit/>
-          <w:tblHeader w:val="false"/>
-        </w:trPr>
-        <w:tc>
-          <w:tcPr>
-            <w:tcW w:type="dxa" w:w="2200"/>
-            <w:tcMar>
-              <w:top w:type="dxa" w:w="60"/>
-              <w:left w:type="dxa" w:w="100"/>
-              <w:bottom w:type="dxa" w:w="60"/>
-              <w:right w:type="dxa" w:w="100"/>
-            </w:tcMar>
-          </w:tcPr>
-          <w:p>
-            <w:r>
-              <w:rPr>
-                <w:rFonts w:ascii="Times New Roman" w:cs="Times New Roman" w:eastAsia="Times New Roman" w:hAnsi="Times New Roman"/>
-                <w:sz w:val="19"/>
-                <w:szCs w:val="19"/>
-              </w:rPr>
               <w:t xml:space="preserve">SMAPI</w:t>
             </w:r>
           </w:p>
@@ -14417,7 +15641,7 @@
           <w:sz w:val="18"/>
           <w:szCs w:val="18"/>
         </w:rPr>
-        <w:t xml:space="preserve">Figure 24. </w:t>
+        <w:t xml:space="preserve">Figure 27. </w:t>
       </w:r>
       <w:r>
         <w:rPr>
@@ -14655,7 +15879,7 @@
           <w:sz w:val="18"/>
           <w:szCs w:val="18"/>
         </w:rPr>
-        <w:t xml:space="preserve">Figure 25. </w:t>
+        <w:t xml:space="preserve">Figure 28. </w:t>
       </w:r>
       <w:r>
         <w:rPr>
@@ -15065,7 +16289,7 @@
           <w:sz w:val="18"/>
           <w:szCs w:val="18"/>
         </w:rPr>
-        <w:t xml:space="preserve">Figure 26. </w:t>
+        <w:t xml:space="preserve">Figure 29. </w:t>
       </w:r>
       <w:r>
         <w:rPr>
@@ -15330,7 +16554,7 @@
           <w:sz w:val="18"/>
           <w:szCs w:val="18"/>
         </w:rPr>
-        <w:t xml:space="preserve">Figure 27. </w:t>
+        <w:t xml:space="preserve">Figure 30. </w:t>
       </w:r>
       <w:r>
         <w:rPr>
@@ -16404,7 +17628,7 @@
           <w:sz w:val="18"/>
           <w:szCs w:val="18"/>
         </w:rPr>
-        <w:t xml:space="preserve">Figure 28. </w:t>
+        <w:t xml:space="preserve">Figure 31. </w:t>
       </w:r>
       <w:r>
         <w:rPr>
@@ -17034,7 +18258,7 @@
           <w:sz w:val="18"/>
           <w:szCs w:val="18"/>
         </w:rPr>
-        <w:t xml:space="preserve">Figure 29. </w:t>
+        <w:t xml:space="preserve">Figure 32. </w:t>
       </w:r>
       <w:r>
         <w:rPr>
@@ -17544,7 +18768,7 @@
           <w:sz w:val="18"/>
           <w:szCs w:val="18"/>
         </w:rPr>
-        <w:t xml:space="preserve">Figure 30. </w:t>
+        <w:t xml:space="preserve">Figure 33. </w:t>
       </w:r>
       <w:r>
         <w:rPr>
@@ -17843,7 +19067,7 @@
           <w:sz w:val="18"/>
           <w:szCs w:val="18"/>
         </w:rPr>
-        <w:t xml:space="preserve">Figure 31. </w:t>
+        <w:t xml:space="preserve">Figure 34. </w:t>
       </w:r>
       <w:r>
         <w:rPr>
@@ -18408,7 +19632,7 @@
           <w:sz w:val="18"/>
           <w:szCs w:val="18"/>
         </w:rPr>
-        <w:t xml:space="preserve">Figure 32. </w:t>
+        <w:t xml:space="preserve">Figure 35. </w:t>
       </w:r>
       <w:r>
         <w:rPr>
@@ -18555,7 +19779,7 @@
           <w:sz w:val="18"/>
           <w:szCs w:val="18"/>
         </w:rPr>
-        <w:t xml:space="preserve">Figure 33. </w:t>
+        <w:t xml:space="preserve">Figure 36. </w:t>
       </w:r>
       <w:r>
         <w:rPr>
@@ -18931,7 +20155,7 @@
           <w:sz w:val="18"/>
           <w:szCs w:val="18"/>
         </w:rPr>
-        <w:t xml:space="preserve">Figure 34. </w:t>
+        <w:t xml:space="preserve">Figure 37. </w:t>
       </w:r>
       <w:r>
         <w:rPr>
@@ -20152,7 +21376,7 @@
           <w:sz w:val="18"/>
           <w:szCs w:val="18"/>
         </w:rPr>
-        <w:t xml:space="preserve">Figure 35. </w:t>
+        <w:t xml:space="preserve">Figure 38. </w:t>
       </w:r>
       <w:r>
         <w:rPr>
@@ -20931,7 +22155,7 @@
           <w:sz w:val="18"/>
           <w:szCs w:val="18"/>
         </w:rPr>
-        <w:t xml:space="preserve">Figure 36. </w:t>
+        <w:t xml:space="preserve">Figure 39. </w:t>
       </w:r>
       <w:r>
         <w:rPr>
@@ -21065,7 +22289,7 @@
           <w:sz w:val="18"/>
           <w:szCs w:val="18"/>
         </w:rPr>
-        <w:t xml:space="preserve">Figure 37. </w:t>
+        <w:t xml:space="preserve">Figure 40. </w:t>
       </w:r>
       <w:r>
         <w:rPr>
@@ -21082,7 +22306,1074 @@
         <w:pageBreakBefore/>
       </w:pPr>
       <w:r>
-        <w:t xml:space="preserve">Chapter 9. Restrictions and Known Problems</w:t>
+        <w:t xml:space="preserve">Chapter 9. Documents and Printing</w:t>
+      </w:r>
+    </w:p>
+    <w:p>
+      <w:pPr>
+        <w:spacing w:after="120"/>
+      </w:pPr>
+      <w:r>
+        <w:rPr>
+          <w:rFonts w:ascii="Times New Roman" w:cs="Times New Roman" w:eastAsia="Times New Roman" w:hAnsi="Times New Roman"/>
+        </w:rPr>
+        <w:t xml:space="preserve">VM/370plus formats documents in the Debian guest through the spool bridge and gives the result back to CMS: plain text as a CMS file, PostScript as a CMS file that can be printed. Three formatters are there: troff, BookMaster markup and LaTeX.</w:t>
+      </w:r>
+    </w:p>
+    <w:p>
+      <w:pPr>
+        <w:pStyle w:val="Heading2"/>
+      </w:pPr>
+      <w:r>
+        <w:t xml:space="preserve">TROFF</w:t>
+      </w:r>
+    </w:p>
+    <w:p>
+      <w:pPr>
+        <w:spacing w:after="120"/>
+      </w:pPr>
+      <w:r>
+        <w:rPr>
+          <w:rFonts w:ascii="Courier New" w:cs="Courier New" w:eastAsia="Courier New" w:hAnsi="Courier New"/>
+          <w:sz w:val="19"/>
+          <w:szCs w:val="19"/>
+        </w:rPr>
+        <w:t xml:space="preserve">TROFF fn [ft [fm]] (MACROS m</w:t>
+      </w:r>
+      <w:r>
+        <w:rPr>
+          <w:rFonts w:ascii="Times New Roman" w:cs="Times New Roman" w:eastAsia="Times New Roman" w:hAnsi="Times New Roman"/>
+        </w:rPr>
+        <w:t xml:space="preserve"> formats a troff document (file type TROFF by default) with groff and the ms, me, mm, man or mom macros; the text comes back as </w:t>
+      </w:r>
+      <w:r>
+        <w:rPr>
+          <w:rFonts w:ascii="Courier New" w:cs="Courier New" w:eastAsia="Courier New" w:hAnsi="Courier New"/>
+          <w:sz w:val="19"/>
+          <w:szCs w:val="19"/>
+        </w:rPr>
+        <w:t xml:space="preserve">fn DOCUMENT A</w:t>
+      </w:r>
+      <w:r>
+        <w:rPr>
+          <w:rFonts w:ascii="Times New Roman" w:cs="Times New Roman" w:eastAsia="Times New Roman" w:hAnsi="Times New Roman"/>
+        </w:rPr>
+        <w:t xml:space="preserve">. With </w:t>
+      </w:r>
+      <w:r>
+        <w:rPr>
+          <w:rFonts w:ascii="Courier New" w:cs="Courier New" w:eastAsia="Courier New" w:hAnsi="Courier New"/>
+          <w:sz w:val="19"/>
+          <w:szCs w:val="19"/>
+        </w:rPr>
+        <w:t xml:space="preserve">(PS</w:t>
+      </w:r>
+      <w:r>
+        <w:rPr>
+          <w:rFonts w:ascii="Times New Roman" w:cs="Times New Roman" w:eastAsia="Times New Roman" w:hAnsi="Times New Roman"/>
+        </w:rPr>
+        <w:t xml:space="preserve"> the result is PostScript, </w:t>
+      </w:r>
+      <w:r>
+        <w:rPr>
+          <w:rFonts w:ascii="Courier New" w:cs="Courier New" w:eastAsia="Courier New" w:hAnsi="Courier New"/>
+          <w:sz w:val="19"/>
+          <w:szCs w:val="19"/>
+        </w:rPr>
+        <w:t xml:space="preserve">fn PS A</w:t>
+      </w:r>
+      <w:r>
+        <w:rPr>
+          <w:rFonts w:ascii="Times New Roman" w:cs="Times New Roman" w:eastAsia="Times New Roman" w:hAnsi="Times New Roman"/>
+        </w:rPr>
+        <w:t xml:space="preserve">.</w:t>
+      </w:r>
+    </w:p>
+    <w:p>
+      <w:pPr>
+        <w:pStyle w:val="Heading2"/>
+      </w:pPr>
+      <w:r>
+        <w:t xml:space="preserve">BOOKIE: BookMaster markup</w:t>
+      </w:r>
+    </w:p>
+    <w:p>
+      <w:pPr>
+        <w:spacing w:after="120"/>
+      </w:pPr>
+      <w:r>
+        <w:rPr>
+          <w:rFonts w:ascii="Times New Roman" w:cs="Times New Roman" w:eastAsia="Times New Roman" w:hAnsi="Times New Roman"/>
+        </w:rPr>
+        <w:t xml:space="preserve">BookMaster is IBM’s licensed program for GML markup. BOOKIE is our own formatter for that markup: </w:t>
+      </w:r>
+      <w:r>
+        <w:rPr>
+          <w:rFonts w:ascii="Courier New" w:cs="Courier New" w:eastAsia="Courier New" w:hAnsi="Courier New"/>
+          <w:sz w:val="19"/>
+          <w:szCs w:val="19"/>
+        </w:rPr>
+        <w:t xml:space="preserve">BOOKIE fn [ft [fm]]</w:t>
+      </w:r>
+      <w:r>
+        <w:rPr>
+          <w:rFonts w:ascii="Times New Roman" w:cs="Times New Roman" w:eastAsia="Times New Roman" w:hAnsi="Times New Roman"/>
+        </w:rPr>
+        <w:t xml:space="preserve"> (file type SCRIPT by default) gives </w:t>
+      </w:r>
+      <w:r>
+        <w:rPr>
+          <w:rFonts w:ascii="Courier New" w:cs="Courier New" w:eastAsia="Courier New" w:hAnsi="Courier New"/>
+          <w:sz w:val="19"/>
+          <w:szCs w:val="19"/>
+        </w:rPr>
+        <w:t xml:space="preserve">fn DOCUMENT A</w:t>
+      </w:r>
+      <w:r>
+        <w:rPr>
+          <w:rFonts w:ascii="Times New Roman" w:cs="Times New Roman" w:eastAsia="Times New Roman" w:hAnsi="Times New Roman"/>
+        </w:rPr>
+        <w:t xml:space="preserve">, </w:t>
+      </w:r>
+      <w:r>
+        <w:rPr>
+          <w:rFonts w:ascii="Courier New" w:cs="Courier New" w:eastAsia="Courier New" w:hAnsi="Courier New"/>
+          <w:sz w:val="19"/>
+          <w:szCs w:val="19"/>
+        </w:rPr>
+        <w:t xml:space="preserve">BOOKIE fn (PS</w:t>
+      </w:r>
+      <w:r>
+        <w:rPr>
+          <w:rFonts w:ascii="Times New Roman" w:cs="Times New Roman" w:eastAsia="Times New Roman" w:hAnsi="Times New Roman"/>
+        </w:rPr>
+        <w:t xml:space="preserve"> gives </w:t>
+      </w:r>
+      <w:r>
+        <w:rPr>
+          <w:rFonts w:ascii="Courier New" w:cs="Courier New" w:eastAsia="Courier New" w:hAnsi="Courier New"/>
+          <w:sz w:val="19"/>
+          <w:szCs w:val="19"/>
+        </w:rPr>
+        <w:t xml:space="preserve">fn PS A</w:t>
+      </w:r>
+      <w:r>
+        <w:rPr>
+          <w:rFonts w:ascii="Times New Roman" w:cs="Times New Roman" w:eastAsia="Times New Roman" w:hAnsi="Times New Roman"/>
+        </w:rPr>
+        <w:t xml:space="preserve">. Its style is the style of this Guide: a title page and an edition notice, a contents page with page numbers, chapters on new pages, running heads and feet, screens in framed boxes, tables and figures. This Guide is itself available as </w:t>
+      </w:r>
+      <w:r>
+        <w:rPr>
+          <w:rFonts w:ascii="Courier New" w:cs="Courier New" w:eastAsia="Courier New" w:hAnsi="Courier New"/>
+          <w:sz w:val="19"/>
+          <w:szCs w:val="19"/>
+        </w:rPr>
+        <w:t xml:space="preserve">GUIDE SCRIPT</w:t>
+      </w:r>
+      <w:r>
+        <w:rPr>
+          <w:rFonts w:ascii="Times New Roman" w:cs="Times New Roman" w:eastAsia="Times New Roman" w:hAnsi="Times New Roman"/>
+        </w:rPr>
+        <w:t xml:space="preserve"> and is formatted on VM/370plus with </w:t>
+      </w:r>
+      <w:r>
+        <w:rPr>
+          <w:rFonts w:ascii="Courier New" w:cs="Courier New" w:eastAsia="Courier New" w:hAnsi="Courier New"/>
+          <w:sz w:val="19"/>
+          <w:szCs w:val="19"/>
+        </w:rPr>
+        <w:t xml:space="preserve">BOOKIE GUIDE (PS</w:t>
+      </w:r>
+      <w:r>
+        <w:rPr>
+          <w:rFonts w:ascii="Times New Roman" w:cs="Times New Roman" w:eastAsia="Times New Roman" w:hAnsi="Times New Roman"/>
+        </w:rPr>
+        <w:t xml:space="preserve">.</w:t>
+      </w:r>
+    </w:p>
+    <w:p>
+      <w:pPr>
+        <w:spacing w:after="120"/>
+      </w:pPr>
+      <w:r>
+        <w:rPr>
+          <w:rFonts w:ascii="Times New Roman" w:cs="Times New Roman" w:eastAsia="Times New Roman" w:hAnsi="Times New Roman"/>
+        </w:rPr>
+        <w:t xml:space="preserve">The tags are those of BookMaster: </w:t>
+      </w:r>
+      <w:r>
+        <w:rPr>
+          <w:rFonts w:ascii="Courier New" w:cs="Courier New" w:eastAsia="Courier New" w:hAnsi="Courier New"/>
+          <w:sz w:val="19"/>
+          <w:szCs w:val="19"/>
+        </w:rPr>
+        <w:t xml:space="preserve">:userdoc</w:t>
+      </w:r>
+      <w:r>
+        <w:rPr>
+          <w:rFonts w:ascii="Times New Roman" w:cs="Times New Roman" w:eastAsia="Times New Roman" w:hAnsi="Times New Roman"/>
+        </w:rPr>
+        <w:t xml:space="preserve">, </w:t>
+      </w:r>
+      <w:r>
+        <w:rPr>
+          <w:rFonts w:ascii="Courier New" w:cs="Courier New" w:eastAsia="Courier New" w:hAnsi="Courier New"/>
+          <w:sz w:val="19"/>
+          <w:szCs w:val="19"/>
+        </w:rPr>
+        <w:t xml:space="preserve">:prolog</w:t>
+      </w:r>
+      <w:r>
+        <w:rPr>
+          <w:rFonts w:ascii="Times New Roman" w:cs="Times New Roman" w:eastAsia="Times New Roman" w:hAnsi="Times New Roman"/>
+        </w:rPr>
+        <w:t xml:space="preserve"> with </w:t>
+      </w:r>
+      <w:r>
+        <w:rPr>
+          <w:rFonts w:ascii="Courier New" w:cs="Courier New" w:eastAsia="Courier New" w:hAnsi="Courier New"/>
+          <w:sz w:val="19"/>
+          <w:szCs w:val="19"/>
+        </w:rPr>
+        <w:t xml:space="preserve">:title</w:t>
+      </w:r>
+      <w:r>
+        <w:rPr>
+          <w:rFonts w:ascii="Times New Roman" w:cs="Times New Roman" w:eastAsia="Times New Roman" w:hAnsi="Times New Roman"/>
+        </w:rPr>
+        <w:t xml:space="preserve">, </w:t>
+      </w:r>
+      <w:r>
+        <w:rPr>
+          <w:rFonts w:ascii="Courier New" w:cs="Courier New" w:eastAsia="Courier New" w:hAnsi="Courier New"/>
+          <w:sz w:val="19"/>
+          <w:szCs w:val="19"/>
+        </w:rPr>
+        <w:t xml:space="preserve">:docnum</w:t>
+      </w:r>
+      <w:r>
+        <w:rPr>
+          <w:rFonts w:ascii="Times New Roman" w:cs="Times New Roman" w:eastAsia="Times New Roman" w:hAnsi="Times New Roman"/>
+        </w:rPr>
+        <w:t xml:space="preserve"> and the title-page tags </w:t>
+      </w:r>
+      <w:r>
+        <w:rPr>
+          <w:rFonts w:ascii="Courier New" w:cs="Courier New" w:eastAsia="Courier New" w:hAnsi="Courier New"/>
+          <w:sz w:val="19"/>
+          <w:szCs w:val="19"/>
+        </w:rPr>
+        <w:t xml:space="preserve">:prodname :subtitle :version :based :filenum</w:t>
+      </w:r>
+      <w:r>
+        <w:rPr>
+          <w:rFonts w:ascii="Times New Roman" w:cs="Times New Roman" w:eastAsia="Times New Roman" w:hAnsi="Times New Roman"/>
+        </w:rPr>
+        <w:t xml:space="preserve">, </w:t>
+      </w:r>
+      <w:r>
+        <w:rPr>
+          <w:rFonts w:ascii="Courier New" w:cs="Courier New" w:eastAsia="Courier New" w:hAnsi="Courier New"/>
+          <w:sz w:val="19"/>
+          <w:szCs w:val="19"/>
+        </w:rPr>
+        <w:t xml:space="preserve">:frontm :tipage :edition :toc :body :appendix</w:t>
+      </w:r>
+      <w:r>
+        <w:rPr>
+          <w:rFonts w:ascii="Times New Roman" w:cs="Times New Roman" w:eastAsia="Times New Roman" w:hAnsi="Times New Roman"/>
+        </w:rPr>
+        <w:t xml:space="preserve">, headings </w:t>
+      </w:r>
+      <w:r>
+        <w:rPr>
+          <w:rFonts w:ascii="Courier New" w:cs="Courier New" w:eastAsia="Courier New" w:hAnsi="Courier New"/>
+          <w:sz w:val="19"/>
+          <w:szCs w:val="19"/>
+        </w:rPr>
+        <w:t xml:space="preserve">:h1</w:t>
+      </w:r>
+      <w:r>
+        <w:rPr>
+          <w:rFonts w:ascii="Times New Roman" w:cs="Times New Roman" w:eastAsia="Times New Roman" w:hAnsi="Times New Roman"/>
+        </w:rPr>
+        <w:t xml:space="preserve">–</w:t>
+      </w:r>
+      <w:r>
+        <w:rPr>
+          <w:rFonts w:ascii="Courier New" w:cs="Courier New" w:eastAsia="Courier New" w:hAnsi="Courier New"/>
+          <w:sz w:val="19"/>
+          <w:szCs w:val="19"/>
+        </w:rPr>
+        <w:t xml:space="preserve">:h6</w:t>
+      </w:r>
+      <w:r>
+        <w:rPr>
+          <w:rFonts w:ascii="Times New Roman" w:cs="Times New Roman" w:eastAsia="Times New Roman" w:hAnsi="Times New Roman"/>
+        </w:rPr>
+        <w:t xml:space="preserve">, </w:t>
+      </w:r>
+      <w:r>
+        <w:rPr>
+          <w:rFonts w:ascii="Courier New" w:cs="Courier New" w:eastAsia="Courier New" w:hAnsi="Courier New"/>
+          <w:sz w:val="19"/>
+          <w:szCs w:val="19"/>
+        </w:rPr>
+        <w:t xml:space="preserve">:p :note :attention</w:t>
+      </w:r>
+      <w:r>
+        <w:rPr>
+          <w:rFonts w:ascii="Times New Roman" w:cs="Times New Roman" w:eastAsia="Times New Roman" w:hAnsi="Times New Roman"/>
+        </w:rPr>
+        <w:t xml:space="preserve">, lists </w:t>
+      </w:r>
+      <w:r>
+        <w:rPr>
+          <w:rFonts w:ascii="Courier New" w:cs="Courier New" w:eastAsia="Courier New" w:hAnsi="Courier New"/>
+          <w:sz w:val="19"/>
+          <w:szCs w:val="19"/>
+        </w:rPr>
+        <w:t xml:space="preserve">:ol :ul :sl :li :dl :dt :dd</w:t>
+      </w:r>
+      <w:r>
+        <w:rPr>
+          <w:rFonts w:ascii="Times New Roman" w:cs="Times New Roman" w:eastAsia="Times New Roman" w:hAnsi="Times New Roman"/>
+        </w:rPr>
+        <w:t xml:space="preserve">, </w:t>
+      </w:r>
+      <w:r>
+        <w:rPr>
+          <w:rFonts w:ascii="Courier New" w:cs="Courier New" w:eastAsia="Courier New" w:hAnsi="Courier New"/>
+          <w:sz w:val="19"/>
+          <w:szCs w:val="19"/>
+        </w:rPr>
+        <w:t xml:space="preserve">:xmp</w:t>
+      </w:r>
+      <w:r>
+        <w:rPr>
+          <w:rFonts w:ascii="Times New Roman" w:cs="Times New Roman" w:eastAsia="Times New Roman" w:hAnsi="Times New Roman"/>
+        </w:rPr>
+        <w:t xml:space="preserve"> for screens, </w:t>
+      </w:r>
+      <w:r>
+        <w:rPr>
+          <w:rFonts w:ascii="Courier New" w:cs="Courier New" w:eastAsia="Courier New" w:hAnsi="Courier New"/>
+          <w:sz w:val="19"/>
+          <w:szCs w:val="19"/>
+        </w:rPr>
+        <w:t xml:space="preserve">:fig :figcap</w:t>
+      </w:r>
+      <w:r>
+        <w:rPr>
+          <w:rFonts w:ascii="Times New Roman" w:cs="Times New Roman" w:eastAsia="Times New Roman" w:hAnsi="Times New Roman"/>
+        </w:rPr>
+        <w:t xml:space="preserve">, </w:t>
+      </w:r>
+      <w:r>
+        <w:rPr>
+          <w:rFonts w:ascii="Courier New" w:cs="Courier New" w:eastAsia="Courier New" w:hAnsi="Courier New"/>
+          <w:sz w:val="19"/>
+          <w:szCs w:val="19"/>
+        </w:rPr>
+        <w:t xml:space="preserve">:table :row :c</w:t>
+      </w:r>
+      <w:r>
+        <w:rPr>
+          <w:rFonts w:ascii="Times New Roman" w:cs="Times New Roman" w:eastAsia="Times New Roman" w:hAnsi="Times New Roman"/>
+        </w:rPr>
+        <w:t xml:space="preserve">, highlighting </w:t>
+      </w:r>
+      <w:r>
+        <w:rPr>
+          <w:rFonts w:ascii="Courier New" w:cs="Courier New" w:eastAsia="Courier New" w:hAnsi="Courier New"/>
+          <w:sz w:val="19"/>
+          <w:szCs w:val="19"/>
+        </w:rPr>
+        <w:t xml:space="preserve">:hp1</w:t>
+      </w:r>
+      <w:r>
+        <w:rPr>
+          <w:rFonts w:ascii="Times New Roman" w:cs="Times New Roman" w:eastAsia="Times New Roman" w:hAnsi="Times New Roman"/>
+        </w:rPr>
+        <w:t xml:space="preserve">–</w:t>
+      </w:r>
+      <w:r>
+        <w:rPr>
+          <w:rFonts w:ascii="Courier New" w:cs="Courier New" w:eastAsia="Courier New" w:hAnsi="Courier New"/>
+          <w:sz w:val="19"/>
+          <w:szCs w:val="19"/>
+        </w:rPr>
+        <w:t xml:space="preserve">:hp3</w:t>
+      </w:r>
+      <w:r>
+        <w:rPr>
+          <w:rFonts w:ascii="Times New Roman" w:cs="Times New Roman" w:eastAsia="Times New Roman" w:hAnsi="Times New Roman"/>
+        </w:rPr>
+        <w:t xml:space="preserve">, </w:t>
+      </w:r>
+      <w:r>
+        <w:rPr>
+          <w:rFonts w:ascii="Courier New" w:cs="Courier New" w:eastAsia="Courier New" w:hAnsi="Courier New"/>
+          <w:sz w:val="19"/>
+          <w:szCs w:val="19"/>
+        </w:rPr>
+        <w:t xml:space="preserve">:q</w:t>
+      </w:r>
+      <w:r>
+        <w:rPr>
+          <w:rFonts w:ascii="Times New Roman" w:cs="Times New Roman" w:eastAsia="Times New Roman" w:hAnsi="Times New Roman"/>
+        </w:rPr>
+        <w:t xml:space="preserve">, </w:t>
+      </w:r>
+      <w:r>
+        <w:rPr>
+          <w:rFonts w:ascii="Courier New" w:cs="Courier New" w:eastAsia="Courier New" w:hAnsi="Courier New"/>
+          <w:sz w:val="19"/>
+          <w:szCs w:val="19"/>
+        </w:rPr>
+        <w:t xml:space="preserve">:xph</w:t>
+      </w:r>
+      <w:r>
+        <w:rPr>
+          <w:rFonts w:ascii="Times New Roman" w:cs="Times New Roman" w:eastAsia="Times New Roman" w:hAnsi="Times New Roman"/>
+        </w:rPr>
+        <w:t xml:space="preserve">, symbols such as </w:t>
+      </w:r>
+      <w:r>
+        <w:rPr>
+          <w:rFonts w:ascii="Courier New" w:cs="Courier New" w:eastAsia="Courier New" w:hAnsi="Courier New"/>
+          <w:sz w:val="19"/>
+          <w:szCs w:val="19"/>
+        </w:rPr>
+        <w:t xml:space="preserve">&amp;colon.</w:t>
+      </w:r>
+      <w:r>
+        <w:rPr>
+          <w:rFonts w:ascii="Times New Roman" w:cs="Times New Roman" w:eastAsia="Times New Roman" w:hAnsi="Times New Roman"/>
+        </w:rPr>
+        <w:t xml:space="preserve"> and </w:t>
+      </w:r>
+      <w:r>
+        <w:rPr>
+          <w:rFonts w:ascii="Courier New" w:cs="Courier New" w:eastAsia="Courier New" w:hAnsi="Courier New"/>
+          <w:sz w:val="19"/>
+          <w:szCs w:val="19"/>
+        </w:rPr>
+        <w:t xml:space="preserve">&amp;amp.</w:t>
+      </w:r>
+      <w:r>
+        <w:rPr>
+          <w:rFonts w:ascii="Times New Roman" w:cs="Times New Roman" w:eastAsia="Times New Roman" w:hAnsi="Times New Roman"/>
+        </w:rPr>
+        <w:t xml:space="preserve">, and the control words </w:t>
+      </w:r>
+      <w:r>
+        <w:rPr>
+          <w:rFonts w:ascii="Courier New" w:cs="Courier New" w:eastAsia="Courier New" w:hAnsi="Courier New"/>
+          <w:sz w:val="19"/>
+          <w:szCs w:val="19"/>
+        </w:rPr>
+        <w:t xml:space="preserve">.*</w:t>
+      </w:r>
+      <w:r>
+        <w:rPr>
+          <w:rFonts w:ascii="Times New Roman" w:cs="Times New Roman" w:eastAsia="Times New Roman" w:hAnsi="Times New Roman"/>
+        </w:rPr>
+        <w:t xml:space="preserve">, </w:t>
+      </w:r>
+      <w:r>
+        <w:rPr>
+          <w:rFonts w:ascii="Courier New" w:cs="Courier New" w:eastAsia="Courier New" w:hAnsi="Courier New"/>
+          <w:sz w:val="19"/>
+          <w:szCs w:val="19"/>
+        </w:rPr>
+        <w:t xml:space="preserve">.sp</w:t>
+      </w:r>
+      <w:r>
+        <w:rPr>
+          <w:rFonts w:ascii="Times New Roman" w:cs="Times New Roman" w:eastAsia="Times New Roman" w:hAnsi="Times New Roman"/>
+        </w:rPr>
+        <w:t xml:space="preserve">, </w:t>
+      </w:r>
+      <w:r>
+        <w:rPr>
+          <w:rFonts w:ascii="Courier New" w:cs="Courier New" w:eastAsia="Courier New" w:hAnsi="Courier New"/>
+          <w:sz w:val="19"/>
+          <w:szCs w:val="19"/>
+        </w:rPr>
+        <w:t xml:space="preserve">.br</w:t>
+      </w:r>
+      <w:r>
+        <w:rPr>
+          <w:rFonts w:ascii="Times New Roman" w:cs="Times New Roman" w:eastAsia="Times New Roman" w:hAnsi="Times New Roman"/>
+        </w:rPr>
+        <w:t xml:space="preserve">, </w:t>
+      </w:r>
+      <w:r>
+        <w:rPr>
+          <w:rFonts w:ascii="Courier New" w:cs="Courier New" w:eastAsia="Courier New" w:hAnsi="Courier New"/>
+          <w:sz w:val="19"/>
+          <w:szCs w:val="19"/>
+        </w:rPr>
+        <w:t xml:space="preserve">.pa</w:t>
+      </w:r>
+      <w:r>
+        <w:rPr>
+          <w:rFonts w:ascii="Times New Roman" w:cs="Times New Roman" w:eastAsia="Times New Roman" w:hAnsi="Times New Roman"/>
+        </w:rPr>
+        <w:t xml:space="preserve">, </w:t>
+      </w:r>
+      <w:r>
+        <w:rPr>
+          <w:rFonts w:ascii="Courier New" w:cs="Courier New" w:eastAsia="Courier New" w:hAnsi="Courier New"/>
+          <w:sz w:val="19"/>
+          <w:szCs w:val="19"/>
+        </w:rPr>
+        <w:t xml:space="preserve">.im</w:t>
+      </w:r>
+      <w:r>
+        <w:rPr>
+          <w:rFonts w:ascii="Times New Roman" w:cs="Times New Roman" w:eastAsia="Times New Roman" w:hAnsi="Times New Roman"/>
+        </w:rPr>
+        <w:t xml:space="preserve">.</w:t>
+      </w:r>
+    </w:p>
+    <w:tbl>
+      <w:tblPr>
+        <w:tblW w:type="dxa" w:w="9638"/>
+        <w:tblBorders>
+          <w:top w:val="single" w:color="auto" w:sz="4"/>
+          <w:left w:val="single" w:color="auto" w:sz="4"/>
+          <w:bottom w:val="single" w:color="auto" w:sz="4"/>
+          <w:right w:val="single" w:color="auto" w:sz="4"/>
+          <w:insideH w:val="single" w:color="auto" w:sz="4"/>
+          <w:insideV w:val="single" w:color="auto" w:sz="4"/>
+        </w:tblBorders>
+      </w:tblPr>
+      <w:tblGrid>
+        <w:gridCol w:w="9638"/>
+      </w:tblGrid>
+      <w:tr>
+        <w:trPr>
+          <w:cantSplit/>
+        </w:trPr>
+        <w:tc>
+          <w:tcPr>
+            <w:tcW w:type="dxa" w:w="9638"/>
+            <w:shd w:fill="F2F2F2" w:color="auto" w:val="clear"/>
+            <w:tcMar>
+              <w:top w:type="dxa" w:w="100"/>
+              <w:left w:type="dxa" w:w="140"/>
+              <w:bottom w:type="dxa" w:w="100"/>
+              <w:right w:type="dxa" w:w="140"/>
+            </w:tcMar>
+          </w:tcPr>
+          <w:p>
+            <w:pPr>
+              <w:spacing w:after="0" w:line="228"/>
+            </w:pPr>
+            <w:r>
+              <w:rPr>
+                <w:rFonts w:ascii="Courier New" w:cs="Courier New" w:eastAsia="Courier New" w:hAnsi="Courier New"/>
+                <w:sz w:val="17"/>
+                <w:szCs w:val="17"/>
+              </w:rPr>
+              <w:t xml:space="preserve">:h1.Introduction</w:t>
+            </w:r>
+          </w:p>
+          <w:p>
+            <w:pPr>
+              <w:spacing w:after="0" w:line="228"/>
+            </w:pPr>
+            <w:r>
+              <w:rPr>
+                <w:rFonts w:ascii="Courier New" w:cs="Courier New" w:eastAsia="Courier New" w:hAnsi="Courier New"/>
+                <w:sz w:val="17"/>
+                <w:szCs w:val="17"/>
+              </w:rPr>
+              <w:t xml:space="preserve">:p.This book is written in :hp2.BookMaster:ehp2. markup.</w:t>
+            </w:r>
+          </w:p>
+          <w:p>
+            <w:pPr>
+              <w:spacing w:after="0" w:line="228"/>
+            </w:pPr>
+            <w:r>
+              <w:rPr>
+                <w:rFonts w:ascii="Courier New" w:cs="Courier New" w:eastAsia="Courier New" w:hAnsi="Courier New"/>
+                <w:sz w:val="17"/>
+                <w:szCs w:val="17"/>
+              </w:rPr>
+              <w:t xml:space="preserve">:ul.</w:t>
+            </w:r>
+          </w:p>
+          <w:p>
+            <w:pPr>
+              <w:spacing w:after="0" w:line="228"/>
+            </w:pPr>
+            <w:r>
+              <w:rPr>
+                <w:rFonts w:ascii="Courier New" w:cs="Courier New" w:eastAsia="Courier New" w:hAnsi="Courier New"/>
+                <w:sz w:val="17"/>
+                <w:szCs w:val="17"/>
+              </w:rPr>
+              <w:t xml:space="preserve">:li.headings, paragraphs and highlighting;</w:t>
+            </w:r>
+          </w:p>
+          <w:p>
+            <w:pPr>
+              <w:spacing w:after="0" w:line="228"/>
+            </w:pPr>
+            <w:r>
+              <w:rPr>
+                <w:rFonts w:ascii="Courier New" w:cs="Courier New" w:eastAsia="Courier New" w:hAnsi="Courier New"/>
+                <w:sz w:val="17"/>
+                <w:szCs w:val="17"/>
+              </w:rPr>
+              <w:t xml:space="preserve">:li.lists, screens, figures and tables.</w:t>
+            </w:r>
+          </w:p>
+          <w:p>
+            <w:pPr>
+              <w:spacing w:after="0" w:line="228"/>
+            </w:pPr>
+            <w:r>
+              <w:rPr>
+                <w:rFonts w:ascii="Courier New" w:cs="Courier New" w:eastAsia="Courier New" w:hAnsi="Courier New"/>
+                <w:sz w:val="17"/>
+                <w:szCs w:val="17"/>
+              </w:rPr>
+              <w:t xml:space="preserve">:eul.</w:t>
+            </w:r>
+          </w:p>
+        </w:tc>
+      </w:tr>
+    </w:tbl>
+    <w:p>
+      <w:pPr>
+        <w:spacing w:after="200" w:before="80"/>
+      </w:pPr>
+      <w:r>
+        <w:rPr>
+          <w:rFonts w:ascii="Arial" w:cs="Arial" w:eastAsia="Arial" w:hAnsi="Arial"/>
+          <w:b/>
+          <w:bCs/>
+          <w:sz w:val="18"/>
+          <w:szCs w:val="18"/>
+        </w:rPr>
+        <w:t xml:space="preserve">Figure 41. </w:t>
+      </w:r>
+      <w:r>
+        <w:rPr>
+          <w:rFonts w:ascii="Arial" w:cs="Arial" w:eastAsia="Arial" w:hAnsi="Arial"/>
+          <w:sz w:val="18"/>
+          <w:szCs w:val="18"/>
+        </w:rPr>
+        <w:t xml:space="preserve">BookMaster markup</w:t>
+      </w:r>
+    </w:p>
+    <w:p>
+      <w:pPr>
+        <w:pStyle w:val="Heading2"/>
+      </w:pPr>
+      <w:r>
+        <w:t xml:space="preserve">LaTeX</w:t>
+      </w:r>
+    </w:p>
+    <w:p>
+      <w:pPr>
+        <w:spacing w:after="120"/>
+      </w:pPr>
+      <w:r>
+        <w:rPr>
+          <w:rFonts w:ascii="Courier New" w:cs="Courier New" w:eastAsia="Courier New" w:hAnsi="Courier New"/>
+          <w:sz w:val="19"/>
+          <w:szCs w:val="19"/>
+        </w:rPr>
+        <w:t xml:space="preserve">LATEX fn [ft [fm]]</w:t>
+      </w:r>
+      <w:r>
+        <w:rPr>
+          <w:rFonts w:ascii="Times New Roman" w:cs="Times New Roman" w:eastAsia="Times New Roman" w:hAnsi="Times New Roman"/>
+        </w:rPr>
+        <w:t xml:space="preserve"> (file type TEX by default) runs LaTeX (pdfTeX, TeX Live 2023) twice, for the contents and references, and dvips; the PostScript comes back as </w:t>
+      </w:r>
+      <w:r>
+        <w:rPr>
+          <w:rFonts w:ascii="Courier New" w:cs="Courier New" w:eastAsia="Courier New" w:hAnsi="Courier New"/>
+          <w:sz w:val="19"/>
+          <w:szCs w:val="19"/>
+        </w:rPr>
+        <w:t xml:space="preserve">fn PS A</w:t>
+      </w:r>
+      <w:r>
+        <w:rPr>
+          <w:rFonts w:ascii="Times New Roman" w:cs="Times New Roman" w:eastAsia="Times New Roman" w:hAnsi="Times New Roman"/>
+        </w:rPr>
+        <w:t xml:space="preserve">. </w:t>
+      </w:r>
+      <w:r>
+        <w:rPr>
+          <w:rFonts w:ascii="Courier New" w:cs="Courier New" w:eastAsia="Courier New" w:hAnsi="Courier New"/>
+          <w:sz w:val="19"/>
+          <w:szCs w:val="19"/>
+        </w:rPr>
+        <w:t xml:space="preserve">LATEX fn (PDF</w:t>
+      </w:r>
+      <w:r>
+        <w:rPr>
+          <w:rFonts w:ascii="Times New Roman" w:cs="Times New Roman" w:eastAsia="Times New Roman" w:hAnsi="Times New Roman"/>
+        </w:rPr>
+        <w:t xml:space="preserve"> runs pdfLaTeX and leaves the PDF in the Debian guest. The packages are those of LaTeX itself, amsmath, graphics, tools, geometry and url; a run takes about a minute.</w:t>
+      </w:r>
+    </w:p>
+    <w:p>
+      <w:pPr>
+        <w:pStyle w:val="Heading2"/>
+      </w:pPr>
+      <w:r>
+        <w:t xml:space="preserve">Printing PostScript</w:t>
+      </w:r>
+    </w:p>
+    <w:p>
+      <w:pPr>
+        <w:spacing w:after="120"/>
+      </w:pPr>
+      <w:r>
+        <w:rPr>
+          <w:rFonts w:ascii="Courier New" w:cs="Courier New" w:eastAsia="Courier New" w:hAnsi="Courier New"/>
+          <w:sz w:val="19"/>
+          <w:szCs w:val="19"/>
+        </w:rPr>
+        <w:t xml:space="preserve">PSPRINT fn [ft [fm]]</w:t>
+      </w:r>
+      <w:r>
+        <w:rPr>
+          <w:rFonts w:ascii="Times New Roman" w:cs="Times New Roman" w:eastAsia="Times New Roman" w:hAnsi="Times New Roman"/>
+        </w:rPr>
+        <w:t xml:space="preserve"> (file type PS by default) prints a PostScript file. By default it goes to the virtual printer without page headers; CP’s printer 00E writes it on the PC, where </w:t>
+      </w:r>
+      <w:r>
+        <w:rPr>
+          <w:rFonts w:ascii="Courier New" w:cs="Courier New" w:eastAsia="Courier New" w:hAnsi="Courier New"/>
+          <w:sz w:val="19"/>
+          <w:szCs w:val="19"/>
+        </w:rPr>
+        <w:t xml:space="preserve">tools/psprint.py</w:t>
+      </w:r>
+      <w:r>
+        <w:rPr>
+          <w:rFonts w:ascii="Times New Roman" w:cs="Times New Roman" w:eastAsia="Times New Roman" w:hAnsi="Times New Roman"/>
+        </w:rPr>
+        <w:t xml:space="preserve"> takes each PostScript job out unchanged and hands it to the printer (lp, or a printer’s port 9100) or makes a PDF. With </w:t>
+      </w:r>
+      <w:r>
+        <w:rPr>
+          <w:rFonts w:ascii="Courier New" w:cs="Courier New" w:eastAsia="Courier New" w:hAnsi="Courier New"/>
+          <w:sz w:val="19"/>
+          <w:szCs w:val="19"/>
+        </w:rPr>
+        <w:t xml:space="preserve">(BRIDGE [format]</w:t>
+      </w:r>
+      <w:r>
+        <w:rPr>
+          <w:rFonts w:ascii="Times New Roman" w:cs="Times New Roman" w:eastAsia="Times New Roman" w:hAnsi="Times New Roman"/>
+        </w:rPr>
+        <w:t xml:space="preserve"> it goes through the spool bridge: Ghostscript in the Debian guest converts it to </w:t>
+      </w:r>
+      <w:r>
+        <w:rPr>
+          <w:rFonts w:ascii="Courier New" w:cs="Courier New" w:eastAsia="Courier New" w:hAnsi="Courier New"/>
+          <w:sz w:val="19"/>
+          <w:szCs w:val="19"/>
+        </w:rPr>
+        <w:t xml:space="preserve">ps</w:t>
+      </w:r>
+      <w:r>
+        <w:rPr>
+          <w:rFonts w:ascii="Times New Roman" w:cs="Times New Roman" w:eastAsia="Times New Roman" w:hAnsi="Times New Roman"/>
+        </w:rPr>
+        <w:t xml:space="preserve">, </w:t>
+      </w:r>
+      <w:r>
+        <w:rPr>
+          <w:rFonts w:ascii="Courier New" w:cs="Courier New" w:eastAsia="Courier New" w:hAnsi="Courier New"/>
+          <w:sz w:val="19"/>
+          <w:szCs w:val="19"/>
+        </w:rPr>
+        <w:t xml:space="preserve">pdf</w:t>
+      </w:r>
+      <w:r>
+        <w:rPr>
+          <w:rFonts w:ascii="Times New Roman" w:cs="Times New Roman" w:eastAsia="Times New Roman" w:hAnsi="Times New Roman"/>
+        </w:rPr>
+        <w:t xml:space="preserve">, </w:t>
+      </w:r>
+      <w:r>
+        <w:rPr>
+          <w:rFonts w:ascii="Courier New" w:cs="Courier New" w:eastAsia="Courier New" w:hAnsi="Courier New"/>
+          <w:sz w:val="19"/>
+          <w:szCs w:val="19"/>
+        </w:rPr>
+        <w:t xml:space="preserve">ljet4</w:t>
+      </w:r>
+      <w:r>
+        <w:rPr>
+          <w:rFonts w:ascii="Times New Roman" w:cs="Times New Roman" w:eastAsia="Times New Roman" w:hAnsi="Times New Roman"/>
+        </w:rPr>
+        <w:t xml:space="preserve">, </w:t>
+      </w:r>
+      <w:r>
+        <w:rPr>
+          <w:rFonts w:ascii="Courier New" w:cs="Courier New" w:eastAsia="Courier New" w:hAnsi="Courier New"/>
+          <w:sz w:val="19"/>
+          <w:szCs w:val="19"/>
+        </w:rPr>
+        <w:t xml:space="preserve">pxlmono</w:t>
+      </w:r>
+      <w:r>
+        <w:rPr>
+          <w:rFonts w:ascii="Times New Roman" w:cs="Times New Roman" w:eastAsia="Times New Roman" w:hAnsi="Times New Roman"/>
+        </w:rPr>
+        <w:t xml:space="preserve"> or </w:t>
+      </w:r>
+      <w:r>
+        <w:rPr>
+          <w:rFonts w:ascii="Courier New" w:cs="Courier New" w:eastAsia="Courier New" w:hAnsi="Courier New"/>
+          <w:sz w:val="19"/>
+          <w:szCs w:val="19"/>
+        </w:rPr>
+        <w:t xml:space="preserve">pxlcolor</w:t>
+      </w:r>
+      <w:r>
+        <w:rPr>
+          <w:rFonts w:ascii="Times New Roman" w:cs="Times New Roman" w:eastAsia="Times New Roman" w:hAnsi="Times New Roman"/>
+        </w:rPr>
+        <w:t xml:space="preserve"> and sends it to the printer named in </w:t>
+      </w:r>
+      <w:r>
+        <w:rPr>
+          <w:rFonts w:ascii="Courier New" w:cs="Courier New" w:eastAsia="Courier New" w:hAnsi="Courier New"/>
+          <w:sz w:val="19"/>
+          <w:szCs w:val="19"/>
+        </w:rPr>
+        <w:t xml:space="preserve">/etc/vmspool.d/print.conf</w:t>
+      </w:r>
+      <w:r>
+        <w:rPr>
+          <w:rFonts w:ascii="Times New Roman" w:cs="Times New Roman" w:eastAsia="Times New Roman" w:hAnsi="Times New Roman"/>
+        </w:rPr>
+        <w:t xml:space="preserve">.</w:t>
+      </w:r>
+    </w:p>
+    <w:tbl>
+      <w:tblPr>
+        <w:tblW w:type="dxa" w:w="9638"/>
+        <w:tblBorders>
+          <w:top w:val="single" w:color="auto" w:sz="4"/>
+          <w:left w:val="single" w:color="auto" w:sz="4"/>
+          <w:bottom w:val="single" w:color="auto" w:sz="4"/>
+          <w:right w:val="single" w:color="auto" w:sz="4"/>
+          <w:insideH w:val="single" w:color="auto" w:sz="4"/>
+          <w:insideV w:val="single" w:color="auto" w:sz="4"/>
+        </w:tblBorders>
+      </w:tblPr>
+      <w:tblGrid>
+        <w:gridCol w:w="9638"/>
+      </w:tblGrid>
+      <w:tr>
+        <w:trPr>
+          <w:cantSplit/>
+        </w:trPr>
+        <w:tc>
+          <w:tcPr>
+            <w:tcW w:type="dxa" w:w="9638"/>
+            <w:shd w:fill="F2F2F2" w:color="auto" w:val="clear"/>
+            <w:tcMar>
+              <w:top w:type="dxa" w:w="100"/>
+              <w:left w:type="dxa" w:w="140"/>
+              <w:bottom w:type="dxa" w:w="100"/>
+              <w:right w:type="dxa" w:w="140"/>
+            </w:tcMar>
+          </w:tcPr>
+          <w:p>
+            <w:pPr>
+              <w:spacing w:after="0" w:line="228"/>
+            </w:pPr>
+            <w:r>
+              <w:rPr>
+                <w:rFonts w:ascii="Courier New" w:cs="Courier New" w:eastAsia="Courier New" w:hAnsi="Courier New"/>
+                <w:sz w:val="17"/>
+                <w:szCs w:val="17"/>
+              </w:rPr>
+              <w:t xml:space="preserve">bookie sample (ps</w:t>
+            </w:r>
+          </w:p>
+          <w:p>
+            <w:pPr>
+              <w:spacing w:after="0" w:line="228"/>
+            </w:pPr>
+            <w:r>
+              <w:rPr>
+                <w:rFonts w:ascii="Courier New" w:cs="Courier New" w:eastAsia="Courier New" w:hAnsi="Courier New"/>
+                <w:sz w:val="17"/>
+                <w:szCs w:val="17"/>
+              </w:rPr>
+              <w:t xml:space="preserve">bookie: /var/spool/vmspool/out/operator/sample.ps, 12369 bytes, 5 page(s)</w:t>
+            </w:r>
+          </w:p>
+          <w:p>
+            <w:pPr>
+              <w:spacing w:after="0" w:line="228"/>
+            </w:pPr>
+            <w:r>
+              <w:rPr>
+                <w:rFonts w:ascii="Courier New" w:cs="Courier New" w:eastAsia="Courier New" w:hAnsi="Courier New"/>
+                <w:sz w:val="17"/>
+                <w:szCs w:val="17"/>
+              </w:rPr>
+              <w:t xml:space="preserve">BOOKIE: SAMPLE PS A, 354 lines</w:t>
+            </w:r>
+          </w:p>
+          <w:p>
+            <w:pPr>
+              <w:spacing w:after="0" w:line="228"/>
+            </w:pPr>
+            <w:r>
+              <w:rPr>
+                <w:rFonts w:ascii="Courier New" w:cs="Courier New" w:eastAsia="Courier New" w:hAnsi="Courier New"/>
+                <w:sz w:val="17"/>
+                <w:szCs w:val="17"/>
+              </w:rPr>
+              <w:t xml:space="preserve">Ready;</w:t>
+            </w:r>
+          </w:p>
+          <w:p>
+            <w:pPr>
+              <w:spacing w:after="0" w:line="228"/>
+            </w:pPr>
+            <w:r>
+              <w:rPr>
+                <w:rFonts w:ascii="Courier New" w:cs="Courier New" w:eastAsia="Courier New" w:hAnsi="Courier New"/>
+                <w:sz w:val="17"/>
+                <w:szCs w:val="17"/>
+              </w:rPr>
+              <w:t xml:space="preserve">psprint sample</w:t>
+            </w:r>
+          </w:p>
+          <w:p>
+            <w:pPr>
+              <w:spacing w:after="0" w:line="228"/>
+            </w:pPr>
+            <w:r>
+              <w:rPr>
+                <w:rFonts w:ascii="Courier New" w:cs="Courier New" w:eastAsia="Courier New" w:hAnsi="Courier New"/>
+                <w:sz w:val="17"/>
+                <w:szCs w:val="17"/>
+              </w:rPr>
+              <w:t xml:space="preserve">PRT  00E OUTPUT OF OPERATOR FILE  = 0041 RECDS= 000355 COPY= 01  A PRT</w:t>
+            </w:r>
+          </w:p>
+          <w:p>
+            <w:pPr>
+              <w:spacing w:after="0" w:line="228"/>
+            </w:pPr>
+            <w:r>
+              <w:rPr>
+                <w:rFonts w:ascii="Courier New" w:cs="Courier New" w:eastAsia="Courier New" w:hAnsi="Courier New"/>
+                <w:sz w:val="17"/>
+                <w:szCs w:val="17"/>
+              </w:rPr>
+              <w:t xml:space="preserve">Ready;</w:t>
+            </w:r>
+          </w:p>
+        </w:tc>
+      </w:tr>
+    </w:tbl>
+    <w:p>
+      <w:pPr>
+        <w:spacing w:after="200" w:before="80"/>
+      </w:pPr>
+      <w:r>
+        <w:rPr>
+          <w:rFonts w:ascii="Arial" w:cs="Arial" w:eastAsia="Arial" w:hAnsi="Arial"/>
+          <w:b/>
+          <w:bCs/>
+          <w:sz w:val="18"/>
+          <w:szCs w:val="18"/>
+        </w:rPr>
+        <w:t xml:space="preserve">Figure 42. </w:t>
+      </w:r>
+      <w:r>
+        <w:rPr>
+          <w:rFonts w:ascii="Arial" w:cs="Arial" w:eastAsia="Arial" w:hAnsi="Arial"/>
+          <w:sz w:val="18"/>
+          <w:szCs w:val="18"/>
+        </w:rPr>
+        <w:t xml:space="preserve">A document formatted and printed</w:t>
+      </w:r>
+    </w:p>
+    <w:p>
+      <w:pPr>
+        <w:spacing w:after="120"/>
+      </w:pPr>
+      <w:r>
+        <w:rPr>
+          <w:rFonts w:ascii="Times New Roman" w:cs="Times New Roman" w:eastAsia="Times New Roman" w:hAnsi="Times New Roman"/>
+        </w:rPr>
+        <w:t xml:space="preserve">Ghostscript itself (</w:t>
+      </w:r>
+      <w:r>
+        <w:rPr>
+          <w:rFonts w:ascii="Courier New" w:cs="Courier New" w:eastAsia="Courier New" w:hAnsi="Courier New"/>
+          <w:sz w:val="19"/>
+          <w:szCs w:val="19"/>
+        </w:rPr>
+        <w:t xml:space="preserve">gs</w:t>
+      </w:r>
+      <w:r>
+        <w:rPr>
+          <w:rFonts w:ascii="Times New Roman" w:cs="Times New Roman" w:eastAsia="Times New Roman" w:hAnsi="Times New Roman"/>
+        </w:rPr>
+        <w:t xml:space="preserve">, </w:t>
+      </w:r>
+      <w:r>
+        <w:rPr>
+          <w:rFonts w:ascii="Courier New" w:cs="Courier New" w:eastAsia="Courier New" w:hAnsi="Courier New"/>
+          <w:sz w:val="19"/>
+          <w:szCs w:val="19"/>
+        </w:rPr>
+        <w:t xml:space="preserve">ps2pdf</w:t>
+      </w:r>
+      <w:r>
+        <w:rPr>
+          <w:rFonts w:ascii="Times New Roman" w:cs="Times New Roman" w:eastAsia="Times New Roman" w:hAnsi="Times New Roman"/>
+        </w:rPr>
+        <w:t xml:space="preserve">, </w:t>
+      </w:r>
+      <w:r>
+        <w:rPr>
+          <w:rFonts w:ascii="Courier New" w:cs="Courier New" w:eastAsia="Courier New" w:hAnsi="Courier New"/>
+          <w:sz w:val="19"/>
+          <w:szCs w:val="19"/>
+        </w:rPr>
+        <w:t xml:space="preserve">pdf2ps</w:t>
+      </w:r>
+      <w:r>
+        <w:rPr>
+          <w:rFonts w:ascii="Times New Roman" w:cs="Times New Roman" w:eastAsia="Times New Roman" w:hAnsi="Times New Roman"/>
+        </w:rPr>
+        <w:t xml:space="preserve">) is in the Debian guest for Linux users.</w:t>
+      </w:r>
+    </w:p>
+    <w:p>
+      <w:pPr>
+        <w:pStyle w:val="Heading1"/>
+        <w:pageBreakBefore/>
+      </w:pPr>
+      <w:r>
+        <w:t xml:space="preserve">Chapter 10. Restrictions and Known Problems</w:t>
       </w:r>
     </w:p>
     <w:tbl>
@@ -22089,6 +24380,102 @@
                 <w:sz w:val="19"/>
                 <w:szCs w:val="19"/>
               </w:rPr>
+              <w:t xml:space="preserve">REXX EXECs</w:t>
+            </w:r>
+          </w:p>
+        </w:tc>
+        <w:tc>
+          <w:tcPr>
+            <w:tcW w:type="dxa" w:w="7238"/>
+            <w:tcMar>
+              <w:top w:type="dxa" w:w="60"/>
+              <w:left w:type="dxa" w:w="100"/>
+              <w:bottom w:type="dxa" w:w="60"/>
+              <w:right w:type="dxa" w:w="100"/>
+            </w:tcMar>
+          </w:tcPr>
+          <w:p>
+            <w:r>
+              <w:rPr>
+                <w:rFonts w:ascii="Times New Roman" w:cs="Times New Roman" w:eastAsia="Times New Roman" w:hAnsi="Times New Roman"/>
+                <w:sz w:val="19"/>
+                <w:szCs w:val="19"/>
+              </w:rPr>
+              <w:t xml:space="preserve">An EXEC called with eight or more arguments ends CMS when the GCCLIB segment is loaded (machines below about 15 MB); this is so in the Community Edition too (I-277). Keep to seven.</w:t>
+            </w:r>
+          </w:p>
+        </w:tc>
+      </w:tr>
+      <w:tr>
+        <w:trPr>
+          <w:cantSplit/>
+          <w:tblHeader w:val="false"/>
+        </w:trPr>
+        <w:tc>
+          <w:tcPr>
+            <w:tcW w:type="dxa" w:w="2400"/>
+            <w:tcMar>
+              <w:top w:type="dxa" w:w="60"/>
+              <w:left w:type="dxa" w:w="100"/>
+              <w:bottom w:type="dxa" w:w="60"/>
+              <w:right w:type="dxa" w:w="100"/>
+            </w:tcMar>
+          </w:tcPr>
+          <w:p>
+            <w:r>
+              <w:rPr>
+                <w:rFonts w:ascii="Times New Roman" w:cs="Times New Roman" w:eastAsia="Times New Roman" w:hAnsi="Times New Roman"/>
+                <w:sz w:val="19"/>
+                <w:szCs w:val="19"/>
+              </w:rPr>
+              <w:t xml:space="preserve">Spool bridge</w:t>
+            </w:r>
+          </w:p>
+        </w:tc>
+        <w:tc>
+          <w:tcPr>
+            <w:tcW w:type="dxa" w:w="7238"/>
+            <w:tcMar>
+              <w:top w:type="dxa" w:w="60"/>
+              <w:left w:type="dxa" w:w="100"/>
+              <w:bottom w:type="dxa" w:w="60"/>
+              <w:right w:type="dxa" w:w="100"/>
+            </w:tcMar>
+          </w:tcPr>
+          <w:p>
+            <w:r>
+              <w:rPr>
+                <w:rFonts w:ascii="Times New Roman" w:cs="Times New Roman" w:eastAsia="Times New Roman" w:hAnsi="Times New Roman"/>
+                <w:sz w:val="19"/>
+                <w:szCs w:val="19"/>
+              </w:rPr>
+              <w:t xml:space="preserve">Requests and answers are 80-column cards: a longer line of a TeX or BookMaster source is cut.</w:t>
+            </w:r>
+          </w:p>
+        </w:tc>
+      </w:tr>
+      <w:tr>
+        <w:trPr>
+          <w:cantSplit/>
+          <w:tblHeader w:val="false"/>
+        </w:trPr>
+        <w:tc>
+          <w:tcPr>
+            <w:tcW w:type="dxa" w:w="2400"/>
+            <w:tcMar>
+              <w:top w:type="dxa" w:w="60"/>
+              <w:left w:type="dxa" w:w="100"/>
+              <w:bottom w:type="dxa" w:w="60"/>
+              <w:right w:type="dxa" w:w="100"/>
+            </w:tcMar>
+          </w:tcPr>
+          <w:p>
+            <w:r>
+              <w:rPr>
+                <w:rFonts w:ascii="Times New Roman" w:cs="Times New Roman" w:eastAsia="Times New Roman" w:hAnsi="Times New Roman"/>
+                <w:sz w:val="19"/>
+                <w:szCs w:val="19"/>
+              </w:rPr>
               <w:t xml:space="preserve">Linux</w:t>
             </w:r>
           </w:p>
@@ -22128,7 +24515,7 @@
           <w:sz w:val="18"/>
           <w:szCs w:val="18"/>
         </w:rPr>
-        <w:t xml:space="preserve">Figure 38. </w:t>
+        <w:t xml:space="preserve">Figure 43. </w:t>
       </w:r>
       <w:r>
         <w:rPr>
@@ -22227,7 +24614,7 @@
           <w:sz w:val="18"/>
           <w:szCs w:val="18"/>
         </w:rPr>
-        <w:t xml:space="preserve">Figure 39. </w:t>
+        <w:t xml:space="preserve">Figure 44. </w:t>
       </w:r>
       <w:r>
         <w:rPr>
@@ -22370,7 +24757,7 @@
           <w:sz w:val="18"/>
           <w:szCs w:val="18"/>
         </w:rPr>
-        <w:t xml:space="preserve">Figure 40. </w:t>
+        <w:t xml:space="preserve">Figure 45. </w:t>
       </w:r>
       <w:r>
         <w:rPr>
@@ -22642,7 +25029,7 @@
           <w:sz w:val="18"/>
           <w:szCs w:val="18"/>
         </w:rPr>
-        <w:t xml:space="preserve">Figure 41. </w:t>
+        <w:t xml:space="preserve">Figure 46. </w:t>
       </w:r>
       <w:r>
         <w:rPr>
@@ -22884,7 +25271,7 @@
           <w:sz w:val="18"/>
           <w:szCs w:val="18"/>
         </w:rPr>
-        <w:t xml:space="preserve">Figure 42. </w:t>
+        <w:t xml:space="preserve">Figure 47. </w:t>
       </w:r>
       <w:r>
         <w:rPr>
@@ -22961,7 +25348,7 @@
           <w:sz w:val="18"/>
           <w:szCs w:val="18"/>
         </w:rPr>
-        <w:t xml:space="preserve">Figure 43. </w:t>
+        <w:t xml:space="preserve">Figure 48. </w:t>
       </w:r>
       <w:r>
         <w:rPr>
@@ -23091,7 +25478,7 @@
           <w:sz w:val="18"/>
           <w:szCs w:val="18"/>
         </w:rPr>
-        <w:t xml:space="preserve">Figure 44. </w:t>
+        <w:t xml:space="preserve">Figure 49. </w:t>
       </w:r>
       <w:r>
         <w:rPr>
@@ -23265,7 +25652,7 @@
           <w:sz w:val="18"/>
           <w:szCs w:val="18"/>
         </w:rPr>
-        <w:t xml:space="preserve">Figure 45. </w:t>
+        <w:t xml:space="preserve">Figure 50. </w:t>
       </w:r>
       <w:r>
         <w:rPr>
@@ -23355,7 +25742,7 @@
           <w:sz w:val="18"/>
           <w:szCs w:val="18"/>
         </w:rPr>
-        <w:t xml:space="preserve">Figure 46. </w:t>
+        <w:t xml:space="preserve">Figure 51. </w:t>
       </w:r>
       <w:r>
         <w:rPr>
@@ -24102,7 +26489,7 @@
           <w:sz w:val="18"/>
           <w:szCs w:val="18"/>
         </w:rPr>
-        <w:t xml:space="preserve">Figure 47. </w:t>
+        <w:t xml:space="preserve">Figure 52. </w:t>
       </w:r>
       <w:r>
         <w:rPr>
@@ -24204,7 +26591,7 @@
           <w:sz w:val="18"/>
           <w:szCs w:val="18"/>
         </w:rPr>
-        <w:t xml:space="preserve">Figure 48. </w:t>
+        <w:t xml:space="preserve">Figure 53. </w:t>
       </w:r>
       <w:r>
         <w:rPr>
@@ -24379,7 +26766,7 @@
           <w:sz w:val="18"/>
           <w:szCs w:val="18"/>
         </w:rPr>
-        <w:t xml:space="preserve">Figure 49. </w:t>
+        <w:t xml:space="preserve">Figure 54. </w:t>
       </w:r>
       <w:r>
         <w:rPr>
@@ -24456,7 +26843,7 @@
           <w:sz w:val="18"/>
           <w:szCs w:val="18"/>
         </w:rPr>
-        <w:t xml:space="preserve">Figure 50. </w:t>
+        <w:t xml:space="preserve">Figure 55. </w:t>
       </w:r>
       <w:r>
         <w:rPr>
@@ -24736,7 +27123,7 @@
           <w:sz w:val="18"/>
           <w:szCs w:val="18"/>
         </w:rPr>
-        <w:t xml:space="preserve">Figure 51. </w:t>
+        <w:t xml:space="preserve">Figure 56. </w:t>
       </w:r>
       <w:r>
         <w:rPr>
@@ -24865,7 +27252,7 @@
           <w:sz w:val="18"/>
           <w:szCs w:val="18"/>
         </w:rPr>
-        <w:t xml:space="preserve">Figure 52. </w:t>
+        <w:t xml:space="preserve">Figure 57. </w:t>
       </w:r>
       <w:r>
         <w:rPr>
@@ -25097,7 +27484,7 @@
           <w:sz w:val="18"/>
           <w:szCs w:val="18"/>
         </w:rPr>
-        <w:t xml:space="preserve">Figure 53. </w:t>
+        <w:t xml:space="preserve">Figure 58. </w:t>
       </w:r>
       <w:r>
         <w:rPr>
@@ -25393,6 +27780,241 @@
           <w:rFonts w:ascii="Times New Roman" w:cs="Times New Roman" w:eastAsia="Times New Roman" w:hAnsi="Times New Roman"/>
         </w:rPr>
         <w:t xml:space="preserve"> runs the service machine.</w:t>
+      </w:r>
+    </w:p>
+    <w:p>
+      <w:pPr>
+        <w:pStyle w:val="Heading2"/>
+      </w:pPr>
+      <w:r>
+        <w:t xml:space="preserve">LXCALL, PHONE, MQTT</w:t>
+      </w:r>
+    </w:p>
+    <w:p>
+      <w:pPr>
+        <w:spacing w:after="120"/>
+      </w:pPr>
+      <w:r>
+        <w:rPr>
+          <w:rFonts w:ascii="Courier New" w:cs="Courier New" w:eastAsia="Courier New" w:hAnsi="Courier New"/>
+          <w:sz w:val="19"/>
+          <w:szCs w:val="19"/>
+        </w:rPr>
+        <w:t xml:space="preserve">LXCALL service [args] (FILE fn ft fm | SERVER userid | WAIT n | NOTYPE</w:t>
+      </w:r>
+      <w:r>
+        <w:rPr>
+          <w:rFonts w:ascii="Times New Roman" w:cs="Times New Roman" w:eastAsia="Times New Roman" w:hAnsi="Times New Roman"/>
+        </w:rPr>
+        <w:t xml:space="preserve">; </w:t>
+      </w:r>
+      <w:r>
+        <w:rPr>
+          <w:rFonts w:ascii="Courier New" w:cs="Courier New" w:eastAsia="Courier New" w:hAnsi="Courier New"/>
+          <w:sz w:val="19"/>
+          <w:szCs w:val="19"/>
+        </w:rPr>
+        <w:t xml:space="preserve">PHONE STATUS|CHANNELS|PEERS|CALL ext [ctx]|HANGUP channel</w:t>
+      </w:r>
+      <w:r>
+        <w:rPr>
+          <w:rFonts w:ascii="Times New Roman" w:cs="Times New Roman" w:eastAsia="Times New Roman" w:hAnsi="Times New Roman"/>
+        </w:rPr>
+        <w:t xml:space="preserve">; </w:t>
+      </w:r>
+      <w:r>
+        <w:rPr>
+          <w:rFonts w:ascii="Courier New" w:cs="Courier New" w:eastAsia="Courier New" w:hAnsi="Courier New"/>
+          <w:sz w:val="19"/>
+          <w:szCs w:val="19"/>
+        </w:rPr>
+        <w:t xml:space="preserve">MQTT PUB topic message</w:t>
+      </w:r>
+      <w:r>
+        <w:rPr>
+          <w:rFonts w:ascii="Times New Roman" w:cs="Times New Roman" w:eastAsia="Times New Roman" w:hAnsi="Times New Roman"/>
+        </w:rPr>
+        <w:t xml:space="preserve">, </w:t>
+      </w:r>
+      <w:r>
+        <w:rPr>
+          <w:rFonts w:ascii="Courier New" w:cs="Courier New" w:eastAsia="Courier New" w:hAnsi="Courier New"/>
+          <w:sz w:val="19"/>
+          <w:szCs w:val="19"/>
+        </w:rPr>
+        <w:t xml:space="preserve">MQTT SUB topic [n [secs]]</w:t>
+      </w:r>
+      <w:r>
+        <w:rPr>
+          <w:rFonts w:ascii="Times New Roman" w:cs="Times New Roman" w:eastAsia="Times New Roman" w:hAnsi="Times New Roman"/>
+        </w:rPr>
+        <w:t xml:space="preserve">.</w:t>
+      </w:r>
+    </w:p>
+    <w:p>
+      <w:pPr>
+        <w:pStyle w:val="Heading2"/>
+      </w:pPr>
+      <w:r>
+        <w:t xml:space="preserve">RXPIP</w:t>
+      </w:r>
+    </w:p>
+    <w:p>
+      <w:pPr>
+        <w:spacing w:after="120"/>
+      </w:pPr>
+      <w:r>
+        <w:rPr>
+          <w:rFonts w:ascii="Courier New" w:cs="Courier New" w:eastAsia="Courier New" w:hAnsi="Courier New"/>
+          <w:sz w:val="19"/>
+          <w:szCs w:val="19"/>
+        </w:rPr>
+        <w:t xml:space="preserve">RXPIP AVAIL</w:t>
+      </w:r>
+      <w:r>
+        <w:rPr>
+          <w:rFonts w:ascii="Times New Roman" w:cs="Times New Roman" w:eastAsia="Times New Roman" w:hAnsi="Times New Roman"/>
+        </w:rPr>
+        <w:t xml:space="preserve">, </w:t>
+      </w:r>
+      <w:r>
+        <w:rPr>
+          <w:rFonts w:ascii="Courier New" w:cs="Courier New" w:eastAsia="Courier New" w:hAnsi="Courier New"/>
+          <w:sz w:val="19"/>
+          <w:szCs w:val="19"/>
+        </w:rPr>
+        <w:t xml:space="preserve">SEARCH term</w:t>
+      </w:r>
+      <w:r>
+        <w:rPr>
+          <w:rFonts w:ascii="Times New Roman" w:cs="Times New Roman" w:eastAsia="Times New Roman" w:hAnsi="Times New Roman"/>
+        </w:rPr>
+        <w:t xml:space="preserve">, </w:t>
+      </w:r>
+      <w:r>
+        <w:rPr>
+          <w:rFonts w:ascii="Courier New" w:cs="Courier New" w:eastAsia="Courier New" w:hAnsi="Courier New"/>
+          <w:sz w:val="19"/>
+          <w:szCs w:val="19"/>
+        </w:rPr>
+        <w:t xml:space="preserve">SHOW name</w:t>
+      </w:r>
+      <w:r>
+        <w:rPr>
+          <w:rFonts w:ascii="Times New Roman" w:cs="Times New Roman" w:eastAsia="Times New Roman" w:hAnsi="Times New Roman"/>
+        </w:rPr>
+        <w:t xml:space="preserve">, </w:t>
+      </w:r>
+      <w:r>
+        <w:rPr>
+          <w:rFonts w:ascii="Courier New" w:cs="Courier New" w:eastAsia="Courier New" w:hAnsi="Courier New"/>
+          <w:sz w:val="19"/>
+          <w:szCs w:val="19"/>
+        </w:rPr>
+        <w:t xml:space="preserve">BUILD fn</w:t>
+      </w:r>
+      <w:r>
+        <w:rPr>
+          <w:rFonts w:ascii="Times New Roman" w:cs="Times New Roman" w:eastAsia="Times New Roman" w:hAnsi="Times New Roman"/>
+        </w:rPr>
+        <w:t xml:space="preserve">, </w:t>
+      </w:r>
+      <w:r>
+        <w:rPr>
+          <w:rFonts w:ascii="Courier New" w:cs="Courier New" w:eastAsia="Courier New" w:hAnsi="Courier New"/>
+          <w:sz w:val="19"/>
+          <w:szCs w:val="19"/>
+        </w:rPr>
+        <w:t xml:space="preserve">RUN fn [args]</w:t>
+      </w:r>
+      <w:r>
+        <w:rPr>
+          <w:rFonts w:ascii="Times New Roman" w:cs="Times New Roman" w:eastAsia="Times New Roman" w:hAnsi="Times New Roman"/>
+        </w:rPr>
+        <w:t xml:space="preserve">, </w:t>
+      </w:r>
+      <w:r>
+        <w:rPr>
+          <w:rFonts w:ascii="Courier New" w:cs="Courier New" w:eastAsia="Courier New" w:hAnsi="Courier New"/>
+          <w:sz w:val="19"/>
+          <w:szCs w:val="19"/>
+        </w:rPr>
+        <w:t xml:space="preserve">GET name</w:t>
+      </w:r>
+      <w:r>
+        <w:rPr>
+          <w:rFonts w:ascii="Times New Roman" w:cs="Times New Roman" w:eastAsia="Times New Roman" w:hAnsi="Times New Roman"/>
+        </w:rPr>
+        <w:t xml:space="preserve">.</w:t>
+      </w:r>
+    </w:p>
+    <w:p>
+      <w:pPr>
+        <w:pStyle w:val="Heading2"/>
+      </w:pPr>
+      <w:r>
+        <w:t xml:space="preserve">TROFF, BOOKIE, LATEX, PSPRINT</w:t>
+      </w:r>
+    </w:p>
+    <w:p>
+      <w:pPr>
+        <w:spacing w:after="120"/>
+      </w:pPr>
+      <w:r>
+        <w:rPr>
+          <w:rFonts w:ascii="Courier New" w:cs="Courier New" w:eastAsia="Courier New" w:hAnsi="Courier New"/>
+          <w:sz w:val="19"/>
+          <w:szCs w:val="19"/>
+        </w:rPr>
+        <w:t xml:space="preserve">TROFF fn [ft [fm]] (MACROS m PS</w:t>
+      </w:r>
+      <w:r>
+        <w:rPr>
+          <w:rFonts w:ascii="Times New Roman" w:cs="Times New Roman" w:eastAsia="Times New Roman" w:hAnsi="Times New Roman"/>
+        </w:rPr>
+        <w:t xml:space="preserve">; </w:t>
+      </w:r>
+      <w:r>
+        <w:rPr>
+          <w:rFonts w:ascii="Courier New" w:cs="Courier New" w:eastAsia="Courier New" w:hAnsi="Courier New"/>
+          <w:sz w:val="19"/>
+          <w:szCs w:val="19"/>
+        </w:rPr>
+        <w:t xml:space="preserve">BOOKIE fn [ft [fm]] (PS</w:t>
+      </w:r>
+      <w:r>
+        <w:rPr>
+          <w:rFonts w:ascii="Times New Roman" w:cs="Times New Roman" w:eastAsia="Times New Roman" w:hAnsi="Times New Roman"/>
+        </w:rPr>
+        <w:t xml:space="preserve">; </w:t>
+      </w:r>
+      <w:r>
+        <w:rPr>
+          <w:rFonts w:ascii="Courier New" w:cs="Courier New" w:eastAsia="Courier New" w:hAnsi="Courier New"/>
+          <w:sz w:val="19"/>
+          <w:szCs w:val="19"/>
+        </w:rPr>
+        <w:t xml:space="preserve">LATEX fn [ft [fm]] (PDF</w:t>
+      </w:r>
+      <w:r>
+        <w:rPr>
+          <w:rFonts w:ascii="Times New Roman" w:cs="Times New Roman" w:eastAsia="Times New Roman" w:hAnsi="Times New Roman"/>
+        </w:rPr>
+        <w:t xml:space="preserve">; </w:t>
+      </w:r>
+      <w:r>
+        <w:rPr>
+          <w:rFonts w:ascii="Courier New" w:cs="Courier New" w:eastAsia="Courier New" w:hAnsi="Courier New"/>
+          <w:sz w:val="19"/>
+          <w:szCs w:val="19"/>
+        </w:rPr>
+        <w:t xml:space="preserve">PSPRINT fn [ft [fm]] (BRIDGE [format]</w:t>
+      </w:r>
+      <w:r>
+        <w:rPr>
+          <w:rFonts w:ascii="Times New Roman" w:cs="Times New Roman" w:eastAsia="Times New Roman" w:hAnsi="Times New Roman"/>
+        </w:rPr>
+        <w:t xml:space="preserve">.</w:t>
       </w:r>
     </w:p>
     <w:p>
@@ -25461,7 +28083,7 @@
           <w:sz w:val="18"/>
           <w:szCs w:val="18"/>
         </w:rPr>
-        <w:t xml:space="preserve">Figure 54. </w:t>
+        <w:t xml:space="preserve">Figure 59. </w:t>
       </w:r>
       <w:r>
         <w:rPr>
@@ -26169,7 +28791,7 @@
           <w:sz w:val="18"/>
           <w:szCs w:val="18"/>
         </w:rPr>
-        <w:t xml:space="preserve">Figure 55. </w:t>
+        <w:t xml:space="preserve">Figure 60. </w:t>
       </w:r>
       <w:r>
         <w:rPr>

</xml_diff>

<commit_message>
Kit build 9 verified on fresh CE (kt22); document IPL 290 and START 00E
Co-Authored-By: Claude Opus 5.5 <noreply@anthropic.com>
Claude-Session: https://claude.ai/code/session_01JBNU8KnKzXkgscse8vw6so
</commit_message>
<xml_diff>
--- a/arch/31bit/manual/VM370PLUS-Guide.docx
+++ b/arch/31bit/manual/VM370PLUS-Guide.docx
@@ -23159,6 +23159,73 @@
           <w:szCs w:val="19"/>
         </w:rPr>
         <w:t xml:space="preserve">/etc/vmspool.d/print.conf</w:t>
+      </w:r>
+      <w:r>
+        <w:rPr>
+          <w:rFonts w:ascii="Times New Roman" w:cs="Times New Roman" w:eastAsia="Times New Roman" w:hAnsi="Times New Roman"/>
+        </w:rPr>
+        <w:t xml:space="preserve">.</w:t>
+      </w:r>
+    </w:p>
+    <w:p>
+      <w:pPr>
+        <w:spacing w:after="120"/>
+      </w:pPr>
+      <w:r>
+        <w:rPr>
+          <w:rFonts w:ascii="Times New Roman" w:cs="Times New Roman" w:eastAsia="Times New Roman" w:hAnsi="Times New Roman"/>
+        </w:rPr>
+        <w:t xml:space="preserve">On a newly installed system the real printer 00E is drained, so spooled print files wait. An operator starts it once with </w:t>
+      </w:r>
+      <w:r>
+        <w:rPr>
+          <w:rFonts w:ascii="Courier New" w:cs="Courier New" w:eastAsia="Courier New" w:hAnsi="Courier New"/>
+          <w:sz w:val="19"/>
+          <w:szCs w:val="19"/>
+        </w:rPr>
+        <w:t xml:space="preserve">START 00E</w:t>
+      </w:r>
+      <w:r>
+        <w:rPr>
+          <w:rFonts w:ascii="Times New Roman" w:cs="Times New Roman" w:eastAsia="Times New Roman" w:hAnsi="Times New Roman"/>
+        </w:rPr>
+        <w:t xml:space="preserve"> (from MAINT, or </w:t>
+      </w:r>
+      <w:r>
+        <w:rPr>
+          <w:rFonts w:ascii="Courier New" w:cs="Courier New" w:eastAsia="Courier New" w:hAnsi="Courier New"/>
+          <w:sz w:val="19"/>
+          <w:szCs w:val="19"/>
+        </w:rPr>
+        <w:t xml:space="preserve">vmcp start 00e</w:t>
+      </w:r>
+      <w:r>
+        <w:rPr>
+          <w:rFonts w:ascii="Times New Roman" w:cs="Times New Roman" w:eastAsia="Times New Roman" w:hAnsi="Times New Roman"/>
+        </w:rPr>
+        <w:t xml:space="preserve"> in the Debian guest). The EXECs of this chapter are on the language disk, which uses EDF, so they need the EC-mode CMS: </w:t>
+      </w:r>
+      <w:r>
+        <w:rPr>
+          <w:rFonts w:ascii="Courier New" w:cs="Courier New" w:eastAsia="Courier New" w:hAnsi="Courier New"/>
+          <w:sz w:val="19"/>
+          <w:szCs w:val="19"/>
+        </w:rPr>
+        <w:t xml:space="preserve">IPL 290</w:t>
+      </w:r>
+      <w:r>
+        <w:rPr>
+          <w:rFonts w:ascii="Times New Roman" w:cs="Times New Roman" w:eastAsia="Times New Roman" w:hAnsi="Times New Roman"/>
+        </w:rPr>
+        <w:t xml:space="preserve">, then </w:t>
+      </w:r>
+      <w:r>
+        <w:rPr>
+          <w:rFonts w:ascii="Courier New" w:cs="Courier New" w:eastAsia="Courier New" w:hAnsi="Courier New"/>
+          <w:sz w:val="19"/>
+          <w:szCs w:val="19"/>
+        </w:rPr>
+        <w:t xml:space="preserve">LANG</w:t>
       </w:r>
       <w:r>
         <w:rPr>

</xml_diff>

<commit_message>
Bridge and document EXECs on MAINT 19D (work under ipl cms); kit b9 parts 1-5 rebuilt
Co-Authored-By: Claude Opus 5.5 <noreply@anthropic.com>
Claude-Session: https://claude.ai/code/session_01JBNU8KnKzXkgscse8vw6so
</commit_message>
<xml_diff>
--- a/arch/31bit/manual/VM370PLUS-Guide.docx
+++ b/arch/31bit/manual/VM370PLUS-Guide.docx
@@ -23203,7 +23203,77 @@
         <w:rPr>
           <w:rFonts w:ascii="Times New Roman" w:cs="Times New Roman" w:eastAsia="Times New Roman" w:hAnsi="Times New Roman"/>
         </w:rPr>
-        <w:t xml:space="preserve"> in the Debian guest). The EXECs of this chapter are on the language disk, which uses EDF, so they need the EC-mode CMS: </w:t>
+        <w:t xml:space="preserve"> in the Debian guest). The EXECs of this chapter are on MAINT’s 19D disk, so they work under the usual </w:t>
+      </w:r>
+      <w:r>
+        <w:rPr>
+          <w:rFonts w:ascii="Courier New" w:cs="Courier New" w:eastAsia="Courier New" w:hAnsi="Courier New"/>
+          <w:sz w:val="19"/>
+          <w:szCs w:val="19"/>
+        </w:rPr>
+        <w:t xml:space="preserve">IPL CMS</w:t>
+      </w:r>
+      <w:r>
+        <w:rPr>
+          <w:rFonts w:ascii="Times New Roman" w:cs="Times New Roman" w:eastAsia="Times New Roman" w:hAnsi="Times New Roman"/>
+        </w:rPr>
+        <w:t xml:space="preserve">; the samples (</w:t>
+      </w:r>
+      <w:r>
+        <w:rPr>
+          <w:rFonts w:ascii="Courier New" w:cs="Courier New" w:eastAsia="Courier New" w:hAnsi="Courier New"/>
+          <w:sz w:val="19"/>
+          <w:szCs w:val="19"/>
+        </w:rPr>
+        <w:t xml:space="preserve">SAMPLE SCRIPT</w:t>
+      </w:r>
+      <w:r>
+        <w:rPr>
+          <w:rFonts w:ascii="Times New Roman" w:cs="Times New Roman" w:eastAsia="Times New Roman" w:hAnsi="Times New Roman"/>
+        </w:rPr>
+        <w:t xml:space="preserve">, </w:t>
+      </w:r>
+      <w:r>
+        <w:rPr>
+          <w:rFonts w:ascii="Courier New" w:cs="Courier New" w:eastAsia="Courier New" w:hAnsi="Courier New"/>
+          <w:sz w:val="19"/>
+          <w:szCs w:val="19"/>
+        </w:rPr>
+        <w:t xml:space="preserve">GUIDE SCRIPT</w:t>
+      </w:r>
+      <w:r>
+        <w:rPr>
+          <w:rFonts w:ascii="Times New Roman" w:cs="Times New Roman" w:eastAsia="Times New Roman" w:hAnsi="Times New Roman"/>
+        </w:rPr>
+        <w:t xml:space="preserve">, </w:t>
+      </w:r>
+      <w:r>
+        <w:rPr>
+          <w:rFonts w:ascii="Courier New" w:cs="Courier New" w:eastAsia="Courier New" w:hAnsi="Courier New"/>
+          <w:sz w:val="19"/>
+          <w:szCs w:val="19"/>
+        </w:rPr>
+        <w:t xml:space="preserve">HELLO TEX</w:t>
+      </w:r>
+      <w:r>
+        <w:rPr>
+          <w:rFonts w:ascii="Times New Roman" w:cs="Times New Roman" w:eastAsia="Times New Roman" w:hAnsi="Times New Roman"/>
+        </w:rPr>
+        <w:t xml:space="preserve">, </w:t>
+      </w:r>
+      <w:r>
+        <w:rPr>
+          <w:rFonts w:ascii="Courier New" w:cs="Courier New" w:eastAsia="Courier New" w:hAnsi="Courier New"/>
+          <w:sz w:val="19"/>
+          <w:szCs w:val="19"/>
+        </w:rPr>
+        <w:t xml:space="preserve">HELLO TROFF</w:t>
+      </w:r>
+      <w:r>
+        <w:rPr>
+          <w:rFonts w:ascii="Times New Roman" w:cs="Times New Roman" w:eastAsia="Times New Roman" w:hAnsi="Times New Roman"/>
+        </w:rPr>
+        <w:t xml:space="preserve">) are on the language disk, which uses EDF and needs the EC-mode CMS: </w:t>
       </w:r>
       <w:r>
         <w:rPr>

</xml_diff>

<commit_message>
9.14 TELL: CMS TELL EXEC (local and AT LINUX), Linux tell + setuid vmmsg, vmspoold tell handler; on 19D and LANG
Co-Authored-By: Claude Opus 5.5 <noreply@anthropic.com>
Claude-Session: https://claude.ai/code/session_01JBNU8KnKzXkgscse8vw6so
</commit_message>
<xml_diff>
--- a/arch/31bit/manual/VM370PLUS-Guide.docx
+++ b/arch/31bit/manual/VM370PLUS-Guide.docx
@@ -1147,6 +1147,35 @@
           <w:szCs w:val="20"/>
         </w:rPr>
         <w:t xml:space="preserve">	16</w:t>
+      </w:r>
+    </w:p>
+    <w:p>
+      <w:pPr>
+        <w:tabs>
+          <w:tab w:val="right" w:pos="9638" w:leader="dot"/>
+        </w:tabs>
+        <w:spacing w:after="20" w:before="20"/>
+        <w:ind w:left="400"/>
+      </w:pPr>
+      <w:r>
+        <w:rPr>
+          <w:rFonts w:ascii="Times New Roman" w:cs="Times New Roman" w:eastAsia="Times New Roman" w:hAnsi="Times New Roman"/>
+          <w:b w:val="false"/>
+          <w:bCs w:val="false"/>
+          <w:sz w:val="20"/>
+          <w:szCs w:val="20"/>
+        </w:rPr>
+        <w:t xml:space="preserve">TELL</w:t>
+      </w:r>
+      <w:r>
+        <w:rPr>
+          <w:rFonts w:ascii="Times New Roman" w:cs="Times New Roman" w:eastAsia="Times New Roman" w:hAnsi="Times New Roman"/>
+          <w:b w:val="false"/>
+          <w:bCs w:val="false"/>
+          <w:sz w:val="20"/>
+          <w:szCs w:val="20"/>
+        </w:rPr>
+        <w:t xml:space="preserve">	17</w:t>
       </w:r>
     </w:p>
     <w:p>
@@ -2847,7 +2876,7 @@
         <w:rPr>
           <w:rFonts w:ascii="Times New Roman" w:cs="Times New Roman" w:eastAsia="Times New Roman" w:hAnsi="Times New Roman"/>
         </w:rPr>
-        <w:t xml:space="preserve">, describes CHATBOT, the spool bridge to Linux services (LXCALL, PHONE, MQTT), RXPIP, and the service machines that are planned.</w:t>
+        <w:t xml:space="preserve">, describes CHATBOT, the spool bridge to Linux services (LXCALL, PHONE, MQTT, TELL), RXPIP, and the service machines that are planned.</w:t>
       </w:r>
     </w:p>
     <w:p>
@@ -14930,6 +14959,103 @@
           <w:szCs w:val="19"/>
         </w:rPr>
         <w:t xml:space="preserve">/etc/vmspool.d/mqtt.conf</w:t>
+      </w:r>
+      <w:r>
+        <w:rPr>
+          <w:rFonts w:ascii="Times New Roman" w:cs="Times New Roman" w:eastAsia="Times New Roman" w:hAnsi="Times New Roman"/>
+        </w:rPr>
+        <w:t xml:space="preserve">.</w:t>
+      </w:r>
+    </w:p>
+    <w:p>
+      <w:pPr>
+        <w:pStyle w:val="Heading2"/>
+      </w:pPr>
+      <w:r>
+        <w:t xml:space="preserve">TELL</w:t>
+      </w:r>
+    </w:p>
+    <w:p>
+      <w:pPr>
+        <w:spacing w:after="120"/>
+      </w:pPr>
+      <w:r>
+        <w:rPr>
+          <w:rFonts w:ascii="Courier New" w:cs="Courier New" w:eastAsia="Courier New" w:hAnsi="Courier New"/>
+          <w:sz w:val="19"/>
+          <w:szCs w:val="19"/>
+        </w:rPr>
+        <w:t xml:space="preserve">TELL userid message</w:t>
+      </w:r>
+      <w:r>
+        <w:rPr>
+          <w:rFonts w:ascii="Times New Roman" w:cs="Times New Roman" w:eastAsia="Times New Roman" w:hAnsi="Times New Roman"/>
+        </w:rPr>
+        <w:t xml:space="preserve"> sends a message to a VM/370 user (CP MSG). </w:t>
+      </w:r>
+      <w:r>
+        <w:rPr>
+          <w:rFonts w:ascii="Courier New" w:cs="Courier New" w:eastAsia="Courier New" w:hAnsi="Courier New"/>
+          <w:sz w:val="19"/>
+          <w:szCs w:val="19"/>
+        </w:rPr>
+        <w:t xml:space="preserve">TELL user AT LINUX message</w:t>
+      </w:r>
+      <w:r>
+        <w:rPr>
+          <w:rFonts w:ascii="Times New Roman" w:cs="Times New Roman" w:eastAsia="Times New Roman" w:hAnsi="Times New Roman"/>
+        </w:rPr>
+        <w:t xml:space="preserve"> sends it to a user of the Debian guest through the spool bridge: it appears on that user’s terminals, and is kept until the user reads it with </w:t>
+      </w:r>
+      <w:r>
+        <w:rPr>
+          <w:rFonts w:ascii="Courier New" w:cs="Courier New" w:eastAsia="Courier New" w:hAnsi="Courier New"/>
+          <w:sz w:val="19"/>
+          <w:szCs w:val="19"/>
+        </w:rPr>
+        <w:t xml:space="preserve">tell</w:t>
+      </w:r>
+      <w:r>
+        <w:rPr>
+          <w:rFonts w:ascii="Times New Roman" w:cs="Times New Roman" w:eastAsia="Times New Roman" w:hAnsi="Times New Roman"/>
+        </w:rPr>
+        <w:t xml:space="preserve">. </w:t>
+      </w:r>
+      <w:r>
+        <w:rPr>
+          <w:rFonts w:ascii="Courier New" w:cs="Courier New" w:eastAsia="Courier New" w:hAnsi="Courier New"/>
+          <w:sz w:val="19"/>
+          <w:szCs w:val="19"/>
+        </w:rPr>
+        <w:t xml:space="preserve">TELL ALL AT LINUX message</w:t>
+      </w:r>
+      <w:r>
+        <w:rPr>
+          <w:rFonts w:ascii="Times New Roman" w:cs="Times New Roman" w:eastAsia="Times New Roman" w:hAnsi="Times New Roman"/>
+        </w:rPr>
+        <w:t xml:space="preserve"> reaches everybody logged on to Linux. A Linux user answers with </w:t>
+      </w:r>
+      <w:r>
+        <w:rPr>
+          <w:rFonts w:ascii="Courier New" w:cs="Courier New" w:eastAsia="Courier New" w:hAnsi="Courier New"/>
+          <w:sz w:val="19"/>
+          <w:szCs w:val="19"/>
+        </w:rPr>
+        <w:t xml:space="preserve">tell userid message</w:t>
+      </w:r>
+      <w:r>
+        <w:rPr>
+          <w:rFonts w:ascii="Times New Roman" w:cs="Times New Roman" w:eastAsia="Times New Roman" w:hAnsi="Times New Roman"/>
+        </w:rPr>
+        <w:t xml:space="preserve">, which arrives on CMS as </w:t>
+      </w:r>
+      <w:r>
+        <w:rPr>
+          <w:rFonts w:ascii="Courier New" w:cs="Courier New" w:eastAsia="Courier New" w:hAnsi="Courier New"/>
+          <w:sz w:val="19"/>
+          <w:szCs w:val="19"/>
+        </w:rPr>
+        <w:t xml:space="preserve">MSG FROM MAINT: (user) message</w:t>
       </w:r>
       <w:r>
         <w:rPr>
@@ -27980,6 +28106,20 @@
           <w:szCs w:val="19"/>
         </w:rPr>
         <w:t xml:space="preserve">MQTT SUB topic [n [secs]]</w:t>
+      </w:r>
+      <w:r>
+        <w:rPr>
+          <w:rFonts w:ascii="Times New Roman" w:cs="Times New Roman" w:eastAsia="Times New Roman" w:hAnsi="Times New Roman"/>
+        </w:rPr>
+        <w:t xml:space="preserve">; </w:t>
+      </w:r>
+      <w:r>
+        <w:rPr>
+          <w:rFonts w:ascii="Courier New" w:cs="Courier New" w:eastAsia="Courier New" w:hAnsi="Courier New"/>
+          <w:sz w:val="19"/>
+          <w:szCs w:val="19"/>
+        </w:rPr>
+        <w:t xml:space="preserve">TELL userid [AT LINUX] message</w:t>
       </w:r>
       <w:r>
         <w:rPr>

</xml_diff>

<commit_message>
I-277 fixed: GCCLIB segment re-saved from the current GCCLIB TEXT (GCCLIBGN after ACCESS (NOPROF); verified byte for byte and with 12-argument EXECs at 8M
Co-Authored-By: Claude Opus 5.5 <noreply@anthropic.com>
Claude-Session: https://claude.ai/code/session_01JBNU8KnKzXkgscse8vw6so
</commit_message>
<xml_diff>
--- a/arch/31bit/manual/VM370PLUS-Guide.docx
+++ b/arch/31bit/manual/VM370PLUS-Guide.docx
@@ -3091,6 +3091,86 @@
           <w:rFonts w:ascii="Times New Roman" w:cs="Times New Roman" w:eastAsia="Times New Roman" w:hAnsi="Times New Roman"/>
         </w:rPr>
         <w:t xml:space="preserve">This edition is kept up to date as VM/370plus grows; each change is listed here, newest first.</w:t>
+      </w:r>
+    </w:p>
+    <w:p>
+      <w:pPr>
+        <w:pStyle w:val="ListParagraph"/>
+        <w:numPr>
+          <w:ilvl w:val="0"/>
+          <w:numId w:val="2"/>
+        </w:numPr>
+        <w:spacing w:after="60"/>
+      </w:pPr>
+      <w:r>
+        <w:rPr>
+          <w:rFonts w:ascii="Times New Roman" w:cs="Times New Roman" w:eastAsia="Times New Roman" w:hAnsi="Times New Roman"/>
+          <w:b/>
+          <w:bCs/>
+        </w:rPr>
+        <w:t xml:space="preserve">13 October 2026, afternoon.</w:t>
+      </w:r>
+      <w:r>
+        <w:rPr>
+          <w:rFonts w:ascii="Times New Roman" w:cs="Times New Roman" w:eastAsia="Times New Roman" w:hAnsi="Times New Roman"/>
+        </w:rPr>
+        <w:t xml:space="preserve"> </w:t>
+      </w:r>
+      <w:r>
+        <w:rPr>
+          <w:rFonts w:ascii="Courier New" w:cs="Courier New" w:eastAsia="Courier New" w:hAnsi="Courier New"/>
+          <w:sz w:val="19"/>
+          <w:szCs w:val="19"/>
+        </w:rPr>
+        <w:t xml:space="preserve">TELL</w:t>
+      </w:r>
+      <w:r>
+        <w:rPr>
+          <w:rFonts w:ascii="Times New Roman" w:cs="Times New Roman" w:eastAsia="Times New Roman" w:hAnsi="Times New Roman"/>
+        </w:rPr>
+        <w:t xml:space="preserve"> (Chapter 6): messages between CMS users, and between CMS and Linux users (</w:t>
+      </w:r>
+      <w:r>
+        <w:rPr>
+          <w:rFonts w:ascii="Courier New" w:cs="Courier New" w:eastAsia="Courier New" w:hAnsi="Courier New"/>
+          <w:sz w:val="19"/>
+          <w:szCs w:val="19"/>
+        </w:rPr>
+        <w:t xml:space="preserve">TELL user AT LINUX</w:t>
+      </w:r>
+      <w:r>
+        <w:rPr>
+          <w:rFonts w:ascii="Times New Roman" w:cs="Times New Roman" w:eastAsia="Times New Roman" w:hAnsi="Times New Roman"/>
+        </w:rPr>
+        <w:t xml:space="preserve">, </w:t>
+      </w:r>
+      <w:r>
+        <w:rPr>
+          <w:rFonts w:ascii="Courier New" w:cs="Courier New" w:eastAsia="Courier New" w:hAnsi="Courier New"/>
+          <w:sz w:val="19"/>
+          <w:szCs w:val="19"/>
+        </w:rPr>
+        <w:t xml:space="preserve">tell</w:t>
+      </w:r>
+      <w:r>
+        <w:rPr>
+          <w:rFonts w:ascii="Times New Roman" w:cs="Times New Roman" w:eastAsia="Times New Roman" w:hAnsi="Times New Roman"/>
+        </w:rPr>
+        <w:t xml:space="preserve"> on Linux). The bridge and document EXECs are on MAINT’s 19D disk, so they work under </w:t>
+      </w:r>
+      <w:r>
+        <w:rPr>
+          <w:rFonts w:ascii="Courier New" w:cs="Courier New" w:eastAsia="Courier New" w:hAnsi="Courier New"/>
+          <w:sz w:val="19"/>
+          <w:szCs w:val="19"/>
+        </w:rPr>
+        <w:t xml:space="preserve">IPL CMS</w:t>
+      </w:r>
+      <w:r>
+        <w:rPr>
+          <w:rFonts w:ascii="Times New Roman" w:cs="Times New Roman" w:eastAsia="Times New Roman" w:hAnsi="Times New Roman"/>
+        </w:rPr>
+        <w:t xml:space="preserve">. A REXX EXEC with eight or more arguments no longer ends CMS in small machines: the GCCLIB segment was saved from an older library and has been saved again (I-277).</w:t>
       </w:r>
     </w:p>
     <w:p>
@@ -24617,54 +24697,6 @@
                 <w:szCs w:val="19"/>
               </w:rPr>
               <w:t xml:space="preserve">, Smalltalk SmallIntegers are ±2^30 (larger ones are big integers); CMS has no directories.</w:t>
-            </w:r>
-          </w:p>
-        </w:tc>
-      </w:tr>
-      <w:tr>
-        <w:trPr>
-          <w:cantSplit/>
-          <w:tblHeader w:val="false"/>
-        </w:trPr>
-        <w:tc>
-          <w:tcPr>
-            <w:tcW w:type="dxa" w:w="2400"/>
-            <w:tcMar>
-              <w:top w:type="dxa" w:w="60"/>
-              <w:left w:type="dxa" w:w="100"/>
-              <w:bottom w:type="dxa" w:w="60"/>
-              <w:right w:type="dxa" w:w="100"/>
-            </w:tcMar>
-          </w:tcPr>
-          <w:p>
-            <w:r>
-              <w:rPr>
-                <w:rFonts w:ascii="Times New Roman" w:cs="Times New Roman" w:eastAsia="Times New Roman" w:hAnsi="Times New Roman"/>
-                <w:sz w:val="19"/>
-                <w:szCs w:val="19"/>
-              </w:rPr>
-              <w:t xml:space="preserve">REXX EXECs</w:t>
-            </w:r>
-          </w:p>
-        </w:tc>
-        <w:tc>
-          <w:tcPr>
-            <w:tcW w:type="dxa" w:w="7238"/>
-            <w:tcMar>
-              <w:top w:type="dxa" w:w="60"/>
-              <w:left w:type="dxa" w:w="100"/>
-              <w:bottom w:type="dxa" w:w="60"/>
-              <w:right w:type="dxa" w:w="100"/>
-            </w:tcMar>
-          </w:tcPr>
-          <w:p>
-            <w:r>
-              <w:rPr>
-                <w:rFonts w:ascii="Times New Roman" w:cs="Times New Roman" w:eastAsia="Times New Roman" w:hAnsi="Times New Roman"/>
-                <w:sz w:val="19"/>
-                <w:szCs w:val="19"/>
-              </w:rPr>
-              <w:t xml:space="preserve">An EXEC called with eight or more arguments ends CMS when the GCCLIB segment is loaded (machines below about 15 MB); this is so in the Community Edition too (I-277). Keep to seven.</w:t>
             </w:r>
           </w:p>
         </w:tc>

</xml_diff>

<commit_message>
9.32 TELL to and from the internet over MQTT (tellnet, tellgw, logins + ACL, netfwd.py --tls, nettell.py); milestones xlsx: 9.32, kit rows renamed
Co-Authored-By: Claude Opus 5.5 <noreply@anthropic.com>
Claude-Session: https://claude.ai/code/session_01JBNU8KnKzXkgscse8vw6so
</commit_message>
<xml_diff>
--- a/arch/31bit/manual/VM370PLUS-Guide.docx
+++ b/arch/31bit/manual/VM370PLUS-Guide.docx
@@ -3091,6 +3091,44 @@
           <w:rFonts w:ascii="Times New Roman" w:cs="Times New Roman" w:eastAsia="Times New Roman" w:hAnsi="Times New Roman"/>
         </w:rPr>
         <w:t xml:space="preserve">This edition is kept up to date as VM/370plus grows; each change is listed here, newest first.</w:t>
+      </w:r>
+    </w:p>
+    <w:p>
+      <w:pPr>
+        <w:pStyle w:val="ListParagraph"/>
+        <w:numPr>
+          <w:ilvl w:val="0"/>
+          <w:numId w:val="2"/>
+        </w:numPr>
+        <w:spacing w:after="60"/>
+      </w:pPr>
+      <w:r>
+        <w:rPr>
+          <w:rFonts w:ascii="Times New Roman" w:cs="Times New Roman" w:eastAsia="Times New Roman" w:hAnsi="Times New Roman"/>
+          <w:b/>
+          <w:bCs/>
+        </w:rPr>
+        <w:t xml:space="preserve">13 October 2026, late afternoon.</w:t>
+      </w:r>
+      <w:r>
+        <w:rPr>
+          <w:rFonts w:ascii="Times New Roman" w:cs="Times New Roman" w:eastAsia="Times New Roman" w:hAnsi="Times New Roman"/>
+        </w:rPr>
+        <w:t xml:space="preserve"> </w:t>
+      </w:r>
+      <w:r>
+        <w:rPr>
+          <w:rFonts w:ascii="Courier New" w:cs="Courier New" w:eastAsia="Courier New" w:hAnsi="Courier New"/>
+          <w:sz w:val="19"/>
+          <w:szCs w:val="19"/>
+        </w:rPr>
+        <w:t xml:space="preserve">TELL user AT NET</w:t>
+      </w:r>
+      <w:r>
+        <w:rPr>
+          <w:rFonts w:ascii="Times New Roman" w:cs="Times New Roman" w:eastAsia="Times New Roman" w:hAnsi="Times New Roman"/>
+        </w:rPr>
+        <w:t xml:space="preserve">: messages to and from users on the internet through the MQTT broker of the Debian guest, with a login per outside user and TLS on the PC (Chapter 6).</w:t>
       </w:r>
     </w:p>
     <w:p>
@@ -15142,6 +15180,109 @@
           <w:rFonts w:ascii="Times New Roman" w:cs="Times New Roman" w:eastAsia="Times New Roman" w:hAnsi="Times New Roman"/>
         </w:rPr>
         <w:t xml:space="preserve">.</w:t>
+      </w:r>
+    </w:p>
+    <w:p>
+      <w:pPr>
+        <w:spacing w:after="120"/>
+      </w:pPr>
+      <w:r>
+        <w:rPr>
+          <w:rFonts w:ascii="Courier New" w:cs="Courier New" w:eastAsia="Courier New" w:hAnsi="Courier New"/>
+          <w:sz w:val="19"/>
+          <w:szCs w:val="19"/>
+        </w:rPr>
+        <w:t xml:space="preserve">TELL user AT NET message</w:t>
+      </w:r>
+      <w:r>
+        <w:rPr>
+          <w:rFonts w:ascii="Times New Roman" w:cs="Times New Roman" w:eastAsia="Times New Roman" w:hAnsi="Times New Roman"/>
+        </w:rPr>
+        <w:t xml:space="preserve"> reaches a user on the internet. The message is published on the MQTT broker of the Debian guest as topic </w:t>
+      </w:r>
+      <w:r>
+        <w:rPr>
+          <w:rFonts w:ascii="Courier New" w:cs="Courier New" w:eastAsia="Courier New" w:hAnsi="Courier New"/>
+          <w:sz w:val="19"/>
+          <w:szCs w:val="19"/>
+        </w:rPr>
+        <w:t xml:space="preserve">vm/tell/out/user</w:t>
+      </w:r>
+      <w:r>
+        <w:rPr>
+          <w:rFonts w:ascii="Times New Roman" w:cs="Times New Roman" w:eastAsia="Times New Roman" w:hAnsi="Times New Roman"/>
+        </w:rPr>
+        <w:t xml:space="preserve">, which the user reads with any MQTT client. The user answers by publishing to </w:t>
+      </w:r>
+      <w:r>
+        <w:rPr>
+          <w:rFonts w:ascii="Courier New" w:cs="Courier New" w:eastAsia="Courier New" w:hAnsi="Courier New"/>
+          <w:sz w:val="19"/>
+          <w:szCs w:val="19"/>
+        </w:rPr>
+        <w:t xml:space="preserve">vm/tell/from/user/to/userid</w:t>
+      </w:r>
+      <w:r>
+        <w:rPr>
+          <w:rFonts w:ascii="Times New Roman" w:cs="Times New Roman" w:eastAsia="Times New Roman" w:hAnsi="Times New Roman"/>
+        </w:rPr>
+        <w:t xml:space="preserve">; it arrives as </w:t>
+      </w:r>
+      <w:r>
+        <w:rPr>
+          <w:rFonts w:ascii="Courier New" w:cs="Courier New" w:eastAsia="Courier New" w:hAnsi="Courier New"/>
+          <w:sz w:val="19"/>
+          <w:szCs w:val="19"/>
+        </w:rPr>
+        <w:t xml:space="preserve">MSG FROM MAINT: (net:user) message</w:t>
+      </w:r>
+      <w:r>
+        <w:rPr>
+          <w:rFonts w:ascii="Times New Roman" w:cs="Times New Roman" w:eastAsia="Times New Roman" w:hAnsi="Times New Roman"/>
+        </w:rPr>
+        <w:t xml:space="preserve">. Outside users need a login (</w:t>
+      </w:r>
+      <w:r>
+        <w:rPr>
+          <w:rFonts w:ascii="Courier New" w:cs="Courier New" w:eastAsia="Courier New" w:hAnsi="Courier New"/>
+          <w:sz w:val="19"/>
+          <w:szCs w:val="19"/>
+        </w:rPr>
+        <w:t xml:space="preserve">tellnet-user name password</w:t>
+      </w:r>
+      <w:r>
+        <w:rPr>
+          <w:rFonts w:ascii="Times New Roman" w:cs="Times New Roman" w:eastAsia="Times New Roman" w:hAnsi="Times New Roman"/>
+        </w:rPr>
+        <w:t xml:space="preserve"> in the guest) and may only use their own TELL topics. On the PC, </w:t>
+      </w:r>
+      <w:r>
+        <w:rPr>
+          <w:rFonts w:ascii="Courier New" w:cs="Courier New" w:eastAsia="Courier New" w:hAnsi="Courier New"/>
+          <w:sz w:val="19"/>
+          <w:szCs w:val="19"/>
+        </w:rPr>
+        <w:t xml:space="preserve">tools/netfwd.py --tls cert key 8883 10.1.1.2:1883</w:t>
+      </w:r>
+      <w:r>
+        <w:rPr>
+          <w:rFonts w:ascii="Times New Roman" w:cs="Times New Roman" w:eastAsia="Times New Roman" w:hAnsi="Times New Roman"/>
+        </w:rPr>
+        <w:t xml:space="preserve"> makes the broker reachable, encrypted; the router has to forward that port to the PC. </w:t>
+      </w:r>
+      <w:r>
+        <w:rPr>
+          <w:rFonts w:ascii="Courier New" w:cs="Courier New" w:eastAsia="Courier New" w:hAnsi="Courier New"/>
+          <w:sz w:val="19"/>
+          <w:szCs w:val="19"/>
+        </w:rPr>
+        <w:t xml:space="preserve">tools/nettell.py</w:t>
+      </w:r>
+      <w:r>
+        <w:rPr>
+          <w:rFonts w:ascii="Times New Roman" w:cs="Times New Roman" w:eastAsia="Times New Roman" w:hAnsi="Times New Roman"/>
+        </w:rPr>
+        <w:t xml:space="preserve"> is a small client for the outside user.</w:t>
       </w:r>
     </w:p>
     <w:tbl>
@@ -28151,7 +28292,7 @@
           <w:sz w:val="19"/>
           <w:szCs w:val="19"/>
         </w:rPr>
-        <w:t xml:space="preserve">TELL userid [AT LINUX] message</w:t>
+        <w:t xml:space="preserve">TELL userid [AT LINUX|NET] message</w:t>
       </w:r>
       <w:r>
         <w:rPr>

</xml_diff>

<commit_message>
9.13d NICOF done: README, Guide section, kit integration; kit README build 11
Co-Authored-By: Claude Opus 5.5 <noreply@anthropic.com>
Claude-Session: https://claude.ai/code/session_01JBNU8KnKzXkgscse8vw6so
</commit_message>
<xml_diff>
--- a/arch/31bit/manual/VM370PLUS-Guide.docx
+++ b/arch/31bit/manual/VM370PLUS-Guide.docx
@@ -1165,7 +1165,7 @@
           <w:sz w:val="20"/>
           <w:szCs w:val="20"/>
         </w:rPr>
-        <w:t xml:space="preserve">TELL</w:t>
+        <w:t xml:space="preserve">NICOF: sockets, FTP and PC files</w:t>
       </w:r>
       <w:r>
         <w:rPr>
@@ -1194,7 +1194,7 @@
           <w:sz w:val="20"/>
           <w:szCs w:val="20"/>
         </w:rPr>
-        <w:t xml:space="preserve">RXPIP: REXX packages</w:t>
+        <w:t xml:space="preserve">TELL</w:t>
       </w:r>
       <w:r>
         <w:rPr>
@@ -1223,7 +1223,7 @@
           <w:sz w:val="20"/>
           <w:szCs w:val="20"/>
         </w:rPr>
-        <w:t xml:space="preserve">Planned service machines</w:t>
+        <w:t xml:space="preserve">RXPIP: REXX packages</w:t>
       </w:r>
       <w:r>
         <w:rPr>
@@ -1234,6 +1234,35 @@
           <w:szCs w:val="20"/>
         </w:rPr>
         <w:t xml:space="preserve">	17</w:t>
+      </w:r>
+    </w:p>
+    <w:p>
+      <w:pPr>
+        <w:tabs>
+          <w:tab w:val="right" w:pos="9638" w:leader="dot"/>
+        </w:tabs>
+        <w:spacing w:after="20" w:before="20"/>
+        <w:ind w:left="400"/>
+      </w:pPr>
+      <w:r>
+        <w:rPr>
+          <w:rFonts w:ascii="Times New Roman" w:cs="Times New Roman" w:eastAsia="Times New Roman" w:hAnsi="Times New Roman"/>
+          <w:b w:val="false"/>
+          <w:bCs w:val="false"/>
+          <w:sz w:val="20"/>
+          <w:szCs w:val="20"/>
+        </w:rPr>
+        <w:t xml:space="preserve">Planned service machines</w:t>
+      </w:r>
+      <w:r>
+        <w:rPr>
+          <w:rFonts w:ascii="Times New Roman" w:cs="Times New Roman" w:eastAsia="Times New Roman" w:hAnsi="Times New Roman"/>
+          <w:b w:val="false"/>
+          <w:bCs w:val="false"/>
+          <w:sz w:val="20"/>
+          <w:szCs w:val="20"/>
+        </w:rPr>
+        <w:t xml:space="preserve">	18</w:t>
       </w:r>
     </w:p>
     <w:p>
@@ -1262,7 +1291,7 @@
           <w:sz w:val="21"/>
           <w:szCs w:val="21"/>
         </w:rPr>
-        <w:t xml:space="preserve">	18</w:t>
+        <w:t xml:space="preserve">	19</w:t>
       </w:r>
     </w:p>
     <w:p>
@@ -1291,7 +1320,7 @@
           <w:sz w:val="20"/>
           <w:szCs w:val="20"/>
         </w:rPr>
-        <w:t xml:space="preserve">	18</w:t>
+        <w:t xml:space="preserve">	19</w:t>
       </w:r>
     </w:p>
     <w:p>
@@ -1320,7 +1349,7 @@
           <w:sz w:val="20"/>
           <w:szCs w:val="20"/>
         </w:rPr>
-        <w:t xml:space="preserve">	18</w:t>
+        <w:t xml:space="preserve">	19</w:t>
       </w:r>
     </w:p>
     <w:p>
@@ -1349,7 +1378,7 @@
           <w:sz w:val="20"/>
           <w:szCs w:val="20"/>
         </w:rPr>
-        <w:t xml:space="preserve">	18</w:t>
+        <w:t xml:space="preserve">	19</w:t>
       </w:r>
     </w:p>
     <w:p>
@@ -1378,7 +1407,7 @@
           <w:sz w:val="20"/>
           <w:szCs w:val="20"/>
         </w:rPr>
-        <w:t xml:space="preserve">	18</w:t>
+        <w:t xml:space="preserve">	19</w:t>
       </w:r>
     </w:p>
     <w:p>
@@ -1407,7 +1436,7 @@
           <w:sz w:val="20"/>
           <w:szCs w:val="20"/>
         </w:rPr>
-        <w:t xml:space="preserve">	19</w:t>
+        <w:t xml:space="preserve">	20</w:t>
       </w:r>
     </w:p>
     <w:p>
@@ -1436,7 +1465,7 @@
           <w:sz w:val="20"/>
           <w:szCs w:val="20"/>
         </w:rPr>
-        <w:t xml:space="preserve">	19</w:t>
+        <w:t xml:space="preserve">	20</w:t>
       </w:r>
     </w:p>
     <w:p>
@@ -1465,7 +1494,7 @@
           <w:sz w:val="21"/>
           <w:szCs w:val="21"/>
         </w:rPr>
-        <w:t xml:space="preserve">	21</w:t>
+        <w:t xml:space="preserve">	22</w:t>
       </w:r>
     </w:p>
     <w:p>
@@ -1494,7 +1523,7 @@
           <w:sz w:val="20"/>
           <w:szCs w:val="20"/>
         </w:rPr>
-        <w:t xml:space="preserve">	21</w:t>
+        <w:t xml:space="preserve">	22</w:t>
       </w:r>
     </w:p>
     <w:p>
@@ -1523,7 +1552,7 @@
           <w:sz w:val="20"/>
           <w:szCs w:val="20"/>
         </w:rPr>
-        <w:t xml:space="preserve">	21</w:t>
+        <w:t xml:space="preserve">	22</w:t>
       </w:r>
     </w:p>
     <w:p>
@@ -1552,7 +1581,7 @@
           <w:sz w:val="20"/>
           <w:szCs w:val="20"/>
         </w:rPr>
-        <w:t xml:space="preserve">	22</w:t>
+        <w:t xml:space="preserve">	23</w:t>
       </w:r>
     </w:p>
     <w:p>
@@ -1581,7 +1610,7 @@
           <w:sz w:val="20"/>
           <w:szCs w:val="20"/>
         </w:rPr>
-        <w:t xml:space="preserve">	22</w:t>
+        <w:t xml:space="preserve">	23</w:t>
       </w:r>
     </w:p>
     <w:p>
@@ -1610,7 +1639,7 @@
           <w:sz w:val="20"/>
           <w:szCs w:val="20"/>
         </w:rPr>
-        <w:t xml:space="preserve">	22</w:t>
+        <w:t xml:space="preserve">	23</w:t>
       </w:r>
     </w:p>
     <w:p>
@@ -1639,7 +1668,7 @@
           <w:sz w:val="20"/>
           <w:szCs w:val="20"/>
         </w:rPr>
-        <w:t xml:space="preserve">	22</w:t>
+        <w:t xml:space="preserve">	23</w:t>
       </w:r>
     </w:p>
     <w:p>
@@ -1668,7 +1697,7 @@
           <w:sz w:val="20"/>
           <w:szCs w:val="20"/>
         </w:rPr>
-        <w:t xml:space="preserve">	22</w:t>
+        <w:t xml:space="preserve">	23</w:t>
       </w:r>
     </w:p>
     <w:p>
@@ -1697,7 +1726,7 @@
           <w:sz w:val="20"/>
           <w:szCs w:val="20"/>
         </w:rPr>
-        <w:t xml:space="preserve">	22</w:t>
+        <w:t xml:space="preserve">	23</w:t>
       </w:r>
     </w:p>
     <w:p>
@@ -1726,7 +1755,7 @@
           <w:sz w:val="20"/>
           <w:szCs w:val="20"/>
         </w:rPr>
-        <w:t xml:space="preserve">	23</w:t>
+        <w:t xml:space="preserve">	24</w:t>
       </w:r>
     </w:p>
     <w:p>
@@ -1755,7 +1784,7 @@
           <w:sz w:val="20"/>
           <w:szCs w:val="20"/>
         </w:rPr>
-        <w:t xml:space="preserve">	23</w:t>
+        <w:t xml:space="preserve">	24</w:t>
       </w:r>
     </w:p>
     <w:p>
@@ -1784,7 +1813,7 @@
           <w:sz w:val="20"/>
           <w:szCs w:val="20"/>
         </w:rPr>
-        <w:t xml:space="preserve">	23</w:t>
+        <w:t xml:space="preserve">	24</w:t>
       </w:r>
     </w:p>
     <w:p>
@@ -1813,7 +1842,7 @@
           <w:sz w:val="20"/>
           <w:szCs w:val="20"/>
         </w:rPr>
-        <w:t xml:space="preserve">	23</w:t>
+        <w:t xml:space="preserve">	24</w:t>
       </w:r>
     </w:p>
     <w:p>
@@ -1842,7 +1871,7 @@
           <w:sz w:val="21"/>
           <w:szCs w:val="21"/>
         </w:rPr>
-        <w:t xml:space="preserve">	25</w:t>
+        <w:t xml:space="preserve">	26</w:t>
       </w:r>
     </w:p>
     <w:p>
@@ -1871,7 +1900,7 @@
           <w:sz w:val="20"/>
           <w:szCs w:val="20"/>
         </w:rPr>
-        <w:t xml:space="preserve">	25</w:t>
+        <w:t xml:space="preserve">	26</w:t>
       </w:r>
     </w:p>
     <w:p>
@@ -1900,7 +1929,7 @@
           <w:sz w:val="20"/>
           <w:szCs w:val="20"/>
         </w:rPr>
-        <w:t xml:space="preserve">	25</w:t>
+        <w:t xml:space="preserve">	26</w:t>
       </w:r>
     </w:p>
     <w:p>
@@ -1929,7 +1958,7 @@
           <w:sz w:val="20"/>
           <w:szCs w:val="20"/>
         </w:rPr>
-        <w:t xml:space="preserve">	25</w:t>
+        <w:t xml:space="preserve">	26</w:t>
       </w:r>
     </w:p>
     <w:p>
@@ -1958,7 +1987,7 @@
           <w:sz w:val="20"/>
           <w:szCs w:val="20"/>
         </w:rPr>
-        <w:t xml:space="preserve">	25</w:t>
+        <w:t xml:space="preserve">	26</w:t>
       </w:r>
     </w:p>
     <w:p>
@@ -1987,7 +2016,7 @@
           <w:sz w:val="21"/>
           <w:szCs w:val="21"/>
         </w:rPr>
-        <w:t xml:space="preserve">	27</w:t>
+        <w:t xml:space="preserve">	28</w:t>
       </w:r>
     </w:p>
     <w:p>
@@ -2016,7 +2045,7 @@
           <w:sz w:val="21"/>
           <w:szCs w:val="21"/>
         </w:rPr>
-        <w:t xml:space="preserve">	28</w:t>
+        <w:t xml:space="preserve">	29</w:t>
       </w:r>
     </w:p>
     <w:p>
@@ -2045,7 +2074,7 @@
           <w:sz w:val="20"/>
           <w:szCs w:val="20"/>
         </w:rPr>
-        <w:t xml:space="preserve">	28</w:t>
+        <w:t xml:space="preserve">	29</w:t>
       </w:r>
     </w:p>
     <w:p>
@@ -2074,7 +2103,7 @@
           <w:sz w:val="20"/>
           <w:szCs w:val="20"/>
         </w:rPr>
-        <w:t xml:space="preserve">	28</w:t>
+        <w:t xml:space="preserve">	29</w:t>
       </w:r>
     </w:p>
     <w:p>
@@ -2103,7 +2132,7 @@
           <w:sz w:val="20"/>
           <w:szCs w:val="20"/>
         </w:rPr>
-        <w:t xml:space="preserve">	28</w:t>
+        <w:t xml:space="preserve">	29</w:t>
       </w:r>
     </w:p>
     <w:p>
@@ -2132,7 +2161,7 @@
           <w:sz w:val="20"/>
           <w:szCs w:val="20"/>
         </w:rPr>
-        <w:t xml:space="preserve">	28</w:t>
+        <w:t xml:space="preserve">	29</w:t>
       </w:r>
     </w:p>
     <w:p>
@@ -2161,7 +2190,7 @@
           <w:sz w:val="20"/>
           <w:szCs w:val="20"/>
         </w:rPr>
-        <w:t xml:space="preserve">	28</w:t>
+        <w:t xml:space="preserve">	29</w:t>
       </w:r>
     </w:p>
     <w:p>
@@ -2190,7 +2219,7 @@
           <w:sz w:val="20"/>
           <w:szCs w:val="20"/>
         </w:rPr>
-        <w:t xml:space="preserve">	29</w:t>
+        <w:t xml:space="preserve">	30</w:t>
       </w:r>
     </w:p>
     <w:p>
@@ -2219,7 +2248,7 @@
           <w:sz w:val="20"/>
           <w:szCs w:val="20"/>
         </w:rPr>
-        <w:t xml:space="preserve">	29</w:t>
+        <w:t xml:space="preserve">	30</w:t>
       </w:r>
     </w:p>
     <w:p>
@@ -2248,7 +2277,7 @@
           <w:sz w:val="20"/>
           <w:szCs w:val="20"/>
         </w:rPr>
-        <w:t xml:space="preserve">	29</w:t>
+        <w:t xml:space="preserve">	30</w:t>
       </w:r>
     </w:p>
     <w:p>
@@ -2277,7 +2306,7 @@
           <w:sz w:val="20"/>
           <w:szCs w:val="20"/>
         </w:rPr>
-        <w:t xml:space="preserve">	30</w:t>
+        <w:t xml:space="preserve">	31</w:t>
       </w:r>
     </w:p>
     <w:p>
@@ -2306,7 +2335,7 @@
           <w:sz w:val="20"/>
           <w:szCs w:val="20"/>
         </w:rPr>
-        <w:t xml:space="preserve">	30</w:t>
+        <w:t xml:space="preserve">	31</w:t>
       </w:r>
     </w:p>
     <w:p>
@@ -2335,7 +2364,7 @@
           <w:sz w:val="20"/>
           <w:szCs w:val="20"/>
         </w:rPr>
-        <w:t xml:space="preserve">	31</w:t>
+        <w:t xml:space="preserve">	32</w:t>
       </w:r>
     </w:p>
     <w:p>
@@ -2364,7 +2393,7 @@
           <w:sz w:val="20"/>
           <w:szCs w:val="20"/>
         </w:rPr>
-        <w:t xml:space="preserve">	31</w:t>
+        <w:t xml:space="preserve">	32</w:t>
       </w:r>
     </w:p>
     <w:p>
@@ -2393,7 +2422,7 @@
           <w:sz w:val="20"/>
           <w:szCs w:val="20"/>
         </w:rPr>
-        <w:t xml:space="preserve">	31</w:t>
+        <w:t xml:space="preserve">	32</w:t>
       </w:r>
     </w:p>
     <w:p>
@@ -2422,7 +2451,7 @@
           <w:sz w:val="20"/>
           <w:szCs w:val="20"/>
         </w:rPr>
-        <w:t xml:space="preserve">	31</w:t>
+        <w:t xml:space="preserve">	32</w:t>
       </w:r>
     </w:p>
     <w:p>
@@ -2451,7 +2480,7 @@
           <w:sz w:val="20"/>
           <w:szCs w:val="20"/>
         </w:rPr>
-        <w:t xml:space="preserve">	31</w:t>
+        <w:t xml:space="preserve">	32</w:t>
       </w:r>
     </w:p>
     <w:p>
@@ -2480,7 +2509,7 @@
           <w:sz w:val="20"/>
           <w:szCs w:val="20"/>
         </w:rPr>
-        <w:t xml:space="preserve">	31</w:t>
+        <w:t xml:space="preserve">	32</w:t>
       </w:r>
     </w:p>
     <w:p>
@@ -2509,7 +2538,7 @@
           <w:sz w:val="20"/>
           <w:szCs w:val="20"/>
         </w:rPr>
-        <w:t xml:space="preserve">	31</w:t>
+        <w:t xml:space="preserve">	32</w:t>
       </w:r>
     </w:p>
     <w:p>
@@ -2538,7 +2567,7 @@
           <w:sz w:val="20"/>
           <w:szCs w:val="20"/>
         </w:rPr>
-        <w:t xml:space="preserve">	31</w:t>
+        <w:t xml:space="preserve">	32</w:t>
       </w:r>
     </w:p>
     <w:p>
@@ -2567,7 +2596,7 @@
           <w:sz w:val="21"/>
           <w:szCs w:val="21"/>
         </w:rPr>
-        <w:t xml:space="preserve">	32</w:t>
+        <w:t xml:space="preserve">	33</w:t>
       </w:r>
     </w:p>
     <w:p>
@@ -2596,7 +2625,7 @@
           <w:sz w:val="21"/>
           <w:szCs w:val="21"/>
         </w:rPr>
-        <w:t xml:space="preserve">	33</w:t>
+        <w:t xml:space="preserve">	34</w:t>
       </w:r>
     </w:p>
     <w:p>
@@ -2625,7 +2654,7 @@
           <w:sz w:val="21"/>
           <w:szCs w:val="21"/>
         </w:rPr>
-        <w:t xml:space="preserve">	34</w:t>
+        <w:t xml:space="preserve">	35</w:t>
       </w:r>
     </w:p>
     <w:p>
@@ -2683,7 +2712,7 @@
           <w:sz w:val="20"/>
           <w:szCs w:val="20"/>
         </w:rPr>
-        <w:t xml:space="preserve">	38</w:t>
+        <w:t xml:space="preserve">	39</w:t>
       </w:r>
     </w:p>
     <w:p>
@@ -3091,6 +3120,44 @@
           <w:rFonts w:ascii="Times New Roman" w:cs="Times New Roman" w:eastAsia="Times New Roman" w:hAnsi="Times New Roman"/>
         </w:rPr>
         <w:t xml:space="preserve">This edition is kept up to date as VM/370plus grows; each change is listed here, newest first.</w:t>
+      </w:r>
+    </w:p>
+    <w:p>
+      <w:pPr>
+        <w:pStyle w:val="ListParagraph"/>
+        <w:numPr>
+          <w:ilvl w:val="0"/>
+          <w:numId w:val="2"/>
+        </w:numPr>
+        <w:spacing w:after="60"/>
+      </w:pPr>
+      <w:r>
+        <w:rPr>
+          <w:rFonts w:ascii="Times New Roman" w:cs="Times New Roman" w:eastAsia="Times New Roman" w:hAnsi="Times New Roman"/>
+          <w:b/>
+          <w:bCs/>
+        </w:rPr>
+        <w:t xml:space="preserve">13 October 2026, evening.</w:t>
+      </w:r>
+      <w:r>
+        <w:rPr>
+          <w:rFonts w:ascii="Times New Roman" w:cs="Times New Roman" w:eastAsia="Times New Roman" w:hAnsi="Times New Roman"/>
+        </w:rPr>
+        <w:t xml:space="preserve"> NICOF (Chapter 6): sockets for CMS programs, the FTP server CMSFTPD and NHFS file transfer to the PC. BREXX in a machine without </w:t>
+      </w:r>
+      <w:r>
+        <w:rPr>
+          <w:rFonts w:ascii="Courier New" w:cs="Courier New" w:eastAsia="Courier New" w:hAnsi="Courier New"/>
+          <w:sz w:val="19"/>
+          <w:szCs w:val="19"/>
+        </w:rPr>
+        <w:t xml:space="preserve">OPTION ECMODE</w:t>
+      </w:r>
+      <w:r>
+        <w:rPr>
+          <w:rFonts w:ascii="Times New Roman" w:cs="Times New Roman" w:eastAsia="Times New Roman" w:hAnsi="Times New Roman"/>
+        </w:rPr>
+        <w:t xml:space="preserve"> no longer ends with an operation exception (I-283).</w:t>
       </w:r>
     </w:p>
     <w:p>
@@ -15090,7 +15157,7 @@
         <w:pStyle w:val="Heading2"/>
       </w:pPr>
       <w:r>
-        <w:t xml:space="preserve">TELL</w:t>
+        <w:t xml:space="preserve">NICOF: sockets, FTP and PC files</w:t>
       </w:r>
     </w:p>
     <w:p>
@@ -15099,190 +15166,79 @@
       </w:pPr>
       <w:r>
         <w:rPr>
-          <w:rFonts w:ascii="Courier New" w:cs="Courier New" w:eastAsia="Courier New" w:hAnsi="Courier New"/>
-          <w:sz w:val="19"/>
-          <w:szCs w:val="19"/>
-        </w:rPr>
-        <w:t xml:space="preserve">TELL userid message</w:t>
-      </w:r>
-      <w:r>
-        <w:rPr>
-          <w:rFonts w:ascii="Times New Roman" w:cs="Times New Roman" w:eastAsia="Times New Roman" w:hAnsi="Times New Roman"/>
-        </w:rPr>
-        <w:t xml:space="preserve"> sends a message to a VM/370 user (CP MSG). </w:t>
-      </w:r>
-      <w:r>
-        <w:rPr>
-          <w:rFonts w:ascii="Courier New" w:cs="Courier New" w:eastAsia="Courier New" w:hAnsi="Courier New"/>
-          <w:sz w:val="19"/>
-          <w:szCs w:val="19"/>
-        </w:rPr>
-        <w:t xml:space="preserve">TELL user AT LINUX message</w:t>
-      </w:r>
-      <w:r>
-        <w:rPr>
-          <w:rFonts w:ascii="Times New Roman" w:cs="Times New Roman" w:eastAsia="Times New Roman" w:hAnsi="Times New Roman"/>
-        </w:rPr>
-        <w:t xml:space="preserve"> sends it to a user of the Debian guest through the spool bridge: it appears on that user’s terminals, and is kept until the user reads it with </w:t>
-      </w:r>
-      <w:r>
-        <w:rPr>
-          <w:rFonts w:ascii="Courier New" w:cs="Courier New" w:eastAsia="Courier New" w:hAnsi="Courier New"/>
-          <w:sz w:val="19"/>
-          <w:szCs w:val="19"/>
-        </w:rPr>
-        <w:t xml:space="preserve">tell</w:t>
-      </w:r>
-      <w:r>
-        <w:rPr>
-          <w:rFonts w:ascii="Times New Roman" w:cs="Times New Roman" w:eastAsia="Times New Roman" w:hAnsi="Times New Roman"/>
-        </w:rPr>
-        <w:t xml:space="preserve">. </w:t>
-      </w:r>
-      <w:r>
-        <w:rPr>
-          <w:rFonts w:ascii="Courier New" w:cs="Courier New" w:eastAsia="Courier New" w:hAnsi="Courier New"/>
-          <w:sz w:val="19"/>
-          <w:szCs w:val="19"/>
-        </w:rPr>
-        <w:t xml:space="preserve">TELL ALL AT LINUX message</w:t>
-      </w:r>
-      <w:r>
-        <w:rPr>
-          <w:rFonts w:ascii="Times New Roman" w:cs="Times New Roman" w:eastAsia="Times New Roman" w:hAnsi="Times New Roman"/>
-        </w:rPr>
-        <w:t xml:space="preserve"> reaches everybody logged on to Linux. A Linux user answers with </w:t>
-      </w:r>
-      <w:r>
-        <w:rPr>
-          <w:rFonts w:ascii="Courier New" w:cs="Courier New" w:eastAsia="Courier New" w:hAnsi="Courier New"/>
-          <w:sz w:val="19"/>
-          <w:szCs w:val="19"/>
-        </w:rPr>
-        <w:t xml:space="preserve">tell userid message</w:t>
-      </w:r>
-      <w:r>
-        <w:rPr>
-          <w:rFonts w:ascii="Times New Roman" w:cs="Times New Roman" w:eastAsia="Times New Roman" w:hAnsi="Times New Roman"/>
-        </w:rPr>
-        <w:t xml:space="preserve">, which arrives on CMS as </w:t>
-      </w:r>
-      <w:r>
-        <w:rPr>
-          <w:rFonts w:ascii="Courier New" w:cs="Courier New" w:eastAsia="Courier New" w:hAnsi="Courier New"/>
-          <w:sz w:val="19"/>
-          <w:szCs w:val="19"/>
-        </w:rPr>
-        <w:t xml:space="preserve">MSG FROM MAINT: (user) message</w:t>
-      </w:r>
-      <w:r>
-        <w:rPr>
-          <w:rFonts w:ascii="Times New Roman" w:cs="Times New Roman" w:eastAsia="Times New Roman" w:hAnsi="Times New Roman"/>
-        </w:rPr>
-        <w:t xml:space="preserve">.</w:t>
-      </w:r>
-    </w:p>
-    <w:p>
-      <w:pPr>
-        <w:spacing w:after="120"/>
-      </w:pPr>
-      <w:r>
-        <w:rPr>
-          <w:rFonts w:ascii="Courier New" w:cs="Courier New" w:eastAsia="Courier New" w:hAnsi="Courier New"/>
-          <w:sz w:val="19"/>
-          <w:szCs w:val="19"/>
-        </w:rPr>
-        <w:t xml:space="preserve">TELL user AT NET message</w:t>
-      </w:r>
-      <w:r>
-        <w:rPr>
-          <w:rFonts w:ascii="Times New Roman" w:cs="Times New Roman" w:eastAsia="Times New Roman" w:hAnsi="Times New Roman"/>
-        </w:rPr>
-        <w:t xml:space="preserve"> reaches a user on the internet. The message is published on the MQTT broker of the Debian guest as topic </w:t>
-      </w:r>
-      <w:r>
-        <w:rPr>
-          <w:rFonts w:ascii="Courier New" w:cs="Courier New" w:eastAsia="Courier New" w:hAnsi="Courier New"/>
-          <w:sz w:val="19"/>
-          <w:szCs w:val="19"/>
-        </w:rPr>
-        <w:t xml:space="preserve">vm/tell/out/user</w:t>
-      </w:r>
-      <w:r>
-        <w:rPr>
-          <w:rFonts w:ascii="Times New Roman" w:cs="Times New Roman" w:eastAsia="Times New Roman" w:hAnsi="Times New Roman"/>
-        </w:rPr>
-        <w:t xml:space="preserve">, which the user reads with any MQTT client. The user answers by publishing to </w:t>
-      </w:r>
-      <w:r>
-        <w:rPr>
-          <w:rFonts w:ascii="Courier New" w:cs="Courier New" w:eastAsia="Courier New" w:hAnsi="Courier New"/>
-          <w:sz w:val="19"/>
-          <w:szCs w:val="19"/>
-        </w:rPr>
-        <w:t xml:space="preserve">vm/tell/from/user/to/userid</w:t>
-      </w:r>
-      <w:r>
-        <w:rPr>
-          <w:rFonts w:ascii="Times New Roman" w:cs="Times New Roman" w:eastAsia="Times New Roman" w:hAnsi="Times New Roman"/>
-        </w:rPr>
-        <w:t xml:space="preserve">; it arrives as </w:t>
-      </w:r>
-      <w:r>
-        <w:rPr>
-          <w:rFonts w:ascii="Courier New" w:cs="Courier New" w:eastAsia="Courier New" w:hAnsi="Courier New"/>
-          <w:sz w:val="19"/>
-          <w:szCs w:val="19"/>
-        </w:rPr>
-        <w:t xml:space="preserve">MSG FROM MAINT: (net:user) message</w:t>
-      </w:r>
-      <w:r>
-        <w:rPr>
-          <w:rFonts w:ascii="Times New Roman" w:cs="Times New Roman" w:eastAsia="Times New Roman" w:hAnsi="Times New Roman"/>
-        </w:rPr>
-        <w:t xml:space="preserve">. Outside users need a login (</w:t>
-      </w:r>
-      <w:r>
-        <w:rPr>
-          <w:rFonts w:ascii="Courier New" w:cs="Courier New" w:eastAsia="Courier New" w:hAnsi="Courier New"/>
-          <w:sz w:val="19"/>
-          <w:szCs w:val="19"/>
-        </w:rPr>
-        <w:t xml:space="preserve">tellnet-user name password</w:t>
-      </w:r>
-      <w:r>
-        <w:rPr>
-          <w:rFonts w:ascii="Times New Roman" w:cs="Times New Roman" w:eastAsia="Times New Roman" w:hAnsi="Times New Roman"/>
-        </w:rPr>
-        <w:t xml:space="preserve"> in the guest) and may only use their own TELL topics. On the PC, </w:t>
-      </w:r>
-      <w:r>
-        <w:rPr>
-          <w:rFonts w:ascii="Courier New" w:cs="Courier New" w:eastAsia="Courier New" w:hAnsi="Courier New"/>
-          <w:sz w:val="19"/>
-          <w:szCs w:val="19"/>
-        </w:rPr>
-        <w:t xml:space="preserve">tools/netfwd.py --tls cert key 8883 10.1.1.2:1883</w:t>
-      </w:r>
-      <w:r>
-        <w:rPr>
-          <w:rFonts w:ascii="Times New Roman" w:cs="Times New Roman" w:eastAsia="Times New Roman" w:hAnsi="Times New Roman"/>
-        </w:rPr>
-        <w:t xml:space="preserve"> makes the broker reachable, encrypted; the router has to forward that port to the PC. </w:t>
-      </w:r>
-      <w:r>
-        <w:rPr>
-          <w:rFonts w:ascii="Courier New" w:cs="Courier New" w:eastAsia="Courier New" w:hAnsi="Courier New"/>
-          <w:sz w:val="19"/>
-          <w:szCs w:val="19"/>
-        </w:rPr>
-        <w:t xml:space="preserve">tools/nettell.py</w:t>
-      </w:r>
-      <w:r>
-        <w:rPr>
-          <w:rFonts w:ascii="Times New Roman" w:cs="Times New Roman" w:eastAsia="Times New Roman" w:hAnsi="Times New Roman"/>
-        </w:rPr>
-        <w:t xml:space="preserve"> is a small client for the outside user.</w:t>
+          <w:rFonts w:ascii="Times New Roman" w:cs="Times New Roman" w:eastAsia="Times New Roman" w:hAnsi="Times New Roman"/>
+        </w:rPr>
+        <w:t xml:space="preserve">NICOF (devhawala, public domain) gives CMS a BSD-style socket API (</w:t>
+      </w:r>
+      <w:r>
+        <w:rPr>
+          <w:rFonts w:ascii="Courier New" w:cs="Courier New" w:eastAsia="Courier New" w:hAnsi="Courier New"/>
+          <w:sz w:val="19"/>
+          <w:szCs w:val="19"/>
+        </w:rPr>
+        <w:t xml:space="preserve">NICOFLIB TXTLIB</w:t>
+      </w:r>
+      <w:r>
+        <w:rPr>
+          <w:rFonts w:ascii="Times New Roman" w:cs="Times New Roman" w:eastAsia="Times New Roman" w:hAnsi="Times New Roman"/>
+        </w:rPr>
+        <w:t xml:space="preserve">, </w:t>
+      </w:r>
+      <w:r>
+        <w:rPr>
+          <w:rFonts w:ascii="Courier New" w:cs="Courier New" w:eastAsia="Courier New" w:hAnsi="Courier New"/>
+          <w:sz w:val="19"/>
+          <w:szCs w:val="19"/>
+        </w:rPr>
+        <w:t xml:space="preserve">SOCKET H</w:t>
+      </w:r>
+      <w:r>
+        <w:rPr>
+          <w:rFonts w:ascii="Times New Roman" w:cs="Times New Roman" w:eastAsia="Times New Roman" w:hAnsi="Times New Roman"/>
+        </w:rPr>
+        <w:t xml:space="preserve">), the FTP server </w:t>
+      </w:r>
+      <w:r>
+        <w:rPr>
+          <w:rFonts w:ascii="Courier New" w:cs="Courier New" w:eastAsia="Courier New" w:hAnsi="Courier New"/>
+          <w:sz w:val="19"/>
+          <w:szCs w:val="19"/>
+        </w:rPr>
+        <w:t xml:space="preserve">CMSFTPD</w:t>
+      </w:r>
+      <w:r>
+        <w:rPr>
+          <w:rFonts w:ascii="Times New Roman" w:cs="Times New Roman" w:eastAsia="Times New Roman" w:hAnsi="Times New Roman"/>
+        </w:rPr>
+        <w:t xml:space="preserve"> and the commands </w:t>
+      </w:r>
+      <w:r>
+        <w:rPr>
+          <w:rFonts w:ascii="Courier New" w:cs="Courier New" w:eastAsia="Courier New" w:hAnsi="Courier New"/>
+          <w:sz w:val="19"/>
+          <w:szCs w:val="19"/>
+        </w:rPr>
+        <w:t xml:space="preserve">NHFS</w:t>
+      </w:r>
+      <w:r>
+        <w:rPr>
+          <w:rFonts w:ascii="Times New Roman" w:cs="Times New Roman" w:eastAsia="Times New Roman" w:hAnsi="Times New Roman"/>
+        </w:rPr>
+        <w:t xml:space="preserve"> and </w:t>
+      </w:r>
+      <w:r>
+        <w:rPr>
+          <w:rFonts w:ascii="Courier New" w:cs="Courier New" w:eastAsia="Courier New" w:hAnsi="Courier New"/>
+          <w:sz w:val="19"/>
+          <w:szCs w:val="19"/>
+        </w:rPr>
+        <w:t xml:space="preserve">HACC</w:t>
+      </w:r>
+      <w:r>
+        <w:rPr>
+          <w:rFonts w:ascii="Times New Roman" w:cs="Times New Roman" w:eastAsia="Times New Roman" w:hAnsi="Times New Roman"/>
+        </w:rPr>
+        <w:t xml:space="preserve">, which copy files between CMS and the PC. The sockets are the PC’s own: a Java program on the PC does the network work and talks to the service machines NICOFPXY and TCPIPPXY, which AUTOLOG1 starts at IPL, over one 3270 line each (03CD, 03CE).</w:t>
       </w:r>
     </w:p>
     <w:tbl>
@@ -15325,7 +15281,7 @@
                 <w:sz w:val="17"/>
                 <w:szCs w:val="17"/>
               </w:rPr>
-              <w:t xml:space="preserve">mqtt sub vm/test 1 20</w:t>
+              <w:t xml:space="preserve">sh vm370plus/nicof/nicof.sh start</w:t>
             </w:r>
           </w:p>
           <w:p>
@@ -15338,20 +15294,7 @@
                 <w:sz w:val="17"/>
                 <w:szCs w:val="17"/>
               </w:rPr>
-              <w:t xml:space="preserve">vm/test hello from linux</w:t>
-            </w:r>
-          </w:p>
-          <w:p>
-            <w:pPr>
-              <w:spacing w:after="0" w:line="228"/>
-            </w:pPr>
-            <w:r>
-              <w:rPr>
-                <w:rFonts w:ascii="Courier New" w:cs="Courier New" w:eastAsia="Courier New" w:hAnsi="Courier New"/>
-                <w:sz w:val="17"/>
-                <w:szCs w:val="17"/>
-              </w:rPr>
-              <w:t xml:space="preserve">Ready;</w:t>
+              <w:t xml:space="preserve">nicof: started (pid 2174, log nicof.log)</w:t>
             </w:r>
           </w:p>
         </w:tc>
@@ -15377,7 +15320,116 @@
           <w:sz w:val="18"/>
           <w:szCs w:val="18"/>
         </w:rPr>
-        <w:t xml:space="preserve">A message from Linux arrives on CMS</w:t>
+        <w:t xml:space="preserve">Starting the PC half of NICOF (Java on the PATH)</w:t>
+      </w:r>
+    </w:p>
+    <w:p>
+      <w:pPr>
+        <w:spacing w:after="120"/>
+      </w:pPr>
+      <w:r>
+        <w:rPr>
+          <w:rFonts w:ascii="Times New Roman" w:cs="Times New Roman" w:eastAsia="Times New Roman" w:hAnsi="Times New Roman"/>
+        </w:rPr>
+        <w:t xml:space="preserve">On CMS, </w:t>
+      </w:r>
+      <w:r>
+        <w:rPr>
+          <w:rFonts w:ascii="Courier New" w:cs="Courier New" w:eastAsia="Courier New" w:hAnsi="Courier New"/>
+          <w:sz w:val="19"/>
+          <w:szCs w:val="19"/>
+        </w:rPr>
+        <w:t xml:space="preserve">NCFACC</w:t>
+      </w:r>
+      <w:r>
+        <w:rPr>
+          <w:rFonts w:ascii="Times New Roman" w:cs="Times New Roman" w:eastAsia="Times New Roman" w:hAnsi="Times New Roman"/>
+        </w:rPr>
+        <w:t xml:space="preserve"> accesses NICOF’s disk as N. </w:t>
+      </w:r>
+      <w:r>
+        <w:rPr>
+          <w:rFonts w:ascii="Courier New" w:cs="Courier New" w:eastAsia="Courier New" w:hAnsi="Courier New"/>
+          <w:sz w:val="19"/>
+          <w:szCs w:val="19"/>
+        </w:rPr>
+        <w:t xml:space="preserve">NHFS LIST</w:t>
+      </w:r>
+      <w:r>
+        <w:rPr>
+          <w:rFonts w:ascii="Times New Roman" w:cs="Times New Roman" w:eastAsia="Times New Roman" w:hAnsi="Times New Roman"/>
+        </w:rPr>
+        <w:t xml:space="preserve">, </w:t>
+      </w:r>
+      <w:r>
+        <w:rPr>
+          <w:rFonts w:ascii="Courier New" w:cs="Courier New" w:eastAsia="Courier New" w:hAnsi="Courier New"/>
+          <w:sz w:val="19"/>
+          <w:szCs w:val="19"/>
+        </w:rPr>
+        <w:t xml:space="preserve">NHFS GET fn ft (REPLACE</w:t>
+      </w:r>
+      <w:r>
+        <w:rPr>
+          <w:rFonts w:ascii="Times New Roman" w:cs="Times New Roman" w:eastAsia="Times New Roman" w:hAnsi="Times New Roman"/>
+        </w:rPr>
+        <w:t xml:space="preserve"> and </w:t>
+      </w:r>
+      <w:r>
+        <w:rPr>
+          <w:rFonts w:ascii="Courier New" w:cs="Courier New" w:eastAsia="Courier New" w:hAnsi="Courier New"/>
+          <w:sz w:val="19"/>
+          <w:szCs w:val="19"/>
+        </w:rPr>
+        <w:t xml:space="preserve">NHFS PUT fn ft</w:t>
+      </w:r>
+      <w:r>
+        <w:rPr>
+          <w:rFonts w:ascii="Times New Roman" w:cs="Times New Roman" w:eastAsia="Times New Roman" w:hAnsi="Times New Roman"/>
+        </w:rPr>
+        <w:t xml:space="preserve"> work on the files in </w:t>
+      </w:r>
+      <w:r>
+        <w:rPr>
+          <w:rFonts w:ascii="Courier New" w:cs="Courier New" w:eastAsia="Courier New" w:hAnsi="Courier New"/>
+          <w:sz w:val="19"/>
+          <w:szCs w:val="19"/>
+        </w:rPr>
+        <w:t xml:space="preserve">vm370plus/nicof/nhfs/&lt;user&gt;</w:t>
+      </w:r>
+      <w:r>
+        <w:rPr>
+          <w:rFonts w:ascii="Times New Roman" w:cs="Times New Roman" w:eastAsia="Times New Roman" w:hAnsi="Times New Roman"/>
+        </w:rPr>
+        <w:t xml:space="preserve"> on the PC. </w:t>
+      </w:r>
+      <w:r>
+        <w:rPr>
+          <w:rFonts w:ascii="Courier New" w:cs="Courier New" w:eastAsia="Courier New" w:hAnsi="Courier New"/>
+          <w:sz w:val="19"/>
+          <w:szCs w:val="19"/>
+        </w:rPr>
+        <w:t xml:space="preserve">CMSFTPD -p 2121 -usecmscmds</w:t>
+      </w:r>
+      <w:r>
+        <w:rPr>
+          <w:rFonts w:ascii="Times New Roman" w:cs="Times New Roman" w:eastAsia="Times New Roman" w:hAnsi="Times New Roman"/>
+        </w:rPr>
+        <w:t xml:space="preserve"> serves the user’s disks to any FTP client on the PC’s port 2121 until the client quits; each disk is a directory (a, b, ...). </w:t>
+      </w:r>
+      <w:r>
+        <w:rPr>
+          <w:rFonts w:ascii="Courier New" w:cs="Courier New" w:eastAsia="Courier New" w:hAnsi="Courier New"/>
+          <w:sz w:val="19"/>
+          <w:szCs w:val="19"/>
+        </w:rPr>
+        <w:t xml:space="preserve">-pwd x</w:t>
+      </w:r>
+      <w:r>
+        <w:rPr>
+          <w:rFonts w:ascii="Times New Roman" w:cs="Times New Roman" w:eastAsia="Times New Roman" w:hAnsi="Times New Roman"/>
+        </w:rPr>
+        <w:t xml:space="preserve"> asks for a password.</w:t>
       </w:r>
     </w:p>
     <w:p>
@@ -15385,7 +15437,7 @@
         <w:pStyle w:val="Heading2"/>
       </w:pPr>
       <w:r>
-        <w:t xml:space="preserve">RXPIP: REXX packages</w:t>
+        <w:t xml:space="preserve">TELL</w:t>
       </w:r>
     </w:p>
     <w:p>
@@ -15394,37 +15446,87 @@
       </w:pPr>
       <w:r>
         <w:rPr>
-          <w:rFonts w:ascii="Times New Roman" w:cs="Times New Roman" w:eastAsia="Times New Roman" w:hAnsi="Times New Roman"/>
-        </w:rPr>
-        <w:t xml:space="preserve">RXPIP is the package manager of rexxpository: REXX routines are published as packages, and a program names what it needs with </w:t>
-      </w:r>
-      <w:r>
-        <w:rPr>
-          <w:rFonts w:ascii="Courier New" w:cs="Courier New" w:eastAsia="Courier New" w:hAnsi="Courier New"/>
-          <w:sz w:val="19"/>
-          <w:szCs w:val="19"/>
-        </w:rPr>
-        <w:t xml:space="preserve">/* REQUIRE pkg */</w:t>
-      </w:r>
-      <w:r>
-        <w:rPr>
-          <w:rFonts w:ascii="Times New Roman" w:cs="Times New Roman" w:eastAsia="Times New Roman" w:hAnsi="Times New Roman"/>
-        </w:rPr>
-        <w:t xml:space="preserve"> comments. The repository server and the rxpip client run in the Debian guest; the bridge service </w:t>
-      </w:r>
-      <w:r>
-        <w:rPr>
-          <w:rFonts w:ascii="Courier New" w:cs="Courier New" w:eastAsia="Courier New" w:hAnsi="Courier New"/>
-          <w:sz w:val="19"/>
-          <w:szCs w:val="19"/>
-        </w:rPr>
-        <w:t xml:space="preserve">rxpip</w:t>
-      </w:r>
-      <w:r>
-        <w:rPr>
-          <w:rFonts w:ascii="Times New Roman" w:cs="Times New Roman" w:eastAsia="Times New Roman" w:hAnsi="Times New Roman"/>
-        </w:rPr>
-        <w:t xml:space="preserve"> serves CMS users.</w:t>
+          <w:rFonts w:ascii="Courier New" w:cs="Courier New" w:eastAsia="Courier New" w:hAnsi="Courier New"/>
+          <w:sz w:val="19"/>
+          <w:szCs w:val="19"/>
+        </w:rPr>
+        <w:t xml:space="preserve">TELL userid message</w:t>
+      </w:r>
+      <w:r>
+        <w:rPr>
+          <w:rFonts w:ascii="Times New Roman" w:cs="Times New Roman" w:eastAsia="Times New Roman" w:hAnsi="Times New Roman"/>
+        </w:rPr>
+        <w:t xml:space="preserve"> sends a message to a VM/370 user (CP MSG). </w:t>
+      </w:r>
+      <w:r>
+        <w:rPr>
+          <w:rFonts w:ascii="Courier New" w:cs="Courier New" w:eastAsia="Courier New" w:hAnsi="Courier New"/>
+          <w:sz w:val="19"/>
+          <w:szCs w:val="19"/>
+        </w:rPr>
+        <w:t xml:space="preserve">TELL user AT LINUX message</w:t>
+      </w:r>
+      <w:r>
+        <w:rPr>
+          <w:rFonts w:ascii="Times New Roman" w:cs="Times New Roman" w:eastAsia="Times New Roman" w:hAnsi="Times New Roman"/>
+        </w:rPr>
+        <w:t xml:space="preserve"> sends it to a user of the Debian guest through the spool bridge: it appears on that user’s terminals, and is kept until the user reads it with </w:t>
+      </w:r>
+      <w:r>
+        <w:rPr>
+          <w:rFonts w:ascii="Courier New" w:cs="Courier New" w:eastAsia="Courier New" w:hAnsi="Courier New"/>
+          <w:sz w:val="19"/>
+          <w:szCs w:val="19"/>
+        </w:rPr>
+        <w:t xml:space="preserve">tell</w:t>
+      </w:r>
+      <w:r>
+        <w:rPr>
+          <w:rFonts w:ascii="Times New Roman" w:cs="Times New Roman" w:eastAsia="Times New Roman" w:hAnsi="Times New Roman"/>
+        </w:rPr>
+        <w:t xml:space="preserve">. </w:t>
+      </w:r>
+      <w:r>
+        <w:rPr>
+          <w:rFonts w:ascii="Courier New" w:cs="Courier New" w:eastAsia="Courier New" w:hAnsi="Courier New"/>
+          <w:sz w:val="19"/>
+          <w:szCs w:val="19"/>
+        </w:rPr>
+        <w:t xml:space="preserve">TELL ALL AT LINUX message</w:t>
+      </w:r>
+      <w:r>
+        <w:rPr>
+          <w:rFonts w:ascii="Times New Roman" w:cs="Times New Roman" w:eastAsia="Times New Roman" w:hAnsi="Times New Roman"/>
+        </w:rPr>
+        <w:t xml:space="preserve"> reaches everybody logged on to Linux. A Linux user answers with </w:t>
+      </w:r>
+      <w:r>
+        <w:rPr>
+          <w:rFonts w:ascii="Courier New" w:cs="Courier New" w:eastAsia="Courier New" w:hAnsi="Courier New"/>
+          <w:sz w:val="19"/>
+          <w:szCs w:val="19"/>
+        </w:rPr>
+        <w:t xml:space="preserve">tell userid message</w:t>
+      </w:r>
+      <w:r>
+        <w:rPr>
+          <w:rFonts w:ascii="Times New Roman" w:cs="Times New Roman" w:eastAsia="Times New Roman" w:hAnsi="Times New Roman"/>
+        </w:rPr>
+        <w:t xml:space="preserve">, which arrives on CMS as </w:t>
+      </w:r>
+      <w:r>
+        <w:rPr>
+          <w:rFonts w:ascii="Courier New" w:cs="Courier New" w:eastAsia="Courier New" w:hAnsi="Courier New"/>
+          <w:sz w:val="19"/>
+          <w:szCs w:val="19"/>
+        </w:rPr>
+        <w:t xml:space="preserve">MSG FROM MAINT: (user) message</w:t>
+      </w:r>
+      <w:r>
+        <w:rPr>
+          <w:rFonts w:ascii="Times New Roman" w:cs="Times New Roman" w:eastAsia="Times New Roman" w:hAnsi="Times New Roman"/>
+        </w:rPr>
+        <w:t xml:space="preserve">.</w:t>
       </w:r>
     </w:p>
     <w:p>
@@ -15437,125 +15539,97 @@
           <w:sz w:val="19"/>
           <w:szCs w:val="19"/>
         </w:rPr>
-        <w:t xml:space="preserve">RXPIP AVAIL</w:t>
-      </w:r>
-      <w:r>
-        <w:rPr>
-          <w:rFonts w:ascii="Times New Roman" w:cs="Times New Roman" w:eastAsia="Times New Roman" w:hAnsi="Times New Roman"/>
-        </w:rPr>
-        <w:t xml:space="preserve">, </w:t>
-      </w:r>
-      <w:r>
-        <w:rPr>
-          <w:rFonts w:ascii="Courier New" w:cs="Courier New" w:eastAsia="Courier New" w:hAnsi="Courier New"/>
-          <w:sz w:val="19"/>
-          <w:szCs w:val="19"/>
-        </w:rPr>
-        <w:t xml:space="preserve">RXPIP SEARCH term</w:t>
-      </w:r>
-      <w:r>
-        <w:rPr>
-          <w:rFonts w:ascii="Times New Roman" w:cs="Times New Roman" w:eastAsia="Times New Roman" w:hAnsi="Times New Roman"/>
-        </w:rPr>
-        <w:t xml:space="preserve"> and </w:t>
-      </w:r>
-      <w:r>
-        <w:rPr>
-          <w:rFonts w:ascii="Courier New" w:cs="Courier New" w:eastAsia="Courier New" w:hAnsi="Courier New"/>
-          <w:sz w:val="19"/>
-          <w:szCs w:val="19"/>
-        </w:rPr>
-        <w:t xml:space="preserve">RXPIP SHOW name</w:t>
-      </w:r>
-      <w:r>
-        <w:rPr>
-          <w:rFonts w:ascii="Times New Roman" w:cs="Times New Roman" w:eastAsia="Times New Roman" w:hAnsi="Times New Roman"/>
-        </w:rPr>
-        <w:t xml:space="preserve"> ask the repository. </w:t>
-      </w:r>
-      <w:r>
-        <w:rPr>
-          <w:rFonts w:ascii="Courier New" w:cs="Courier New" w:eastAsia="Courier New" w:hAnsi="Courier New"/>
-          <w:sz w:val="19"/>
-          <w:szCs w:val="19"/>
-        </w:rPr>
-        <w:t xml:space="preserve">RXPIP BUILD fn</w:t>
-      </w:r>
-      <w:r>
-        <w:rPr>
-          <w:rFonts w:ascii="Times New Roman" w:cs="Times New Roman" w:eastAsia="Times New Roman" w:hAnsi="Times New Roman"/>
-        </w:rPr>
-        <w:t xml:space="preserve"> takes </w:t>
-      </w:r>
-      <w:r>
-        <w:rPr>
-          <w:rFonts w:ascii="Courier New" w:cs="Courier New" w:eastAsia="Courier New" w:hAnsi="Courier New"/>
-          <w:sz w:val="19"/>
-          <w:szCs w:val="19"/>
-        </w:rPr>
-        <w:t xml:space="preserve">fn REXX</w:t>
-      </w:r>
-      <w:r>
-        <w:rPr>
-          <w:rFonts w:ascii="Times New Roman" w:cs="Times New Roman" w:eastAsia="Times New Roman" w:hAnsi="Times New Roman"/>
-        </w:rPr>
-        <w:t xml:space="preserve">, installs the packages it requires and writes </w:t>
-      </w:r>
-      <w:r>
-        <w:rPr>
-          <w:rFonts w:ascii="Courier New" w:cs="Courier New" w:eastAsia="Courier New" w:hAnsi="Courier New"/>
-          <w:sz w:val="19"/>
-          <w:szCs w:val="19"/>
-        </w:rPr>
-        <w:t xml:space="preserve">fn EXEC A</w:t>
-      </w:r>
-      <w:r>
-        <w:rPr>
-          <w:rFonts w:ascii="Times New Roman" w:cs="Times New Roman" w:eastAsia="Times New Roman" w:hAnsi="Times New Roman"/>
-        </w:rPr>
-        <w:t xml:space="preserve">, a standalone program with the packages merged in; </w:t>
-      </w:r>
-      <w:r>
-        <w:rPr>
-          <w:rFonts w:ascii="Courier New" w:cs="Courier New" w:eastAsia="Courier New" w:hAnsi="Courier New"/>
-          <w:sz w:val="19"/>
-          <w:szCs w:val="19"/>
-        </w:rPr>
-        <w:t xml:space="preserve">RXPIP RUN fn [args]</w:t>
-      </w:r>
-      <w:r>
-        <w:rPr>
-          <w:rFonts w:ascii="Times New Roman" w:cs="Times New Roman" w:eastAsia="Times New Roman" w:hAnsi="Times New Roman"/>
-        </w:rPr>
-        <w:t xml:space="preserve"> builds and runs it. </w:t>
-      </w:r>
-      <w:r>
-        <w:rPr>
-          <w:rFonts w:ascii="Courier New" w:cs="Courier New" w:eastAsia="Courier New" w:hAnsi="Courier New"/>
-          <w:sz w:val="19"/>
-          <w:szCs w:val="19"/>
-        </w:rPr>
-        <w:t xml:space="preserve">RXPIP GET name</w:t>
-      </w:r>
-      <w:r>
-        <w:rPr>
-          <w:rFonts w:ascii="Times New Roman" w:cs="Times New Roman" w:eastAsia="Times New Roman" w:hAnsi="Times New Roman"/>
-        </w:rPr>
-        <w:t xml:space="preserve"> fetches a package as </w:t>
-      </w:r>
-      <w:r>
-        <w:rPr>
-          <w:rFonts w:ascii="Courier New" w:cs="Courier New" w:eastAsia="Courier New" w:hAnsi="Courier New"/>
-          <w:sz w:val="19"/>
-          <w:szCs w:val="19"/>
-        </w:rPr>
-        <w:t xml:space="preserve">file REXX A</w:t>
-      </w:r>
-      <w:r>
-        <w:rPr>
-          <w:rFonts w:ascii="Times New Roman" w:cs="Times New Roman" w:eastAsia="Times New Roman" w:hAnsi="Times New Roman"/>
-        </w:rPr>
-        <w:t xml:space="preserve">.</w:t>
+        <w:t xml:space="preserve">TELL user AT NET message</w:t>
+      </w:r>
+      <w:r>
+        <w:rPr>
+          <w:rFonts w:ascii="Times New Roman" w:cs="Times New Roman" w:eastAsia="Times New Roman" w:hAnsi="Times New Roman"/>
+        </w:rPr>
+        <w:t xml:space="preserve"> reaches a user on the internet. The message is published on the MQTT broker of the Debian guest as topic </w:t>
+      </w:r>
+      <w:r>
+        <w:rPr>
+          <w:rFonts w:ascii="Courier New" w:cs="Courier New" w:eastAsia="Courier New" w:hAnsi="Courier New"/>
+          <w:sz w:val="19"/>
+          <w:szCs w:val="19"/>
+        </w:rPr>
+        <w:t xml:space="preserve">vm/tell/out/user</w:t>
+      </w:r>
+      <w:r>
+        <w:rPr>
+          <w:rFonts w:ascii="Times New Roman" w:cs="Times New Roman" w:eastAsia="Times New Roman" w:hAnsi="Times New Roman"/>
+        </w:rPr>
+        <w:t xml:space="preserve">, which the user reads with any MQTT client. The user answers by publishing to </w:t>
+      </w:r>
+      <w:r>
+        <w:rPr>
+          <w:rFonts w:ascii="Courier New" w:cs="Courier New" w:eastAsia="Courier New" w:hAnsi="Courier New"/>
+          <w:sz w:val="19"/>
+          <w:szCs w:val="19"/>
+        </w:rPr>
+        <w:t xml:space="preserve">vm/tell/from/user/to/userid</w:t>
+      </w:r>
+      <w:r>
+        <w:rPr>
+          <w:rFonts w:ascii="Times New Roman" w:cs="Times New Roman" w:eastAsia="Times New Roman" w:hAnsi="Times New Roman"/>
+        </w:rPr>
+        <w:t xml:space="preserve">; it arrives as </w:t>
+      </w:r>
+      <w:r>
+        <w:rPr>
+          <w:rFonts w:ascii="Courier New" w:cs="Courier New" w:eastAsia="Courier New" w:hAnsi="Courier New"/>
+          <w:sz w:val="19"/>
+          <w:szCs w:val="19"/>
+        </w:rPr>
+        <w:t xml:space="preserve">MSG FROM MAINT: (net:user) message</w:t>
+      </w:r>
+      <w:r>
+        <w:rPr>
+          <w:rFonts w:ascii="Times New Roman" w:cs="Times New Roman" w:eastAsia="Times New Roman" w:hAnsi="Times New Roman"/>
+        </w:rPr>
+        <w:t xml:space="preserve">. Outside users need a login (</w:t>
+      </w:r>
+      <w:r>
+        <w:rPr>
+          <w:rFonts w:ascii="Courier New" w:cs="Courier New" w:eastAsia="Courier New" w:hAnsi="Courier New"/>
+          <w:sz w:val="19"/>
+          <w:szCs w:val="19"/>
+        </w:rPr>
+        <w:t xml:space="preserve">tellnet-user name password</w:t>
+      </w:r>
+      <w:r>
+        <w:rPr>
+          <w:rFonts w:ascii="Times New Roman" w:cs="Times New Roman" w:eastAsia="Times New Roman" w:hAnsi="Times New Roman"/>
+        </w:rPr>
+        <w:t xml:space="preserve"> in the guest) and may only use their own TELL topics. On the PC, </w:t>
+      </w:r>
+      <w:r>
+        <w:rPr>
+          <w:rFonts w:ascii="Courier New" w:cs="Courier New" w:eastAsia="Courier New" w:hAnsi="Courier New"/>
+          <w:sz w:val="19"/>
+          <w:szCs w:val="19"/>
+        </w:rPr>
+        <w:t xml:space="preserve">tools/netfwd.py --tls cert key 8883 10.1.1.2:1883</w:t>
+      </w:r>
+      <w:r>
+        <w:rPr>
+          <w:rFonts w:ascii="Times New Roman" w:cs="Times New Roman" w:eastAsia="Times New Roman" w:hAnsi="Times New Roman"/>
+        </w:rPr>
+        <w:t xml:space="preserve"> makes the broker reachable, encrypted; the router has to forward that port to the PC. </w:t>
+      </w:r>
+      <w:r>
+        <w:rPr>
+          <w:rFonts w:ascii="Courier New" w:cs="Courier New" w:eastAsia="Courier New" w:hAnsi="Courier New"/>
+          <w:sz w:val="19"/>
+          <w:szCs w:val="19"/>
+        </w:rPr>
+        <w:t xml:space="preserve">tools/nettell.py</w:t>
+      </w:r>
+      <w:r>
+        <w:rPr>
+          <w:rFonts w:ascii="Times New Roman" w:cs="Times New Roman" w:eastAsia="Times New Roman" w:hAnsi="Times New Roman"/>
+        </w:rPr>
+        <w:t xml:space="preserve"> is a small client for the outside user.</w:t>
       </w:r>
     </w:p>
     <w:tbl>
@@ -15598,7 +15672,7 @@
                 <w:sz w:val="17"/>
                 <w:szCs w:val="17"/>
               </w:rPr>
-              <w:t xml:space="preserve">rxpip run demo</w:t>
+              <w:t xml:space="preserve">mqtt sub vm/test 1 20</w:t>
             </w:r>
           </w:p>
           <w:p>
@@ -15611,59 +15685,7 @@
                 <w:sz w:val="17"/>
                 <w:szCs w:val="17"/>
               </w:rPr>
-              <w:t xml:space="preserve">rxpip: mathutils 1.0.0 already installed</w:t>
-            </w:r>
-          </w:p>
-          <w:p>
-            <w:pPr>
-              <w:spacing w:after="0" w:line="228"/>
-            </w:pPr>
-            <w:r>
-              <w:rPr>
-                <w:rFonts w:ascii="Courier New" w:cs="Courier New" w:eastAsia="Courier New" w:hAnsi="Courier New"/>
-                <w:sz w:val="17"/>
-                <w:szCs w:val="17"/>
-              </w:rPr>
-              <w:t xml:space="preserve">rxpip: greetutils 1.0.0 already installed</w:t>
-            </w:r>
-          </w:p>
-          <w:p>
-            <w:pPr>
-              <w:spacing w:after="0" w:line="228"/>
-            </w:pPr>
-            <w:r>
-              <w:rPr>
-                <w:rFonts w:ascii="Courier New" w:cs="Courier New" w:eastAsia="Courier New" w:hAnsi="Courier New"/>
-                <w:sz w:val="17"/>
-                <w:szCs w:val="17"/>
-              </w:rPr>
-              <w:t xml:space="preserve">RXPIP: DEMO EXEC A written, 71 lines</w:t>
-            </w:r>
-          </w:p>
-          <w:p>
-            <w:pPr>
-              <w:spacing w:after="0" w:line="228"/>
-            </w:pPr>
-            <w:r>
-              <w:rPr>
-                <w:rFonts w:ascii="Courier New" w:cs="Courier New" w:eastAsia="Courier New" w:hAnsi="Courier New"/>
-                <w:sz w:val="17"/>
-                <w:szCs w:val="17"/>
-              </w:rPr>
-              <w:t xml:space="preserve">HELLO, WORLD!!!</w:t>
-            </w:r>
-          </w:p>
-          <w:p>
-            <w:pPr>
-              <w:spacing w:after="0" w:line="228"/>
-            </w:pPr>
-            <w:r>
-              <w:rPr>
-                <w:rFonts w:ascii="Courier New" w:cs="Courier New" w:eastAsia="Courier New" w:hAnsi="Courier New"/>
-                <w:sz w:val="17"/>
-                <w:szCs w:val="17"/>
-              </w:rPr>
-              <w:t xml:space="preserve">square of 7 is 49</w:t>
+              <w:t xml:space="preserve">vm/test hello from linux</w:t>
             </w:r>
           </w:p>
           <w:p>
@@ -15695,6 +15717,331 @@
           <w:szCs w:val="18"/>
         </w:rPr>
         <w:t xml:space="preserve">Figure 26. </w:t>
+      </w:r>
+      <w:r>
+        <w:rPr>
+          <w:rFonts w:ascii="Arial" w:cs="Arial" w:eastAsia="Arial" w:hAnsi="Arial"/>
+          <w:sz w:val="18"/>
+          <w:szCs w:val="18"/>
+        </w:rPr>
+        <w:t xml:space="preserve">A message from Linux arrives on CMS</w:t>
+      </w:r>
+    </w:p>
+    <w:p>
+      <w:pPr>
+        <w:pStyle w:val="Heading2"/>
+      </w:pPr>
+      <w:r>
+        <w:t xml:space="preserve">RXPIP: REXX packages</w:t>
+      </w:r>
+    </w:p>
+    <w:p>
+      <w:pPr>
+        <w:spacing w:after="120"/>
+      </w:pPr>
+      <w:r>
+        <w:rPr>
+          <w:rFonts w:ascii="Times New Roman" w:cs="Times New Roman" w:eastAsia="Times New Roman" w:hAnsi="Times New Roman"/>
+        </w:rPr>
+        <w:t xml:space="preserve">RXPIP is the package manager of rexxpository: REXX routines are published as packages, and a program names what it needs with </w:t>
+      </w:r>
+      <w:r>
+        <w:rPr>
+          <w:rFonts w:ascii="Courier New" w:cs="Courier New" w:eastAsia="Courier New" w:hAnsi="Courier New"/>
+          <w:sz w:val="19"/>
+          <w:szCs w:val="19"/>
+        </w:rPr>
+        <w:t xml:space="preserve">/* REQUIRE pkg */</w:t>
+      </w:r>
+      <w:r>
+        <w:rPr>
+          <w:rFonts w:ascii="Times New Roman" w:cs="Times New Roman" w:eastAsia="Times New Roman" w:hAnsi="Times New Roman"/>
+        </w:rPr>
+        <w:t xml:space="preserve"> comments. The repository server and the rxpip client run in the Debian guest; the bridge service </w:t>
+      </w:r>
+      <w:r>
+        <w:rPr>
+          <w:rFonts w:ascii="Courier New" w:cs="Courier New" w:eastAsia="Courier New" w:hAnsi="Courier New"/>
+          <w:sz w:val="19"/>
+          <w:szCs w:val="19"/>
+        </w:rPr>
+        <w:t xml:space="preserve">rxpip</w:t>
+      </w:r>
+      <w:r>
+        <w:rPr>
+          <w:rFonts w:ascii="Times New Roman" w:cs="Times New Roman" w:eastAsia="Times New Roman" w:hAnsi="Times New Roman"/>
+        </w:rPr>
+        <w:t xml:space="preserve"> serves CMS users.</w:t>
+      </w:r>
+    </w:p>
+    <w:p>
+      <w:pPr>
+        <w:spacing w:after="120"/>
+      </w:pPr>
+      <w:r>
+        <w:rPr>
+          <w:rFonts w:ascii="Courier New" w:cs="Courier New" w:eastAsia="Courier New" w:hAnsi="Courier New"/>
+          <w:sz w:val="19"/>
+          <w:szCs w:val="19"/>
+        </w:rPr>
+        <w:t xml:space="preserve">RXPIP AVAIL</w:t>
+      </w:r>
+      <w:r>
+        <w:rPr>
+          <w:rFonts w:ascii="Times New Roman" w:cs="Times New Roman" w:eastAsia="Times New Roman" w:hAnsi="Times New Roman"/>
+        </w:rPr>
+        <w:t xml:space="preserve">, </w:t>
+      </w:r>
+      <w:r>
+        <w:rPr>
+          <w:rFonts w:ascii="Courier New" w:cs="Courier New" w:eastAsia="Courier New" w:hAnsi="Courier New"/>
+          <w:sz w:val="19"/>
+          <w:szCs w:val="19"/>
+        </w:rPr>
+        <w:t xml:space="preserve">RXPIP SEARCH term</w:t>
+      </w:r>
+      <w:r>
+        <w:rPr>
+          <w:rFonts w:ascii="Times New Roman" w:cs="Times New Roman" w:eastAsia="Times New Roman" w:hAnsi="Times New Roman"/>
+        </w:rPr>
+        <w:t xml:space="preserve"> and </w:t>
+      </w:r>
+      <w:r>
+        <w:rPr>
+          <w:rFonts w:ascii="Courier New" w:cs="Courier New" w:eastAsia="Courier New" w:hAnsi="Courier New"/>
+          <w:sz w:val="19"/>
+          <w:szCs w:val="19"/>
+        </w:rPr>
+        <w:t xml:space="preserve">RXPIP SHOW name</w:t>
+      </w:r>
+      <w:r>
+        <w:rPr>
+          <w:rFonts w:ascii="Times New Roman" w:cs="Times New Roman" w:eastAsia="Times New Roman" w:hAnsi="Times New Roman"/>
+        </w:rPr>
+        <w:t xml:space="preserve"> ask the repository. </w:t>
+      </w:r>
+      <w:r>
+        <w:rPr>
+          <w:rFonts w:ascii="Courier New" w:cs="Courier New" w:eastAsia="Courier New" w:hAnsi="Courier New"/>
+          <w:sz w:val="19"/>
+          <w:szCs w:val="19"/>
+        </w:rPr>
+        <w:t xml:space="preserve">RXPIP BUILD fn</w:t>
+      </w:r>
+      <w:r>
+        <w:rPr>
+          <w:rFonts w:ascii="Times New Roman" w:cs="Times New Roman" w:eastAsia="Times New Roman" w:hAnsi="Times New Roman"/>
+        </w:rPr>
+        <w:t xml:space="preserve"> takes </w:t>
+      </w:r>
+      <w:r>
+        <w:rPr>
+          <w:rFonts w:ascii="Courier New" w:cs="Courier New" w:eastAsia="Courier New" w:hAnsi="Courier New"/>
+          <w:sz w:val="19"/>
+          <w:szCs w:val="19"/>
+        </w:rPr>
+        <w:t xml:space="preserve">fn REXX</w:t>
+      </w:r>
+      <w:r>
+        <w:rPr>
+          <w:rFonts w:ascii="Times New Roman" w:cs="Times New Roman" w:eastAsia="Times New Roman" w:hAnsi="Times New Roman"/>
+        </w:rPr>
+        <w:t xml:space="preserve">, installs the packages it requires and writes </w:t>
+      </w:r>
+      <w:r>
+        <w:rPr>
+          <w:rFonts w:ascii="Courier New" w:cs="Courier New" w:eastAsia="Courier New" w:hAnsi="Courier New"/>
+          <w:sz w:val="19"/>
+          <w:szCs w:val="19"/>
+        </w:rPr>
+        <w:t xml:space="preserve">fn EXEC A</w:t>
+      </w:r>
+      <w:r>
+        <w:rPr>
+          <w:rFonts w:ascii="Times New Roman" w:cs="Times New Roman" w:eastAsia="Times New Roman" w:hAnsi="Times New Roman"/>
+        </w:rPr>
+        <w:t xml:space="preserve">, a standalone program with the packages merged in; </w:t>
+      </w:r>
+      <w:r>
+        <w:rPr>
+          <w:rFonts w:ascii="Courier New" w:cs="Courier New" w:eastAsia="Courier New" w:hAnsi="Courier New"/>
+          <w:sz w:val="19"/>
+          <w:szCs w:val="19"/>
+        </w:rPr>
+        <w:t xml:space="preserve">RXPIP RUN fn [args]</w:t>
+      </w:r>
+      <w:r>
+        <w:rPr>
+          <w:rFonts w:ascii="Times New Roman" w:cs="Times New Roman" w:eastAsia="Times New Roman" w:hAnsi="Times New Roman"/>
+        </w:rPr>
+        <w:t xml:space="preserve"> builds and runs it. </w:t>
+      </w:r>
+      <w:r>
+        <w:rPr>
+          <w:rFonts w:ascii="Courier New" w:cs="Courier New" w:eastAsia="Courier New" w:hAnsi="Courier New"/>
+          <w:sz w:val="19"/>
+          <w:szCs w:val="19"/>
+        </w:rPr>
+        <w:t xml:space="preserve">RXPIP GET name</w:t>
+      </w:r>
+      <w:r>
+        <w:rPr>
+          <w:rFonts w:ascii="Times New Roman" w:cs="Times New Roman" w:eastAsia="Times New Roman" w:hAnsi="Times New Roman"/>
+        </w:rPr>
+        <w:t xml:space="preserve"> fetches a package as </w:t>
+      </w:r>
+      <w:r>
+        <w:rPr>
+          <w:rFonts w:ascii="Courier New" w:cs="Courier New" w:eastAsia="Courier New" w:hAnsi="Courier New"/>
+          <w:sz w:val="19"/>
+          <w:szCs w:val="19"/>
+        </w:rPr>
+        <w:t xml:space="preserve">file REXX A</w:t>
+      </w:r>
+      <w:r>
+        <w:rPr>
+          <w:rFonts w:ascii="Times New Roman" w:cs="Times New Roman" w:eastAsia="Times New Roman" w:hAnsi="Times New Roman"/>
+        </w:rPr>
+        <w:t xml:space="preserve">.</w:t>
+      </w:r>
+    </w:p>
+    <w:tbl>
+      <w:tblPr>
+        <w:tblW w:type="dxa" w:w="9638"/>
+        <w:tblBorders>
+          <w:top w:val="single" w:color="auto" w:sz="4"/>
+          <w:left w:val="single" w:color="auto" w:sz="4"/>
+          <w:bottom w:val="single" w:color="auto" w:sz="4"/>
+          <w:right w:val="single" w:color="auto" w:sz="4"/>
+          <w:insideH w:val="single" w:color="auto" w:sz="4"/>
+          <w:insideV w:val="single" w:color="auto" w:sz="4"/>
+        </w:tblBorders>
+      </w:tblPr>
+      <w:tblGrid>
+        <w:gridCol w:w="9638"/>
+      </w:tblGrid>
+      <w:tr>
+        <w:trPr>
+          <w:cantSplit/>
+        </w:trPr>
+        <w:tc>
+          <w:tcPr>
+            <w:tcW w:type="dxa" w:w="9638"/>
+            <w:shd w:fill="F2F2F2" w:color="auto" w:val="clear"/>
+            <w:tcMar>
+              <w:top w:type="dxa" w:w="100"/>
+              <w:left w:type="dxa" w:w="140"/>
+              <w:bottom w:type="dxa" w:w="100"/>
+              <w:right w:type="dxa" w:w="140"/>
+            </w:tcMar>
+          </w:tcPr>
+          <w:p>
+            <w:pPr>
+              <w:spacing w:after="0" w:line="228"/>
+            </w:pPr>
+            <w:r>
+              <w:rPr>
+                <w:rFonts w:ascii="Courier New" w:cs="Courier New" w:eastAsia="Courier New" w:hAnsi="Courier New"/>
+                <w:sz w:val="17"/>
+                <w:szCs w:val="17"/>
+              </w:rPr>
+              <w:t xml:space="preserve">rxpip run demo</w:t>
+            </w:r>
+          </w:p>
+          <w:p>
+            <w:pPr>
+              <w:spacing w:after="0" w:line="228"/>
+            </w:pPr>
+            <w:r>
+              <w:rPr>
+                <w:rFonts w:ascii="Courier New" w:cs="Courier New" w:eastAsia="Courier New" w:hAnsi="Courier New"/>
+                <w:sz w:val="17"/>
+                <w:szCs w:val="17"/>
+              </w:rPr>
+              <w:t xml:space="preserve">rxpip: mathutils 1.0.0 already installed</w:t>
+            </w:r>
+          </w:p>
+          <w:p>
+            <w:pPr>
+              <w:spacing w:after="0" w:line="228"/>
+            </w:pPr>
+            <w:r>
+              <w:rPr>
+                <w:rFonts w:ascii="Courier New" w:cs="Courier New" w:eastAsia="Courier New" w:hAnsi="Courier New"/>
+                <w:sz w:val="17"/>
+                <w:szCs w:val="17"/>
+              </w:rPr>
+              <w:t xml:space="preserve">rxpip: greetutils 1.0.0 already installed</w:t>
+            </w:r>
+          </w:p>
+          <w:p>
+            <w:pPr>
+              <w:spacing w:after="0" w:line="228"/>
+            </w:pPr>
+            <w:r>
+              <w:rPr>
+                <w:rFonts w:ascii="Courier New" w:cs="Courier New" w:eastAsia="Courier New" w:hAnsi="Courier New"/>
+                <w:sz w:val="17"/>
+                <w:szCs w:val="17"/>
+              </w:rPr>
+              <w:t xml:space="preserve">RXPIP: DEMO EXEC A written, 71 lines</w:t>
+            </w:r>
+          </w:p>
+          <w:p>
+            <w:pPr>
+              <w:spacing w:after="0" w:line="228"/>
+            </w:pPr>
+            <w:r>
+              <w:rPr>
+                <w:rFonts w:ascii="Courier New" w:cs="Courier New" w:eastAsia="Courier New" w:hAnsi="Courier New"/>
+                <w:sz w:val="17"/>
+                <w:szCs w:val="17"/>
+              </w:rPr>
+              <w:t xml:space="preserve">HELLO, WORLD!!!</w:t>
+            </w:r>
+          </w:p>
+          <w:p>
+            <w:pPr>
+              <w:spacing w:after="0" w:line="228"/>
+            </w:pPr>
+            <w:r>
+              <w:rPr>
+                <w:rFonts w:ascii="Courier New" w:cs="Courier New" w:eastAsia="Courier New" w:hAnsi="Courier New"/>
+                <w:sz w:val="17"/>
+                <w:szCs w:val="17"/>
+              </w:rPr>
+              <w:t xml:space="preserve">square of 7 is 49</w:t>
+            </w:r>
+          </w:p>
+          <w:p>
+            <w:pPr>
+              <w:spacing w:after="0" w:line="228"/>
+            </w:pPr>
+            <w:r>
+              <w:rPr>
+                <w:rFonts w:ascii="Courier New" w:cs="Courier New" w:eastAsia="Courier New" w:hAnsi="Courier New"/>
+                <w:sz w:val="17"/>
+                <w:szCs w:val="17"/>
+              </w:rPr>
+              <w:t xml:space="preserve">Ready;</w:t>
+            </w:r>
+          </w:p>
+        </w:tc>
+      </w:tr>
+    </w:tbl>
+    <w:p>
+      <w:pPr>
+        <w:spacing w:after="200" w:before="80"/>
+      </w:pPr>
+      <w:r>
+        <w:rPr>
+          <w:rFonts w:ascii="Arial" w:cs="Arial" w:eastAsia="Arial" w:hAnsi="Arial"/>
+          <w:b/>
+          <w:bCs/>
+          <w:sz w:val="18"/>
+          <w:szCs w:val="18"/>
+        </w:rPr>
+        <w:t xml:space="preserve">Figure 27. </w:t>
       </w:r>
       <w:r>
         <w:rPr>
@@ -15988,7 +16335,7 @@
           <w:sz w:val="18"/>
           <w:szCs w:val="18"/>
         </w:rPr>
-        <w:t xml:space="preserve">Figure 27. </w:t>
+        <w:t xml:space="preserve">Figure 28. </w:t>
       </w:r>
       <w:r>
         <w:rPr>
@@ -16226,7 +16573,7 @@
           <w:sz w:val="18"/>
           <w:szCs w:val="18"/>
         </w:rPr>
-        <w:t xml:space="preserve">Figure 28. </w:t>
+        <w:t xml:space="preserve">Figure 29. </w:t>
       </w:r>
       <w:r>
         <w:rPr>
@@ -16636,7 +16983,7 @@
           <w:sz w:val="18"/>
           <w:szCs w:val="18"/>
         </w:rPr>
-        <w:t xml:space="preserve">Figure 29. </w:t>
+        <w:t xml:space="preserve">Figure 30. </w:t>
       </w:r>
       <w:r>
         <w:rPr>
@@ -16901,7 +17248,7 @@
           <w:sz w:val="18"/>
           <w:szCs w:val="18"/>
         </w:rPr>
-        <w:t xml:space="preserve">Figure 30. </w:t>
+        <w:t xml:space="preserve">Figure 31. </w:t>
       </w:r>
       <w:r>
         <w:rPr>
@@ -17975,7 +18322,7 @@
           <w:sz w:val="18"/>
           <w:szCs w:val="18"/>
         </w:rPr>
-        <w:t xml:space="preserve">Figure 31. </w:t>
+        <w:t xml:space="preserve">Figure 32. </w:t>
       </w:r>
       <w:r>
         <w:rPr>
@@ -18605,7 +18952,7 @@
           <w:sz w:val="18"/>
           <w:szCs w:val="18"/>
         </w:rPr>
-        <w:t xml:space="preserve">Figure 32. </w:t>
+        <w:t xml:space="preserve">Figure 33. </w:t>
       </w:r>
       <w:r>
         <w:rPr>
@@ -19115,7 +19462,7 @@
           <w:sz w:val="18"/>
           <w:szCs w:val="18"/>
         </w:rPr>
-        <w:t xml:space="preserve">Figure 33. </w:t>
+        <w:t xml:space="preserve">Figure 34. </w:t>
       </w:r>
       <w:r>
         <w:rPr>
@@ -19414,7 +19761,7 @@
           <w:sz w:val="18"/>
           <w:szCs w:val="18"/>
         </w:rPr>
-        <w:t xml:space="preserve">Figure 34. </w:t>
+        <w:t xml:space="preserve">Figure 35. </w:t>
       </w:r>
       <w:r>
         <w:rPr>
@@ -19979,7 +20326,7 @@
           <w:sz w:val="18"/>
           <w:szCs w:val="18"/>
         </w:rPr>
-        <w:t xml:space="preserve">Figure 35. </w:t>
+        <w:t xml:space="preserve">Figure 36. </w:t>
       </w:r>
       <w:r>
         <w:rPr>
@@ -20126,7 +20473,7 @@
           <w:sz w:val="18"/>
           <w:szCs w:val="18"/>
         </w:rPr>
-        <w:t xml:space="preserve">Figure 36. </w:t>
+        <w:t xml:space="preserve">Figure 37. </w:t>
       </w:r>
       <w:r>
         <w:rPr>
@@ -20502,7 +20849,7 @@
           <w:sz w:val="18"/>
           <w:szCs w:val="18"/>
         </w:rPr>
-        <w:t xml:space="preserve">Figure 37. </w:t>
+        <w:t xml:space="preserve">Figure 38. </w:t>
       </w:r>
       <w:r>
         <w:rPr>
@@ -21723,7 +22070,7 @@
           <w:sz w:val="18"/>
           <w:szCs w:val="18"/>
         </w:rPr>
-        <w:t xml:space="preserve">Figure 38. </w:t>
+        <w:t xml:space="preserve">Figure 39. </w:t>
       </w:r>
       <w:r>
         <w:rPr>
@@ -22502,7 +22849,7 @@
           <w:sz w:val="18"/>
           <w:szCs w:val="18"/>
         </w:rPr>
-        <w:t xml:space="preserve">Figure 39. </w:t>
+        <w:t xml:space="preserve">Figure 40. </w:t>
       </w:r>
       <w:r>
         <w:rPr>
@@ -22636,7 +22983,7 @@
           <w:sz w:val="18"/>
           <w:szCs w:val="18"/>
         </w:rPr>
-        <w:t xml:space="preserve">Figure 40. </w:t>
+        <w:t xml:space="preserve">Figure 41. </w:t>
       </w:r>
       <w:r>
         <w:rPr>
@@ -23309,7 +23656,7 @@
           <w:sz w:val="18"/>
           <w:szCs w:val="18"/>
         </w:rPr>
-        <w:t xml:space="preserve">Figure 41. </w:t>
+        <w:t xml:space="preserve">Figure 42. </w:t>
       </w:r>
       <w:r>
         <w:rPr>
@@ -23787,7 +24134,7 @@
           <w:sz w:val="18"/>
           <w:szCs w:val="18"/>
         </w:rPr>
-        <w:t xml:space="preserve">Figure 42. </w:t>
+        <w:t xml:space="preserve">Figure 43. </w:t>
       </w:r>
       <w:r>
         <w:rPr>
@@ -24951,7 +25298,7 @@
           <w:sz w:val="18"/>
           <w:szCs w:val="18"/>
         </w:rPr>
-        <w:t xml:space="preserve">Figure 43. </w:t>
+        <w:t xml:space="preserve">Figure 44. </w:t>
       </w:r>
       <w:r>
         <w:rPr>
@@ -25050,7 +25397,7 @@
           <w:sz w:val="18"/>
           <w:szCs w:val="18"/>
         </w:rPr>
-        <w:t xml:space="preserve">Figure 44. </w:t>
+        <w:t xml:space="preserve">Figure 45. </w:t>
       </w:r>
       <w:r>
         <w:rPr>
@@ -25193,7 +25540,7 @@
           <w:sz w:val="18"/>
           <w:szCs w:val="18"/>
         </w:rPr>
-        <w:t xml:space="preserve">Figure 45. </w:t>
+        <w:t xml:space="preserve">Figure 46. </w:t>
       </w:r>
       <w:r>
         <w:rPr>
@@ -25465,7 +25812,7 @@
           <w:sz w:val="18"/>
           <w:szCs w:val="18"/>
         </w:rPr>
-        <w:t xml:space="preserve">Figure 46. </w:t>
+        <w:t xml:space="preserve">Figure 47. </w:t>
       </w:r>
       <w:r>
         <w:rPr>
@@ -25707,7 +26054,7 @@
           <w:sz w:val="18"/>
           <w:szCs w:val="18"/>
         </w:rPr>
-        <w:t xml:space="preserve">Figure 47. </w:t>
+        <w:t xml:space="preserve">Figure 48. </w:t>
       </w:r>
       <w:r>
         <w:rPr>
@@ -25784,7 +26131,7 @@
           <w:sz w:val="18"/>
           <w:szCs w:val="18"/>
         </w:rPr>
-        <w:t xml:space="preserve">Figure 48. </w:t>
+        <w:t xml:space="preserve">Figure 49. </w:t>
       </w:r>
       <w:r>
         <w:rPr>
@@ -25914,7 +26261,7 @@
           <w:sz w:val="18"/>
           <w:szCs w:val="18"/>
         </w:rPr>
-        <w:t xml:space="preserve">Figure 49. </w:t>
+        <w:t xml:space="preserve">Figure 50. </w:t>
       </w:r>
       <w:r>
         <w:rPr>
@@ -26088,7 +26435,7 @@
           <w:sz w:val="18"/>
           <w:szCs w:val="18"/>
         </w:rPr>
-        <w:t xml:space="preserve">Figure 50. </w:t>
+        <w:t xml:space="preserve">Figure 51. </w:t>
       </w:r>
       <w:r>
         <w:rPr>
@@ -26178,7 +26525,7 @@
           <w:sz w:val="18"/>
           <w:szCs w:val="18"/>
         </w:rPr>
-        <w:t xml:space="preserve">Figure 51. </w:t>
+        <w:t xml:space="preserve">Figure 52. </w:t>
       </w:r>
       <w:r>
         <w:rPr>
@@ -26925,7 +27272,7 @@
           <w:sz w:val="18"/>
           <w:szCs w:val="18"/>
         </w:rPr>
-        <w:t xml:space="preserve">Figure 52. </w:t>
+        <w:t xml:space="preserve">Figure 53. </w:t>
       </w:r>
       <w:r>
         <w:rPr>
@@ -27027,7 +27374,7 @@
           <w:sz w:val="18"/>
           <w:szCs w:val="18"/>
         </w:rPr>
-        <w:t xml:space="preserve">Figure 53. </w:t>
+        <w:t xml:space="preserve">Figure 54. </w:t>
       </w:r>
       <w:r>
         <w:rPr>
@@ -27202,7 +27549,7 @@
           <w:sz w:val="18"/>
           <w:szCs w:val="18"/>
         </w:rPr>
-        <w:t xml:space="preserve">Figure 54. </w:t>
+        <w:t xml:space="preserve">Figure 55. </w:t>
       </w:r>
       <w:r>
         <w:rPr>
@@ -27279,7 +27626,7 @@
           <w:sz w:val="18"/>
           <w:szCs w:val="18"/>
         </w:rPr>
-        <w:t xml:space="preserve">Figure 55. </w:t>
+        <w:t xml:space="preserve">Figure 56. </w:t>
       </w:r>
       <w:r>
         <w:rPr>
@@ -27559,7 +27906,7 @@
           <w:sz w:val="18"/>
           <w:szCs w:val="18"/>
         </w:rPr>
-        <w:t xml:space="preserve">Figure 56. </w:t>
+        <w:t xml:space="preserve">Figure 57. </w:t>
       </w:r>
       <w:r>
         <w:rPr>
@@ -27688,7 +28035,7 @@
           <w:sz w:val="18"/>
           <w:szCs w:val="18"/>
         </w:rPr>
-        <w:t xml:space="preserve">Figure 57. </w:t>
+        <w:t xml:space="preserve">Figure 58. </w:t>
       </w:r>
       <w:r>
         <w:rPr>
@@ -27920,7 +28267,7 @@
           <w:sz w:val="18"/>
           <w:szCs w:val="18"/>
         </w:rPr>
-        <w:t xml:space="preserve">Figure 58. </w:t>
+        <w:t xml:space="preserve">Figure 59. </w:t>
       </w:r>
       <w:r>
         <w:rPr>
@@ -28533,7 +28880,7 @@
           <w:sz w:val="18"/>
           <w:szCs w:val="18"/>
         </w:rPr>
-        <w:t xml:space="preserve">Figure 59. </w:t>
+        <w:t xml:space="preserve">Figure 60. </w:t>
       </w:r>
       <w:r>
         <w:rPr>
@@ -29241,7 +29588,7 @@
           <w:sz w:val="18"/>
           <w:szCs w:val="18"/>
         </w:rPr>
-        <w:t xml:space="preserve">Figure 60. </w:t>
+        <w:t xml:space="preserve">Figure 61. </w:t>
       </w:r>
       <w:r>
         <w:rPr>

</xml_diff>

<commit_message>
9.33 CP/M 2.2: RunCPM in the Debian guest (runcpm, cpm service) and natively on CMS (RUNCPM MODULE, CPM EXEC, CP/M programs on L:); M13 MVS rows; Guide
Co-Authored-By: Claude Opus 5.5 <noreply@anthropic.com>
Claude-Session: https://claude.ai/code/session_01JBNU8KnKzXkgscse8vw6so
</commit_message>
<xml_diff>
--- a/arch/31bit/manual/VM370PLUS-Guide.docx
+++ b/arch/31bit/manual/VM370PLUS-Guide.docx
@@ -1850,6 +1850,35 @@
         <w:tabs>
           <w:tab w:val="right" w:pos="9638" w:leader="dot"/>
         </w:tabs>
+        <w:spacing w:after="20" w:before="20"/>
+        <w:ind w:left="400"/>
+      </w:pPr>
+      <w:r>
+        <w:rPr>
+          <w:rFonts w:ascii="Times New Roman" w:cs="Times New Roman" w:eastAsia="Times New Roman" w:hAnsi="Times New Roman"/>
+          <w:b w:val="false"/>
+          <w:bCs w:val="false"/>
+          <w:sz w:val="20"/>
+          <w:szCs w:val="20"/>
+        </w:rPr>
+        <w:t xml:space="preserve">CP/M 2.2</w:t>
+      </w:r>
+      <w:r>
+        <w:rPr>
+          <w:rFonts w:ascii="Times New Roman" w:cs="Times New Roman" w:eastAsia="Times New Roman" w:hAnsi="Times New Roman"/>
+          <w:b w:val="false"/>
+          <w:bCs w:val="false"/>
+          <w:sz w:val="20"/>
+          <w:szCs w:val="20"/>
+        </w:rPr>
+        <w:t xml:space="preserve">	25</w:t>
+      </w:r>
+    </w:p>
+    <w:p>
+      <w:pPr>
+        <w:tabs>
+          <w:tab w:val="right" w:pos="9638" w:leader="dot"/>
+        </w:tabs>
         <w:spacing w:after="20" w:before="160"/>
         <w:ind w:left="0"/>
       </w:pPr>
@@ -2384,6 +2413,35 @@
           <w:szCs w:val="20"/>
         </w:rPr>
         <w:t xml:space="preserve">ZIP, UNZIP, GZIP</w:t>
+      </w:r>
+      <w:r>
+        <w:rPr>
+          <w:rFonts w:ascii="Times New Roman" w:cs="Times New Roman" w:eastAsia="Times New Roman" w:hAnsi="Times New Roman"/>
+          <w:b w:val="false"/>
+          <w:bCs w:val="false"/>
+          <w:sz w:val="20"/>
+          <w:szCs w:val="20"/>
+        </w:rPr>
+        <w:t xml:space="preserve">	32</w:t>
+      </w:r>
+    </w:p>
+    <w:p>
+      <w:pPr>
+        <w:tabs>
+          <w:tab w:val="right" w:pos="9638" w:leader="dot"/>
+        </w:tabs>
+        <w:spacing w:after="20" w:before="20"/>
+        <w:ind w:left="400"/>
+      </w:pPr>
+      <w:r>
+        <w:rPr>
+          <w:rFonts w:ascii="Times New Roman" w:cs="Times New Roman" w:eastAsia="Times New Roman" w:hAnsi="Times New Roman"/>
+          <w:b w:val="false"/>
+          <w:bCs w:val="false"/>
+          <w:sz w:val="20"/>
+          <w:szCs w:val="20"/>
+        </w:rPr>
+        <w:t xml:space="preserve">CPM</w:t>
       </w:r>
       <w:r>
         <w:rPr>
@@ -3120,6 +3178,44 @@
           <w:rFonts w:ascii="Times New Roman" w:cs="Times New Roman" w:eastAsia="Times New Roman" w:hAnsi="Times New Roman"/>
         </w:rPr>
         <w:t xml:space="preserve">This edition is kept up to date as VM/370plus grows; each change is listed here, newest first.</w:t>
+      </w:r>
+    </w:p>
+    <w:p>
+      <w:pPr>
+        <w:pStyle w:val="ListParagraph"/>
+        <w:numPr>
+          <w:ilvl w:val="0"/>
+          <w:numId w:val="2"/>
+        </w:numPr>
+        <w:spacing w:after="60"/>
+      </w:pPr>
+      <w:r>
+        <w:rPr>
+          <w:rFonts w:ascii="Times New Roman" w:cs="Times New Roman" w:eastAsia="Times New Roman" w:hAnsi="Times New Roman"/>
+          <w:b/>
+          <w:bCs/>
+        </w:rPr>
+        <w:t xml:space="preserve">13 October 2026, late evening.</w:t>
+      </w:r>
+      <w:r>
+        <w:rPr>
+          <w:rFonts w:ascii="Times New Roman" w:cs="Times New Roman" w:eastAsia="Times New Roman" w:hAnsi="Times New Roman"/>
+        </w:rPr>
+        <w:t xml:space="preserve"> CP/M 2.2 (Chapter 8): </w:t>
+      </w:r>
+      <w:r>
+        <w:rPr>
+          <w:rFonts w:ascii="Courier New" w:cs="Courier New" w:eastAsia="Courier New" w:hAnsi="Courier New"/>
+          <w:sz w:val="19"/>
+          <w:szCs w:val="19"/>
+        </w:rPr>
+        <w:t xml:space="preserve">CPM</w:t>
+      </w:r>
+      <w:r>
+        <w:rPr>
+          <w:rFonts w:ascii="Times New Roman" w:cs="Times New Roman" w:eastAsia="Times New Roman" w:hAnsi="Times New Roman"/>
+        </w:rPr>
+        <w:t xml:space="preserve"> runs CP/M on CMS, with the CP/M programs on the language disk, and in the Debian guest. TK5 (MVS 3.8j) and a 31-bit MVS are in the plan as M13.</w:t>
       </w:r>
     </w:p>
     <w:p>
@@ -22996,11 +23092,10 @@
     </w:p>
     <w:p>
       <w:pPr>
-        <w:pStyle w:val="Heading1"/>
-        <w:pageBreakBefore/>
+        <w:pStyle w:val="Heading2"/>
       </w:pPr>
       <w:r>
-        <w:t xml:space="preserve">Chapter 9. Documents and Printing</w:t>
+        <w:t xml:space="preserve">CP/M 2.2</w:t>
       </w:r>
     </w:p>
     <w:p>
@@ -23009,528 +23104,101 @@
       </w:pPr>
       <w:r>
         <w:rPr>
-          <w:rFonts w:ascii="Times New Roman" w:cs="Times New Roman" w:eastAsia="Times New Roman" w:hAnsi="Times New Roman"/>
-        </w:rPr>
-        <w:t xml:space="preserve">VM/370plus formats documents in the Debian guest through the spool bridge and gives the result back to CMS: plain text as a CMS file, PostScript as a CMS file that can be printed. Three formatters are there: troff, BookMaster markup and LaTeX.</w:t>
-      </w:r>
-    </w:p>
-    <w:p>
-      <w:pPr>
-        <w:pStyle w:val="Heading2"/>
-      </w:pPr>
-      <w:r>
-        <w:t xml:space="preserve">TROFF</w:t>
-      </w:r>
-    </w:p>
-    <w:p>
-      <w:pPr>
-        <w:spacing w:after="120"/>
-      </w:pPr>
-      <w:r>
-        <w:rPr>
-          <w:rFonts w:ascii="Courier New" w:cs="Courier New" w:eastAsia="Courier New" w:hAnsi="Courier New"/>
-          <w:sz w:val="19"/>
-          <w:szCs w:val="19"/>
-        </w:rPr>
-        <w:t xml:space="preserve">TROFF fn [ft [fm]] (MACROS m</w:t>
-      </w:r>
-      <w:r>
-        <w:rPr>
-          <w:rFonts w:ascii="Times New Roman" w:cs="Times New Roman" w:eastAsia="Times New Roman" w:hAnsi="Times New Roman"/>
-        </w:rPr>
-        <w:t xml:space="preserve"> formats a troff document (file type TROFF by default) with groff and the ms, me, mm, man or mom macros; the text comes back as </w:t>
-      </w:r>
-      <w:r>
-        <w:rPr>
-          <w:rFonts w:ascii="Courier New" w:cs="Courier New" w:eastAsia="Courier New" w:hAnsi="Courier New"/>
-          <w:sz w:val="19"/>
-          <w:szCs w:val="19"/>
-        </w:rPr>
-        <w:t xml:space="preserve">fn DOCUMENT A</w:t>
-      </w:r>
-      <w:r>
-        <w:rPr>
-          <w:rFonts w:ascii="Times New Roman" w:cs="Times New Roman" w:eastAsia="Times New Roman" w:hAnsi="Times New Roman"/>
-        </w:rPr>
-        <w:t xml:space="preserve">. With </w:t>
-      </w:r>
-      <w:r>
-        <w:rPr>
-          <w:rFonts w:ascii="Courier New" w:cs="Courier New" w:eastAsia="Courier New" w:hAnsi="Courier New"/>
-          <w:sz w:val="19"/>
-          <w:szCs w:val="19"/>
-        </w:rPr>
-        <w:t xml:space="preserve">(PS</w:t>
-      </w:r>
-      <w:r>
-        <w:rPr>
-          <w:rFonts w:ascii="Times New Roman" w:cs="Times New Roman" w:eastAsia="Times New Roman" w:hAnsi="Times New Roman"/>
-        </w:rPr>
-        <w:t xml:space="preserve"> the result is PostScript, </w:t>
-      </w:r>
-      <w:r>
-        <w:rPr>
-          <w:rFonts w:ascii="Courier New" w:cs="Courier New" w:eastAsia="Courier New" w:hAnsi="Courier New"/>
-          <w:sz w:val="19"/>
-          <w:szCs w:val="19"/>
-        </w:rPr>
-        <w:t xml:space="preserve">fn PS A</w:t>
-      </w:r>
-      <w:r>
-        <w:rPr>
-          <w:rFonts w:ascii="Times New Roman" w:cs="Times New Roman" w:eastAsia="Times New Roman" w:hAnsi="Times New Roman"/>
-        </w:rPr>
-        <w:t xml:space="preserve">.</w:t>
-      </w:r>
-    </w:p>
-    <w:p>
-      <w:pPr>
-        <w:pStyle w:val="Heading2"/>
-      </w:pPr>
-      <w:r>
-        <w:t xml:space="preserve">BOOKIE: BookMaster markup</w:t>
-      </w:r>
-    </w:p>
-    <w:p>
-      <w:pPr>
-        <w:spacing w:after="120"/>
-      </w:pPr>
-      <w:r>
-        <w:rPr>
-          <w:rFonts w:ascii="Times New Roman" w:cs="Times New Roman" w:eastAsia="Times New Roman" w:hAnsi="Times New Roman"/>
-        </w:rPr>
-        <w:t xml:space="preserve">BookMaster is IBM’s licensed program for GML markup. BOOKIE is our own formatter for that markup: </w:t>
-      </w:r>
-      <w:r>
-        <w:rPr>
-          <w:rFonts w:ascii="Courier New" w:cs="Courier New" w:eastAsia="Courier New" w:hAnsi="Courier New"/>
-          <w:sz w:val="19"/>
-          <w:szCs w:val="19"/>
-        </w:rPr>
-        <w:t xml:space="preserve">BOOKIE fn [ft [fm]]</w:t>
-      </w:r>
-      <w:r>
-        <w:rPr>
-          <w:rFonts w:ascii="Times New Roman" w:cs="Times New Roman" w:eastAsia="Times New Roman" w:hAnsi="Times New Roman"/>
-        </w:rPr>
-        <w:t xml:space="preserve"> (file type SCRIPT by default) gives </w:t>
-      </w:r>
-      <w:r>
-        <w:rPr>
-          <w:rFonts w:ascii="Courier New" w:cs="Courier New" w:eastAsia="Courier New" w:hAnsi="Courier New"/>
-          <w:sz w:val="19"/>
-          <w:szCs w:val="19"/>
-        </w:rPr>
-        <w:t xml:space="preserve">fn DOCUMENT A</w:t>
-      </w:r>
-      <w:r>
-        <w:rPr>
-          <w:rFonts w:ascii="Times New Roman" w:cs="Times New Roman" w:eastAsia="Times New Roman" w:hAnsi="Times New Roman"/>
-        </w:rPr>
-        <w:t xml:space="preserve">, </w:t>
-      </w:r>
-      <w:r>
-        <w:rPr>
-          <w:rFonts w:ascii="Courier New" w:cs="Courier New" w:eastAsia="Courier New" w:hAnsi="Courier New"/>
-          <w:sz w:val="19"/>
-          <w:szCs w:val="19"/>
-        </w:rPr>
-        <w:t xml:space="preserve">BOOKIE fn (PS</w:t>
-      </w:r>
-      <w:r>
-        <w:rPr>
-          <w:rFonts w:ascii="Times New Roman" w:cs="Times New Roman" w:eastAsia="Times New Roman" w:hAnsi="Times New Roman"/>
-        </w:rPr>
-        <w:t xml:space="preserve"> gives </w:t>
-      </w:r>
-      <w:r>
-        <w:rPr>
-          <w:rFonts w:ascii="Courier New" w:cs="Courier New" w:eastAsia="Courier New" w:hAnsi="Courier New"/>
-          <w:sz w:val="19"/>
-          <w:szCs w:val="19"/>
-        </w:rPr>
-        <w:t xml:space="preserve">fn PS A</w:t>
-      </w:r>
-      <w:r>
-        <w:rPr>
-          <w:rFonts w:ascii="Times New Roman" w:cs="Times New Roman" w:eastAsia="Times New Roman" w:hAnsi="Times New Roman"/>
-        </w:rPr>
-        <w:t xml:space="preserve">. Its style is the style of this Guide: a title page and an edition notice, a contents page with page numbers, chapters on new pages, running heads and feet, screens in framed boxes, tables and figures. This Guide is itself available as </w:t>
-      </w:r>
-      <w:r>
-        <w:rPr>
-          <w:rFonts w:ascii="Courier New" w:cs="Courier New" w:eastAsia="Courier New" w:hAnsi="Courier New"/>
-          <w:sz w:val="19"/>
-          <w:szCs w:val="19"/>
-        </w:rPr>
-        <w:t xml:space="preserve">GUIDE SCRIPT</w:t>
-      </w:r>
-      <w:r>
-        <w:rPr>
-          <w:rFonts w:ascii="Times New Roman" w:cs="Times New Roman" w:eastAsia="Times New Roman" w:hAnsi="Times New Roman"/>
-        </w:rPr>
-        <w:t xml:space="preserve"> and is formatted on VM/370plus with </w:t>
-      </w:r>
-      <w:r>
-        <w:rPr>
-          <w:rFonts w:ascii="Courier New" w:cs="Courier New" w:eastAsia="Courier New" w:hAnsi="Courier New"/>
-          <w:sz w:val="19"/>
-          <w:szCs w:val="19"/>
-        </w:rPr>
-        <w:t xml:space="preserve">BOOKIE GUIDE (PS</w:t>
-      </w:r>
-      <w:r>
-        <w:rPr>
-          <w:rFonts w:ascii="Times New Roman" w:cs="Times New Roman" w:eastAsia="Times New Roman" w:hAnsi="Times New Roman"/>
-        </w:rPr>
-        <w:t xml:space="preserve">.</w:t>
-      </w:r>
-    </w:p>
-    <w:p>
-      <w:pPr>
-        <w:spacing w:after="120"/>
-      </w:pPr>
-      <w:r>
-        <w:rPr>
-          <w:rFonts w:ascii="Times New Roman" w:cs="Times New Roman" w:eastAsia="Times New Roman" w:hAnsi="Times New Roman"/>
-        </w:rPr>
-        <w:t xml:space="preserve">The tags are those of BookMaster: </w:t>
-      </w:r>
-      <w:r>
-        <w:rPr>
-          <w:rFonts w:ascii="Courier New" w:cs="Courier New" w:eastAsia="Courier New" w:hAnsi="Courier New"/>
-          <w:sz w:val="19"/>
-          <w:szCs w:val="19"/>
-        </w:rPr>
-        <w:t xml:space="preserve">:userdoc</w:t>
-      </w:r>
-      <w:r>
-        <w:rPr>
-          <w:rFonts w:ascii="Times New Roman" w:cs="Times New Roman" w:eastAsia="Times New Roman" w:hAnsi="Times New Roman"/>
-        </w:rPr>
-        <w:t xml:space="preserve">, </w:t>
-      </w:r>
-      <w:r>
-        <w:rPr>
-          <w:rFonts w:ascii="Courier New" w:cs="Courier New" w:eastAsia="Courier New" w:hAnsi="Courier New"/>
-          <w:sz w:val="19"/>
-          <w:szCs w:val="19"/>
-        </w:rPr>
-        <w:t xml:space="preserve">:prolog</w:t>
-      </w:r>
-      <w:r>
-        <w:rPr>
-          <w:rFonts w:ascii="Times New Roman" w:cs="Times New Roman" w:eastAsia="Times New Roman" w:hAnsi="Times New Roman"/>
-        </w:rPr>
-        <w:t xml:space="preserve"> with </w:t>
-      </w:r>
-      <w:r>
-        <w:rPr>
-          <w:rFonts w:ascii="Courier New" w:cs="Courier New" w:eastAsia="Courier New" w:hAnsi="Courier New"/>
-          <w:sz w:val="19"/>
-          <w:szCs w:val="19"/>
-        </w:rPr>
-        <w:t xml:space="preserve">:title</w:t>
-      </w:r>
-      <w:r>
-        <w:rPr>
-          <w:rFonts w:ascii="Times New Roman" w:cs="Times New Roman" w:eastAsia="Times New Roman" w:hAnsi="Times New Roman"/>
-        </w:rPr>
-        <w:t xml:space="preserve">, </w:t>
-      </w:r>
-      <w:r>
-        <w:rPr>
-          <w:rFonts w:ascii="Courier New" w:cs="Courier New" w:eastAsia="Courier New" w:hAnsi="Courier New"/>
-          <w:sz w:val="19"/>
-          <w:szCs w:val="19"/>
-        </w:rPr>
-        <w:t xml:space="preserve">:docnum</w:t>
-      </w:r>
-      <w:r>
-        <w:rPr>
-          <w:rFonts w:ascii="Times New Roman" w:cs="Times New Roman" w:eastAsia="Times New Roman" w:hAnsi="Times New Roman"/>
-        </w:rPr>
-        <w:t xml:space="preserve"> and the title-page tags </w:t>
-      </w:r>
-      <w:r>
-        <w:rPr>
-          <w:rFonts w:ascii="Courier New" w:cs="Courier New" w:eastAsia="Courier New" w:hAnsi="Courier New"/>
-          <w:sz w:val="19"/>
-          <w:szCs w:val="19"/>
-        </w:rPr>
-        <w:t xml:space="preserve">:prodname :subtitle :version :based :filenum</w:t>
-      </w:r>
-      <w:r>
-        <w:rPr>
-          <w:rFonts w:ascii="Times New Roman" w:cs="Times New Roman" w:eastAsia="Times New Roman" w:hAnsi="Times New Roman"/>
-        </w:rPr>
-        <w:t xml:space="preserve">, </w:t>
-      </w:r>
-      <w:r>
-        <w:rPr>
-          <w:rFonts w:ascii="Courier New" w:cs="Courier New" w:eastAsia="Courier New" w:hAnsi="Courier New"/>
-          <w:sz w:val="19"/>
-          <w:szCs w:val="19"/>
-        </w:rPr>
-        <w:t xml:space="preserve">:frontm :tipage :edition :toc :body :appendix</w:t>
-      </w:r>
-      <w:r>
-        <w:rPr>
-          <w:rFonts w:ascii="Times New Roman" w:cs="Times New Roman" w:eastAsia="Times New Roman" w:hAnsi="Times New Roman"/>
-        </w:rPr>
-        <w:t xml:space="preserve">, headings </w:t>
-      </w:r>
-      <w:r>
-        <w:rPr>
-          <w:rFonts w:ascii="Courier New" w:cs="Courier New" w:eastAsia="Courier New" w:hAnsi="Courier New"/>
-          <w:sz w:val="19"/>
-          <w:szCs w:val="19"/>
-        </w:rPr>
-        <w:t xml:space="preserve">:h1</w:t>
-      </w:r>
-      <w:r>
-        <w:rPr>
-          <w:rFonts w:ascii="Times New Roman" w:cs="Times New Roman" w:eastAsia="Times New Roman" w:hAnsi="Times New Roman"/>
-        </w:rPr>
-        <w:t xml:space="preserve">–</w:t>
-      </w:r>
-      <w:r>
-        <w:rPr>
-          <w:rFonts w:ascii="Courier New" w:cs="Courier New" w:eastAsia="Courier New" w:hAnsi="Courier New"/>
-          <w:sz w:val="19"/>
-          <w:szCs w:val="19"/>
-        </w:rPr>
-        <w:t xml:space="preserve">:h6</w:t>
-      </w:r>
-      <w:r>
-        <w:rPr>
-          <w:rFonts w:ascii="Times New Roman" w:cs="Times New Roman" w:eastAsia="Times New Roman" w:hAnsi="Times New Roman"/>
-        </w:rPr>
-        <w:t xml:space="preserve">, </w:t>
-      </w:r>
-      <w:r>
-        <w:rPr>
-          <w:rFonts w:ascii="Courier New" w:cs="Courier New" w:eastAsia="Courier New" w:hAnsi="Courier New"/>
-          <w:sz w:val="19"/>
-          <w:szCs w:val="19"/>
-        </w:rPr>
-        <w:t xml:space="preserve">:p :note :attention</w:t>
-      </w:r>
-      <w:r>
-        <w:rPr>
-          <w:rFonts w:ascii="Times New Roman" w:cs="Times New Roman" w:eastAsia="Times New Roman" w:hAnsi="Times New Roman"/>
-        </w:rPr>
-        <w:t xml:space="preserve">, lists </w:t>
-      </w:r>
-      <w:r>
-        <w:rPr>
-          <w:rFonts w:ascii="Courier New" w:cs="Courier New" w:eastAsia="Courier New" w:hAnsi="Courier New"/>
-          <w:sz w:val="19"/>
-          <w:szCs w:val="19"/>
-        </w:rPr>
-        <w:t xml:space="preserve">:ol :ul :sl :li :dl :dt :dd</w:t>
-      </w:r>
-      <w:r>
-        <w:rPr>
-          <w:rFonts w:ascii="Times New Roman" w:cs="Times New Roman" w:eastAsia="Times New Roman" w:hAnsi="Times New Roman"/>
-        </w:rPr>
-        <w:t xml:space="preserve">, </w:t>
-      </w:r>
-      <w:r>
-        <w:rPr>
-          <w:rFonts w:ascii="Courier New" w:cs="Courier New" w:eastAsia="Courier New" w:hAnsi="Courier New"/>
-          <w:sz w:val="19"/>
-          <w:szCs w:val="19"/>
-        </w:rPr>
-        <w:t xml:space="preserve">:xmp</w:t>
-      </w:r>
-      <w:r>
-        <w:rPr>
-          <w:rFonts w:ascii="Times New Roman" w:cs="Times New Roman" w:eastAsia="Times New Roman" w:hAnsi="Times New Roman"/>
-        </w:rPr>
-        <w:t xml:space="preserve"> for screens, </w:t>
-      </w:r>
-      <w:r>
-        <w:rPr>
-          <w:rFonts w:ascii="Courier New" w:cs="Courier New" w:eastAsia="Courier New" w:hAnsi="Courier New"/>
-          <w:sz w:val="19"/>
-          <w:szCs w:val="19"/>
-        </w:rPr>
-        <w:t xml:space="preserve">:fig :figcap</w:t>
-      </w:r>
-      <w:r>
-        <w:rPr>
-          <w:rFonts w:ascii="Times New Roman" w:cs="Times New Roman" w:eastAsia="Times New Roman" w:hAnsi="Times New Roman"/>
-        </w:rPr>
-        <w:t xml:space="preserve">, </w:t>
-      </w:r>
-      <w:r>
-        <w:rPr>
-          <w:rFonts w:ascii="Courier New" w:cs="Courier New" w:eastAsia="Courier New" w:hAnsi="Courier New"/>
-          <w:sz w:val="19"/>
-          <w:szCs w:val="19"/>
-        </w:rPr>
-        <w:t xml:space="preserve">:table :row :c</w:t>
-      </w:r>
-      <w:r>
-        <w:rPr>
-          <w:rFonts w:ascii="Times New Roman" w:cs="Times New Roman" w:eastAsia="Times New Roman" w:hAnsi="Times New Roman"/>
-        </w:rPr>
-        <w:t xml:space="preserve">, highlighting </w:t>
-      </w:r>
-      <w:r>
-        <w:rPr>
-          <w:rFonts w:ascii="Courier New" w:cs="Courier New" w:eastAsia="Courier New" w:hAnsi="Courier New"/>
-          <w:sz w:val="19"/>
-          <w:szCs w:val="19"/>
-        </w:rPr>
-        <w:t xml:space="preserve">:hp1</w:t>
-      </w:r>
-      <w:r>
-        <w:rPr>
-          <w:rFonts w:ascii="Times New Roman" w:cs="Times New Roman" w:eastAsia="Times New Roman" w:hAnsi="Times New Roman"/>
-        </w:rPr>
-        <w:t xml:space="preserve">–</w:t>
-      </w:r>
-      <w:r>
-        <w:rPr>
-          <w:rFonts w:ascii="Courier New" w:cs="Courier New" w:eastAsia="Courier New" w:hAnsi="Courier New"/>
-          <w:sz w:val="19"/>
-          <w:szCs w:val="19"/>
-        </w:rPr>
-        <w:t xml:space="preserve">:hp3</w:t>
-      </w:r>
-      <w:r>
-        <w:rPr>
-          <w:rFonts w:ascii="Times New Roman" w:cs="Times New Roman" w:eastAsia="Times New Roman" w:hAnsi="Times New Roman"/>
-        </w:rPr>
-        <w:t xml:space="preserve">, </w:t>
-      </w:r>
-      <w:r>
-        <w:rPr>
-          <w:rFonts w:ascii="Courier New" w:cs="Courier New" w:eastAsia="Courier New" w:hAnsi="Courier New"/>
-          <w:sz w:val="19"/>
-          <w:szCs w:val="19"/>
-        </w:rPr>
-        <w:t xml:space="preserve">:q</w:t>
-      </w:r>
-      <w:r>
-        <w:rPr>
-          <w:rFonts w:ascii="Times New Roman" w:cs="Times New Roman" w:eastAsia="Times New Roman" w:hAnsi="Times New Roman"/>
-        </w:rPr>
-        <w:t xml:space="preserve">, </w:t>
-      </w:r>
-      <w:r>
-        <w:rPr>
-          <w:rFonts w:ascii="Courier New" w:cs="Courier New" w:eastAsia="Courier New" w:hAnsi="Courier New"/>
-          <w:sz w:val="19"/>
-          <w:szCs w:val="19"/>
-        </w:rPr>
-        <w:t xml:space="preserve">:xph</w:t>
-      </w:r>
-      <w:r>
-        <w:rPr>
-          <w:rFonts w:ascii="Times New Roman" w:cs="Times New Roman" w:eastAsia="Times New Roman" w:hAnsi="Times New Roman"/>
-        </w:rPr>
-        <w:t xml:space="preserve">, symbols such as </w:t>
-      </w:r>
-      <w:r>
-        <w:rPr>
-          <w:rFonts w:ascii="Courier New" w:cs="Courier New" w:eastAsia="Courier New" w:hAnsi="Courier New"/>
-          <w:sz w:val="19"/>
-          <w:szCs w:val="19"/>
-        </w:rPr>
-        <w:t xml:space="preserve">&amp;colon.</w:t>
-      </w:r>
-      <w:r>
-        <w:rPr>
-          <w:rFonts w:ascii="Times New Roman" w:cs="Times New Roman" w:eastAsia="Times New Roman" w:hAnsi="Times New Roman"/>
-        </w:rPr>
-        <w:t xml:space="preserve"> and </w:t>
-      </w:r>
-      <w:r>
-        <w:rPr>
-          <w:rFonts w:ascii="Courier New" w:cs="Courier New" w:eastAsia="Courier New" w:hAnsi="Courier New"/>
-          <w:sz w:val="19"/>
-          <w:szCs w:val="19"/>
-        </w:rPr>
-        <w:t xml:space="preserve">&amp;amp.</w:t>
-      </w:r>
-      <w:r>
-        <w:rPr>
-          <w:rFonts w:ascii="Times New Roman" w:cs="Times New Roman" w:eastAsia="Times New Roman" w:hAnsi="Times New Roman"/>
-        </w:rPr>
-        <w:t xml:space="preserve">, and the control words </w:t>
-      </w:r>
-      <w:r>
-        <w:rPr>
-          <w:rFonts w:ascii="Courier New" w:cs="Courier New" w:eastAsia="Courier New" w:hAnsi="Courier New"/>
-          <w:sz w:val="19"/>
-          <w:szCs w:val="19"/>
-        </w:rPr>
-        <w:t xml:space="preserve">.*</w:t>
-      </w:r>
-      <w:r>
-        <w:rPr>
-          <w:rFonts w:ascii="Times New Roman" w:cs="Times New Roman" w:eastAsia="Times New Roman" w:hAnsi="Times New Roman"/>
-        </w:rPr>
-        <w:t xml:space="preserve">, </w:t>
-      </w:r>
-      <w:r>
-        <w:rPr>
-          <w:rFonts w:ascii="Courier New" w:cs="Courier New" w:eastAsia="Courier New" w:hAnsi="Courier New"/>
-          <w:sz w:val="19"/>
-          <w:szCs w:val="19"/>
-        </w:rPr>
-        <w:t xml:space="preserve">.sp</w:t>
-      </w:r>
-      <w:r>
-        <w:rPr>
-          <w:rFonts w:ascii="Times New Roman" w:cs="Times New Roman" w:eastAsia="Times New Roman" w:hAnsi="Times New Roman"/>
-        </w:rPr>
-        <w:t xml:space="preserve">, </w:t>
-      </w:r>
-      <w:r>
-        <w:rPr>
-          <w:rFonts w:ascii="Courier New" w:cs="Courier New" w:eastAsia="Courier New" w:hAnsi="Courier New"/>
-          <w:sz w:val="19"/>
-          <w:szCs w:val="19"/>
-        </w:rPr>
-        <w:t xml:space="preserve">.br</w:t>
-      </w:r>
-      <w:r>
-        <w:rPr>
-          <w:rFonts w:ascii="Times New Roman" w:cs="Times New Roman" w:eastAsia="Times New Roman" w:hAnsi="Times New Roman"/>
-        </w:rPr>
-        <w:t xml:space="preserve">, </w:t>
-      </w:r>
-      <w:r>
-        <w:rPr>
-          <w:rFonts w:ascii="Courier New" w:cs="Courier New" w:eastAsia="Courier New" w:hAnsi="Courier New"/>
-          <w:sz w:val="19"/>
-          <w:szCs w:val="19"/>
-        </w:rPr>
-        <w:t xml:space="preserve">.pa</w:t>
-      </w:r>
-      <w:r>
-        <w:rPr>
-          <w:rFonts w:ascii="Times New Roman" w:cs="Times New Roman" w:eastAsia="Times New Roman" w:hAnsi="Times New Roman"/>
-        </w:rPr>
-        <w:t xml:space="preserve">, </w:t>
-      </w:r>
-      <w:r>
-        <w:rPr>
-          <w:rFonts w:ascii="Courier New" w:cs="Courier New" w:eastAsia="Courier New" w:hAnsi="Courier New"/>
-          <w:sz w:val="19"/>
-          <w:szCs w:val="19"/>
-        </w:rPr>
-        <w:t xml:space="preserve">.im</w:t>
-      </w:r>
-      <w:r>
-        <w:rPr>
-          <w:rFonts w:ascii="Times New Roman" w:cs="Times New Roman" w:eastAsia="Times New Roman" w:hAnsi="Times New Roman"/>
-        </w:rPr>
-        <w:t xml:space="preserve">.</w:t>
+          <w:rFonts w:ascii="Courier New" w:cs="Courier New" w:eastAsia="Courier New" w:hAnsi="Courier New"/>
+          <w:sz w:val="19"/>
+          <w:szCs w:val="19"/>
+        </w:rPr>
+        <w:t xml:space="preserve">CPM</w:t>
+      </w:r>
+      <w:r>
+        <w:rPr>
+          <w:rFonts w:ascii="Times New Roman" w:cs="Times New Roman" w:eastAsia="Times New Roman" w:hAnsi="Times New Roman"/>
+        </w:rPr>
+        <w:t xml:space="preserve"> starts CP/M 2.2 in your CMS machine (RunCPM, a Z80 emulator; after </w:t>
+      </w:r>
+      <w:r>
+        <w:rPr>
+          <w:rFonts w:ascii="Courier New" w:cs="Courier New" w:eastAsia="Courier New" w:hAnsi="Courier New"/>
+          <w:sz w:val="19"/>
+          <w:szCs w:val="19"/>
+        </w:rPr>
+        <w:t xml:space="preserve">LANG</w:t>
+      </w:r>
+      <w:r>
+        <w:rPr>
+          <w:rFonts w:ascii="Times New Roman" w:cs="Times New Roman" w:eastAsia="Times New Roman" w:hAnsi="Times New Roman"/>
+        </w:rPr>
+        <w:t xml:space="preserve">, under </w:t>
+      </w:r>
+      <w:r>
+        <w:rPr>
+          <w:rFonts w:ascii="Courier New" w:cs="Courier New" w:eastAsia="Courier New" w:hAnsi="Courier New"/>
+          <w:sz w:val="19"/>
+          <w:szCs w:val="19"/>
+        </w:rPr>
+        <w:t xml:space="preserve">IPL 290</w:t>
+      </w:r>
+      <w:r>
+        <w:rPr>
+          <w:rFonts w:ascii="Times New Roman" w:cs="Times New Roman" w:eastAsia="Times New Roman" w:hAnsi="Times New Roman"/>
+        </w:rPr>
+        <w:t xml:space="preserve"> in more than 16 MB). CP/M drive X: is the CMS disk X: A: is your A disk, and L: the language disk with the CP/M programs PIP, STAT, ASM, LOAD, DDT, ED, DUMP, SUBMIT and others. </w:t>
+      </w:r>
+      <w:r>
+        <w:rPr>
+          <w:rFonts w:ascii="Courier New" w:cs="Courier New" w:eastAsia="Courier New" w:hAnsi="Courier New"/>
+          <w:sz w:val="19"/>
+          <w:szCs w:val="19"/>
+        </w:rPr>
+        <w:t xml:space="preserve">EXIT</w:t>
+      </w:r>
+      <w:r>
+        <w:rPr>
+          <w:rFonts w:ascii="Times New Roman" w:cs="Times New Roman" w:eastAsia="Times New Roman" w:hAnsi="Times New Roman"/>
+        </w:rPr>
+        <w:t xml:space="preserve"> leaves CP/M. </w:t>
+      </w:r>
+      <w:r>
+        <w:rPr>
+          <w:rFonts w:ascii="Courier New" w:cs="Courier New" w:eastAsia="Courier New" w:hAnsi="Courier New"/>
+          <w:sz w:val="19"/>
+          <w:szCs w:val="19"/>
+        </w:rPr>
+        <w:t xml:space="preserve">CPM command; command</w:t>
+      </w:r>
+      <w:r>
+        <w:rPr>
+          <w:rFonts w:ascii="Times New Roman" w:cs="Times New Roman" w:eastAsia="Times New Roman" w:hAnsi="Times New Roman"/>
+        </w:rPr>
+        <w:t xml:space="preserve"> runs CP/M commands and returns. A CP/M file is the plain bytes of a CMS file of the same name, so a CMS text file must be converted first: </w:t>
+      </w:r>
+      <w:r>
+        <w:rPr>
+          <w:rFonts w:ascii="Courier New" w:cs="Courier New" w:eastAsia="Courier New" w:hAnsi="Courier New"/>
+          <w:sz w:val="19"/>
+          <w:szCs w:val="19"/>
+        </w:rPr>
+        <w:t xml:space="preserve">CPM IMPORT fn ft</w:t>
+      </w:r>
+      <w:r>
+        <w:rPr>
+          <w:rFonts w:ascii="Times New Roman" w:cs="Times New Roman" w:eastAsia="Times New Roman" w:hAnsi="Times New Roman"/>
+        </w:rPr>
+        <w:t xml:space="preserve"> makes it a CP/M text file (ASCII, CR LF), </w:t>
+      </w:r>
+      <w:r>
+        <w:rPr>
+          <w:rFonts w:ascii="Courier New" w:cs="Courier New" w:eastAsia="Courier New" w:hAnsi="Courier New"/>
+          <w:sz w:val="19"/>
+          <w:szCs w:val="19"/>
+        </w:rPr>
+        <w:t xml:space="preserve">CPM EXPORT fn ft</w:t>
+      </w:r>
+      <w:r>
+        <w:rPr>
+          <w:rFonts w:ascii="Times New Roman" w:cs="Times New Roman" w:eastAsia="Times New Roman" w:hAnsi="Times New Roman"/>
+        </w:rPr>
+        <w:t xml:space="preserve"> makes it CMS text again.</w:t>
       </w:r>
     </w:p>
     <w:tbl>
@@ -23573,7 +23241,7 @@
                 <w:sz w:val="17"/>
                 <w:szCs w:val="17"/>
               </w:rPr>
-              <w:t xml:space="preserve">:h1.Introduction</w:t>
+              <w:t xml:space="preserve">copyfile hello asm l = = a</w:t>
             </w:r>
           </w:p>
           <w:p>
@@ -23586,7 +23254,7 @@
                 <w:sz w:val="17"/>
                 <w:szCs w:val="17"/>
               </w:rPr>
-              <w:t xml:space="preserve">:p.This book is written in :hp2.BookMaster:ehp2. markup.</w:t>
+              <w:t xml:space="preserve">cpm import hello asm</w:t>
             </w:r>
           </w:p>
           <w:p>
@@ -23599,7 +23267,7 @@
                 <w:sz w:val="17"/>
                 <w:szCs w:val="17"/>
               </w:rPr>
-              <w:t xml:space="preserve">:ul.</w:t>
+              <w:t xml:space="preserve">CPM: HELLO ASM A is now a CP/M file</w:t>
             </w:r>
           </w:p>
           <w:p>
@@ -23612,7 +23280,7 @@
                 <w:sz w:val="17"/>
                 <w:szCs w:val="17"/>
               </w:rPr>
-              <w:t xml:space="preserve">:li.headings, paragraphs and highlighting;</w:t>
+              <w:t xml:space="preserve">cpm l:asm hello; l:load hello; hello</w:t>
             </w:r>
           </w:p>
           <w:p>
@@ -23625,7 +23293,7 @@
                 <w:sz w:val="17"/>
                 <w:szCs w:val="17"/>
               </w:rPr>
-              <w:t xml:space="preserve">:li.lists, screens, figures and tables.</w:t>
+              <w:t xml:space="preserve">CP/M ASSEMBLER - VER 2.0</w:t>
             </w:r>
           </w:p>
           <w:p>
@@ -23638,7 +23306,46 @@
                 <w:sz w:val="17"/>
                 <w:szCs w:val="17"/>
               </w:rPr>
-              <w:t xml:space="preserve">:eul.</w:t>
+              <w:t xml:space="preserve">012E</w:t>
+            </w:r>
+          </w:p>
+          <w:p>
+            <w:pPr>
+              <w:spacing w:after="0" w:line="228"/>
+            </w:pPr>
+            <w:r>
+              <w:rPr>
+                <w:rFonts w:ascii="Courier New" w:cs="Courier New" w:eastAsia="Courier New" w:hAnsi="Courier New"/>
+                <w:sz w:val="17"/>
+                <w:szCs w:val="17"/>
+              </w:rPr>
+              <w:t xml:space="preserve">END OF ASSEMBLY</w:t>
+            </w:r>
+          </w:p>
+          <w:p>
+            <w:pPr>
+              <w:spacing w:after="0" w:line="228"/>
+            </w:pPr>
+            <w:r>
+              <w:rPr>
+                <w:rFonts w:ascii="Courier New" w:cs="Courier New" w:eastAsia="Courier New" w:hAnsi="Courier New"/>
+                <w:sz w:val="17"/>
+                <w:szCs w:val="17"/>
+              </w:rPr>
+              <w:t xml:space="preserve">Hello from CP/M 2.2 on VM/370plus!</w:t>
+            </w:r>
+          </w:p>
+          <w:p>
+            <w:pPr>
+              <w:spacing w:after="0" w:line="228"/>
+            </w:pPr>
+            <w:r>
+              <w:rPr>
+                <w:rFonts w:ascii="Courier New" w:cs="Courier New" w:eastAsia="Courier New" w:hAnsi="Courier New"/>
+                <w:sz w:val="17"/>
+                <w:szCs w:val="17"/>
+              </w:rPr>
+              <w:t xml:space="preserve">Ready;</w:t>
             </w:r>
           </w:p>
         </w:tc>
@@ -23664,7 +23371,94 @@
           <w:sz w:val="18"/>
           <w:szCs w:val="18"/>
         </w:rPr>
-        <w:t xml:space="preserve">BookMaster markup</w:t>
+        <w:t xml:space="preserve">Assembling and running an 8080 program under CP/M on CMS</w:t>
+      </w:r>
+    </w:p>
+    <w:p>
+      <w:pPr>
+        <w:spacing w:after="120"/>
+      </w:pPr>
+      <w:r>
+        <w:rPr>
+          <w:rFonts w:ascii="Times New Roman" w:cs="Times New Roman" w:eastAsia="Times New Roman" w:hAnsi="Times New Roman"/>
+        </w:rPr>
+        <w:t xml:space="preserve">The CMS terminal is line-oriented: CP/M sees each typed line, and ^C does not stop a running program. Full-screen CP/M programs work in the Debian guest instead: </w:t>
+      </w:r>
+      <w:r>
+        <w:rPr>
+          <w:rFonts w:ascii="Courier New" w:cs="Courier New" w:eastAsia="Courier New" w:hAnsi="Courier New"/>
+          <w:sz w:val="19"/>
+          <w:szCs w:val="19"/>
+        </w:rPr>
+        <w:t xml:space="preserve">runcpm</w:t>
+      </w:r>
+      <w:r>
+        <w:rPr>
+          <w:rFonts w:ascii="Times New Roman" w:cs="Times New Roman" w:eastAsia="Times New Roman" w:hAnsi="Times New Roman"/>
+        </w:rPr>
+        <w:t xml:space="preserve"> in an ssh session, or from CMS </w:t>
+      </w:r>
+      <w:r>
+        <w:rPr>
+          <w:rFonts w:ascii="Courier New" w:cs="Courier New" w:eastAsia="Courier New" w:hAnsi="Courier New"/>
+          <w:sz w:val="19"/>
+          <w:szCs w:val="19"/>
+        </w:rPr>
+        <w:t xml:space="preserve">CPM command (LINUX</w:t>
+      </w:r>
+      <w:r>
+        <w:rPr>
+          <w:rFonts w:ascii="Times New Roman" w:cs="Times New Roman" w:eastAsia="Times New Roman" w:hAnsi="Times New Roman"/>
+        </w:rPr>
+        <w:t xml:space="preserve"> through the spool bridge, with </w:t>
+      </w:r>
+      <w:r>
+        <w:rPr>
+          <w:rFonts w:ascii="Courier New" w:cs="Courier New" w:eastAsia="Courier New" w:hAnsi="Courier New"/>
+          <w:sz w:val="19"/>
+          <w:szCs w:val="19"/>
+        </w:rPr>
+        <w:t xml:space="preserve">CPM PUT fn ft (LINUX</w:t>
+      </w:r>
+      <w:r>
+        <w:rPr>
+          <w:rFonts w:ascii="Times New Roman" w:cs="Times New Roman" w:eastAsia="Times New Roman" w:hAnsi="Times New Roman"/>
+        </w:rPr>
+        <w:t xml:space="preserve"> and </w:t>
+      </w:r>
+      <w:r>
+        <w:rPr>
+          <w:rFonts w:ascii="Courier New" w:cs="Courier New" w:eastAsia="Courier New" w:hAnsi="Courier New"/>
+          <w:sz w:val="19"/>
+          <w:szCs w:val="19"/>
+        </w:rPr>
+        <w:t xml:space="preserve">CPM GET fn ft (LINUX</w:t>
+      </w:r>
+      <w:r>
+        <w:rPr>
+          <w:rFonts w:ascii="Times New Roman" w:cs="Times New Roman" w:eastAsia="Times New Roman" w:hAnsi="Times New Roman"/>
+        </w:rPr>
+        <w:t xml:space="preserve"> to move files.</w:t>
+      </w:r>
+    </w:p>
+    <w:p>
+      <w:pPr>
+        <w:pStyle w:val="Heading1"/>
+        <w:pageBreakBefore/>
+      </w:pPr>
+      <w:r>
+        <w:t xml:space="preserve">Chapter 9. Documents and Printing</w:t>
+      </w:r>
+    </w:p>
+    <w:p>
+      <w:pPr>
+        <w:spacing w:after="120"/>
+      </w:pPr>
+      <w:r>
+        <w:rPr>
+          <w:rFonts w:ascii="Times New Roman" w:cs="Times New Roman" w:eastAsia="Times New Roman" w:hAnsi="Times New Roman"/>
+        </w:rPr>
+        <w:t xml:space="preserve">VM/370plus formats documents in the Debian guest through the spool bridge and gives the result back to CMS: plain text as a CMS file, PostScript as a CMS file that can be printed. Three formatters are there: troff, BookMaster markup and LaTeX.</w:t>
       </w:r>
     </w:p>
     <w:p>
@@ -23672,7 +23466,7 @@
         <w:pStyle w:val="Heading2"/>
       </w:pPr>
       <w:r>
-        <w:t xml:space="preserve">LaTeX</w:t>
+        <w:t xml:space="preserve">TROFF</w:t>
       </w:r>
     </w:p>
     <w:p>
@@ -23685,13 +23479,41 @@
           <w:sz w:val="19"/>
           <w:szCs w:val="19"/>
         </w:rPr>
-        <w:t xml:space="preserve">LATEX fn [ft [fm]]</w:t>
-      </w:r>
-      <w:r>
-        <w:rPr>
-          <w:rFonts w:ascii="Times New Roman" w:cs="Times New Roman" w:eastAsia="Times New Roman" w:hAnsi="Times New Roman"/>
-        </w:rPr>
-        <w:t xml:space="preserve"> (file type TEX by default) runs LaTeX (pdfTeX, TeX Live 2023) twice, for the contents and references, and dvips; the PostScript comes back as </w:t>
+        <w:t xml:space="preserve">TROFF fn [ft [fm]] (MACROS m</w:t>
+      </w:r>
+      <w:r>
+        <w:rPr>
+          <w:rFonts w:ascii="Times New Roman" w:cs="Times New Roman" w:eastAsia="Times New Roman" w:hAnsi="Times New Roman"/>
+        </w:rPr>
+        <w:t xml:space="preserve"> formats a troff document (file type TROFF by default) with groff and the ms, me, mm, man or mom macros; the text comes back as </w:t>
+      </w:r>
+      <w:r>
+        <w:rPr>
+          <w:rFonts w:ascii="Courier New" w:cs="Courier New" w:eastAsia="Courier New" w:hAnsi="Courier New"/>
+          <w:sz w:val="19"/>
+          <w:szCs w:val="19"/>
+        </w:rPr>
+        <w:t xml:space="preserve">fn DOCUMENT A</w:t>
+      </w:r>
+      <w:r>
+        <w:rPr>
+          <w:rFonts w:ascii="Times New Roman" w:cs="Times New Roman" w:eastAsia="Times New Roman" w:hAnsi="Times New Roman"/>
+        </w:rPr>
+        <w:t xml:space="preserve">. With </w:t>
+      </w:r>
+      <w:r>
+        <w:rPr>
+          <w:rFonts w:ascii="Courier New" w:cs="Courier New" w:eastAsia="Courier New" w:hAnsi="Courier New"/>
+          <w:sz w:val="19"/>
+          <w:szCs w:val="19"/>
+        </w:rPr>
+        <w:t xml:space="preserve">(PS</w:t>
+      </w:r>
+      <w:r>
+        <w:rPr>
+          <w:rFonts w:ascii="Times New Roman" w:cs="Times New Roman" w:eastAsia="Times New Roman" w:hAnsi="Times New Roman"/>
+        </w:rPr>
+        <w:t xml:space="preserve"> the result is PostScript, </w:t>
       </w:r>
       <w:r>
         <w:rPr>
@@ -23705,21 +23527,7 @@
         <w:rPr>
           <w:rFonts w:ascii="Times New Roman" w:cs="Times New Roman" w:eastAsia="Times New Roman" w:hAnsi="Times New Roman"/>
         </w:rPr>
-        <w:t xml:space="preserve">. </w:t>
-      </w:r>
-      <w:r>
-        <w:rPr>
-          <w:rFonts w:ascii="Courier New" w:cs="Courier New" w:eastAsia="Courier New" w:hAnsi="Courier New"/>
-          <w:sz w:val="19"/>
-          <w:szCs w:val="19"/>
-        </w:rPr>
-        <w:t xml:space="preserve">LATEX fn (PDF</w:t>
-      </w:r>
-      <w:r>
-        <w:rPr>
-          <w:rFonts w:ascii="Times New Roman" w:cs="Times New Roman" w:eastAsia="Times New Roman" w:hAnsi="Times New Roman"/>
-        </w:rPr>
-        <w:t xml:space="preserve"> runs pdfLaTeX and leaves the PDF in the Debian guest. The packages are those of LaTeX itself, amsmath, graphics, tools, geometry and url; a run takes about a minute.</w:t>
+        <w:t xml:space="preserve">.</w:t>
       </w:r>
     </w:p>
     <w:p>
@@ -23727,7 +23535,7 @@
         <w:pStyle w:val="Heading2"/>
       </w:pPr>
       <w:r>
-        <w:t xml:space="preserve">Printing PostScript</w:t>
+        <w:t xml:space="preserve">BOOKIE: BookMaster markup</w:t>
       </w:r>
     </w:p>
     <w:p>
@@ -23736,53 +23544,31 @@
       </w:pPr>
       <w:r>
         <w:rPr>
-          <w:rFonts w:ascii="Courier New" w:cs="Courier New" w:eastAsia="Courier New" w:hAnsi="Courier New"/>
-          <w:sz w:val="19"/>
-          <w:szCs w:val="19"/>
-        </w:rPr>
-        <w:t xml:space="preserve">PSPRINT fn [ft [fm]]</w:t>
-      </w:r>
-      <w:r>
-        <w:rPr>
-          <w:rFonts w:ascii="Times New Roman" w:cs="Times New Roman" w:eastAsia="Times New Roman" w:hAnsi="Times New Roman"/>
-        </w:rPr>
-        <w:t xml:space="preserve"> (file type PS by default) prints a PostScript file. By default it goes to the virtual printer without page headers; CP’s printer 00E writes it on the PC, where </w:t>
-      </w:r>
-      <w:r>
-        <w:rPr>
-          <w:rFonts w:ascii="Courier New" w:cs="Courier New" w:eastAsia="Courier New" w:hAnsi="Courier New"/>
-          <w:sz w:val="19"/>
-          <w:szCs w:val="19"/>
-        </w:rPr>
-        <w:t xml:space="preserve">tools/psprint.py</w:t>
-      </w:r>
-      <w:r>
-        <w:rPr>
-          <w:rFonts w:ascii="Times New Roman" w:cs="Times New Roman" w:eastAsia="Times New Roman" w:hAnsi="Times New Roman"/>
-        </w:rPr>
-        <w:t xml:space="preserve"> takes each PostScript job out unchanged and hands it to the printer (lp, or a printer’s port 9100) or makes a PDF. With </w:t>
-      </w:r>
-      <w:r>
-        <w:rPr>
-          <w:rFonts w:ascii="Courier New" w:cs="Courier New" w:eastAsia="Courier New" w:hAnsi="Courier New"/>
-          <w:sz w:val="19"/>
-          <w:szCs w:val="19"/>
-        </w:rPr>
-        <w:t xml:space="preserve">(BRIDGE [format]</w:t>
-      </w:r>
-      <w:r>
-        <w:rPr>
-          <w:rFonts w:ascii="Times New Roman" w:cs="Times New Roman" w:eastAsia="Times New Roman" w:hAnsi="Times New Roman"/>
-        </w:rPr>
-        <w:t xml:space="preserve"> it goes through the spool bridge: Ghostscript in the Debian guest converts it to </w:t>
-      </w:r>
-      <w:r>
-        <w:rPr>
-          <w:rFonts w:ascii="Courier New" w:cs="Courier New" w:eastAsia="Courier New" w:hAnsi="Courier New"/>
-          <w:sz w:val="19"/>
-          <w:szCs w:val="19"/>
-        </w:rPr>
-        <w:t xml:space="preserve">ps</w:t>
+          <w:rFonts w:ascii="Times New Roman" w:cs="Times New Roman" w:eastAsia="Times New Roman" w:hAnsi="Times New Roman"/>
+        </w:rPr>
+        <w:t xml:space="preserve">BookMaster is IBM’s licensed program for GML markup. BOOKIE is our own formatter for that markup: </w:t>
+      </w:r>
+      <w:r>
+        <w:rPr>
+          <w:rFonts w:ascii="Courier New" w:cs="Courier New" w:eastAsia="Courier New" w:hAnsi="Courier New"/>
+          <w:sz w:val="19"/>
+          <w:szCs w:val="19"/>
+        </w:rPr>
+        <w:t xml:space="preserve">BOOKIE fn [ft [fm]]</w:t>
+      </w:r>
+      <w:r>
+        <w:rPr>
+          <w:rFonts w:ascii="Times New Roman" w:cs="Times New Roman" w:eastAsia="Times New Roman" w:hAnsi="Times New Roman"/>
+        </w:rPr>
+        <w:t xml:space="preserve"> (file type SCRIPT by default) gives </w:t>
+      </w:r>
+      <w:r>
+        <w:rPr>
+          <w:rFonts w:ascii="Courier New" w:cs="Courier New" w:eastAsia="Courier New" w:hAnsi="Courier New"/>
+          <w:sz w:val="19"/>
+          <w:szCs w:val="19"/>
+        </w:rPr>
+        <w:t xml:space="preserve">fn DOCUMENT A</w:t>
       </w:r>
       <w:r>
         <w:rPr>
@@ -23796,63 +23582,49 @@
           <w:sz w:val="19"/>
           <w:szCs w:val="19"/>
         </w:rPr>
-        <w:t xml:space="preserve">pdf</w:t>
-      </w:r>
-      <w:r>
-        <w:rPr>
-          <w:rFonts w:ascii="Times New Roman" w:cs="Times New Roman" w:eastAsia="Times New Roman" w:hAnsi="Times New Roman"/>
-        </w:rPr>
-        <w:t xml:space="preserve">, </w:t>
-      </w:r>
-      <w:r>
-        <w:rPr>
-          <w:rFonts w:ascii="Courier New" w:cs="Courier New" w:eastAsia="Courier New" w:hAnsi="Courier New"/>
-          <w:sz w:val="19"/>
-          <w:szCs w:val="19"/>
-        </w:rPr>
-        <w:t xml:space="preserve">ljet4</w:t>
-      </w:r>
-      <w:r>
-        <w:rPr>
-          <w:rFonts w:ascii="Times New Roman" w:cs="Times New Roman" w:eastAsia="Times New Roman" w:hAnsi="Times New Roman"/>
-        </w:rPr>
-        <w:t xml:space="preserve">, </w:t>
-      </w:r>
-      <w:r>
-        <w:rPr>
-          <w:rFonts w:ascii="Courier New" w:cs="Courier New" w:eastAsia="Courier New" w:hAnsi="Courier New"/>
-          <w:sz w:val="19"/>
-          <w:szCs w:val="19"/>
-        </w:rPr>
-        <w:t xml:space="preserve">pxlmono</w:t>
-      </w:r>
-      <w:r>
-        <w:rPr>
-          <w:rFonts w:ascii="Times New Roman" w:cs="Times New Roman" w:eastAsia="Times New Roman" w:hAnsi="Times New Roman"/>
-        </w:rPr>
-        <w:t xml:space="preserve"> or </w:t>
-      </w:r>
-      <w:r>
-        <w:rPr>
-          <w:rFonts w:ascii="Courier New" w:cs="Courier New" w:eastAsia="Courier New" w:hAnsi="Courier New"/>
-          <w:sz w:val="19"/>
-          <w:szCs w:val="19"/>
-        </w:rPr>
-        <w:t xml:space="preserve">pxlcolor</w:t>
-      </w:r>
-      <w:r>
-        <w:rPr>
-          <w:rFonts w:ascii="Times New Roman" w:cs="Times New Roman" w:eastAsia="Times New Roman" w:hAnsi="Times New Roman"/>
-        </w:rPr>
-        <w:t xml:space="preserve"> and sends it to the printer named in </w:t>
-      </w:r>
-      <w:r>
-        <w:rPr>
-          <w:rFonts w:ascii="Courier New" w:cs="Courier New" w:eastAsia="Courier New" w:hAnsi="Courier New"/>
-          <w:sz w:val="19"/>
-          <w:szCs w:val="19"/>
-        </w:rPr>
-        <w:t xml:space="preserve">/etc/vmspool.d/print.conf</w:t>
+        <w:t xml:space="preserve">BOOKIE fn (PS</w:t>
+      </w:r>
+      <w:r>
+        <w:rPr>
+          <w:rFonts w:ascii="Times New Roman" w:cs="Times New Roman" w:eastAsia="Times New Roman" w:hAnsi="Times New Roman"/>
+        </w:rPr>
+        <w:t xml:space="preserve"> gives </w:t>
+      </w:r>
+      <w:r>
+        <w:rPr>
+          <w:rFonts w:ascii="Courier New" w:cs="Courier New" w:eastAsia="Courier New" w:hAnsi="Courier New"/>
+          <w:sz w:val="19"/>
+          <w:szCs w:val="19"/>
+        </w:rPr>
+        <w:t xml:space="preserve">fn PS A</w:t>
+      </w:r>
+      <w:r>
+        <w:rPr>
+          <w:rFonts w:ascii="Times New Roman" w:cs="Times New Roman" w:eastAsia="Times New Roman" w:hAnsi="Times New Roman"/>
+        </w:rPr>
+        <w:t xml:space="preserve">. Its style is the style of this Guide: a title page and an edition notice, a contents page with page numbers, chapters on new pages, running heads and feet, screens in framed boxes, tables and figures. This Guide is itself available as </w:t>
+      </w:r>
+      <w:r>
+        <w:rPr>
+          <w:rFonts w:ascii="Courier New" w:cs="Courier New" w:eastAsia="Courier New" w:hAnsi="Courier New"/>
+          <w:sz w:val="19"/>
+          <w:szCs w:val="19"/>
+        </w:rPr>
+        <w:t xml:space="preserve">GUIDE SCRIPT</w:t>
+      </w:r>
+      <w:r>
+        <w:rPr>
+          <w:rFonts w:ascii="Times New Roman" w:cs="Times New Roman" w:eastAsia="Times New Roman" w:hAnsi="Times New Roman"/>
+        </w:rPr>
+        <w:t xml:space="preserve"> and is formatted on VM/370plus with </w:t>
+      </w:r>
+      <w:r>
+        <w:rPr>
+          <w:rFonts w:ascii="Courier New" w:cs="Courier New" w:eastAsia="Courier New" w:hAnsi="Courier New"/>
+          <w:sz w:val="19"/>
+          <w:szCs w:val="19"/>
+        </w:rPr>
+        <w:t xml:space="preserve">BOOKIE GUIDE (PS</w:t>
       </w:r>
       <w:r>
         <w:rPr>
@@ -23869,57 +23641,15 @@
         <w:rPr>
           <w:rFonts w:ascii="Times New Roman" w:cs="Times New Roman" w:eastAsia="Times New Roman" w:hAnsi="Times New Roman"/>
         </w:rPr>
-        <w:t xml:space="preserve">On a newly installed system the real printer 00E is drained, so spooled print files wait. An operator starts it once with </w:t>
-      </w:r>
-      <w:r>
-        <w:rPr>
-          <w:rFonts w:ascii="Courier New" w:cs="Courier New" w:eastAsia="Courier New" w:hAnsi="Courier New"/>
-          <w:sz w:val="19"/>
-          <w:szCs w:val="19"/>
-        </w:rPr>
-        <w:t xml:space="preserve">START 00E</w:t>
-      </w:r>
-      <w:r>
-        <w:rPr>
-          <w:rFonts w:ascii="Times New Roman" w:cs="Times New Roman" w:eastAsia="Times New Roman" w:hAnsi="Times New Roman"/>
-        </w:rPr>
-        <w:t xml:space="preserve"> (from MAINT, or </w:t>
-      </w:r>
-      <w:r>
-        <w:rPr>
-          <w:rFonts w:ascii="Courier New" w:cs="Courier New" w:eastAsia="Courier New" w:hAnsi="Courier New"/>
-          <w:sz w:val="19"/>
-          <w:szCs w:val="19"/>
-        </w:rPr>
-        <w:t xml:space="preserve">vmcp start 00e</w:t>
-      </w:r>
-      <w:r>
-        <w:rPr>
-          <w:rFonts w:ascii="Times New Roman" w:cs="Times New Roman" w:eastAsia="Times New Roman" w:hAnsi="Times New Roman"/>
-        </w:rPr>
-        <w:t xml:space="preserve"> in the Debian guest). The EXECs of this chapter are on MAINT’s 19D disk, so they work under the usual </w:t>
-      </w:r>
-      <w:r>
-        <w:rPr>
-          <w:rFonts w:ascii="Courier New" w:cs="Courier New" w:eastAsia="Courier New" w:hAnsi="Courier New"/>
-          <w:sz w:val="19"/>
-          <w:szCs w:val="19"/>
-        </w:rPr>
-        <w:t xml:space="preserve">IPL CMS</w:t>
-      </w:r>
-      <w:r>
-        <w:rPr>
-          <w:rFonts w:ascii="Times New Roman" w:cs="Times New Roman" w:eastAsia="Times New Roman" w:hAnsi="Times New Roman"/>
-        </w:rPr>
-        <w:t xml:space="preserve">; the samples (</w:t>
-      </w:r>
-      <w:r>
-        <w:rPr>
-          <w:rFonts w:ascii="Courier New" w:cs="Courier New" w:eastAsia="Courier New" w:hAnsi="Courier New"/>
-          <w:sz w:val="19"/>
-          <w:szCs w:val="19"/>
-        </w:rPr>
-        <w:t xml:space="preserve">SAMPLE SCRIPT</w:t>
+        <w:t xml:space="preserve">The tags are those of BookMaster: </w:t>
+      </w:r>
+      <w:r>
+        <w:rPr>
+          <w:rFonts w:ascii="Courier New" w:cs="Courier New" w:eastAsia="Courier New" w:hAnsi="Courier New"/>
+          <w:sz w:val="19"/>
+          <w:szCs w:val="19"/>
+        </w:rPr>
+        <w:t xml:space="preserve">:userdoc</w:t>
       </w:r>
       <w:r>
         <w:rPr>
@@ -23933,7 +23663,21 @@
           <w:sz w:val="19"/>
           <w:szCs w:val="19"/>
         </w:rPr>
-        <w:t xml:space="preserve">GUIDE SCRIPT</w:t>
+        <w:t xml:space="preserve">:prolog</w:t>
+      </w:r>
+      <w:r>
+        <w:rPr>
+          <w:rFonts w:ascii="Times New Roman" w:cs="Times New Roman" w:eastAsia="Times New Roman" w:hAnsi="Times New Roman"/>
+        </w:rPr>
+        <w:t xml:space="preserve"> with </w:t>
+      </w:r>
+      <w:r>
+        <w:rPr>
+          <w:rFonts w:ascii="Courier New" w:cs="Courier New" w:eastAsia="Courier New" w:hAnsi="Courier New"/>
+          <w:sz w:val="19"/>
+          <w:szCs w:val="19"/>
+        </w:rPr>
+        <w:t xml:space="preserve">:title</w:t>
       </w:r>
       <w:r>
         <w:rPr>
@@ -23947,7 +23691,21 @@
           <w:sz w:val="19"/>
           <w:szCs w:val="19"/>
         </w:rPr>
-        <w:t xml:space="preserve">HELLO TEX</w:t>
+        <w:t xml:space="preserve">:docnum</w:t>
+      </w:r>
+      <w:r>
+        <w:rPr>
+          <w:rFonts w:ascii="Times New Roman" w:cs="Times New Roman" w:eastAsia="Times New Roman" w:hAnsi="Times New Roman"/>
+        </w:rPr>
+        <w:t xml:space="preserve"> and the title-page tags </w:t>
+      </w:r>
+      <w:r>
+        <w:rPr>
+          <w:rFonts w:ascii="Courier New" w:cs="Courier New" w:eastAsia="Courier New" w:hAnsi="Courier New"/>
+          <w:sz w:val="19"/>
+          <w:szCs w:val="19"/>
+        </w:rPr>
+        <w:t xml:space="preserve">:prodname :subtitle :version :based :filenum</w:t>
       </w:r>
       <w:r>
         <w:rPr>
@@ -23961,35 +23719,259 @@
           <w:sz w:val="19"/>
           <w:szCs w:val="19"/>
         </w:rPr>
-        <w:t xml:space="preserve">HELLO TROFF</w:t>
-      </w:r>
-      <w:r>
-        <w:rPr>
-          <w:rFonts w:ascii="Times New Roman" w:cs="Times New Roman" w:eastAsia="Times New Roman" w:hAnsi="Times New Roman"/>
-        </w:rPr>
-        <w:t xml:space="preserve">) are on the language disk, which uses EDF and needs the EC-mode CMS: </w:t>
-      </w:r>
-      <w:r>
-        <w:rPr>
-          <w:rFonts w:ascii="Courier New" w:cs="Courier New" w:eastAsia="Courier New" w:hAnsi="Courier New"/>
-          <w:sz w:val="19"/>
-          <w:szCs w:val="19"/>
-        </w:rPr>
-        <w:t xml:space="preserve">IPL 290</w:t>
-      </w:r>
-      <w:r>
-        <w:rPr>
-          <w:rFonts w:ascii="Times New Roman" w:cs="Times New Roman" w:eastAsia="Times New Roman" w:hAnsi="Times New Roman"/>
-        </w:rPr>
-        <w:t xml:space="preserve">, then </w:t>
-      </w:r>
-      <w:r>
-        <w:rPr>
-          <w:rFonts w:ascii="Courier New" w:cs="Courier New" w:eastAsia="Courier New" w:hAnsi="Courier New"/>
-          <w:sz w:val="19"/>
-          <w:szCs w:val="19"/>
-        </w:rPr>
-        <w:t xml:space="preserve">LANG</w:t>
+        <w:t xml:space="preserve">:frontm :tipage :edition :toc :body :appendix</w:t>
+      </w:r>
+      <w:r>
+        <w:rPr>
+          <w:rFonts w:ascii="Times New Roman" w:cs="Times New Roman" w:eastAsia="Times New Roman" w:hAnsi="Times New Roman"/>
+        </w:rPr>
+        <w:t xml:space="preserve">, headings </w:t>
+      </w:r>
+      <w:r>
+        <w:rPr>
+          <w:rFonts w:ascii="Courier New" w:cs="Courier New" w:eastAsia="Courier New" w:hAnsi="Courier New"/>
+          <w:sz w:val="19"/>
+          <w:szCs w:val="19"/>
+        </w:rPr>
+        <w:t xml:space="preserve">:h1</w:t>
+      </w:r>
+      <w:r>
+        <w:rPr>
+          <w:rFonts w:ascii="Times New Roman" w:cs="Times New Roman" w:eastAsia="Times New Roman" w:hAnsi="Times New Roman"/>
+        </w:rPr>
+        <w:t xml:space="preserve">–</w:t>
+      </w:r>
+      <w:r>
+        <w:rPr>
+          <w:rFonts w:ascii="Courier New" w:cs="Courier New" w:eastAsia="Courier New" w:hAnsi="Courier New"/>
+          <w:sz w:val="19"/>
+          <w:szCs w:val="19"/>
+        </w:rPr>
+        <w:t xml:space="preserve">:h6</w:t>
+      </w:r>
+      <w:r>
+        <w:rPr>
+          <w:rFonts w:ascii="Times New Roman" w:cs="Times New Roman" w:eastAsia="Times New Roman" w:hAnsi="Times New Roman"/>
+        </w:rPr>
+        <w:t xml:space="preserve">, </w:t>
+      </w:r>
+      <w:r>
+        <w:rPr>
+          <w:rFonts w:ascii="Courier New" w:cs="Courier New" w:eastAsia="Courier New" w:hAnsi="Courier New"/>
+          <w:sz w:val="19"/>
+          <w:szCs w:val="19"/>
+        </w:rPr>
+        <w:t xml:space="preserve">:p :note :attention</w:t>
+      </w:r>
+      <w:r>
+        <w:rPr>
+          <w:rFonts w:ascii="Times New Roman" w:cs="Times New Roman" w:eastAsia="Times New Roman" w:hAnsi="Times New Roman"/>
+        </w:rPr>
+        <w:t xml:space="preserve">, lists </w:t>
+      </w:r>
+      <w:r>
+        <w:rPr>
+          <w:rFonts w:ascii="Courier New" w:cs="Courier New" w:eastAsia="Courier New" w:hAnsi="Courier New"/>
+          <w:sz w:val="19"/>
+          <w:szCs w:val="19"/>
+        </w:rPr>
+        <w:t xml:space="preserve">:ol :ul :sl :li :dl :dt :dd</w:t>
+      </w:r>
+      <w:r>
+        <w:rPr>
+          <w:rFonts w:ascii="Times New Roman" w:cs="Times New Roman" w:eastAsia="Times New Roman" w:hAnsi="Times New Roman"/>
+        </w:rPr>
+        <w:t xml:space="preserve">, </w:t>
+      </w:r>
+      <w:r>
+        <w:rPr>
+          <w:rFonts w:ascii="Courier New" w:cs="Courier New" w:eastAsia="Courier New" w:hAnsi="Courier New"/>
+          <w:sz w:val="19"/>
+          <w:szCs w:val="19"/>
+        </w:rPr>
+        <w:t xml:space="preserve">:xmp</w:t>
+      </w:r>
+      <w:r>
+        <w:rPr>
+          <w:rFonts w:ascii="Times New Roman" w:cs="Times New Roman" w:eastAsia="Times New Roman" w:hAnsi="Times New Roman"/>
+        </w:rPr>
+        <w:t xml:space="preserve"> for screens, </w:t>
+      </w:r>
+      <w:r>
+        <w:rPr>
+          <w:rFonts w:ascii="Courier New" w:cs="Courier New" w:eastAsia="Courier New" w:hAnsi="Courier New"/>
+          <w:sz w:val="19"/>
+          <w:szCs w:val="19"/>
+        </w:rPr>
+        <w:t xml:space="preserve">:fig :figcap</w:t>
+      </w:r>
+      <w:r>
+        <w:rPr>
+          <w:rFonts w:ascii="Times New Roman" w:cs="Times New Roman" w:eastAsia="Times New Roman" w:hAnsi="Times New Roman"/>
+        </w:rPr>
+        <w:t xml:space="preserve">, </w:t>
+      </w:r>
+      <w:r>
+        <w:rPr>
+          <w:rFonts w:ascii="Courier New" w:cs="Courier New" w:eastAsia="Courier New" w:hAnsi="Courier New"/>
+          <w:sz w:val="19"/>
+          <w:szCs w:val="19"/>
+        </w:rPr>
+        <w:t xml:space="preserve">:table :row :c</w:t>
+      </w:r>
+      <w:r>
+        <w:rPr>
+          <w:rFonts w:ascii="Times New Roman" w:cs="Times New Roman" w:eastAsia="Times New Roman" w:hAnsi="Times New Roman"/>
+        </w:rPr>
+        <w:t xml:space="preserve">, highlighting </w:t>
+      </w:r>
+      <w:r>
+        <w:rPr>
+          <w:rFonts w:ascii="Courier New" w:cs="Courier New" w:eastAsia="Courier New" w:hAnsi="Courier New"/>
+          <w:sz w:val="19"/>
+          <w:szCs w:val="19"/>
+        </w:rPr>
+        <w:t xml:space="preserve">:hp1</w:t>
+      </w:r>
+      <w:r>
+        <w:rPr>
+          <w:rFonts w:ascii="Times New Roman" w:cs="Times New Roman" w:eastAsia="Times New Roman" w:hAnsi="Times New Roman"/>
+        </w:rPr>
+        <w:t xml:space="preserve">–</w:t>
+      </w:r>
+      <w:r>
+        <w:rPr>
+          <w:rFonts w:ascii="Courier New" w:cs="Courier New" w:eastAsia="Courier New" w:hAnsi="Courier New"/>
+          <w:sz w:val="19"/>
+          <w:szCs w:val="19"/>
+        </w:rPr>
+        <w:t xml:space="preserve">:hp3</w:t>
+      </w:r>
+      <w:r>
+        <w:rPr>
+          <w:rFonts w:ascii="Times New Roman" w:cs="Times New Roman" w:eastAsia="Times New Roman" w:hAnsi="Times New Roman"/>
+        </w:rPr>
+        <w:t xml:space="preserve">, </w:t>
+      </w:r>
+      <w:r>
+        <w:rPr>
+          <w:rFonts w:ascii="Courier New" w:cs="Courier New" w:eastAsia="Courier New" w:hAnsi="Courier New"/>
+          <w:sz w:val="19"/>
+          <w:szCs w:val="19"/>
+        </w:rPr>
+        <w:t xml:space="preserve">:q</w:t>
+      </w:r>
+      <w:r>
+        <w:rPr>
+          <w:rFonts w:ascii="Times New Roman" w:cs="Times New Roman" w:eastAsia="Times New Roman" w:hAnsi="Times New Roman"/>
+        </w:rPr>
+        <w:t xml:space="preserve">, </w:t>
+      </w:r>
+      <w:r>
+        <w:rPr>
+          <w:rFonts w:ascii="Courier New" w:cs="Courier New" w:eastAsia="Courier New" w:hAnsi="Courier New"/>
+          <w:sz w:val="19"/>
+          <w:szCs w:val="19"/>
+        </w:rPr>
+        <w:t xml:space="preserve">:xph</w:t>
+      </w:r>
+      <w:r>
+        <w:rPr>
+          <w:rFonts w:ascii="Times New Roman" w:cs="Times New Roman" w:eastAsia="Times New Roman" w:hAnsi="Times New Roman"/>
+        </w:rPr>
+        <w:t xml:space="preserve">, symbols such as </w:t>
+      </w:r>
+      <w:r>
+        <w:rPr>
+          <w:rFonts w:ascii="Courier New" w:cs="Courier New" w:eastAsia="Courier New" w:hAnsi="Courier New"/>
+          <w:sz w:val="19"/>
+          <w:szCs w:val="19"/>
+        </w:rPr>
+        <w:t xml:space="preserve">&amp;colon.</w:t>
+      </w:r>
+      <w:r>
+        <w:rPr>
+          <w:rFonts w:ascii="Times New Roman" w:cs="Times New Roman" w:eastAsia="Times New Roman" w:hAnsi="Times New Roman"/>
+        </w:rPr>
+        <w:t xml:space="preserve"> and </w:t>
+      </w:r>
+      <w:r>
+        <w:rPr>
+          <w:rFonts w:ascii="Courier New" w:cs="Courier New" w:eastAsia="Courier New" w:hAnsi="Courier New"/>
+          <w:sz w:val="19"/>
+          <w:szCs w:val="19"/>
+        </w:rPr>
+        <w:t xml:space="preserve">&amp;amp.</w:t>
+      </w:r>
+      <w:r>
+        <w:rPr>
+          <w:rFonts w:ascii="Times New Roman" w:cs="Times New Roman" w:eastAsia="Times New Roman" w:hAnsi="Times New Roman"/>
+        </w:rPr>
+        <w:t xml:space="preserve">, and the control words </w:t>
+      </w:r>
+      <w:r>
+        <w:rPr>
+          <w:rFonts w:ascii="Courier New" w:cs="Courier New" w:eastAsia="Courier New" w:hAnsi="Courier New"/>
+          <w:sz w:val="19"/>
+          <w:szCs w:val="19"/>
+        </w:rPr>
+        <w:t xml:space="preserve">.*</w:t>
+      </w:r>
+      <w:r>
+        <w:rPr>
+          <w:rFonts w:ascii="Times New Roman" w:cs="Times New Roman" w:eastAsia="Times New Roman" w:hAnsi="Times New Roman"/>
+        </w:rPr>
+        <w:t xml:space="preserve">, </w:t>
+      </w:r>
+      <w:r>
+        <w:rPr>
+          <w:rFonts w:ascii="Courier New" w:cs="Courier New" w:eastAsia="Courier New" w:hAnsi="Courier New"/>
+          <w:sz w:val="19"/>
+          <w:szCs w:val="19"/>
+        </w:rPr>
+        <w:t xml:space="preserve">.sp</w:t>
+      </w:r>
+      <w:r>
+        <w:rPr>
+          <w:rFonts w:ascii="Times New Roman" w:cs="Times New Roman" w:eastAsia="Times New Roman" w:hAnsi="Times New Roman"/>
+        </w:rPr>
+        <w:t xml:space="preserve">, </w:t>
+      </w:r>
+      <w:r>
+        <w:rPr>
+          <w:rFonts w:ascii="Courier New" w:cs="Courier New" w:eastAsia="Courier New" w:hAnsi="Courier New"/>
+          <w:sz w:val="19"/>
+          <w:szCs w:val="19"/>
+        </w:rPr>
+        <w:t xml:space="preserve">.br</w:t>
+      </w:r>
+      <w:r>
+        <w:rPr>
+          <w:rFonts w:ascii="Times New Roman" w:cs="Times New Roman" w:eastAsia="Times New Roman" w:hAnsi="Times New Roman"/>
+        </w:rPr>
+        <w:t xml:space="preserve">, </w:t>
+      </w:r>
+      <w:r>
+        <w:rPr>
+          <w:rFonts w:ascii="Courier New" w:cs="Courier New" w:eastAsia="Courier New" w:hAnsi="Courier New"/>
+          <w:sz w:val="19"/>
+          <w:szCs w:val="19"/>
+        </w:rPr>
+        <w:t xml:space="preserve">.pa</w:t>
+      </w:r>
+      <w:r>
+        <w:rPr>
+          <w:rFonts w:ascii="Times New Roman" w:cs="Times New Roman" w:eastAsia="Times New Roman" w:hAnsi="Times New Roman"/>
+        </w:rPr>
+        <w:t xml:space="preserve">, </w:t>
+      </w:r>
+      <w:r>
+        <w:rPr>
+          <w:rFonts w:ascii="Courier New" w:cs="Courier New" w:eastAsia="Courier New" w:hAnsi="Courier New"/>
+          <w:sz w:val="19"/>
+          <w:szCs w:val="19"/>
+        </w:rPr>
+        <w:t xml:space="preserve">.im</w:t>
       </w:r>
       <w:r>
         <w:rPr>
@@ -24038,7 +24020,7 @@
                 <w:sz w:val="17"/>
                 <w:szCs w:val="17"/>
               </w:rPr>
-              <w:t xml:space="preserve">bookie sample (ps</w:t>
+              <w:t xml:space="preserve">:h1.Introduction</w:t>
             </w:r>
           </w:p>
           <w:p>
@@ -24051,7 +24033,7 @@
                 <w:sz w:val="17"/>
                 <w:szCs w:val="17"/>
               </w:rPr>
-              <w:t xml:space="preserve">bookie: /var/spool/vmspool/out/operator/sample.ps, 12369 bytes, 5 page(s)</w:t>
+              <w:t xml:space="preserve">:p.This book is written in :hp2.BookMaster:ehp2. markup.</w:t>
             </w:r>
           </w:p>
           <w:p>
@@ -24064,7 +24046,7 @@
                 <w:sz w:val="17"/>
                 <w:szCs w:val="17"/>
               </w:rPr>
-              <w:t xml:space="preserve">BOOKIE: SAMPLE PS A, 354 lines</w:t>
+              <w:t xml:space="preserve">:ul.</w:t>
             </w:r>
           </w:p>
           <w:p>
@@ -24077,7 +24059,7 @@
                 <w:sz w:val="17"/>
                 <w:szCs w:val="17"/>
               </w:rPr>
-              <w:t xml:space="preserve">Ready;</w:t>
+              <w:t xml:space="preserve">:li.headings, paragraphs and highlighting;</w:t>
             </w:r>
           </w:p>
           <w:p>
@@ -24090,7 +24072,7 @@
                 <w:sz w:val="17"/>
                 <w:szCs w:val="17"/>
               </w:rPr>
-              <w:t xml:space="preserve">psprint sample</w:t>
+              <w:t xml:space="preserve">:li.lists, screens, figures and tables.</w:t>
             </w:r>
           </w:p>
           <w:p>
@@ -24103,20 +24085,7 @@
                 <w:sz w:val="17"/>
                 <w:szCs w:val="17"/>
               </w:rPr>
-              <w:t xml:space="preserve">PRT  00E OUTPUT OF OPERATOR FILE  = 0041 RECDS= 000355 COPY= 01  A PRT</w:t>
-            </w:r>
-          </w:p>
-          <w:p>
-            <w:pPr>
-              <w:spacing w:after="0" w:line="228"/>
-            </w:pPr>
-            <w:r>
-              <w:rPr>
-                <w:rFonts w:ascii="Courier New" w:cs="Courier New" w:eastAsia="Courier New" w:hAnsi="Courier New"/>
-                <w:sz w:val="17"/>
-                <w:szCs w:val="17"/>
-              </w:rPr>
-              <w:t xml:space="preserve">Ready;</w:t>
+              <w:t xml:space="preserve">:eul.</w:t>
             </w:r>
           </w:p>
         </w:tc>
@@ -24135,6 +24104,484 @@
           <w:szCs w:val="18"/>
         </w:rPr>
         <w:t xml:space="preserve">Figure 43. </w:t>
+      </w:r>
+      <w:r>
+        <w:rPr>
+          <w:rFonts w:ascii="Arial" w:cs="Arial" w:eastAsia="Arial" w:hAnsi="Arial"/>
+          <w:sz w:val="18"/>
+          <w:szCs w:val="18"/>
+        </w:rPr>
+        <w:t xml:space="preserve">BookMaster markup</w:t>
+      </w:r>
+    </w:p>
+    <w:p>
+      <w:pPr>
+        <w:pStyle w:val="Heading2"/>
+      </w:pPr>
+      <w:r>
+        <w:t xml:space="preserve">LaTeX</w:t>
+      </w:r>
+    </w:p>
+    <w:p>
+      <w:pPr>
+        <w:spacing w:after="120"/>
+      </w:pPr>
+      <w:r>
+        <w:rPr>
+          <w:rFonts w:ascii="Courier New" w:cs="Courier New" w:eastAsia="Courier New" w:hAnsi="Courier New"/>
+          <w:sz w:val="19"/>
+          <w:szCs w:val="19"/>
+        </w:rPr>
+        <w:t xml:space="preserve">LATEX fn [ft [fm]]</w:t>
+      </w:r>
+      <w:r>
+        <w:rPr>
+          <w:rFonts w:ascii="Times New Roman" w:cs="Times New Roman" w:eastAsia="Times New Roman" w:hAnsi="Times New Roman"/>
+        </w:rPr>
+        <w:t xml:space="preserve"> (file type TEX by default) runs LaTeX (pdfTeX, TeX Live 2023) twice, for the contents and references, and dvips; the PostScript comes back as </w:t>
+      </w:r>
+      <w:r>
+        <w:rPr>
+          <w:rFonts w:ascii="Courier New" w:cs="Courier New" w:eastAsia="Courier New" w:hAnsi="Courier New"/>
+          <w:sz w:val="19"/>
+          <w:szCs w:val="19"/>
+        </w:rPr>
+        <w:t xml:space="preserve">fn PS A</w:t>
+      </w:r>
+      <w:r>
+        <w:rPr>
+          <w:rFonts w:ascii="Times New Roman" w:cs="Times New Roman" w:eastAsia="Times New Roman" w:hAnsi="Times New Roman"/>
+        </w:rPr>
+        <w:t xml:space="preserve">. </w:t>
+      </w:r>
+      <w:r>
+        <w:rPr>
+          <w:rFonts w:ascii="Courier New" w:cs="Courier New" w:eastAsia="Courier New" w:hAnsi="Courier New"/>
+          <w:sz w:val="19"/>
+          <w:szCs w:val="19"/>
+        </w:rPr>
+        <w:t xml:space="preserve">LATEX fn (PDF</w:t>
+      </w:r>
+      <w:r>
+        <w:rPr>
+          <w:rFonts w:ascii="Times New Roman" w:cs="Times New Roman" w:eastAsia="Times New Roman" w:hAnsi="Times New Roman"/>
+        </w:rPr>
+        <w:t xml:space="preserve"> runs pdfLaTeX and leaves the PDF in the Debian guest. The packages are those of LaTeX itself, amsmath, graphics, tools, geometry and url; a run takes about a minute.</w:t>
+      </w:r>
+    </w:p>
+    <w:p>
+      <w:pPr>
+        <w:pStyle w:val="Heading2"/>
+      </w:pPr>
+      <w:r>
+        <w:t xml:space="preserve">Printing PostScript</w:t>
+      </w:r>
+    </w:p>
+    <w:p>
+      <w:pPr>
+        <w:spacing w:after="120"/>
+      </w:pPr>
+      <w:r>
+        <w:rPr>
+          <w:rFonts w:ascii="Courier New" w:cs="Courier New" w:eastAsia="Courier New" w:hAnsi="Courier New"/>
+          <w:sz w:val="19"/>
+          <w:szCs w:val="19"/>
+        </w:rPr>
+        <w:t xml:space="preserve">PSPRINT fn [ft [fm]]</w:t>
+      </w:r>
+      <w:r>
+        <w:rPr>
+          <w:rFonts w:ascii="Times New Roman" w:cs="Times New Roman" w:eastAsia="Times New Roman" w:hAnsi="Times New Roman"/>
+        </w:rPr>
+        <w:t xml:space="preserve"> (file type PS by default) prints a PostScript file. By default it goes to the virtual printer without page headers; CP’s printer 00E writes it on the PC, where </w:t>
+      </w:r>
+      <w:r>
+        <w:rPr>
+          <w:rFonts w:ascii="Courier New" w:cs="Courier New" w:eastAsia="Courier New" w:hAnsi="Courier New"/>
+          <w:sz w:val="19"/>
+          <w:szCs w:val="19"/>
+        </w:rPr>
+        <w:t xml:space="preserve">tools/psprint.py</w:t>
+      </w:r>
+      <w:r>
+        <w:rPr>
+          <w:rFonts w:ascii="Times New Roman" w:cs="Times New Roman" w:eastAsia="Times New Roman" w:hAnsi="Times New Roman"/>
+        </w:rPr>
+        <w:t xml:space="preserve"> takes each PostScript job out unchanged and hands it to the printer (lp, or a printer’s port 9100) or makes a PDF. With </w:t>
+      </w:r>
+      <w:r>
+        <w:rPr>
+          <w:rFonts w:ascii="Courier New" w:cs="Courier New" w:eastAsia="Courier New" w:hAnsi="Courier New"/>
+          <w:sz w:val="19"/>
+          <w:szCs w:val="19"/>
+        </w:rPr>
+        <w:t xml:space="preserve">(BRIDGE [format]</w:t>
+      </w:r>
+      <w:r>
+        <w:rPr>
+          <w:rFonts w:ascii="Times New Roman" w:cs="Times New Roman" w:eastAsia="Times New Roman" w:hAnsi="Times New Roman"/>
+        </w:rPr>
+        <w:t xml:space="preserve"> it goes through the spool bridge: Ghostscript in the Debian guest converts it to </w:t>
+      </w:r>
+      <w:r>
+        <w:rPr>
+          <w:rFonts w:ascii="Courier New" w:cs="Courier New" w:eastAsia="Courier New" w:hAnsi="Courier New"/>
+          <w:sz w:val="19"/>
+          <w:szCs w:val="19"/>
+        </w:rPr>
+        <w:t xml:space="preserve">ps</w:t>
+      </w:r>
+      <w:r>
+        <w:rPr>
+          <w:rFonts w:ascii="Times New Roman" w:cs="Times New Roman" w:eastAsia="Times New Roman" w:hAnsi="Times New Roman"/>
+        </w:rPr>
+        <w:t xml:space="preserve">, </w:t>
+      </w:r>
+      <w:r>
+        <w:rPr>
+          <w:rFonts w:ascii="Courier New" w:cs="Courier New" w:eastAsia="Courier New" w:hAnsi="Courier New"/>
+          <w:sz w:val="19"/>
+          <w:szCs w:val="19"/>
+        </w:rPr>
+        <w:t xml:space="preserve">pdf</w:t>
+      </w:r>
+      <w:r>
+        <w:rPr>
+          <w:rFonts w:ascii="Times New Roman" w:cs="Times New Roman" w:eastAsia="Times New Roman" w:hAnsi="Times New Roman"/>
+        </w:rPr>
+        <w:t xml:space="preserve">, </w:t>
+      </w:r>
+      <w:r>
+        <w:rPr>
+          <w:rFonts w:ascii="Courier New" w:cs="Courier New" w:eastAsia="Courier New" w:hAnsi="Courier New"/>
+          <w:sz w:val="19"/>
+          <w:szCs w:val="19"/>
+        </w:rPr>
+        <w:t xml:space="preserve">ljet4</w:t>
+      </w:r>
+      <w:r>
+        <w:rPr>
+          <w:rFonts w:ascii="Times New Roman" w:cs="Times New Roman" w:eastAsia="Times New Roman" w:hAnsi="Times New Roman"/>
+        </w:rPr>
+        <w:t xml:space="preserve">, </w:t>
+      </w:r>
+      <w:r>
+        <w:rPr>
+          <w:rFonts w:ascii="Courier New" w:cs="Courier New" w:eastAsia="Courier New" w:hAnsi="Courier New"/>
+          <w:sz w:val="19"/>
+          <w:szCs w:val="19"/>
+        </w:rPr>
+        <w:t xml:space="preserve">pxlmono</w:t>
+      </w:r>
+      <w:r>
+        <w:rPr>
+          <w:rFonts w:ascii="Times New Roman" w:cs="Times New Roman" w:eastAsia="Times New Roman" w:hAnsi="Times New Roman"/>
+        </w:rPr>
+        <w:t xml:space="preserve"> or </w:t>
+      </w:r>
+      <w:r>
+        <w:rPr>
+          <w:rFonts w:ascii="Courier New" w:cs="Courier New" w:eastAsia="Courier New" w:hAnsi="Courier New"/>
+          <w:sz w:val="19"/>
+          <w:szCs w:val="19"/>
+        </w:rPr>
+        <w:t xml:space="preserve">pxlcolor</w:t>
+      </w:r>
+      <w:r>
+        <w:rPr>
+          <w:rFonts w:ascii="Times New Roman" w:cs="Times New Roman" w:eastAsia="Times New Roman" w:hAnsi="Times New Roman"/>
+        </w:rPr>
+        <w:t xml:space="preserve"> and sends it to the printer named in </w:t>
+      </w:r>
+      <w:r>
+        <w:rPr>
+          <w:rFonts w:ascii="Courier New" w:cs="Courier New" w:eastAsia="Courier New" w:hAnsi="Courier New"/>
+          <w:sz w:val="19"/>
+          <w:szCs w:val="19"/>
+        </w:rPr>
+        <w:t xml:space="preserve">/etc/vmspool.d/print.conf</w:t>
+      </w:r>
+      <w:r>
+        <w:rPr>
+          <w:rFonts w:ascii="Times New Roman" w:cs="Times New Roman" w:eastAsia="Times New Roman" w:hAnsi="Times New Roman"/>
+        </w:rPr>
+        <w:t xml:space="preserve">.</w:t>
+      </w:r>
+    </w:p>
+    <w:p>
+      <w:pPr>
+        <w:spacing w:after="120"/>
+      </w:pPr>
+      <w:r>
+        <w:rPr>
+          <w:rFonts w:ascii="Times New Roman" w:cs="Times New Roman" w:eastAsia="Times New Roman" w:hAnsi="Times New Roman"/>
+        </w:rPr>
+        <w:t xml:space="preserve">On a newly installed system the real printer 00E is drained, so spooled print files wait. An operator starts it once with </w:t>
+      </w:r>
+      <w:r>
+        <w:rPr>
+          <w:rFonts w:ascii="Courier New" w:cs="Courier New" w:eastAsia="Courier New" w:hAnsi="Courier New"/>
+          <w:sz w:val="19"/>
+          <w:szCs w:val="19"/>
+        </w:rPr>
+        <w:t xml:space="preserve">START 00E</w:t>
+      </w:r>
+      <w:r>
+        <w:rPr>
+          <w:rFonts w:ascii="Times New Roman" w:cs="Times New Roman" w:eastAsia="Times New Roman" w:hAnsi="Times New Roman"/>
+        </w:rPr>
+        <w:t xml:space="preserve"> (from MAINT, or </w:t>
+      </w:r>
+      <w:r>
+        <w:rPr>
+          <w:rFonts w:ascii="Courier New" w:cs="Courier New" w:eastAsia="Courier New" w:hAnsi="Courier New"/>
+          <w:sz w:val="19"/>
+          <w:szCs w:val="19"/>
+        </w:rPr>
+        <w:t xml:space="preserve">vmcp start 00e</w:t>
+      </w:r>
+      <w:r>
+        <w:rPr>
+          <w:rFonts w:ascii="Times New Roman" w:cs="Times New Roman" w:eastAsia="Times New Roman" w:hAnsi="Times New Roman"/>
+        </w:rPr>
+        <w:t xml:space="preserve"> in the Debian guest). The EXECs of this chapter are on MAINT’s 19D disk, so they work under the usual </w:t>
+      </w:r>
+      <w:r>
+        <w:rPr>
+          <w:rFonts w:ascii="Courier New" w:cs="Courier New" w:eastAsia="Courier New" w:hAnsi="Courier New"/>
+          <w:sz w:val="19"/>
+          <w:szCs w:val="19"/>
+        </w:rPr>
+        <w:t xml:space="preserve">IPL CMS</w:t>
+      </w:r>
+      <w:r>
+        <w:rPr>
+          <w:rFonts w:ascii="Times New Roman" w:cs="Times New Roman" w:eastAsia="Times New Roman" w:hAnsi="Times New Roman"/>
+        </w:rPr>
+        <w:t xml:space="preserve">; the samples (</w:t>
+      </w:r>
+      <w:r>
+        <w:rPr>
+          <w:rFonts w:ascii="Courier New" w:cs="Courier New" w:eastAsia="Courier New" w:hAnsi="Courier New"/>
+          <w:sz w:val="19"/>
+          <w:szCs w:val="19"/>
+        </w:rPr>
+        <w:t xml:space="preserve">SAMPLE SCRIPT</w:t>
+      </w:r>
+      <w:r>
+        <w:rPr>
+          <w:rFonts w:ascii="Times New Roman" w:cs="Times New Roman" w:eastAsia="Times New Roman" w:hAnsi="Times New Roman"/>
+        </w:rPr>
+        <w:t xml:space="preserve">, </w:t>
+      </w:r>
+      <w:r>
+        <w:rPr>
+          <w:rFonts w:ascii="Courier New" w:cs="Courier New" w:eastAsia="Courier New" w:hAnsi="Courier New"/>
+          <w:sz w:val="19"/>
+          <w:szCs w:val="19"/>
+        </w:rPr>
+        <w:t xml:space="preserve">GUIDE SCRIPT</w:t>
+      </w:r>
+      <w:r>
+        <w:rPr>
+          <w:rFonts w:ascii="Times New Roman" w:cs="Times New Roman" w:eastAsia="Times New Roman" w:hAnsi="Times New Roman"/>
+        </w:rPr>
+        <w:t xml:space="preserve">, </w:t>
+      </w:r>
+      <w:r>
+        <w:rPr>
+          <w:rFonts w:ascii="Courier New" w:cs="Courier New" w:eastAsia="Courier New" w:hAnsi="Courier New"/>
+          <w:sz w:val="19"/>
+          <w:szCs w:val="19"/>
+        </w:rPr>
+        <w:t xml:space="preserve">HELLO TEX</w:t>
+      </w:r>
+      <w:r>
+        <w:rPr>
+          <w:rFonts w:ascii="Times New Roman" w:cs="Times New Roman" w:eastAsia="Times New Roman" w:hAnsi="Times New Roman"/>
+        </w:rPr>
+        <w:t xml:space="preserve">, </w:t>
+      </w:r>
+      <w:r>
+        <w:rPr>
+          <w:rFonts w:ascii="Courier New" w:cs="Courier New" w:eastAsia="Courier New" w:hAnsi="Courier New"/>
+          <w:sz w:val="19"/>
+          <w:szCs w:val="19"/>
+        </w:rPr>
+        <w:t xml:space="preserve">HELLO TROFF</w:t>
+      </w:r>
+      <w:r>
+        <w:rPr>
+          <w:rFonts w:ascii="Times New Roman" w:cs="Times New Roman" w:eastAsia="Times New Roman" w:hAnsi="Times New Roman"/>
+        </w:rPr>
+        <w:t xml:space="preserve">) are on the language disk, which uses EDF and needs the EC-mode CMS: </w:t>
+      </w:r>
+      <w:r>
+        <w:rPr>
+          <w:rFonts w:ascii="Courier New" w:cs="Courier New" w:eastAsia="Courier New" w:hAnsi="Courier New"/>
+          <w:sz w:val="19"/>
+          <w:szCs w:val="19"/>
+        </w:rPr>
+        <w:t xml:space="preserve">IPL 290</w:t>
+      </w:r>
+      <w:r>
+        <w:rPr>
+          <w:rFonts w:ascii="Times New Roman" w:cs="Times New Roman" w:eastAsia="Times New Roman" w:hAnsi="Times New Roman"/>
+        </w:rPr>
+        <w:t xml:space="preserve">, then </w:t>
+      </w:r>
+      <w:r>
+        <w:rPr>
+          <w:rFonts w:ascii="Courier New" w:cs="Courier New" w:eastAsia="Courier New" w:hAnsi="Courier New"/>
+          <w:sz w:val="19"/>
+          <w:szCs w:val="19"/>
+        </w:rPr>
+        <w:t xml:space="preserve">LANG</w:t>
+      </w:r>
+      <w:r>
+        <w:rPr>
+          <w:rFonts w:ascii="Times New Roman" w:cs="Times New Roman" w:eastAsia="Times New Roman" w:hAnsi="Times New Roman"/>
+        </w:rPr>
+        <w:t xml:space="preserve">.</w:t>
+      </w:r>
+    </w:p>
+    <w:tbl>
+      <w:tblPr>
+        <w:tblW w:type="dxa" w:w="9638"/>
+        <w:tblBorders>
+          <w:top w:val="single" w:color="auto" w:sz="4"/>
+          <w:left w:val="single" w:color="auto" w:sz="4"/>
+          <w:bottom w:val="single" w:color="auto" w:sz="4"/>
+          <w:right w:val="single" w:color="auto" w:sz="4"/>
+          <w:insideH w:val="single" w:color="auto" w:sz="4"/>
+          <w:insideV w:val="single" w:color="auto" w:sz="4"/>
+        </w:tblBorders>
+      </w:tblPr>
+      <w:tblGrid>
+        <w:gridCol w:w="9638"/>
+      </w:tblGrid>
+      <w:tr>
+        <w:trPr>
+          <w:cantSplit/>
+        </w:trPr>
+        <w:tc>
+          <w:tcPr>
+            <w:tcW w:type="dxa" w:w="9638"/>
+            <w:shd w:fill="F2F2F2" w:color="auto" w:val="clear"/>
+            <w:tcMar>
+              <w:top w:type="dxa" w:w="100"/>
+              <w:left w:type="dxa" w:w="140"/>
+              <w:bottom w:type="dxa" w:w="100"/>
+              <w:right w:type="dxa" w:w="140"/>
+            </w:tcMar>
+          </w:tcPr>
+          <w:p>
+            <w:pPr>
+              <w:spacing w:after="0" w:line="228"/>
+            </w:pPr>
+            <w:r>
+              <w:rPr>
+                <w:rFonts w:ascii="Courier New" w:cs="Courier New" w:eastAsia="Courier New" w:hAnsi="Courier New"/>
+                <w:sz w:val="17"/>
+                <w:szCs w:val="17"/>
+              </w:rPr>
+              <w:t xml:space="preserve">bookie sample (ps</w:t>
+            </w:r>
+          </w:p>
+          <w:p>
+            <w:pPr>
+              <w:spacing w:after="0" w:line="228"/>
+            </w:pPr>
+            <w:r>
+              <w:rPr>
+                <w:rFonts w:ascii="Courier New" w:cs="Courier New" w:eastAsia="Courier New" w:hAnsi="Courier New"/>
+                <w:sz w:val="17"/>
+                <w:szCs w:val="17"/>
+              </w:rPr>
+              <w:t xml:space="preserve">bookie: /var/spool/vmspool/out/operator/sample.ps, 12369 bytes, 5 page(s)</w:t>
+            </w:r>
+          </w:p>
+          <w:p>
+            <w:pPr>
+              <w:spacing w:after="0" w:line="228"/>
+            </w:pPr>
+            <w:r>
+              <w:rPr>
+                <w:rFonts w:ascii="Courier New" w:cs="Courier New" w:eastAsia="Courier New" w:hAnsi="Courier New"/>
+                <w:sz w:val="17"/>
+                <w:szCs w:val="17"/>
+              </w:rPr>
+              <w:t xml:space="preserve">BOOKIE: SAMPLE PS A, 354 lines</w:t>
+            </w:r>
+          </w:p>
+          <w:p>
+            <w:pPr>
+              <w:spacing w:after="0" w:line="228"/>
+            </w:pPr>
+            <w:r>
+              <w:rPr>
+                <w:rFonts w:ascii="Courier New" w:cs="Courier New" w:eastAsia="Courier New" w:hAnsi="Courier New"/>
+                <w:sz w:val="17"/>
+                <w:szCs w:val="17"/>
+              </w:rPr>
+              <w:t xml:space="preserve">Ready;</w:t>
+            </w:r>
+          </w:p>
+          <w:p>
+            <w:pPr>
+              <w:spacing w:after="0" w:line="228"/>
+            </w:pPr>
+            <w:r>
+              <w:rPr>
+                <w:rFonts w:ascii="Courier New" w:cs="Courier New" w:eastAsia="Courier New" w:hAnsi="Courier New"/>
+                <w:sz w:val="17"/>
+                <w:szCs w:val="17"/>
+              </w:rPr>
+              <w:t xml:space="preserve">psprint sample</w:t>
+            </w:r>
+          </w:p>
+          <w:p>
+            <w:pPr>
+              <w:spacing w:after="0" w:line="228"/>
+            </w:pPr>
+            <w:r>
+              <w:rPr>
+                <w:rFonts w:ascii="Courier New" w:cs="Courier New" w:eastAsia="Courier New" w:hAnsi="Courier New"/>
+                <w:sz w:val="17"/>
+                <w:szCs w:val="17"/>
+              </w:rPr>
+              <w:t xml:space="preserve">PRT  00E OUTPUT OF OPERATOR FILE  = 0041 RECDS= 000355 COPY= 01  A PRT</w:t>
+            </w:r>
+          </w:p>
+          <w:p>
+            <w:pPr>
+              <w:spacing w:after="0" w:line="228"/>
+            </w:pPr>
+            <w:r>
+              <w:rPr>
+                <w:rFonts w:ascii="Courier New" w:cs="Courier New" w:eastAsia="Courier New" w:hAnsi="Courier New"/>
+                <w:sz w:val="17"/>
+                <w:szCs w:val="17"/>
+              </w:rPr>
+              <w:t xml:space="preserve">Ready;</w:t>
+            </w:r>
+          </w:p>
+        </w:tc>
+      </w:tr>
+    </w:tbl>
+    <w:p>
+      <w:pPr>
+        <w:spacing w:after="200" w:before="80"/>
+      </w:pPr>
+      <w:r>
+        <w:rPr>
+          <w:rFonts w:ascii="Arial" w:cs="Arial" w:eastAsia="Arial" w:hAnsi="Arial"/>
+          <w:b/>
+          <w:bCs/>
+          <w:sz w:val="18"/>
+          <w:szCs w:val="18"/>
+        </w:rPr>
+        <w:t xml:space="preserve">Figure 44. </w:t>
       </w:r>
       <w:r>
         <w:rPr>
@@ -25298,7 +25745,7 @@
           <w:sz w:val="18"/>
           <w:szCs w:val="18"/>
         </w:rPr>
-        <w:t xml:space="preserve">Figure 44. </w:t>
+        <w:t xml:space="preserve">Figure 45. </w:t>
       </w:r>
       <w:r>
         <w:rPr>
@@ -25397,7 +25844,7 @@
           <w:sz w:val="18"/>
           <w:szCs w:val="18"/>
         </w:rPr>
-        <w:t xml:space="preserve">Figure 45. </w:t>
+        <w:t xml:space="preserve">Figure 46. </w:t>
       </w:r>
       <w:r>
         <w:rPr>
@@ -25540,7 +25987,7 @@
           <w:sz w:val="18"/>
           <w:szCs w:val="18"/>
         </w:rPr>
-        <w:t xml:space="preserve">Figure 46. </w:t>
+        <w:t xml:space="preserve">Figure 47. </w:t>
       </w:r>
       <w:r>
         <w:rPr>
@@ -25812,7 +26259,7 @@
           <w:sz w:val="18"/>
           <w:szCs w:val="18"/>
         </w:rPr>
-        <w:t xml:space="preserve">Figure 47. </w:t>
+        <w:t xml:space="preserve">Figure 48. </w:t>
       </w:r>
       <w:r>
         <w:rPr>
@@ -26054,7 +26501,7 @@
           <w:sz w:val="18"/>
           <w:szCs w:val="18"/>
         </w:rPr>
-        <w:t xml:space="preserve">Figure 48. </w:t>
+        <w:t xml:space="preserve">Figure 49. </w:t>
       </w:r>
       <w:r>
         <w:rPr>
@@ -26131,7 +26578,7 @@
           <w:sz w:val="18"/>
           <w:szCs w:val="18"/>
         </w:rPr>
-        <w:t xml:space="preserve">Figure 49. </w:t>
+        <w:t xml:space="preserve">Figure 50. </w:t>
       </w:r>
       <w:r>
         <w:rPr>
@@ -26261,7 +26708,7 @@
           <w:sz w:val="18"/>
           <w:szCs w:val="18"/>
         </w:rPr>
-        <w:t xml:space="preserve">Figure 50. </w:t>
+        <w:t xml:space="preserve">Figure 51. </w:t>
       </w:r>
       <w:r>
         <w:rPr>
@@ -26435,7 +26882,7 @@
           <w:sz w:val="18"/>
           <w:szCs w:val="18"/>
         </w:rPr>
-        <w:t xml:space="preserve">Figure 51. </w:t>
+        <w:t xml:space="preserve">Figure 52. </w:t>
       </w:r>
       <w:r>
         <w:rPr>
@@ -26525,7 +26972,7 @@
           <w:sz w:val="18"/>
           <w:szCs w:val="18"/>
         </w:rPr>
-        <w:t xml:space="preserve">Figure 52. </w:t>
+        <w:t xml:space="preserve">Figure 53. </w:t>
       </w:r>
       <w:r>
         <w:rPr>
@@ -27272,7 +27719,7 @@
           <w:sz w:val="18"/>
           <w:szCs w:val="18"/>
         </w:rPr>
-        <w:t xml:space="preserve">Figure 53. </w:t>
+        <w:t xml:space="preserve">Figure 54. </w:t>
       </w:r>
       <w:r>
         <w:rPr>
@@ -27374,7 +27821,7 @@
           <w:sz w:val="18"/>
           <w:szCs w:val="18"/>
         </w:rPr>
-        <w:t xml:space="preserve">Figure 54. </w:t>
+        <w:t xml:space="preserve">Figure 55. </w:t>
       </w:r>
       <w:r>
         <w:rPr>
@@ -27549,7 +27996,7 @@
           <w:sz w:val="18"/>
           <w:szCs w:val="18"/>
         </w:rPr>
-        <w:t xml:space="preserve">Figure 55. </w:t>
+        <w:t xml:space="preserve">Figure 56. </w:t>
       </w:r>
       <w:r>
         <w:rPr>
@@ -27626,7 +28073,7 @@
           <w:sz w:val="18"/>
           <w:szCs w:val="18"/>
         </w:rPr>
-        <w:t xml:space="preserve">Figure 56. </w:t>
+        <w:t xml:space="preserve">Figure 57. </w:t>
       </w:r>
       <w:r>
         <w:rPr>
@@ -27906,7 +28353,7 @@
           <w:sz w:val="18"/>
           <w:szCs w:val="18"/>
         </w:rPr>
-        <w:t xml:space="preserve">Figure 57. </w:t>
+        <w:t xml:space="preserve">Figure 58. </w:t>
       </w:r>
       <w:r>
         <w:rPr>
@@ -28035,7 +28482,7 @@
           <w:sz w:val="18"/>
           <w:szCs w:val="18"/>
         </w:rPr>
-        <w:t xml:space="preserve">Figure 58. </w:t>
+        <w:t xml:space="preserve">Figure 59. </w:t>
       </w:r>
       <w:r>
         <w:rPr>
@@ -28267,7 +28714,7 @@
           <w:sz w:val="18"/>
           <w:szCs w:val="18"/>
         </w:rPr>
-        <w:t xml:space="preserve">Figure 59. </w:t>
+        <w:t xml:space="preserve">Figure 60. </w:t>
       </w:r>
       <w:r>
         <w:rPr>
@@ -28411,6 +28858,117 @@
           <w:rFonts w:ascii="Times New Roman" w:cs="Times New Roman" w:eastAsia="Times New Roman" w:hAnsi="Times New Roman"/>
         </w:rPr>
         <w:t xml:space="preserve"> (Info-ZIP zip 3.0 and unzip 6.0; gzip format from zlib).</w:t>
+      </w:r>
+    </w:p>
+    <w:p>
+      <w:pPr>
+        <w:pStyle w:val="Heading2"/>
+      </w:pPr>
+      <w:r>
+        <w:t xml:space="preserve">CPM</w:t>
+      </w:r>
+    </w:p>
+    <w:p>
+      <w:pPr>
+        <w:spacing w:after="120"/>
+      </w:pPr>
+      <w:r>
+        <w:rPr>
+          <w:rFonts w:ascii="Courier New" w:cs="Courier New" w:eastAsia="Courier New" w:hAnsi="Courier New"/>
+          <w:sz w:val="19"/>
+          <w:szCs w:val="19"/>
+        </w:rPr>
+        <w:t xml:space="preserve">CPM</w:t>
+      </w:r>
+      <w:r>
+        <w:rPr>
+          <w:rFonts w:ascii="Times New Roman" w:cs="Times New Roman" w:eastAsia="Times New Roman" w:hAnsi="Times New Roman"/>
+        </w:rPr>
+        <w:t xml:space="preserve">, </w:t>
+      </w:r>
+      <w:r>
+        <w:rPr>
+          <w:rFonts w:ascii="Courier New" w:cs="Courier New" w:eastAsia="Courier New" w:hAnsi="Courier New"/>
+          <w:sz w:val="19"/>
+          <w:szCs w:val="19"/>
+        </w:rPr>
+        <w:t xml:space="preserve">CPM command [; command ...]</w:t>
+      </w:r>
+      <w:r>
+        <w:rPr>
+          <w:rFonts w:ascii="Times New Roman" w:cs="Times New Roman" w:eastAsia="Times New Roman" w:hAnsi="Times New Roman"/>
+        </w:rPr>
+        <w:t xml:space="preserve">, </w:t>
+      </w:r>
+      <w:r>
+        <w:rPr>
+          <w:rFonts w:ascii="Courier New" w:cs="Courier New" w:eastAsia="Courier New" w:hAnsi="Courier New"/>
+          <w:sz w:val="19"/>
+          <w:szCs w:val="19"/>
+        </w:rPr>
+        <w:t xml:space="preserve">CPM IMPORT|EXPORT fn ft [fm]</w:t>
+      </w:r>
+      <w:r>
+        <w:rPr>
+          <w:rFonts w:ascii="Times New Roman" w:cs="Times New Roman" w:eastAsia="Times New Roman" w:hAnsi="Times New Roman"/>
+        </w:rPr>
+        <w:t xml:space="preserve">; with </w:t>
+      </w:r>
+      <w:r>
+        <w:rPr>
+          <w:rFonts w:ascii="Courier New" w:cs="Courier New" w:eastAsia="Courier New" w:hAnsi="Courier New"/>
+          <w:sz w:val="19"/>
+          <w:szCs w:val="19"/>
+        </w:rPr>
+        <w:t xml:space="preserve">(LINUX</w:t>
+      </w:r>
+      <w:r>
+        <w:rPr>
+          <w:rFonts w:ascii="Times New Roman" w:cs="Times New Roman" w:eastAsia="Times New Roman" w:hAnsi="Times New Roman"/>
+        </w:rPr>
+        <w:t xml:space="preserve">: </w:t>
+      </w:r>
+      <w:r>
+        <w:rPr>
+          <w:rFonts w:ascii="Courier New" w:cs="Courier New" w:eastAsia="Courier New" w:hAnsi="Courier New"/>
+          <w:sz w:val="19"/>
+          <w:szCs w:val="19"/>
+        </w:rPr>
+        <w:t xml:space="preserve">CPM command (LINUX</w:t>
+      </w:r>
+      <w:r>
+        <w:rPr>
+          <w:rFonts w:ascii="Times New Roman" w:cs="Times New Roman" w:eastAsia="Times New Roman" w:hAnsi="Times New Roman"/>
+        </w:rPr>
+        <w:t xml:space="preserve">, </w:t>
+      </w:r>
+      <w:r>
+        <w:rPr>
+          <w:rFonts w:ascii="Courier New" w:cs="Courier New" w:eastAsia="Courier New" w:hAnsi="Courier New"/>
+          <w:sz w:val="19"/>
+          <w:szCs w:val="19"/>
+        </w:rPr>
+        <w:t xml:space="preserve">CPM PUT|GET fn ft (LINUX</w:t>
+      </w:r>
+      <w:r>
+        <w:rPr>
+          <w:rFonts w:ascii="Times New Roman" w:cs="Times New Roman" w:eastAsia="Times New Roman" w:hAnsi="Times New Roman"/>
+        </w:rPr>
+        <w:t xml:space="preserve">, </w:t>
+      </w:r>
+      <w:r>
+        <w:rPr>
+          <w:rFonts w:ascii="Courier New" w:cs="Courier New" w:eastAsia="Courier New" w:hAnsi="Courier New"/>
+          <w:sz w:val="19"/>
+          <w:szCs w:val="19"/>
+        </w:rPr>
+        <w:t xml:space="preserve">CPM DIR|RESET (LINUX</w:t>
+      </w:r>
+      <w:r>
+        <w:rPr>
+          <w:rFonts w:ascii="Times New Roman" w:cs="Times New Roman" w:eastAsia="Times New Roman" w:hAnsi="Times New Roman"/>
+        </w:rPr>
+        <w:t xml:space="preserve">.</w:t>
       </w:r>
     </w:p>
     <w:p>
@@ -28880,7 +29438,7 @@
           <w:sz w:val="18"/>
           <w:szCs w:val="18"/>
         </w:rPr>
-        <w:t xml:space="preserve">Figure 60. </w:t>
+        <w:t xml:space="preserve">Figure 61. </w:t>
       </w:r>
       <w:r>
         <w:rPr>
@@ -29588,7 +30146,7 @@
           <w:sz w:val="18"/>
           <w:szCs w:val="18"/>
         </w:rPr>
-        <w:t xml:space="preserve">Figure 61. </w:t>
+        <w:t xml:space="preserve">Figure 62. </w:t>
       </w:r>
       <w:r>
         <w:rPr>

</xml_diff>

<commit_message>
9.5: NICOF's GCC 13 tools on the language disk (NHFS31 HACC31 IPLOOK31 HTTPD31 NCTEST); Guide section on HTTPD and IPL 290
Verified run n31: LANGGEN made the modules, CMSUSER ran them from L.

Co-Authored-By: Claude Opus 5.5 <noreply@anthropic.com>
Claude-Session: https://claude.ai/code/session_01JBNU8KnKzXkgscse8vw6so
</commit_message>
<xml_diff>
--- a/arch/31bit/manual/VM370PLUS-Guide.docx
+++ b/arch/31bit/manual/VM370PLUS-Guide.docx
@@ -1233,7 +1233,7 @@
           <w:sz w:val="20"/>
           <w:szCs w:val="20"/>
         </w:rPr>
-        <w:t xml:space="preserve">	17</w:t>
+        <w:t xml:space="preserve">	18</w:t>
       </w:r>
     </w:p>
     <w:p>
@@ -3178,6 +3178,128 @@
           <w:rFonts w:ascii="Times New Roman" w:cs="Times New Roman" w:eastAsia="Times New Roman" w:hAnsi="Times New Roman"/>
         </w:rPr>
         <w:t xml:space="preserve">This edition is kept up to date as VM/370plus grows; each change is listed here, newest first.</w:t>
+      </w:r>
+    </w:p>
+    <w:p>
+      <w:pPr>
+        <w:pStyle w:val="ListParagraph"/>
+        <w:numPr>
+          <w:ilvl w:val="0"/>
+          <w:numId w:val="2"/>
+        </w:numPr>
+        <w:spacing w:after="60"/>
+      </w:pPr>
+      <w:r>
+        <w:rPr>
+          <w:rFonts w:ascii="Times New Roman" w:cs="Times New Roman" w:eastAsia="Times New Roman" w:hAnsi="Times New Roman"/>
+          <w:b/>
+          <w:bCs/>
+        </w:rPr>
+        <w:t xml:space="preserve">13 October 2026, night.</w:t>
+      </w:r>
+      <w:r>
+        <w:rPr>
+          <w:rFonts w:ascii="Times New Roman" w:cs="Times New Roman" w:eastAsia="Times New Roman" w:hAnsi="Times New Roman"/>
+        </w:rPr>
+        <w:t xml:space="preserve"> NICOF’s tools for the EC-mode CMS, built with GCC 13, on the language disk: </w:t>
+      </w:r>
+      <w:r>
+        <w:rPr>
+          <w:rFonts w:ascii="Courier New" w:cs="Courier New" w:eastAsia="Courier New" w:hAnsi="Courier New"/>
+          <w:sz w:val="19"/>
+          <w:szCs w:val="19"/>
+        </w:rPr>
+        <w:t xml:space="preserve">NHFS31</w:t>
+      </w:r>
+      <w:r>
+        <w:rPr>
+          <w:rFonts w:ascii="Times New Roman" w:cs="Times New Roman" w:eastAsia="Times New Roman" w:hAnsi="Times New Roman"/>
+        </w:rPr>
+        <w:t xml:space="preserve">, </w:t>
+      </w:r>
+      <w:r>
+        <w:rPr>
+          <w:rFonts w:ascii="Courier New" w:cs="Courier New" w:eastAsia="Courier New" w:hAnsi="Courier New"/>
+          <w:sz w:val="19"/>
+          <w:szCs w:val="19"/>
+        </w:rPr>
+        <w:t xml:space="preserve">HACC31</w:t>
+      </w:r>
+      <w:r>
+        <w:rPr>
+          <w:rFonts w:ascii="Times New Roman" w:cs="Times New Roman" w:eastAsia="Times New Roman" w:hAnsi="Times New Roman"/>
+        </w:rPr>
+        <w:t xml:space="preserve">, </w:t>
+      </w:r>
+      <w:r>
+        <w:rPr>
+          <w:rFonts w:ascii="Courier New" w:cs="Courier New" w:eastAsia="Courier New" w:hAnsi="Courier New"/>
+          <w:sz w:val="19"/>
+          <w:szCs w:val="19"/>
+        </w:rPr>
+        <w:t xml:space="preserve">IPLOOK31</w:t>
+      </w:r>
+      <w:r>
+        <w:rPr>
+          <w:rFonts w:ascii="Times New Roman" w:cs="Times New Roman" w:eastAsia="Times New Roman" w:hAnsi="Times New Roman"/>
+        </w:rPr>
+        <w:t xml:space="preserve">, the web server </w:t>
+      </w:r>
+      <w:r>
+        <w:rPr>
+          <w:rFonts w:ascii="Courier New" w:cs="Courier New" w:eastAsia="Courier New" w:hAnsi="Courier New"/>
+          <w:sz w:val="19"/>
+          <w:szCs w:val="19"/>
+        </w:rPr>
+        <w:t xml:space="preserve">HTTPD31</w:t>
+      </w:r>
+      <w:r>
+        <w:rPr>
+          <w:rFonts w:ascii="Times New Roman" w:cs="Times New Roman" w:eastAsia="Times New Roman" w:hAnsi="Times New Roman"/>
+        </w:rPr>
+        <w:t xml:space="preserve"> and </w:t>
+      </w:r>
+      <w:r>
+        <w:rPr>
+          <w:rFonts w:ascii="Courier New" w:cs="Courier New" w:eastAsia="Courier New" w:hAnsi="Courier New"/>
+          <w:sz w:val="19"/>
+          <w:szCs w:val="19"/>
+        </w:rPr>
+        <w:t xml:space="preserve">NCTEST</w:t>
+      </w:r>
+      <w:r>
+        <w:rPr>
+          <w:rFonts w:ascii="Times New Roman" w:cs="Times New Roman" w:eastAsia="Times New Roman" w:hAnsi="Times New Roman"/>
+        </w:rPr>
+        <w:t xml:space="preserve"> (Chapter 6). NICOF programs no longer wait forever under </w:t>
+      </w:r>
+      <w:r>
+        <w:rPr>
+          <w:rFonts w:ascii="Courier New" w:cs="Courier New" w:eastAsia="Courier New" w:hAnsi="Courier New"/>
+          <w:sz w:val="19"/>
+          <w:szCs w:val="19"/>
+        </w:rPr>
+        <w:t xml:space="preserve">IPL 290</w:t>
+      </w:r>
+      <w:r>
+        <w:rPr>
+          <w:rFonts w:ascii="Times New Roman" w:cs="Times New Roman" w:eastAsia="Times New Roman" w:hAnsi="Times New Roman"/>
+        </w:rPr>
+        <w:t xml:space="preserve"> (I-285), and HX under </w:t>
+      </w:r>
+      <w:r>
+        <w:rPr>
+          <w:rFonts w:ascii="Courier New" w:cs="Courier New" w:eastAsia="Courier New" w:hAnsi="Courier New"/>
+          <w:sz w:val="19"/>
+          <w:szCs w:val="19"/>
+        </w:rPr>
+        <w:t xml:space="preserve">IPL 290</w:t>
+      </w:r>
+      <w:r>
+        <w:rPr>
+          <w:rFonts w:ascii="Times New Roman" w:cs="Times New Roman" w:eastAsia="Times New Roman" w:hAnsi="Times New Roman"/>
+        </w:rPr>
+        <w:t xml:space="preserve"> no longer ends in a disabled wait (I-286).</w:t>
       </w:r>
     </w:p>
     <w:p>
@@ -15530,10 +15652,175 @@
     </w:p>
     <w:p>
       <w:pPr>
-        <w:pStyle w:val="Heading2"/>
+        <w:spacing w:after="120"/>
       </w:pPr>
       <w:r>
-        <w:t xml:space="preserve">TELL</w:t>
+        <w:rPr>
+          <w:rFonts w:ascii="Times New Roman" w:cs="Times New Roman" w:eastAsia="Times New Roman" w:hAnsi="Times New Roman"/>
+        </w:rPr>
+        <w:t xml:space="preserve">The modules on NICOF’s disk are built with CE’s GCC and run under </w:t>
+      </w:r>
+      <w:r>
+        <w:rPr>
+          <w:rFonts w:ascii="Courier New" w:cs="Courier New" w:eastAsia="Courier New" w:hAnsi="Courier New"/>
+          <w:sz w:val="19"/>
+          <w:szCs w:val="19"/>
+        </w:rPr>
+        <w:t xml:space="preserve">IPL CMS</w:t>
+      </w:r>
+      <w:r>
+        <w:rPr>
+          <w:rFonts w:ascii="Times New Roman" w:cs="Times New Roman" w:eastAsia="Times New Roman" w:hAnsi="Times New Roman"/>
+        </w:rPr>
+        <w:t xml:space="preserve">. Under the EC-mode CMS (</w:t>
+      </w:r>
+      <w:r>
+        <w:rPr>
+          <w:rFonts w:ascii="Courier New" w:cs="Courier New" w:eastAsia="Courier New" w:hAnsi="Courier New"/>
+          <w:sz w:val="19"/>
+          <w:szCs w:val="19"/>
+        </w:rPr>
+        <w:t xml:space="preserve">IPL 290</w:t>
+      </w:r>
+      <w:r>
+        <w:rPr>
+          <w:rFonts w:ascii="Times New Roman" w:cs="Times New Roman" w:eastAsia="Times New Roman" w:hAnsi="Times New Roman"/>
+        </w:rPr>
+        <w:t xml:space="preserve">) use the versions on the language disk, built with GCC 13 (</w:t>
+      </w:r>
+      <w:r>
+        <w:rPr>
+          <w:rFonts w:ascii="Courier New" w:cs="Courier New" w:eastAsia="Courier New" w:hAnsi="Courier New"/>
+          <w:sz w:val="19"/>
+          <w:szCs w:val="19"/>
+        </w:rPr>
+        <w:t xml:space="preserve">LANG</w:t>
+      </w:r>
+      <w:r>
+        <w:rPr>
+          <w:rFonts w:ascii="Times New Roman" w:cs="Times New Roman" w:eastAsia="Times New Roman" w:hAnsi="Times New Roman"/>
+        </w:rPr>
+        <w:t xml:space="preserve"> first): </w:t>
+      </w:r>
+      <w:r>
+        <w:rPr>
+          <w:rFonts w:ascii="Courier New" w:cs="Courier New" w:eastAsia="Courier New" w:hAnsi="Courier New"/>
+          <w:sz w:val="19"/>
+          <w:szCs w:val="19"/>
+        </w:rPr>
+        <w:t xml:space="preserve">NHFS31</w:t>
+      </w:r>
+      <w:r>
+        <w:rPr>
+          <w:rFonts w:ascii="Times New Roman" w:cs="Times New Roman" w:eastAsia="Times New Roman" w:hAnsi="Times New Roman"/>
+        </w:rPr>
+        <w:t xml:space="preserve"> and </w:t>
+      </w:r>
+      <w:r>
+        <w:rPr>
+          <w:rFonts w:ascii="Courier New" w:cs="Courier New" w:eastAsia="Courier New" w:hAnsi="Courier New"/>
+          <w:sz w:val="19"/>
+          <w:szCs w:val="19"/>
+        </w:rPr>
+        <w:t xml:space="preserve">HACC31</w:t>
+      </w:r>
+      <w:r>
+        <w:rPr>
+          <w:rFonts w:ascii="Times New Roman" w:cs="Times New Roman" w:eastAsia="Times New Roman" w:hAnsi="Times New Roman"/>
+        </w:rPr>
+        <w:t xml:space="preserve"> (the same commands as NHFS and HACC), </w:t>
+      </w:r>
+      <w:r>
+        <w:rPr>
+          <w:rFonts w:ascii="Courier New" w:cs="Courier New" w:eastAsia="Courier New" w:hAnsi="Courier New"/>
+          <w:sz w:val="19"/>
+          <w:szCs w:val="19"/>
+        </w:rPr>
+        <w:t xml:space="preserve">IPLOOK31 name</w:t>
+      </w:r>
+      <w:r>
+        <w:rPr>
+          <w:rFonts w:ascii="Times New Roman" w:cs="Times New Roman" w:eastAsia="Times New Roman" w:hAnsi="Times New Roman"/>
+        </w:rPr>
+        <w:t xml:space="preserve"> (a name or address lookup through the PC), </w:t>
+      </w:r>
+      <w:r>
+        <w:rPr>
+          <w:rFonts w:ascii="Courier New" w:cs="Courier New" w:eastAsia="Courier New" w:hAnsi="Courier New"/>
+          <w:sz w:val="19"/>
+          <w:szCs w:val="19"/>
+        </w:rPr>
+        <w:t xml:space="preserve">HTTPD31</w:t>
+      </w:r>
+      <w:r>
+        <w:rPr>
+          <w:rFonts w:ascii="Times New Roman" w:cs="Times New Roman" w:eastAsia="Times New Roman" w:hAnsi="Times New Roman"/>
+        </w:rPr>
+        <w:t xml:space="preserve"> and </w:t>
+      </w:r>
+      <w:r>
+        <w:rPr>
+          <w:rFonts w:ascii="Courier New" w:cs="Courier New" w:eastAsia="Courier New" w:hAnsi="Courier New"/>
+          <w:sz w:val="19"/>
+          <w:szCs w:val="19"/>
+        </w:rPr>
+        <w:t xml:space="preserve">NCTEST</w:t>
+      </w:r>
+      <w:r>
+        <w:rPr>
+          <w:rFonts w:ascii="Times New Roman" w:cs="Times New Roman" w:eastAsia="Times New Roman" w:hAnsi="Times New Roman"/>
+        </w:rPr>
+        <w:t xml:space="preserve">. CMS cuts every argument to 8 characters, so </w:t>
+      </w:r>
+      <w:r>
+        <w:rPr>
+          <w:rFonts w:ascii="Courier New" w:cs="Courier New" w:eastAsia="Courier New" w:hAnsi="Courier New"/>
+          <w:sz w:val="19"/>
+          <w:szCs w:val="19"/>
+        </w:rPr>
+        <w:t xml:space="preserve">IPLOOK31 localhost</w:t>
+      </w:r>
+      <w:r>
+        <w:rPr>
+          <w:rFonts w:ascii="Times New Roman" w:cs="Times New Roman" w:eastAsia="Times New Roman" w:hAnsi="Times New Roman"/>
+        </w:rPr>
+        <w:t xml:space="preserve"> asks for </w:t>
+      </w:r>
+      <w:r>
+        <w:rPr>
+          <w:rFonts w:ascii="Courier New" w:cs="Courier New" w:eastAsia="Courier New" w:hAnsi="Courier New"/>
+          <w:sz w:val="19"/>
+          <w:szCs w:val="19"/>
+        </w:rPr>
+        <w:t xml:space="preserve">localhos</w:t>
+      </w:r>
+      <w:r>
+        <w:rPr>
+          <w:rFonts w:ascii="Times New Roman" w:cs="Times New Roman" w:eastAsia="Times New Roman" w:hAnsi="Times New Roman"/>
+        </w:rPr>
+        <w:t xml:space="preserve">; </w:t>
+      </w:r>
+      <w:r>
+        <w:rPr>
+          <w:rFonts w:ascii="Courier New" w:cs="Courier New" w:eastAsia="Courier New" w:hAnsi="Courier New"/>
+          <w:sz w:val="19"/>
+          <w:szCs w:val="19"/>
+        </w:rPr>
+        <w:t xml:space="preserve">IPLOOK31 -ME</w:t>
+      </w:r>
+      <w:r>
+        <w:rPr>
+          <w:rFonts w:ascii="Times New Roman" w:cs="Times New Roman" w:eastAsia="Times New Roman" w:hAnsi="Times New Roman"/>
+        </w:rPr>
+        <w:t xml:space="preserve"> gives the PC’s own name.</w:t>
+      </w:r>
+    </w:p>
+    <w:p>
+      <w:pPr>
+        <w:pStyle w:val="Heading3"/>
+      </w:pPr>
+      <w:r>
+        <w:t xml:space="preserve">HTTPD: a web server for a CMS disk</w:t>
       </w:r>
     </w:p>
     <w:p>
@@ -15546,186 +15833,153 @@
           <w:sz w:val="19"/>
           <w:szCs w:val="19"/>
         </w:rPr>
-        <w:t xml:space="preserve">TELL userid message</w:t>
-      </w:r>
-      <w:r>
-        <w:rPr>
-          <w:rFonts w:ascii="Times New Roman" w:cs="Times New Roman" w:eastAsia="Times New Roman" w:hAnsi="Times New Roman"/>
-        </w:rPr>
-        <w:t xml:space="preserve"> sends a message to a VM/370 user (CP MSG). </w:t>
-      </w:r>
-      <w:r>
-        <w:rPr>
-          <w:rFonts w:ascii="Courier New" w:cs="Courier New" w:eastAsia="Courier New" w:hAnsi="Courier New"/>
-          <w:sz w:val="19"/>
-          <w:szCs w:val="19"/>
-        </w:rPr>
-        <w:t xml:space="preserve">TELL user AT LINUX message</w:t>
-      </w:r>
-      <w:r>
-        <w:rPr>
-          <w:rFonts w:ascii="Times New Roman" w:cs="Times New Roman" w:eastAsia="Times New Roman" w:hAnsi="Times New Roman"/>
-        </w:rPr>
-        <w:t xml:space="preserve"> sends it to a user of the Debian guest through the spool bridge: it appears on that user’s terminals, and is kept until the user reads it with </w:t>
-      </w:r>
-      <w:r>
-        <w:rPr>
-          <w:rFonts w:ascii="Courier New" w:cs="Courier New" w:eastAsia="Courier New" w:hAnsi="Courier New"/>
-          <w:sz w:val="19"/>
-          <w:szCs w:val="19"/>
-        </w:rPr>
-        <w:t xml:space="preserve">tell</w:t>
-      </w:r>
-      <w:r>
-        <w:rPr>
-          <w:rFonts w:ascii="Times New Roman" w:cs="Times New Roman" w:eastAsia="Times New Roman" w:hAnsi="Times New Roman"/>
-        </w:rPr>
-        <w:t xml:space="preserve">. </w:t>
-      </w:r>
-      <w:r>
-        <w:rPr>
-          <w:rFonts w:ascii="Courier New" w:cs="Courier New" w:eastAsia="Courier New" w:hAnsi="Courier New"/>
-          <w:sz w:val="19"/>
-          <w:szCs w:val="19"/>
-        </w:rPr>
-        <w:t xml:space="preserve">TELL ALL AT LINUX message</w:t>
-      </w:r>
-      <w:r>
-        <w:rPr>
-          <w:rFonts w:ascii="Times New Roman" w:cs="Times New Roman" w:eastAsia="Times New Roman" w:hAnsi="Times New Roman"/>
-        </w:rPr>
-        <w:t xml:space="preserve"> reaches everybody logged on to Linux. A Linux user answers with </w:t>
-      </w:r>
-      <w:r>
-        <w:rPr>
-          <w:rFonts w:ascii="Courier New" w:cs="Courier New" w:eastAsia="Courier New" w:hAnsi="Courier New"/>
-          <w:sz w:val="19"/>
-          <w:szCs w:val="19"/>
-        </w:rPr>
-        <w:t xml:space="preserve">tell userid message</w:t>
-      </w:r>
-      <w:r>
-        <w:rPr>
-          <w:rFonts w:ascii="Times New Roman" w:cs="Times New Roman" w:eastAsia="Times New Roman" w:hAnsi="Times New Roman"/>
-        </w:rPr>
-        <w:t xml:space="preserve">, which arrives on CMS as </w:t>
-      </w:r>
-      <w:r>
-        <w:rPr>
-          <w:rFonts w:ascii="Courier New" w:cs="Courier New" w:eastAsia="Courier New" w:hAnsi="Courier New"/>
-          <w:sz w:val="19"/>
-          <w:szCs w:val="19"/>
-        </w:rPr>
-        <w:t xml:space="preserve">MSG FROM MAINT: (user) message</w:t>
-      </w:r>
-      <w:r>
-        <w:rPr>
-          <w:rFonts w:ascii="Times New Roman" w:cs="Times New Roman" w:eastAsia="Times New Roman" w:hAnsi="Times New Roman"/>
-        </w:rPr>
-        <w:t xml:space="preserve">.</w:t>
-      </w:r>
-    </w:p>
-    <w:p>
-      <w:pPr>
-        <w:spacing w:after="120"/>
-      </w:pPr>
-      <w:r>
-        <w:rPr>
-          <w:rFonts w:ascii="Courier New" w:cs="Courier New" w:eastAsia="Courier New" w:hAnsi="Courier New"/>
-          <w:sz w:val="19"/>
-          <w:szCs w:val="19"/>
-        </w:rPr>
-        <w:t xml:space="preserve">TELL user AT NET message</w:t>
-      </w:r>
-      <w:r>
-        <w:rPr>
-          <w:rFonts w:ascii="Times New Roman" w:cs="Times New Roman" w:eastAsia="Times New Roman" w:hAnsi="Times New Roman"/>
-        </w:rPr>
-        <w:t xml:space="preserve"> reaches a user on the internet. The message is published on the MQTT broker of the Debian guest as topic </w:t>
-      </w:r>
-      <w:r>
-        <w:rPr>
-          <w:rFonts w:ascii="Courier New" w:cs="Courier New" w:eastAsia="Courier New" w:hAnsi="Courier New"/>
-          <w:sz w:val="19"/>
-          <w:szCs w:val="19"/>
-        </w:rPr>
-        <w:t xml:space="preserve">vm/tell/out/user</w:t>
-      </w:r>
-      <w:r>
-        <w:rPr>
-          <w:rFonts w:ascii="Times New Roman" w:cs="Times New Roman" w:eastAsia="Times New Roman" w:hAnsi="Times New Roman"/>
-        </w:rPr>
-        <w:t xml:space="preserve">, which the user reads with any MQTT client. The user answers by publishing to </w:t>
-      </w:r>
-      <w:r>
-        <w:rPr>
-          <w:rFonts w:ascii="Courier New" w:cs="Courier New" w:eastAsia="Courier New" w:hAnsi="Courier New"/>
-          <w:sz w:val="19"/>
-          <w:szCs w:val="19"/>
-        </w:rPr>
-        <w:t xml:space="preserve">vm/tell/from/user/to/userid</w:t>
-      </w:r>
-      <w:r>
-        <w:rPr>
-          <w:rFonts w:ascii="Times New Roman" w:cs="Times New Roman" w:eastAsia="Times New Roman" w:hAnsi="Times New Roman"/>
-        </w:rPr>
-        <w:t xml:space="preserve">; it arrives as </w:t>
-      </w:r>
-      <w:r>
-        <w:rPr>
-          <w:rFonts w:ascii="Courier New" w:cs="Courier New" w:eastAsia="Courier New" w:hAnsi="Courier New"/>
-          <w:sz w:val="19"/>
-          <w:szCs w:val="19"/>
-        </w:rPr>
-        <w:t xml:space="preserve">MSG FROM MAINT: (net:user) message</w:t>
-      </w:r>
-      <w:r>
-        <w:rPr>
-          <w:rFonts w:ascii="Times New Roman" w:cs="Times New Roman" w:eastAsia="Times New Roman" w:hAnsi="Times New Roman"/>
-        </w:rPr>
-        <w:t xml:space="preserve">. Outside users need a login (</w:t>
-      </w:r>
-      <w:r>
-        <w:rPr>
-          <w:rFonts w:ascii="Courier New" w:cs="Courier New" w:eastAsia="Courier New" w:hAnsi="Courier New"/>
-          <w:sz w:val="19"/>
-          <w:szCs w:val="19"/>
-        </w:rPr>
-        <w:t xml:space="preserve">tellnet-user name password</w:t>
-      </w:r>
-      <w:r>
-        <w:rPr>
-          <w:rFonts w:ascii="Times New Roman" w:cs="Times New Roman" w:eastAsia="Times New Roman" w:hAnsi="Times New Roman"/>
-        </w:rPr>
-        <w:t xml:space="preserve"> in the guest) and may only use their own TELL topics. On the PC, </w:t>
-      </w:r>
-      <w:r>
-        <w:rPr>
-          <w:rFonts w:ascii="Courier New" w:cs="Courier New" w:eastAsia="Courier New" w:hAnsi="Courier New"/>
-          <w:sz w:val="19"/>
-          <w:szCs w:val="19"/>
-        </w:rPr>
-        <w:t xml:space="preserve">tools/netfwd.py --tls cert key 8883 10.1.1.2:1883</w:t>
-      </w:r>
-      <w:r>
-        <w:rPr>
-          <w:rFonts w:ascii="Times New Roman" w:cs="Times New Roman" w:eastAsia="Times New Roman" w:hAnsi="Times New Roman"/>
-        </w:rPr>
-        <w:t xml:space="preserve"> makes the broker reachable, encrypted; the router has to forward that port to the PC. </w:t>
-      </w:r>
-      <w:r>
-        <w:rPr>
-          <w:rFonts w:ascii="Courier New" w:cs="Courier New" w:eastAsia="Courier New" w:hAnsi="Courier New"/>
-          <w:sz w:val="19"/>
-          <w:szCs w:val="19"/>
-        </w:rPr>
-        <w:t xml:space="preserve">tools/nettell.py</w:t>
-      </w:r>
-      <w:r>
-        <w:rPr>
-          <w:rFonts w:ascii="Times New Roman" w:cs="Times New Roman" w:eastAsia="Times New Roman" w:hAnsi="Times New Roman"/>
-        </w:rPr>
-        <w:t xml:space="preserve"> is a small client for the outside user.</w:t>
+        <w:t xml:space="preserve">HTTPD31 -p port [-d fm] [-n count] [-k key] [-v]</w:t>
+      </w:r>
+      <w:r>
+        <w:rPr>
+          <w:rFonts w:ascii="Times New Roman" w:cs="Times New Roman" w:eastAsia="Times New Roman" w:hAnsi="Times New Roman"/>
+        </w:rPr>
+        <w:t xml:space="preserve"> serves the files of a CMS disk (default A) on the PC’s port: </w:t>
+      </w:r>
+      <w:r>
+        <w:rPr>
+          <w:rFonts w:ascii="Courier New" w:cs="Courier New" w:eastAsia="Courier New" w:hAnsi="Courier New"/>
+          <w:sz w:val="19"/>
+          <w:szCs w:val="19"/>
+        </w:rPr>
+        <w:t xml:space="preserve">GET /fn.ft</w:t>
+      </w:r>
+      <w:r>
+        <w:rPr>
+          <w:rFonts w:ascii="Times New Roman" w:cs="Times New Roman" w:eastAsia="Times New Roman" w:hAnsi="Times New Roman"/>
+        </w:rPr>
+        <w:t xml:space="preserve"> sends </w:t>
+      </w:r>
+      <w:r>
+        <w:rPr>
+          <w:rFonts w:ascii="Courier New" w:cs="Courier New" w:eastAsia="Courier New" w:hAnsi="Courier New"/>
+          <w:sz w:val="19"/>
+          <w:szCs w:val="19"/>
+        </w:rPr>
+        <w:t xml:space="preserve">fn ft</w:t>
+      </w:r>
+      <w:r>
+        <w:rPr>
+          <w:rFonts w:ascii="Times New Roman" w:cs="Times New Roman" w:eastAsia="Times New Roman" w:hAnsi="Times New Roman"/>
+        </w:rPr>
+        <w:t xml:space="preserve">, text files as ASCII lines and GIF, PNG, JPG, ICO, PDF, ZIP and BIN files as their bytes; </w:t>
+      </w:r>
+      <w:r>
+        <w:rPr>
+          <w:rFonts w:ascii="Courier New" w:cs="Courier New" w:eastAsia="Courier New" w:hAnsi="Courier New"/>
+          <w:sz w:val="19"/>
+          <w:szCs w:val="19"/>
+        </w:rPr>
+        <w:t xml:space="preserve">GET /</w:t>
+      </w:r>
+      <w:r>
+        <w:rPr>
+          <w:rFonts w:ascii="Times New Roman" w:cs="Times New Roman" w:eastAsia="Times New Roman" w:hAnsi="Times New Roman"/>
+        </w:rPr>
+        <w:t xml:space="preserve"> sends </w:t>
+      </w:r>
+      <w:r>
+        <w:rPr>
+          <w:rFonts w:ascii="Courier New" w:cs="Courier New" w:eastAsia="Courier New" w:hAnsi="Courier New"/>
+          <w:sz w:val="19"/>
+          <w:szCs w:val="19"/>
+        </w:rPr>
+        <w:t xml:space="preserve">INDEX HTML</w:t>
+      </w:r>
+      <w:r>
+        <w:rPr>
+          <w:rFonts w:ascii="Times New Roman" w:cs="Times New Roman" w:eastAsia="Times New Roman" w:hAnsi="Times New Roman"/>
+        </w:rPr>
+        <w:t xml:space="preserve"> if the disk has one, otherwise a list of its files. </w:t>
+      </w:r>
+      <w:r>
+        <w:rPr>
+          <w:rFonts w:ascii="Courier New" w:cs="Courier New" w:eastAsia="Courier New" w:hAnsi="Courier New"/>
+          <w:sz w:val="19"/>
+          <w:szCs w:val="19"/>
+        </w:rPr>
+        <w:t xml:space="preserve">-n count</w:t>
+      </w:r>
+      <w:r>
+        <w:rPr>
+          <w:rFonts w:ascii="Times New Roman" w:cs="Times New Roman" w:eastAsia="Times New Roman" w:hAnsi="Times New Roman"/>
+        </w:rPr>
+        <w:t xml:space="preserve"> ends the server after so many requests, </w:t>
+      </w:r>
+      <w:r>
+        <w:rPr>
+          <w:rFonts w:ascii="Courier New" w:cs="Courier New" w:eastAsia="Courier New" w:hAnsi="Courier New"/>
+          <w:sz w:val="19"/>
+          <w:szCs w:val="19"/>
+        </w:rPr>
+        <w:t xml:space="preserve">-k key</w:t>
+      </w:r>
+      <w:r>
+        <w:rPr>
+          <w:rFonts w:ascii="Times New Roman" w:cs="Times New Roman" w:eastAsia="Times New Roman" w:hAnsi="Times New Roman"/>
+        </w:rPr>
+        <w:t xml:space="preserve"> lets </w:t>
+      </w:r>
+      <w:r>
+        <w:rPr>
+          <w:rFonts w:ascii="Courier New" w:cs="Courier New" w:eastAsia="Courier New" w:hAnsi="Courier New"/>
+          <w:sz w:val="19"/>
+          <w:szCs w:val="19"/>
+        </w:rPr>
+        <w:t xml:space="preserve">GET /.stop/key</w:t>
+      </w:r>
+      <w:r>
+        <w:rPr>
+          <w:rFonts w:ascii="Times New Roman" w:cs="Times New Roman" w:eastAsia="Times New Roman" w:hAnsi="Times New Roman"/>
+        </w:rPr>
+        <w:t xml:space="preserve"> end it. </w:t>
+      </w:r>
+      <w:r>
+        <w:rPr>
+          <w:rFonts w:ascii="Courier New" w:cs="Courier New" w:eastAsia="Courier New" w:hAnsi="Courier New"/>
+          <w:sz w:val="19"/>
+          <w:szCs w:val="19"/>
+        </w:rPr>
+        <w:t xml:space="preserve">INDEX HTML</w:t>
+      </w:r>
+      <w:r>
+        <w:rPr>
+          <w:rFonts w:ascii="Times New Roman" w:cs="Times New Roman" w:eastAsia="Times New Roman" w:hAnsi="Times New Roman"/>
+        </w:rPr>
+        <w:t xml:space="preserve"> on the language disk is a small example page. (</w:t>
+      </w:r>
+      <w:r>
+        <w:rPr>
+          <w:rFonts w:ascii="Courier New" w:cs="Courier New" w:eastAsia="Courier New" w:hAnsi="Courier New"/>
+          <w:sz w:val="19"/>
+          <w:szCs w:val="19"/>
+        </w:rPr>
+        <w:t xml:space="preserve">HTTPD</w:t>
+      </w:r>
+      <w:r>
+        <w:rPr>
+          <w:rFonts w:ascii="Times New Roman" w:cs="Times New Roman" w:eastAsia="Times New Roman" w:hAnsi="Times New Roman"/>
+        </w:rPr>
+        <w:t xml:space="preserve"> for IPL CMS, built with CE’s GCC, is in </w:t>
+      </w:r>
+      <w:r>
+        <w:rPr>
+          <w:rFonts w:ascii="Courier New" w:cs="Courier New" w:eastAsia="Courier New" w:hAnsi="Courier New"/>
+          <w:sz w:val="19"/>
+          <w:szCs w:val="19"/>
+        </w:rPr>
+        <w:t xml:space="preserve">vm370plus/nicof/httpd</w:t>
+      </w:r>
+      <w:r>
+        <w:rPr>
+          <w:rFonts w:ascii="Times New Roman" w:cs="Times New Roman" w:eastAsia="Times New Roman" w:hAnsi="Times New Roman"/>
+        </w:rPr>
+        <w:t xml:space="preserve">.)</w:t>
       </w:r>
     </w:p>
     <w:tbl>
@@ -15768,7 +16022,7 @@
                 <w:sz w:val="17"/>
                 <w:szCs w:val="17"/>
               </w:rPr>
-              <w:t xml:space="preserve">mqtt sub vm/test 1 20</w:t>
+              <w:t xml:space="preserve">httpd31 -p 8080 -k bye</w:t>
             </w:r>
           </w:p>
           <w:p>
@@ -15781,20 +16035,7 @@
                 <w:sz w:val="17"/>
                 <w:szCs w:val="17"/>
               </w:rPr>
-              <w:t xml:space="preserve">vm/test hello from linux</w:t>
-            </w:r>
-          </w:p>
-          <w:p>
-            <w:pPr>
-              <w:spacing w:after="0" w:line="228"/>
-            </w:pPr>
-            <w:r>
-              <w:rPr>
-                <w:rFonts w:ascii="Courier New" w:cs="Courier New" w:eastAsia="Courier New" w:hAnsi="Courier New"/>
-                <w:sz w:val="17"/>
-                <w:szCs w:val="17"/>
-              </w:rPr>
-              <w:t xml:space="preserve">Ready;</w:t>
+              <w:t xml:space="preserve">HTTPD: serving the A disk on port 8080</w:t>
             </w:r>
           </w:p>
         </w:tc>
@@ -15820,7 +16061,74 @@
           <w:sz w:val="18"/>
           <w:szCs w:val="18"/>
         </w:rPr>
-        <w:t xml:space="preserve">A message from Linux arrives on CMS</w:t>
+        <w:t xml:space="preserve">A web server on CMS; on the PC, http://localhost:8080/</w:t>
+      </w:r>
+    </w:p>
+    <w:p>
+      <w:pPr>
+        <w:spacing w:after="120"/>
+      </w:pPr>
+      <w:r>
+        <w:rPr>
+          <w:rFonts w:ascii="Times New Roman" w:cs="Times New Roman" w:eastAsia="Times New Roman" w:hAnsi="Times New Roman"/>
+        </w:rPr>
+        <w:t xml:space="preserve">A program that ends abnormally (HX, an abend) leaves its sockets in NICOF’s proxy: a server port stays in use until </w:t>
+      </w:r>
+      <w:r>
+        <w:rPr>
+          <w:rFonts w:ascii="Courier New" w:cs="Courier New" w:eastAsia="Courier New" w:hAnsi="Courier New"/>
+          <w:sz w:val="19"/>
+          <w:szCs w:val="19"/>
+        </w:rPr>
+        <w:t xml:space="preserve">nicof.sh stop</w:t>
+      </w:r>
+      <w:r>
+        <w:rPr>
+          <w:rFonts w:ascii="Times New Roman" w:cs="Times New Roman" w:eastAsia="Times New Roman" w:hAnsi="Times New Roman"/>
+        </w:rPr>
+        <w:t xml:space="preserve"> and </w:t>
+      </w:r>
+      <w:r>
+        <w:rPr>
+          <w:rFonts w:ascii="Courier New" w:cs="Courier New" w:eastAsia="Courier New" w:hAnsi="Courier New"/>
+          <w:sz w:val="19"/>
+          <w:szCs w:val="19"/>
+        </w:rPr>
+        <w:t xml:space="preserve">start</w:t>
+      </w:r>
+      <w:r>
+        <w:rPr>
+          <w:rFonts w:ascii="Times New Roman" w:cs="Times New Roman" w:eastAsia="Times New Roman" w:hAnsi="Times New Roman"/>
+        </w:rPr>
+        <w:t xml:space="preserve"> on the PC. End HTTPD with </w:t>
+      </w:r>
+      <w:r>
+        <w:rPr>
+          <w:rFonts w:ascii="Courier New" w:cs="Courier New" w:eastAsia="Courier New" w:hAnsi="Courier New"/>
+          <w:sz w:val="19"/>
+          <w:szCs w:val="19"/>
+        </w:rPr>
+        <w:t xml:space="preserve">-n</w:t>
+      </w:r>
+      <w:r>
+        <w:rPr>
+          <w:rFonts w:ascii="Times New Roman" w:cs="Times New Roman" w:eastAsia="Times New Roman" w:hAnsi="Times New Roman"/>
+        </w:rPr>
+        <w:t xml:space="preserve"> or </w:t>
+      </w:r>
+      <w:r>
+        <w:rPr>
+          <w:rFonts w:ascii="Courier New" w:cs="Courier New" w:eastAsia="Courier New" w:hAnsi="Courier New"/>
+          <w:sz w:val="19"/>
+          <w:szCs w:val="19"/>
+        </w:rPr>
+        <w:t xml:space="preserve">-k</w:t>
+      </w:r>
+      <w:r>
+        <w:rPr>
+          <w:rFonts w:ascii="Times New Roman" w:cs="Times New Roman" w:eastAsia="Times New Roman" w:hAnsi="Times New Roman"/>
+        </w:rPr>
+        <w:t xml:space="preserve"> when you can.</w:t>
       </w:r>
     </w:p>
     <w:p>
@@ -15828,7 +16136,7 @@
         <w:pStyle w:val="Heading2"/>
       </w:pPr>
       <w:r>
-        <w:t xml:space="preserve">RXPIP: REXX packages</w:t>
+        <w:t xml:space="preserve">TELL</w:t>
       </w:r>
     </w:p>
     <w:p>
@@ -15837,37 +16145,87 @@
       </w:pPr>
       <w:r>
         <w:rPr>
-          <w:rFonts w:ascii="Times New Roman" w:cs="Times New Roman" w:eastAsia="Times New Roman" w:hAnsi="Times New Roman"/>
-        </w:rPr>
-        <w:t xml:space="preserve">RXPIP is the package manager of rexxpository: REXX routines are published as packages, and a program names what it needs with </w:t>
-      </w:r>
-      <w:r>
-        <w:rPr>
-          <w:rFonts w:ascii="Courier New" w:cs="Courier New" w:eastAsia="Courier New" w:hAnsi="Courier New"/>
-          <w:sz w:val="19"/>
-          <w:szCs w:val="19"/>
-        </w:rPr>
-        <w:t xml:space="preserve">/* REQUIRE pkg */</w:t>
-      </w:r>
-      <w:r>
-        <w:rPr>
-          <w:rFonts w:ascii="Times New Roman" w:cs="Times New Roman" w:eastAsia="Times New Roman" w:hAnsi="Times New Roman"/>
-        </w:rPr>
-        <w:t xml:space="preserve"> comments. The repository server and the rxpip client run in the Debian guest; the bridge service </w:t>
-      </w:r>
-      <w:r>
-        <w:rPr>
-          <w:rFonts w:ascii="Courier New" w:cs="Courier New" w:eastAsia="Courier New" w:hAnsi="Courier New"/>
-          <w:sz w:val="19"/>
-          <w:szCs w:val="19"/>
-        </w:rPr>
-        <w:t xml:space="preserve">rxpip</w:t>
-      </w:r>
-      <w:r>
-        <w:rPr>
-          <w:rFonts w:ascii="Times New Roman" w:cs="Times New Roman" w:eastAsia="Times New Roman" w:hAnsi="Times New Roman"/>
-        </w:rPr>
-        <w:t xml:space="preserve"> serves CMS users.</w:t>
+          <w:rFonts w:ascii="Courier New" w:cs="Courier New" w:eastAsia="Courier New" w:hAnsi="Courier New"/>
+          <w:sz w:val="19"/>
+          <w:szCs w:val="19"/>
+        </w:rPr>
+        <w:t xml:space="preserve">TELL userid message</w:t>
+      </w:r>
+      <w:r>
+        <w:rPr>
+          <w:rFonts w:ascii="Times New Roman" w:cs="Times New Roman" w:eastAsia="Times New Roman" w:hAnsi="Times New Roman"/>
+        </w:rPr>
+        <w:t xml:space="preserve"> sends a message to a VM/370 user (CP MSG). </w:t>
+      </w:r>
+      <w:r>
+        <w:rPr>
+          <w:rFonts w:ascii="Courier New" w:cs="Courier New" w:eastAsia="Courier New" w:hAnsi="Courier New"/>
+          <w:sz w:val="19"/>
+          <w:szCs w:val="19"/>
+        </w:rPr>
+        <w:t xml:space="preserve">TELL user AT LINUX message</w:t>
+      </w:r>
+      <w:r>
+        <w:rPr>
+          <w:rFonts w:ascii="Times New Roman" w:cs="Times New Roman" w:eastAsia="Times New Roman" w:hAnsi="Times New Roman"/>
+        </w:rPr>
+        <w:t xml:space="preserve"> sends it to a user of the Debian guest through the spool bridge: it appears on that user’s terminals, and is kept until the user reads it with </w:t>
+      </w:r>
+      <w:r>
+        <w:rPr>
+          <w:rFonts w:ascii="Courier New" w:cs="Courier New" w:eastAsia="Courier New" w:hAnsi="Courier New"/>
+          <w:sz w:val="19"/>
+          <w:szCs w:val="19"/>
+        </w:rPr>
+        <w:t xml:space="preserve">tell</w:t>
+      </w:r>
+      <w:r>
+        <w:rPr>
+          <w:rFonts w:ascii="Times New Roman" w:cs="Times New Roman" w:eastAsia="Times New Roman" w:hAnsi="Times New Roman"/>
+        </w:rPr>
+        <w:t xml:space="preserve">. </w:t>
+      </w:r>
+      <w:r>
+        <w:rPr>
+          <w:rFonts w:ascii="Courier New" w:cs="Courier New" w:eastAsia="Courier New" w:hAnsi="Courier New"/>
+          <w:sz w:val="19"/>
+          <w:szCs w:val="19"/>
+        </w:rPr>
+        <w:t xml:space="preserve">TELL ALL AT LINUX message</w:t>
+      </w:r>
+      <w:r>
+        <w:rPr>
+          <w:rFonts w:ascii="Times New Roman" w:cs="Times New Roman" w:eastAsia="Times New Roman" w:hAnsi="Times New Roman"/>
+        </w:rPr>
+        <w:t xml:space="preserve"> reaches everybody logged on to Linux. A Linux user answers with </w:t>
+      </w:r>
+      <w:r>
+        <w:rPr>
+          <w:rFonts w:ascii="Courier New" w:cs="Courier New" w:eastAsia="Courier New" w:hAnsi="Courier New"/>
+          <w:sz w:val="19"/>
+          <w:szCs w:val="19"/>
+        </w:rPr>
+        <w:t xml:space="preserve">tell userid message</w:t>
+      </w:r>
+      <w:r>
+        <w:rPr>
+          <w:rFonts w:ascii="Times New Roman" w:cs="Times New Roman" w:eastAsia="Times New Roman" w:hAnsi="Times New Roman"/>
+        </w:rPr>
+        <w:t xml:space="preserve">, which arrives on CMS as </w:t>
+      </w:r>
+      <w:r>
+        <w:rPr>
+          <w:rFonts w:ascii="Courier New" w:cs="Courier New" w:eastAsia="Courier New" w:hAnsi="Courier New"/>
+          <w:sz w:val="19"/>
+          <w:szCs w:val="19"/>
+        </w:rPr>
+        <w:t xml:space="preserve">MSG FROM MAINT: (user) message</w:t>
+      </w:r>
+      <w:r>
+        <w:rPr>
+          <w:rFonts w:ascii="Times New Roman" w:cs="Times New Roman" w:eastAsia="Times New Roman" w:hAnsi="Times New Roman"/>
+        </w:rPr>
+        <w:t xml:space="preserve">.</w:t>
       </w:r>
     </w:p>
     <w:p>
@@ -15880,125 +16238,97 @@
           <w:sz w:val="19"/>
           <w:szCs w:val="19"/>
         </w:rPr>
-        <w:t xml:space="preserve">RXPIP AVAIL</w:t>
-      </w:r>
-      <w:r>
-        <w:rPr>
-          <w:rFonts w:ascii="Times New Roman" w:cs="Times New Roman" w:eastAsia="Times New Roman" w:hAnsi="Times New Roman"/>
-        </w:rPr>
-        <w:t xml:space="preserve">, </w:t>
-      </w:r>
-      <w:r>
-        <w:rPr>
-          <w:rFonts w:ascii="Courier New" w:cs="Courier New" w:eastAsia="Courier New" w:hAnsi="Courier New"/>
-          <w:sz w:val="19"/>
-          <w:szCs w:val="19"/>
-        </w:rPr>
-        <w:t xml:space="preserve">RXPIP SEARCH term</w:t>
-      </w:r>
-      <w:r>
-        <w:rPr>
-          <w:rFonts w:ascii="Times New Roman" w:cs="Times New Roman" w:eastAsia="Times New Roman" w:hAnsi="Times New Roman"/>
-        </w:rPr>
-        <w:t xml:space="preserve"> and </w:t>
-      </w:r>
-      <w:r>
-        <w:rPr>
-          <w:rFonts w:ascii="Courier New" w:cs="Courier New" w:eastAsia="Courier New" w:hAnsi="Courier New"/>
-          <w:sz w:val="19"/>
-          <w:szCs w:val="19"/>
-        </w:rPr>
-        <w:t xml:space="preserve">RXPIP SHOW name</w:t>
-      </w:r>
-      <w:r>
-        <w:rPr>
-          <w:rFonts w:ascii="Times New Roman" w:cs="Times New Roman" w:eastAsia="Times New Roman" w:hAnsi="Times New Roman"/>
-        </w:rPr>
-        <w:t xml:space="preserve"> ask the repository. </w:t>
-      </w:r>
-      <w:r>
-        <w:rPr>
-          <w:rFonts w:ascii="Courier New" w:cs="Courier New" w:eastAsia="Courier New" w:hAnsi="Courier New"/>
-          <w:sz w:val="19"/>
-          <w:szCs w:val="19"/>
-        </w:rPr>
-        <w:t xml:space="preserve">RXPIP BUILD fn</w:t>
-      </w:r>
-      <w:r>
-        <w:rPr>
-          <w:rFonts w:ascii="Times New Roman" w:cs="Times New Roman" w:eastAsia="Times New Roman" w:hAnsi="Times New Roman"/>
-        </w:rPr>
-        <w:t xml:space="preserve"> takes </w:t>
-      </w:r>
-      <w:r>
-        <w:rPr>
-          <w:rFonts w:ascii="Courier New" w:cs="Courier New" w:eastAsia="Courier New" w:hAnsi="Courier New"/>
-          <w:sz w:val="19"/>
-          <w:szCs w:val="19"/>
-        </w:rPr>
-        <w:t xml:space="preserve">fn REXX</w:t>
-      </w:r>
-      <w:r>
-        <w:rPr>
-          <w:rFonts w:ascii="Times New Roman" w:cs="Times New Roman" w:eastAsia="Times New Roman" w:hAnsi="Times New Roman"/>
-        </w:rPr>
-        <w:t xml:space="preserve">, installs the packages it requires and writes </w:t>
-      </w:r>
-      <w:r>
-        <w:rPr>
-          <w:rFonts w:ascii="Courier New" w:cs="Courier New" w:eastAsia="Courier New" w:hAnsi="Courier New"/>
-          <w:sz w:val="19"/>
-          <w:szCs w:val="19"/>
-        </w:rPr>
-        <w:t xml:space="preserve">fn EXEC A</w:t>
-      </w:r>
-      <w:r>
-        <w:rPr>
-          <w:rFonts w:ascii="Times New Roman" w:cs="Times New Roman" w:eastAsia="Times New Roman" w:hAnsi="Times New Roman"/>
-        </w:rPr>
-        <w:t xml:space="preserve">, a standalone program with the packages merged in; </w:t>
-      </w:r>
-      <w:r>
-        <w:rPr>
-          <w:rFonts w:ascii="Courier New" w:cs="Courier New" w:eastAsia="Courier New" w:hAnsi="Courier New"/>
-          <w:sz w:val="19"/>
-          <w:szCs w:val="19"/>
-        </w:rPr>
-        <w:t xml:space="preserve">RXPIP RUN fn [args]</w:t>
-      </w:r>
-      <w:r>
-        <w:rPr>
-          <w:rFonts w:ascii="Times New Roman" w:cs="Times New Roman" w:eastAsia="Times New Roman" w:hAnsi="Times New Roman"/>
-        </w:rPr>
-        <w:t xml:space="preserve"> builds and runs it. </w:t>
-      </w:r>
-      <w:r>
-        <w:rPr>
-          <w:rFonts w:ascii="Courier New" w:cs="Courier New" w:eastAsia="Courier New" w:hAnsi="Courier New"/>
-          <w:sz w:val="19"/>
-          <w:szCs w:val="19"/>
-        </w:rPr>
-        <w:t xml:space="preserve">RXPIP GET name</w:t>
-      </w:r>
-      <w:r>
-        <w:rPr>
-          <w:rFonts w:ascii="Times New Roman" w:cs="Times New Roman" w:eastAsia="Times New Roman" w:hAnsi="Times New Roman"/>
-        </w:rPr>
-        <w:t xml:space="preserve"> fetches a package as </w:t>
-      </w:r>
-      <w:r>
-        <w:rPr>
-          <w:rFonts w:ascii="Courier New" w:cs="Courier New" w:eastAsia="Courier New" w:hAnsi="Courier New"/>
-          <w:sz w:val="19"/>
-          <w:szCs w:val="19"/>
-        </w:rPr>
-        <w:t xml:space="preserve">file REXX A</w:t>
-      </w:r>
-      <w:r>
-        <w:rPr>
-          <w:rFonts w:ascii="Times New Roman" w:cs="Times New Roman" w:eastAsia="Times New Roman" w:hAnsi="Times New Roman"/>
-        </w:rPr>
-        <w:t xml:space="preserve">.</w:t>
+        <w:t xml:space="preserve">TELL user AT NET message</w:t>
+      </w:r>
+      <w:r>
+        <w:rPr>
+          <w:rFonts w:ascii="Times New Roman" w:cs="Times New Roman" w:eastAsia="Times New Roman" w:hAnsi="Times New Roman"/>
+        </w:rPr>
+        <w:t xml:space="preserve"> reaches a user on the internet. The message is published on the MQTT broker of the Debian guest as topic </w:t>
+      </w:r>
+      <w:r>
+        <w:rPr>
+          <w:rFonts w:ascii="Courier New" w:cs="Courier New" w:eastAsia="Courier New" w:hAnsi="Courier New"/>
+          <w:sz w:val="19"/>
+          <w:szCs w:val="19"/>
+        </w:rPr>
+        <w:t xml:space="preserve">vm/tell/out/user</w:t>
+      </w:r>
+      <w:r>
+        <w:rPr>
+          <w:rFonts w:ascii="Times New Roman" w:cs="Times New Roman" w:eastAsia="Times New Roman" w:hAnsi="Times New Roman"/>
+        </w:rPr>
+        <w:t xml:space="preserve">, which the user reads with any MQTT client. The user answers by publishing to </w:t>
+      </w:r>
+      <w:r>
+        <w:rPr>
+          <w:rFonts w:ascii="Courier New" w:cs="Courier New" w:eastAsia="Courier New" w:hAnsi="Courier New"/>
+          <w:sz w:val="19"/>
+          <w:szCs w:val="19"/>
+        </w:rPr>
+        <w:t xml:space="preserve">vm/tell/from/user/to/userid</w:t>
+      </w:r>
+      <w:r>
+        <w:rPr>
+          <w:rFonts w:ascii="Times New Roman" w:cs="Times New Roman" w:eastAsia="Times New Roman" w:hAnsi="Times New Roman"/>
+        </w:rPr>
+        <w:t xml:space="preserve">; it arrives as </w:t>
+      </w:r>
+      <w:r>
+        <w:rPr>
+          <w:rFonts w:ascii="Courier New" w:cs="Courier New" w:eastAsia="Courier New" w:hAnsi="Courier New"/>
+          <w:sz w:val="19"/>
+          <w:szCs w:val="19"/>
+        </w:rPr>
+        <w:t xml:space="preserve">MSG FROM MAINT: (net:user) message</w:t>
+      </w:r>
+      <w:r>
+        <w:rPr>
+          <w:rFonts w:ascii="Times New Roman" w:cs="Times New Roman" w:eastAsia="Times New Roman" w:hAnsi="Times New Roman"/>
+        </w:rPr>
+        <w:t xml:space="preserve">. Outside users need a login (</w:t>
+      </w:r>
+      <w:r>
+        <w:rPr>
+          <w:rFonts w:ascii="Courier New" w:cs="Courier New" w:eastAsia="Courier New" w:hAnsi="Courier New"/>
+          <w:sz w:val="19"/>
+          <w:szCs w:val="19"/>
+        </w:rPr>
+        <w:t xml:space="preserve">tellnet-user name password</w:t>
+      </w:r>
+      <w:r>
+        <w:rPr>
+          <w:rFonts w:ascii="Times New Roman" w:cs="Times New Roman" w:eastAsia="Times New Roman" w:hAnsi="Times New Roman"/>
+        </w:rPr>
+        <w:t xml:space="preserve"> in the guest) and may only use their own TELL topics. On the PC, </w:t>
+      </w:r>
+      <w:r>
+        <w:rPr>
+          <w:rFonts w:ascii="Courier New" w:cs="Courier New" w:eastAsia="Courier New" w:hAnsi="Courier New"/>
+          <w:sz w:val="19"/>
+          <w:szCs w:val="19"/>
+        </w:rPr>
+        <w:t xml:space="preserve">tools/netfwd.py --tls cert key 8883 10.1.1.2:1883</w:t>
+      </w:r>
+      <w:r>
+        <w:rPr>
+          <w:rFonts w:ascii="Times New Roman" w:cs="Times New Roman" w:eastAsia="Times New Roman" w:hAnsi="Times New Roman"/>
+        </w:rPr>
+        <w:t xml:space="preserve"> makes the broker reachable, encrypted; the router has to forward that port to the PC. </w:t>
+      </w:r>
+      <w:r>
+        <w:rPr>
+          <w:rFonts w:ascii="Courier New" w:cs="Courier New" w:eastAsia="Courier New" w:hAnsi="Courier New"/>
+          <w:sz w:val="19"/>
+          <w:szCs w:val="19"/>
+        </w:rPr>
+        <w:t xml:space="preserve">tools/nettell.py</w:t>
+      </w:r>
+      <w:r>
+        <w:rPr>
+          <w:rFonts w:ascii="Times New Roman" w:cs="Times New Roman" w:eastAsia="Times New Roman" w:hAnsi="Times New Roman"/>
+        </w:rPr>
+        <w:t xml:space="preserve"> is a small client for the outside user.</w:t>
       </w:r>
     </w:p>
     <w:tbl>
@@ -16041,7 +16371,7 @@
                 <w:sz w:val="17"/>
                 <w:szCs w:val="17"/>
               </w:rPr>
-              <w:t xml:space="preserve">rxpip run demo</w:t>
+              <w:t xml:space="preserve">mqtt sub vm/test 1 20</w:t>
             </w:r>
           </w:p>
           <w:p>
@@ -16054,59 +16384,7 @@
                 <w:sz w:val="17"/>
                 <w:szCs w:val="17"/>
               </w:rPr>
-              <w:t xml:space="preserve">rxpip: mathutils 1.0.0 already installed</w:t>
-            </w:r>
-          </w:p>
-          <w:p>
-            <w:pPr>
-              <w:spacing w:after="0" w:line="228"/>
-            </w:pPr>
-            <w:r>
-              <w:rPr>
-                <w:rFonts w:ascii="Courier New" w:cs="Courier New" w:eastAsia="Courier New" w:hAnsi="Courier New"/>
-                <w:sz w:val="17"/>
-                <w:szCs w:val="17"/>
-              </w:rPr>
-              <w:t xml:space="preserve">rxpip: greetutils 1.0.0 already installed</w:t>
-            </w:r>
-          </w:p>
-          <w:p>
-            <w:pPr>
-              <w:spacing w:after="0" w:line="228"/>
-            </w:pPr>
-            <w:r>
-              <w:rPr>
-                <w:rFonts w:ascii="Courier New" w:cs="Courier New" w:eastAsia="Courier New" w:hAnsi="Courier New"/>
-                <w:sz w:val="17"/>
-                <w:szCs w:val="17"/>
-              </w:rPr>
-              <w:t xml:space="preserve">RXPIP: DEMO EXEC A written, 71 lines</w:t>
-            </w:r>
-          </w:p>
-          <w:p>
-            <w:pPr>
-              <w:spacing w:after="0" w:line="228"/>
-            </w:pPr>
-            <w:r>
-              <w:rPr>
-                <w:rFonts w:ascii="Courier New" w:cs="Courier New" w:eastAsia="Courier New" w:hAnsi="Courier New"/>
-                <w:sz w:val="17"/>
-                <w:szCs w:val="17"/>
-              </w:rPr>
-              <w:t xml:space="preserve">HELLO, WORLD!!!</w:t>
-            </w:r>
-          </w:p>
-          <w:p>
-            <w:pPr>
-              <w:spacing w:after="0" w:line="228"/>
-            </w:pPr>
-            <w:r>
-              <w:rPr>
-                <w:rFonts w:ascii="Courier New" w:cs="Courier New" w:eastAsia="Courier New" w:hAnsi="Courier New"/>
-                <w:sz w:val="17"/>
-                <w:szCs w:val="17"/>
-              </w:rPr>
-              <w:t xml:space="preserve">square of 7 is 49</w:t>
+              <w:t xml:space="preserve">vm/test hello from linux</w:t>
             </w:r>
           </w:p>
           <w:p>
@@ -16138,6 +16416,331 @@
           <w:szCs w:val="18"/>
         </w:rPr>
         <w:t xml:space="preserve">Figure 27. </w:t>
+      </w:r>
+      <w:r>
+        <w:rPr>
+          <w:rFonts w:ascii="Arial" w:cs="Arial" w:eastAsia="Arial" w:hAnsi="Arial"/>
+          <w:sz w:val="18"/>
+          <w:szCs w:val="18"/>
+        </w:rPr>
+        <w:t xml:space="preserve">A message from Linux arrives on CMS</w:t>
+      </w:r>
+    </w:p>
+    <w:p>
+      <w:pPr>
+        <w:pStyle w:val="Heading2"/>
+      </w:pPr>
+      <w:r>
+        <w:t xml:space="preserve">RXPIP: REXX packages</w:t>
+      </w:r>
+    </w:p>
+    <w:p>
+      <w:pPr>
+        <w:spacing w:after="120"/>
+      </w:pPr>
+      <w:r>
+        <w:rPr>
+          <w:rFonts w:ascii="Times New Roman" w:cs="Times New Roman" w:eastAsia="Times New Roman" w:hAnsi="Times New Roman"/>
+        </w:rPr>
+        <w:t xml:space="preserve">RXPIP is the package manager of rexxpository: REXX routines are published as packages, and a program names what it needs with </w:t>
+      </w:r>
+      <w:r>
+        <w:rPr>
+          <w:rFonts w:ascii="Courier New" w:cs="Courier New" w:eastAsia="Courier New" w:hAnsi="Courier New"/>
+          <w:sz w:val="19"/>
+          <w:szCs w:val="19"/>
+        </w:rPr>
+        <w:t xml:space="preserve">/* REQUIRE pkg */</w:t>
+      </w:r>
+      <w:r>
+        <w:rPr>
+          <w:rFonts w:ascii="Times New Roman" w:cs="Times New Roman" w:eastAsia="Times New Roman" w:hAnsi="Times New Roman"/>
+        </w:rPr>
+        <w:t xml:space="preserve"> comments. The repository server and the rxpip client run in the Debian guest; the bridge service </w:t>
+      </w:r>
+      <w:r>
+        <w:rPr>
+          <w:rFonts w:ascii="Courier New" w:cs="Courier New" w:eastAsia="Courier New" w:hAnsi="Courier New"/>
+          <w:sz w:val="19"/>
+          <w:szCs w:val="19"/>
+        </w:rPr>
+        <w:t xml:space="preserve">rxpip</w:t>
+      </w:r>
+      <w:r>
+        <w:rPr>
+          <w:rFonts w:ascii="Times New Roman" w:cs="Times New Roman" w:eastAsia="Times New Roman" w:hAnsi="Times New Roman"/>
+        </w:rPr>
+        <w:t xml:space="preserve"> serves CMS users.</w:t>
+      </w:r>
+    </w:p>
+    <w:p>
+      <w:pPr>
+        <w:spacing w:after="120"/>
+      </w:pPr>
+      <w:r>
+        <w:rPr>
+          <w:rFonts w:ascii="Courier New" w:cs="Courier New" w:eastAsia="Courier New" w:hAnsi="Courier New"/>
+          <w:sz w:val="19"/>
+          <w:szCs w:val="19"/>
+        </w:rPr>
+        <w:t xml:space="preserve">RXPIP AVAIL</w:t>
+      </w:r>
+      <w:r>
+        <w:rPr>
+          <w:rFonts w:ascii="Times New Roman" w:cs="Times New Roman" w:eastAsia="Times New Roman" w:hAnsi="Times New Roman"/>
+        </w:rPr>
+        <w:t xml:space="preserve">, </w:t>
+      </w:r>
+      <w:r>
+        <w:rPr>
+          <w:rFonts w:ascii="Courier New" w:cs="Courier New" w:eastAsia="Courier New" w:hAnsi="Courier New"/>
+          <w:sz w:val="19"/>
+          <w:szCs w:val="19"/>
+        </w:rPr>
+        <w:t xml:space="preserve">RXPIP SEARCH term</w:t>
+      </w:r>
+      <w:r>
+        <w:rPr>
+          <w:rFonts w:ascii="Times New Roman" w:cs="Times New Roman" w:eastAsia="Times New Roman" w:hAnsi="Times New Roman"/>
+        </w:rPr>
+        <w:t xml:space="preserve"> and </w:t>
+      </w:r>
+      <w:r>
+        <w:rPr>
+          <w:rFonts w:ascii="Courier New" w:cs="Courier New" w:eastAsia="Courier New" w:hAnsi="Courier New"/>
+          <w:sz w:val="19"/>
+          <w:szCs w:val="19"/>
+        </w:rPr>
+        <w:t xml:space="preserve">RXPIP SHOW name</w:t>
+      </w:r>
+      <w:r>
+        <w:rPr>
+          <w:rFonts w:ascii="Times New Roman" w:cs="Times New Roman" w:eastAsia="Times New Roman" w:hAnsi="Times New Roman"/>
+        </w:rPr>
+        <w:t xml:space="preserve"> ask the repository. </w:t>
+      </w:r>
+      <w:r>
+        <w:rPr>
+          <w:rFonts w:ascii="Courier New" w:cs="Courier New" w:eastAsia="Courier New" w:hAnsi="Courier New"/>
+          <w:sz w:val="19"/>
+          <w:szCs w:val="19"/>
+        </w:rPr>
+        <w:t xml:space="preserve">RXPIP BUILD fn</w:t>
+      </w:r>
+      <w:r>
+        <w:rPr>
+          <w:rFonts w:ascii="Times New Roman" w:cs="Times New Roman" w:eastAsia="Times New Roman" w:hAnsi="Times New Roman"/>
+        </w:rPr>
+        <w:t xml:space="preserve"> takes </w:t>
+      </w:r>
+      <w:r>
+        <w:rPr>
+          <w:rFonts w:ascii="Courier New" w:cs="Courier New" w:eastAsia="Courier New" w:hAnsi="Courier New"/>
+          <w:sz w:val="19"/>
+          <w:szCs w:val="19"/>
+        </w:rPr>
+        <w:t xml:space="preserve">fn REXX</w:t>
+      </w:r>
+      <w:r>
+        <w:rPr>
+          <w:rFonts w:ascii="Times New Roman" w:cs="Times New Roman" w:eastAsia="Times New Roman" w:hAnsi="Times New Roman"/>
+        </w:rPr>
+        <w:t xml:space="preserve">, installs the packages it requires and writes </w:t>
+      </w:r>
+      <w:r>
+        <w:rPr>
+          <w:rFonts w:ascii="Courier New" w:cs="Courier New" w:eastAsia="Courier New" w:hAnsi="Courier New"/>
+          <w:sz w:val="19"/>
+          <w:szCs w:val="19"/>
+        </w:rPr>
+        <w:t xml:space="preserve">fn EXEC A</w:t>
+      </w:r>
+      <w:r>
+        <w:rPr>
+          <w:rFonts w:ascii="Times New Roman" w:cs="Times New Roman" w:eastAsia="Times New Roman" w:hAnsi="Times New Roman"/>
+        </w:rPr>
+        <w:t xml:space="preserve">, a standalone program with the packages merged in; </w:t>
+      </w:r>
+      <w:r>
+        <w:rPr>
+          <w:rFonts w:ascii="Courier New" w:cs="Courier New" w:eastAsia="Courier New" w:hAnsi="Courier New"/>
+          <w:sz w:val="19"/>
+          <w:szCs w:val="19"/>
+        </w:rPr>
+        <w:t xml:space="preserve">RXPIP RUN fn [args]</w:t>
+      </w:r>
+      <w:r>
+        <w:rPr>
+          <w:rFonts w:ascii="Times New Roman" w:cs="Times New Roman" w:eastAsia="Times New Roman" w:hAnsi="Times New Roman"/>
+        </w:rPr>
+        <w:t xml:space="preserve"> builds and runs it. </w:t>
+      </w:r>
+      <w:r>
+        <w:rPr>
+          <w:rFonts w:ascii="Courier New" w:cs="Courier New" w:eastAsia="Courier New" w:hAnsi="Courier New"/>
+          <w:sz w:val="19"/>
+          <w:szCs w:val="19"/>
+        </w:rPr>
+        <w:t xml:space="preserve">RXPIP GET name</w:t>
+      </w:r>
+      <w:r>
+        <w:rPr>
+          <w:rFonts w:ascii="Times New Roman" w:cs="Times New Roman" w:eastAsia="Times New Roman" w:hAnsi="Times New Roman"/>
+        </w:rPr>
+        <w:t xml:space="preserve"> fetches a package as </w:t>
+      </w:r>
+      <w:r>
+        <w:rPr>
+          <w:rFonts w:ascii="Courier New" w:cs="Courier New" w:eastAsia="Courier New" w:hAnsi="Courier New"/>
+          <w:sz w:val="19"/>
+          <w:szCs w:val="19"/>
+        </w:rPr>
+        <w:t xml:space="preserve">file REXX A</w:t>
+      </w:r>
+      <w:r>
+        <w:rPr>
+          <w:rFonts w:ascii="Times New Roman" w:cs="Times New Roman" w:eastAsia="Times New Roman" w:hAnsi="Times New Roman"/>
+        </w:rPr>
+        <w:t xml:space="preserve">.</w:t>
+      </w:r>
+    </w:p>
+    <w:tbl>
+      <w:tblPr>
+        <w:tblW w:type="dxa" w:w="9638"/>
+        <w:tblBorders>
+          <w:top w:val="single" w:color="auto" w:sz="4"/>
+          <w:left w:val="single" w:color="auto" w:sz="4"/>
+          <w:bottom w:val="single" w:color="auto" w:sz="4"/>
+          <w:right w:val="single" w:color="auto" w:sz="4"/>
+          <w:insideH w:val="single" w:color="auto" w:sz="4"/>
+          <w:insideV w:val="single" w:color="auto" w:sz="4"/>
+        </w:tblBorders>
+      </w:tblPr>
+      <w:tblGrid>
+        <w:gridCol w:w="9638"/>
+      </w:tblGrid>
+      <w:tr>
+        <w:trPr>
+          <w:cantSplit/>
+        </w:trPr>
+        <w:tc>
+          <w:tcPr>
+            <w:tcW w:type="dxa" w:w="9638"/>
+            <w:shd w:fill="F2F2F2" w:color="auto" w:val="clear"/>
+            <w:tcMar>
+              <w:top w:type="dxa" w:w="100"/>
+              <w:left w:type="dxa" w:w="140"/>
+              <w:bottom w:type="dxa" w:w="100"/>
+              <w:right w:type="dxa" w:w="140"/>
+            </w:tcMar>
+          </w:tcPr>
+          <w:p>
+            <w:pPr>
+              <w:spacing w:after="0" w:line="228"/>
+            </w:pPr>
+            <w:r>
+              <w:rPr>
+                <w:rFonts w:ascii="Courier New" w:cs="Courier New" w:eastAsia="Courier New" w:hAnsi="Courier New"/>
+                <w:sz w:val="17"/>
+                <w:szCs w:val="17"/>
+              </w:rPr>
+              <w:t xml:space="preserve">rxpip run demo</w:t>
+            </w:r>
+          </w:p>
+          <w:p>
+            <w:pPr>
+              <w:spacing w:after="0" w:line="228"/>
+            </w:pPr>
+            <w:r>
+              <w:rPr>
+                <w:rFonts w:ascii="Courier New" w:cs="Courier New" w:eastAsia="Courier New" w:hAnsi="Courier New"/>
+                <w:sz w:val="17"/>
+                <w:szCs w:val="17"/>
+              </w:rPr>
+              <w:t xml:space="preserve">rxpip: mathutils 1.0.0 already installed</w:t>
+            </w:r>
+          </w:p>
+          <w:p>
+            <w:pPr>
+              <w:spacing w:after="0" w:line="228"/>
+            </w:pPr>
+            <w:r>
+              <w:rPr>
+                <w:rFonts w:ascii="Courier New" w:cs="Courier New" w:eastAsia="Courier New" w:hAnsi="Courier New"/>
+                <w:sz w:val="17"/>
+                <w:szCs w:val="17"/>
+              </w:rPr>
+              <w:t xml:space="preserve">rxpip: greetutils 1.0.0 already installed</w:t>
+            </w:r>
+          </w:p>
+          <w:p>
+            <w:pPr>
+              <w:spacing w:after="0" w:line="228"/>
+            </w:pPr>
+            <w:r>
+              <w:rPr>
+                <w:rFonts w:ascii="Courier New" w:cs="Courier New" w:eastAsia="Courier New" w:hAnsi="Courier New"/>
+                <w:sz w:val="17"/>
+                <w:szCs w:val="17"/>
+              </w:rPr>
+              <w:t xml:space="preserve">RXPIP: DEMO EXEC A written, 71 lines</w:t>
+            </w:r>
+          </w:p>
+          <w:p>
+            <w:pPr>
+              <w:spacing w:after="0" w:line="228"/>
+            </w:pPr>
+            <w:r>
+              <w:rPr>
+                <w:rFonts w:ascii="Courier New" w:cs="Courier New" w:eastAsia="Courier New" w:hAnsi="Courier New"/>
+                <w:sz w:val="17"/>
+                <w:szCs w:val="17"/>
+              </w:rPr>
+              <w:t xml:space="preserve">HELLO, WORLD!!!</w:t>
+            </w:r>
+          </w:p>
+          <w:p>
+            <w:pPr>
+              <w:spacing w:after="0" w:line="228"/>
+            </w:pPr>
+            <w:r>
+              <w:rPr>
+                <w:rFonts w:ascii="Courier New" w:cs="Courier New" w:eastAsia="Courier New" w:hAnsi="Courier New"/>
+                <w:sz w:val="17"/>
+                <w:szCs w:val="17"/>
+              </w:rPr>
+              <w:t xml:space="preserve">square of 7 is 49</w:t>
+            </w:r>
+          </w:p>
+          <w:p>
+            <w:pPr>
+              <w:spacing w:after="0" w:line="228"/>
+            </w:pPr>
+            <w:r>
+              <w:rPr>
+                <w:rFonts w:ascii="Courier New" w:cs="Courier New" w:eastAsia="Courier New" w:hAnsi="Courier New"/>
+                <w:sz w:val="17"/>
+                <w:szCs w:val="17"/>
+              </w:rPr>
+              <w:t xml:space="preserve">Ready;</w:t>
+            </w:r>
+          </w:p>
+        </w:tc>
+      </w:tr>
+    </w:tbl>
+    <w:p>
+      <w:pPr>
+        <w:spacing w:after="200" w:before="80"/>
+      </w:pPr>
+      <w:r>
+        <w:rPr>
+          <w:rFonts w:ascii="Arial" w:cs="Arial" w:eastAsia="Arial" w:hAnsi="Arial"/>
+          <w:b/>
+          <w:bCs/>
+          <w:sz w:val="18"/>
+          <w:szCs w:val="18"/>
+        </w:rPr>
+        <w:t xml:space="preserve">Figure 28. </w:t>
       </w:r>
       <w:r>
         <w:rPr>
@@ -16431,7 +17034,7 @@
           <w:sz w:val="18"/>
           <w:szCs w:val="18"/>
         </w:rPr>
-        <w:t xml:space="preserve">Figure 28. </w:t>
+        <w:t xml:space="preserve">Figure 29. </w:t>
       </w:r>
       <w:r>
         <w:rPr>
@@ -16669,7 +17272,7 @@
           <w:sz w:val="18"/>
           <w:szCs w:val="18"/>
         </w:rPr>
-        <w:t xml:space="preserve">Figure 29. </w:t>
+        <w:t xml:space="preserve">Figure 30. </w:t>
       </w:r>
       <w:r>
         <w:rPr>
@@ -17079,7 +17682,7 @@
           <w:sz w:val="18"/>
           <w:szCs w:val="18"/>
         </w:rPr>
-        <w:t xml:space="preserve">Figure 30. </w:t>
+        <w:t xml:space="preserve">Figure 31. </w:t>
       </w:r>
       <w:r>
         <w:rPr>
@@ -17344,7 +17947,7 @@
           <w:sz w:val="18"/>
           <w:szCs w:val="18"/>
         </w:rPr>
-        <w:t xml:space="preserve">Figure 31. </w:t>
+        <w:t xml:space="preserve">Figure 32. </w:t>
       </w:r>
       <w:r>
         <w:rPr>
@@ -18418,7 +19021,7 @@
           <w:sz w:val="18"/>
           <w:szCs w:val="18"/>
         </w:rPr>
-        <w:t xml:space="preserve">Figure 32. </w:t>
+        <w:t xml:space="preserve">Figure 33. </w:t>
       </w:r>
       <w:r>
         <w:rPr>
@@ -19048,7 +19651,7 @@
           <w:sz w:val="18"/>
           <w:szCs w:val="18"/>
         </w:rPr>
-        <w:t xml:space="preserve">Figure 33. </w:t>
+        <w:t xml:space="preserve">Figure 34. </w:t>
       </w:r>
       <w:r>
         <w:rPr>
@@ -19558,7 +20161,7 @@
           <w:sz w:val="18"/>
           <w:szCs w:val="18"/>
         </w:rPr>
-        <w:t xml:space="preserve">Figure 34. </w:t>
+        <w:t xml:space="preserve">Figure 35. </w:t>
       </w:r>
       <w:r>
         <w:rPr>
@@ -19857,7 +20460,7 @@
           <w:sz w:val="18"/>
           <w:szCs w:val="18"/>
         </w:rPr>
-        <w:t xml:space="preserve">Figure 35. </w:t>
+        <w:t xml:space="preserve">Figure 36. </w:t>
       </w:r>
       <w:r>
         <w:rPr>
@@ -20422,7 +21025,7 @@
           <w:sz w:val="18"/>
           <w:szCs w:val="18"/>
         </w:rPr>
-        <w:t xml:space="preserve">Figure 36. </w:t>
+        <w:t xml:space="preserve">Figure 37. </w:t>
       </w:r>
       <w:r>
         <w:rPr>
@@ -20569,7 +21172,7 @@
           <w:sz w:val="18"/>
           <w:szCs w:val="18"/>
         </w:rPr>
-        <w:t xml:space="preserve">Figure 37. </w:t>
+        <w:t xml:space="preserve">Figure 38. </w:t>
       </w:r>
       <w:r>
         <w:rPr>
@@ -20945,7 +21548,7 @@
           <w:sz w:val="18"/>
           <w:szCs w:val="18"/>
         </w:rPr>
-        <w:t xml:space="preserve">Figure 38. </w:t>
+        <w:t xml:space="preserve">Figure 39. </w:t>
       </w:r>
       <w:r>
         <w:rPr>
@@ -22166,7 +22769,7 @@
           <w:sz w:val="18"/>
           <w:szCs w:val="18"/>
         </w:rPr>
-        <w:t xml:space="preserve">Figure 39. </w:t>
+        <w:t xml:space="preserve">Figure 40. </w:t>
       </w:r>
       <w:r>
         <w:rPr>
@@ -22945,7 +23548,7 @@
           <w:sz w:val="18"/>
           <w:szCs w:val="18"/>
         </w:rPr>
-        <w:t xml:space="preserve">Figure 40. </w:t>
+        <w:t xml:space="preserve">Figure 41. </w:t>
       </w:r>
       <w:r>
         <w:rPr>
@@ -23079,7 +23682,7 @@
           <w:sz w:val="18"/>
           <w:szCs w:val="18"/>
         </w:rPr>
-        <w:t xml:space="preserve">Figure 41. </w:t>
+        <w:t xml:space="preserve">Figure 42. </w:t>
       </w:r>
       <w:r>
         <w:rPr>
@@ -23363,7 +23966,7 @@
           <w:sz w:val="18"/>
           <w:szCs w:val="18"/>
         </w:rPr>
-        <w:t xml:space="preserve">Figure 42. </w:t>
+        <w:t xml:space="preserve">Figure 43. </w:t>
       </w:r>
       <w:r>
         <w:rPr>
@@ -24103,7 +24706,7 @@
           <w:sz w:val="18"/>
           <w:szCs w:val="18"/>
         </w:rPr>
-        <w:t xml:space="preserve">Figure 43. </w:t>
+        <w:t xml:space="preserve">Figure 44. </w:t>
       </w:r>
       <w:r>
         <w:rPr>
@@ -24581,7 +25184,7 @@
           <w:sz w:val="18"/>
           <w:szCs w:val="18"/>
         </w:rPr>
-        <w:t xml:space="preserve">Figure 44. </w:t>
+        <w:t xml:space="preserve">Figure 45. </w:t>
       </w:r>
       <w:r>
         <w:rPr>
@@ -25745,7 +26348,7 @@
           <w:sz w:val="18"/>
           <w:szCs w:val="18"/>
         </w:rPr>
-        <w:t xml:space="preserve">Figure 45. </w:t>
+        <w:t xml:space="preserve">Figure 46. </w:t>
       </w:r>
       <w:r>
         <w:rPr>
@@ -25844,7 +26447,7 @@
           <w:sz w:val="18"/>
           <w:szCs w:val="18"/>
         </w:rPr>
-        <w:t xml:space="preserve">Figure 46. </w:t>
+        <w:t xml:space="preserve">Figure 47. </w:t>
       </w:r>
       <w:r>
         <w:rPr>
@@ -25987,7 +26590,7 @@
           <w:sz w:val="18"/>
           <w:szCs w:val="18"/>
         </w:rPr>
-        <w:t xml:space="preserve">Figure 47. </w:t>
+        <w:t xml:space="preserve">Figure 48. </w:t>
       </w:r>
       <w:r>
         <w:rPr>
@@ -26259,7 +26862,7 @@
           <w:sz w:val="18"/>
           <w:szCs w:val="18"/>
         </w:rPr>
-        <w:t xml:space="preserve">Figure 48. </w:t>
+        <w:t xml:space="preserve">Figure 49. </w:t>
       </w:r>
       <w:r>
         <w:rPr>
@@ -26501,7 +27104,7 @@
           <w:sz w:val="18"/>
           <w:szCs w:val="18"/>
         </w:rPr>
-        <w:t xml:space="preserve">Figure 49. </w:t>
+        <w:t xml:space="preserve">Figure 50. </w:t>
       </w:r>
       <w:r>
         <w:rPr>
@@ -26578,7 +27181,7 @@
           <w:sz w:val="18"/>
           <w:szCs w:val="18"/>
         </w:rPr>
-        <w:t xml:space="preserve">Figure 50. </w:t>
+        <w:t xml:space="preserve">Figure 51. </w:t>
       </w:r>
       <w:r>
         <w:rPr>
@@ -26708,7 +27311,7 @@
           <w:sz w:val="18"/>
           <w:szCs w:val="18"/>
         </w:rPr>
-        <w:t xml:space="preserve">Figure 51. </w:t>
+        <w:t xml:space="preserve">Figure 52. </w:t>
       </w:r>
       <w:r>
         <w:rPr>
@@ -26882,7 +27485,7 @@
           <w:sz w:val="18"/>
           <w:szCs w:val="18"/>
         </w:rPr>
-        <w:t xml:space="preserve">Figure 52. </w:t>
+        <w:t xml:space="preserve">Figure 53. </w:t>
       </w:r>
       <w:r>
         <w:rPr>
@@ -26972,7 +27575,7 @@
           <w:sz w:val="18"/>
           <w:szCs w:val="18"/>
         </w:rPr>
-        <w:t xml:space="preserve">Figure 53. </w:t>
+        <w:t xml:space="preserve">Figure 54. </w:t>
       </w:r>
       <w:r>
         <w:rPr>
@@ -27719,7 +28322,7 @@
           <w:sz w:val="18"/>
           <w:szCs w:val="18"/>
         </w:rPr>
-        <w:t xml:space="preserve">Figure 54. </w:t>
+        <w:t xml:space="preserve">Figure 55. </w:t>
       </w:r>
       <w:r>
         <w:rPr>
@@ -27821,7 +28424,7 @@
           <w:sz w:val="18"/>
           <w:szCs w:val="18"/>
         </w:rPr>
-        <w:t xml:space="preserve">Figure 55. </w:t>
+        <w:t xml:space="preserve">Figure 56. </w:t>
       </w:r>
       <w:r>
         <w:rPr>
@@ -27996,7 +28599,7 @@
           <w:sz w:val="18"/>
           <w:szCs w:val="18"/>
         </w:rPr>
-        <w:t xml:space="preserve">Figure 56. </w:t>
+        <w:t xml:space="preserve">Figure 57. </w:t>
       </w:r>
       <w:r>
         <w:rPr>
@@ -28073,7 +28676,7 @@
           <w:sz w:val="18"/>
           <w:szCs w:val="18"/>
         </w:rPr>
-        <w:t xml:space="preserve">Figure 57. </w:t>
+        <w:t xml:space="preserve">Figure 58. </w:t>
       </w:r>
       <w:r>
         <w:rPr>
@@ -28353,7 +28956,7 @@
           <w:sz w:val="18"/>
           <w:szCs w:val="18"/>
         </w:rPr>
-        <w:t xml:space="preserve">Figure 58. </w:t>
+        <w:t xml:space="preserve">Figure 59. </w:t>
       </w:r>
       <w:r>
         <w:rPr>
@@ -28482,7 +29085,7 @@
           <w:sz w:val="18"/>
           <w:szCs w:val="18"/>
         </w:rPr>
-        <w:t xml:space="preserve">Figure 59. </w:t>
+        <w:t xml:space="preserve">Figure 60. </w:t>
       </w:r>
       <w:r>
         <w:rPr>
@@ -28714,7 +29317,7 @@
           <w:sz w:val="18"/>
           <w:szCs w:val="18"/>
         </w:rPr>
-        <w:t xml:space="preserve">Figure 60. </w:t>
+        <w:t xml:space="preserve">Figure 61. </w:t>
       </w:r>
       <w:r>
         <w:rPr>
@@ -29438,7 +30041,7 @@
           <w:sz w:val="18"/>
           <w:szCs w:val="18"/>
         </w:rPr>
-        <w:t xml:space="preserve">Figure 61. </w:t>
+        <w:t xml:space="preserve">Figure 62. </w:t>
       </w:r>
       <w:r>
         <w:rPr>
@@ -30146,7 +30749,7 @@
           <w:sz w:val="18"/>
           <w:szCs w:val="18"/>
         </w:rPr>
-        <w:t xml:space="preserve">Figure 62. </w:t>
+        <w:t xml:space="preserve">Figure 63. </w:t>
       </w:r>
       <w:r>
         <w:rPr>

</xml_diff>

<commit_message>
9.5: CMSFTPD with GCC 13 (CMSFTP31): EEUTIL's functions written anew, GCCLIB's CMScommand/CMSstackQuery/CMSconsoleRead on cmsrt; verified with ftplib
Co-Authored-By: Claude Opus 5.5 <noreply@anthropic.com>
Claude-Session: https://claude.ai/code/session_01JBNU8KnKzXkgscse8vw6so
</commit_message>
<xml_diff>
--- a/arch/31bit/manual/VM370PLUS-Guide.docx
+++ b/arch/31bit/manual/VM370PLUS-Guide.docx
@@ -3202,6 +3202,20 @@
           <w:rFonts w:ascii="Times New Roman" w:cs="Times New Roman" w:eastAsia="Times New Roman" w:hAnsi="Times New Roman"/>
         </w:rPr>
         <w:t xml:space="preserve"> NICOF’s tools for the EC-mode CMS, built with GCC 13, on the language disk: </w:t>
+      </w:r>
+      <w:r>
+        <w:rPr>
+          <w:rFonts w:ascii="Courier New" w:cs="Courier New" w:eastAsia="Courier New" w:hAnsi="Courier New"/>
+          <w:sz w:val="19"/>
+          <w:szCs w:val="19"/>
+        </w:rPr>
+        <w:t xml:space="preserve">CMSFTP31</w:t>
+      </w:r>
+      <w:r>
+        <w:rPr>
+          <w:rFonts w:ascii="Times New Roman" w:cs="Times New Roman" w:eastAsia="Times New Roman" w:hAnsi="Times New Roman"/>
+        </w:rPr>
+        <w:t xml:space="preserve">, </w:t>
       </w:r>
       <w:r>
         <w:rPr>
@@ -15701,6 +15715,20 @@
           <w:rFonts w:ascii="Times New Roman" w:cs="Times New Roman" w:eastAsia="Times New Roman" w:hAnsi="Times New Roman"/>
         </w:rPr>
         <w:t xml:space="preserve"> first): </w:t>
+      </w:r>
+      <w:r>
+        <w:rPr>
+          <w:rFonts w:ascii="Courier New" w:cs="Courier New" w:eastAsia="Courier New" w:hAnsi="Courier New"/>
+          <w:sz w:val="19"/>
+          <w:szCs w:val="19"/>
+        </w:rPr>
+        <w:t xml:space="preserve">CMSFTP31</w:t>
+      </w:r>
+      <w:r>
+        <w:rPr>
+          <w:rFonts w:ascii="Times New Roman" w:cs="Times New Roman" w:eastAsia="Times New Roman" w:hAnsi="Times New Roman"/>
+        </w:rPr>
+        <w:t xml:space="preserve"> (the FTP server, same options as CMSFTPD), </w:t>
       </w:r>
       <w:r>
         <w:rPr>

</xml_diff>

<commit_message>
Guide: MQ section (table widths)
Co-Authored-By: Claude Opus 5.5 <noreply@anthropic.com>
Claude-Session: https://claude.ai/code/session_01JBNU8KnKzXkgscse8vw6so
</commit_message>
<xml_diff>
--- a/arch/31bit/manual/VM370PLUS-Guide.docx
+++ b/arch/31bit/manual/VM370PLUS-Guide.docx
@@ -1194,7 +1194,7 @@
           <w:sz w:val="20"/>
           <w:szCs w:val="20"/>
         </w:rPr>
-        <w:t xml:space="preserve">TELL</w:t>
+        <w:t xml:space="preserve">MQ: message queues on RabbitMQ</w:t>
       </w:r>
       <w:r>
         <w:rPr>
@@ -1223,7 +1223,7 @@
           <w:sz w:val="20"/>
           <w:szCs w:val="20"/>
         </w:rPr>
-        <w:t xml:space="preserve">RXPIP: REXX packages</w:t>
+        <w:t xml:space="preserve">TELL</w:t>
       </w:r>
       <w:r>
         <w:rPr>
@@ -1252,6 +1252,35 @@
           <w:sz w:val="20"/>
           <w:szCs w:val="20"/>
         </w:rPr>
+        <w:t xml:space="preserve">RXPIP: REXX packages</w:t>
+      </w:r>
+      <w:r>
+        <w:rPr>
+          <w:rFonts w:ascii="Times New Roman" w:cs="Times New Roman" w:eastAsia="Times New Roman" w:hAnsi="Times New Roman"/>
+          <w:b w:val="false"/>
+          <w:bCs w:val="false"/>
+          <w:sz w:val="20"/>
+          <w:szCs w:val="20"/>
+        </w:rPr>
+        <w:t xml:space="preserve">	18</w:t>
+      </w:r>
+    </w:p>
+    <w:p>
+      <w:pPr>
+        <w:tabs>
+          <w:tab w:val="right" w:pos="9638" w:leader="dot"/>
+        </w:tabs>
+        <w:spacing w:after="20" w:before="20"/>
+        <w:ind w:left="400"/>
+      </w:pPr>
+      <w:r>
+        <w:rPr>
+          <w:rFonts w:ascii="Times New Roman" w:cs="Times New Roman" w:eastAsia="Times New Roman" w:hAnsi="Times New Roman"/>
+          <w:b w:val="false"/>
+          <w:bCs w:val="false"/>
+          <w:sz w:val="20"/>
+          <w:szCs w:val="20"/>
+        </w:rPr>
         <w:t xml:space="preserve">Planned service machines</w:t>
       </w:r>
       <w:r>
@@ -1291,7 +1320,7 @@
           <w:sz w:val="21"/>
           <w:szCs w:val="21"/>
         </w:rPr>
-        <w:t xml:space="preserve">	19</w:t>
+        <w:t xml:space="preserve">	20</w:t>
       </w:r>
     </w:p>
     <w:p>
@@ -1320,7 +1349,7 @@
           <w:sz w:val="20"/>
           <w:szCs w:val="20"/>
         </w:rPr>
-        <w:t xml:space="preserve">	19</w:t>
+        <w:t xml:space="preserve">	20</w:t>
       </w:r>
     </w:p>
     <w:p>
@@ -1349,7 +1378,7 @@
           <w:sz w:val="20"/>
           <w:szCs w:val="20"/>
         </w:rPr>
-        <w:t xml:space="preserve">	19</w:t>
+        <w:t xml:space="preserve">	20</w:t>
       </w:r>
     </w:p>
     <w:p>
@@ -1378,7 +1407,7 @@
           <w:sz w:val="20"/>
           <w:szCs w:val="20"/>
         </w:rPr>
-        <w:t xml:space="preserve">	19</w:t>
+        <w:t xml:space="preserve">	20</w:t>
       </w:r>
     </w:p>
     <w:p>
@@ -1407,7 +1436,7 @@
           <w:sz w:val="20"/>
           <w:szCs w:val="20"/>
         </w:rPr>
-        <w:t xml:space="preserve">	19</w:t>
+        <w:t xml:space="preserve">	20</w:t>
       </w:r>
     </w:p>
     <w:p>
@@ -1436,7 +1465,7 @@
           <w:sz w:val="20"/>
           <w:szCs w:val="20"/>
         </w:rPr>
-        <w:t xml:space="preserve">	20</w:t>
+        <w:t xml:space="preserve">	21</w:t>
       </w:r>
     </w:p>
     <w:p>
@@ -1465,7 +1494,7 @@
           <w:sz w:val="20"/>
           <w:szCs w:val="20"/>
         </w:rPr>
-        <w:t xml:space="preserve">	20</w:t>
+        <w:t xml:space="preserve">	21</w:t>
       </w:r>
     </w:p>
     <w:p>
@@ -1494,7 +1523,7 @@
           <w:sz w:val="21"/>
           <w:szCs w:val="21"/>
         </w:rPr>
-        <w:t xml:space="preserve">	22</w:t>
+        <w:t xml:space="preserve">	23</w:t>
       </w:r>
     </w:p>
     <w:p>
@@ -1523,7 +1552,7 @@
           <w:sz w:val="20"/>
           <w:szCs w:val="20"/>
         </w:rPr>
-        <w:t xml:space="preserve">	22</w:t>
+        <w:t xml:space="preserve">	23</w:t>
       </w:r>
     </w:p>
     <w:p>
@@ -1552,7 +1581,7 @@
           <w:sz w:val="20"/>
           <w:szCs w:val="20"/>
         </w:rPr>
-        <w:t xml:space="preserve">	22</w:t>
+        <w:t xml:space="preserve">	23</w:t>
       </w:r>
     </w:p>
     <w:p>
@@ -1581,7 +1610,7 @@
           <w:sz w:val="20"/>
           <w:szCs w:val="20"/>
         </w:rPr>
-        <w:t xml:space="preserve">	23</w:t>
+        <w:t xml:space="preserve">	24</w:t>
       </w:r>
     </w:p>
     <w:p>
@@ -1610,7 +1639,7 @@
           <w:sz w:val="20"/>
           <w:szCs w:val="20"/>
         </w:rPr>
-        <w:t xml:space="preserve">	23</w:t>
+        <w:t xml:space="preserve">	24</w:t>
       </w:r>
     </w:p>
     <w:p>
@@ -1639,7 +1668,7 @@
           <w:sz w:val="20"/>
           <w:szCs w:val="20"/>
         </w:rPr>
-        <w:t xml:space="preserve">	23</w:t>
+        <w:t xml:space="preserve">	24</w:t>
       </w:r>
     </w:p>
     <w:p>
@@ -1668,7 +1697,7 @@
           <w:sz w:val="20"/>
           <w:szCs w:val="20"/>
         </w:rPr>
-        <w:t xml:space="preserve">	23</w:t>
+        <w:t xml:space="preserve">	24</w:t>
       </w:r>
     </w:p>
     <w:p>
@@ -1697,7 +1726,7 @@
           <w:sz w:val="20"/>
           <w:szCs w:val="20"/>
         </w:rPr>
-        <w:t xml:space="preserve">	23</w:t>
+        <w:t xml:space="preserve">	24</w:t>
       </w:r>
     </w:p>
     <w:p>
@@ -1726,7 +1755,7 @@
           <w:sz w:val="20"/>
           <w:szCs w:val="20"/>
         </w:rPr>
-        <w:t xml:space="preserve">	23</w:t>
+        <w:t xml:space="preserve">	24</w:t>
       </w:r>
     </w:p>
     <w:p>
@@ -1755,7 +1784,7 @@
           <w:sz w:val="20"/>
           <w:szCs w:val="20"/>
         </w:rPr>
-        <w:t xml:space="preserve">	24</w:t>
+        <w:t xml:space="preserve">	25</w:t>
       </w:r>
     </w:p>
     <w:p>
@@ -1784,7 +1813,7 @@
           <w:sz w:val="20"/>
           <w:szCs w:val="20"/>
         </w:rPr>
-        <w:t xml:space="preserve">	24</w:t>
+        <w:t xml:space="preserve">	25</w:t>
       </w:r>
     </w:p>
     <w:p>
@@ -1813,7 +1842,7 @@
           <w:sz w:val="20"/>
           <w:szCs w:val="20"/>
         </w:rPr>
-        <w:t xml:space="preserve">	24</w:t>
+        <w:t xml:space="preserve">	25</w:t>
       </w:r>
     </w:p>
     <w:p>
@@ -1842,7 +1871,7 @@
           <w:sz w:val="20"/>
           <w:szCs w:val="20"/>
         </w:rPr>
-        <w:t xml:space="preserve">	24</w:t>
+        <w:t xml:space="preserve">	25</w:t>
       </w:r>
     </w:p>
     <w:p>
@@ -1871,7 +1900,7 @@
           <w:sz w:val="20"/>
           <w:szCs w:val="20"/>
         </w:rPr>
-        <w:t xml:space="preserve">	25</w:t>
+        <w:t xml:space="preserve">	26</w:t>
       </w:r>
     </w:p>
     <w:p>
@@ -1900,7 +1929,7 @@
           <w:sz w:val="21"/>
           <w:szCs w:val="21"/>
         </w:rPr>
-        <w:t xml:space="preserve">	26</w:t>
+        <w:t xml:space="preserve">	27</w:t>
       </w:r>
     </w:p>
     <w:p>
@@ -1929,7 +1958,7 @@
           <w:sz w:val="20"/>
           <w:szCs w:val="20"/>
         </w:rPr>
-        <w:t xml:space="preserve">	26</w:t>
+        <w:t xml:space="preserve">	27</w:t>
       </w:r>
     </w:p>
     <w:p>
@@ -1958,7 +1987,7 @@
           <w:sz w:val="20"/>
           <w:szCs w:val="20"/>
         </w:rPr>
-        <w:t xml:space="preserve">	26</w:t>
+        <w:t xml:space="preserve">	27</w:t>
       </w:r>
     </w:p>
     <w:p>
@@ -1987,7 +2016,7 @@
           <w:sz w:val="20"/>
           <w:szCs w:val="20"/>
         </w:rPr>
-        <w:t xml:space="preserve">	26</w:t>
+        <w:t xml:space="preserve">	27</w:t>
       </w:r>
     </w:p>
     <w:p>
@@ -2016,7 +2045,7 @@
           <w:sz w:val="20"/>
           <w:szCs w:val="20"/>
         </w:rPr>
-        <w:t xml:space="preserve">	26</w:t>
+        <w:t xml:space="preserve">	27</w:t>
       </w:r>
     </w:p>
     <w:p>
@@ -2045,7 +2074,7 @@
           <w:sz w:val="21"/>
           <w:szCs w:val="21"/>
         </w:rPr>
-        <w:t xml:space="preserve">	28</w:t>
+        <w:t xml:space="preserve">	29</w:t>
       </w:r>
     </w:p>
     <w:p>
@@ -2074,7 +2103,7 @@
           <w:sz w:val="21"/>
           <w:szCs w:val="21"/>
         </w:rPr>
-        <w:t xml:space="preserve">	29</w:t>
+        <w:t xml:space="preserve">	30</w:t>
       </w:r>
     </w:p>
     <w:p>
@@ -2103,7 +2132,7 @@
           <w:sz w:val="20"/>
           <w:szCs w:val="20"/>
         </w:rPr>
-        <w:t xml:space="preserve">	29</w:t>
+        <w:t xml:space="preserve">	30</w:t>
       </w:r>
     </w:p>
     <w:p>
@@ -2132,7 +2161,7 @@
           <w:sz w:val="20"/>
           <w:szCs w:val="20"/>
         </w:rPr>
-        <w:t xml:space="preserve">	29</w:t>
+        <w:t xml:space="preserve">	30</w:t>
       </w:r>
     </w:p>
     <w:p>
@@ -2161,7 +2190,7 @@
           <w:sz w:val="20"/>
           <w:szCs w:val="20"/>
         </w:rPr>
-        <w:t xml:space="preserve">	29</w:t>
+        <w:t xml:space="preserve">	30</w:t>
       </w:r>
     </w:p>
     <w:p>
@@ -2190,7 +2219,7 @@
           <w:sz w:val="20"/>
           <w:szCs w:val="20"/>
         </w:rPr>
-        <w:t xml:space="preserve">	29</w:t>
+        <w:t xml:space="preserve">	30</w:t>
       </w:r>
     </w:p>
     <w:p>
@@ -2219,7 +2248,7 @@
           <w:sz w:val="20"/>
           <w:szCs w:val="20"/>
         </w:rPr>
-        <w:t xml:space="preserve">	29</w:t>
+        <w:t xml:space="preserve">	30</w:t>
       </w:r>
     </w:p>
     <w:p>
@@ -2248,7 +2277,7 @@
           <w:sz w:val="20"/>
           <w:szCs w:val="20"/>
         </w:rPr>
-        <w:t xml:space="preserve">	30</w:t>
+        <w:t xml:space="preserve">	31</w:t>
       </w:r>
     </w:p>
     <w:p>
@@ -2277,7 +2306,7 @@
           <w:sz w:val="20"/>
           <w:szCs w:val="20"/>
         </w:rPr>
-        <w:t xml:space="preserve">	30</w:t>
+        <w:t xml:space="preserve">	31</w:t>
       </w:r>
     </w:p>
     <w:p>
@@ -2306,7 +2335,7 @@
           <w:sz w:val="20"/>
           <w:szCs w:val="20"/>
         </w:rPr>
-        <w:t xml:space="preserve">	30</w:t>
+        <w:t xml:space="preserve">	31</w:t>
       </w:r>
     </w:p>
     <w:p>
@@ -2335,7 +2364,7 @@
           <w:sz w:val="20"/>
           <w:szCs w:val="20"/>
         </w:rPr>
-        <w:t xml:space="preserve">	31</w:t>
+        <w:t xml:space="preserve">	32</w:t>
       </w:r>
     </w:p>
     <w:p>
@@ -2364,7 +2393,7 @@
           <w:sz w:val="20"/>
           <w:szCs w:val="20"/>
         </w:rPr>
-        <w:t xml:space="preserve">	31</w:t>
+        <w:t xml:space="preserve">	32</w:t>
       </w:r>
     </w:p>
     <w:p>
@@ -2393,7 +2422,7 @@
           <w:sz w:val="20"/>
           <w:szCs w:val="20"/>
         </w:rPr>
-        <w:t xml:space="preserve">	32</w:t>
+        <w:t xml:space="preserve">	33</w:t>
       </w:r>
     </w:p>
     <w:p>
@@ -2422,7 +2451,7 @@
           <w:sz w:val="20"/>
           <w:szCs w:val="20"/>
         </w:rPr>
-        <w:t xml:space="preserve">	32</w:t>
+        <w:t xml:space="preserve">	33</w:t>
       </w:r>
     </w:p>
     <w:p>
@@ -2451,7 +2480,7 @@
           <w:sz w:val="20"/>
           <w:szCs w:val="20"/>
         </w:rPr>
-        <w:t xml:space="preserve">	32</w:t>
+        <w:t xml:space="preserve">	33</w:t>
       </w:r>
     </w:p>
     <w:p>
@@ -2480,7 +2509,7 @@
           <w:sz w:val="20"/>
           <w:szCs w:val="20"/>
         </w:rPr>
-        <w:t xml:space="preserve">	32</w:t>
+        <w:t xml:space="preserve">	33</w:t>
       </w:r>
     </w:p>
     <w:p>
@@ -2509,7 +2538,7 @@
           <w:sz w:val="20"/>
           <w:szCs w:val="20"/>
         </w:rPr>
-        <w:t xml:space="preserve">	32</w:t>
+        <w:t xml:space="preserve">	33</w:t>
       </w:r>
     </w:p>
     <w:p>
@@ -2538,7 +2567,7 @@
           <w:sz w:val="20"/>
           <w:szCs w:val="20"/>
         </w:rPr>
-        <w:t xml:space="preserve">	32</w:t>
+        <w:t xml:space="preserve">	33</w:t>
       </w:r>
     </w:p>
     <w:p>
@@ -2567,7 +2596,7 @@
           <w:sz w:val="20"/>
           <w:szCs w:val="20"/>
         </w:rPr>
-        <w:t xml:space="preserve">	32</w:t>
+        <w:t xml:space="preserve">	33</w:t>
       </w:r>
     </w:p>
     <w:p>
@@ -2596,7 +2625,7 @@
           <w:sz w:val="20"/>
           <w:szCs w:val="20"/>
         </w:rPr>
-        <w:t xml:space="preserve">	32</w:t>
+        <w:t xml:space="preserve">	33</w:t>
       </w:r>
     </w:p>
     <w:p>
@@ -2625,7 +2654,7 @@
           <w:sz w:val="20"/>
           <w:szCs w:val="20"/>
         </w:rPr>
-        <w:t xml:space="preserve">	32</w:t>
+        <w:t xml:space="preserve">	33</w:t>
       </w:r>
     </w:p>
     <w:p>
@@ -2654,7 +2683,7 @@
           <w:sz w:val="21"/>
           <w:szCs w:val="21"/>
         </w:rPr>
-        <w:t xml:space="preserve">	33</w:t>
+        <w:t xml:space="preserve">	34</w:t>
       </w:r>
     </w:p>
     <w:p>
@@ -2683,7 +2712,7 @@
           <w:sz w:val="21"/>
           <w:szCs w:val="21"/>
         </w:rPr>
-        <w:t xml:space="preserve">	34</w:t>
+        <w:t xml:space="preserve">	35</w:t>
       </w:r>
     </w:p>
     <w:p>
@@ -2712,7 +2741,7 @@
           <w:sz w:val="21"/>
           <w:szCs w:val="21"/>
         </w:rPr>
-        <w:t xml:space="preserve">	35</w:t>
+        <w:t xml:space="preserve">	36</w:t>
       </w:r>
     </w:p>
     <w:p>
@@ -2770,7 +2799,7 @@
           <w:sz w:val="20"/>
           <w:szCs w:val="20"/>
         </w:rPr>
-        <w:t xml:space="preserve">	39</w:t>
+        <w:t xml:space="preserve">	40</w:t>
       </w:r>
     </w:p>
     <w:p>
@@ -2963,7 +2992,7 @@
         <w:rPr>
           <w:rFonts w:ascii="Times New Roman" w:cs="Times New Roman" w:eastAsia="Times New Roman" w:hAnsi="Times New Roman"/>
         </w:rPr>
-        <w:t xml:space="preserve">, describes CHATBOT, the spool bridge to Linux services (LXCALL, PHONE, MQTT, TELL), RXPIP, and the service machines that are planned.</w:t>
+        <w:t xml:space="preserve">, describes CHATBOT, the spool bridge to Linux services (LXCALL, PHONE, MQTT, TELL), RXPIP, NICOF, MQ, and the service machines that are planned.</w:t>
       </w:r>
     </w:p>
     <w:p>
@@ -3178,6 +3207,44 @@
           <w:rFonts w:ascii="Times New Roman" w:cs="Times New Roman" w:eastAsia="Times New Roman" w:hAnsi="Times New Roman"/>
         </w:rPr>
         <w:t xml:space="preserve">This edition is kept up to date as VM/370plus grows; each change is listed here, newest first.</w:t>
+      </w:r>
+    </w:p>
+    <w:p>
+      <w:pPr>
+        <w:pStyle w:val="ListParagraph"/>
+        <w:numPr>
+          <w:ilvl w:val="0"/>
+          <w:numId w:val="2"/>
+        </w:numPr>
+        <w:spacing w:after="60"/>
+      </w:pPr>
+      <w:r>
+        <w:rPr>
+          <w:rFonts w:ascii="Times New Roman" w:cs="Times New Roman" w:eastAsia="Times New Roman" w:hAnsi="Times New Roman"/>
+          <w:b/>
+          <w:bCs/>
+        </w:rPr>
+        <w:t xml:space="preserve">14 October 2026.</w:t>
+      </w:r>
+      <w:r>
+        <w:rPr>
+          <w:rFonts w:ascii="Times New Roman" w:cs="Times New Roman" w:eastAsia="Times New Roman" w:hAnsi="Times New Roman"/>
+        </w:rPr>
+        <w:t xml:space="preserve"> </w:t>
+      </w:r>
+      <w:r>
+        <w:rPr>
+          <w:rFonts w:ascii="Courier New" w:cs="Courier New" w:eastAsia="Courier New" w:hAnsi="Courier New"/>
+          <w:sz w:val="19"/>
+          <w:szCs w:val="19"/>
+        </w:rPr>
+        <w:t xml:space="preserve">MQ</w:t>
+      </w:r>
+      <w:r>
+        <w:rPr>
+          <w:rFonts w:ascii="Times New Roman" w:cs="Times New Roman" w:eastAsia="Times New Roman" w:hAnsi="Times New Roman"/>
+        </w:rPr>
+        <w:t xml:space="preserve"> (Chapter 6): message queues for CMS programs on a RabbitMQ broker (PUT, GET, DEPTH, PURGE, GET onto the stack). The RXPIP bridge follows the current rexxpository client.</w:t>
       </w:r>
     </w:p>
     <w:p>
@@ -16164,7 +16231,7 @@
         <w:pStyle w:val="Heading2"/>
       </w:pPr>
       <w:r>
-        <w:t xml:space="preserve">TELL</w:t>
+        <w:t xml:space="preserve">MQ: message queues on RabbitMQ</w:t>
       </w:r>
     </w:p>
     <w:p>
@@ -16177,83 +16244,375 @@
           <w:sz w:val="19"/>
           <w:szCs w:val="19"/>
         </w:rPr>
-        <w:t xml:space="preserve">TELL userid message</w:t>
-      </w:r>
-      <w:r>
-        <w:rPr>
-          <w:rFonts w:ascii="Times New Roman" w:cs="Times New Roman" w:eastAsia="Times New Roman" w:hAnsi="Times New Roman"/>
-        </w:rPr>
-        <w:t xml:space="preserve"> sends a message to a VM/370 user (CP MSG). </w:t>
-      </w:r>
-      <w:r>
-        <w:rPr>
-          <w:rFonts w:ascii="Courier New" w:cs="Courier New" w:eastAsia="Courier New" w:hAnsi="Courier New"/>
-          <w:sz w:val="19"/>
-          <w:szCs w:val="19"/>
-        </w:rPr>
-        <w:t xml:space="preserve">TELL user AT LINUX message</w:t>
-      </w:r>
-      <w:r>
-        <w:rPr>
-          <w:rFonts w:ascii="Times New Roman" w:cs="Times New Roman" w:eastAsia="Times New Roman" w:hAnsi="Times New Roman"/>
-        </w:rPr>
-        <w:t xml:space="preserve"> sends it to a user of the Debian guest through the spool bridge: it appears on that user’s terminals, and is kept until the user reads it with </w:t>
-      </w:r>
-      <w:r>
-        <w:rPr>
-          <w:rFonts w:ascii="Courier New" w:cs="Courier New" w:eastAsia="Courier New" w:hAnsi="Courier New"/>
-          <w:sz w:val="19"/>
-          <w:szCs w:val="19"/>
-        </w:rPr>
-        <w:t xml:space="preserve">tell</w:t>
-      </w:r>
-      <w:r>
-        <w:rPr>
-          <w:rFonts w:ascii="Times New Roman" w:cs="Times New Roman" w:eastAsia="Times New Roman" w:hAnsi="Times New Roman"/>
-        </w:rPr>
-        <w:t xml:space="preserve">. </w:t>
-      </w:r>
-      <w:r>
-        <w:rPr>
-          <w:rFonts w:ascii="Courier New" w:cs="Courier New" w:eastAsia="Courier New" w:hAnsi="Courier New"/>
-          <w:sz w:val="19"/>
-          <w:szCs w:val="19"/>
-        </w:rPr>
-        <w:t xml:space="preserve">TELL ALL AT LINUX message</w:t>
-      </w:r>
-      <w:r>
-        <w:rPr>
-          <w:rFonts w:ascii="Times New Roman" w:cs="Times New Roman" w:eastAsia="Times New Roman" w:hAnsi="Times New Roman"/>
-        </w:rPr>
-        <w:t xml:space="preserve"> reaches everybody logged on to Linux. A Linux user answers with </w:t>
-      </w:r>
-      <w:r>
-        <w:rPr>
-          <w:rFonts w:ascii="Courier New" w:cs="Courier New" w:eastAsia="Courier New" w:hAnsi="Courier New"/>
-          <w:sz w:val="19"/>
-          <w:szCs w:val="19"/>
-        </w:rPr>
-        <w:t xml:space="preserve">tell userid message</w:t>
-      </w:r>
-      <w:r>
-        <w:rPr>
-          <w:rFonts w:ascii="Times New Roman" w:cs="Times New Roman" w:eastAsia="Times New Roman" w:hAnsi="Times New Roman"/>
-        </w:rPr>
-        <w:t xml:space="preserve">, which arrives on CMS as </w:t>
-      </w:r>
-      <w:r>
-        <w:rPr>
-          <w:rFonts w:ascii="Courier New" w:cs="Courier New" w:eastAsia="Courier New" w:hAnsi="Courier New"/>
-          <w:sz w:val="19"/>
-          <w:szCs w:val="19"/>
-        </w:rPr>
-        <w:t xml:space="preserve">MSG FROM MAINT: (user) message</w:t>
-      </w:r>
-      <w:r>
-        <w:rPr>
-          <w:rFonts w:ascii="Times New Roman" w:cs="Times New Roman" w:eastAsia="Times New Roman" w:hAnsi="Times New Roman"/>
-        </w:rPr>
-        <w:t xml:space="preserve">.</w:t>
+        <w:t xml:space="preserve">MQ</w:t>
+      </w:r>
+      <w:r>
+        <w:rPr>
+          <w:rFonts w:ascii="Times New Roman" w:cs="Times New Roman" w:eastAsia="Times New Roman" w:hAnsi="Times New Roman"/>
+        </w:rPr>
+        <w:t xml:space="preserve"> gives CMS programs message queues on a RabbitMQ broker (AMQP 0-9-1), the broker the cREXX package mikebeer/mq uses on Linux and Windows. It runs under </w:t>
+      </w:r>
+      <w:r>
+        <w:rPr>
+          <w:rFonts w:ascii="Courier New" w:cs="Courier New" w:eastAsia="Courier New" w:hAnsi="Courier New"/>
+          <w:sz w:val="19"/>
+          <w:szCs w:val="19"/>
+        </w:rPr>
+        <w:t xml:space="preserve">IPL 290</w:t>
+      </w:r>
+      <w:r>
+        <w:rPr>
+          <w:rFonts w:ascii="Times New Roman" w:cs="Times New Roman" w:eastAsia="Times New Roman" w:hAnsi="Times New Roman"/>
+        </w:rPr>
+        <w:t xml:space="preserve"> from the language disk (</w:t>
+      </w:r>
+      <w:r>
+        <w:rPr>
+          <w:rFonts w:ascii="Courier New" w:cs="Courier New" w:eastAsia="Courier New" w:hAnsi="Courier New"/>
+          <w:sz w:val="19"/>
+          <w:szCs w:val="19"/>
+        </w:rPr>
+        <w:t xml:space="preserve">LANG</w:t>
+      </w:r>
+      <w:r>
+        <w:rPr>
+          <w:rFonts w:ascii="Times New Roman" w:cs="Times New Roman" w:eastAsia="Times New Roman" w:hAnsi="Times New Roman"/>
+        </w:rPr>
+        <w:t xml:space="preserve">), with NICOF’s proxies running, and reaches the broker through the PC: the AMQP client library rabbitmq-c, built with GCC 13 on NICOF’s sockets.</w:t>
+      </w:r>
+    </w:p>
+    <w:tbl>
+      <w:tblPr>
+        <w:tblW w:type="dxa" w:w="9638"/>
+        <w:tblBorders>
+          <w:top w:val="single" w:color="808080" w:sz="4"/>
+          <w:left w:val="single" w:color="808080" w:sz="4"/>
+          <w:bottom w:val="single" w:color="808080" w:sz="4"/>
+          <w:right w:val="single" w:color="808080" w:sz="4"/>
+          <w:insideH w:val="single" w:color="808080" w:sz="4"/>
+          <w:insideV w:val="single" w:color="808080" w:sz="4"/>
+        </w:tblBorders>
+      </w:tblPr>
+      <w:tblGrid>
+        <w:gridCol w:w="3200"/>
+        <w:gridCol w:w="6438"/>
+      </w:tblGrid>
+      <w:tr>
+        <w:trPr>
+          <w:cantSplit/>
+          <w:tblHeader/>
+        </w:trPr>
+        <w:tc>
+          <w:tcPr>
+            <w:tcW w:type="dxa" w:w="3200"/>
+            <w:shd w:fill="D9D9D9" w:color="auto" w:val="clear"/>
+            <w:tcMar>
+              <w:top w:type="dxa" w:w="60"/>
+              <w:left w:type="dxa" w:w="100"/>
+              <w:bottom w:type="dxa" w:w="60"/>
+              <w:right w:type="dxa" w:w="100"/>
+            </w:tcMar>
+          </w:tcPr>
+          <w:p>
+            <w:r>
+              <w:rPr>
+                <w:rFonts w:ascii="Arial" w:cs="Arial" w:eastAsia="Arial" w:hAnsi="Arial"/>
+                <w:b/>
+                <w:bCs/>
+                <w:sz w:val="18"/>
+                <w:szCs w:val="18"/>
+              </w:rPr>
+              <w:t xml:space="preserve">Command</w:t>
+            </w:r>
+          </w:p>
+        </w:tc>
+        <w:tc>
+          <w:tcPr>
+            <w:tcW w:type="dxa" w:w="6438"/>
+            <w:shd w:fill="D9D9D9" w:color="auto" w:val="clear"/>
+            <w:tcMar>
+              <w:top w:type="dxa" w:w="60"/>
+              <w:left w:type="dxa" w:w="100"/>
+              <w:bottom w:type="dxa" w:w="60"/>
+              <w:right w:type="dxa" w:w="100"/>
+            </w:tcMar>
+          </w:tcPr>
+          <w:p>
+            <w:r>
+              <w:rPr>
+                <w:rFonts w:ascii="Arial" w:cs="Arial" w:eastAsia="Arial" w:hAnsi="Arial"/>
+                <w:b/>
+                <w:bCs/>
+                <w:sz w:val="18"/>
+                <w:szCs w:val="18"/>
+              </w:rPr>
+              <w:t xml:space="preserve">Does</w:t>
+            </w:r>
+          </w:p>
+        </w:tc>
+      </w:tr>
+      <w:tr>
+        <w:trPr>
+          <w:cantSplit/>
+          <w:tblHeader w:val="false"/>
+        </w:trPr>
+        <w:tc>
+          <w:tcPr>
+            <w:tcW w:type="dxa" w:w="3200"/>
+            <w:tcMar>
+              <w:top w:type="dxa" w:w="60"/>
+              <w:left w:type="dxa" w:w="100"/>
+              <w:bottom w:type="dxa" w:w="60"/>
+              <w:right w:type="dxa" w:w="100"/>
+            </w:tcMar>
+          </w:tcPr>
+          <w:p>
+            <w:r>
+              <w:rPr>
+                <w:rFonts w:ascii="Courier New" w:cs="Courier New" w:eastAsia="Courier New" w:hAnsi="Courier New"/>
+                <w:sz w:val="19"/>
+                <w:szCs w:val="19"/>
+              </w:rPr>
+              <w:t xml:space="preserve">MQ PUT queue message</w:t>
+            </w:r>
+          </w:p>
+        </w:tc>
+        <w:tc>
+          <w:tcPr>
+            <w:tcW w:type="dxa" w:w="6438"/>
+            <w:tcMar>
+              <w:top w:type="dxa" w:w="60"/>
+              <w:left w:type="dxa" w:w="100"/>
+              <w:bottom w:type="dxa" w:w="60"/>
+              <w:right w:type="dxa" w:w="100"/>
+            </w:tcMar>
+          </w:tcPr>
+          <w:p>
+            <w:r>
+              <w:rPr>
+                <w:rFonts w:ascii="Times New Roman" w:cs="Times New Roman" w:eastAsia="Times New Roman" w:hAnsi="Times New Roman"/>
+                <w:sz w:val="19"/>
+                <w:szCs w:val="19"/>
+              </w:rPr>
+              <w:t xml:space="preserve">Puts a persistent message; the queue is declared durable if it does not exist.</w:t>
+            </w:r>
+          </w:p>
+        </w:tc>
+      </w:tr>
+      <w:tr>
+        <w:trPr>
+          <w:cantSplit/>
+          <w:tblHeader w:val="false"/>
+        </w:trPr>
+        <w:tc>
+          <w:tcPr>
+            <w:tcW w:type="dxa" w:w="3200"/>
+            <w:tcMar>
+              <w:top w:type="dxa" w:w="60"/>
+              <w:left w:type="dxa" w:w="100"/>
+              <w:bottom w:type="dxa" w:w="60"/>
+              <w:right w:type="dxa" w:w="100"/>
+            </w:tcMar>
+          </w:tcPr>
+          <w:p>
+            <w:r>
+              <w:rPr>
+                <w:rFonts w:ascii="Courier New" w:cs="Courier New" w:eastAsia="Courier New" w:hAnsi="Courier New"/>
+                <w:sz w:val="19"/>
+                <w:szCs w:val="19"/>
+              </w:rPr>
+              <w:t xml:space="preserve">MQ GET queue</w:t>
+            </w:r>
+          </w:p>
+        </w:tc>
+        <w:tc>
+          <w:tcPr>
+            <w:tcW w:type="dxa" w:w="6438"/>
+            <w:tcMar>
+              <w:top w:type="dxa" w:w="60"/>
+              <w:left w:type="dxa" w:w="100"/>
+              <w:bottom w:type="dxa" w:w="60"/>
+              <w:right w:type="dxa" w:w="100"/>
+            </w:tcMar>
+          </w:tcPr>
+          <w:p>
+            <w:r>
+              <w:rPr>
+                <w:rFonts w:ascii="Times New Roman" w:cs="Times New Roman" w:eastAsia="Times New Roman" w:hAnsi="Times New Roman"/>
+                <w:sz w:val="19"/>
+                <w:szCs w:val="19"/>
+              </w:rPr>
+              <w:t xml:space="preserve">Gets one message and types it; return code 4 if the queue is empty.</w:t>
+            </w:r>
+          </w:p>
+        </w:tc>
+      </w:tr>
+      <w:tr>
+        <w:trPr>
+          <w:cantSplit/>
+          <w:tblHeader w:val="false"/>
+        </w:trPr>
+        <w:tc>
+          <w:tcPr>
+            <w:tcW w:type="dxa" w:w="3200"/>
+            <w:tcMar>
+              <w:top w:type="dxa" w:w="60"/>
+              <w:left w:type="dxa" w:w="100"/>
+              <w:bottom w:type="dxa" w:w="60"/>
+              <w:right w:type="dxa" w:w="100"/>
+            </w:tcMar>
+          </w:tcPr>
+          <w:p>
+            <w:r>
+              <w:rPr>
+                <w:rFonts w:ascii="Courier New" w:cs="Courier New" w:eastAsia="Courier New" w:hAnsi="Courier New"/>
+                <w:sz w:val="19"/>
+                <w:szCs w:val="19"/>
+              </w:rPr>
+              <w:t xml:space="preserve">MQ GET queue (STACK</w:t>
+            </w:r>
+          </w:p>
+        </w:tc>
+        <w:tc>
+          <w:tcPr>
+            <w:tcW w:type="dxa" w:w="6438"/>
+            <w:tcMar>
+              <w:top w:type="dxa" w:w="60"/>
+              <w:left w:type="dxa" w:w="100"/>
+              <w:bottom w:type="dxa" w:w="60"/>
+              <w:right w:type="dxa" w:w="100"/>
+            </w:tcMar>
+          </w:tcPr>
+          <w:p>
+            <w:r>
+              <w:rPr>
+                <w:rFonts w:ascii="Times New Roman" w:cs="Times New Roman" w:eastAsia="Times New Roman" w:hAnsi="Times New Roman"/>
+                <w:sz w:val="19"/>
+                <w:szCs w:val="19"/>
+              </w:rPr>
+              <w:t xml:space="preserve">Puts the message on the program stack, a line each, for an EXEC to PULL.</w:t>
+            </w:r>
+          </w:p>
+        </w:tc>
+      </w:tr>
+      <w:tr>
+        <w:trPr>
+          <w:cantSplit/>
+          <w:tblHeader w:val="false"/>
+        </w:trPr>
+        <w:tc>
+          <w:tcPr>
+            <w:tcW w:type="dxa" w:w="3200"/>
+            <w:tcMar>
+              <w:top w:type="dxa" w:w="60"/>
+              <w:left w:type="dxa" w:w="100"/>
+              <w:bottom w:type="dxa" w:w="60"/>
+              <w:right w:type="dxa" w:w="100"/>
+            </w:tcMar>
+          </w:tcPr>
+          <w:p>
+            <w:r>
+              <w:rPr>
+                <w:rFonts w:ascii="Courier New" w:cs="Courier New" w:eastAsia="Courier New" w:hAnsi="Courier New"/>
+                <w:sz w:val="19"/>
+                <w:szCs w:val="19"/>
+              </w:rPr>
+              <w:t xml:space="preserve">MQ DEPTH queue</w:t>
+            </w:r>
+          </w:p>
+        </w:tc>
+        <w:tc>
+          <w:tcPr>
+            <w:tcW w:type="dxa" w:w="6438"/>
+            <w:tcMar>
+              <w:top w:type="dxa" w:w="60"/>
+              <w:left w:type="dxa" w:w="100"/>
+              <w:bottom w:type="dxa" w:w="60"/>
+              <w:right w:type="dxa" w:w="100"/>
+            </w:tcMar>
+          </w:tcPr>
+          <w:p>
+            <w:r>
+              <w:rPr>
+                <w:rFonts w:ascii="Times New Roman" w:cs="Times New Roman" w:eastAsia="Times New Roman" w:hAnsi="Times New Roman"/>
+                <w:sz w:val="19"/>
+                <w:szCs w:val="19"/>
+              </w:rPr>
+              <w:t xml:space="preserve">Types the number of messages waiting.</w:t>
+            </w:r>
+          </w:p>
+        </w:tc>
+      </w:tr>
+      <w:tr>
+        <w:trPr>
+          <w:cantSplit/>
+          <w:tblHeader w:val="false"/>
+        </w:trPr>
+        <w:tc>
+          <w:tcPr>
+            <w:tcW w:type="dxa" w:w="3200"/>
+            <w:tcMar>
+              <w:top w:type="dxa" w:w="60"/>
+              <w:left w:type="dxa" w:w="100"/>
+              <w:bottom w:type="dxa" w:w="60"/>
+              <w:right w:type="dxa" w:w="100"/>
+            </w:tcMar>
+          </w:tcPr>
+          <w:p>
+            <w:r>
+              <w:rPr>
+                <w:rFonts w:ascii="Courier New" w:cs="Courier New" w:eastAsia="Courier New" w:hAnsi="Courier New"/>
+                <w:sz w:val="19"/>
+                <w:szCs w:val="19"/>
+              </w:rPr>
+              <w:t xml:space="preserve">MQ PURGE queue</w:t>
+            </w:r>
+          </w:p>
+        </w:tc>
+        <w:tc>
+          <w:tcPr>
+            <w:tcW w:type="dxa" w:w="6438"/>
+            <w:tcMar>
+              <w:top w:type="dxa" w:w="60"/>
+              <w:left w:type="dxa" w:w="100"/>
+              <w:bottom w:type="dxa" w:w="60"/>
+              <w:right w:type="dxa" w:w="100"/>
+            </w:tcMar>
+          </w:tcPr>
+          <w:p>
+            <w:r>
+              <w:rPr>
+                <w:rFonts w:ascii="Times New Roman" w:cs="Times New Roman" w:eastAsia="Times New Roman" w:hAnsi="Times New Roman"/>
+                <w:sz w:val="19"/>
+                <w:szCs w:val="19"/>
+              </w:rPr>
+              <w:t xml:space="preserve">Drops all messages.</w:t>
+            </w:r>
+          </w:p>
+        </w:tc>
+      </w:tr>
+    </w:tbl>
+    <w:p>
+      <w:pPr>
+        <w:spacing w:after="200" w:before="80"/>
+      </w:pPr>
+      <w:r>
+        <w:rPr>
+          <w:rFonts w:ascii="Arial" w:cs="Arial" w:eastAsia="Arial" w:hAnsi="Arial"/>
+          <w:b/>
+          <w:bCs/>
+          <w:sz w:val="18"/>
+          <w:szCs w:val="18"/>
+        </w:rPr>
+        <w:t xml:space="preserve">Figure 27. </w:t>
+      </w:r>
+      <w:r>
+        <w:rPr>
+          <w:rFonts w:ascii="Arial" w:cs="Arial" w:eastAsia="Arial" w:hAnsi="Arial"/>
+          <w:sz w:val="18"/>
+          <w:szCs w:val="18"/>
+        </w:rPr>
+        <w:t xml:space="preserve">MQ commands</w:t>
       </w:r>
     </w:p>
     <w:p>
@@ -16266,97 +16625,125 @@
           <w:sz w:val="19"/>
           <w:szCs w:val="19"/>
         </w:rPr>
-        <w:t xml:space="preserve">TELL user AT NET message</w:t>
-      </w:r>
-      <w:r>
-        <w:rPr>
-          <w:rFonts w:ascii="Times New Roman" w:cs="Times New Roman" w:eastAsia="Times New Roman" w:hAnsi="Times New Roman"/>
-        </w:rPr>
-        <w:t xml:space="preserve"> reaches a user on the internet. The message is published on the MQTT broker of the Debian guest as topic </w:t>
-      </w:r>
-      <w:r>
-        <w:rPr>
-          <w:rFonts w:ascii="Courier New" w:cs="Courier New" w:eastAsia="Courier New" w:hAnsi="Courier New"/>
-          <w:sz w:val="19"/>
-          <w:szCs w:val="19"/>
-        </w:rPr>
-        <w:t xml:space="preserve">vm/tell/out/user</w:t>
-      </w:r>
-      <w:r>
-        <w:rPr>
-          <w:rFonts w:ascii="Times New Roman" w:cs="Times New Roman" w:eastAsia="Times New Roman" w:hAnsi="Times New Roman"/>
-        </w:rPr>
-        <w:t xml:space="preserve">, which the user reads with any MQTT client. The user answers by publishing to </w:t>
-      </w:r>
-      <w:r>
-        <w:rPr>
-          <w:rFonts w:ascii="Courier New" w:cs="Courier New" w:eastAsia="Courier New" w:hAnsi="Courier New"/>
-          <w:sz w:val="19"/>
-          <w:szCs w:val="19"/>
-        </w:rPr>
-        <w:t xml:space="preserve">vm/tell/from/user/to/userid</w:t>
-      </w:r>
-      <w:r>
-        <w:rPr>
-          <w:rFonts w:ascii="Times New Roman" w:cs="Times New Roman" w:eastAsia="Times New Roman" w:hAnsi="Times New Roman"/>
-        </w:rPr>
-        <w:t xml:space="preserve">; it arrives as </w:t>
-      </w:r>
-      <w:r>
-        <w:rPr>
-          <w:rFonts w:ascii="Courier New" w:cs="Courier New" w:eastAsia="Courier New" w:hAnsi="Courier New"/>
-          <w:sz w:val="19"/>
-          <w:szCs w:val="19"/>
-        </w:rPr>
-        <w:t xml:space="preserve">MSG FROM MAINT: (net:user) message</w:t>
-      </w:r>
-      <w:r>
-        <w:rPr>
-          <w:rFonts w:ascii="Times New Roman" w:cs="Times New Roman" w:eastAsia="Times New Roman" w:hAnsi="Times New Roman"/>
-        </w:rPr>
-        <w:t xml:space="preserve">. Outside users need a login (</w:t>
-      </w:r>
-      <w:r>
-        <w:rPr>
-          <w:rFonts w:ascii="Courier New" w:cs="Courier New" w:eastAsia="Courier New" w:hAnsi="Courier New"/>
-          <w:sz w:val="19"/>
-          <w:szCs w:val="19"/>
-        </w:rPr>
-        <w:t xml:space="preserve">tellnet-user name password</w:t>
-      </w:r>
-      <w:r>
-        <w:rPr>
-          <w:rFonts w:ascii="Times New Roman" w:cs="Times New Roman" w:eastAsia="Times New Roman" w:hAnsi="Times New Roman"/>
-        </w:rPr>
-        <w:t xml:space="preserve"> in the guest) and may only use their own TELL topics. On the PC, </w:t>
-      </w:r>
-      <w:r>
-        <w:rPr>
-          <w:rFonts w:ascii="Courier New" w:cs="Courier New" w:eastAsia="Courier New" w:hAnsi="Courier New"/>
-          <w:sz w:val="19"/>
-          <w:szCs w:val="19"/>
-        </w:rPr>
-        <w:t xml:space="preserve">tools/netfwd.py --tls cert key 8883 10.1.1.2:1883</w:t>
-      </w:r>
-      <w:r>
-        <w:rPr>
-          <w:rFonts w:ascii="Times New Roman" w:cs="Times New Roman" w:eastAsia="Times New Roman" w:hAnsi="Times New Roman"/>
-        </w:rPr>
-        <w:t xml:space="preserve"> makes the broker reachable, encrypted; the router has to forward that port to the PC. </w:t>
-      </w:r>
-      <w:r>
-        <w:rPr>
-          <w:rFonts w:ascii="Courier New" w:cs="Courier New" w:eastAsia="Courier New" w:hAnsi="Courier New"/>
-          <w:sz w:val="19"/>
-          <w:szCs w:val="19"/>
-        </w:rPr>
-        <w:t xml:space="preserve">tools/nettell.py</w:t>
-      </w:r>
-      <w:r>
-        <w:rPr>
-          <w:rFonts w:ascii="Times New Roman" w:cs="Times New Roman" w:eastAsia="Times New Roman" w:hAnsi="Times New Roman"/>
-        </w:rPr>
-        <w:t xml:space="preserve"> is a small client for the outside user.</w:t>
+        <w:t xml:space="preserve">MQ OPTIONS</w:t>
+      </w:r>
+      <w:r>
+        <w:rPr>
+          <w:rFonts w:ascii="Times New Roman" w:cs="Times New Roman" w:eastAsia="Times New Roman" w:hAnsi="Times New Roman"/>
+        </w:rPr>
+        <w:t xml:space="preserve"> (any accessed disk) names the broker, one </w:t>
+      </w:r>
+      <w:r>
+        <w:rPr>
+          <w:rFonts w:ascii="Courier New" w:cs="Courier New" w:eastAsia="Courier New" w:hAnsi="Courier New"/>
+          <w:sz w:val="19"/>
+          <w:szCs w:val="19"/>
+        </w:rPr>
+        <w:t xml:space="preserve">key value</w:t>
+      </w:r>
+      <w:r>
+        <w:rPr>
+          <w:rFonts w:ascii="Times New Roman" w:cs="Times New Roman" w:eastAsia="Times New Roman" w:hAnsi="Times New Roman"/>
+        </w:rPr>
+        <w:t xml:space="preserve"> per line: </w:t>
+      </w:r>
+      <w:r>
+        <w:rPr>
+          <w:rFonts w:ascii="Courier New" w:cs="Courier New" w:eastAsia="Courier New" w:hAnsi="Courier New"/>
+          <w:sz w:val="19"/>
+          <w:szCs w:val="19"/>
+        </w:rPr>
+        <w:t xml:space="preserve">HOST</w:t>
+      </w:r>
+      <w:r>
+        <w:rPr>
+          <w:rFonts w:ascii="Times New Roman" w:cs="Times New Roman" w:eastAsia="Times New Roman" w:hAnsi="Times New Roman"/>
+        </w:rPr>
+        <w:t xml:space="preserve">, </w:t>
+      </w:r>
+      <w:r>
+        <w:rPr>
+          <w:rFonts w:ascii="Courier New" w:cs="Courier New" w:eastAsia="Courier New" w:hAnsi="Courier New"/>
+          <w:sz w:val="19"/>
+          <w:szCs w:val="19"/>
+        </w:rPr>
+        <w:t xml:space="preserve">PORT</w:t>
+      </w:r>
+      <w:r>
+        <w:rPr>
+          <w:rFonts w:ascii="Times New Roman" w:cs="Times New Roman" w:eastAsia="Times New Roman" w:hAnsi="Times New Roman"/>
+        </w:rPr>
+        <w:t xml:space="preserve">, </w:t>
+      </w:r>
+      <w:r>
+        <w:rPr>
+          <w:rFonts w:ascii="Courier New" w:cs="Courier New" w:eastAsia="Courier New" w:hAnsi="Courier New"/>
+          <w:sz w:val="19"/>
+          <w:szCs w:val="19"/>
+        </w:rPr>
+        <w:t xml:space="preserve">USER</w:t>
+      </w:r>
+      <w:r>
+        <w:rPr>
+          <w:rFonts w:ascii="Times New Roman" w:cs="Times New Roman" w:eastAsia="Times New Roman" w:hAnsi="Times New Roman"/>
+        </w:rPr>
+        <w:t xml:space="preserve">, </w:t>
+      </w:r>
+      <w:r>
+        <w:rPr>
+          <w:rFonts w:ascii="Courier New" w:cs="Courier New" w:eastAsia="Courier New" w:hAnsi="Courier New"/>
+          <w:sz w:val="19"/>
+          <w:szCs w:val="19"/>
+        </w:rPr>
+        <w:t xml:space="preserve">PASSWORD</w:t>
+      </w:r>
+      <w:r>
+        <w:rPr>
+          <w:rFonts w:ascii="Times New Roman" w:cs="Times New Roman" w:eastAsia="Times New Roman" w:hAnsi="Times New Roman"/>
+        </w:rPr>
+        <w:t xml:space="preserve">, </w:t>
+      </w:r>
+      <w:r>
+        <w:rPr>
+          <w:rFonts w:ascii="Courier New" w:cs="Courier New" w:eastAsia="Courier New" w:hAnsi="Courier New"/>
+          <w:sz w:val="19"/>
+          <w:szCs w:val="19"/>
+        </w:rPr>
+        <w:t xml:space="preserve">VHOST</w:t>
+      </w:r>
+      <w:r>
+        <w:rPr>
+          <w:rFonts w:ascii="Times New Roman" w:cs="Times New Roman" w:eastAsia="Times New Roman" w:hAnsi="Times New Roman"/>
+        </w:rPr>
+        <w:t xml:space="preserve">. The defaults, </w:t>
+      </w:r>
+      <w:r>
+        <w:rPr>
+          <w:rFonts w:ascii="Courier New" w:cs="Courier New" w:eastAsia="Courier New" w:hAnsi="Courier New"/>
+          <w:sz w:val="19"/>
+          <w:szCs w:val="19"/>
+        </w:rPr>
+        <w:t xml:space="preserve">localhost 5672 guest guest /</w:t>
+      </w:r>
+      <w:r>
+        <w:rPr>
+          <w:rFonts w:ascii="Times New Roman" w:cs="Times New Roman" w:eastAsia="Times New Roman" w:hAnsi="Times New Roman"/>
+        </w:rPr>
+        <w:t xml:space="preserve">, reach a broker on the PC itself. Message bodies are UTF-8 on the broker and Latin-1 on CMS. </w:t>
+      </w:r>
+      <w:r>
+        <w:rPr>
+          <w:rFonts w:ascii="Courier New" w:cs="Courier New" w:eastAsia="Courier New" w:hAnsi="Courier New"/>
+          <w:sz w:val="19"/>
+          <w:szCs w:val="19"/>
+        </w:rPr>
+        <w:t xml:space="preserve">MQTEST</w:t>
+      </w:r>
+      <w:r>
+        <w:rPr>
+          <w:rFonts w:ascii="Times New Roman" w:cs="Times New Roman" w:eastAsia="Times New Roman" w:hAnsi="Times New Roman"/>
+        </w:rPr>
+        <w:t xml:space="preserve"> is an example EXEC.</w:t>
       </w:r>
     </w:p>
     <w:tbl>
@@ -16399,7 +16786,7 @@
                 <w:sz w:val="17"/>
                 <w:szCs w:val="17"/>
               </w:rPr>
-              <w:t xml:space="preserve">mqtt sub vm/test 1 20</w:t>
+              <w:t xml:space="preserve">mq put orders 3 widgets for Zurich</w:t>
             </w:r>
           </w:p>
           <w:p>
@@ -16412,7 +16799,72 @@
                 <w:sz w:val="17"/>
                 <w:szCs w:val="17"/>
               </w:rPr>
-              <w:t xml:space="preserve">vm/test hello from linux</w:t>
+              <w:t xml:space="preserve">Ready;</w:t>
+            </w:r>
+          </w:p>
+          <w:p>
+            <w:pPr>
+              <w:spacing w:after="0" w:line="228"/>
+            </w:pPr>
+            <w:r>
+              <w:rPr>
+                <w:rFonts w:ascii="Courier New" w:cs="Courier New" w:eastAsia="Courier New" w:hAnsi="Courier New"/>
+                <w:sz w:val="17"/>
+                <w:szCs w:val="17"/>
+              </w:rPr>
+              <w:t xml:space="preserve">mq depth orders</w:t>
+            </w:r>
+          </w:p>
+          <w:p>
+            <w:pPr>
+              <w:spacing w:after="0" w:line="228"/>
+            </w:pPr>
+            <w:r>
+              <w:rPr>
+                <w:rFonts w:ascii="Courier New" w:cs="Courier New" w:eastAsia="Courier New" w:hAnsi="Courier New"/>
+                <w:sz w:val="17"/>
+                <w:szCs w:val="17"/>
+              </w:rPr>
+              <w:t xml:space="preserve">1</w:t>
+            </w:r>
+          </w:p>
+          <w:p>
+            <w:pPr>
+              <w:spacing w:after="0" w:line="228"/>
+            </w:pPr>
+            <w:r>
+              <w:rPr>
+                <w:rFonts w:ascii="Courier New" w:cs="Courier New" w:eastAsia="Courier New" w:hAnsi="Courier New"/>
+                <w:sz w:val="17"/>
+                <w:szCs w:val="17"/>
+              </w:rPr>
+              <w:t xml:space="preserve">Ready;</w:t>
+            </w:r>
+          </w:p>
+          <w:p>
+            <w:pPr>
+              <w:spacing w:after="0" w:line="228"/>
+            </w:pPr>
+            <w:r>
+              <w:rPr>
+                <w:rFonts w:ascii="Courier New" w:cs="Courier New" w:eastAsia="Courier New" w:hAnsi="Courier New"/>
+                <w:sz w:val="17"/>
+                <w:szCs w:val="17"/>
+              </w:rPr>
+              <w:t xml:space="preserve">mq get orders</w:t>
+            </w:r>
+          </w:p>
+          <w:p>
+            <w:pPr>
+              <w:spacing w:after="0" w:line="228"/>
+            </w:pPr>
+            <w:r>
+              <w:rPr>
+                <w:rFonts w:ascii="Courier New" w:cs="Courier New" w:eastAsia="Courier New" w:hAnsi="Courier New"/>
+                <w:sz w:val="17"/>
+                <w:szCs w:val="17"/>
+              </w:rPr>
+              <w:t xml:space="preserve">3 widgets for Zurich</w:t>
             </w:r>
           </w:p>
           <w:p>
@@ -16443,7 +16895,7 @@
           <w:sz w:val="18"/>
           <w:szCs w:val="18"/>
         </w:rPr>
-        <w:t xml:space="preserve">Figure 27. </w:t>
+        <w:t xml:space="preserve">Figure 28. </w:t>
       </w:r>
       <w:r>
         <w:rPr>
@@ -16451,7 +16903,7 @@
           <w:sz w:val="18"/>
           <w:szCs w:val="18"/>
         </w:rPr>
-        <w:t xml:space="preserve">A message from Linux arrives on CMS</w:t>
+        <w:t xml:space="preserve">A queue on the PC’s RabbitMQ</w:t>
       </w:r>
     </w:p>
     <w:p>
@@ -16459,7 +16911,7 @@
         <w:pStyle w:val="Heading2"/>
       </w:pPr>
       <w:r>
-        <w:t xml:space="preserve">RXPIP: REXX packages</w:t>
+        <w:t xml:space="preserve">TELL</w:t>
       </w:r>
     </w:p>
     <w:p>
@@ -16468,37 +16920,87 @@
       </w:pPr>
       <w:r>
         <w:rPr>
-          <w:rFonts w:ascii="Times New Roman" w:cs="Times New Roman" w:eastAsia="Times New Roman" w:hAnsi="Times New Roman"/>
-        </w:rPr>
-        <w:t xml:space="preserve">RXPIP is the package manager of rexxpository: REXX routines are published as packages, and a program names what it needs with </w:t>
-      </w:r>
-      <w:r>
-        <w:rPr>
-          <w:rFonts w:ascii="Courier New" w:cs="Courier New" w:eastAsia="Courier New" w:hAnsi="Courier New"/>
-          <w:sz w:val="19"/>
-          <w:szCs w:val="19"/>
-        </w:rPr>
-        <w:t xml:space="preserve">/* REQUIRE pkg */</w:t>
-      </w:r>
-      <w:r>
-        <w:rPr>
-          <w:rFonts w:ascii="Times New Roman" w:cs="Times New Roman" w:eastAsia="Times New Roman" w:hAnsi="Times New Roman"/>
-        </w:rPr>
-        <w:t xml:space="preserve"> comments. The repository server and the rxpip client run in the Debian guest; the bridge service </w:t>
-      </w:r>
-      <w:r>
-        <w:rPr>
-          <w:rFonts w:ascii="Courier New" w:cs="Courier New" w:eastAsia="Courier New" w:hAnsi="Courier New"/>
-          <w:sz w:val="19"/>
-          <w:szCs w:val="19"/>
-        </w:rPr>
-        <w:t xml:space="preserve">rxpip</w:t>
-      </w:r>
-      <w:r>
-        <w:rPr>
-          <w:rFonts w:ascii="Times New Roman" w:cs="Times New Roman" w:eastAsia="Times New Roman" w:hAnsi="Times New Roman"/>
-        </w:rPr>
-        <w:t xml:space="preserve"> serves CMS users.</w:t>
+          <w:rFonts w:ascii="Courier New" w:cs="Courier New" w:eastAsia="Courier New" w:hAnsi="Courier New"/>
+          <w:sz w:val="19"/>
+          <w:szCs w:val="19"/>
+        </w:rPr>
+        <w:t xml:space="preserve">TELL userid message</w:t>
+      </w:r>
+      <w:r>
+        <w:rPr>
+          <w:rFonts w:ascii="Times New Roman" w:cs="Times New Roman" w:eastAsia="Times New Roman" w:hAnsi="Times New Roman"/>
+        </w:rPr>
+        <w:t xml:space="preserve"> sends a message to a VM/370 user (CP MSG). </w:t>
+      </w:r>
+      <w:r>
+        <w:rPr>
+          <w:rFonts w:ascii="Courier New" w:cs="Courier New" w:eastAsia="Courier New" w:hAnsi="Courier New"/>
+          <w:sz w:val="19"/>
+          <w:szCs w:val="19"/>
+        </w:rPr>
+        <w:t xml:space="preserve">TELL user AT LINUX message</w:t>
+      </w:r>
+      <w:r>
+        <w:rPr>
+          <w:rFonts w:ascii="Times New Roman" w:cs="Times New Roman" w:eastAsia="Times New Roman" w:hAnsi="Times New Roman"/>
+        </w:rPr>
+        <w:t xml:space="preserve"> sends it to a user of the Debian guest through the spool bridge: it appears on that user’s terminals, and is kept until the user reads it with </w:t>
+      </w:r>
+      <w:r>
+        <w:rPr>
+          <w:rFonts w:ascii="Courier New" w:cs="Courier New" w:eastAsia="Courier New" w:hAnsi="Courier New"/>
+          <w:sz w:val="19"/>
+          <w:szCs w:val="19"/>
+        </w:rPr>
+        <w:t xml:space="preserve">tell</w:t>
+      </w:r>
+      <w:r>
+        <w:rPr>
+          <w:rFonts w:ascii="Times New Roman" w:cs="Times New Roman" w:eastAsia="Times New Roman" w:hAnsi="Times New Roman"/>
+        </w:rPr>
+        <w:t xml:space="preserve">. </w:t>
+      </w:r>
+      <w:r>
+        <w:rPr>
+          <w:rFonts w:ascii="Courier New" w:cs="Courier New" w:eastAsia="Courier New" w:hAnsi="Courier New"/>
+          <w:sz w:val="19"/>
+          <w:szCs w:val="19"/>
+        </w:rPr>
+        <w:t xml:space="preserve">TELL ALL AT LINUX message</w:t>
+      </w:r>
+      <w:r>
+        <w:rPr>
+          <w:rFonts w:ascii="Times New Roman" w:cs="Times New Roman" w:eastAsia="Times New Roman" w:hAnsi="Times New Roman"/>
+        </w:rPr>
+        <w:t xml:space="preserve"> reaches everybody logged on to Linux. A Linux user answers with </w:t>
+      </w:r>
+      <w:r>
+        <w:rPr>
+          <w:rFonts w:ascii="Courier New" w:cs="Courier New" w:eastAsia="Courier New" w:hAnsi="Courier New"/>
+          <w:sz w:val="19"/>
+          <w:szCs w:val="19"/>
+        </w:rPr>
+        <w:t xml:space="preserve">tell userid message</w:t>
+      </w:r>
+      <w:r>
+        <w:rPr>
+          <w:rFonts w:ascii="Times New Roman" w:cs="Times New Roman" w:eastAsia="Times New Roman" w:hAnsi="Times New Roman"/>
+        </w:rPr>
+        <w:t xml:space="preserve">, which arrives on CMS as </w:t>
+      </w:r>
+      <w:r>
+        <w:rPr>
+          <w:rFonts w:ascii="Courier New" w:cs="Courier New" w:eastAsia="Courier New" w:hAnsi="Courier New"/>
+          <w:sz w:val="19"/>
+          <w:szCs w:val="19"/>
+        </w:rPr>
+        <w:t xml:space="preserve">MSG FROM MAINT: (user) message</w:t>
+      </w:r>
+      <w:r>
+        <w:rPr>
+          <w:rFonts w:ascii="Times New Roman" w:cs="Times New Roman" w:eastAsia="Times New Roman" w:hAnsi="Times New Roman"/>
+        </w:rPr>
+        <w:t xml:space="preserve">.</w:t>
       </w:r>
     </w:p>
     <w:p>
@@ -16511,125 +17013,97 @@
           <w:sz w:val="19"/>
           <w:szCs w:val="19"/>
         </w:rPr>
-        <w:t xml:space="preserve">RXPIP AVAIL</w:t>
-      </w:r>
-      <w:r>
-        <w:rPr>
-          <w:rFonts w:ascii="Times New Roman" w:cs="Times New Roman" w:eastAsia="Times New Roman" w:hAnsi="Times New Roman"/>
-        </w:rPr>
-        <w:t xml:space="preserve">, </w:t>
-      </w:r>
-      <w:r>
-        <w:rPr>
-          <w:rFonts w:ascii="Courier New" w:cs="Courier New" w:eastAsia="Courier New" w:hAnsi="Courier New"/>
-          <w:sz w:val="19"/>
-          <w:szCs w:val="19"/>
-        </w:rPr>
-        <w:t xml:space="preserve">RXPIP SEARCH term</w:t>
-      </w:r>
-      <w:r>
-        <w:rPr>
-          <w:rFonts w:ascii="Times New Roman" w:cs="Times New Roman" w:eastAsia="Times New Roman" w:hAnsi="Times New Roman"/>
-        </w:rPr>
-        <w:t xml:space="preserve"> and </w:t>
-      </w:r>
-      <w:r>
-        <w:rPr>
-          <w:rFonts w:ascii="Courier New" w:cs="Courier New" w:eastAsia="Courier New" w:hAnsi="Courier New"/>
-          <w:sz w:val="19"/>
-          <w:szCs w:val="19"/>
-        </w:rPr>
-        <w:t xml:space="preserve">RXPIP SHOW name</w:t>
-      </w:r>
-      <w:r>
-        <w:rPr>
-          <w:rFonts w:ascii="Times New Roman" w:cs="Times New Roman" w:eastAsia="Times New Roman" w:hAnsi="Times New Roman"/>
-        </w:rPr>
-        <w:t xml:space="preserve"> ask the repository. </w:t>
-      </w:r>
-      <w:r>
-        <w:rPr>
-          <w:rFonts w:ascii="Courier New" w:cs="Courier New" w:eastAsia="Courier New" w:hAnsi="Courier New"/>
-          <w:sz w:val="19"/>
-          <w:szCs w:val="19"/>
-        </w:rPr>
-        <w:t xml:space="preserve">RXPIP BUILD fn</w:t>
-      </w:r>
-      <w:r>
-        <w:rPr>
-          <w:rFonts w:ascii="Times New Roman" w:cs="Times New Roman" w:eastAsia="Times New Roman" w:hAnsi="Times New Roman"/>
-        </w:rPr>
-        <w:t xml:space="preserve"> takes </w:t>
-      </w:r>
-      <w:r>
-        <w:rPr>
-          <w:rFonts w:ascii="Courier New" w:cs="Courier New" w:eastAsia="Courier New" w:hAnsi="Courier New"/>
-          <w:sz w:val="19"/>
-          <w:szCs w:val="19"/>
-        </w:rPr>
-        <w:t xml:space="preserve">fn REXX</w:t>
-      </w:r>
-      <w:r>
-        <w:rPr>
-          <w:rFonts w:ascii="Times New Roman" w:cs="Times New Roman" w:eastAsia="Times New Roman" w:hAnsi="Times New Roman"/>
-        </w:rPr>
-        <w:t xml:space="preserve">, installs the packages it requires and writes </w:t>
-      </w:r>
-      <w:r>
-        <w:rPr>
-          <w:rFonts w:ascii="Courier New" w:cs="Courier New" w:eastAsia="Courier New" w:hAnsi="Courier New"/>
-          <w:sz w:val="19"/>
-          <w:szCs w:val="19"/>
-        </w:rPr>
-        <w:t xml:space="preserve">fn EXEC A</w:t>
-      </w:r>
-      <w:r>
-        <w:rPr>
-          <w:rFonts w:ascii="Times New Roman" w:cs="Times New Roman" w:eastAsia="Times New Roman" w:hAnsi="Times New Roman"/>
-        </w:rPr>
-        <w:t xml:space="preserve">, a standalone program with the packages merged in; </w:t>
-      </w:r>
-      <w:r>
-        <w:rPr>
-          <w:rFonts w:ascii="Courier New" w:cs="Courier New" w:eastAsia="Courier New" w:hAnsi="Courier New"/>
-          <w:sz w:val="19"/>
-          <w:szCs w:val="19"/>
-        </w:rPr>
-        <w:t xml:space="preserve">RXPIP RUN fn [args]</w:t>
-      </w:r>
-      <w:r>
-        <w:rPr>
-          <w:rFonts w:ascii="Times New Roman" w:cs="Times New Roman" w:eastAsia="Times New Roman" w:hAnsi="Times New Roman"/>
-        </w:rPr>
-        <w:t xml:space="preserve"> builds and runs it. </w:t>
-      </w:r>
-      <w:r>
-        <w:rPr>
-          <w:rFonts w:ascii="Courier New" w:cs="Courier New" w:eastAsia="Courier New" w:hAnsi="Courier New"/>
-          <w:sz w:val="19"/>
-          <w:szCs w:val="19"/>
-        </w:rPr>
-        <w:t xml:space="preserve">RXPIP GET name</w:t>
-      </w:r>
-      <w:r>
-        <w:rPr>
-          <w:rFonts w:ascii="Times New Roman" w:cs="Times New Roman" w:eastAsia="Times New Roman" w:hAnsi="Times New Roman"/>
-        </w:rPr>
-        <w:t xml:space="preserve"> fetches a package as </w:t>
-      </w:r>
-      <w:r>
-        <w:rPr>
-          <w:rFonts w:ascii="Courier New" w:cs="Courier New" w:eastAsia="Courier New" w:hAnsi="Courier New"/>
-          <w:sz w:val="19"/>
-          <w:szCs w:val="19"/>
-        </w:rPr>
-        <w:t xml:space="preserve">file REXX A</w:t>
-      </w:r>
-      <w:r>
-        <w:rPr>
-          <w:rFonts w:ascii="Times New Roman" w:cs="Times New Roman" w:eastAsia="Times New Roman" w:hAnsi="Times New Roman"/>
-        </w:rPr>
-        <w:t xml:space="preserve">.</w:t>
+        <w:t xml:space="preserve">TELL user AT NET message</w:t>
+      </w:r>
+      <w:r>
+        <w:rPr>
+          <w:rFonts w:ascii="Times New Roman" w:cs="Times New Roman" w:eastAsia="Times New Roman" w:hAnsi="Times New Roman"/>
+        </w:rPr>
+        <w:t xml:space="preserve"> reaches a user on the internet. The message is published on the MQTT broker of the Debian guest as topic </w:t>
+      </w:r>
+      <w:r>
+        <w:rPr>
+          <w:rFonts w:ascii="Courier New" w:cs="Courier New" w:eastAsia="Courier New" w:hAnsi="Courier New"/>
+          <w:sz w:val="19"/>
+          <w:szCs w:val="19"/>
+        </w:rPr>
+        <w:t xml:space="preserve">vm/tell/out/user</w:t>
+      </w:r>
+      <w:r>
+        <w:rPr>
+          <w:rFonts w:ascii="Times New Roman" w:cs="Times New Roman" w:eastAsia="Times New Roman" w:hAnsi="Times New Roman"/>
+        </w:rPr>
+        <w:t xml:space="preserve">, which the user reads with any MQTT client. The user answers by publishing to </w:t>
+      </w:r>
+      <w:r>
+        <w:rPr>
+          <w:rFonts w:ascii="Courier New" w:cs="Courier New" w:eastAsia="Courier New" w:hAnsi="Courier New"/>
+          <w:sz w:val="19"/>
+          <w:szCs w:val="19"/>
+        </w:rPr>
+        <w:t xml:space="preserve">vm/tell/from/user/to/userid</w:t>
+      </w:r>
+      <w:r>
+        <w:rPr>
+          <w:rFonts w:ascii="Times New Roman" w:cs="Times New Roman" w:eastAsia="Times New Roman" w:hAnsi="Times New Roman"/>
+        </w:rPr>
+        <w:t xml:space="preserve">; it arrives as </w:t>
+      </w:r>
+      <w:r>
+        <w:rPr>
+          <w:rFonts w:ascii="Courier New" w:cs="Courier New" w:eastAsia="Courier New" w:hAnsi="Courier New"/>
+          <w:sz w:val="19"/>
+          <w:szCs w:val="19"/>
+        </w:rPr>
+        <w:t xml:space="preserve">MSG FROM MAINT: (net:user) message</w:t>
+      </w:r>
+      <w:r>
+        <w:rPr>
+          <w:rFonts w:ascii="Times New Roman" w:cs="Times New Roman" w:eastAsia="Times New Roman" w:hAnsi="Times New Roman"/>
+        </w:rPr>
+        <w:t xml:space="preserve">. Outside users need a login (</w:t>
+      </w:r>
+      <w:r>
+        <w:rPr>
+          <w:rFonts w:ascii="Courier New" w:cs="Courier New" w:eastAsia="Courier New" w:hAnsi="Courier New"/>
+          <w:sz w:val="19"/>
+          <w:szCs w:val="19"/>
+        </w:rPr>
+        <w:t xml:space="preserve">tellnet-user name password</w:t>
+      </w:r>
+      <w:r>
+        <w:rPr>
+          <w:rFonts w:ascii="Times New Roman" w:cs="Times New Roman" w:eastAsia="Times New Roman" w:hAnsi="Times New Roman"/>
+        </w:rPr>
+        <w:t xml:space="preserve"> in the guest) and may only use their own TELL topics. On the PC, </w:t>
+      </w:r>
+      <w:r>
+        <w:rPr>
+          <w:rFonts w:ascii="Courier New" w:cs="Courier New" w:eastAsia="Courier New" w:hAnsi="Courier New"/>
+          <w:sz w:val="19"/>
+          <w:szCs w:val="19"/>
+        </w:rPr>
+        <w:t xml:space="preserve">tools/netfwd.py --tls cert key 8883 10.1.1.2:1883</w:t>
+      </w:r>
+      <w:r>
+        <w:rPr>
+          <w:rFonts w:ascii="Times New Roman" w:cs="Times New Roman" w:eastAsia="Times New Roman" w:hAnsi="Times New Roman"/>
+        </w:rPr>
+        <w:t xml:space="preserve"> makes the broker reachable, encrypted; the router has to forward that port to the PC. </w:t>
+      </w:r>
+      <w:r>
+        <w:rPr>
+          <w:rFonts w:ascii="Courier New" w:cs="Courier New" w:eastAsia="Courier New" w:hAnsi="Courier New"/>
+          <w:sz w:val="19"/>
+          <w:szCs w:val="19"/>
+        </w:rPr>
+        <w:t xml:space="preserve">tools/nettell.py</w:t>
+      </w:r>
+      <w:r>
+        <w:rPr>
+          <w:rFonts w:ascii="Times New Roman" w:cs="Times New Roman" w:eastAsia="Times New Roman" w:hAnsi="Times New Roman"/>
+        </w:rPr>
+        <w:t xml:space="preserve"> is a small client for the outside user.</w:t>
       </w:r>
     </w:p>
     <w:tbl>
@@ -16672,7 +17146,7 @@
                 <w:sz w:val="17"/>
                 <w:szCs w:val="17"/>
               </w:rPr>
-              <w:t xml:space="preserve">rxpip run demo</w:t>
+              <w:t xml:space="preserve">mqtt sub vm/test 1 20</w:t>
             </w:r>
           </w:p>
           <w:p>
@@ -16685,59 +17159,7 @@
                 <w:sz w:val="17"/>
                 <w:szCs w:val="17"/>
               </w:rPr>
-              <w:t xml:space="preserve">rxpip: mathutils 1.0.0 already installed</w:t>
-            </w:r>
-          </w:p>
-          <w:p>
-            <w:pPr>
-              <w:spacing w:after="0" w:line="228"/>
-            </w:pPr>
-            <w:r>
-              <w:rPr>
-                <w:rFonts w:ascii="Courier New" w:cs="Courier New" w:eastAsia="Courier New" w:hAnsi="Courier New"/>
-                <w:sz w:val="17"/>
-                <w:szCs w:val="17"/>
-              </w:rPr>
-              <w:t xml:space="preserve">rxpip: greetutils 1.0.0 already installed</w:t>
-            </w:r>
-          </w:p>
-          <w:p>
-            <w:pPr>
-              <w:spacing w:after="0" w:line="228"/>
-            </w:pPr>
-            <w:r>
-              <w:rPr>
-                <w:rFonts w:ascii="Courier New" w:cs="Courier New" w:eastAsia="Courier New" w:hAnsi="Courier New"/>
-                <w:sz w:val="17"/>
-                <w:szCs w:val="17"/>
-              </w:rPr>
-              <w:t xml:space="preserve">RXPIP: DEMO EXEC A written, 71 lines</w:t>
-            </w:r>
-          </w:p>
-          <w:p>
-            <w:pPr>
-              <w:spacing w:after="0" w:line="228"/>
-            </w:pPr>
-            <w:r>
-              <w:rPr>
-                <w:rFonts w:ascii="Courier New" w:cs="Courier New" w:eastAsia="Courier New" w:hAnsi="Courier New"/>
-                <w:sz w:val="17"/>
-                <w:szCs w:val="17"/>
-              </w:rPr>
-              <w:t xml:space="preserve">HELLO, WORLD!!!</w:t>
-            </w:r>
-          </w:p>
-          <w:p>
-            <w:pPr>
-              <w:spacing w:after="0" w:line="228"/>
-            </w:pPr>
-            <w:r>
-              <w:rPr>
-                <w:rFonts w:ascii="Courier New" w:cs="Courier New" w:eastAsia="Courier New" w:hAnsi="Courier New"/>
-                <w:sz w:val="17"/>
-                <w:szCs w:val="17"/>
-              </w:rPr>
-              <w:t xml:space="preserve">square of 7 is 49</w:t>
+              <w:t xml:space="preserve">vm/test hello from linux</w:t>
             </w:r>
           </w:p>
           <w:p>
@@ -16768,7 +17190,332 @@
           <w:sz w:val="18"/>
           <w:szCs w:val="18"/>
         </w:rPr>
-        <w:t xml:space="preserve">Figure 28. </w:t>
+        <w:t xml:space="preserve">Figure 29. </w:t>
+      </w:r>
+      <w:r>
+        <w:rPr>
+          <w:rFonts w:ascii="Arial" w:cs="Arial" w:eastAsia="Arial" w:hAnsi="Arial"/>
+          <w:sz w:val="18"/>
+          <w:szCs w:val="18"/>
+        </w:rPr>
+        <w:t xml:space="preserve">A message from Linux arrives on CMS</w:t>
+      </w:r>
+    </w:p>
+    <w:p>
+      <w:pPr>
+        <w:pStyle w:val="Heading2"/>
+      </w:pPr>
+      <w:r>
+        <w:t xml:space="preserve">RXPIP: REXX packages</w:t>
+      </w:r>
+    </w:p>
+    <w:p>
+      <w:pPr>
+        <w:spacing w:after="120"/>
+      </w:pPr>
+      <w:r>
+        <w:rPr>
+          <w:rFonts w:ascii="Times New Roman" w:cs="Times New Roman" w:eastAsia="Times New Roman" w:hAnsi="Times New Roman"/>
+        </w:rPr>
+        <w:t xml:space="preserve">RXPIP is the package manager of rexxpository: REXX routines are published as packages, and a program names what it needs with </w:t>
+      </w:r>
+      <w:r>
+        <w:rPr>
+          <w:rFonts w:ascii="Courier New" w:cs="Courier New" w:eastAsia="Courier New" w:hAnsi="Courier New"/>
+          <w:sz w:val="19"/>
+          <w:szCs w:val="19"/>
+        </w:rPr>
+        <w:t xml:space="preserve">/* REQUIRE pkg */</w:t>
+      </w:r>
+      <w:r>
+        <w:rPr>
+          <w:rFonts w:ascii="Times New Roman" w:cs="Times New Roman" w:eastAsia="Times New Roman" w:hAnsi="Times New Roman"/>
+        </w:rPr>
+        <w:t xml:space="preserve"> comments. The repository server and the rxpip client run in the Debian guest; the bridge service </w:t>
+      </w:r>
+      <w:r>
+        <w:rPr>
+          <w:rFonts w:ascii="Courier New" w:cs="Courier New" w:eastAsia="Courier New" w:hAnsi="Courier New"/>
+          <w:sz w:val="19"/>
+          <w:szCs w:val="19"/>
+        </w:rPr>
+        <w:t xml:space="preserve">rxpip</w:t>
+      </w:r>
+      <w:r>
+        <w:rPr>
+          <w:rFonts w:ascii="Times New Roman" w:cs="Times New Roman" w:eastAsia="Times New Roman" w:hAnsi="Times New Roman"/>
+        </w:rPr>
+        <w:t xml:space="preserve"> serves CMS users.</w:t>
+      </w:r>
+    </w:p>
+    <w:p>
+      <w:pPr>
+        <w:spacing w:after="120"/>
+      </w:pPr>
+      <w:r>
+        <w:rPr>
+          <w:rFonts w:ascii="Courier New" w:cs="Courier New" w:eastAsia="Courier New" w:hAnsi="Courier New"/>
+          <w:sz w:val="19"/>
+          <w:szCs w:val="19"/>
+        </w:rPr>
+        <w:t xml:space="preserve">RXPIP AVAIL</w:t>
+      </w:r>
+      <w:r>
+        <w:rPr>
+          <w:rFonts w:ascii="Times New Roman" w:cs="Times New Roman" w:eastAsia="Times New Roman" w:hAnsi="Times New Roman"/>
+        </w:rPr>
+        <w:t xml:space="preserve">, </w:t>
+      </w:r>
+      <w:r>
+        <w:rPr>
+          <w:rFonts w:ascii="Courier New" w:cs="Courier New" w:eastAsia="Courier New" w:hAnsi="Courier New"/>
+          <w:sz w:val="19"/>
+          <w:szCs w:val="19"/>
+        </w:rPr>
+        <w:t xml:space="preserve">RXPIP SEARCH term</w:t>
+      </w:r>
+      <w:r>
+        <w:rPr>
+          <w:rFonts w:ascii="Times New Roman" w:cs="Times New Roman" w:eastAsia="Times New Roman" w:hAnsi="Times New Roman"/>
+        </w:rPr>
+        <w:t xml:space="preserve"> and </w:t>
+      </w:r>
+      <w:r>
+        <w:rPr>
+          <w:rFonts w:ascii="Courier New" w:cs="Courier New" w:eastAsia="Courier New" w:hAnsi="Courier New"/>
+          <w:sz w:val="19"/>
+          <w:szCs w:val="19"/>
+        </w:rPr>
+        <w:t xml:space="preserve">RXPIP SHOW name</w:t>
+      </w:r>
+      <w:r>
+        <w:rPr>
+          <w:rFonts w:ascii="Times New Roman" w:cs="Times New Roman" w:eastAsia="Times New Roman" w:hAnsi="Times New Roman"/>
+        </w:rPr>
+        <w:t xml:space="preserve"> ask the repository. </w:t>
+      </w:r>
+      <w:r>
+        <w:rPr>
+          <w:rFonts w:ascii="Courier New" w:cs="Courier New" w:eastAsia="Courier New" w:hAnsi="Courier New"/>
+          <w:sz w:val="19"/>
+          <w:szCs w:val="19"/>
+        </w:rPr>
+        <w:t xml:space="preserve">RXPIP BUILD fn</w:t>
+      </w:r>
+      <w:r>
+        <w:rPr>
+          <w:rFonts w:ascii="Times New Roman" w:cs="Times New Roman" w:eastAsia="Times New Roman" w:hAnsi="Times New Roman"/>
+        </w:rPr>
+        <w:t xml:space="preserve"> takes </w:t>
+      </w:r>
+      <w:r>
+        <w:rPr>
+          <w:rFonts w:ascii="Courier New" w:cs="Courier New" w:eastAsia="Courier New" w:hAnsi="Courier New"/>
+          <w:sz w:val="19"/>
+          <w:szCs w:val="19"/>
+        </w:rPr>
+        <w:t xml:space="preserve">fn REXX</w:t>
+      </w:r>
+      <w:r>
+        <w:rPr>
+          <w:rFonts w:ascii="Times New Roman" w:cs="Times New Roman" w:eastAsia="Times New Roman" w:hAnsi="Times New Roman"/>
+        </w:rPr>
+        <w:t xml:space="preserve">, installs the packages it requires and writes </w:t>
+      </w:r>
+      <w:r>
+        <w:rPr>
+          <w:rFonts w:ascii="Courier New" w:cs="Courier New" w:eastAsia="Courier New" w:hAnsi="Courier New"/>
+          <w:sz w:val="19"/>
+          <w:szCs w:val="19"/>
+        </w:rPr>
+        <w:t xml:space="preserve">fn EXEC A</w:t>
+      </w:r>
+      <w:r>
+        <w:rPr>
+          <w:rFonts w:ascii="Times New Roman" w:cs="Times New Roman" w:eastAsia="Times New Roman" w:hAnsi="Times New Roman"/>
+        </w:rPr>
+        <w:t xml:space="preserve">, a standalone program with the packages merged in; </w:t>
+      </w:r>
+      <w:r>
+        <w:rPr>
+          <w:rFonts w:ascii="Courier New" w:cs="Courier New" w:eastAsia="Courier New" w:hAnsi="Courier New"/>
+          <w:sz w:val="19"/>
+          <w:szCs w:val="19"/>
+        </w:rPr>
+        <w:t xml:space="preserve">RXPIP RUN fn [args]</w:t>
+      </w:r>
+      <w:r>
+        <w:rPr>
+          <w:rFonts w:ascii="Times New Roman" w:cs="Times New Roman" w:eastAsia="Times New Roman" w:hAnsi="Times New Roman"/>
+        </w:rPr>
+        <w:t xml:space="preserve"> builds and runs it. </w:t>
+      </w:r>
+      <w:r>
+        <w:rPr>
+          <w:rFonts w:ascii="Courier New" w:cs="Courier New" w:eastAsia="Courier New" w:hAnsi="Courier New"/>
+          <w:sz w:val="19"/>
+          <w:szCs w:val="19"/>
+        </w:rPr>
+        <w:t xml:space="preserve">RXPIP GET name</w:t>
+      </w:r>
+      <w:r>
+        <w:rPr>
+          <w:rFonts w:ascii="Times New Roman" w:cs="Times New Roman" w:eastAsia="Times New Roman" w:hAnsi="Times New Roman"/>
+        </w:rPr>
+        <w:t xml:space="preserve"> fetches a package as </w:t>
+      </w:r>
+      <w:r>
+        <w:rPr>
+          <w:rFonts w:ascii="Courier New" w:cs="Courier New" w:eastAsia="Courier New" w:hAnsi="Courier New"/>
+          <w:sz w:val="19"/>
+          <w:szCs w:val="19"/>
+        </w:rPr>
+        <w:t xml:space="preserve">file REXX A</w:t>
+      </w:r>
+      <w:r>
+        <w:rPr>
+          <w:rFonts w:ascii="Times New Roman" w:cs="Times New Roman" w:eastAsia="Times New Roman" w:hAnsi="Times New Roman"/>
+        </w:rPr>
+        <w:t xml:space="preserve">.</w:t>
+      </w:r>
+    </w:p>
+    <w:tbl>
+      <w:tblPr>
+        <w:tblW w:type="dxa" w:w="9638"/>
+        <w:tblBorders>
+          <w:top w:val="single" w:color="auto" w:sz="4"/>
+          <w:left w:val="single" w:color="auto" w:sz="4"/>
+          <w:bottom w:val="single" w:color="auto" w:sz="4"/>
+          <w:right w:val="single" w:color="auto" w:sz="4"/>
+          <w:insideH w:val="single" w:color="auto" w:sz="4"/>
+          <w:insideV w:val="single" w:color="auto" w:sz="4"/>
+        </w:tblBorders>
+      </w:tblPr>
+      <w:tblGrid>
+        <w:gridCol w:w="9638"/>
+      </w:tblGrid>
+      <w:tr>
+        <w:trPr>
+          <w:cantSplit/>
+        </w:trPr>
+        <w:tc>
+          <w:tcPr>
+            <w:tcW w:type="dxa" w:w="9638"/>
+            <w:shd w:fill="F2F2F2" w:color="auto" w:val="clear"/>
+            <w:tcMar>
+              <w:top w:type="dxa" w:w="100"/>
+              <w:left w:type="dxa" w:w="140"/>
+              <w:bottom w:type="dxa" w:w="100"/>
+              <w:right w:type="dxa" w:w="140"/>
+            </w:tcMar>
+          </w:tcPr>
+          <w:p>
+            <w:pPr>
+              <w:spacing w:after="0" w:line="228"/>
+            </w:pPr>
+            <w:r>
+              <w:rPr>
+                <w:rFonts w:ascii="Courier New" w:cs="Courier New" w:eastAsia="Courier New" w:hAnsi="Courier New"/>
+                <w:sz w:val="17"/>
+                <w:szCs w:val="17"/>
+              </w:rPr>
+              <w:t xml:space="preserve">rxpip run demo</w:t>
+            </w:r>
+          </w:p>
+          <w:p>
+            <w:pPr>
+              <w:spacing w:after="0" w:line="228"/>
+            </w:pPr>
+            <w:r>
+              <w:rPr>
+                <w:rFonts w:ascii="Courier New" w:cs="Courier New" w:eastAsia="Courier New" w:hAnsi="Courier New"/>
+                <w:sz w:val="17"/>
+                <w:szCs w:val="17"/>
+              </w:rPr>
+              <w:t xml:space="preserve">rxpip: mathutils 1.0.0 already installed</w:t>
+            </w:r>
+          </w:p>
+          <w:p>
+            <w:pPr>
+              <w:spacing w:after="0" w:line="228"/>
+            </w:pPr>
+            <w:r>
+              <w:rPr>
+                <w:rFonts w:ascii="Courier New" w:cs="Courier New" w:eastAsia="Courier New" w:hAnsi="Courier New"/>
+                <w:sz w:val="17"/>
+                <w:szCs w:val="17"/>
+              </w:rPr>
+              <w:t xml:space="preserve">rxpip: greetutils 1.0.0 already installed</w:t>
+            </w:r>
+          </w:p>
+          <w:p>
+            <w:pPr>
+              <w:spacing w:after="0" w:line="228"/>
+            </w:pPr>
+            <w:r>
+              <w:rPr>
+                <w:rFonts w:ascii="Courier New" w:cs="Courier New" w:eastAsia="Courier New" w:hAnsi="Courier New"/>
+                <w:sz w:val="17"/>
+                <w:szCs w:val="17"/>
+              </w:rPr>
+              <w:t xml:space="preserve">RXPIP: DEMO EXEC A written, 71 lines</w:t>
+            </w:r>
+          </w:p>
+          <w:p>
+            <w:pPr>
+              <w:spacing w:after="0" w:line="228"/>
+            </w:pPr>
+            <w:r>
+              <w:rPr>
+                <w:rFonts w:ascii="Courier New" w:cs="Courier New" w:eastAsia="Courier New" w:hAnsi="Courier New"/>
+                <w:sz w:val="17"/>
+                <w:szCs w:val="17"/>
+              </w:rPr>
+              <w:t xml:space="preserve">HELLO, WORLD!!!</w:t>
+            </w:r>
+          </w:p>
+          <w:p>
+            <w:pPr>
+              <w:spacing w:after="0" w:line="228"/>
+            </w:pPr>
+            <w:r>
+              <w:rPr>
+                <w:rFonts w:ascii="Courier New" w:cs="Courier New" w:eastAsia="Courier New" w:hAnsi="Courier New"/>
+                <w:sz w:val="17"/>
+                <w:szCs w:val="17"/>
+              </w:rPr>
+              <w:t xml:space="preserve">square of 7 is 49</w:t>
+            </w:r>
+          </w:p>
+          <w:p>
+            <w:pPr>
+              <w:spacing w:after="0" w:line="228"/>
+            </w:pPr>
+            <w:r>
+              <w:rPr>
+                <w:rFonts w:ascii="Courier New" w:cs="Courier New" w:eastAsia="Courier New" w:hAnsi="Courier New"/>
+                <w:sz w:val="17"/>
+                <w:szCs w:val="17"/>
+              </w:rPr>
+              <w:t xml:space="preserve">Ready;</w:t>
+            </w:r>
+          </w:p>
+        </w:tc>
+      </w:tr>
+    </w:tbl>
+    <w:p>
+      <w:pPr>
+        <w:spacing w:after="200" w:before="80"/>
+      </w:pPr>
+      <w:r>
+        <w:rPr>
+          <w:rFonts w:ascii="Arial" w:cs="Arial" w:eastAsia="Arial" w:hAnsi="Arial"/>
+          <w:b/>
+          <w:bCs/>
+          <w:sz w:val="18"/>
+          <w:szCs w:val="18"/>
+        </w:rPr>
+        <w:t xml:space="preserve">Figure 30. </w:t>
       </w:r>
       <w:r>
         <w:rPr>
@@ -17062,7 +17809,7 @@
           <w:sz w:val="18"/>
           <w:szCs w:val="18"/>
         </w:rPr>
-        <w:t xml:space="preserve">Figure 29. </w:t>
+        <w:t xml:space="preserve">Figure 31. </w:t>
       </w:r>
       <w:r>
         <w:rPr>
@@ -17300,7 +18047,7 @@
           <w:sz w:val="18"/>
           <w:szCs w:val="18"/>
         </w:rPr>
-        <w:t xml:space="preserve">Figure 30. </w:t>
+        <w:t xml:space="preserve">Figure 32. </w:t>
       </w:r>
       <w:r>
         <w:rPr>
@@ -17710,7 +18457,7 @@
           <w:sz w:val="18"/>
           <w:szCs w:val="18"/>
         </w:rPr>
-        <w:t xml:space="preserve">Figure 31. </w:t>
+        <w:t xml:space="preserve">Figure 33. </w:t>
       </w:r>
       <w:r>
         <w:rPr>
@@ -17975,7 +18722,7 @@
           <w:sz w:val="18"/>
           <w:szCs w:val="18"/>
         </w:rPr>
-        <w:t xml:space="preserve">Figure 32. </w:t>
+        <w:t xml:space="preserve">Figure 34. </w:t>
       </w:r>
       <w:r>
         <w:rPr>
@@ -19049,7 +19796,7 @@
           <w:sz w:val="18"/>
           <w:szCs w:val="18"/>
         </w:rPr>
-        <w:t xml:space="preserve">Figure 33. </w:t>
+        <w:t xml:space="preserve">Figure 35. </w:t>
       </w:r>
       <w:r>
         <w:rPr>
@@ -19679,7 +20426,7 @@
           <w:sz w:val="18"/>
           <w:szCs w:val="18"/>
         </w:rPr>
-        <w:t xml:space="preserve">Figure 34. </w:t>
+        <w:t xml:space="preserve">Figure 36. </w:t>
       </w:r>
       <w:r>
         <w:rPr>
@@ -20189,7 +20936,7 @@
           <w:sz w:val="18"/>
           <w:szCs w:val="18"/>
         </w:rPr>
-        <w:t xml:space="preserve">Figure 35. </w:t>
+        <w:t xml:space="preserve">Figure 37. </w:t>
       </w:r>
       <w:r>
         <w:rPr>
@@ -20488,7 +21235,7 @@
           <w:sz w:val="18"/>
           <w:szCs w:val="18"/>
         </w:rPr>
-        <w:t xml:space="preserve">Figure 36. </w:t>
+        <w:t xml:space="preserve">Figure 38. </w:t>
       </w:r>
       <w:r>
         <w:rPr>
@@ -21053,7 +21800,7 @@
           <w:sz w:val="18"/>
           <w:szCs w:val="18"/>
         </w:rPr>
-        <w:t xml:space="preserve">Figure 37. </w:t>
+        <w:t xml:space="preserve">Figure 39. </w:t>
       </w:r>
       <w:r>
         <w:rPr>
@@ -21200,7 +21947,7 @@
           <w:sz w:val="18"/>
           <w:szCs w:val="18"/>
         </w:rPr>
-        <w:t xml:space="preserve">Figure 38. </w:t>
+        <w:t xml:space="preserve">Figure 40. </w:t>
       </w:r>
       <w:r>
         <w:rPr>
@@ -21576,7 +22323,7 @@
           <w:sz w:val="18"/>
           <w:szCs w:val="18"/>
         </w:rPr>
-        <w:t xml:space="preserve">Figure 39. </w:t>
+        <w:t xml:space="preserve">Figure 41. </w:t>
       </w:r>
       <w:r>
         <w:rPr>
@@ -22797,7 +23544,7 @@
           <w:sz w:val="18"/>
           <w:szCs w:val="18"/>
         </w:rPr>
-        <w:t xml:space="preserve">Figure 40. </w:t>
+        <w:t xml:space="preserve">Figure 42. </w:t>
       </w:r>
       <w:r>
         <w:rPr>
@@ -23576,7 +24323,7 @@
           <w:sz w:val="18"/>
           <w:szCs w:val="18"/>
         </w:rPr>
-        <w:t xml:space="preserve">Figure 41. </w:t>
+        <w:t xml:space="preserve">Figure 43. </w:t>
       </w:r>
       <w:r>
         <w:rPr>
@@ -23710,7 +24457,7 @@
           <w:sz w:val="18"/>
           <w:szCs w:val="18"/>
         </w:rPr>
-        <w:t xml:space="preserve">Figure 42. </w:t>
+        <w:t xml:space="preserve">Figure 44. </w:t>
       </w:r>
       <w:r>
         <w:rPr>
@@ -23994,7 +24741,7 @@
           <w:sz w:val="18"/>
           <w:szCs w:val="18"/>
         </w:rPr>
-        <w:t xml:space="preserve">Figure 43. </w:t>
+        <w:t xml:space="preserve">Figure 45. </w:t>
       </w:r>
       <w:r>
         <w:rPr>
@@ -24734,7 +25481,7 @@
           <w:sz w:val="18"/>
           <w:szCs w:val="18"/>
         </w:rPr>
-        <w:t xml:space="preserve">Figure 44. </w:t>
+        <w:t xml:space="preserve">Figure 46. </w:t>
       </w:r>
       <w:r>
         <w:rPr>
@@ -25212,7 +25959,7 @@
           <w:sz w:val="18"/>
           <w:szCs w:val="18"/>
         </w:rPr>
-        <w:t xml:space="preserve">Figure 45. </w:t>
+        <w:t xml:space="preserve">Figure 47. </w:t>
       </w:r>
       <w:r>
         <w:rPr>
@@ -26376,7 +27123,7 @@
           <w:sz w:val="18"/>
           <w:szCs w:val="18"/>
         </w:rPr>
-        <w:t xml:space="preserve">Figure 46. </w:t>
+        <w:t xml:space="preserve">Figure 48. </w:t>
       </w:r>
       <w:r>
         <w:rPr>
@@ -26475,7 +27222,7 @@
           <w:sz w:val="18"/>
           <w:szCs w:val="18"/>
         </w:rPr>
-        <w:t xml:space="preserve">Figure 47. </w:t>
+        <w:t xml:space="preserve">Figure 49. </w:t>
       </w:r>
       <w:r>
         <w:rPr>
@@ -26618,7 +27365,7 @@
           <w:sz w:val="18"/>
           <w:szCs w:val="18"/>
         </w:rPr>
-        <w:t xml:space="preserve">Figure 48. </w:t>
+        <w:t xml:space="preserve">Figure 50. </w:t>
       </w:r>
       <w:r>
         <w:rPr>
@@ -26890,7 +27637,7 @@
           <w:sz w:val="18"/>
           <w:szCs w:val="18"/>
         </w:rPr>
-        <w:t xml:space="preserve">Figure 49. </w:t>
+        <w:t xml:space="preserve">Figure 51. </w:t>
       </w:r>
       <w:r>
         <w:rPr>
@@ -27132,7 +27879,7 @@
           <w:sz w:val="18"/>
           <w:szCs w:val="18"/>
         </w:rPr>
-        <w:t xml:space="preserve">Figure 50. </w:t>
+        <w:t xml:space="preserve">Figure 52. </w:t>
       </w:r>
       <w:r>
         <w:rPr>
@@ -27209,7 +27956,7 @@
           <w:sz w:val="18"/>
           <w:szCs w:val="18"/>
         </w:rPr>
-        <w:t xml:space="preserve">Figure 51. </w:t>
+        <w:t xml:space="preserve">Figure 53. </w:t>
       </w:r>
       <w:r>
         <w:rPr>
@@ -27339,7 +28086,7 @@
           <w:sz w:val="18"/>
           <w:szCs w:val="18"/>
         </w:rPr>
-        <w:t xml:space="preserve">Figure 52. </w:t>
+        <w:t xml:space="preserve">Figure 54. </w:t>
       </w:r>
       <w:r>
         <w:rPr>
@@ -27513,7 +28260,7 @@
           <w:sz w:val="18"/>
           <w:szCs w:val="18"/>
         </w:rPr>
-        <w:t xml:space="preserve">Figure 53. </w:t>
+        <w:t xml:space="preserve">Figure 55. </w:t>
       </w:r>
       <w:r>
         <w:rPr>
@@ -27603,7 +28350,7 @@
           <w:sz w:val="18"/>
           <w:szCs w:val="18"/>
         </w:rPr>
-        <w:t xml:space="preserve">Figure 54. </w:t>
+        <w:t xml:space="preserve">Figure 56. </w:t>
       </w:r>
       <w:r>
         <w:rPr>
@@ -28350,7 +29097,7 @@
           <w:sz w:val="18"/>
           <w:szCs w:val="18"/>
         </w:rPr>
-        <w:t xml:space="preserve">Figure 55. </w:t>
+        <w:t xml:space="preserve">Figure 57. </w:t>
       </w:r>
       <w:r>
         <w:rPr>
@@ -28452,7 +29199,7 @@
           <w:sz w:val="18"/>
           <w:szCs w:val="18"/>
         </w:rPr>
-        <w:t xml:space="preserve">Figure 56. </w:t>
+        <w:t xml:space="preserve">Figure 58. </w:t>
       </w:r>
       <w:r>
         <w:rPr>
@@ -28627,7 +29374,7 @@
           <w:sz w:val="18"/>
           <w:szCs w:val="18"/>
         </w:rPr>
-        <w:t xml:space="preserve">Figure 57. </w:t>
+        <w:t xml:space="preserve">Figure 59. </w:t>
       </w:r>
       <w:r>
         <w:rPr>
@@ -28704,7 +29451,7 @@
           <w:sz w:val="18"/>
           <w:szCs w:val="18"/>
         </w:rPr>
-        <w:t xml:space="preserve">Figure 58. </w:t>
+        <w:t xml:space="preserve">Figure 60. </w:t>
       </w:r>
       <w:r>
         <w:rPr>
@@ -28984,7 +29731,7 @@
           <w:sz w:val="18"/>
           <w:szCs w:val="18"/>
         </w:rPr>
-        <w:t xml:space="preserve">Figure 59. </w:t>
+        <w:t xml:space="preserve">Figure 61. </w:t>
       </w:r>
       <w:r>
         <w:rPr>
@@ -29113,7 +29860,7 @@
           <w:sz w:val="18"/>
           <w:szCs w:val="18"/>
         </w:rPr>
-        <w:t xml:space="preserve">Figure 60. </w:t>
+        <w:t xml:space="preserve">Figure 62. </w:t>
       </w:r>
       <w:r>
         <w:rPr>
@@ -29345,7 +30092,7 @@
           <w:sz w:val="18"/>
           <w:szCs w:val="18"/>
         </w:rPr>
-        <w:t xml:space="preserve">Figure 61. </w:t>
+        <w:t xml:space="preserve">Figure 63. </w:t>
       </w:r>
       <w:r>
         <w:rPr>
@@ -30069,7 +30816,7 @@
           <w:sz w:val="18"/>
           <w:szCs w:val="18"/>
         </w:rPr>
-        <w:t xml:space="preserve">Figure 62. </w:t>
+        <w:t xml:space="preserve">Figure 64. </w:t>
       </w:r>
       <w:r>
         <w:rPr>
@@ -30777,7 +31524,7 @@
           <w:sz w:val="18"/>
           <w:szCs w:val="18"/>
         </w:rPr>
-        <w:t xml:space="preserve">Figure 63. </w:t>
+        <w:t xml:space="preserve">Figure 65. </w:t>
       </w:r>
       <w:r>
         <w:rPr>

</xml_diff>

<commit_message>
Guide: PGSQL (PostgreSQL in the Debian guest from CMS)
Co-Authored-By: Claude Opus 5.5 <noreply@anthropic.com>
Claude-Session: https://claude.ai/code/session_01JBNU8KnKzXkgscse8vw6so
</commit_message>
<xml_diff>
--- a/arch/31bit/manual/VM370PLUS-Guide.docx
+++ b/arch/31bit/manual/VM370PLUS-Guide.docx
@@ -1223,7 +1223,7 @@
           <w:sz w:val="20"/>
           <w:szCs w:val="20"/>
         </w:rPr>
-        <w:t xml:space="preserve">TELL</w:t>
+        <w:t xml:space="preserve">PGSQL: PostgreSQL in the Debian guest</w:t>
       </w:r>
       <w:r>
         <w:rPr>
@@ -1252,7 +1252,7 @@
           <w:sz w:val="20"/>
           <w:szCs w:val="20"/>
         </w:rPr>
-        <w:t xml:space="preserve">RXPIP: REXX packages</w:t>
+        <w:t xml:space="preserve">TELL</w:t>
       </w:r>
       <w:r>
         <w:rPr>
@@ -1281,7 +1281,7 @@
           <w:sz w:val="20"/>
           <w:szCs w:val="20"/>
         </w:rPr>
-        <w:t xml:space="preserve">Planned service machines</w:t>
+        <w:t xml:space="preserve">RXPIP: REXX packages</w:t>
       </w:r>
       <w:r>
         <w:rPr>
@@ -1291,7 +1291,36 @@
           <w:sz w:val="20"/>
           <w:szCs w:val="20"/>
         </w:rPr>
-        <w:t xml:space="preserve">	18</w:t>
+        <w:t xml:space="preserve">	19</w:t>
+      </w:r>
+    </w:p>
+    <w:p>
+      <w:pPr>
+        <w:tabs>
+          <w:tab w:val="right" w:pos="9638" w:leader="dot"/>
+        </w:tabs>
+        <w:spacing w:after="20" w:before="20"/>
+        <w:ind w:left="400"/>
+      </w:pPr>
+      <w:r>
+        <w:rPr>
+          <w:rFonts w:ascii="Times New Roman" w:cs="Times New Roman" w:eastAsia="Times New Roman" w:hAnsi="Times New Roman"/>
+          <w:b w:val="false"/>
+          <w:bCs w:val="false"/>
+          <w:sz w:val="20"/>
+          <w:szCs w:val="20"/>
+        </w:rPr>
+        <w:t xml:space="preserve">Planned service machines</w:t>
+      </w:r>
+      <w:r>
+        <w:rPr>
+          <w:rFonts w:ascii="Times New Roman" w:cs="Times New Roman" w:eastAsia="Times New Roman" w:hAnsi="Times New Roman"/>
+          <w:b w:val="false"/>
+          <w:bCs w:val="false"/>
+          <w:sz w:val="20"/>
+          <w:szCs w:val="20"/>
+        </w:rPr>
+        <w:t xml:space="preserve">	19</w:t>
       </w:r>
     </w:p>
     <w:p>
@@ -2558,6 +2587,35 @@
           <w:szCs w:val="20"/>
         </w:rPr>
         <w:t xml:space="preserve">LXCALL, PHONE, MQTT</w:t>
+      </w:r>
+      <w:r>
+        <w:rPr>
+          <w:rFonts w:ascii="Times New Roman" w:cs="Times New Roman" w:eastAsia="Times New Roman" w:hAnsi="Times New Roman"/>
+          <w:b w:val="false"/>
+          <w:bCs w:val="false"/>
+          <w:sz w:val="20"/>
+          <w:szCs w:val="20"/>
+        </w:rPr>
+        <w:t xml:space="preserve">	33</w:t>
+      </w:r>
+    </w:p>
+    <w:p>
+      <w:pPr>
+        <w:tabs>
+          <w:tab w:val="right" w:pos="9638" w:leader="dot"/>
+        </w:tabs>
+        <w:spacing w:after="20" w:before="20"/>
+        <w:ind w:left="400"/>
+      </w:pPr>
+      <w:r>
+        <w:rPr>
+          <w:rFonts w:ascii="Times New Roman" w:cs="Times New Roman" w:eastAsia="Times New Roman" w:hAnsi="Times New Roman"/>
+          <w:b w:val="false"/>
+          <w:bCs w:val="false"/>
+          <w:sz w:val="20"/>
+          <w:szCs w:val="20"/>
+        </w:rPr>
+        <w:t xml:space="preserve">PGSQL</w:t>
       </w:r>
       <w:r>
         <w:rPr>
@@ -2992,7 +3050,7 @@
         <w:rPr>
           <w:rFonts w:ascii="Times New Roman" w:cs="Times New Roman" w:eastAsia="Times New Roman" w:hAnsi="Times New Roman"/>
         </w:rPr>
-        <w:t xml:space="preserve">, describes CHATBOT, the spool bridge to Linux services (LXCALL, PHONE, MQTT, TELL), RXPIP, NICOF, MQ, and the service machines that are planned.</w:t>
+        <w:t xml:space="preserve">, describes CHATBOT, the spool bridge to Linux services (LXCALL, PHONE, MQTT, TELL), RXPIP, NICOF, MQ, PGSQL, and the service machines that are planned.</w:t>
       </w:r>
     </w:p>
     <w:p>
@@ -3207,6 +3265,44 @@
           <w:rFonts w:ascii="Times New Roman" w:cs="Times New Roman" w:eastAsia="Times New Roman" w:hAnsi="Times New Roman"/>
         </w:rPr>
         <w:t xml:space="preserve">This edition is kept up to date as VM/370plus grows; each change is listed here, newest first.</w:t>
+      </w:r>
+    </w:p>
+    <w:p>
+      <w:pPr>
+        <w:pStyle w:val="ListParagraph"/>
+        <w:numPr>
+          <w:ilvl w:val="0"/>
+          <w:numId w:val="2"/>
+        </w:numPr>
+        <w:spacing w:after="60"/>
+      </w:pPr>
+      <w:r>
+        <w:rPr>
+          <w:rFonts w:ascii="Times New Roman" w:cs="Times New Roman" w:eastAsia="Times New Roman" w:hAnsi="Times New Roman"/>
+          <w:b/>
+          <w:bCs/>
+        </w:rPr>
+        <w:t xml:space="preserve">14 October 2026, night.</w:t>
+      </w:r>
+      <w:r>
+        <w:rPr>
+          <w:rFonts w:ascii="Times New Roman" w:cs="Times New Roman" w:eastAsia="Times New Roman" w:hAnsi="Times New Roman"/>
+        </w:rPr>
+        <w:t xml:space="preserve"> </w:t>
+      </w:r>
+      <w:r>
+        <w:rPr>
+          <w:rFonts w:ascii="Courier New" w:cs="Courier New" w:eastAsia="Courier New" w:hAnsi="Courier New"/>
+          <w:sz w:val="19"/>
+          <w:szCs w:val="19"/>
+        </w:rPr>
+        <w:t xml:space="preserve">PGSQL</w:t>
+      </w:r>
+      <w:r>
+        <w:rPr>
+          <w:rFonts w:ascii="Times New Roman" w:cs="Times New Roman" w:eastAsia="Times New Roman" w:hAnsi="Times New Roman"/>
+        </w:rPr>
+        <w:t xml:space="preserve"> (Chapter 6): PostgreSQL 16 in the Debian guest, from CMS through the spool bridge; each CMS user gets a database of its own.</w:t>
       </w:r>
     </w:p>
     <w:p>
@@ -16911,7 +17007,7 @@
         <w:pStyle w:val="Heading2"/>
       </w:pPr>
       <w:r>
-        <w:t xml:space="preserve">TELL</w:t>
+        <w:t xml:space="preserve">PGSQL: PostgreSQL in the Debian guest</w:t>
       </w:r>
     </w:p>
     <w:p>
@@ -16920,87 +17016,65 @@
       </w:pPr>
       <w:r>
         <w:rPr>
-          <w:rFonts w:ascii="Courier New" w:cs="Courier New" w:eastAsia="Courier New" w:hAnsi="Courier New"/>
-          <w:sz w:val="19"/>
-          <w:szCs w:val="19"/>
-        </w:rPr>
-        <w:t xml:space="preserve">TELL userid message</w:t>
-      </w:r>
-      <w:r>
-        <w:rPr>
-          <w:rFonts w:ascii="Times New Roman" w:cs="Times New Roman" w:eastAsia="Times New Roman" w:hAnsi="Times New Roman"/>
-        </w:rPr>
-        <w:t xml:space="preserve"> sends a message to a VM/370 user (CP MSG). </w:t>
-      </w:r>
-      <w:r>
-        <w:rPr>
-          <w:rFonts w:ascii="Courier New" w:cs="Courier New" w:eastAsia="Courier New" w:hAnsi="Courier New"/>
-          <w:sz w:val="19"/>
-          <w:szCs w:val="19"/>
-        </w:rPr>
-        <w:t xml:space="preserve">TELL user AT LINUX message</w:t>
-      </w:r>
-      <w:r>
-        <w:rPr>
-          <w:rFonts w:ascii="Times New Roman" w:cs="Times New Roman" w:eastAsia="Times New Roman" w:hAnsi="Times New Roman"/>
-        </w:rPr>
-        <w:t xml:space="preserve"> sends it to a user of the Debian guest through the spool bridge: it appears on that user’s terminals, and is kept until the user reads it with </w:t>
-      </w:r>
-      <w:r>
-        <w:rPr>
-          <w:rFonts w:ascii="Courier New" w:cs="Courier New" w:eastAsia="Courier New" w:hAnsi="Courier New"/>
-          <w:sz w:val="19"/>
-          <w:szCs w:val="19"/>
-        </w:rPr>
-        <w:t xml:space="preserve">tell</w:t>
-      </w:r>
-      <w:r>
-        <w:rPr>
-          <w:rFonts w:ascii="Times New Roman" w:cs="Times New Roman" w:eastAsia="Times New Roman" w:hAnsi="Times New Roman"/>
-        </w:rPr>
-        <w:t xml:space="preserve">. </w:t>
-      </w:r>
-      <w:r>
-        <w:rPr>
-          <w:rFonts w:ascii="Courier New" w:cs="Courier New" w:eastAsia="Courier New" w:hAnsi="Courier New"/>
-          <w:sz w:val="19"/>
-          <w:szCs w:val="19"/>
-        </w:rPr>
-        <w:t xml:space="preserve">TELL ALL AT LINUX message</w:t>
-      </w:r>
-      <w:r>
-        <w:rPr>
-          <w:rFonts w:ascii="Times New Roman" w:cs="Times New Roman" w:eastAsia="Times New Roman" w:hAnsi="Times New Roman"/>
-        </w:rPr>
-        <w:t xml:space="preserve"> reaches everybody logged on to Linux. A Linux user answers with </w:t>
-      </w:r>
-      <w:r>
-        <w:rPr>
-          <w:rFonts w:ascii="Courier New" w:cs="Courier New" w:eastAsia="Courier New" w:hAnsi="Courier New"/>
-          <w:sz w:val="19"/>
-          <w:szCs w:val="19"/>
-        </w:rPr>
-        <w:t xml:space="preserve">tell userid message</w:t>
-      </w:r>
-      <w:r>
-        <w:rPr>
-          <w:rFonts w:ascii="Times New Roman" w:cs="Times New Roman" w:eastAsia="Times New Roman" w:hAnsi="Times New Roman"/>
-        </w:rPr>
-        <w:t xml:space="preserve">, which arrives on CMS as </w:t>
-      </w:r>
-      <w:r>
-        <w:rPr>
-          <w:rFonts w:ascii="Courier New" w:cs="Courier New" w:eastAsia="Courier New" w:hAnsi="Courier New"/>
-          <w:sz w:val="19"/>
-          <w:szCs w:val="19"/>
-        </w:rPr>
-        <w:t xml:space="preserve">MSG FROM MAINT: (user) message</w:t>
-      </w:r>
-      <w:r>
-        <w:rPr>
-          <w:rFonts w:ascii="Times New Roman" w:cs="Times New Roman" w:eastAsia="Times New Roman" w:hAnsi="Times New Roman"/>
-        </w:rPr>
-        <w:t xml:space="preserve">.</w:t>
+          <w:rFonts w:ascii="Times New Roman" w:cs="Times New Roman" w:eastAsia="Times New Roman" w:hAnsi="Times New Roman"/>
+        </w:rPr>
+        <w:t xml:space="preserve">The Debian guest runs </w:t>
+      </w:r>
+      <w:r>
+        <w:rPr>
+          <w:rFonts w:ascii="Times New Roman" w:cs="Times New Roman" w:eastAsia="Times New Roman" w:hAnsi="Times New Roman"/>
+          <w:b/>
+          <w:bCs/>
+        </w:rPr>
+        <w:t xml:space="preserve">PostgreSQL 16</w:t>
+      </w:r>
+      <w:r>
+        <w:rPr>
+          <w:rFonts w:ascii="Times New Roman" w:cs="Times New Roman" w:eastAsia="Times New Roman" w:hAnsi="Times New Roman"/>
+        </w:rPr>
+        <w:t xml:space="preserve">, cross-built with GCC 13 for the 31-bit guest, installed under </w:t>
+      </w:r>
+      <w:r>
+        <w:rPr>
+          <w:rFonts w:ascii="Courier New" w:cs="Courier New" w:eastAsia="Courier New" w:hAnsi="Courier New"/>
+          <w:sz w:val="19"/>
+          <w:szCs w:val="19"/>
+        </w:rPr>
+        <w:t xml:space="preserve">/usr/local/pgsql</w:t>
+      </w:r>
+      <w:r>
+        <w:rPr>
+          <w:rFonts w:ascii="Times New Roman" w:cs="Times New Roman" w:eastAsia="Times New Roman" w:hAnsi="Times New Roman"/>
+        </w:rPr>
+        <w:t xml:space="preserve"> with its data in </w:t>
+      </w:r>
+      <w:r>
+        <w:rPr>
+          <w:rFonts w:ascii="Courier New" w:cs="Courier New" w:eastAsia="Courier New" w:hAnsi="Courier New"/>
+          <w:sz w:val="19"/>
+          <w:szCs w:val="19"/>
+        </w:rPr>
+        <w:t xml:space="preserve">/var/lib/pgsql16</w:t>
+      </w:r>
+      <w:r>
+        <w:rPr>
+          <w:rFonts w:ascii="Times New Roman" w:cs="Times New Roman" w:eastAsia="Times New Roman" w:hAnsi="Times New Roman"/>
+        </w:rPr>
+        <w:t xml:space="preserve">, and started at boot. It is set for a small machine (10 connections, 4 MB of shared buffers) and accepts local connections only. In the guest, </w:t>
+      </w:r>
+      <w:r>
+        <w:rPr>
+          <w:rFonts w:ascii="Courier New" w:cs="Courier New" w:eastAsia="Courier New" w:hAnsi="Courier New"/>
+          <w:sz w:val="19"/>
+          <w:szCs w:val="19"/>
+        </w:rPr>
+        <w:t xml:space="preserve">psql -U postgres</w:t>
+      </w:r>
+      <w:r>
+        <w:rPr>
+          <w:rFonts w:ascii="Times New Roman" w:cs="Times New Roman" w:eastAsia="Times New Roman" w:hAnsi="Times New Roman"/>
+        </w:rPr>
+        <w:t xml:space="preserve"> talks to it.</w:t>
       </w:r>
     </w:p>
     <w:p>
@@ -17009,101 +17083,135 @@
       </w:pPr>
       <w:r>
         <w:rPr>
-          <w:rFonts w:ascii="Courier New" w:cs="Courier New" w:eastAsia="Courier New" w:hAnsi="Courier New"/>
-          <w:sz w:val="19"/>
-          <w:szCs w:val="19"/>
-        </w:rPr>
-        <w:t xml:space="preserve">TELL user AT NET message</w:t>
-      </w:r>
-      <w:r>
-        <w:rPr>
-          <w:rFonts w:ascii="Times New Roman" w:cs="Times New Roman" w:eastAsia="Times New Roman" w:hAnsi="Times New Roman"/>
-        </w:rPr>
-        <w:t xml:space="preserve"> reaches a user on the internet. The message is published on the MQTT broker of the Debian guest as topic </w:t>
-      </w:r>
-      <w:r>
-        <w:rPr>
-          <w:rFonts w:ascii="Courier New" w:cs="Courier New" w:eastAsia="Courier New" w:hAnsi="Courier New"/>
-          <w:sz w:val="19"/>
-          <w:szCs w:val="19"/>
-        </w:rPr>
-        <w:t xml:space="preserve">vm/tell/out/user</w:t>
-      </w:r>
-      <w:r>
-        <w:rPr>
-          <w:rFonts w:ascii="Times New Roman" w:cs="Times New Roman" w:eastAsia="Times New Roman" w:hAnsi="Times New Roman"/>
-        </w:rPr>
-        <w:t xml:space="preserve">, which the user reads with any MQTT client. The user answers by publishing to </w:t>
-      </w:r>
-      <w:r>
-        <w:rPr>
-          <w:rFonts w:ascii="Courier New" w:cs="Courier New" w:eastAsia="Courier New" w:hAnsi="Courier New"/>
-          <w:sz w:val="19"/>
-          <w:szCs w:val="19"/>
-        </w:rPr>
-        <w:t xml:space="preserve">vm/tell/from/user/to/userid</w:t>
-      </w:r>
-      <w:r>
-        <w:rPr>
-          <w:rFonts w:ascii="Times New Roman" w:cs="Times New Roman" w:eastAsia="Times New Roman" w:hAnsi="Times New Roman"/>
-        </w:rPr>
-        <w:t xml:space="preserve">; it arrives as </w:t>
-      </w:r>
-      <w:r>
-        <w:rPr>
-          <w:rFonts w:ascii="Courier New" w:cs="Courier New" w:eastAsia="Courier New" w:hAnsi="Courier New"/>
-          <w:sz w:val="19"/>
-          <w:szCs w:val="19"/>
-        </w:rPr>
-        <w:t xml:space="preserve">MSG FROM MAINT: (net:user) message</w:t>
-      </w:r>
-      <w:r>
-        <w:rPr>
-          <w:rFonts w:ascii="Times New Roman" w:cs="Times New Roman" w:eastAsia="Times New Roman" w:hAnsi="Times New Roman"/>
-        </w:rPr>
-        <w:t xml:space="preserve">. Outside users need a login (</w:t>
-      </w:r>
-      <w:r>
-        <w:rPr>
-          <w:rFonts w:ascii="Courier New" w:cs="Courier New" w:eastAsia="Courier New" w:hAnsi="Courier New"/>
-          <w:sz w:val="19"/>
-          <w:szCs w:val="19"/>
-        </w:rPr>
-        <w:t xml:space="preserve">tellnet-user name password</w:t>
-      </w:r>
-      <w:r>
-        <w:rPr>
-          <w:rFonts w:ascii="Times New Roman" w:cs="Times New Roman" w:eastAsia="Times New Roman" w:hAnsi="Times New Roman"/>
-        </w:rPr>
-        <w:t xml:space="preserve"> in the guest) and may only use their own TELL topics. On the PC, </w:t>
-      </w:r>
-      <w:r>
-        <w:rPr>
-          <w:rFonts w:ascii="Courier New" w:cs="Courier New" w:eastAsia="Courier New" w:hAnsi="Courier New"/>
-          <w:sz w:val="19"/>
-          <w:szCs w:val="19"/>
-        </w:rPr>
-        <w:t xml:space="preserve">tools/netfwd.py --tls cert key 8883 10.1.1.2:1883</w:t>
-      </w:r>
-      <w:r>
-        <w:rPr>
-          <w:rFonts w:ascii="Times New Roman" w:cs="Times New Roman" w:eastAsia="Times New Roman" w:hAnsi="Times New Roman"/>
-        </w:rPr>
-        <w:t xml:space="preserve"> makes the broker reachable, encrypted; the router has to forward that port to the PC. </w:t>
-      </w:r>
-      <w:r>
-        <w:rPr>
-          <w:rFonts w:ascii="Courier New" w:cs="Courier New" w:eastAsia="Courier New" w:hAnsi="Courier New"/>
-          <w:sz w:val="19"/>
-          <w:szCs w:val="19"/>
-        </w:rPr>
-        <w:t xml:space="preserve">tools/nettell.py</w:t>
-      </w:r>
-      <w:r>
-        <w:rPr>
-          <w:rFonts w:ascii="Times New Roman" w:cs="Times New Roman" w:eastAsia="Times New Roman" w:hAnsi="Times New Roman"/>
-        </w:rPr>
-        <w:t xml:space="preserve"> is a small client for the outside user.</w:t>
+          <w:rFonts w:ascii="Times New Roman" w:cs="Times New Roman" w:eastAsia="Times New Roman" w:hAnsi="Times New Roman"/>
+        </w:rPr>
+        <w:t xml:space="preserve">From CMS, </w:t>
+      </w:r>
+      <w:r>
+        <w:rPr>
+          <w:rFonts w:ascii="Courier New" w:cs="Courier New" w:eastAsia="Courier New" w:hAnsi="Courier New"/>
+          <w:sz w:val="19"/>
+          <w:szCs w:val="19"/>
+        </w:rPr>
+        <w:t xml:space="preserve">PGSQL</w:t>
+      </w:r>
+      <w:r>
+        <w:rPr>
+          <w:rFonts w:ascii="Times New Roman" w:cs="Times New Roman" w:eastAsia="Times New Roman" w:hAnsi="Times New Roman"/>
+        </w:rPr>
+        <w:t xml:space="preserve"> sends SQL to it over the spool bridge (</w:t>
+      </w:r>
+      <w:r>
+        <w:rPr>
+          <w:rFonts w:ascii="Courier New" w:cs="Courier New" w:eastAsia="Courier New" w:hAnsi="Courier New"/>
+          <w:sz w:val="19"/>
+          <w:szCs w:val="19"/>
+        </w:rPr>
+        <w:t xml:space="preserve">LXCALL</w:t>
+      </w:r>
+      <w:r>
+        <w:rPr>
+          <w:rFonts w:ascii="Times New Roman" w:cs="Times New Roman" w:eastAsia="Times New Roman" w:hAnsi="Times New Roman"/>
+        </w:rPr>
+        <w:t xml:space="preserve">, service </w:t>
+      </w:r>
+      <w:r>
+        <w:rPr>
+          <w:rFonts w:ascii="Courier New" w:cs="Courier New" w:eastAsia="Courier New" w:hAnsi="Courier New"/>
+          <w:sz w:val="19"/>
+          <w:szCs w:val="19"/>
+        </w:rPr>
+        <w:t xml:space="preserve">pgsql</w:t>
+      </w:r>
+      <w:r>
+        <w:rPr>
+          <w:rFonts w:ascii="Times New Roman" w:cs="Times New Roman" w:eastAsia="Times New Roman" w:hAnsi="Times New Roman"/>
+        </w:rPr>
+        <w:t xml:space="preserve">), so it works under </w:t>
+      </w:r>
+      <w:r>
+        <w:rPr>
+          <w:rFonts w:ascii="Courier New" w:cs="Courier New" w:eastAsia="Courier New" w:hAnsi="Courier New"/>
+          <w:sz w:val="19"/>
+          <w:szCs w:val="19"/>
+        </w:rPr>
+        <w:t xml:space="preserve">IPL CMS</w:t>
+      </w:r>
+      <w:r>
+        <w:rPr>
+          <w:rFonts w:ascii="Times New Roman" w:cs="Times New Roman" w:eastAsia="Times New Roman" w:hAnsi="Times New Roman"/>
+        </w:rPr>
+        <w:t xml:space="preserve"> and </w:t>
+      </w:r>
+      <w:r>
+        <w:rPr>
+          <w:rFonts w:ascii="Courier New" w:cs="Courier New" w:eastAsia="Courier New" w:hAnsi="Courier New"/>
+          <w:sz w:val="19"/>
+          <w:szCs w:val="19"/>
+        </w:rPr>
+        <w:t xml:space="preserve">IPL 290</w:t>
+      </w:r>
+      <w:r>
+        <w:rPr>
+          <w:rFonts w:ascii="Times New Roman" w:cs="Times New Roman" w:eastAsia="Times New Roman" w:hAnsi="Times New Roman"/>
+        </w:rPr>
+        <w:t xml:space="preserve"> alike. Each CMS user gets a role and a database named after the user ID (lower case) on first use. </w:t>
+      </w:r>
+      <w:r>
+        <w:rPr>
+          <w:rFonts w:ascii="Courier New" w:cs="Courier New" w:eastAsia="Courier New" w:hAnsi="Courier New"/>
+          <w:sz w:val="19"/>
+          <w:szCs w:val="19"/>
+        </w:rPr>
+        <w:t xml:space="preserve">PGSQL statement</w:t>
+      </w:r>
+      <w:r>
+        <w:rPr>
+          <w:rFonts w:ascii="Times New Roman" w:cs="Times New Roman" w:eastAsia="Times New Roman" w:hAnsi="Times New Roman"/>
+        </w:rPr>
+        <w:t xml:space="preserve"> runs one statement; the </w:t>
+      </w:r>
+      <w:r>
+        <w:rPr>
+          <w:rFonts w:ascii="Courier New" w:cs="Courier New" w:eastAsia="Courier New" w:hAnsi="Courier New"/>
+          <w:sz w:val="19"/>
+          <w:szCs w:val="19"/>
+        </w:rPr>
+        <w:t xml:space="preserve">;</w:t>
+      </w:r>
+      <w:r>
+        <w:rPr>
+          <w:rFonts w:ascii="Times New Roman" w:cs="Times New Roman" w:eastAsia="Times New Roman" w:hAnsi="Times New Roman"/>
+        </w:rPr>
+        <w:t xml:space="preserve"> at the end is optional. </w:t>
+      </w:r>
+      <w:r>
+        <w:rPr>
+          <w:rFonts w:ascii="Courier New" w:cs="Courier New" w:eastAsia="Courier New" w:hAnsi="Courier New"/>
+          <w:sz w:val="19"/>
+          <w:szCs w:val="19"/>
+        </w:rPr>
+        <w:t xml:space="preserve">PGSQL (FILE fn [ft [fm]]</w:t>
+      </w:r>
+      <w:r>
+        <w:rPr>
+          <w:rFonts w:ascii="Times New Roman" w:cs="Times New Roman" w:eastAsia="Times New Roman" w:hAnsi="Times New Roman"/>
+        </w:rPr>
+        <w:t xml:space="preserve"> runs the statements of a file, file type </w:t>
+      </w:r>
+      <w:r>
+        <w:rPr>
+          <w:rFonts w:ascii="Courier New" w:cs="Courier New" w:eastAsia="Courier New" w:hAnsi="Courier New"/>
+          <w:sz w:val="19"/>
+          <w:szCs w:val="19"/>
+        </w:rPr>
+        <w:t xml:space="preserve">SQL</w:t>
+      </w:r>
+      <w:r>
+        <w:rPr>
+          <w:rFonts w:ascii="Times New Roman" w:cs="Times New Roman" w:eastAsia="Times New Roman" w:hAnsi="Times New Roman"/>
+        </w:rPr>
+        <w:t xml:space="preserve"> by default. The console takes about 130 characters, so longer statements belong in a file.</w:t>
       </w:r>
     </w:p>
     <w:tbl>
@@ -17146,7 +17254,7 @@
                 <w:sz w:val="17"/>
                 <w:szCs w:val="17"/>
               </w:rPr>
-              <w:t xml:space="preserve">mqtt sub vm/test 1 20</w:t>
+              <w:t xml:space="preserve">pgsql create table parts (no int, name text)</w:t>
             </w:r>
           </w:p>
           <w:p>
@@ -17159,7 +17267,124 @@
                 <w:sz w:val="17"/>
                 <w:szCs w:val="17"/>
               </w:rPr>
-              <w:t xml:space="preserve">vm/test hello from linux</w:t>
+              <w:t xml:space="preserve">CREATE TABLE</w:t>
+            </w:r>
+          </w:p>
+          <w:p>
+            <w:pPr>
+              <w:spacing w:after="0" w:line="228"/>
+            </w:pPr>
+            <w:r>
+              <w:rPr>
+                <w:rFonts w:ascii="Courier New" w:cs="Courier New" w:eastAsia="Courier New" w:hAnsi="Courier New"/>
+                <w:sz w:val="17"/>
+                <w:szCs w:val="17"/>
+              </w:rPr>
+              <w:t xml:space="preserve">Ready;</w:t>
+            </w:r>
+          </w:p>
+          <w:p>
+            <w:pPr>
+              <w:spacing w:after="0" w:line="228"/>
+            </w:pPr>
+            <w:r>
+              <w:rPr>
+                <w:rFonts w:ascii="Courier New" w:cs="Courier New" w:eastAsia="Courier New" w:hAnsi="Courier New"/>
+                <w:sz w:val="17"/>
+                <w:szCs w:val="17"/>
+              </w:rPr>
+              <w:t xml:space="preserve">pgsql insert into parts values (1, 'widget')</w:t>
+            </w:r>
+          </w:p>
+          <w:p>
+            <w:pPr>
+              <w:spacing w:after="0" w:line="228"/>
+            </w:pPr>
+            <w:r>
+              <w:rPr>
+                <w:rFonts w:ascii="Courier New" w:cs="Courier New" w:eastAsia="Courier New" w:hAnsi="Courier New"/>
+                <w:sz w:val="17"/>
+                <w:szCs w:val="17"/>
+              </w:rPr>
+              <w:t xml:space="preserve">INSERT 0 1</w:t>
+            </w:r>
+          </w:p>
+          <w:p>
+            <w:pPr>
+              <w:spacing w:after="0" w:line="228"/>
+            </w:pPr>
+            <w:r>
+              <w:rPr>
+                <w:rFonts w:ascii="Courier New" w:cs="Courier New" w:eastAsia="Courier New" w:hAnsi="Courier New"/>
+                <w:sz w:val="17"/>
+                <w:szCs w:val="17"/>
+              </w:rPr>
+              <w:t xml:space="preserve">Ready;</w:t>
+            </w:r>
+          </w:p>
+          <w:p>
+            <w:pPr>
+              <w:spacing w:after="0" w:line="228"/>
+            </w:pPr>
+            <w:r>
+              <w:rPr>
+                <w:rFonts w:ascii="Courier New" w:cs="Courier New" w:eastAsia="Courier New" w:hAnsi="Courier New"/>
+                <w:sz w:val="17"/>
+                <w:szCs w:val="17"/>
+              </w:rPr>
+              <w:t xml:space="preserve">pgsql select * from parts</w:t>
+            </w:r>
+          </w:p>
+          <w:p>
+            <w:pPr>
+              <w:spacing w:after="0" w:line="228"/>
+            </w:pPr>
+            <w:r>
+              <w:rPr>
+                <w:rFonts w:ascii="Courier New" w:cs="Courier New" w:eastAsia="Courier New" w:hAnsi="Courier New"/>
+                <w:sz w:val="17"/>
+                <w:szCs w:val="17"/>
+              </w:rPr>
+              <w:t xml:space="preserve"> no |  name</w:t>
+            </w:r>
+          </w:p>
+          <w:p>
+            <w:pPr>
+              <w:spacing w:after="0" w:line="228"/>
+            </w:pPr>
+            <w:r>
+              <w:rPr>
+                <w:rFonts w:ascii="Courier New" w:cs="Courier New" w:eastAsia="Courier New" w:hAnsi="Courier New"/>
+                <w:sz w:val="17"/>
+                <w:szCs w:val="17"/>
+              </w:rPr>
+              <w:t xml:space="preserve">----+--------</w:t>
+            </w:r>
+          </w:p>
+          <w:p>
+            <w:pPr>
+              <w:spacing w:after="0" w:line="228"/>
+            </w:pPr>
+            <w:r>
+              <w:rPr>
+                <w:rFonts w:ascii="Courier New" w:cs="Courier New" w:eastAsia="Courier New" w:hAnsi="Courier New"/>
+                <w:sz w:val="17"/>
+                <w:szCs w:val="17"/>
+              </w:rPr>
+              <w:t xml:space="preserve">  1 | widget</w:t>
+            </w:r>
+          </w:p>
+          <w:p>
+            <w:pPr>
+              <w:spacing w:after="0" w:line="228"/>
+            </w:pPr>
+            <w:r>
+              <w:rPr>
+                <w:rFonts w:ascii="Courier New" w:cs="Courier New" w:eastAsia="Courier New" w:hAnsi="Courier New"/>
+                <w:sz w:val="17"/>
+                <w:szCs w:val="17"/>
+              </w:rPr>
+              <w:t xml:space="preserve">(1 row)</w:t>
             </w:r>
           </w:p>
           <w:p>
@@ -17198,7 +17423,7 @@
           <w:sz w:val="18"/>
           <w:szCs w:val="18"/>
         </w:rPr>
-        <w:t xml:space="preserve">A message from Linux arrives on CMS</w:t>
+        <w:t xml:space="preserve">PostgreSQL from CMS</w:t>
       </w:r>
     </w:p>
     <w:p>
@@ -17206,7 +17431,7 @@
         <w:pStyle w:val="Heading2"/>
       </w:pPr>
       <w:r>
-        <w:t xml:space="preserve">RXPIP: REXX packages</w:t>
+        <w:t xml:space="preserve">TELL</w:t>
       </w:r>
     </w:p>
     <w:p>
@@ -17215,37 +17440,87 @@
       </w:pPr>
       <w:r>
         <w:rPr>
-          <w:rFonts w:ascii="Times New Roman" w:cs="Times New Roman" w:eastAsia="Times New Roman" w:hAnsi="Times New Roman"/>
-        </w:rPr>
-        <w:t xml:space="preserve">RXPIP is the package manager of rexxpository: REXX routines are published as packages, and a program names what it needs with </w:t>
-      </w:r>
-      <w:r>
-        <w:rPr>
-          <w:rFonts w:ascii="Courier New" w:cs="Courier New" w:eastAsia="Courier New" w:hAnsi="Courier New"/>
-          <w:sz w:val="19"/>
-          <w:szCs w:val="19"/>
-        </w:rPr>
-        <w:t xml:space="preserve">/* REQUIRE pkg */</w:t>
-      </w:r>
-      <w:r>
-        <w:rPr>
-          <w:rFonts w:ascii="Times New Roman" w:cs="Times New Roman" w:eastAsia="Times New Roman" w:hAnsi="Times New Roman"/>
-        </w:rPr>
-        <w:t xml:space="preserve"> comments. The repository server and the rxpip client run in the Debian guest; the bridge service </w:t>
-      </w:r>
-      <w:r>
-        <w:rPr>
-          <w:rFonts w:ascii="Courier New" w:cs="Courier New" w:eastAsia="Courier New" w:hAnsi="Courier New"/>
-          <w:sz w:val="19"/>
-          <w:szCs w:val="19"/>
-        </w:rPr>
-        <w:t xml:space="preserve">rxpip</w:t>
-      </w:r>
-      <w:r>
-        <w:rPr>
-          <w:rFonts w:ascii="Times New Roman" w:cs="Times New Roman" w:eastAsia="Times New Roman" w:hAnsi="Times New Roman"/>
-        </w:rPr>
-        <w:t xml:space="preserve"> serves CMS users.</w:t>
+          <w:rFonts w:ascii="Courier New" w:cs="Courier New" w:eastAsia="Courier New" w:hAnsi="Courier New"/>
+          <w:sz w:val="19"/>
+          <w:szCs w:val="19"/>
+        </w:rPr>
+        <w:t xml:space="preserve">TELL userid message</w:t>
+      </w:r>
+      <w:r>
+        <w:rPr>
+          <w:rFonts w:ascii="Times New Roman" w:cs="Times New Roman" w:eastAsia="Times New Roman" w:hAnsi="Times New Roman"/>
+        </w:rPr>
+        <w:t xml:space="preserve"> sends a message to a VM/370 user (CP MSG). </w:t>
+      </w:r>
+      <w:r>
+        <w:rPr>
+          <w:rFonts w:ascii="Courier New" w:cs="Courier New" w:eastAsia="Courier New" w:hAnsi="Courier New"/>
+          <w:sz w:val="19"/>
+          <w:szCs w:val="19"/>
+        </w:rPr>
+        <w:t xml:space="preserve">TELL user AT LINUX message</w:t>
+      </w:r>
+      <w:r>
+        <w:rPr>
+          <w:rFonts w:ascii="Times New Roman" w:cs="Times New Roman" w:eastAsia="Times New Roman" w:hAnsi="Times New Roman"/>
+        </w:rPr>
+        <w:t xml:space="preserve"> sends it to a user of the Debian guest through the spool bridge: it appears on that user’s terminals, and is kept until the user reads it with </w:t>
+      </w:r>
+      <w:r>
+        <w:rPr>
+          <w:rFonts w:ascii="Courier New" w:cs="Courier New" w:eastAsia="Courier New" w:hAnsi="Courier New"/>
+          <w:sz w:val="19"/>
+          <w:szCs w:val="19"/>
+        </w:rPr>
+        <w:t xml:space="preserve">tell</w:t>
+      </w:r>
+      <w:r>
+        <w:rPr>
+          <w:rFonts w:ascii="Times New Roman" w:cs="Times New Roman" w:eastAsia="Times New Roman" w:hAnsi="Times New Roman"/>
+        </w:rPr>
+        <w:t xml:space="preserve">. </w:t>
+      </w:r>
+      <w:r>
+        <w:rPr>
+          <w:rFonts w:ascii="Courier New" w:cs="Courier New" w:eastAsia="Courier New" w:hAnsi="Courier New"/>
+          <w:sz w:val="19"/>
+          <w:szCs w:val="19"/>
+        </w:rPr>
+        <w:t xml:space="preserve">TELL ALL AT LINUX message</w:t>
+      </w:r>
+      <w:r>
+        <w:rPr>
+          <w:rFonts w:ascii="Times New Roman" w:cs="Times New Roman" w:eastAsia="Times New Roman" w:hAnsi="Times New Roman"/>
+        </w:rPr>
+        <w:t xml:space="preserve"> reaches everybody logged on to Linux. A Linux user answers with </w:t>
+      </w:r>
+      <w:r>
+        <w:rPr>
+          <w:rFonts w:ascii="Courier New" w:cs="Courier New" w:eastAsia="Courier New" w:hAnsi="Courier New"/>
+          <w:sz w:val="19"/>
+          <w:szCs w:val="19"/>
+        </w:rPr>
+        <w:t xml:space="preserve">tell userid message</w:t>
+      </w:r>
+      <w:r>
+        <w:rPr>
+          <w:rFonts w:ascii="Times New Roman" w:cs="Times New Roman" w:eastAsia="Times New Roman" w:hAnsi="Times New Roman"/>
+        </w:rPr>
+        <w:t xml:space="preserve">, which arrives on CMS as </w:t>
+      </w:r>
+      <w:r>
+        <w:rPr>
+          <w:rFonts w:ascii="Courier New" w:cs="Courier New" w:eastAsia="Courier New" w:hAnsi="Courier New"/>
+          <w:sz w:val="19"/>
+          <w:szCs w:val="19"/>
+        </w:rPr>
+        <w:t xml:space="preserve">MSG FROM MAINT: (user) message</w:t>
+      </w:r>
+      <w:r>
+        <w:rPr>
+          <w:rFonts w:ascii="Times New Roman" w:cs="Times New Roman" w:eastAsia="Times New Roman" w:hAnsi="Times New Roman"/>
+        </w:rPr>
+        <w:t xml:space="preserve">.</w:t>
       </w:r>
     </w:p>
     <w:p>
@@ -17258,125 +17533,97 @@
           <w:sz w:val="19"/>
           <w:szCs w:val="19"/>
         </w:rPr>
-        <w:t xml:space="preserve">RXPIP AVAIL</w:t>
-      </w:r>
-      <w:r>
-        <w:rPr>
-          <w:rFonts w:ascii="Times New Roman" w:cs="Times New Roman" w:eastAsia="Times New Roman" w:hAnsi="Times New Roman"/>
-        </w:rPr>
-        <w:t xml:space="preserve">, </w:t>
-      </w:r>
-      <w:r>
-        <w:rPr>
-          <w:rFonts w:ascii="Courier New" w:cs="Courier New" w:eastAsia="Courier New" w:hAnsi="Courier New"/>
-          <w:sz w:val="19"/>
-          <w:szCs w:val="19"/>
-        </w:rPr>
-        <w:t xml:space="preserve">RXPIP SEARCH term</w:t>
-      </w:r>
-      <w:r>
-        <w:rPr>
-          <w:rFonts w:ascii="Times New Roman" w:cs="Times New Roman" w:eastAsia="Times New Roman" w:hAnsi="Times New Roman"/>
-        </w:rPr>
-        <w:t xml:space="preserve"> and </w:t>
-      </w:r>
-      <w:r>
-        <w:rPr>
-          <w:rFonts w:ascii="Courier New" w:cs="Courier New" w:eastAsia="Courier New" w:hAnsi="Courier New"/>
-          <w:sz w:val="19"/>
-          <w:szCs w:val="19"/>
-        </w:rPr>
-        <w:t xml:space="preserve">RXPIP SHOW name</w:t>
-      </w:r>
-      <w:r>
-        <w:rPr>
-          <w:rFonts w:ascii="Times New Roman" w:cs="Times New Roman" w:eastAsia="Times New Roman" w:hAnsi="Times New Roman"/>
-        </w:rPr>
-        <w:t xml:space="preserve"> ask the repository. </w:t>
-      </w:r>
-      <w:r>
-        <w:rPr>
-          <w:rFonts w:ascii="Courier New" w:cs="Courier New" w:eastAsia="Courier New" w:hAnsi="Courier New"/>
-          <w:sz w:val="19"/>
-          <w:szCs w:val="19"/>
-        </w:rPr>
-        <w:t xml:space="preserve">RXPIP BUILD fn</w:t>
-      </w:r>
-      <w:r>
-        <w:rPr>
-          <w:rFonts w:ascii="Times New Roman" w:cs="Times New Roman" w:eastAsia="Times New Roman" w:hAnsi="Times New Roman"/>
-        </w:rPr>
-        <w:t xml:space="preserve"> takes </w:t>
-      </w:r>
-      <w:r>
-        <w:rPr>
-          <w:rFonts w:ascii="Courier New" w:cs="Courier New" w:eastAsia="Courier New" w:hAnsi="Courier New"/>
-          <w:sz w:val="19"/>
-          <w:szCs w:val="19"/>
-        </w:rPr>
-        <w:t xml:space="preserve">fn REXX</w:t>
-      </w:r>
-      <w:r>
-        <w:rPr>
-          <w:rFonts w:ascii="Times New Roman" w:cs="Times New Roman" w:eastAsia="Times New Roman" w:hAnsi="Times New Roman"/>
-        </w:rPr>
-        <w:t xml:space="preserve">, installs the packages it requires and writes </w:t>
-      </w:r>
-      <w:r>
-        <w:rPr>
-          <w:rFonts w:ascii="Courier New" w:cs="Courier New" w:eastAsia="Courier New" w:hAnsi="Courier New"/>
-          <w:sz w:val="19"/>
-          <w:szCs w:val="19"/>
-        </w:rPr>
-        <w:t xml:space="preserve">fn EXEC A</w:t>
-      </w:r>
-      <w:r>
-        <w:rPr>
-          <w:rFonts w:ascii="Times New Roman" w:cs="Times New Roman" w:eastAsia="Times New Roman" w:hAnsi="Times New Roman"/>
-        </w:rPr>
-        <w:t xml:space="preserve">, a standalone program with the packages merged in; </w:t>
-      </w:r>
-      <w:r>
-        <w:rPr>
-          <w:rFonts w:ascii="Courier New" w:cs="Courier New" w:eastAsia="Courier New" w:hAnsi="Courier New"/>
-          <w:sz w:val="19"/>
-          <w:szCs w:val="19"/>
-        </w:rPr>
-        <w:t xml:space="preserve">RXPIP RUN fn [args]</w:t>
-      </w:r>
-      <w:r>
-        <w:rPr>
-          <w:rFonts w:ascii="Times New Roman" w:cs="Times New Roman" w:eastAsia="Times New Roman" w:hAnsi="Times New Roman"/>
-        </w:rPr>
-        <w:t xml:space="preserve"> builds and runs it. </w:t>
-      </w:r>
-      <w:r>
-        <w:rPr>
-          <w:rFonts w:ascii="Courier New" w:cs="Courier New" w:eastAsia="Courier New" w:hAnsi="Courier New"/>
-          <w:sz w:val="19"/>
-          <w:szCs w:val="19"/>
-        </w:rPr>
-        <w:t xml:space="preserve">RXPIP GET name</w:t>
-      </w:r>
-      <w:r>
-        <w:rPr>
-          <w:rFonts w:ascii="Times New Roman" w:cs="Times New Roman" w:eastAsia="Times New Roman" w:hAnsi="Times New Roman"/>
-        </w:rPr>
-        <w:t xml:space="preserve"> fetches a package as </w:t>
-      </w:r>
-      <w:r>
-        <w:rPr>
-          <w:rFonts w:ascii="Courier New" w:cs="Courier New" w:eastAsia="Courier New" w:hAnsi="Courier New"/>
-          <w:sz w:val="19"/>
-          <w:szCs w:val="19"/>
-        </w:rPr>
-        <w:t xml:space="preserve">file REXX A</w:t>
-      </w:r>
-      <w:r>
-        <w:rPr>
-          <w:rFonts w:ascii="Times New Roman" w:cs="Times New Roman" w:eastAsia="Times New Roman" w:hAnsi="Times New Roman"/>
-        </w:rPr>
-        <w:t xml:space="preserve">.</w:t>
+        <w:t xml:space="preserve">TELL user AT NET message</w:t>
+      </w:r>
+      <w:r>
+        <w:rPr>
+          <w:rFonts w:ascii="Times New Roman" w:cs="Times New Roman" w:eastAsia="Times New Roman" w:hAnsi="Times New Roman"/>
+        </w:rPr>
+        <w:t xml:space="preserve"> reaches a user on the internet. The message is published on the MQTT broker of the Debian guest as topic </w:t>
+      </w:r>
+      <w:r>
+        <w:rPr>
+          <w:rFonts w:ascii="Courier New" w:cs="Courier New" w:eastAsia="Courier New" w:hAnsi="Courier New"/>
+          <w:sz w:val="19"/>
+          <w:szCs w:val="19"/>
+        </w:rPr>
+        <w:t xml:space="preserve">vm/tell/out/user</w:t>
+      </w:r>
+      <w:r>
+        <w:rPr>
+          <w:rFonts w:ascii="Times New Roman" w:cs="Times New Roman" w:eastAsia="Times New Roman" w:hAnsi="Times New Roman"/>
+        </w:rPr>
+        <w:t xml:space="preserve">, which the user reads with any MQTT client. The user answers by publishing to </w:t>
+      </w:r>
+      <w:r>
+        <w:rPr>
+          <w:rFonts w:ascii="Courier New" w:cs="Courier New" w:eastAsia="Courier New" w:hAnsi="Courier New"/>
+          <w:sz w:val="19"/>
+          <w:szCs w:val="19"/>
+        </w:rPr>
+        <w:t xml:space="preserve">vm/tell/from/user/to/userid</w:t>
+      </w:r>
+      <w:r>
+        <w:rPr>
+          <w:rFonts w:ascii="Times New Roman" w:cs="Times New Roman" w:eastAsia="Times New Roman" w:hAnsi="Times New Roman"/>
+        </w:rPr>
+        <w:t xml:space="preserve">; it arrives as </w:t>
+      </w:r>
+      <w:r>
+        <w:rPr>
+          <w:rFonts w:ascii="Courier New" w:cs="Courier New" w:eastAsia="Courier New" w:hAnsi="Courier New"/>
+          <w:sz w:val="19"/>
+          <w:szCs w:val="19"/>
+        </w:rPr>
+        <w:t xml:space="preserve">MSG FROM MAINT: (net:user) message</w:t>
+      </w:r>
+      <w:r>
+        <w:rPr>
+          <w:rFonts w:ascii="Times New Roman" w:cs="Times New Roman" w:eastAsia="Times New Roman" w:hAnsi="Times New Roman"/>
+        </w:rPr>
+        <w:t xml:space="preserve">. Outside users need a login (</w:t>
+      </w:r>
+      <w:r>
+        <w:rPr>
+          <w:rFonts w:ascii="Courier New" w:cs="Courier New" w:eastAsia="Courier New" w:hAnsi="Courier New"/>
+          <w:sz w:val="19"/>
+          <w:szCs w:val="19"/>
+        </w:rPr>
+        <w:t xml:space="preserve">tellnet-user name password</w:t>
+      </w:r>
+      <w:r>
+        <w:rPr>
+          <w:rFonts w:ascii="Times New Roman" w:cs="Times New Roman" w:eastAsia="Times New Roman" w:hAnsi="Times New Roman"/>
+        </w:rPr>
+        <w:t xml:space="preserve"> in the guest) and may only use their own TELL topics. On the PC, </w:t>
+      </w:r>
+      <w:r>
+        <w:rPr>
+          <w:rFonts w:ascii="Courier New" w:cs="Courier New" w:eastAsia="Courier New" w:hAnsi="Courier New"/>
+          <w:sz w:val="19"/>
+          <w:szCs w:val="19"/>
+        </w:rPr>
+        <w:t xml:space="preserve">tools/netfwd.py --tls cert key 8883 10.1.1.2:1883</w:t>
+      </w:r>
+      <w:r>
+        <w:rPr>
+          <w:rFonts w:ascii="Times New Roman" w:cs="Times New Roman" w:eastAsia="Times New Roman" w:hAnsi="Times New Roman"/>
+        </w:rPr>
+        <w:t xml:space="preserve"> makes the broker reachable, encrypted; the router has to forward that port to the PC. </w:t>
+      </w:r>
+      <w:r>
+        <w:rPr>
+          <w:rFonts w:ascii="Courier New" w:cs="Courier New" w:eastAsia="Courier New" w:hAnsi="Courier New"/>
+          <w:sz w:val="19"/>
+          <w:szCs w:val="19"/>
+        </w:rPr>
+        <w:t xml:space="preserve">tools/nettell.py</w:t>
+      </w:r>
+      <w:r>
+        <w:rPr>
+          <w:rFonts w:ascii="Times New Roman" w:cs="Times New Roman" w:eastAsia="Times New Roman" w:hAnsi="Times New Roman"/>
+        </w:rPr>
+        <w:t xml:space="preserve"> is a small client for the outside user.</w:t>
       </w:r>
     </w:p>
     <w:tbl>
@@ -17419,7 +17666,7 @@
                 <w:sz w:val="17"/>
                 <w:szCs w:val="17"/>
               </w:rPr>
-              <w:t xml:space="preserve">rxpip run demo</w:t>
+              <w:t xml:space="preserve">mqtt sub vm/test 1 20</w:t>
             </w:r>
           </w:p>
           <w:p>
@@ -17432,59 +17679,7 @@
                 <w:sz w:val="17"/>
                 <w:szCs w:val="17"/>
               </w:rPr>
-              <w:t xml:space="preserve">rxpip: mathutils 1.0.0 already installed</w:t>
-            </w:r>
-          </w:p>
-          <w:p>
-            <w:pPr>
-              <w:spacing w:after="0" w:line="228"/>
-            </w:pPr>
-            <w:r>
-              <w:rPr>
-                <w:rFonts w:ascii="Courier New" w:cs="Courier New" w:eastAsia="Courier New" w:hAnsi="Courier New"/>
-                <w:sz w:val="17"/>
-                <w:szCs w:val="17"/>
-              </w:rPr>
-              <w:t xml:space="preserve">rxpip: greetutils 1.0.0 already installed</w:t>
-            </w:r>
-          </w:p>
-          <w:p>
-            <w:pPr>
-              <w:spacing w:after="0" w:line="228"/>
-            </w:pPr>
-            <w:r>
-              <w:rPr>
-                <w:rFonts w:ascii="Courier New" w:cs="Courier New" w:eastAsia="Courier New" w:hAnsi="Courier New"/>
-                <w:sz w:val="17"/>
-                <w:szCs w:val="17"/>
-              </w:rPr>
-              <w:t xml:space="preserve">RXPIP: DEMO EXEC A written, 71 lines</w:t>
-            </w:r>
-          </w:p>
-          <w:p>
-            <w:pPr>
-              <w:spacing w:after="0" w:line="228"/>
-            </w:pPr>
-            <w:r>
-              <w:rPr>
-                <w:rFonts w:ascii="Courier New" w:cs="Courier New" w:eastAsia="Courier New" w:hAnsi="Courier New"/>
-                <w:sz w:val="17"/>
-                <w:szCs w:val="17"/>
-              </w:rPr>
-              <w:t xml:space="preserve">HELLO, WORLD!!!</w:t>
-            </w:r>
-          </w:p>
-          <w:p>
-            <w:pPr>
-              <w:spacing w:after="0" w:line="228"/>
-            </w:pPr>
-            <w:r>
-              <w:rPr>
-                <w:rFonts w:ascii="Courier New" w:cs="Courier New" w:eastAsia="Courier New" w:hAnsi="Courier New"/>
-                <w:sz w:val="17"/>
-                <w:szCs w:val="17"/>
-              </w:rPr>
-              <w:t xml:space="preserve">square of 7 is 49</w:t>
+              <w:t xml:space="preserve">vm/test hello from linux</w:t>
             </w:r>
           </w:p>
           <w:p>
@@ -17516,6 +17711,331 @@
           <w:szCs w:val="18"/>
         </w:rPr>
         <w:t xml:space="preserve">Figure 30. </w:t>
+      </w:r>
+      <w:r>
+        <w:rPr>
+          <w:rFonts w:ascii="Arial" w:cs="Arial" w:eastAsia="Arial" w:hAnsi="Arial"/>
+          <w:sz w:val="18"/>
+          <w:szCs w:val="18"/>
+        </w:rPr>
+        <w:t xml:space="preserve">A message from Linux arrives on CMS</w:t>
+      </w:r>
+    </w:p>
+    <w:p>
+      <w:pPr>
+        <w:pStyle w:val="Heading2"/>
+      </w:pPr>
+      <w:r>
+        <w:t xml:space="preserve">RXPIP: REXX packages</w:t>
+      </w:r>
+    </w:p>
+    <w:p>
+      <w:pPr>
+        <w:spacing w:after="120"/>
+      </w:pPr>
+      <w:r>
+        <w:rPr>
+          <w:rFonts w:ascii="Times New Roman" w:cs="Times New Roman" w:eastAsia="Times New Roman" w:hAnsi="Times New Roman"/>
+        </w:rPr>
+        <w:t xml:space="preserve">RXPIP is the package manager of rexxpository: REXX routines are published as packages, and a program names what it needs with </w:t>
+      </w:r>
+      <w:r>
+        <w:rPr>
+          <w:rFonts w:ascii="Courier New" w:cs="Courier New" w:eastAsia="Courier New" w:hAnsi="Courier New"/>
+          <w:sz w:val="19"/>
+          <w:szCs w:val="19"/>
+        </w:rPr>
+        <w:t xml:space="preserve">/* REQUIRE pkg */</w:t>
+      </w:r>
+      <w:r>
+        <w:rPr>
+          <w:rFonts w:ascii="Times New Roman" w:cs="Times New Roman" w:eastAsia="Times New Roman" w:hAnsi="Times New Roman"/>
+        </w:rPr>
+        <w:t xml:space="preserve"> comments. The repository server and the rxpip client run in the Debian guest; the bridge service </w:t>
+      </w:r>
+      <w:r>
+        <w:rPr>
+          <w:rFonts w:ascii="Courier New" w:cs="Courier New" w:eastAsia="Courier New" w:hAnsi="Courier New"/>
+          <w:sz w:val="19"/>
+          <w:szCs w:val="19"/>
+        </w:rPr>
+        <w:t xml:space="preserve">rxpip</w:t>
+      </w:r>
+      <w:r>
+        <w:rPr>
+          <w:rFonts w:ascii="Times New Roman" w:cs="Times New Roman" w:eastAsia="Times New Roman" w:hAnsi="Times New Roman"/>
+        </w:rPr>
+        <w:t xml:space="preserve"> serves CMS users.</w:t>
+      </w:r>
+    </w:p>
+    <w:p>
+      <w:pPr>
+        <w:spacing w:after="120"/>
+      </w:pPr>
+      <w:r>
+        <w:rPr>
+          <w:rFonts w:ascii="Courier New" w:cs="Courier New" w:eastAsia="Courier New" w:hAnsi="Courier New"/>
+          <w:sz w:val="19"/>
+          <w:szCs w:val="19"/>
+        </w:rPr>
+        <w:t xml:space="preserve">RXPIP AVAIL</w:t>
+      </w:r>
+      <w:r>
+        <w:rPr>
+          <w:rFonts w:ascii="Times New Roman" w:cs="Times New Roman" w:eastAsia="Times New Roman" w:hAnsi="Times New Roman"/>
+        </w:rPr>
+        <w:t xml:space="preserve">, </w:t>
+      </w:r>
+      <w:r>
+        <w:rPr>
+          <w:rFonts w:ascii="Courier New" w:cs="Courier New" w:eastAsia="Courier New" w:hAnsi="Courier New"/>
+          <w:sz w:val="19"/>
+          <w:szCs w:val="19"/>
+        </w:rPr>
+        <w:t xml:space="preserve">RXPIP SEARCH term</w:t>
+      </w:r>
+      <w:r>
+        <w:rPr>
+          <w:rFonts w:ascii="Times New Roman" w:cs="Times New Roman" w:eastAsia="Times New Roman" w:hAnsi="Times New Roman"/>
+        </w:rPr>
+        <w:t xml:space="preserve"> and </w:t>
+      </w:r>
+      <w:r>
+        <w:rPr>
+          <w:rFonts w:ascii="Courier New" w:cs="Courier New" w:eastAsia="Courier New" w:hAnsi="Courier New"/>
+          <w:sz w:val="19"/>
+          <w:szCs w:val="19"/>
+        </w:rPr>
+        <w:t xml:space="preserve">RXPIP SHOW name</w:t>
+      </w:r>
+      <w:r>
+        <w:rPr>
+          <w:rFonts w:ascii="Times New Roman" w:cs="Times New Roman" w:eastAsia="Times New Roman" w:hAnsi="Times New Roman"/>
+        </w:rPr>
+        <w:t xml:space="preserve"> ask the repository. </w:t>
+      </w:r>
+      <w:r>
+        <w:rPr>
+          <w:rFonts w:ascii="Courier New" w:cs="Courier New" w:eastAsia="Courier New" w:hAnsi="Courier New"/>
+          <w:sz w:val="19"/>
+          <w:szCs w:val="19"/>
+        </w:rPr>
+        <w:t xml:space="preserve">RXPIP BUILD fn</w:t>
+      </w:r>
+      <w:r>
+        <w:rPr>
+          <w:rFonts w:ascii="Times New Roman" w:cs="Times New Roman" w:eastAsia="Times New Roman" w:hAnsi="Times New Roman"/>
+        </w:rPr>
+        <w:t xml:space="preserve"> takes </w:t>
+      </w:r>
+      <w:r>
+        <w:rPr>
+          <w:rFonts w:ascii="Courier New" w:cs="Courier New" w:eastAsia="Courier New" w:hAnsi="Courier New"/>
+          <w:sz w:val="19"/>
+          <w:szCs w:val="19"/>
+        </w:rPr>
+        <w:t xml:space="preserve">fn REXX</w:t>
+      </w:r>
+      <w:r>
+        <w:rPr>
+          <w:rFonts w:ascii="Times New Roman" w:cs="Times New Roman" w:eastAsia="Times New Roman" w:hAnsi="Times New Roman"/>
+        </w:rPr>
+        <w:t xml:space="preserve">, installs the packages it requires and writes </w:t>
+      </w:r>
+      <w:r>
+        <w:rPr>
+          <w:rFonts w:ascii="Courier New" w:cs="Courier New" w:eastAsia="Courier New" w:hAnsi="Courier New"/>
+          <w:sz w:val="19"/>
+          <w:szCs w:val="19"/>
+        </w:rPr>
+        <w:t xml:space="preserve">fn EXEC A</w:t>
+      </w:r>
+      <w:r>
+        <w:rPr>
+          <w:rFonts w:ascii="Times New Roman" w:cs="Times New Roman" w:eastAsia="Times New Roman" w:hAnsi="Times New Roman"/>
+        </w:rPr>
+        <w:t xml:space="preserve">, a standalone program with the packages merged in; </w:t>
+      </w:r>
+      <w:r>
+        <w:rPr>
+          <w:rFonts w:ascii="Courier New" w:cs="Courier New" w:eastAsia="Courier New" w:hAnsi="Courier New"/>
+          <w:sz w:val="19"/>
+          <w:szCs w:val="19"/>
+        </w:rPr>
+        <w:t xml:space="preserve">RXPIP RUN fn [args]</w:t>
+      </w:r>
+      <w:r>
+        <w:rPr>
+          <w:rFonts w:ascii="Times New Roman" w:cs="Times New Roman" w:eastAsia="Times New Roman" w:hAnsi="Times New Roman"/>
+        </w:rPr>
+        <w:t xml:space="preserve"> builds and runs it. </w:t>
+      </w:r>
+      <w:r>
+        <w:rPr>
+          <w:rFonts w:ascii="Courier New" w:cs="Courier New" w:eastAsia="Courier New" w:hAnsi="Courier New"/>
+          <w:sz w:val="19"/>
+          <w:szCs w:val="19"/>
+        </w:rPr>
+        <w:t xml:space="preserve">RXPIP GET name</w:t>
+      </w:r>
+      <w:r>
+        <w:rPr>
+          <w:rFonts w:ascii="Times New Roman" w:cs="Times New Roman" w:eastAsia="Times New Roman" w:hAnsi="Times New Roman"/>
+        </w:rPr>
+        <w:t xml:space="preserve"> fetches a package as </w:t>
+      </w:r>
+      <w:r>
+        <w:rPr>
+          <w:rFonts w:ascii="Courier New" w:cs="Courier New" w:eastAsia="Courier New" w:hAnsi="Courier New"/>
+          <w:sz w:val="19"/>
+          <w:szCs w:val="19"/>
+        </w:rPr>
+        <w:t xml:space="preserve">file REXX A</w:t>
+      </w:r>
+      <w:r>
+        <w:rPr>
+          <w:rFonts w:ascii="Times New Roman" w:cs="Times New Roman" w:eastAsia="Times New Roman" w:hAnsi="Times New Roman"/>
+        </w:rPr>
+        <w:t xml:space="preserve">.</w:t>
+      </w:r>
+    </w:p>
+    <w:tbl>
+      <w:tblPr>
+        <w:tblW w:type="dxa" w:w="9638"/>
+        <w:tblBorders>
+          <w:top w:val="single" w:color="auto" w:sz="4"/>
+          <w:left w:val="single" w:color="auto" w:sz="4"/>
+          <w:bottom w:val="single" w:color="auto" w:sz="4"/>
+          <w:right w:val="single" w:color="auto" w:sz="4"/>
+          <w:insideH w:val="single" w:color="auto" w:sz="4"/>
+          <w:insideV w:val="single" w:color="auto" w:sz="4"/>
+        </w:tblBorders>
+      </w:tblPr>
+      <w:tblGrid>
+        <w:gridCol w:w="9638"/>
+      </w:tblGrid>
+      <w:tr>
+        <w:trPr>
+          <w:cantSplit/>
+        </w:trPr>
+        <w:tc>
+          <w:tcPr>
+            <w:tcW w:type="dxa" w:w="9638"/>
+            <w:shd w:fill="F2F2F2" w:color="auto" w:val="clear"/>
+            <w:tcMar>
+              <w:top w:type="dxa" w:w="100"/>
+              <w:left w:type="dxa" w:w="140"/>
+              <w:bottom w:type="dxa" w:w="100"/>
+              <w:right w:type="dxa" w:w="140"/>
+            </w:tcMar>
+          </w:tcPr>
+          <w:p>
+            <w:pPr>
+              <w:spacing w:after="0" w:line="228"/>
+            </w:pPr>
+            <w:r>
+              <w:rPr>
+                <w:rFonts w:ascii="Courier New" w:cs="Courier New" w:eastAsia="Courier New" w:hAnsi="Courier New"/>
+                <w:sz w:val="17"/>
+                <w:szCs w:val="17"/>
+              </w:rPr>
+              <w:t xml:space="preserve">rxpip run demo</w:t>
+            </w:r>
+          </w:p>
+          <w:p>
+            <w:pPr>
+              <w:spacing w:after="0" w:line="228"/>
+            </w:pPr>
+            <w:r>
+              <w:rPr>
+                <w:rFonts w:ascii="Courier New" w:cs="Courier New" w:eastAsia="Courier New" w:hAnsi="Courier New"/>
+                <w:sz w:val="17"/>
+                <w:szCs w:val="17"/>
+              </w:rPr>
+              <w:t xml:space="preserve">rxpip: mathutils 1.0.0 already installed</w:t>
+            </w:r>
+          </w:p>
+          <w:p>
+            <w:pPr>
+              <w:spacing w:after="0" w:line="228"/>
+            </w:pPr>
+            <w:r>
+              <w:rPr>
+                <w:rFonts w:ascii="Courier New" w:cs="Courier New" w:eastAsia="Courier New" w:hAnsi="Courier New"/>
+                <w:sz w:val="17"/>
+                <w:szCs w:val="17"/>
+              </w:rPr>
+              <w:t xml:space="preserve">rxpip: greetutils 1.0.0 already installed</w:t>
+            </w:r>
+          </w:p>
+          <w:p>
+            <w:pPr>
+              <w:spacing w:after="0" w:line="228"/>
+            </w:pPr>
+            <w:r>
+              <w:rPr>
+                <w:rFonts w:ascii="Courier New" w:cs="Courier New" w:eastAsia="Courier New" w:hAnsi="Courier New"/>
+                <w:sz w:val="17"/>
+                <w:szCs w:val="17"/>
+              </w:rPr>
+              <w:t xml:space="preserve">RXPIP: DEMO EXEC A written, 71 lines</w:t>
+            </w:r>
+          </w:p>
+          <w:p>
+            <w:pPr>
+              <w:spacing w:after="0" w:line="228"/>
+            </w:pPr>
+            <w:r>
+              <w:rPr>
+                <w:rFonts w:ascii="Courier New" w:cs="Courier New" w:eastAsia="Courier New" w:hAnsi="Courier New"/>
+                <w:sz w:val="17"/>
+                <w:szCs w:val="17"/>
+              </w:rPr>
+              <w:t xml:space="preserve">HELLO, WORLD!!!</w:t>
+            </w:r>
+          </w:p>
+          <w:p>
+            <w:pPr>
+              <w:spacing w:after="0" w:line="228"/>
+            </w:pPr>
+            <w:r>
+              <w:rPr>
+                <w:rFonts w:ascii="Courier New" w:cs="Courier New" w:eastAsia="Courier New" w:hAnsi="Courier New"/>
+                <w:sz w:val="17"/>
+                <w:szCs w:val="17"/>
+              </w:rPr>
+              <w:t xml:space="preserve">square of 7 is 49</w:t>
+            </w:r>
+          </w:p>
+          <w:p>
+            <w:pPr>
+              <w:spacing w:after="0" w:line="228"/>
+            </w:pPr>
+            <w:r>
+              <w:rPr>
+                <w:rFonts w:ascii="Courier New" w:cs="Courier New" w:eastAsia="Courier New" w:hAnsi="Courier New"/>
+                <w:sz w:val="17"/>
+                <w:szCs w:val="17"/>
+              </w:rPr>
+              <w:t xml:space="preserve">Ready;</w:t>
+            </w:r>
+          </w:p>
+        </w:tc>
+      </w:tr>
+    </w:tbl>
+    <w:p>
+      <w:pPr>
+        <w:spacing w:after="200" w:before="80"/>
+      </w:pPr>
+      <w:r>
+        <w:rPr>
+          <w:rFonts w:ascii="Arial" w:cs="Arial" w:eastAsia="Arial" w:hAnsi="Arial"/>
+          <w:b/>
+          <w:bCs/>
+          <w:sz w:val="18"/>
+          <w:szCs w:val="18"/>
+        </w:rPr>
+        <w:t xml:space="preserve">Figure 31. </w:t>
       </w:r>
       <w:r>
         <w:rPr>
@@ -17809,7 +18329,7 @@
           <w:sz w:val="18"/>
           <w:szCs w:val="18"/>
         </w:rPr>
-        <w:t xml:space="preserve">Figure 31. </w:t>
+        <w:t xml:space="preserve">Figure 32. </w:t>
       </w:r>
       <w:r>
         <w:rPr>
@@ -18047,7 +18567,7 @@
           <w:sz w:val="18"/>
           <w:szCs w:val="18"/>
         </w:rPr>
-        <w:t xml:space="preserve">Figure 32. </w:t>
+        <w:t xml:space="preserve">Figure 33. </w:t>
       </w:r>
       <w:r>
         <w:rPr>
@@ -18457,7 +18977,7 @@
           <w:sz w:val="18"/>
           <w:szCs w:val="18"/>
         </w:rPr>
-        <w:t xml:space="preserve">Figure 33. </w:t>
+        <w:t xml:space="preserve">Figure 34. </w:t>
       </w:r>
       <w:r>
         <w:rPr>
@@ -18722,7 +19242,7 @@
           <w:sz w:val="18"/>
           <w:szCs w:val="18"/>
         </w:rPr>
-        <w:t xml:space="preserve">Figure 34. </w:t>
+        <w:t xml:space="preserve">Figure 35. </w:t>
       </w:r>
       <w:r>
         <w:rPr>
@@ -19796,7 +20316,7 @@
           <w:sz w:val="18"/>
           <w:szCs w:val="18"/>
         </w:rPr>
-        <w:t xml:space="preserve">Figure 35. </w:t>
+        <w:t xml:space="preserve">Figure 36. </w:t>
       </w:r>
       <w:r>
         <w:rPr>
@@ -20426,7 +20946,7 @@
           <w:sz w:val="18"/>
           <w:szCs w:val="18"/>
         </w:rPr>
-        <w:t xml:space="preserve">Figure 36. </w:t>
+        <w:t xml:space="preserve">Figure 37. </w:t>
       </w:r>
       <w:r>
         <w:rPr>
@@ -20936,7 +21456,7 @@
           <w:sz w:val="18"/>
           <w:szCs w:val="18"/>
         </w:rPr>
-        <w:t xml:space="preserve">Figure 37. </w:t>
+        <w:t xml:space="preserve">Figure 38. </w:t>
       </w:r>
       <w:r>
         <w:rPr>
@@ -21235,7 +21755,7 @@
           <w:sz w:val="18"/>
           <w:szCs w:val="18"/>
         </w:rPr>
-        <w:t xml:space="preserve">Figure 38. </w:t>
+        <w:t xml:space="preserve">Figure 39. </w:t>
       </w:r>
       <w:r>
         <w:rPr>
@@ -21800,7 +22320,7 @@
           <w:sz w:val="18"/>
           <w:szCs w:val="18"/>
         </w:rPr>
-        <w:t xml:space="preserve">Figure 39. </w:t>
+        <w:t xml:space="preserve">Figure 40. </w:t>
       </w:r>
       <w:r>
         <w:rPr>
@@ -21947,7 +22467,7 @@
           <w:sz w:val="18"/>
           <w:szCs w:val="18"/>
         </w:rPr>
-        <w:t xml:space="preserve">Figure 40. </w:t>
+        <w:t xml:space="preserve">Figure 41. </w:t>
       </w:r>
       <w:r>
         <w:rPr>
@@ -22323,7 +22843,7 @@
           <w:sz w:val="18"/>
           <w:szCs w:val="18"/>
         </w:rPr>
-        <w:t xml:space="preserve">Figure 41. </w:t>
+        <w:t xml:space="preserve">Figure 42. </w:t>
       </w:r>
       <w:r>
         <w:rPr>
@@ -23544,7 +24064,7 @@
           <w:sz w:val="18"/>
           <w:szCs w:val="18"/>
         </w:rPr>
-        <w:t xml:space="preserve">Figure 42. </w:t>
+        <w:t xml:space="preserve">Figure 43. </w:t>
       </w:r>
       <w:r>
         <w:rPr>
@@ -24323,7 +24843,7 @@
           <w:sz w:val="18"/>
           <w:szCs w:val="18"/>
         </w:rPr>
-        <w:t xml:space="preserve">Figure 43. </w:t>
+        <w:t xml:space="preserve">Figure 44. </w:t>
       </w:r>
       <w:r>
         <w:rPr>
@@ -24457,7 +24977,7 @@
           <w:sz w:val="18"/>
           <w:szCs w:val="18"/>
         </w:rPr>
-        <w:t xml:space="preserve">Figure 44. </w:t>
+        <w:t xml:space="preserve">Figure 45. </w:t>
       </w:r>
       <w:r>
         <w:rPr>
@@ -24741,7 +25261,7 @@
           <w:sz w:val="18"/>
           <w:szCs w:val="18"/>
         </w:rPr>
-        <w:t xml:space="preserve">Figure 45. </w:t>
+        <w:t xml:space="preserve">Figure 46. </w:t>
       </w:r>
       <w:r>
         <w:rPr>
@@ -25481,7 +26001,7 @@
           <w:sz w:val="18"/>
           <w:szCs w:val="18"/>
         </w:rPr>
-        <w:t xml:space="preserve">Figure 46. </w:t>
+        <w:t xml:space="preserve">Figure 47. </w:t>
       </w:r>
       <w:r>
         <w:rPr>
@@ -25959,7 +26479,7 @@
           <w:sz w:val="18"/>
           <w:szCs w:val="18"/>
         </w:rPr>
-        <w:t xml:space="preserve">Figure 47. </w:t>
+        <w:t xml:space="preserve">Figure 48. </w:t>
       </w:r>
       <w:r>
         <w:rPr>
@@ -27123,7 +27643,7 @@
           <w:sz w:val="18"/>
           <w:szCs w:val="18"/>
         </w:rPr>
-        <w:t xml:space="preserve">Figure 48. </w:t>
+        <w:t xml:space="preserve">Figure 49. </w:t>
       </w:r>
       <w:r>
         <w:rPr>
@@ -27222,7 +27742,7 @@
           <w:sz w:val="18"/>
           <w:szCs w:val="18"/>
         </w:rPr>
-        <w:t xml:space="preserve">Figure 49. </w:t>
+        <w:t xml:space="preserve">Figure 50. </w:t>
       </w:r>
       <w:r>
         <w:rPr>
@@ -27365,7 +27885,7 @@
           <w:sz w:val="18"/>
           <w:szCs w:val="18"/>
         </w:rPr>
-        <w:t xml:space="preserve">Figure 50. </w:t>
+        <w:t xml:space="preserve">Figure 51. </w:t>
       </w:r>
       <w:r>
         <w:rPr>
@@ -27637,7 +28157,7 @@
           <w:sz w:val="18"/>
           <w:szCs w:val="18"/>
         </w:rPr>
-        <w:t xml:space="preserve">Figure 51. </w:t>
+        <w:t xml:space="preserve">Figure 52. </w:t>
       </w:r>
       <w:r>
         <w:rPr>
@@ -27879,7 +28399,7 @@
           <w:sz w:val="18"/>
           <w:szCs w:val="18"/>
         </w:rPr>
-        <w:t xml:space="preserve">Figure 52. </w:t>
+        <w:t xml:space="preserve">Figure 53. </w:t>
       </w:r>
       <w:r>
         <w:rPr>
@@ -27956,7 +28476,7 @@
           <w:sz w:val="18"/>
           <w:szCs w:val="18"/>
         </w:rPr>
-        <w:t xml:space="preserve">Figure 53. </w:t>
+        <w:t xml:space="preserve">Figure 54. </w:t>
       </w:r>
       <w:r>
         <w:rPr>
@@ -28086,7 +28606,7 @@
           <w:sz w:val="18"/>
           <w:szCs w:val="18"/>
         </w:rPr>
-        <w:t xml:space="preserve">Figure 54. </w:t>
+        <w:t xml:space="preserve">Figure 55. </w:t>
       </w:r>
       <w:r>
         <w:rPr>
@@ -28260,7 +28780,7 @@
           <w:sz w:val="18"/>
           <w:szCs w:val="18"/>
         </w:rPr>
-        <w:t xml:space="preserve">Figure 55. </w:t>
+        <w:t xml:space="preserve">Figure 56. </w:t>
       </w:r>
       <w:r>
         <w:rPr>
@@ -28350,7 +28870,7 @@
           <w:sz w:val="18"/>
           <w:szCs w:val="18"/>
         </w:rPr>
-        <w:t xml:space="preserve">Figure 56. </w:t>
+        <w:t xml:space="preserve">Figure 57. </w:t>
       </w:r>
       <w:r>
         <w:rPr>
@@ -29097,7 +29617,7 @@
           <w:sz w:val="18"/>
           <w:szCs w:val="18"/>
         </w:rPr>
-        <w:t xml:space="preserve">Figure 57. </w:t>
+        <w:t xml:space="preserve">Figure 58. </w:t>
       </w:r>
       <w:r>
         <w:rPr>
@@ -29199,7 +29719,7 @@
           <w:sz w:val="18"/>
           <w:szCs w:val="18"/>
         </w:rPr>
-        <w:t xml:space="preserve">Figure 58. </w:t>
+        <w:t xml:space="preserve">Figure 59. </w:t>
       </w:r>
       <w:r>
         <w:rPr>
@@ -29374,7 +29894,7 @@
           <w:sz w:val="18"/>
           <w:szCs w:val="18"/>
         </w:rPr>
-        <w:t xml:space="preserve">Figure 59. </w:t>
+        <w:t xml:space="preserve">Figure 60. </w:t>
       </w:r>
       <w:r>
         <w:rPr>
@@ -29451,7 +29971,7 @@
           <w:sz w:val="18"/>
           <w:szCs w:val="18"/>
         </w:rPr>
-        <w:t xml:space="preserve">Figure 60. </w:t>
+        <w:t xml:space="preserve">Figure 61. </w:t>
       </w:r>
       <w:r>
         <w:rPr>
@@ -29731,7 +30251,7 @@
           <w:sz w:val="18"/>
           <w:szCs w:val="18"/>
         </w:rPr>
-        <w:t xml:space="preserve">Figure 61. </w:t>
+        <w:t xml:space="preserve">Figure 62. </w:t>
       </w:r>
       <w:r>
         <w:rPr>
@@ -29860,7 +30380,7 @@
           <w:sz w:val="18"/>
           <w:szCs w:val="18"/>
         </w:rPr>
-        <w:t xml:space="preserve">Figure 62. </w:t>
+        <w:t xml:space="preserve">Figure 63. </w:t>
       </w:r>
       <w:r>
         <w:rPr>
@@ -30092,7 +30612,7 @@
           <w:sz w:val="18"/>
           <w:szCs w:val="18"/>
         </w:rPr>
-        <w:t xml:space="preserve">Figure 63. </w:t>
+        <w:t xml:space="preserve">Figure 64. </w:t>
       </w:r>
       <w:r>
         <w:rPr>
@@ -30576,6 +31096,47 @@
           <w:szCs w:val="19"/>
         </w:rPr>
         <w:t xml:space="preserve">TELL userid [AT LINUX|NET] message</w:t>
+      </w:r>
+      <w:r>
+        <w:rPr>
+          <w:rFonts w:ascii="Times New Roman" w:cs="Times New Roman" w:eastAsia="Times New Roman" w:hAnsi="Times New Roman"/>
+        </w:rPr>
+        <w:t xml:space="preserve">.</w:t>
+      </w:r>
+    </w:p>
+    <w:p>
+      <w:pPr>
+        <w:pStyle w:val="Heading2"/>
+      </w:pPr>
+      <w:r>
+        <w:t xml:space="preserve">PGSQL</w:t>
+      </w:r>
+    </w:p>
+    <w:p>
+      <w:pPr>
+        <w:spacing w:after="120"/>
+      </w:pPr>
+      <w:r>
+        <w:rPr>
+          <w:rFonts w:ascii="Courier New" w:cs="Courier New" w:eastAsia="Courier New" w:hAnsi="Courier New"/>
+          <w:sz w:val="19"/>
+          <w:szCs w:val="19"/>
+        </w:rPr>
+        <w:t xml:space="preserve">PGSQL statement</w:t>
+      </w:r>
+      <w:r>
+        <w:rPr>
+          <w:rFonts w:ascii="Times New Roman" w:cs="Times New Roman" w:eastAsia="Times New Roman" w:hAnsi="Times New Roman"/>
+        </w:rPr>
+        <w:t xml:space="preserve">, </w:t>
+      </w:r>
+      <w:r>
+        <w:rPr>
+          <w:rFonts w:ascii="Courier New" w:cs="Courier New" w:eastAsia="Courier New" w:hAnsi="Courier New"/>
+          <w:sz w:val="19"/>
+          <w:szCs w:val="19"/>
+        </w:rPr>
+        <w:t xml:space="preserve">PGSQL (FILE fn [ft [fm]]</w:t>
       </w:r>
       <w:r>
         <w:rPr>
@@ -30816,7 +31377,7 @@
           <w:sz w:val="18"/>
           <w:szCs w:val="18"/>
         </w:rPr>
-        <w:t xml:space="preserve">Figure 64. </w:t>
+        <w:t xml:space="preserve">Figure 65. </w:t>
       </w:r>
       <w:r>
         <w:rPr>
@@ -31524,7 +32085,7 @@
           <w:sz w:val="18"/>
           <w:szCs w:val="18"/>
         </w:rPr>
-        <w:t xml:space="preserve">Figure 65. </w:t>
+        <w:t xml:space="preserve">Figure 66. </w:t>
       </w:r>
       <w:r>
         <w:rPr>

</xml_diff>